<commit_message>
Analysis should be sorted so can get started on testing!!
</commit_message>
<xml_diff>
--- a/Analysis.docx
+++ b/Analysis.docx
@@ -4,7 +4,7 @@
   <w:body>
     <w:p>
       <w:pPr>
-        <w:pStyle w:val="710"/>
+        <w:pStyle w:val="719"/>
         <w:pBdr/>
         <w:spacing w:line="141" w:lineRule="atLeast"/>
         <w:ind/>
@@ -37,7 +37,7 @@
     </w:p>
     <w:p>
       <w:pPr>
-        <w:pStyle w:val="714"/>
+        <w:pStyle w:val="723"/>
         <w:pBdr/>
         <w:spacing/>
         <w:ind/>
@@ -90,7 +90,7 @@
         <w:t xml:space="preserve">However, there is a lack of interactive tools available for teaching the solar system that also incorporate </w:t>
       </w:r>
       <w:r>
-        <w:t xml:space="preserve">other physics topics such as energy. It would be useful to teachers, and students, to have an application that can use an interesting topic like space that also teaches important concepts from other topics such as conservation of momentum or Newton’s laws.</w:t>
+        <w:t xml:space="preserve">other physics topics such as energy. It would be useful to teachers, and students, to have a prorgam that can use an interesting topic like space that also teaches important concepts from other topics such as conservation of momentum or Newton’s laws.</w:t>
       </w:r>
       <w:r>
         <w:rPr>
@@ -115,7 +115,7 @@
     </w:p>
     <w:p>
       <w:pPr>
-        <w:pStyle w:val="714"/>
+        <w:pStyle w:val="723"/>
         <w:pBdr/>
         <w:spacing/>
         <w:ind/>
@@ -155,7 +155,7 @@
     </w:p>
     <w:p>
       <w:pPr>
-        <w:pStyle w:val="890"/>
+        <w:pStyle w:val="899"/>
         <w:numPr>
           <w:ilvl w:val="0"/>
           <w:numId w:val="1"/>
@@ -195,7 +195,7 @@
     </w:p>
     <w:p>
       <w:pPr>
-        <w:pStyle w:val="890"/>
+        <w:pStyle w:val="899"/>
         <w:numPr>
           <w:ilvl w:val="0"/>
           <w:numId w:val="1"/>
@@ -515,7 +515,7 @@
     </w:p>
     <w:p>
       <w:pPr>
-        <w:pStyle w:val="714"/>
+        <w:pStyle w:val="723"/>
         <w:pBdr/>
         <w:spacing/>
         <w:ind/>
@@ -886,14 +886,14 @@
       <w:hyperlink r:id="rId10" w:tooltip="https://eyes.nasa.gov/apps/orrery/#/home." w:history="1">
         <w:r>
           <w:rPr>
-            <w:rStyle w:val="868"/>
+            <w:rStyle w:val="877"/>
             <w:highlight w:val="none"/>
           </w:rPr>
           <w:t xml:space="preserve">https://eyes.nasa.gov/apps/orrery/#/home</w:t>
         </w:r>
         <w:r>
           <w:rPr>
-            <w:rStyle w:val="868"/>
+            <w:rStyle w:val="877"/>
             <w:highlight w:val="none"/>
           </w:rPr>
           <w:t xml:space="preserve">.</w:t>
@@ -970,20 +970,20 @@
       <w:hyperlink r:id="rId11" w:tooltip="https://phet.colorado.edu/sims/html/my-solar-system/latest/my-solar-system_all.html" w:history="1">
         <w:r>
           <w:rPr>
-            <w:rStyle w:val="868"/>
+            <w:rStyle w:val="877"/>
             <w:highlight w:val="none"/>
           </w:rPr>
           <w:t xml:space="preserve">https://phet.colorado.edu/sims/html/my-solar-system/latest/my-solar-system_all.html</w:t>
         </w:r>
         <w:r>
           <w:rPr>
-            <w:rStyle w:val="868"/>
+            <w:rStyle w:val="877"/>
             <w:highlight w:val="none"/>
           </w:rPr>
         </w:r>
         <w:r>
           <w:rPr>
-            <w:rStyle w:val="868"/>
+            <w:rStyle w:val="877"/>
             <w:highlight w:val="none"/>
           </w:rPr>
         </w:r>
@@ -1100,16 +1100,6 @@
           <w:highlight w:val="none"/>
         </w:rPr>
       </w:r>
-      <w:r>
-        <w:rPr>
-          <w:highlight w:val="none"/>
-        </w:rPr>
-      </w:r>
-      <w:r>
-        <w:rPr>
-          <w:highlight w:val="none"/>
-        </w:rPr>
-      </w:r>
     </w:p>
     <w:p>
       <w:pPr>
@@ -1424,7 +1414,12 @@
           <w:highlight w:val="none"/>
         </w:rPr>
         <w:tab/>
-        <w:t xml:space="preserve">An executable python file would work well</w:t>
+        <w:t xml:space="preserve">An executable file would work well</w:t>
+      </w:r>
+      <w:r>
+        <w:rPr>
+          <w:highlight w:val="none"/>
+        </w:rPr>
       </w:r>
       <w:r>
         <w:rPr>
@@ -1703,7 +1698,7 @@
     </w:p>
     <w:p>
       <w:pPr>
-        <w:pStyle w:val="890"/>
+        <w:pStyle w:val="899"/>
         <w:numPr>
           <w:ilvl w:val="0"/>
           <w:numId w:val="2"/>
@@ -1726,10 +1721,15 @@
           <w:highlight w:val="none"/>
         </w:rPr>
       </w:r>
+      <w:r>
+        <w:rPr>
+          <w:highlight w:val="none"/>
+        </w:rPr>
+      </w:r>
     </w:p>
     <w:p>
       <w:pPr>
-        <w:pStyle w:val="890"/>
+        <w:pStyle w:val="899"/>
         <w:numPr>
           <w:ilvl w:val="0"/>
           <w:numId w:val="2"/>
@@ -1760,7 +1760,7 @@
     </w:p>
     <w:p>
       <w:pPr>
-        <w:pStyle w:val="890"/>
+        <w:pStyle w:val="899"/>
         <w:numPr>
           <w:ilvl w:val="0"/>
           <w:numId w:val="2"/>
@@ -1791,7 +1791,7 @@
     </w:p>
     <w:p>
       <w:pPr>
-        <w:pStyle w:val="890"/>
+        <w:pStyle w:val="899"/>
         <w:numPr>
           <w:ilvl w:val="0"/>
           <w:numId w:val="2"/>
@@ -1822,7 +1822,7 @@
     </w:p>
     <w:p>
       <w:pPr>
-        <w:pStyle w:val="890"/>
+        <w:pStyle w:val="899"/>
         <w:numPr>
           <w:ilvl w:val="0"/>
           <w:numId w:val="2"/>
@@ -1845,6 +1845,11 @@
           <w:highlight w:val="none"/>
         </w:rPr>
       </w:r>
+      <w:r>
+        <w:rPr>
+          <w:highlight w:val="none"/>
+        </w:rPr>
+      </w:r>
     </w:p>
     <w:p>
       <w:pPr>
@@ -1890,7 +1895,13 @@
         <w:rPr>
           <w:highlight w:val="none"/>
         </w:rPr>
-        <w:t xml:space="preserve">ach. There will be a celestial body class. Celestial bodies will be stored as objects. Their masses, positions and sizes will be stored as attributes. I can just display those attributes (these attributes will be fetched from a NASA database as explained later, which is a reliable source.)</w:t>
+        <w:t xml:space="preserve">ach. There will be a celestial bod</w:t>
+      </w:r>
+      <w:r>
+        <w:rPr>
+          <w:highlight w:val="none"/>
+        </w:rPr>
+        <w:t xml:space="preserve">y class. Celestial bodies will be stored as objects. Their masses, positions and sizes will be stored as attributes. I can just display those attributes (these attributes will be fetched from a NASA database as explained later, which is a reliable source.)</w:t>
       </w:r>
       <w:r>
         <w:rPr>
@@ -1986,7 +1997,13 @@
         <w:rPr>
           <w:highlight w:val="none"/>
         </w:rPr>
-        <w:t xml:space="preserve">upposed to be an accurate simulation. The hard bit is trying to make it clear to kids how those things are happening in the program, and help them get a better understanding of it. I will try displaying both the potential and kinetic energy of the system, as well as the total. This will show that while the types of energy change, the total amount of energy stays constant.</w:t>
+        <w:t xml:space="preserve">upposed to be an accurate simulation. The hard bit is trying to make it clear to kids how those things are happening i</w:t>
+      </w:r>
+      <w:r>
+        <w:rPr>
+          <w:highlight w:val="none"/>
+        </w:rPr>
+        <w:t xml:space="preserve">n the program, and help them get a better understanding of it. I will try displaying both the potential and kinetic energy of the system, as well as the total. This will show that while the types of energy change, the total amount of energy stays constant.</w:t>
       </w:r>
       <w:r>
         <w:rPr>
@@ -2026,7 +2043,7 @@
     </w:p>
     <w:p>
       <w:pPr>
-        <w:pStyle w:val="712"/>
+        <w:pStyle w:val="721"/>
         <w:pBdr/>
         <w:spacing/>
         <w:ind/>
@@ -2054,7 +2071,7 @@
     </w:p>
     <w:p>
       <w:pPr>
-        <w:pStyle w:val="714"/>
+        <w:pStyle w:val="723"/>
         <w:pBdr/>
         <w:spacing/>
         <w:ind/>
@@ -2097,29 +2114,29 @@
       <w:hyperlink r:id="rId12" w:tooltip="https://eyes.nasa.gov/apps/orrery/#/home" w:history="1">
         <w:r>
           <w:rPr>
-            <w:rStyle w:val="868"/>
+            <w:rStyle w:val="877"/>
             <w:highlight w:val="none"/>
           </w:rPr>
           <w:t xml:space="preserve">https://eyes.nasa.gov/apps/orrery/#/home</w:t>
         </w:r>
         <w:r>
           <w:rPr>
-            <w:rStyle w:val="868"/>
+            <w:rStyle w:val="877"/>
           </w:rPr>
         </w:r>
         <w:r>
           <w:rPr>
-            <w:rStyle w:val="868"/>
+            <w:rStyle w:val="877"/>
           </w:rPr>
         </w:r>
         <w:r>
           <w:rPr>
-            <w:rStyle w:val="868"/>
+            <w:rStyle w:val="877"/>
           </w:rPr>
         </w:r>
         <w:r>
           <w:rPr>
-            <w:rStyle w:val="868"/>
+            <w:rStyle w:val="877"/>
           </w:rPr>
         </w:r>
       </w:hyperlink>
@@ -2310,7 +2327,7 @@
     </w:p>
     <w:p>
       <w:pPr>
-        <w:pStyle w:val="714"/>
+        <w:pStyle w:val="723"/>
         <w:pBdr/>
         <w:spacing/>
         <w:ind/>
@@ -2349,18 +2366,18 @@
       <w:hyperlink r:id="rId14" w:tooltip="https://phet.colorado.edu/sims/html/my-solar-system/latest/my-solar-system_all.html" w:history="1">
         <w:r>
           <w:rPr>
-            <w:rStyle w:val="868"/>
+            <w:rStyle w:val="877"/>
           </w:rPr>
           <w:t xml:space="preserve">https://phet.colorado.edu/sims/html/my-solar-system/latest/my-solar-system_all.html</w:t>
         </w:r>
         <w:r>
           <w:rPr>
-            <w:rStyle w:val="868"/>
+            <w:rStyle w:val="877"/>
           </w:rPr>
         </w:r>
         <w:r>
           <w:rPr>
-            <w:rStyle w:val="868"/>
+            <w:rStyle w:val="877"/>
           </w:rPr>
         </w:r>
       </w:hyperlink>
@@ -2551,7 +2568,7 @@
     </w:p>
     <w:p>
       <w:pPr>
-        <w:pStyle w:val="712"/>
+        <w:pStyle w:val="721"/>
         <w:pBdr/>
         <w:spacing/>
         <w:ind/>
@@ -2594,6 +2611,11 @@
       </w:r>
       <w:r>
         <w:t xml:space="preserve">es.</w:t>
+      </w:r>
+      <w:r>
+        <w:rPr>
+          <w:highlight w:val="none"/>
+        </w:rPr>
       </w:r>
       <w:r>
         <w:rPr>
@@ -2623,7 +2645,7 @@
     </w:p>
     <w:p>
       <w:pPr>
-        <w:pStyle w:val="890"/>
+        <w:pStyle w:val="899"/>
         <w:numPr>
           <w:ilvl w:val="0"/>
           <w:numId w:val="3"/>
@@ -2640,7 +2662,7 @@
     </w:p>
     <w:p>
       <w:pPr>
-        <w:pStyle w:val="890"/>
+        <w:pStyle w:val="899"/>
         <w:numPr>
           <w:ilvl w:val="0"/>
           <w:numId w:val="3"/>
@@ -2665,7 +2687,7 @@
     </w:p>
     <w:p>
       <w:pPr>
-        <w:pStyle w:val="890"/>
+        <w:pStyle w:val="899"/>
         <w:numPr>
           <w:ilvl w:val="0"/>
           <w:numId w:val="3"/>
@@ -2690,7 +2712,7 @@
     </w:p>
     <w:p>
       <w:pPr>
-        <w:pStyle w:val="890"/>
+        <w:pStyle w:val="899"/>
         <w:numPr>
           <w:ilvl w:val="0"/>
           <w:numId w:val="3"/>
@@ -2725,7 +2747,7 @@
     </w:p>
     <w:p>
       <w:pPr>
-        <w:pStyle w:val="712"/>
+        <w:pStyle w:val="721"/>
         <w:pBdr/>
         <w:spacing/>
         <w:ind/>
@@ -2753,7 +2775,7 @@
     </w:p>
     <w:p>
       <w:pPr>
-        <w:pStyle w:val="714"/>
+        <w:pStyle w:val="723"/>
         <w:pBdr/>
         <w:spacing/>
         <w:ind/>
@@ -2997,7 +3019,7 @@
     </w:p>
     <w:p>
       <w:pPr>
-        <w:pStyle w:val="714"/>
+        <w:pStyle w:val="723"/>
         <w:pBdr/>
         <w:spacing/>
         <w:ind/>
@@ -3049,22 +3071,26 @@
       <w:hyperlink r:id="rId17" w:tooltip="https://ssd.jpl.nasa.gov/horizons/" w:history="1">
         <w:r>
           <w:rPr>
-            <w:rStyle w:val="868"/>
+            <w:rStyle w:val="877"/>
           </w:rPr>
           <w:t xml:space="preserve">https://ssd.jpl.nasa.gov/horizons/</w:t>
         </w:r>
         <w:r>
           <w:rPr>
-            <w:rStyle w:val="868"/>
+            <w:rStyle w:val="877"/>
           </w:rPr>
         </w:r>
         <w:r>
           <w:rPr>
-            <w:rStyle w:val="868"/>
+            <w:rStyle w:val="877"/>
           </w:rPr>
         </w:r>
       </w:hyperlink>
-      <w:r/>
+      <w:r>
+        <w:rPr>
+          <w:highlight w:val="none"/>
+        </w:rPr>
+      </w:r>
       <w:r>
         <w:rPr>
           <w:highlight w:val="none"/>
@@ -3084,13 +3110,13 @@
         <w:rPr>
           <w:highlight w:val="none"/>
         </w:rPr>
-        <w:t xml:space="preserve">Horizons is an online database that hosts real time information on planets. The idea will be to access this data using their API or</w:t>
-      </w:r>
-      <w:r>
-        <w:rPr>
-          <w:highlight w:val="none"/>
-        </w:rPr>
-        <w:t xml:space="preserve"> command-line interface, both of which use HTTP POST queries, and then translate that data to parameters for planets in my program, and load the solar system. Parsing the data may be tricky, but once I have the mass, positions and velocites of the planets </w:t>
+        <w:t xml:space="preserve">Horizons is an online database that hosts real time information on planets. The idea will be to access this data using their API</w:t>
+      </w:r>
+      <w:r>
+        <w:rPr>
+          <w:highlight w:val="none"/>
+        </w:rPr>
+        <w:t xml:space="preserve">, which uses HTTP POST queries, and then translate that data to parameters for planets in my program, and load the solar system. Parsing the data may be tricky, but once I have the mass, positions and velocites of the planets </w:t>
       </w:r>
       <w:r>
         <w:rPr>
@@ -3103,7 +3129,11 @@
           <w:highlight w:val="none"/>
         </w:rPr>
       </w:r>
-      <w:r/>
+      <w:r>
+        <w:rPr>
+          <w:highlight w:val="none"/>
+        </w:rPr>
+      </w:r>
     </w:p>
     <w:p>
       <w:pPr>
@@ -3111,22 +3141,26 @@
         <w:spacing/>
         <w:ind/>
         <w:rPr>
-          <w:highlight w:val="none"/>
-        </w:rPr>
-      </w:pPr>
-      <w:r>
-        <w:rPr>
-          <w:highlight w:val="none"/>
-        </w:rPr>
-        <w:t xml:space="preserve">This is the query that will be used:</w:t>
-      </w:r>
-      <w:r>
-        <w:rPr>
-          <w:highlight w:val="none"/>
-        </w:rPr>
-      </w:r>
-      <w:r>
-        <w:rPr>
+          <w:color w:val="000000" w:themeColor="text1"/>
+          <w:sz w:val="22"/>
+          <w:szCs w:val="22"/>
+          <w:highlight w:val="none"/>
+        </w:rPr>
+      </w:pPr>
+      <w:r>
+        <w:rPr>
+          <w:color w:val="000000" w:themeColor="text1"/>
+          <w:sz w:val="22"/>
+          <w:szCs w:val="18"/>
+          <w:highlight w:val="none"/>
+        </w:rPr>
+        <w:t xml:space="preserve">This is the request I will be using:</w:t>
+      </w:r>
+      <w:r>
+        <w:rPr>
+          <w:color w:val="000000" w:themeColor="text1"/>
+          <w:sz w:val="22"/>
+          <w:szCs w:val="22"/>
           <w:highlight w:val="none"/>
         </w:rPr>
       </w:r>
@@ -3137,44 +3171,71 @@
         <w:spacing/>
         <w:ind/>
         <w:rPr>
-          <w:highlight w:val="none"/>
-        </w:rPr>
-      </w:pPr>
-      <w:r>
-        <w:rPr>
-          <w:highlight w:val="none"/>
-        </w:rPr>
-      </w:r>
-      <w:r>
-        <w:rPr>
-          <w:highlight w:val="none"/>
-        </w:rPr>
-      </w:r>
-      <w:hyperlink r:id="rId18" w:tooltip="https://ssd.jpl.nasa.gov/api/horizons.api?format=text&amp;COMMAND='&quot;+target+&quot;'&amp;OBJ_DATA='YES'&amp;MAKE_EPHEM='YES'&amp;EPHEM_TYPE='VECTORS'&amp;START_TIME='&quot;+startTime+&quot;'&amp;STOP_TIME='&quot;+stopTime+&quot;'&amp;CENTER='500@0'&amp;STEP_SIZE='1 d'&amp;QUANTITIES=''" w:history="1">
+          <w:color w:val="000000" w:themeColor="text1"/>
+          <w:sz w:val="22"/>
+          <w:szCs w:val="22"/>
+          <w:highlight w:val="none"/>
+        </w:rPr>
+      </w:pPr>
+      <w:r>
+        <w:rPr>
+          <w:color w:val="000000" w:themeColor="text1"/>
+          <w:sz w:val="22"/>
+          <w:szCs w:val="18"/>
+          <w:highlight w:val="none"/>
+        </w:rPr>
+      </w:r>
+      <w:r>
+        <w:rPr>
+          <w:color w:val="000000" w:themeColor="text1"/>
+          <w:sz w:val="22"/>
+          <w:szCs w:val="18"/>
+          <w:highlight w:val="none"/>
+        </w:rPr>
+      </w:r>
+      <w:hyperlink r:id="rId18" w:tooltip="https://ssd.jpl.nasa.gov/api/horizons.api?format=text&amp;COMMAND='&quot;+target+&quot;'&amp;OBJ_DATA='YES'&amp;MAKE_EPHEM='YES'&amp;EPHEM_TYPE='VECTORS'&amp;START_TIME='&quot;+startTime+&quot;'&amp;STOP_TIME='&quot;+stopTime+&quot;'&amp;CENTER='500@0'&amp;STEP_SIZE='1 d'&amp;QUANTITIES='1,9,20,23,24,29'" w:history="1">
         <w:r>
           <w:rPr>
-            <w:rStyle w:val="868"/>
+            <w:rStyle w:val="877"/>
+            <w:color w:val="000000" w:themeColor="text1"/>
+            <w:sz w:val="22"/>
+            <w:szCs w:val="18"/>
             <w:highlight w:val="none"/>
           </w:rPr>
-          <w:t xml:space="preserve">https://ssd.jpl.nasa.gov/api/horizons.api?format=text&amp;COMMAND='"+target+"'&amp;OBJ_DATA='YES'&amp;MAKE_EPHEM='YES'&amp;EPHEM_TYPE='VECTORS'&amp;START_TIME='"+startTime+"'&amp;STOP_TIME='"+stopTime+"'&amp;CENTER='500@0'&amp;STEP_SIZE='1%20d'&amp;QUANTITIES=''</w:t>
+          <w:t xml:space="preserve">https://ssd.jpl.nasa.gov/api/horizons.api?format=text&amp;COMMAND='"+target+"'&amp;OBJ_DATA='YES'&amp;MAKE_EPHEM='YES'&amp;EPHEM_TYPE='VECTORS'&amp;START_TIME='"+startTime+"'&amp;STOP_TIME='"+stopTime+"'&amp;CENTER='500@0'&amp;STEP_SIZE='1%20d'&amp;QUANTITIES=''’</w:t>
         </w:r>
         <w:r>
           <w:rPr>
-            <w:rStyle w:val="868"/>
+            <w:rStyle w:val="877"/>
+            <w:color w:val="000000" w:themeColor="text1"/>
+            <w:sz w:val="22"/>
+            <w:szCs w:val="18"/>
             <w:highlight w:val="none"/>
           </w:rPr>
         </w:r>
         <w:r>
           <w:rPr>
-            <w:rStyle w:val="868"/>
+            <w:rStyle w:val="877"/>
+            <w:color w:val="000000" w:themeColor="text1"/>
+            <w:sz w:val="22"/>
+            <w:szCs w:val="18"/>
             <w:highlight w:val="none"/>
           </w:rPr>
         </w:r>
       </w:hyperlink>
-      <w:r/>
-      <w:r/>
-      <w:r>
-        <w:rPr>
+      <w:r>
+        <w:rPr>
+          <w:color w:val="000000" w:themeColor="text1"/>
+          <w:sz w:val="22"/>
+          <w:szCs w:val="22"/>
+          <w:highlight w:val="none"/>
+        </w:rPr>
+      </w:r>
+      <w:r>
+        <w:rPr>
+          <w:color w:val="000000" w:themeColor="text1"/>
+          <w:sz w:val="22"/>
+          <w:szCs w:val="22"/>
           <w:highlight w:val="none"/>
         </w:rPr>
       </w:r>
@@ -3185,52 +3246,600 @@
         <w:spacing/>
         <w:ind/>
         <w:rPr>
-          <w:highlight w:val="none"/>
-        </w:rPr>
-      </w:pPr>
-      <w:r>
-        <w:rPr>
-          <w:highlight w:val="none"/>
-        </w:rPr>
-      </w:r>
-      <w:r>
-        <w:rPr>
+          <w:color w:val="000000" w:themeColor="text1"/>
+          <w:sz w:val="22"/>
+          <w:szCs w:val="22"/>
+          <w:highlight w:val="none"/>
+        </w:rPr>
+      </w:pPr>
+      <w:r>
+        <w:rPr>
+          <w:color w:val="000000" w:themeColor="text1"/>
+          <w:sz w:val="22"/>
+          <w:szCs w:val="22"/>
+          <w:highlight w:val="none"/>
+        </w:rPr>
+        <w:t xml:space="preserve">Target, startTime and stopTime represent variables that will be set by the program. The rest of the request will not change. Here is an explanation of the important settings I’ve used in the request:</w:t>
+      </w:r>
+      <w:r>
+        <w:rPr>
+          <w:color w:val="000000" w:themeColor="text1"/>
+          <w:sz w:val="22"/>
+          <w:szCs w:val="22"/>
           <w:highlight w:val="none"/>
         </w:rPr>
       </w:r>
     </w:p>
     <w:p>
       <w:pPr>
-        <w:pStyle w:val="714"/>
-        <w:pBdr/>
-        <w:spacing/>
-        <w:ind/>
-        <w:jc w:val="both"/>
-        <w:rPr>
-          <w:color w:val="5b9bd5"/>
-        </w:rPr>
-      </w:pPr>
-      <w:r>
-        <w:rPr>
-          <w:color w:val="4472c4" w:themeColor="accent5"/>
-          <w:highlight w:val="none"/>
-        </w:rPr>
-        <w:t xml:space="preserve">The maths of simulating a solar system</w:t>
-      </w:r>
-      <w:r>
-        <w:rPr>
-          <w:color w:val="5b9bd5"/>
-        </w:rPr>
-      </w:r>
-      <w:r>
-        <w:rPr>
-          <w:color w:val="5b9bd5"/>
+        <w:pBdr/>
+        <w:spacing/>
+        <w:ind/>
+        <w:rPr>
+          <w:color w:val="000000" w:themeColor="text1"/>
+          <w:sz w:val="22"/>
+          <w:szCs w:val="22"/>
+          <w:highlight w:val="none"/>
+        </w:rPr>
+      </w:pPr>
+      <w:r>
+        <w:rPr>
+          <w:color w:val="000000" w:themeColor="text1"/>
+          <w:sz w:val="22"/>
+          <w:szCs w:val="22"/>
+          <w:highlight w:val="none"/>
+        </w:rPr>
+        <w:t xml:space="preserve">EPHEM_TYPE: This h</w:t>
+      </w:r>
+      <w:r>
+        <w:rPr>
+          <w:color w:val="000000" w:themeColor="text1"/>
+          <w:sz w:val="22"/>
+          <w:szCs w:val="22"/>
+          <w:highlight w:val="none"/>
+        </w:rPr>
+        <w:t xml:space="preserve">as multiple options. However the other options are all intended for uses not relevant to my program, e.g. making telescope observations or planning space missions to other planets. VECTORS is the type that NASA recommends for programming on their own site:</w:t>
+      </w:r>
+      <w:r>
+        <w:rPr>
+          <w:color w:val="000000" w:themeColor="text1"/>
+          <w:sz w:val="22"/>
+          <w:szCs w:val="22"/>
+          <w:highlight w:val="none"/>
+        </w:rPr>
+      </w:r>
+      <w:r>
+        <w:rPr>
+          <w:color w:val="000000" w:themeColor="text1"/>
+          <w:sz w:val="22"/>
+          <w:szCs w:val="22"/>
+          <w:highlight w:val="none"/>
         </w:rPr>
       </w:r>
     </w:p>
     <w:p>
       <w:pPr>
-        <w:pStyle w:val="714"/>
+        <w:pBdr/>
+        <w:spacing/>
+        <w:ind/>
+        <w:rPr>
+          <w:color w:val="000000" w:themeColor="text1"/>
+          <w:sz w:val="22"/>
+          <w:szCs w:val="22"/>
+          <w:highlight w:val="none"/>
+        </w:rPr>
+      </w:pPr>
+      <w:r>
+        <w:rPr>
+          <w:color w:val="000000" w:themeColor="text1"/>
+          <w:sz w:val="22"/>
+          <w:szCs w:val="22"/>
+          <w:highlight w:val="none"/>
+        </w:rPr>
+      </w:r>
+      <w:r>
+        <w:rPr>
+          <w:color w:val="000000" w:themeColor="text1"/>
+          <w:sz w:val="22"/>
+          <w:szCs w:val="22"/>
+          <w:highlight w:val="none"/>
+        </w:rPr>
+      </w:r>
+      <w:hyperlink r:id="rId19" w:tooltip="https://ssd-api.jpl.nasa.gov/doc/horizons.html#ephem_type" w:history="1">
+        <w:r>
+          <w:rPr>
+            <w:rStyle w:val="877"/>
+            <w:color w:val="000000" w:themeColor="text1"/>
+            <w:sz w:val="22"/>
+            <w:szCs w:val="22"/>
+            <w:highlight w:val="none"/>
+          </w:rPr>
+          <w:t xml:space="preserve">https://ssd-api.jpl.nasa.gov/doc/horizons.html#ephem_type</w:t>
+        </w:r>
+        <w:r>
+          <w:rPr>
+            <w:rStyle w:val="877"/>
+            <w:color w:val="000000" w:themeColor="text1"/>
+            <w:sz w:val="22"/>
+            <w:szCs w:val="22"/>
+            <w:highlight w:val="none"/>
+          </w:rPr>
+        </w:r>
+        <w:r>
+          <w:rPr>
+            <w:rStyle w:val="877"/>
+            <w:color w:val="000000" w:themeColor="text1"/>
+            <w:sz w:val="22"/>
+            <w:szCs w:val="22"/>
+            <w:highlight w:val="none"/>
+          </w:rPr>
+        </w:r>
+      </w:hyperlink>
+      <w:r>
+        <w:rPr>
+          <w:color w:val="000000" w:themeColor="text1"/>
+          <w:sz w:val="22"/>
+          <w:szCs w:val="22"/>
+          <w:highlight w:val="none"/>
+        </w:rPr>
+      </w:r>
+      <w:r>
+        <w:rPr>
+          <w:color w:val="000000" w:themeColor="text1"/>
+          <w:sz w:val="22"/>
+          <w:szCs w:val="22"/>
+          <w:highlight w:val="none"/>
+        </w:rPr>
+      </w:r>
+    </w:p>
+    <w:p>
+      <w:pPr>
+        <w:pBdr/>
+        <w:spacing/>
+        <w:ind/>
+        <w:rPr>
+          <w:color w:val="000000" w:themeColor="text1"/>
+          <w:sz w:val="22"/>
+          <w:szCs w:val="22"/>
+          <w:highlight w:val="none"/>
+        </w:rPr>
+      </w:pPr>
+      <w:r>
+        <w:rPr>
+          <w:color w:val="000000" w:themeColor="text1"/>
+          <w:sz w:val="22"/>
+          <w:szCs w:val="22"/>
+          <w:highlight w:val="none"/>
+        </w:rPr>
+        <w:t xml:space="preserve">So it’s the one that I use.</w:t>
+      </w:r>
+      <w:r>
+        <w:rPr>
+          <w:color w:val="000000" w:themeColor="text1"/>
+          <w:sz w:val="22"/>
+          <w:szCs w:val="22"/>
+          <w:highlight w:val="none"/>
+        </w:rPr>
+      </w:r>
+      <w:r>
+        <w:rPr>
+          <w:color w:val="000000" w:themeColor="text1"/>
+          <w:sz w:val="22"/>
+          <w:szCs w:val="22"/>
+          <w:highlight w:val="none"/>
+        </w:rPr>
+      </w:r>
+    </w:p>
+    <w:p>
+      <w:pPr>
+        <w:pBdr/>
+        <w:spacing/>
+        <w:ind/>
+        <w:rPr>
+          <w:color w:val="000000" w:themeColor="text1"/>
+          <w:sz w:val="22"/>
+          <w:szCs w:val="22"/>
+          <w:highlight w:val="none"/>
+        </w:rPr>
+      </w:pPr>
+      <w:r>
+        <w:rPr>
+          <w:color w:val="000000" w:themeColor="text1"/>
+          <w:sz w:val="22"/>
+          <w:szCs w:val="22"/>
+          <w:highlight w:val="none"/>
+        </w:rPr>
+        <w:t xml:space="preserve">CENTER: </w:t>
+      </w:r>
+      <w:r>
+        <w:rPr>
+          <w:color w:val="000000" w:themeColor="text1"/>
+          <w:sz w:val="22"/>
+          <w:szCs w:val="22"/>
+          <w:highlight w:val="none"/>
+        </w:rPr>
+        <w:t xml:space="preserve">This is the reference location for the coordinates returned by Ephemeris. 500@0 is the ID for the Solar Barycenter, the center of mass of the solar system. This is the most objective reference point available for our solar system, so is the one that I use.</w:t>
+      </w:r>
+      <w:r>
+        <w:rPr>
+          <w:color w:val="000000" w:themeColor="text1"/>
+          <w:sz w:val="22"/>
+          <w:szCs w:val="22"/>
+          <w:highlight w:val="none"/>
+        </w:rPr>
+      </w:r>
+      <w:r>
+        <w:rPr>
+          <w:color w:val="000000" w:themeColor="text1"/>
+          <w:sz w:val="22"/>
+          <w:szCs w:val="22"/>
+          <w:highlight w:val="none"/>
+        </w:rPr>
+      </w:r>
+    </w:p>
+    <w:p>
+      <w:pPr>
+        <w:pBdr/>
+        <w:spacing/>
+        <w:ind/>
+        <w:rPr>
+          <w:color w:val="000000" w:themeColor="text1"/>
+          <w:sz w:val="22"/>
+          <w:szCs w:val="22"/>
+          <w:highlight w:val="none"/>
+        </w:rPr>
+      </w:pPr>
+      <w:r>
+        <w:rPr>
+          <w:color w:val="000000" w:themeColor="text1"/>
+          <w:sz w:val="22"/>
+          <w:szCs w:val="22"/>
+          <w:highlight w:val="none"/>
+        </w:rPr>
+        <w:t xml:space="preserve">STEP_SIZE: This just means the ephemeris generates coordinates every day, this isn’t really relevant to the program as I’m only using the initial coordinates given in the response and simulating the rest from there.</w:t>
+      </w:r>
+      <w:r>
+        <w:rPr>
+          <w:color w:val="000000" w:themeColor="text1"/>
+          <w:sz w:val="22"/>
+          <w:szCs w:val="22"/>
+          <w:highlight w:val="none"/>
+        </w:rPr>
+      </w:r>
+      <w:r>
+        <w:rPr>
+          <w:color w:val="000000" w:themeColor="text1"/>
+          <w:sz w:val="22"/>
+          <w:szCs w:val="22"/>
+          <w:highlight w:val="none"/>
+        </w:rPr>
+      </w:r>
+    </w:p>
+    <w:p>
+      <w:pPr>
+        <w:pBdr/>
+        <w:spacing/>
+        <w:ind/>
+        <w:rPr>
+          <w:color w:val="000000" w:themeColor="text1"/>
+          <w:sz w:val="22"/>
+          <w:szCs w:val="22"/>
+          <w:highlight w:val="none"/>
+        </w:rPr>
+      </w:pPr>
+      <w:r>
+        <w:rPr>
+          <w:color w:val="000000" w:themeColor="text1"/>
+          <w:sz w:val="22"/>
+          <w:szCs w:val="22"/>
+          <w:highlight w:val="none"/>
+        </w:rPr>
+        <w:t xml:space="preserve">QUANTITIES: This lets you request a bunch of very cool information, but none of it is needed by my program, so to make getting the request faster and to reduce the size of the requests it is set to be empty.</w:t>
+      </w:r>
+      <w:r>
+        <w:rPr>
+          <w:highlight w:val="none"/>
+        </w:rPr>
+      </w:r>
+      <w:r>
+        <w:rPr>
+          <w:highlight w:val="none"/>
+        </w:rPr>
+      </w:r>
+      <w:r>
+        <w:rPr>
+          <w:highlight w:val="none"/>
+        </w:rPr>
+      </w:r>
+      <w:r>
+        <w:rPr>
+          <w:color w:val="000000" w:themeColor="text1"/>
+          <w:sz w:val="22"/>
+          <w:szCs w:val="22"/>
+          <w:highlight w:val="none"/>
+        </w:rPr>
+      </w:r>
+    </w:p>
+    <w:p>
+      <w:pPr>
+        <w:pBdr/>
+        <w:spacing/>
+        <w:ind/>
+        <w:rPr>
+          <w:color w:val="000000" w:themeColor="text1"/>
+          <w:sz w:val="22"/>
+          <w:szCs w:val="22"/>
+          <w:highlight w:val="none"/>
+        </w:rPr>
+      </w:pPr>
+      <w:r>
+        <w:rPr>
+          <w:color w:val="000000" w:themeColor="text1"/>
+          <w:sz w:val="22"/>
+          <w:szCs w:val="22"/>
+          <w:highlight w:val="none"/>
+        </w:rPr>
+      </w:r>
+      <w:r>
+        <w:rPr>
+          <w:color w:val="000000" w:themeColor="text1"/>
+          <w:sz w:val="22"/>
+          <w:szCs w:val="22"/>
+          <w:highlight w:val="none"/>
+        </w:rPr>
+      </w:r>
+    </w:p>
+    <w:p>
+      <w:pPr>
+        <w:pBdr/>
+        <w:spacing/>
+        <w:ind/>
+        <w:rPr>
+          <w:color w:val="000000" w:themeColor="text1"/>
+          <w:sz w:val="22"/>
+          <w:szCs w:val="22"/>
+          <w:highlight w:val="none"/>
+        </w:rPr>
+      </w:pPr>
+      <w:r>
+        <w:rPr>
+          <w:color w:val="000000" w:themeColor="text1"/>
+          <w:sz w:val="22"/>
+          <w:szCs w:val="22"/>
+          <w:highlight w:val="none"/>
+        </w:rPr>
+        <w:t xml:space="preserve">Once the request is received, it must be parsed so that the relevant parameters can be extracted. The basic strategy I’ll use is to first search for key phrases in the text like “Mass” or “Radius” which indicate that a parameter I want is about to come up. Once a key phrase is found, this algorithm will be used to get the numerical value out:</w:t>
+      </w:r>
+      <w:r>
+        <w:rPr>
+          <w:color w:val="000000" w:themeColor="text1"/>
+          <w:sz w:val="22"/>
+          <w:szCs w:val="22"/>
+          <w:highlight w:val="none"/>
+        </w:rPr>
+      </w:r>
+    </w:p>
+    <w:p>
+      <w:pPr>
+        <w:pBdr/>
+        <w:spacing/>
+        <w:ind/>
+        <w:rPr>
+          <w:color w:val="000000" w:themeColor="text1"/>
+          <w:sz w:val="22"/>
+          <w:szCs w:val="22"/>
+          <w:highlight w:val="none"/>
+        </w:rPr>
+      </w:pPr>
+      <w:r>
+        <w:rPr>
+          <w:color w:val="000000" w:themeColor="text1"/>
+          <w:sz w:val="22"/>
+          <w:szCs w:val="22"/>
+          <w:highlight w:val="none"/>
+        </w:rPr>
+      </w:r>
+      <w:r>
+        <w:rPr>
+          <w:color w:val="000000" w:themeColor="text1"/>
+          <w:sz w:val="22"/>
+          <w:szCs w:val="22"/>
+          <w:highlight w:val="none"/>
+        </w:rPr>
+      </w:r>
+    </w:p>
+    <w:p>
+      <w:pPr>
+        <w:pBdr/>
+        <w:spacing/>
+        <w:ind/>
+        <w:rPr>
+          <w:color w:val="000000" w:themeColor="text1"/>
+          <w:sz w:val="22"/>
+          <w:szCs w:val="22"/>
+          <w:highlight w:val="none"/>
+        </w:rPr>
+      </w:pPr>
+      <w:r>
+        <w:rPr>
+          <w:color w:val="000000" w:themeColor="text1"/>
+          <w:sz w:val="22"/>
+          <w:szCs w:val="22"/>
+          <w:highlight w:val="none"/>
+        </w:rPr>
+        <mc:AlternateContent>
+          <mc:Choice Requires="wpg">
+            <w:drawing>
+              <wp:inline xmlns:wp="http://schemas.openxmlformats.org/drawingml/2006/wordprocessingDrawing" distT="0" distB="0" distL="0" distR="0">
+                <wp:extent cx="5940425" cy="7141203"/>
+                <wp:effectExtent l="0" t="0" r="0" b="0"/>
+                <wp:docPr id="5" name=""/>
+                <wp:cNvGraphicFramePr>
+                  <a:graphicFrameLocks xmlns:a="http://schemas.openxmlformats.org/drawingml/2006/main" noChangeAspect="1"/>
+                </wp:cNvGraphicFramePr>
+                <a:graphic xmlns:a="http://schemas.openxmlformats.org/drawingml/2006/main">
+                  <a:graphicData uri="http://schemas.openxmlformats.org/drawingml/2006/picture">
+                    <pic:pic xmlns:pic="http://schemas.openxmlformats.org/drawingml/2006/picture">
+                      <pic:nvPicPr>
+                        <pic:cNvPr id="471979064" name=""/>
+                        <pic:cNvPicPr>
+                          <a:picLocks noChangeAspect="1"/>
+                        </pic:cNvPicPr>
+                        <pic:nvPr/>
+                      </pic:nvPicPr>
+                      <pic:blipFill>
+                        <a:blip r:embed="rId20"/>
+                        <a:stretch/>
+                      </pic:blipFill>
+                      <pic:spPr bwMode="auto">
+                        <a:xfrm rot="0" flipH="0" flipV="0">
+                          <a:off x="0" y="0"/>
+                          <a:ext cx="5940424" cy="7141203"/>
+                        </a:xfrm>
+                        <a:prstGeom prst="rect">
+                          <a:avLst/>
+                        </a:prstGeom>
+                      </pic:spPr>
+                    </pic:pic>
+                  </a:graphicData>
+                </a:graphic>
+              </wp:inline>
+            </w:drawing>
+          </mc:Choice>
+          <mc:Fallback>
+            <w:pict>
+              <v:shapetype id="_x0000_t75" coordsize="21600,21600" o:spt="75" o:preferrelative="t" path="m@4@5l@4@11@9@11@9@5xe" filled="f" stroked="f">
+                <v:stroke joinstyle="miter"/>
+                <v:formulas>
+                  <v:f eqn="if lineDrawn pixelLineWidth 0"/>
+                  <v:f eqn="sum @0 1 0"/>
+                  <v:f eqn="sum 0 0 @1"/>
+                  <v:f eqn="prod @2 1 2"/>
+                  <v:f eqn="prod @3 21600 pixelWidth"/>
+                  <v:f eqn="prod @3 21600 pixelHeight"/>
+                  <v:f eqn="sum @0 0 1"/>
+                  <v:f eqn="prod @6 1 2"/>
+                  <v:f eqn="prod @7 21600 pixelWidth"/>
+                  <v:f eqn="sum @8 21600 0"/>
+                  <v:f eqn="prod @7 21600 pixelHeight"/>
+                  <v:f eqn="sum @10 21600 0"/>
+                </v:formulas>
+                <v:path o:extrusionok="f" gradientshapeok="t" o:connecttype="rect"/>
+                <o:lock v:ext="edit" aspectratio="t"/>
+              </v:shapetype>
+              <v:shape id="_x0000_i4" o:spid="_x0000_s4" type="#_x0000_t75" style="width:467.75pt;height:562.30pt;mso-wrap-distance-left:0.00pt;mso-wrap-distance-top:0.00pt;mso-wrap-distance-right:0.00pt;mso-wrap-distance-bottom:0.00pt;rotation:0;z-index:1;" stroked="false">
+                <v:imagedata r:id="rId20" o:title=""/>
+                <o:lock v:ext="edit" rotation="t"/>
+              </v:shape>
+            </w:pict>
+          </mc:Fallback>
+        </mc:AlternateContent>
+      </w:r>
+      <w:r>
+        <w:rPr>
+          <w:color w:val="000000" w:themeColor="text1"/>
+          <w:sz w:val="22"/>
+          <w:szCs w:val="22"/>
+          <w:highlight w:val="none"/>
+        </w:rPr>
+      </w:r>
+      <w:r>
+        <w:rPr>
+          <w:color w:val="000000" w:themeColor="text1"/>
+          <w:sz w:val="22"/>
+          <w:szCs w:val="22"/>
+          <w:highlight w:val="none"/>
+        </w:rPr>
+      </w:r>
+    </w:p>
+    <w:p>
+      <w:pPr>
+        <w:pStyle w:val="723"/>
+        <w:pBdr/>
+        <w:spacing/>
+        <w:ind/>
+        <w:jc w:val="both"/>
+        <w:rPr>
+          <w:color w:val="000000" w:themeColor="text1"/>
+          <w:sz w:val="22"/>
+          <w:szCs w:val="22"/>
+        </w:rPr>
+      </w:pPr>
+      <w:r>
+        <w:rPr>
+          <w:color w:val="000000" w:themeColor="text1"/>
+          <w:sz w:val="22"/>
+          <w:szCs w:val="22"/>
+          <w:highlight w:val="none"/>
+        </w:rPr>
+        <w:t xml:space="preserve">Because NASA formats their data horribly, there are a lot of caveats involved that will need to be overcome in order to sucessfully parse the data. This will be covered in the design.</w:t>
+      </w:r>
+      <w:r>
+        <w:rPr>
+          <w:color w:val="000000" w:themeColor="text1"/>
+          <w:sz w:val="22"/>
+          <w:szCs w:val="22"/>
+        </w:rPr>
+      </w:r>
+    </w:p>
+    <w:p>
+      <w:pPr>
+        <w:pStyle w:val="723"/>
+        <w:pBdr/>
+        <w:spacing/>
+        <w:ind/>
+        <w:jc w:val="both"/>
+        <w:rPr>
+          <w:color w:val="4472c4" w:themeColor="accent5"/>
+          <w:highlight w:val="none"/>
+        </w:rPr>
+      </w:pPr>
+      <w:r>
+        <w:rPr>
+          <w:color w:val="4472c4" w:themeColor="accent5"/>
+          <w:highlight w:val="none"/>
+        </w:rPr>
+      </w:r>
+      <w:r>
+        <w:rPr>
+          <w:color w:val="4472c4" w:themeColor="accent5"/>
+          <w:highlight w:val="none"/>
+        </w:rPr>
+      </w:r>
+    </w:p>
+    <w:p>
+      <w:pPr>
+        <w:pStyle w:val="723"/>
+        <w:pBdr/>
+        <w:spacing/>
+        <w:ind/>
+        <w:jc w:val="both"/>
+        <w:rPr>
+          <w:color w:val="4472c4" w:themeColor="accent5"/>
+          <w:highlight w:val="none"/>
+        </w:rPr>
+      </w:pPr>
+      <w:r>
+        <w:rPr>
+          <w:color w:val="4472c4" w:themeColor="accent5"/>
+          <w:highlight w:val="none"/>
+        </w:rPr>
+        <w:t xml:space="preserve">The maths of simulating a solar system</w:t>
+      </w:r>
+      <w:r>
+        <w:rPr>
+          <w:color w:val="5b9bd5"/>
+        </w:rPr>
+      </w:r>
+      <w:r>
+        <w:rPr>
+          <w:color w:val="5b9bd5"/>
+        </w:rPr>
+      </w:r>
+    </w:p>
+    <w:p>
+      <w:pPr>
+        <w:pStyle w:val="723"/>
         <w:pBdr/>
         <w:spacing/>
         <w:ind/>
@@ -5221,7 +5830,7 @@
     </w:p>
     <w:p>
       <w:pPr>
-        <w:pStyle w:val="714"/>
+        <w:pStyle w:val="723"/>
         <w:pBdr/>
         <w:spacing/>
         <w:ind/>
@@ -5846,7 +6455,7 @@
               <wp:inline xmlns:wp="http://schemas.openxmlformats.org/drawingml/2006/wordprocessingDrawing" distT="0" distB="0" distL="0" distR="0">
                 <wp:extent cx="2998297" cy="10024717"/>
                 <wp:effectExtent l="0" t="0" r="0" b="0"/>
-                <wp:docPr id="5" name="" hidden="0"/>
+                <wp:docPr id="6" name="" hidden="0"/>
                 <wp:cNvGraphicFramePr>
                   <a:graphicFrameLocks xmlns:a="http://schemas.openxmlformats.org/drawingml/2006/main" noChangeAspect="1"/>
                 </wp:cNvGraphicFramePr>
@@ -5861,7 +6470,7 @@
                         <pic:nvPr isPhoto="0" userDrawn="0"/>
                       </pic:nvPicPr>
                       <pic:blipFill>
-                        <a:blip r:embed="rId19"/>
+                        <a:blip r:embed="rId21"/>
                         <a:stretch/>
                       </pic:blipFill>
                       <pic:spPr bwMode="auto">
@@ -5900,8 +6509,8 @@
                 <v:path o:extrusionok="f" gradientshapeok="t" o:connecttype="rect"/>
                 <o:lock v:ext="edit" aspectratio="t"/>
               </v:shapetype>
-              <v:shape id="_x0000_i4" o:spid="_x0000_s4" type="#_x0000_t75" style="width:236.09pt;height:789.35pt;mso-wrap-distance-left:0.00pt;mso-wrap-distance-top:0.00pt;mso-wrap-distance-right:0.00pt;mso-wrap-distance-bottom:0.00pt;z-index:1;" stroked="false">
-                <v:imagedata r:id="rId19" o:title=""/>
+              <v:shape id="_x0000_i5" o:spid="_x0000_s5" type="#_x0000_t75" style="width:236.09pt;height:789.35pt;mso-wrap-distance-left:0.00pt;mso-wrap-distance-top:0.00pt;mso-wrap-distance-right:0.00pt;mso-wrap-distance-bottom:0.00pt;z-index:1;" stroked="false">
+                <v:imagedata r:id="rId21" o:title=""/>
                 <o:lock v:ext="edit" rotation="t"/>
               </v:shape>
             </w:pict>
@@ -5946,7 +6555,7 @@
     </w:p>
     <w:p>
       <w:pPr>
-        <w:pStyle w:val="714"/>
+        <w:pStyle w:val="723"/>
         <w:pBdr/>
         <w:spacing/>
         <w:ind/>
@@ -5975,7 +6584,7 @@
     </w:p>
     <w:p>
       <w:pPr>
-        <w:pStyle w:val="890"/>
+        <w:pStyle w:val="899"/>
         <w:numPr>
           <w:ilvl w:val="0"/>
           <w:numId w:val="7"/>
@@ -5992,7 +6601,7 @@
     </w:p>
     <w:p>
       <w:pPr>
-        <w:pStyle w:val="890"/>
+        <w:pStyle w:val="899"/>
         <w:numPr>
           <w:ilvl w:val="1"/>
           <w:numId w:val="7"/>
@@ -6006,7 +6615,7 @@
         <w:rPr>
           <w:highlight w:val="none"/>
         </w:rPr>
-        <w:t xml:space="preserve">Model gravity accurately</w:t>
+        <w:t xml:space="preserve">Model the effects of gravity using Newton’s laws of motion</w:t>
       </w:r>
       <w:r>
         <w:rPr>
@@ -6017,7 +6626,7 @@
     </w:p>
     <w:p>
       <w:pPr>
-        <w:pStyle w:val="890"/>
+        <w:pStyle w:val="899"/>
         <w:numPr>
           <w:ilvl w:val="1"/>
           <w:numId w:val="7"/>
@@ -6031,13 +6640,37 @@
         <w:rPr>
           <w:highlight w:val="none"/>
         </w:rPr>
-        <w:t xml:space="preserve">Conserve important quantities (momentum and energy)</w:t>
+        <w:t xml:space="preserve">Display a scale model of the actual solar system using real, up to date data from NASA</w:t>
+      </w:r>
+      <w:r>
+        <w:rPr>
+          <w:highlight w:val="none"/>
+        </w:rPr>
+      </w:r>
+    </w:p>
+    <w:p>
+      <w:pPr>
+        <w:pStyle w:val="899"/>
+        <w:numPr>
+          <w:ilvl w:val="1"/>
+          <w:numId w:val="7"/>
+        </w:numPr>
+        <w:pBdr/>
+        <w:spacing/>
+        <w:ind/>
+        <w:rPr/>
+      </w:pPr>
+      <w:r>
+        <w:rPr>
+          <w:highlight w:val="none"/>
+        </w:rPr>
+        <w:t xml:space="preserve">Energy and momentum should be conserved (this should naturally arise from using Newton’s laws if they’re implemented correctly)</w:t>
       </w:r>
       <w:r/>
     </w:p>
     <w:p>
       <w:pPr>
-        <w:pStyle w:val="890"/>
+        <w:pStyle w:val="899"/>
         <w:numPr>
           <w:ilvl w:val="0"/>
           <w:numId w:val="7"/>
@@ -6062,7 +6695,7 @@
     </w:p>
     <w:p>
       <w:pPr>
-        <w:pStyle w:val="890"/>
+        <w:pStyle w:val="899"/>
         <w:numPr>
           <w:ilvl w:val="1"/>
           <w:numId w:val="7"/>
@@ -6087,7 +6720,7 @@
     </w:p>
     <w:p>
       <w:pPr>
-        <w:pStyle w:val="890"/>
+        <w:pStyle w:val="899"/>
         <w:numPr>
           <w:ilvl w:val="2"/>
           <w:numId w:val="7"/>
@@ -6101,7 +6734,7 @@
         <w:rPr>
           <w:highlight w:val="none"/>
         </w:rPr>
-        <w:t xml:space="preserve">Include useful diagrams such as force diagrams to aid with this</w:t>
+        <w:t xml:space="preserve">Include force diagrams to aid with this</w:t>
       </w:r>
       <w:r>
         <w:rPr>
@@ -6112,7 +6745,7 @@
     </w:p>
     <w:p>
       <w:pPr>
-        <w:pStyle w:val="890"/>
+        <w:pStyle w:val="899"/>
         <w:numPr>
           <w:ilvl w:val="2"/>
           <w:numId w:val="7"/>
@@ -6137,7 +6770,7 @@
     </w:p>
     <w:p>
       <w:pPr>
-        <w:pStyle w:val="890"/>
+        <w:pStyle w:val="899"/>
         <w:numPr>
           <w:ilvl w:val="0"/>
           <w:numId w:val="7"/>
@@ -6151,7 +6784,7 @@
         <w:rPr>
           <w:highlight w:val="none"/>
         </w:rPr>
-        <w:t xml:space="preserve">Display information when planets are selected</w:t>
+        <w:t xml:space="preserve">Display the mass, radius and distance from the sun when planets are selected</w:t>
       </w:r>
       <w:r>
         <w:rPr>
@@ -6162,7 +6795,7 @@
     </w:p>
     <w:p>
       <w:pPr>
-        <w:pStyle w:val="890"/>
+        <w:pStyle w:val="899"/>
         <w:numPr>
           <w:ilvl w:val="0"/>
           <w:numId w:val="7"/>
@@ -6176,7 +6809,7 @@
         <w:rPr>
           <w:highlight w:val="none"/>
         </w:rPr>
-        <w:t xml:space="preserve">Include a size comparison</w:t>
+        <w:t xml:space="preserve">Include the ability to compare sizes of two planets</w:t>
       </w:r>
       <w:r>
         <w:rPr>
@@ -6187,7 +6820,7 @@
     </w:p>
     <w:p>
       <w:pPr>
-        <w:pStyle w:val="890"/>
+        <w:pStyle w:val="899"/>
         <w:numPr>
           <w:ilvl w:val="0"/>
           <w:numId w:val="7"/>
@@ -6212,7 +6845,31 @@
     </w:p>
     <w:p>
       <w:pPr>
-        <w:pStyle w:val="890"/>
+        <w:pStyle w:val="899"/>
+        <w:numPr>
+          <w:ilvl w:val="1"/>
+          <w:numId w:val="7"/>
+        </w:numPr>
+        <w:pBdr/>
+        <w:spacing/>
+        <w:ind/>
+        <w:rPr/>
+      </w:pPr>
+      <w:r>
+        <w:rPr>
+          <w:highlight w:val="none"/>
+        </w:rPr>
+        <w:t xml:space="preserve">This should be done through a menu which shows the mass of the planet as you change it</w:t>
+      </w:r>
+      <w:r>
+        <w:rPr>
+          <w:highlight w:val="none"/>
+        </w:rPr>
+      </w:r>
+    </w:p>
+    <w:p>
+      <w:pPr>
+        <w:pStyle w:val="899"/>
         <w:numPr>
           <w:ilvl w:val="0"/>
           <w:numId w:val="7"/>
@@ -6237,7 +6894,7 @@
     </w:p>
     <w:p>
       <w:pPr>
-        <w:pStyle w:val="890"/>
+        <w:pStyle w:val="899"/>
         <w:numPr>
           <w:ilvl w:val="1"/>
           <w:numId w:val="7"/>
@@ -6262,7 +6919,7 @@
     </w:p>
     <w:p>
       <w:pPr>
-        <w:pStyle w:val="890"/>
+        <w:pStyle w:val="899"/>
         <w:numPr>
           <w:ilvl w:val="0"/>
           <w:numId w:val="7"/>
@@ -6284,128 +6941,17 @@
         </w:rPr>
       </w:r>
       <w:r/>
-    </w:p>
-    <w:p>
-      <w:pPr>
-        <w:pBdr/>
-        <w:spacing/>
-        <w:ind/>
-        <w:rPr/>
-      </w:pPr>
+      <w:r>
+        <w:rPr>
+          <w:highlight w:val="none"/>
+        </w:rPr>
+      </w:r>
+      <w:r>
+        <w:rPr>
+          <w:highlight w:val="none"/>
+        </w:rPr>
+      </w:r>
       <w:r/>
-      <w:r/>
-    </w:p>
-    <w:p>
-      <w:pPr>
-        <w:pStyle w:val="714"/>
-        <w:pBdr/>
-        <w:spacing/>
-        <w:ind/>
-        <w:jc w:val="both"/>
-        <w:rPr>
-          <w:color w:val="5b9bd5"/>
-        </w:rPr>
-      </w:pPr>
-      <w:r>
-        <w:rPr>
-          <w:color w:val="4472c4" w:themeColor="accent5"/>
-          <w:highlight w:val="none"/>
-        </w:rPr>
-        <w:t xml:space="preserve">References</w:t>
-      </w:r>
-      <w:r>
-        <w:rPr>
-          <w:color w:val="5b9bd5"/>
-        </w:rPr>
-      </w:r>
-      <w:r>
-        <w:rPr>
-          <w:color w:val="5b9bd5"/>
-        </w:rPr>
-      </w:r>
-    </w:p>
-    <w:p>
-      <w:pPr>
-        <w:pBdr/>
-        <w:spacing/>
-        <w:ind/>
-        <w:rPr>
-          <w:highlight w:val="none"/>
-        </w:rPr>
-      </w:pPr>
-      <w:r>
-        <w:rPr>
-          <w:highlight w:val="none"/>
-        </w:rPr>
-        <w:t xml:space="preserve">Cells diagrams in the optimisation section of collision come from this video here:</w:t>
-      </w:r>
-      <w:r>
-        <w:rPr>
-          <w:highlight w:val="none"/>
-        </w:rPr>
-      </w:r>
-      <w:r>
-        <w:rPr>
-          <w:highlight w:val="none"/>
-        </w:rPr>
-      </w:r>
-    </w:p>
-    <w:p>
-      <w:pPr>
-        <w:pBdr/>
-        <w:spacing/>
-        <w:ind/>
-        <w:rPr>
-          <w:highlight w:val="none"/>
-        </w:rPr>
-      </w:pPr>
-      <w:r>
-        <w:rPr>
-          <w:highlight w:val="none"/>
-        </w:rPr>
-      </w:r>
-      <w:r>
-        <w:rPr>
-          <w:highlight w:val="none"/>
-        </w:rPr>
-      </w:r>
-      <w:hyperlink r:id="rId20" w:tooltip="https://www.youtube.com/watch?v=9IULfQH7E90" w:history="1">
-        <w:r>
-          <w:rPr>
-            <w:rStyle w:val="868"/>
-            <w:highlight w:val="none"/>
-          </w:rPr>
-          <w:t xml:space="preserve">https://www.youtube.com/watch?v=9IULfQH7E90</w:t>
-        </w:r>
-      </w:hyperlink>
-      <w:r>
-        <w:rPr>
-          <w:highlight w:val="none"/>
-        </w:rPr>
-      </w:r>
-      <w:r>
-        <w:rPr>
-          <w:highlight w:val="none"/>
-        </w:rPr>
-      </w:r>
-    </w:p>
-    <w:p>
-      <w:pPr>
-        <w:pBdr/>
-        <w:spacing/>
-        <w:ind/>
-        <w:rPr/>
-      </w:pPr>
-      <w:r>
-        <w:rPr>
-          <w:highlight w:val="none"/>
-        </w:rPr>
-      </w:r>
-      <w:r>
-        <w:rPr>
-          <w:highlight w:val="none"/>
-        </w:rPr>
-      </w:r>
       <w:r/>
     </w:p>
     <w:sectPr>
@@ -7638,9 +8184,9 @@
     <w:lsdException w:name="Bibliography" w:uiPriority="37"/>
     <w:lsdException w:name="TOC Heading" w:uiPriority="39" w:qFormat="1"/>
   </w:latentStyles>
-  <w:style w:type="character" w:styleId="165">
+  <w:style w:type="character" w:styleId="711">
     <w:name w:val="Intense Emphasis"/>
-    <w:basedOn w:val="891"/>
+    <w:basedOn w:val="900"/>
     <w:uiPriority w:val="21"/>
     <w:qFormat/>
     <w:pPr>
@@ -7654,9 +8200,9 @@
       <w:color w:val="0f4761" w:themeColor="accent1" w:themeShade="BF"/>
     </w:rPr>
   </w:style>
-  <w:style w:type="character" w:styleId="168">
+  <w:style w:type="character" w:styleId="712">
     <w:name w:val="Intense Reference"/>
-    <w:basedOn w:val="891"/>
+    <w:basedOn w:val="900"/>
     <w:uiPriority w:val="32"/>
     <w:qFormat/>
     <w:pPr>
@@ -7672,9 +8218,9 @@
       <w:spacing w:val="5"/>
     </w:rPr>
   </w:style>
-  <w:style w:type="character" w:styleId="170">
+  <w:style w:type="character" w:styleId="713">
     <w:name w:val="Subtle Emphasis"/>
-    <w:basedOn w:val="891"/>
+    <w:basedOn w:val="900"/>
     <w:uiPriority w:val="19"/>
     <w:qFormat/>
     <w:pPr>
@@ -7688,9 +8234,9 @@
       <w:color w:val="404040" w:themeColor="text1" w:themeTint="BF"/>
     </w:rPr>
   </w:style>
-  <w:style w:type="character" w:styleId="171">
+  <w:style w:type="character" w:styleId="714">
     <w:name w:val="Emphasis"/>
-    <w:basedOn w:val="891"/>
+    <w:basedOn w:val="900"/>
     <w:uiPriority w:val="20"/>
     <w:qFormat/>
     <w:pPr>
@@ -7703,9 +8249,9 @@
       <w:iCs/>
     </w:rPr>
   </w:style>
-  <w:style w:type="character" w:styleId="172">
+  <w:style w:type="character" w:styleId="715">
     <w:name w:val="Strong"/>
-    <w:basedOn w:val="891"/>
+    <w:basedOn w:val="900"/>
     <w:uiPriority w:val="22"/>
     <w:qFormat/>
     <w:pPr>
@@ -7718,9 +8264,9 @@
       <w:bCs/>
     </w:rPr>
   </w:style>
-  <w:style w:type="character" w:styleId="173">
+  <w:style w:type="character" w:styleId="716">
     <w:name w:val="Subtle Reference"/>
-    <w:basedOn w:val="891"/>
+    <w:basedOn w:val="900"/>
     <w:uiPriority w:val="31"/>
     <w:qFormat/>
     <w:pPr>
@@ -7733,9 +8279,9 @@
       <w:color w:val="5a5a5a" w:themeColor="text1" w:themeTint="A5"/>
     </w:rPr>
   </w:style>
-  <w:style w:type="character" w:styleId="174">
+  <w:style w:type="character" w:styleId="717">
     <w:name w:val="Book Title"/>
-    <w:basedOn w:val="891"/>
+    <w:basedOn w:val="900"/>
     <w:uiPriority w:val="33"/>
     <w:qFormat/>
     <w:pPr>
@@ -7751,9 +8297,9 @@
       <w:spacing w:val="5"/>
     </w:rPr>
   </w:style>
-  <w:style w:type="character" w:styleId="187">
+  <w:style w:type="character" w:styleId="718">
     <w:name w:val="FollowedHyperlink"/>
-    <w:basedOn w:val="891"/>
+    <w:basedOn w:val="900"/>
     <w:uiPriority w:val="99"/>
     <w:semiHidden/>
     <w:unhideWhenUsed/>
@@ -7767,11 +8313,11 @@
       <w:u w:val="single"/>
     </w:rPr>
   </w:style>
-  <w:style w:type="paragraph" w:styleId="710">
+  <w:style w:type="paragraph" w:styleId="719">
     <w:name w:val="Heading 1"/>
-    <w:basedOn w:val="886"/>
-    <w:next w:val="886"/>
-    <w:link w:val="711"/>
+    <w:basedOn w:val="895"/>
+    <w:next w:val="895"/>
+    <w:link w:val="720"/>
     <w:uiPriority w:val="9"/>
     <w:qFormat/>
     <w:pPr>
@@ -7788,9 +8334,9 @@
       <w:szCs w:val="40"/>
     </w:rPr>
   </w:style>
-  <w:style w:type="character" w:styleId="711">
+  <w:style w:type="character" w:styleId="720">
     <w:name w:val="Heading 1 Char"/>
-    <w:link w:val="710"/>
+    <w:link w:val="719"/>
     <w:uiPriority w:val="9"/>
     <w:pPr>
       <w:pBdr/>
@@ -7803,11 +8349,11 @@
       <w:szCs w:val="40"/>
     </w:rPr>
   </w:style>
-  <w:style w:type="paragraph" w:styleId="712">
+  <w:style w:type="paragraph" w:styleId="721">
     <w:name w:val="Heading 2"/>
-    <w:basedOn w:val="886"/>
-    <w:next w:val="886"/>
-    <w:link w:val="713"/>
+    <w:basedOn w:val="895"/>
+    <w:next w:val="895"/>
+    <w:link w:val="722"/>
     <w:uiPriority w:val="9"/>
     <w:unhideWhenUsed/>
     <w:qFormat/>
@@ -7824,9 +8370,9 @@
       <w:sz w:val="34"/>
     </w:rPr>
   </w:style>
-  <w:style w:type="character" w:styleId="713">
+  <w:style w:type="character" w:styleId="722">
     <w:name w:val="Heading 2 Char"/>
-    <w:link w:val="712"/>
+    <w:link w:val="721"/>
     <w:uiPriority w:val="9"/>
     <w:pPr>
       <w:pBdr/>
@@ -7838,11 +8384,11 @@
       <w:sz w:val="34"/>
     </w:rPr>
   </w:style>
-  <w:style w:type="paragraph" w:styleId="714">
+  <w:style w:type="paragraph" w:styleId="723">
     <w:name w:val="Heading 3"/>
-    <w:basedOn w:val="886"/>
-    <w:next w:val="886"/>
-    <w:link w:val="715"/>
+    <w:basedOn w:val="895"/>
+    <w:next w:val="895"/>
+    <w:link w:val="724"/>
     <w:uiPriority w:val="9"/>
     <w:unhideWhenUsed/>
     <w:qFormat/>
@@ -7860,9 +8406,9 @@
       <w:szCs w:val="30"/>
     </w:rPr>
   </w:style>
-  <w:style w:type="character" w:styleId="715">
+  <w:style w:type="character" w:styleId="724">
     <w:name w:val="Heading 3 Char"/>
-    <w:link w:val="714"/>
+    <w:link w:val="723"/>
     <w:uiPriority w:val="9"/>
     <w:pPr>
       <w:pBdr/>
@@ -7875,11 +8421,11 @@
       <w:szCs w:val="30"/>
     </w:rPr>
   </w:style>
-  <w:style w:type="paragraph" w:styleId="716">
+  <w:style w:type="paragraph" w:styleId="725">
     <w:name w:val="Heading 4"/>
-    <w:basedOn w:val="886"/>
-    <w:next w:val="886"/>
-    <w:link w:val="717"/>
+    <w:basedOn w:val="895"/>
+    <w:next w:val="895"/>
+    <w:link w:val="726"/>
     <w:uiPriority w:val="9"/>
     <w:unhideWhenUsed/>
     <w:qFormat/>
@@ -7899,9 +8445,9 @@
       <w:szCs w:val="26"/>
     </w:rPr>
   </w:style>
-  <w:style w:type="character" w:styleId="717">
+  <w:style w:type="character" w:styleId="726">
     <w:name w:val="Heading 4 Char"/>
-    <w:link w:val="716"/>
+    <w:link w:val="725"/>
     <w:uiPriority w:val="9"/>
     <w:pPr>
       <w:pBdr/>
@@ -7916,11 +8462,11 @@
       <w:szCs w:val="26"/>
     </w:rPr>
   </w:style>
-  <w:style w:type="paragraph" w:styleId="718">
+  <w:style w:type="paragraph" w:styleId="727">
     <w:name w:val="Heading 5"/>
-    <w:basedOn w:val="886"/>
-    <w:next w:val="886"/>
-    <w:link w:val="719"/>
+    <w:basedOn w:val="895"/>
+    <w:next w:val="895"/>
+    <w:link w:val="728"/>
     <w:uiPriority w:val="9"/>
     <w:unhideWhenUsed/>
     <w:qFormat/>
@@ -7940,9 +8486,9 @@
       <w:szCs w:val="24"/>
     </w:rPr>
   </w:style>
-  <w:style w:type="character" w:styleId="719">
+  <w:style w:type="character" w:styleId="728">
     <w:name w:val="Heading 5 Char"/>
-    <w:link w:val="718"/>
+    <w:link w:val="727"/>
     <w:uiPriority w:val="9"/>
     <w:pPr>
       <w:pBdr/>
@@ -7957,11 +8503,11 @@
       <w:szCs w:val="24"/>
     </w:rPr>
   </w:style>
-  <w:style w:type="paragraph" w:styleId="720">
+  <w:style w:type="paragraph" w:styleId="729">
     <w:name w:val="Heading 6"/>
-    <w:basedOn w:val="886"/>
-    <w:next w:val="886"/>
-    <w:link w:val="721"/>
+    <w:basedOn w:val="895"/>
+    <w:next w:val="895"/>
+    <w:link w:val="730"/>
     <w:uiPriority w:val="9"/>
     <w:unhideWhenUsed/>
     <w:qFormat/>
@@ -7981,9 +8527,9 @@
       <w:szCs w:val="22"/>
     </w:rPr>
   </w:style>
-  <w:style w:type="character" w:styleId="721">
+  <w:style w:type="character" w:styleId="730">
     <w:name w:val="Heading 6 Char"/>
-    <w:link w:val="720"/>
+    <w:link w:val="729"/>
     <w:uiPriority w:val="9"/>
     <w:pPr>
       <w:pBdr/>
@@ -7998,11 +8544,11 @@
       <w:szCs w:val="22"/>
     </w:rPr>
   </w:style>
-  <w:style w:type="paragraph" w:styleId="722">
+  <w:style w:type="paragraph" w:styleId="731">
     <w:name w:val="Heading 7"/>
-    <w:basedOn w:val="886"/>
-    <w:next w:val="886"/>
-    <w:link w:val="723"/>
+    <w:basedOn w:val="895"/>
+    <w:next w:val="895"/>
+    <w:link w:val="732"/>
     <w:uiPriority w:val="9"/>
     <w:unhideWhenUsed/>
     <w:qFormat/>
@@ -8024,9 +8570,9 @@
       <w:szCs w:val="22"/>
     </w:rPr>
   </w:style>
-  <w:style w:type="character" w:styleId="723">
+  <w:style w:type="character" w:styleId="732">
     <w:name w:val="Heading 7 Char"/>
-    <w:link w:val="722"/>
+    <w:link w:val="731"/>
     <w:uiPriority w:val="9"/>
     <w:pPr>
       <w:pBdr/>
@@ -8043,11 +8589,11 @@
       <w:szCs w:val="22"/>
     </w:rPr>
   </w:style>
-  <w:style w:type="paragraph" w:styleId="724">
+  <w:style w:type="paragraph" w:styleId="733">
     <w:name w:val="Heading 8"/>
-    <w:basedOn w:val="886"/>
-    <w:next w:val="886"/>
-    <w:link w:val="725"/>
+    <w:basedOn w:val="895"/>
+    <w:next w:val="895"/>
+    <w:link w:val="734"/>
     <w:uiPriority w:val="9"/>
     <w:unhideWhenUsed/>
     <w:qFormat/>
@@ -8067,9 +8613,9 @@
       <w:szCs w:val="22"/>
     </w:rPr>
   </w:style>
-  <w:style w:type="character" w:styleId="725">
+  <w:style w:type="character" w:styleId="734">
     <w:name w:val="Heading 8 Char"/>
-    <w:link w:val="724"/>
+    <w:link w:val="733"/>
     <w:uiPriority w:val="9"/>
     <w:pPr>
       <w:pBdr/>
@@ -8084,11 +8630,11 @@
       <w:szCs w:val="22"/>
     </w:rPr>
   </w:style>
-  <w:style w:type="paragraph" w:styleId="726">
+  <w:style w:type="paragraph" w:styleId="735">
     <w:name w:val="Heading 9"/>
-    <w:basedOn w:val="886"/>
-    <w:next w:val="886"/>
-    <w:link w:val="727"/>
+    <w:basedOn w:val="895"/>
+    <w:next w:val="895"/>
+    <w:link w:val="736"/>
     <w:uiPriority w:val="9"/>
     <w:unhideWhenUsed/>
     <w:qFormat/>
@@ -8108,9 +8654,9 @@
       <w:szCs w:val="21"/>
     </w:rPr>
   </w:style>
-  <w:style w:type="character" w:styleId="727">
+  <w:style w:type="character" w:styleId="736">
     <w:name w:val="Heading 9 Char"/>
-    <w:link w:val="726"/>
+    <w:link w:val="735"/>
     <w:uiPriority w:val="9"/>
     <w:pPr>
       <w:pBdr/>
@@ -8125,11 +8671,11 @@
       <w:szCs w:val="21"/>
     </w:rPr>
   </w:style>
-  <w:style w:type="paragraph" w:styleId="728">
+  <w:style w:type="paragraph" w:styleId="737">
     <w:name w:val="Title"/>
-    <w:basedOn w:val="886"/>
-    <w:next w:val="886"/>
-    <w:link w:val="729"/>
+    <w:basedOn w:val="895"/>
+    <w:next w:val="895"/>
+    <w:link w:val="738"/>
     <w:uiPriority w:val="10"/>
     <w:qFormat/>
     <w:pPr>
@@ -8143,9 +8689,9 @@
       <w:szCs w:val="48"/>
     </w:rPr>
   </w:style>
-  <w:style w:type="character" w:styleId="729">
+  <w:style w:type="character" w:styleId="738">
     <w:name w:val="Title Char"/>
-    <w:link w:val="728"/>
+    <w:link w:val="737"/>
     <w:uiPriority w:val="10"/>
     <w:pPr>
       <w:pBdr/>
@@ -8157,11 +8703,11 @@
       <w:szCs w:val="48"/>
     </w:rPr>
   </w:style>
-  <w:style w:type="paragraph" w:styleId="730">
+  <w:style w:type="paragraph" w:styleId="739">
     <w:name w:val="Subtitle"/>
-    <w:basedOn w:val="886"/>
-    <w:next w:val="886"/>
-    <w:link w:val="731"/>
+    <w:basedOn w:val="895"/>
+    <w:next w:val="895"/>
+    <w:link w:val="740"/>
     <w:uiPriority w:val="11"/>
     <w:qFormat/>
     <w:pPr>
@@ -8174,9 +8720,9 @@
       <w:szCs w:val="24"/>
     </w:rPr>
   </w:style>
-  <w:style w:type="character" w:styleId="731">
+  <w:style w:type="character" w:styleId="740">
     <w:name w:val="Subtitle Char"/>
-    <w:link w:val="730"/>
+    <w:link w:val="739"/>
     <w:uiPriority w:val="11"/>
     <w:pPr>
       <w:pBdr/>
@@ -8188,11 +8734,11 @@
       <w:szCs w:val="24"/>
     </w:rPr>
   </w:style>
-  <w:style w:type="paragraph" w:styleId="732">
+  <w:style w:type="paragraph" w:styleId="741">
     <w:name w:val="Quote"/>
-    <w:basedOn w:val="886"/>
-    <w:next w:val="886"/>
-    <w:link w:val="733"/>
+    <w:basedOn w:val="895"/>
+    <w:next w:val="895"/>
+    <w:link w:val="742"/>
     <w:uiPriority w:val="29"/>
     <w:qFormat/>
     <w:pPr>
@@ -8204,9 +8750,9 @@
       <w:i/>
     </w:rPr>
   </w:style>
-  <w:style w:type="character" w:styleId="733">
+  <w:style w:type="character" w:styleId="742">
     <w:name w:val="Quote Char"/>
-    <w:link w:val="732"/>
+    <w:link w:val="741"/>
     <w:uiPriority w:val="29"/>
     <w:pPr>
       <w:pBdr/>
@@ -8217,11 +8763,11 @@
       <w:i/>
     </w:rPr>
   </w:style>
-  <w:style w:type="paragraph" w:styleId="734">
+  <w:style w:type="paragraph" w:styleId="743">
     <w:name w:val="Intense Quote"/>
-    <w:basedOn w:val="886"/>
-    <w:next w:val="886"/>
-    <w:link w:val="735"/>
+    <w:basedOn w:val="895"/>
+    <w:next w:val="895"/>
+    <w:link w:val="744"/>
     <w:uiPriority w:val="30"/>
     <w:qFormat/>
     <w:pPr>
@@ -8240,9 +8786,9 @@
       <w:i/>
     </w:rPr>
   </w:style>
-  <w:style w:type="character" w:styleId="735">
+  <w:style w:type="character" w:styleId="744">
     <w:name w:val="Intense Quote Char"/>
-    <w:link w:val="734"/>
+    <w:link w:val="743"/>
     <w:uiPriority w:val="30"/>
     <w:pPr>
       <w:pBdr/>
@@ -8253,10 +8799,10 @@
       <w:i/>
     </w:rPr>
   </w:style>
-  <w:style w:type="paragraph" w:styleId="736">
+  <w:style w:type="paragraph" w:styleId="745">
     <w:name w:val="Header"/>
-    <w:basedOn w:val="886"/>
-    <w:link w:val="737"/>
+    <w:basedOn w:val="895"/>
+    <w:link w:val="746"/>
     <w:uiPriority w:val="99"/>
     <w:unhideWhenUsed/>
     <w:pPr>
@@ -8269,9 +8815,9 @@
       <w:ind/>
     </w:pPr>
   </w:style>
-  <w:style w:type="character" w:styleId="737">
+  <w:style w:type="character" w:styleId="746">
     <w:name w:val="Header Char"/>
-    <w:link w:val="736"/>
+    <w:link w:val="745"/>
     <w:uiPriority w:val="99"/>
     <w:pPr>
       <w:pBdr/>
@@ -8279,10 +8825,10 @@
       <w:ind/>
     </w:pPr>
   </w:style>
-  <w:style w:type="paragraph" w:styleId="738">
+  <w:style w:type="paragraph" w:styleId="747">
     <w:name w:val="Footer"/>
-    <w:basedOn w:val="886"/>
-    <w:link w:val="741"/>
+    <w:basedOn w:val="895"/>
+    <w:link w:val="750"/>
     <w:uiPriority w:val="99"/>
     <w:unhideWhenUsed/>
     <w:pPr>
@@ -8295,9 +8841,9 @@
       <w:ind/>
     </w:pPr>
   </w:style>
-  <w:style w:type="character" w:styleId="739">
+  <w:style w:type="character" w:styleId="748">
     <w:name w:val="Footer Char"/>
-    <w:link w:val="738"/>
+    <w:link w:val="747"/>
     <w:uiPriority w:val="99"/>
     <w:pPr>
       <w:pBdr/>
@@ -8305,10 +8851,10 @@
       <w:ind/>
     </w:pPr>
   </w:style>
-  <w:style w:type="paragraph" w:styleId="740">
+  <w:style w:type="paragraph" w:styleId="749">
     <w:name w:val="Caption"/>
-    <w:basedOn w:val="886"/>
-    <w:next w:val="886"/>
+    <w:basedOn w:val="895"/>
+    <w:next w:val="895"/>
     <w:uiPriority w:val="35"/>
     <w:semiHidden/>
     <w:unhideWhenUsed/>
@@ -8326,10 +8872,10 @@
       <w:szCs w:val="18"/>
     </w:rPr>
   </w:style>
-  <w:style w:type="character" w:styleId="741">
+  <w:style w:type="character" w:styleId="750">
     <w:name w:val="Caption Char"/>
-    <w:basedOn w:val="740"/>
-    <w:link w:val="738"/>
+    <w:basedOn w:val="749"/>
+    <w:link w:val="747"/>
     <w:uiPriority w:val="99"/>
     <w:pPr>
       <w:pBdr/>
@@ -8337,9 +8883,9 @@
       <w:ind/>
     </w:pPr>
   </w:style>
-  <w:style w:type="table" w:styleId="742">
+  <w:style w:type="table" w:styleId="751">
     <w:name w:val="Table Grid"/>
-    <w:basedOn w:val="887"/>
+    <w:basedOn w:val="896"/>
     <w:uiPriority w:val="59"/>
     <w:pPr>
       <w:pBdr/>
@@ -8536,9 +9082,9 @@
       </w:tcPr>
     </w:tblStylePr>
   </w:style>
-  <w:style w:type="table" w:styleId="743">
+  <w:style w:type="table" w:styleId="752">
     <w:name w:val="Table Grid Light"/>
-    <w:basedOn w:val="887"/>
+    <w:basedOn w:val="896"/>
     <w:uiPriority w:val="59"/>
     <w:pPr>
       <w:pBdr/>
@@ -8735,9 +9281,9 @@
       </w:tcPr>
     </w:tblStylePr>
   </w:style>
-  <w:style w:type="table" w:styleId="744">
+  <w:style w:type="table" w:styleId="753">
     <w:name w:val="Plain Table 1"/>
-    <w:basedOn w:val="887"/>
+    <w:basedOn w:val="896"/>
     <w:uiPriority w:val="59"/>
     <w:pPr>
       <w:pBdr/>
@@ -8960,9 +9506,9 @@
       </w:tcPr>
     </w:tblStylePr>
   </w:style>
-  <w:style w:type="table" w:styleId="745">
+  <w:style w:type="table" w:styleId="754">
     <w:name w:val="Plain Table 2"/>
-    <w:basedOn w:val="887"/>
+    <w:basedOn w:val="896"/>
     <w:uiPriority w:val="59"/>
     <w:pPr>
       <w:pBdr/>
@@ -9193,9 +9739,9 @@
       </w:tcPr>
     </w:tblStylePr>
   </w:style>
-  <w:style w:type="table" w:styleId="746">
+  <w:style w:type="table" w:styleId="755">
     <w:name w:val="Plain Table 3"/>
-    <w:basedOn w:val="887"/>
+    <w:basedOn w:val="896"/>
     <w:uiPriority w:val="99"/>
     <w:pPr>
       <w:pBdr/>
@@ -9423,9 +9969,9 @@
       </w:tcPr>
     </w:tblStylePr>
   </w:style>
-  <w:style w:type="table" w:styleId="747">
+  <w:style w:type="table" w:styleId="756">
     <w:name w:val="Plain Table 4"/>
-    <w:basedOn w:val="887"/>
+    <w:basedOn w:val="896"/>
     <w:uiPriority w:val="99"/>
     <w:pPr>
       <w:pBdr/>
@@ -9639,9 +10185,9 @@
       </w:tcPr>
     </w:tblStylePr>
   </w:style>
-  <w:style w:type="table" w:styleId="748">
+  <w:style w:type="table" w:styleId="757">
     <w:name w:val="Plain Table 5"/>
-    <w:basedOn w:val="887"/>
+    <w:basedOn w:val="896"/>
     <w:uiPriority w:val="99"/>
     <w:pPr>
       <w:pBdr/>
@@ -9872,9 +10418,9 @@
       </w:tcPr>
     </w:tblStylePr>
   </w:style>
-  <w:style w:type="table" w:styleId="749">
+  <w:style w:type="table" w:styleId="758">
     <w:name w:val="Grid Table 1 Light"/>
-    <w:basedOn w:val="887"/>
+    <w:basedOn w:val="896"/>
     <w:uiPriority w:val="99"/>
     <w:pPr>
       <w:pBdr/>
@@ -10095,9 +10641,9 @@
       </w:tcPr>
     </w:tblStylePr>
   </w:style>
-  <w:style w:type="table" w:styleId="750">
+  <w:style w:type="table" w:styleId="759">
     <w:name w:val="Grid Table 1 Light - Accent 1"/>
-    <w:basedOn w:val="887"/>
+    <w:basedOn w:val="896"/>
     <w:uiPriority w:val="99"/>
     <w:pPr>
       <w:pBdr/>
@@ -10318,9 +10864,9 @@
       </w:tcPr>
     </w:tblStylePr>
   </w:style>
-  <w:style w:type="table" w:styleId="751">
+  <w:style w:type="table" w:styleId="760">
     <w:name w:val="Grid Table 1 Light - Accent 2"/>
-    <w:basedOn w:val="887"/>
+    <w:basedOn w:val="896"/>
     <w:uiPriority w:val="99"/>
     <w:pPr>
       <w:pBdr/>
@@ -10541,9 +11087,9 @@
       </w:tcPr>
     </w:tblStylePr>
   </w:style>
-  <w:style w:type="table" w:styleId="752">
+  <w:style w:type="table" w:styleId="761">
     <w:name w:val="Grid Table 1 Light - Accent 3"/>
-    <w:basedOn w:val="887"/>
+    <w:basedOn w:val="896"/>
     <w:uiPriority w:val="99"/>
     <w:pPr>
       <w:pBdr/>
@@ -10764,9 +11310,9 @@
       </w:tcPr>
     </w:tblStylePr>
   </w:style>
-  <w:style w:type="table" w:styleId="753">
+  <w:style w:type="table" w:styleId="762">
     <w:name w:val="Grid Table 1 Light - Accent 4"/>
-    <w:basedOn w:val="887"/>
+    <w:basedOn w:val="896"/>
     <w:uiPriority w:val="99"/>
     <w:pPr>
       <w:pBdr/>
@@ -10987,9 +11533,9 @@
       </w:tcPr>
     </w:tblStylePr>
   </w:style>
-  <w:style w:type="table" w:styleId="754">
+  <w:style w:type="table" w:styleId="763">
     <w:name w:val="Grid Table 1 Light - Accent 5"/>
-    <w:basedOn w:val="887"/>
+    <w:basedOn w:val="896"/>
     <w:uiPriority w:val="99"/>
     <w:pPr>
       <w:pBdr/>
@@ -11210,9 +11756,9 @@
       </w:tcPr>
     </w:tblStylePr>
   </w:style>
-  <w:style w:type="table" w:styleId="755">
+  <w:style w:type="table" w:styleId="764">
     <w:name w:val="Grid Table 1 Light - Accent 6"/>
-    <w:basedOn w:val="887"/>
+    <w:basedOn w:val="896"/>
     <w:uiPriority w:val="99"/>
     <w:pPr>
       <w:pBdr/>
@@ -11433,9 +11979,9 @@
       </w:tcPr>
     </w:tblStylePr>
   </w:style>
-  <w:style w:type="table" w:styleId="756">
+  <w:style w:type="table" w:styleId="765">
     <w:name w:val="Grid Table 2"/>
-    <w:basedOn w:val="887"/>
+    <w:basedOn w:val="896"/>
     <w:uiPriority w:val="99"/>
     <w:pPr>
       <w:pBdr/>
@@ -11665,9 +12211,9 @@
       </w:tcPr>
     </w:tblStylePr>
   </w:style>
-  <w:style w:type="table" w:styleId="757">
+  <w:style w:type="table" w:styleId="766">
     <w:name w:val="Grid Table 2 - Accent 1"/>
-    <w:basedOn w:val="887"/>
+    <w:basedOn w:val="896"/>
     <w:uiPriority w:val="99"/>
     <w:pPr>
       <w:pBdr/>
@@ -11897,9 +12443,9 @@
       </w:tcPr>
     </w:tblStylePr>
   </w:style>
-  <w:style w:type="table" w:styleId="758">
+  <w:style w:type="table" w:styleId="767">
     <w:name w:val="Grid Table 2 - Accent 2"/>
-    <w:basedOn w:val="887"/>
+    <w:basedOn w:val="896"/>
     <w:uiPriority w:val="99"/>
     <w:pPr>
       <w:pBdr/>
@@ -12129,9 +12675,9 @@
       </w:tcPr>
     </w:tblStylePr>
   </w:style>
-  <w:style w:type="table" w:styleId="759">
+  <w:style w:type="table" w:styleId="768">
     <w:name w:val="Grid Table 2 - Accent 3"/>
-    <w:basedOn w:val="887"/>
+    <w:basedOn w:val="896"/>
     <w:uiPriority w:val="99"/>
     <w:pPr>
       <w:pBdr/>
@@ -12361,9 +12907,9 @@
       </w:tcPr>
     </w:tblStylePr>
   </w:style>
-  <w:style w:type="table" w:styleId="760">
+  <w:style w:type="table" w:styleId="769">
     <w:name w:val="Grid Table 2 - Accent 4"/>
-    <w:basedOn w:val="887"/>
+    <w:basedOn w:val="896"/>
     <w:uiPriority w:val="99"/>
     <w:pPr>
       <w:pBdr/>
@@ -12593,9 +13139,9 @@
       </w:tcPr>
     </w:tblStylePr>
   </w:style>
-  <w:style w:type="table" w:styleId="761">
+  <w:style w:type="table" w:styleId="770">
     <w:name w:val="Grid Table 2 - Accent 5"/>
-    <w:basedOn w:val="887"/>
+    <w:basedOn w:val="896"/>
     <w:uiPriority w:val="99"/>
     <w:pPr>
       <w:pBdr/>
@@ -12825,9 +13371,9 @@
       </w:tcPr>
     </w:tblStylePr>
   </w:style>
-  <w:style w:type="table" w:styleId="762">
+  <w:style w:type="table" w:styleId="771">
     <w:name w:val="Grid Table 2 - Accent 6"/>
-    <w:basedOn w:val="887"/>
+    <w:basedOn w:val="896"/>
     <w:uiPriority w:val="99"/>
     <w:pPr>
       <w:pBdr/>
@@ -13057,9 +13603,9 @@
       </w:tcPr>
     </w:tblStylePr>
   </w:style>
-  <w:style w:type="table" w:styleId="763">
+  <w:style w:type="table" w:styleId="772">
     <w:name w:val="Grid Table 3"/>
-    <w:basedOn w:val="887"/>
+    <w:basedOn w:val="896"/>
     <w:uiPriority w:val="99"/>
     <w:pPr>
       <w:pBdr/>
@@ -13302,9 +13848,9 @@
       </w:tcPr>
     </w:tblStylePr>
   </w:style>
-  <w:style w:type="table" w:styleId="764">
+  <w:style w:type="table" w:styleId="773">
     <w:name w:val="Grid Table 3 - Accent 1"/>
-    <w:basedOn w:val="887"/>
+    <w:basedOn w:val="896"/>
     <w:uiPriority w:val="99"/>
     <w:pPr>
       <w:pBdr/>
@@ -13547,9 +14093,9 @@
       </w:tcPr>
     </w:tblStylePr>
   </w:style>
-  <w:style w:type="table" w:styleId="765">
+  <w:style w:type="table" w:styleId="774">
     <w:name w:val="Grid Table 3 - Accent 2"/>
-    <w:basedOn w:val="887"/>
+    <w:basedOn w:val="896"/>
     <w:uiPriority w:val="99"/>
     <w:pPr>
       <w:pBdr/>
@@ -13792,9 +14338,9 @@
       </w:tcPr>
     </w:tblStylePr>
   </w:style>
-  <w:style w:type="table" w:styleId="766">
+  <w:style w:type="table" w:styleId="775">
     <w:name w:val="Grid Table 3 - Accent 3"/>
-    <w:basedOn w:val="887"/>
+    <w:basedOn w:val="896"/>
     <w:uiPriority w:val="99"/>
     <w:pPr>
       <w:pBdr/>
@@ -14037,9 +14583,9 @@
       </w:tcPr>
     </w:tblStylePr>
   </w:style>
-  <w:style w:type="table" w:styleId="767">
+  <w:style w:type="table" w:styleId="776">
     <w:name w:val="Grid Table 3 - Accent 4"/>
-    <w:basedOn w:val="887"/>
+    <w:basedOn w:val="896"/>
     <w:uiPriority w:val="99"/>
     <w:pPr>
       <w:pBdr/>
@@ -14282,9 +14828,9 @@
       </w:tcPr>
     </w:tblStylePr>
   </w:style>
-  <w:style w:type="table" w:styleId="768">
+  <w:style w:type="table" w:styleId="777">
     <w:name w:val="Grid Table 3 - Accent 5"/>
-    <w:basedOn w:val="887"/>
+    <w:basedOn w:val="896"/>
     <w:uiPriority w:val="99"/>
     <w:pPr>
       <w:pBdr/>
@@ -14527,9 +15073,9 @@
       </w:tcPr>
     </w:tblStylePr>
   </w:style>
-  <w:style w:type="table" w:styleId="769">
+  <w:style w:type="table" w:styleId="778">
     <w:name w:val="Grid Table 3 - Accent 6"/>
-    <w:basedOn w:val="887"/>
+    <w:basedOn w:val="896"/>
     <w:uiPriority w:val="99"/>
     <w:pPr>
       <w:pBdr/>
@@ -14772,9 +15318,9 @@
       </w:tcPr>
     </w:tblStylePr>
   </w:style>
-  <w:style w:type="table" w:styleId="770">
+  <w:style w:type="table" w:styleId="779">
     <w:name w:val="Grid Table 4"/>
-    <w:basedOn w:val="887"/>
+    <w:basedOn w:val="896"/>
     <w:uiPriority w:val="59"/>
     <w:pPr>
       <w:pBdr/>
@@ -15005,9 +15551,9 @@
       </w:tcPr>
     </w:tblStylePr>
   </w:style>
-  <w:style w:type="table" w:styleId="771">
+  <w:style w:type="table" w:styleId="780">
     <w:name w:val="Grid Table 4 - Accent 1"/>
-    <w:basedOn w:val="887"/>
+    <w:basedOn w:val="896"/>
     <w:uiPriority w:val="59"/>
     <w:pPr>
       <w:pBdr/>
@@ -15238,9 +15784,9 @@
       </w:tcPr>
     </w:tblStylePr>
   </w:style>
-  <w:style w:type="table" w:styleId="772">
+  <w:style w:type="table" w:styleId="781">
     <w:name w:val="Grid Table 4 - Accent 2"/>
-    <w:basedOn w:val="887"/>
+    <w:basedOn w:val="896"/>
     <w:uiPriority w:val="59"/>
     <w:pPr>
       <w:pBdr/>
@@ -15471,9 +16017,9 @@
       </w:tcPr>
     </w:tblStylePr>
   </w:style>
-  <w:style w:type="table" w:styleId="773">
+  <w:style w:type="table" w:styleId="782">
     <w:name w:val="Grid Table 4 - Accent 3"/>
-    <w:basedOn w:val="887"/>
+    <w:basedOn w:val="896"/>
     <w:uiPriority w:val="59"/>
     <w:pPr>
       <w:pBdr/>
@@ -15704,9 +16250,9 @@
       </w:tcPr>
     </w:tblStylePr>
   </w:style>
-  <w:style w:type="table" w:styleId="774">
+  <w:style w:type="table" w:styleId="783">
     <w:name w:val="Grid Table 4 - Accent 4"/>
-    <w:basedOn w:val="887"/>
+    <w:basedOn w:val="896"/>
     <w:uiPriority w:val="59"/>
     <w:pPr>
       <w:pBdr/>
@@ -15937,9 +16483,9 @@
       </w:tcPr>
     </w:tblStylePr>
   </w:style>
-  <w:style w:type="table" w:styleId="775">
+  <w:style w:type="table" w:styleId="784">
     <w:name w:val="Grid Table 4 - Accent 5"/>
-    <w:basedOn w:val="887"/>
+    <w:basedOn w:val="896"/>
     <w:uiPriority w:val="59"/>
     <w:pPr>
       <w:pBdr/>
@@ -16170,9 +16716,9 @@
       </w:tcPr>
     </w:tblStylePr>
   </w:style>
-  <w:style w:type="table" w:styleId="776">
+  <w:style w:type="table" w:styleId="785">
     <w:name w:val="Grid Table 4 - Accent 6"/>
-    <w:basedOn w:val="887"/>
+    <w:basedOn w:val="896"/>
     <w:uiPriority w:val="59"/>
     <w:pPr>
       <w:pBdr/>
@@ -16403,9 +16949,9 @@
       </w:tcPr>
     </w:tblStylePr>
   </w:style>
-  <w:style w:type="table" w:styleId="777">
+  <w:style w:type="table" w:styleId="786">
     <w:name w:val="Grid Table 5 Dark"/>
-    <w:basedOn w:val="887"/>
+    <w:basedOn w:val="896"/>
     <w:uiPriority w:val="99"/>
     <w:pPr>
       <w:pBdr/>
@@ -16631,9 +17177,9 @@
       </w:tcPr>
     </w:tblStylePr>
   </w:style>
-  <w:style w:type="table" w:styleId="778">
+  <w:style w:type="table" w:styleId="787">
     <w:name w:val="Grid Table 5 Dark- Accent 1"/>
-    <w:basedOn w:val="887"/>
+    <w:basedOn w:val="896"/>
     <w:uiPriority w:val="99"/>
     <w:pPr>
       <w:pBdr/>
@@ -16859,9 +17405,9 @@
       </w:tcPr>
     </w:tblStylePr>
   </w:style>
-  <w:style w:type="table" w:styleId="779">
+  <w:style w:type="table" w:styleId="788">
     <w:name w:val="Grid Table 5 Dark - Accent 2"/>
-    <w:basedOn w:val="887"/>
+    <w:basedOn w:val="896"/>
     <w:uiPriority w:val="99"/>
     <w:pPr>
       <w:pBdr/>
@@ -17087,9 +17633,9 @@
       </w:tcPr>
     </w:tblStylePr>
   </w:style>
-  <w:style w:type="table" w:styleId="780">
+  <w:style w:type="table" w:styleId="789">
     <w:name w:val="Grid Table 5 Dark - Accent 3"/>
-    <w:basedOn w:val="887"/>
+    <w:basedOn w:val="896"/>
     <w:uiPriority w:val="99"/>
     <w:pPr>
       <w:pBdr/>
@@ -17315,9 +17861,9 @@
       </w:tcPr>
     </w:tblStylePr>
   </w:style>
-  <w:style w:type="table" w:styleId="781">
+  <w:style w:type="table" w:styleId="790">
     <w:name w:val="Grid Table 5 Dark- Accent 4"/>
-    <w:basedOn w:val="887"/>
+    <w:basedOn w:val="896"/>
     <w:uiPriority w:val="99"/>
     <w:pPr>
       <w:pBdr/>
@@ -17543,9 +18089,9 @@
       </w:tcPr>
     </w:tblStylePr>
   </w:style>
-  <w:style w:type="table" w:styleId="782">
+  <w:style w:type="table" w:styleId="791">
     <w:name w:val="Grid Table 5 Dark - Accent 5"/>
-    <w:basedOn w:val="887"/>
+    <w:basedOn w:val="896"/>
     <w:uiPriority w:val="99"/>
     <w:pPr>
       <w:pBdr/>
@@ -17771,9 +18317,9 @@
       </w:tcPr>
     </w:tblStylePr>
   </w:style>
-  <w:style w:type="table" w:styleId="783">
+  <w:style w:type="table" w:styleId="792">
     <w:name w:val="Grid Table 5 Dark - Accent 6"/>
-    <w:basedOn w:val="887"/>
+    <w:basedOn w:val="896"/>
     <w:uiPriority w:val="99"/>
     <w:pPr>
       <w:pBdr/>
@@ -17999,9 +18545,9 @@
       </w:tcPr>
     </w:tblStylePr>
   </w:style>
-  <w:style w:type="table" w:styleId="784">
+  <w:style w:type="table" w:styleId="793">
     <w:name w:val="Grid Table 6 Colorful"/>
-    <w:basedOn w:val="887"/>
+    <w:basedOn w:val="896"/>
     <w:uiPriority w:val="99"/>
     <w:pPr>
       <w:pBdr/>
@@ -18229,9 +18775,9 @@
       </w:tcPr>
     </w:tblStylePr>
   </w:style>
-  <w:style w:type="table" w:styleId="785">
+  <w:style w:type="table" w:styleId="794">
     <w:name w:val="Grid Table 6 Colorful - Accent 1"/>
-    <w:basedOn w:val="887"/>
+    <w:basedOn w:val="896"/>
     <w:uiPriority w:val="99"/>
     <w:pPr>
       <w:pBdr/>
@@ -18459,9 +19005,9 @@
       </w:tcPr>
     </w:tblStylePr>
   </w:style>
-  <w:style w:type="table" w:styleId="786">
+  <w:style w:type="table" w:styleId="795">
     <w:name w:val="Grid Table 6 Colorful - Accent 2"/>
-    <w:basedOn w:val="887"/>
+    <w:basedOn w:val="896"/>
     <w:uiPriority w:val="99"/>
     <w:pPr>
       <w:pBdr/>
@@ -18689,9 +19235,9 @@
       </w:tcPr>
     </w:tblStylePr>
   </w:style>
-  <w:style w:type="table" w:styleId="787">
+  <w:style w:type="table" w:styleId="796">
     <w:name w:val="Grid Table 6 Colorful - Accent 3"/>
-    <w:basedOn w:val="887"/>
+    <w:basedOn w:val="896"/>
     <w:uiPriority w:val="99"/>
     <w:pPr>
       <w:pBdr/>
@@ -18919,9 +19465,9 @@
       </w:tcPr>
     </w:tblStylePr>
   </w:style>
-  <w:style w:type="table" w:styleId="788">
+  <w:style w:type="table" w:styleId="797">
     <w:name w:val="Grid Table 6 Colorful - Accent 4"/>
-    <w:basedOn w:val="887"/>
+    <w:basedOn w:val="896"/>
     <w:uiPriority w:val="99"/>
     <w:pPr>
       <w:pBdr/>
@@ -19149,9 +19695,9 @@
       </w:tcPr>
     </w:tblStylePr>
   </w:style>
-  <w:style w:type="table" w:styleId="789">
+  <w:style w:type="table" w:styleId="798">
     <w:name w:val="Grid Table 6 Colorful - Accent 5"/>
-    <w:basedOn w:val="887"/>
+    <w:basedOn w:val="896"/>
     <w:uiPriority w:val="99"/>
     <w:pPr>
       <w:pBdr/>
@@ -19379,9 +19925,9 @@
       </w:tcPr>
     </w:tblStylePr>
   </w:style>
-  <w:style w:type="table" w:styleId="790">
+  <w:style w:type="table" w:styleId="799">
     <w:name w:val="Grid Table 6 Colorful - Accent 6"/>
-    <w:basedOn w:val="887"/>
+    <w:basedOn w:val="896"/>
     <w:uiPriority w:val="99"/>
     <w:pPr>
       <w:pBdr/>
@@ -19609,9 +20155,9 @@
       </w:tcPr>
     </w:tblStylePr>
   </w:style>
-  <w:style w:type="table" w:styleId="791">
+  <w:style w:type="table" w:styleId="800">
     <w:name w:val="Grid Table 7 Colorful"/>
-    <w:basedOn w:val="887"/>
+    <w:basedOn w:val="896"/>
     <w:uiPriority w:val="99"/>
     <w:pPr>
       <w:pBdr/>
@@ -19863,9 +20409,9 @@
       </w:tcPr>
     </w:tblStylePr>
   </w:style>
-  <w:style w:type="table" w:styleId="792">
+  <w:style w:type="table" w:styleId="801">
     <w:name w:val="Grid Table 7 Colorful - Accent 1"/>
-    <w:basedOn w:val="887"/>
+    <w:basedOn w:val="896"/>
     <w:uiPriority w:val="99"/>
     <w:pPr>
       <w:pBdr/>
@@ -20117,9 +20663,9 @@
       </w:tcPr>
     </w:tblStylePr>
   </w:style>
-  <w:style w:type="table" w:styleId="793">
+  <w:style w:type="table" w:styleId="802">
     <w:name w:val="Grid Table 7 Colorful - Accent 2"/>
-    <w:basedOn w:val="887"/>
+    <w:basedOn w:val="896"/>
     <w:uiPriority w:val="99"/>
     <w:pPr>
       <w:pBdr/>
@@ -20371,9 +20917,9 @@
       </w:tcPr>
     </w:tblStylePr>
   </w:style>
-  <w:style w:type="table" w:styleId="794">
+  <w:style w:type="table" w:styleId="803">
     <w:name w:val="Grid Table 7 Colorful - Accent 3"/>
-    <w:basedOn w:val="887"/>
+    <w:basedOn w:val="896"/>
     <w:uiPriority w:val="99"/>
     <w:pPr>
       <w:pBdr/>
@@ -20625,9 +21171,9 @@
       </w:tcPr>
     </w:tblStylePr>
   </w:style>
-  <w:style w:type="table" w:styleId="795">
+  <w:style w:type="table" w:styleId="804">
     <w:name w:val="Grid Table 7 Colorful - Accent 4"/>
-    <w:basedOn w:val="887"/>
+    <w:basedOn w:val="896"/>
     <w:uiPriority w:val="99"/>
     <w:pPr>
       <w:pBdr/>
@@ -20879,9 +21425,9 @@
       </w:tcPr>
     </w:tblStylePr>
   </w:style>
-  <w:style w:type="table" w:styleId="796">
+  <w:style w:type="table" w:styleId="805">
     <w:name w:val="Grid Table 7 Colorful - Accent 5"/>
-    <w:basedOn w:val="887"/>
+    <w:basedOn w:val="896"/>
     <w:uiPriority w:val="99"/>
     <w:pPr>
       <w:pBdr/>
@@ -21133,9 +21679,9 @@
       </w:tcPr>
     </w:tblStylePr>
   </w:style>
-  <w:style w:type="table" w:styleId="797">
+  <w:style w:type="table" w:styleId="806">
     <w:name w:val="Grid Table 7 Colorful - Accent 6"/>
-    <w:basedOn w:val="887"/>
+    <w:basedOn w:val="896"/>
     <w:uiPriority w:val="99"/>
     <w:pPr>
       <w:pBdr/>
@@ -21387,9 +21933,9 @@
       </w:tcPr>
     </w:tblStylePr>
   </w:style>
-  <w:style w:type="table" w:styleId="798">
+  <w:style w:type="table" w:styleId="807">
     <w:name w:val="List Table 1 Light"/>
-    <w:basedOn w:val="887"/>
+    <w:basedOn w:val="896"/>
     <w:uiPriority w:val="99"/>
     <w:pPr>
       <w:pBdr/>
@@ -21603,9 +22149,9 @@
       </w:tcPr>
     </w:tblStylePr>
   </w:style>
-  <w:style w:type="table" w:styleId="799">
+  <w:style w:type="table" w:styleId="808">
     <w:name w:val="List Table 1 Light - Accent 1"/>
-    <w:basedOn w:val="887"/>
+    <w:basedOn w:val="896"/>
     <w:uiPriority w:val="99"/>
     <w:pPr>
       <w:pBdr/>
@@ -21819,9 +22365,9 @@
       </w:tcPr>
     </w:tblStylePr>
   </w:style>
-  <w:style w:type="table" w:styleId="800">
+  <w:style w:type="table" w:styleId="809">
     <w:name w:val="List Table 1 Light - Accent 2"/>
-    <w:basedOn w:val="887"/>
+    <w:basedOn w:val="896"/>
     <w:uiPriority w:val="99"/>
     <w:pPr>
       <w:pBdr/>
@@ -22035,9 +22581,9 @@
       </w:tcPr>
     </w:tblStylePr>
   </w:style>
-  <w:style w:type="table" w:styleId="801">
+  <w:style w:type="table" w:styleId="810">
     <w:name w:val="List Table 1 Light - Accent 3"/>
-    <w:basedOn w:val="887"/>
+    <w:basedOn w:val="896"/>
     <w:uiPriority w:val="99"/>
     <w:pPr>
       <w:pBdr/>
@@ -22251,9 +22797,9 @@
       </w:tcPr>
     </w:tblStylePr>
   </w:style>
-  <w:style w:type="table" w:styleId="802">
+  <w:style w:type="table" w:styleId="811">
     <w:name w:val="List Table 1 Light - Accent 4"/>
-    <w:basedOn w:val="887"/>
+    <w:basedOn w:val="896"/>
     <w:uiPriority w:val="99"/>
     <w:pPr>
       <w:pBdr/>
@@ -22467,9 +23013,9 @@
       </w:tcPr>
     </w:tblStylePr>
   </w:style>
-  <w:style w:type="table" w:styleId="803">
+  <w:style w:type="table" w:styleId="812">
     <w:name w:val="List Table 1 Light - Accent 5"/>
-    <w:basedOn w:val="887"/>
+    <w:basedOn w:val="896"/>
     <w:uiPriority w:val="99"/>
     <w:pPr>
       <w:pBdr/>
@@ -22683,9 +23229,9 @@
       </w:tcPr>
     </w:tblStylePr>
   </w:style>
-  <w:style w:type="table" w:styleId="804">
+  <w:style w:type="table" w:styleId="813">
     <w:name w:val="List Table 1 Light - Accent 6"/>
-    <w:basedOn w:val="887"/>
+    <w:basedOn w:val="896"/>
     <w:uiPriority w:val="99"/>
     <w:pPr>
       <w:pBdr/>
@@ -22899,9 +23445,9 @@
       </w:tcPr>
     </w:tblStylePr>
   </w:style>
-  <w:style w:type="table" w:styleId="805">
+  <w:style w:type="table" w:styleId="814">
     <w:name w:val="List Table 2"/>
-    <w:basedOn w:val="887"/>
+    <w:basedOn w:val="896"/>
     <w:uiPriority w:val="99"/>
     <w:pPr>
       <w:pBdr/>
@@ -23137,9 +23683,9 @@
       </w:tcPr>
     </w:tblStylePr>
   </w:style>
-  <w:style w:type="table" w:styleId="806">
+  <w:style w:type="table" w:styleId="815">
     <w:name w:val="List Table 2 - Accent 1"/>
-    <w:basedOn w:val="887"/>
+    <w:basedOn w:val="896"/>
     <w:uiPriority w:val="99"/>
     <w:pPr>
       <w:pBdr/>
@@ -23375,9 +23921,9 @@
       </w:tcPr>
     </w:tblStylePr>
   </w:style>
-  <w:style w:type="table" w:styleId="807">
+  <w:style w:type="table" w:styleId="816">
     <w:name w:val="List Table 2 - Accent 2"/>
-    <w:basedOn w:val="887"/>
+    <w:basedOn w:val="896"/>
     <w:uiPriority w:val="99"/>
     <w:pPr>
       <w:pBdr/>
@@ -23613,9 +24159,9 @@
       </w:tcPr>
     </w:tblStylePr>
   </w:style>
-  <w:style w:type="table" w:styleId="808">
+  <w:style w:type="table" w:styleId="817">
     <w:name w:val="List Table 2 - Accent 3"/>
-    <w:basedOn w:val="887"/>
+    <w:basedOn w:val="896"/>
     <w:uiPriority w:val="99"/>
     <w:pPr>
       <w:pBdr/>
@@ -23851,9 +24397,9 @@
       </w:tcPr>
     </w:tblStylePr>
   </w:style>
-  <w:style w:type="table" w:styleId="809">
+  <w:style w:type="table" w:styleId="818">
     <w:name w:val="List Table 2 - Accent 4"/>
-    <w:basedOn w:val="887"/>
+    <w:basedOn w:val="896"/>
     <w:uiPriority w:val="99"/>
     <w:pPr>
       <w:pBdr/>
@@ -24089,9 +24635,9 @@
       </w:tcPr>
     </w:tblStylePr>
   </w:style>
-  <w:style w:type="table" w:styleId="810">
+  <w:style w:type="table" w:styleId="819">
     <w:name w:val="List Table 2 - Accent 5"/>
-    <w:basedOn w:val="887"/>
+    <w:basedOn w:val="896"/>
     <w:uiPriority w:val="99"/>
     <w:pPr>
       <w:pBdr/>
@@ -24327,9 +24873,9 @@
       </w:tcPr>
     </w:tblStylePr>
   </w:style>
-  <w:style w:type="table" w:styleId="811">
+  <w:style w:type="table" w:styleId="820">
     <w:name w:val="List Table 2 - Accent 6"/>
-    <w:basedOn w:val="887"/>
+    <w:basedOn w:val="896"/>
     <w:uiPriority w:val="99"/>
     <w:pPr>
       <w:pBdr/>
@@ -24565,9 +25111,9 @@
       </w:tcPr>
     </w:tblStylePr>
   </w:style>
-  <w:style w:type="table" w:styleId="812">
+  <w:style w:type="table" w:styleId="821">
     <w:name w:val="List Table 3"/>
-    <w:basedOn w:val="887"/>
+    <w:basedOn w:val="896"/>
     <w:uiPriority w:val="99"/>
     <w:pPr>
       <w:pBdr/>
@@ -24793,9 +25339,9 @@
       </w:tcPr>
     </w:tblStylePr>
   </w:style>
-  <w:style w:type="table" w:styleId="813">
+  <w:style w:type="table" w:styleId="822">
     <w:name w:val="List Table 3 - Accent 1"/>
-    <w:basedOn w:val="887"/>
+    <w:basedOn w:val="896"/>
     <w:uiPriority w:val="99"/>
     <w:pPr>
       <w:pBdr/>
@@ -25021,9 +25567,9 @@
       </w:tcPr>
     </w:tblStylePr>
   </w:style>
-  <w:style w:type="table" w:styleId="814">
+  <w:style w:type="table" w:styleId="823">
     <w:name w:val="List Table 3 - Accent 2"/>
-    <w:basedOn w:val="887"/>
+    <w:basedOn w:val="896"/>
     <w:uiPriority w:val="99"/>
     <w:pPr>
       <w:pBdr/>
@@ -25249,9 +25795,9 @@
       </w:tcPr>
     </w:tblStylePr>
   </w:style>
-  <w:style w:type="table" w:styleId="815">
+  <w:style w:type="table" w:styleId="824">
     <w:name w:val="List Table 3 - Accent 3"/>
-    <w:basedOn w:val="887"/>
+    <w:basedOn w:val="896"/>
     <w:uiPriority w:val="99"/>
     <w:pPr>
       <w:pBdr/>
@@ -25477,9 +26023,9 @@
       </w:tcPr>
     </w:tblStylePr>
   </w:style>
-  <w:style w:type="table" w:styleId="816">
+  <w:style w:type="table" w:styleId="825">
     <w:name w:val="List Table 3 - Accent 4"/>
-    <w:basedOn w:val="887"/>
+    <w:basedOn w:val="896"/>
     <w:uiPriority w:val="99"/>
     <w:pPr>
       <w:pBdr/>
@@ -25705,9 +26251,9 @@
       </w:tcPr>
     </w:tblStylePr>
   </w:style>
-  <w:style w:type="table" w:styleId="817">
+  <w:style w:type="table" w:styleId="826">
     <w:name w:val="List Table 3 - Accent 5"/>
-    <w:basedOn w:val="887"/>
+    <w:basedOn w:val="896"/>
     <w:uiPriority w:val="99"/>
     <w:pPr>
       <w:pBdr/>
@@ -25933,9 +26479,9 @@
       </w:tcPr>
     </w:tblStylePr>
   </w:style>
-  <w:style w:type="table" w:styleId="818">
+  <w:style w:type="table" w:styleId="827">
     <w:name w:val="List Table 3 - Accent 6"/>
-    <w:basedOn w:val="887"/>
+    <w:basedOn w:val="896"/>
     <w:uiPriority w:val="99"/>
     <w:pPr>
       <w:pBdr/>
@@ -26161,9 +26707,9 @@
       </w:tcPr>
     </w:tblStylePr>
   </w:style>
-  <w:style w:type="table" w:styleId="819">
+  <w:style w:type="table" w:styleId="828">
     <w:name w:val="List Table 4"/>
-    <w:basedOn w:val="887"/>
+    <w:basedOn w:val="896"/>
     <w:uiPriority w:val="99"/>
     <w:pPr>
       <w:pBdr/>
@@ -26386,9 +26932,9 @@
       </w:tcPr>
     </w:tblStylePr>
   </w:style>
-  <w:style w:type="table" w:styleId="820">
+  <w:style w:type="table" w:styleId="829">
     <w:name w:val="List Table 4 - Accent 1"/>
-    <w:basedOn w:val="887"/>
+    <w:basedOn w:val="896"/>
     <w:uiPriority w:val="99"/>
     <w:pPr>
       <w:pBdr/>
@@ -26611,9 +27157,9 @@
       </w:tcPr>
     </w:tblStylePr>
   </w:style>
-  <w:style w:type="table" w:styleId="821">
+  <w:style w:type="table" w:styleId="830">
     <w:name w:val="List Table 4 - Accent 2"/>
-    <w:basedOn w:val="887"/>
+    <w:basedOn w:val="896"/>
     <w:uiPriority w:val="99"/>
     <w:pPr>
       <w:pBdr/>
@@ -26836,9 +27382,9 @@
       </w:tcPr>
     </w:tblStylePr>
   </w:style>
-  <w:style w:type="table" w:styleId="822">
+  <w:style w:type="table" w:styleId="831">
     <w:name w:val="List Table 4 - Accent 3"/>
-    <w:basedOn w:val="887"/>
+    <w:basedOn w:val="896"/>
     <w:uiPriority w:val="99"/>
     <w:pPr>
       <w:pBdr/>
@@ -27061,9 +27607,9 @@
       </w:tcPr>
     </w:tblStylePr>
   </w:style>
-  <w:style w:type="table" w:styleId="823">
+  <w:style w:type="table" w:styleId="832">
     <w:name w:val="List Table 4 - Accent 4"/>
-    <w:basedOn w:val="887"/>
+    <w:basedOn w:val="896"/>
     <w:uiPriority w:val="99"/>
     <w:pPr>
       <w:pBdr/>
@@ -27286,9 +27832,9 @@
       </w:tcPr>
     </w:tblStylePr>
   </w:style>
-  <w:style w:type="table" w:styleId="824">
+  <w:style w:type="table" w:styleId="833">
     <w:name w:val="List Table 4 - Accent 5"/>
-    <w:basedOn w:val="887"/>
+    <w:basedOn w:val="896"/>
     <w:uiPriority w:val="99"/>
     <w:pPr>
       <w:pBdr/>
@@ -27511,9 +28057,9 @@
       </w:tcPr>
     </w:tblStylePr>
   </w:style>
-  <w:style w:type="table" w:styleId="825">
+  <w:style w:type="table" w:styleId="834">
     <w:name w:val="List Table 4 - Accent 6"/>
-    <w:basedOn w:val="887"/>
+    <w:basedOn w:val="896"/>
     <w:uiPriority w:val="99"/>
     <w:pPr>
       <w:pBdr/>
@@ -27736,9 +28282,9 @@
       </w:tcPr>
     </w:tblStylePr>
   </w:style>
-  <w:style w:type="table" w:styleId="826">
+  <w:style w:type="table" w:styleId="835">
     <w:name w:val="List Table 5 Dark"/>
-    <w:basedOn w:val="887"/>
+    <w:basedOn w:val="896"/>
     <w:uiPriority w:val="99"/>
     <w:pPr>
       <w:pBdr/>
@@ -27978,9 +28524,9 @@
       </w:tcPr>
     </w:tblStylePr>
   </w:style>
-  <w:style w:type="table" w:styleId="827">
+  <w:style w:type="table" w:styleId="836">
     <w:name w:val="List Table 5 Dark - Accent 1"/>
-    <w:basedOn w:val="887"/>
+    <w:basedOn w:val="896"/>
     <w:uiPriority w:val="99"/>
     <w:pPr>
       <w:pBdr/>
@@ -28220,9 +28766,9 @@
       </w:tcPr>
     </w:tblStylePr>
   </w:style>
-  <w:style w:type="table" w:styleId="828">
+  <w:style w:type="table" w:styleId="837">
     <w:name w:val="List Table 5 Dark - Accent 2"/>
-    <w:basedOn w:val="887"/>
+    <w:basedOn w:val="896"/>
     <w:uiPriority w:val="99"/>
     <w:pPr>
       <w:pBdr/>
@@ -28462,9 +29008,9 @@
       </w:tcPr>
     </w:tblStylePr>
   </w:style>
-  <w:style w:type="table" w:styleId="829">
+  <w:style w:type="table" w:styleId="838">
     <w:name w:val="List Table 5 Dark - Accent 3"/>
-    <w:basedOn w:val="887"/>
+    <w:basedOn w:val="896"/>
     <w:uiPriority w:val="99"/>
     <w:pPr>
       <w:pBdr/>
@@ -28704,9 +29250,9 @@
       </w:tcPr>
     </w:tblStylePr>
   </w:style>
-  <w:style w:type="table" w:styleId="830">
+  <w:style w:type="table" w:styleId="839">
     <w:name w:val="List Table 5 Dark - Accent 4"/>
-    <w:basedOn w:val="887"/>
+    <w:basedOn w:val="896"/>
     <w:uiPriority w:val="99"/>
     <w:pPr>
       <w:pBdr/>
@@ -28946,9 +29492,9 @@
       </w:tcPr>
     </w:tblStylePr>
   </w:style>
-  <w:style w:type="table" w:styleId="831">
+  <w:style w:type="table" w:styleId="840">
     <w:name w:val="List Table 5 Dark - Accent 5"/>
-    <w:basedOn w:val="887"/>
+    <w:basedOn w:val="896"/>
     <w:uiPriority w:val="99"/>
     <w:pPr>
       <w:pBdr/>
@@ -29188,9 +29734,9 @@
       </w:tcPr>
     </w:tblStylePr>
   </w:style>
-  <w:style w:type="table" w:styleId="832">
+  <w:style w:type="table" w:styleId="841">
     <w:name w:val="List Table 5 Dark - Accent 6"/>
-    <w:basedOn w:val="887"/>
+    <w:basedOn w:val="896"/>
     <w:uiPriority w:val="99"/>
     <w:pPr>
       <w:pBdr/>
@@ -29430,9 +29976,9 @@
       </w:tcPr>
     </w:tblStylePr>
   </w:style>
-  <w:style w:type="table" w:styleId="833">
+  <w:style w:type="table" w:styleId="842">
     <w:name w:val="List Table 6 Colorful"/>
-    <w:basedOn w:val="887"/>
+    <w:basedOn w:val="896"/>
     <w:uiPriority w:val="99"/>
     <w:pPr>
       <w:pBdr/>
@@ -29653,9 +30199,9 @@
       </w:tcPr>
     </w:tblStylePr>
   </w:style>
-  <w:style w:type="table" w:styleId="834">
+  <w:style w:type="table" w:styleId="843">
     <w:name w:val="List Table 6 Colorful - Accent 1"/>
-    <w:basedOn w:val="887"/>
+    <w:basedOn w:val="896"/>
     <w:uiPriority w:val="99"/>
     <w:pPr>
       <w:pBdr/>
@@ -29876,9 +30422,9 @@
       </w:tcPr>
     </w:tblStylePr>
   </w:style>
-  <w:style w:type="table" w:styleId="835">
+  <w:style w:type="table" w:styleId="844">
     <w:name w:val="List Table 6 Colorful - Accent 2"/>
-    <w:basedOn w:val="887"/>
+    <w:basedOn w:val="896"/>
     <w:uiPriority w:val="99"/>
     <w:pPr>
       <w:pBdr/>
@@ -30099,9 +30645,9 @@
       </w:tcPr>
     </w:tblStylePr>
   </w:style>
-  <w:style w:type="table" w:styleId="836">
+  <w:style w:type="table" w:styleId="845">
     <w:name w:val="List Table 6 Colorful - Accent 3"/>
-    <w:basedOn w:val="887"/>
+    <w:basedOn w:val="896"/>
     <w:uiPriority w:val="99"/>
     <w:pPr>
       <w:pBdr/>
@@ -30322,9 +30868,9 @@
       </w:tcPr>
     </w:tblStylePr>
   </w:style>
-  <w:style w:type="table" w:styleId="837">
+  <w:style w:type="table" w:styleId="846">
     <w:name w:val="List Table 6 Colorful - Accent 4"/>
-    <w:basedOn w:val="887"/>
+    <w:basedOn w:val="896"/>
     <w:uiPriority w:val="99"/>
     <w:pPr>
       <w:pBdr/>
@@ -30545,9 +31091,9 @@
       </w:tcPr>
     </w:tblStylePr>
   </w:style>
-  <w:style w:type="table" w:styleId="838">
+  <w:style w:type="table" w:styleId="847">
     <w:name w:val="List Table 6 Colorful - Accent 5"/>
-    <w:basedOn w:val="887"/>
+    <w:basedOn w:val="896"/>
     <w:uiPriority w:val="99"/>
     <w:pPr>
       <w:pBdr/>
@@ -30768,9 +31314,9 @@
       </w:tcPr>
     </w:tblStylePr>
   </w:style>
-  <w:style w:type="table" w:styleId="839">
+  <w:style w:type="table" w:styleId="848">
     <w:name w:val="List Table 6 Colorful - Accent 6"/>
-    <w:basedOn w:val="887"/>
+    <w:basedOn w:val="896"/>
     <w:uiPriority w:val="99"/>
     <w:pPr>
       <w:pBdr/>
@@ -30991,9 +31537,9 @@
       </w:tcPr>
     </w:tblStylePr>
   </w:style>
-  <w:style w:type="table" w:styleId="840">
+  <w:style w:type="table" w:styleId="849">
     <w:name w:val="List Table 7 Colorful"/>
-    <w:basedOn w:val="887"/>
+    <w:basedOn w:val="896"/>
     <w:uiPriority w:val="99"/>
     <w:pPr>
       <w:pBdr/>
@@ -31247,9 +31793,9 @@
       </w:tcPr>
     </w:tblStylePr>
   </w:style>
-  <w:style w:type="table" w:styleId="841">
+  <w:style w:type="table" w:styleId="850">
     <w:name w:val="List Table 7 Colorful - Accent 1"/>
-    <w:basedOn w:val="887"/>
+    <w:basedOn w:val="896"/>
     <w:uiPriority w:val="99"/>
     <w:pPr>
       <w:pBdr/>
@@ -31503,9 +32049,9 @@
       </w:tcPr>
     </w:tblStylePr>
   </w:style>
-  <w:style w:type="table" w:styleId="842">
+  <w:style w:type="table" w:styleId="851">
     <w:name w:val="List Table 7 Colorful - Accent 2"/>
-    <w:basedOn w:val="887"/>
+    <w:basedOn w:val="896"/>
     <w:uiPriority w:val="99"/>
     <w:pPr>
       <w:pBdr/>
@@ -31759,9 +32305,9 @@
       </w:tcPr>
     </w:tblStylePr>
   </w:style>
-  <w:style w:type="table" w:styleId="843">
+  <w:style w:type="table" w:styleId="852">
     <w:name w:val="List Table 7 Colorful - Accent 3"/>
-    <w:basedOn w:val="887"/>
+    <w:basedOn w:val="896"/>
     <w:uiPriority w:val="99"/>
     <w:pPr>
       <w:pBdr/>
@@ -32015,9 +32561,9 @@
       </w:tcPr>
     </w:tblStylePr>
   </w:style>
-  <w:style w:type="table" w:styleId="844">
+  <w:style w:type="table" w:styleId="853">
     <w:name w:val="List Table 7 Colorful - Accent 4"/>
-    <w:basedOn w:val="887"/>
+    <w:basedOn w:val="896"/>
     <w:uiPriority w:val="99"/>
     <w:pPr>
       <w:pBdr/>
@@ -32271,9 +32817,9 @@
       </w:tcPr>
     </w:tblStylePr>
   </w:style>
-  <w:style w:type="table" w:styleId="845">
+  <w:style w:type="table" w:styleId="854">
     <w:name w:val="List Table 7 Colorful - Accent 5"/>
-    <w:basedOn w:val="887"/>
+    <w:basedOn w:val="896"/>
     <w:uiPriority w:val="99"/>
     <w:pPr>
       <w:pBdr/>
@@ -32527,9 +33073,9 @@
       </w:tcPr>
     </w:tblStylePr>
   </w:style>
-  <w:style w:type="table" w:styleId="846">
+  <w:style w:type="table" w:styleId="855">
     <w:name w:val="List Table 7 Colorful - Accent 6"/>
-    <w:basedOn w:val="887"/>
+    <w:basedOn w:val="896"/>
     <w:uiPriority w:val="99"/>
     <w:pPr>
       <w:pBdr/>
@@ -32783,9 +33329,9 @@
       </w:tcPr>
     </w:tblStylePr>
   </w:style>
-  <w:style w:type="table" w:styleId="847">
+  <w:style w:type="table" w:styleId="856">
     <w:name w:val="Lined - Accent"/>
-    <w:basedOn w:val="887"/>
+    <w:basedOn w:val="896"/>
     <w:uiPriority w:val="99"/>
     <w:pPr>
       <w:pBdr/>
@@ -33020,9 +33566,9 @@
       </w:tcPr>
     </w:tblStylePr>
   </w:style>
-  <w:style w:type="table" w:styleId="848">
+  <w:style w:type="table" w:styleId="857">
     <w:name w:val="Lined - Accent 1"/>
-    <w:basedOn w:val="887"/>
+    <w:basedOn w:val="896"/>
     <w:uiPriority w:val="99"/>
     <w:pPr>
       <w:pBdr/>
@@ -33257,9 +33803,9 @@
       </w:tcPr>
     </w:tblStylePr>
   </w:style>
-  <w:style w:type="table" w:styleId="849">
+  <w:style w:type="table" w:styleId="858">
     <w:name w:val="Lined - Accent 2"/>
-    <w:basedOn w:val="887"/>
+    <w:basedOn w:val="896"/>
     <w:uiPriority w:val="99"/>
     <w:pPr>
       <w:pBdr/>
@@ -33494,9 +34040,9 @@
       </w:tcPr>
     </w:tblStylePr>
   </w:style>
-  <w:style w:type="table" w:styleId="850">
+  <w:style w:type="table" w:styleId="859">
     <w:name w:val="Lined - Accent 3"/>
-    <w:basedOn w:val="887"/>
+    <w:basedOn w:val="896"/>
     <w:uiPriority w:val="99"/>
     <w:pPr>
       <w:pBdr/>
@@ -33731,9 +34277,9 @@
       </w:tcPr>
     </w:tblStylePr>
   </w:style>
-  <w:style w:type="table" w:styleId="851">
+  <w:style w:type="table" w:styleId="860">
     <w:name w:val="Lined - Accent 4"/>
-    <w:basedOn w:val="887"/>
+    <w:basedOn w:val="896"/>
     <w:uiPriority w:val="99"/>
     <w:pPr>
       <w:pBdr/>
@@ -33968,9 +34514,9 @@
       </w:tcPr>
     </w:tblStylePr>
   </w:style>
-  <w:style w:type="table" w:styleId="852">
+  <w:style w:type="table" w:styleId="861">
     <w:name w:val="Lined - Accent 5"/>
-    <w:basedOn w:val="887"/>
+    <w:basedOn w:val="896"/>
     <w:uiPriority w:val="99"/>
     <w:pPr>
       <w:pBdr/>
@@ -34205,9 +34751,9 @@
       </w:tcPr>
     </w:tblStylePr>
   </w:style>
-  <w:style w:type="table" w:styleId="853">
+  <w:style w:type="table" w:styleId="862">
     <w:name w:val="Lined - Accent 6"/>
-    <w:basedOn w:val="887"/>
+    <w:basedOn w:val="896"/>
     <w:uiPriority w:val="99"/>
     <w:pPr>
       <w:pBdr/>
@@ -34442,9 +34988,9 @@
       </w:tcPr>
     </w:tblStylePr>
   </w:style>
-  <w:style w:type="table" w:styleId="854">
+  <w:style w:type="table" w:styleId="863">
     <w:name w:val="Bordered &amp; Lined - Accent"/>
-    <w:basedOn w:val="887"/>
+    <w:basedOn w:val="896"/>
     <w:uiPriority w:val="99"/>
     <w:pPr>
       <w:pBdr/>
@@ -34686,9 +35232,9 @@
       </w:tcPr>
     </w:tblStylePr>
   </w:style>
-  <w:style w:type="table" w:styleId="855">
+  <w:style w:type="table" w:styleId="864">
     <w:name w:val="Bordered &amp; Lined - Accent 1"/>
-    <w:basedOn w:val="887"/>
+    <w:basedOn w:val="896"/>
     <w:uiPriority w:val="99"/>
     <w:pPr>
       <w:pBdr/>
@@ -34930,9 +35476,9 @@
       </w:tcPr>
     </w:tblStylePr>
   </w:style>
-  <w:style w:type="table" w:styleId="856">
+  <w:style w:type="table" w:styleId="865">
     <w:name w:val="Bordered &amp; Lined - Accent 2"/>
-    <w:basedOn w:val="887"/>
+    <w:basedOn w:val="896"/>
     <w:uiPriority w:val="99"/>
     <w:pPr>
       <w:pBdr/>
@@ -35174,9 +35720,9 @@
       </w:tcPr>
     </w:tblStylePr>
   </w:style>
-  <w:style w:type="table" w:styleId="857">
+  <w:style w:type="table" w:styleId="866">
     <w:name w:val="Bordered &amp; Lined - Accent 3"/>
-    <w:basedOn w:val="887"/>
+    <w:basedOn w:val="896"/>
     <w:uiPriority w:val="99"/>
     <w:pPr>
       <w:pBdr/>
@@ -35418,9 +35964,9 @@
       </w:tcPr>
     </w:tblStylePr>
   </w:style>
-  <w:style w:type="table" w:styleId="858">
+  <w:style w:type="table" w:styleId="867">
     <w:name w:val="Bordered &amp; Lined - Accent 4"/>
-    <w:basedOn w:val="887"/>
+    <w:basedOn w:val="896"/>
     <w:uiPriority w:val="99"/>
     <w:pPr>
       <w:pBdr/>
@@ -35662,9 +36208,9 @@
       </w:tcPr>
     </w:tblStylePr>
   </w:style>
-  <w:style w:type="table" w:styleId="859">
+  <w:style w:type="table" w:styleId="868">
     <w:name w:val="Bordered &amp; Lined - Accent 5"/>
-    <w:basedOn w:val="887"/>
+    <w:basedOn w:val="896"/>
     <w:uiPriority w:val="99"/>
     <w:pPr>
       <w:pBdr/>
@@ -35906,9 +36452,9 @@
       </w:tcPr>
     </w:tblStylePr>
   </w:style>
-  <w:style w:type="table" w:styleId="860">
+  <w:style w:type="table" w:styleId="869">
     <w:name w:val="Bordered &amp; Lined - Accent 6"/>
-    <w:basedOn w:val="887"/>
+    <w:basedOn w:val="896"/>
     <w:uiPriority w:val="99"/>
     <w:pPr>
       <w:pBdr/>
@@ -36150,9 +36696,9 @@
       </w:tcPr>
     </w:tblStylePr>
   </w:style>
-  <w:style w:type="table" w:styleId="861">
+  <w:style w:type="table" w:styleId="870">
     <w:name w:val="Bordered"/>
-    <w:basedOn w:val="887"/>
+    <w:basedOn w:val="896"/>
     <w:uiPriority w:val="99"/>
     <w:pPr>
       <w:pBdr/>
@@ -36381,9 +36927,9 @@
       </w:tcPr>
     </w:tblStylePr>
   </w:style>
-  <w:style w:type="table" w:styleId="862">
+  <w:style w:type="table" w:styleId="871">
     <w:name w:val="Bordered - Accent 1"/>
-    <w:basedOn w:val="887"/>
+    <w:basedOn w:val="896"/>
     <w:uiPriority w:val="99"/>
     <w:pPr>
       <w:pBdr/>
@@ -36612,9 +37158,9 @@
       </w:tcPr>
     </w:tblStylePr>
   </w:style>
-  <w:style w:type="table" w:styleId="863">
+  <w:style w:type="table" w:styleId="872">
     <w:name w:val="Bordered - Accent 2"/>
-    <w:basedOn w:val="887"/>
+    <w:basedOn w:val="896"/>
     <w:uiPriority w:val="99"/>
     <w:pPr>
       <w:pBdr/>
@@ -36843,9 +37389,9 @@
       </w:tcPr>
     </w:tblStylePr>
   </w:style>
-  <w:style w:type="table" w:styleId="864">
+  <w:style w:type="table" w:styleId="873">
     <w:name w:val="Bordered - Accent 3"/>
-    <w:basedOn w:val="887"/>
+    <w:basedOn w:val="896"/>
     <w:uiPriority w:val="99"/>
     <w:pPr>
       <w:pBdr/>
@@ -37074,9 +37620,9 @@
       </w:tcPr>
     </w:tblStylePr>
   </w:style>
-  <w:style w:type="table" w:styleId="865">
+  <w:style w:type="table" w:styleId="874">
     <w:name w:val="Bordered - Accent 4"/>
-    <w:basedOn w:val="887"/>
+    <w:basedOn w:val="896"/>
     <w:uiPriority w:val="99"/>
     <w:pPr>
       <w:pBdr/>
@@ -37305,9 +37851,9 @@
       </w:tcPr>
     </w:tblStylePr>
   </w:style>
-  <w:style w:type="table" w:styleId="866">
+  <w:style w:type="table" w:styleId="875">
     <w:name w:val="Bordered - Accent 5"/>
-    <w:basedOn w:val="887"/>
+    <w:basedOn w:val="896"/>
     <w:uiPriority w:val="99"/>
     <w:pPr>
       <w:pBdr/>
@@ -37536,9 +38082,9 @@
       </w:tcPr>
     </w:tblStylePr>
   </w:style>
-  <w:style w:type="table" w:styleId="867">
+  <w:style w:type="table" w:styleId="876">
     <w:name w:val="Bordered - Accent 6"/>
-    <w:basedOn w:val="887"/>
+    <w:basedOn w:val="896"/>
     <w:uiPriority w:val="99"/>
     <w:pPr>
       <w:pBdr/>
@@ -37767,7 +38313,7 @@
       </w:tcPr>
     </w:tblStylePr>
   </w:style>
-  <w:style w:type="character" w:styleId="868">
+  <w:style w:type="character" w:styleId="877">
     <w:name w:val="Hyperlink"/>
     <w:uiPriority w:val="99"/>
     <w:unhideWhenUsed/>
@@ -37781,10 +38327,10 @@
       <w:u w:val="single"/>
     </w:rPr>
   </w:style>
-  <w:style w:type="paragraph" w:styleId="869">
+  <w:style w:type="paragraph" w:styleId="878">
     <w:name w:val="footnote text"/>
-    <w:basedOn w:val="886"/>
-    <w:link w:val="870"/>
+    <w:basedOn w:val="895"/>
+    <w:link w:val="879"/>
     <w:uiPriority w:val="99"/>
     <w:semiHidden/>
     <w:unhideWhenUsed/>
@@ -37797,9 +38343,9 @@
       <w:sz w:val="18"/>
     </w:rPr>
   </w:style>
-  <w:style w:type="character" w:styleId="870">
+  <w:style w:type="character" w:styleId="879">
     <w:name w:val="Footnote Text Char"/>
-    <w:link w:val="869"/>
+    <w:link w:val="878"/>
     <w:uiPriority w:val="99"/>
     <w:pPr>
       <w:pBdr/>
@@ -37810,7 +38356,7 @@
       <w:sz w:val="18"/>
     </w:rPr>
   </w:style>
-  <w:style w:type="character" w:styleId="871">
+  <w:style w:type="character" w:styleId="880">
     <w:name w:val="footnote reference"/>
     <w:uiPriority w:val="99"/>
     <w:unhideWhenUsed/>
@@ -37823,10 +38369,10 @@
       <w:vertAlign w:val="superscript"/>
     </w:rPr>
   </w:style>
-  <w:style w:type="paragraph" w:styleId="872">
+  <w:style w:type="paragraph" w:styleId="881">
     <w:name w:val="endnote text"/>
-    <w:basedOn w:val="886"/>
-    <w:link w:val="873"/>
+    <w:basedOn w:val="895"/>
+    <w:link w:val="882"/>
     <w:uiPriority w:val="99"/>
     <w:semiHidden/>
     <w:unhideWhenUsed/>
@@ -37839,9 +38385,9 @@
       <w:sz w:val="20"/>
     </w:rPr>
   </w:style>
-  <w:style w:type="character" w:styleId="873">
+  <w:style w:type="character" w:styleId="882">
     <w:name w:val="Endnote Text Char"/>
-    <w:link w:val="872"/>
+    <w:link w:val="881"/>
     <w:uiPriority w:val="99"/>
     <w:pPr>
       <w:pBdr/>
@@ -37852,7 +38398,7 @@
       <w:sz w:val="20"/>
     </w:rPr>
   </w:style>
-  <w:style w:type="character" w:styleId="874">
+  <w:style w:type="character" w:styleId="883">
     <w:name w:val="endnote reference"/>
     <w:uiPriority w:val="99"/>
     <w:semiHidden/>
@@ -37866,10 +38412,10 @@
       <w:vertAlign w:val="superscript"/>
     </w:rPr>
   </w:style>
-  <w:style w:type="paragraph" w:styleId="875">
+  <w:style w:type="paragraph" w:styleId="884">
     <w:name w:val="toc 1"/>
-    <w:basedOn w:val="886"/>
-    <w:next w:val="886"/>
+    <w:basedOn w:val="895"/>
+    <w:next w:val="895"/>
     <w:uiPriority w:val="39"/>
     <w:unhideWhenUsed/>
     <w:pPr>
@@ -37878,10 +38424,10 @@
       <w:ind w:right="0" w:firstLine="0" w:left="0"/>
     </w:pPr>
   </w:style>
-  <w:style w:type="paragraph" w:styleId="876">
+  <w:style w:type="paragraph" w:styleId="885">
     <w:name w:val="toc 2"/>
-    <w:basedOn w:val="886"/>
-    <w:next w:val="886"/>
+    <w:basedOn w:val="895"/>
+    <w:next w:val="895"/>
     <w:uiPriority w:val="39"/>
     <w:unhideWhenUsed/>
     <w:pPr>
@@ -37890,10 +38436,10 @@
       <w:ind w:right="0" w:firstLine="0" w:left="283"/>
     </w:pPr>
   </w:style>
-  <w:style w:type="paragraph" w:styleId="877">
+  <w:style w:type="paragraph" w:styleId="886">
     <w:name w:val="toc 3"/>
-    <w:basedOn w:val="886"/>
-    <w:next w:val="886"/>
+    <w:basedOn w:val="895"/>
+    <w:next w:val="895"/>
     <w:uiPriority w:val="39"/>
     <w:unhideWhenUsed/>
     <w:pPr>
@@ -37902,10 +38448,10 @@
       <w:ind w:right="0" w:firstLine="0" w:left="567"/>
     </w:pPr>
   </w:style>
-  <w:style w:type="paragraph" w:styleId="878">
+  <w:style w:type="paragraph" w:styleId="887">
     <w:name w:val="toc 4"/>
-    <w:basedOn w:val="886"/>
-    <w:next w:val="886"/>
+    <w:basedOn w:val="895"/>
+    <w:next w:val="895"/>
     <w:uiPriority w:val="39"/>
     <w:unhideWhenUsed/>
     <w:pPr>
@@ -37914,10 +38460,10 @@
       <w:ind w:right="0" w:firstLine="0" w:left="850"/>
     </w:pPr>
   </w:style>
-  <w:style w:type="paragraph" w:styleId="879">
+  <w:style w:type="paragraph" w:styleId="888">
     <w:name w:val="toc 5"/>
-    <w:basedOn w:val="886"/>
-    <w:next w:val="886"/>
+    <w:basedOn w:val="895"/>
+    <w:next w:val="895"/>
     <w:uiPriority w:val="39"/>
     <w:unhideWhenUsed/>
     <w:pPr>
@@ -37926,10 +38472,10 @@
       <w:ind w:right="0" w:firstLine="0" w:left="1134"/>
     </w:pPr>
   </w:style>
-  <w:style w:type="paragraph" w:styleId="880">
+  <w:style w:type="paragraph" w:styleId="889">
     <w:name w:val="toc 6"/>
-    <w:basedOn w:val="886"/>
-    <w:next w:val="886"/>
+    <w:basedOn w:val="895"/>
+    <w:next w:val="895"/>
     <w:uiPriority w:val="39"/>
     <w:unhideWhenUsed/>
     <w:pPr>
@@ -37938,10 +38484,10 @@
       <w:ind w:right="0" w:firstLine="0" w:left="1417"/>
     </w:pPr>
   </w:style>
-  <w:style w:type="paragraph" w:styleId="881">
+  <w:style w:type="paragraph" w:styleId="890">
     <w:name w:val="toc 7"/>
-    <w:basedOn w:val="886"/>
-    <w:next w:val="886"/>
+    <w:basedOn w:val="895"/>
+    <w:next w:val="895"/>
     <w:uiPriority w:val="39"/>
     <w:unhideWhenUsed/>
     <w:pPr>
@@ -37950,10 +38496,10 @@
       <w:ind w:right="0" w:firstLine="0" w:left="1701"/>
     </w:pPr>
   </w:style>
-  <w:style w:type="paragraph" w:styleId="882">
+  <w:style w:type="paragraph" w:styleId="891">
     <w:name w:val="toc 8"/>
-    <w:basedOn w:val="886"/>
-    <w:next w:val="886"/>
+    <w:basedOn w:val="895"/>
+    <w:next w:val="895"/>
     <w:uiPriority w:val="39"/>
     <w:unhideWhenUsed/>
     <w:pPr>
@@ -37962,10 +38508,10 @@
       <w:ind w:right="0" w:firstLine="0" w:left="1984"/>
     </w:pPr>
   </w:style>
-  <w:style w:type="paragraph" w:styleId="883">
+  <w:style w:type="paragraph" w:styleId="892">
     <w:name w:val="toc 9"/>
-    <w:basedOn w:val="886"/>
-    <w:next w:val="886"/>
+    <w:basedOn w:val="895"/>
+    <w:next w:val="895"/>
     <w:uiPriority w:val="39"/>
     <w:unhideWhenUsed/>
     <w:pPr>
@@ -37974,7 +38520,7 @@
       <w:ind w:right="0" w:firstLine="0" w:left="2268"/>
     </w:pPr>
   </w:style>
-  <w:style w:type="paragraph" w:styleId="884">
+  <w:style w:type="paragraph" w:styleId="893">
     <w:name w:val="TOC Heading"/>
     <w:uiPriority w:val="39"/>
     <w:unhideWhenUsed/>
@@ -37984,10 +38530,10 @@
       <w:ind/>
     </w:pPr>
   </w:style>
-  <w:style w:type="paragraph" w:styleId="885">
+  <w:style w:type="paragraph" w:styleId="894">
     <w:name w:val="table of figures"/>
-    <w:basedOn w:val="886"/>
-    <w:next w:val="886"/>
+    <w:basedOn w:val="895"/>
+    <w:next w:val="895"/>
     <w:uiPriority w:val="99"/>
     <w:unhideWhenUsed/>
     <w:pPr>
@@ -37996,7 +38542,7 @@
       <w:ind/>
     </w:pPr>
   </w:style>
-  <w:style w:type="paragraph" w:styleId="886" w:default="1">
+  <w:style w:type="paragraph" w:styleId="895" w:default="1">
     <w:name w:val="Normal"/>
     <w:qFormat/>
     <w:pPr>
@@ -38005,7 +38551,7 @@
       <w:ind/>
     </w:pPr>
   </w:style>
-  <w:style w:type="table" w:styleId="887" w:default="1">
+  <w:style w:type="table" w:styleId="896" w:default="1">
     <w:name w:val="Normal Table"/>
     <w:uiPriority w:val="99"/>
     <w:semiHidden/>
@@ -38198,7 +38744,7 @@
       </w:tcPr>
     </w:tblStylePr>
   </w:style>
-  <w:style w:type="numbering" w:styleId="888" w:default="1">
+  <w:style w:type="numbering" w:styleId="897" w:default="1">
     <w:name w:val="No List"/>
     <w:uiPriority w:val="99"/>
     <w:semiHidden/>
@@ -38209,9 +38755,9 @@
       <w:ind/>
     </w:pPr>
   </w:style>
-  <w:style w:type="paragraph" w:styleId="889">
+  <w:style w:type="paragraph" w:styleId="898">
     <w:name w:val="No Spacing"/>
-    <w:basedOn w:val="886"/>
+    <w:basedOn w:val="895"/>
     <w:uiPriority w:val="1"/>
     <w:qFormat/>
     <w:pPr>
@@ -38220,9 +38766,9 @@
       <w:ind/>
     </w:pPr>
   </w:style>
-  <w:style w:type="paragraph" w:styleId="890">
+  <w:style w:type="paragraph" w:styleId="899">
     <w:name w:val="List Paragraph"/>
-    <w:basedOn w:val="886"/>
+    <w:basedOn w:val="895"/>
     <w:uiPriority w:val="34"/>
     <w:qFormat/>
     <w:pPr>
@@ -38232,7 +38778,7 @@
       <w:contextualSpacing w:val="true"/>
     </w:pPr>
   </w:style>
-  <w:style w:type="character" w:styleId="891" w:default="1">
+  <w:style w:type="character" w:styleId="900" w:default="1">
     <w:name w:val="Default Paragraph Font"/>
     <w:uiPriority w:val="1"/>
     <w:semiHidden/>

</xml_diff>

<commit_message>
Need to finish interface analysis + include interface / display in objectives
</commit_message>
<xml_diff>
--- a/Analysis.docx
+++ b/Analysis.docx
@@ -461,42 +461,11 @@
           <w:highlight w:val="none"/>
         </w:rPr>
       </w:r>
-    </w:p>
-    <w:p>
-      <w:pPr>
-        <w:pBdr/>
-        <w:spacing/>
-        <w:ind/>
-        <w:rPr>
-          <w:highlight w:val="none"/>
-        </w:rPr>
-      </w:pPr>
-      <w:r>
-        <w:rPr>
-          <w:highlight w:val="none"/>
-        </w:rPr>
-        <w:t xml:space="preserve">This simulation works fine, until planets collide. How collisions are handled will be explained later, as it’s rather technical.</w:t>
-      </w:r>
-      <w:r>
-        <w:rPr>
-          <w:highlight w:val="none"/>
-        </w:rPr>
-      </w:r>
-      <w:r>
-        <w:rPr>
-          <w:highlight w:val="none"/>
-        </w:rPr>
-      </w:r>
-    </w:p>
-    <w:p>
-      <w:pPr>
-        <w:pBdr/>
-        <w:spacing/>
-        <w:ind/>
-        <w:rPr>
-          <w:highlight w:val="none"/>
-        </w:rPr>
-      </w:pPr>
+      <w:r>
+        <w:rPr>
+          <w:highlight w:val="none"/>
+        </w:rPr>
+      </w:r>
       <w:r>
         <w:rPr>
           <w:highlight w:val="none"/>
@@ -1088,7 +1057,24 @@
         <w:tab/>
         <w:t xml:space="preserve">comparisons, like in the link above. Should be possible to edit the masses of objects to </w:t>
         <w:tab/>
-        <w:t xml:space="preserve">show the effect it has too like in the PHeT simulator.</w:t>
+        <w:t xml:space="preserve">show the effect it has too like in the PHeT simulator. I think allowing the user to change </w:t>
+        <w:tab/>
+        <w:t xml:space="preserve">the value of G would be informative as well, to show what it actually does.</w:t>
+      </w:r>
+      <w:r>
+        <w:rPr>
+          <w:highlight w:val="none"/>
+        </w:rPr>
+      </w:r>
+      <w:r>
+        <w:rPr>
+          <w:highlight w:val="none"/>
+        </w:rPr>
+      </w:r>
+      <w:r>
+        <w:rPr>
+          <w:highlight w:val="none"/>
+        </w:rPr>
       </w:r>
       <w:r>
         <w:rPr>
@@ -2296,6 +2282,27 @@
         <w:rPr>
           <w:highlight w:val="none"/>
         </w:rPr>
+        <w:t xml:space="preserve">This site allows you to move the camera and to focus on specific planets, which is something I think is very beneficial for teaching as it gives you different perspectives of the solar system, and it is something I want in my own project.</w:t>
+      </w:r>
+      <w:r>
+        <w:rPr>
+          <w:highlight w:val="none"/>
+        </w:rPr>
+      </w:r>
+    </w:p>
+    <w:p>
+      <w:pPr>
+        <w:pBdr/>
+        <w:spacing/>
+        <w:ind/>
+        <w:rPr>
+          <w:highlight w:val="none"/>
+        </w:rPr>
+      </w:pPr>
+      <w:r>
+        <w:rPr>
+          <w:highlight w:val="none"/>
+        </w:rPr>
         <w:t xml:space="preserve">However, the site lacks a few things. </w:t>
       </w:r>
       <w:r>
@@ -3164,6 +3171,14 @@
           <w:highlight w:val="none"/>
         </w:rPr>
       </w:r>
+      <w:r>
+        <w:rPr>
+          <w:color w:val="000000" w:themeColor="text1"/>
+          <w:sz w:val="22"/>
+          <w:szCs w:val="22"/>
+          <w:highlight w:val="none"/>
+        </w:rPr>
+      </w:r>
     </w:p>
     <w:p>
       <w:pPr>
@@ -3269,6 +3284,14 @@
           <w:highlight w:val="none"/>
         </w:rPr>
       </w:r>
+      <w:r>
+        <w:rPr>
+          <w:color w:val="000000" w:themeColor="text1"/>
+          <w:sz w:val="22"/>
+          <w:szCs w:val="22"/>
+          <w:highlight w:val="none"/>
+        </w:rPr>
+      </w:r>
     </w:p>
     <w:p>
       <w:pPr>
@@ -3538,48 +3561,33 @@
       </w:r>
       <w:r>
         <w:rPr>
-          <w:highlight w:val="none"/>
-        </w:rPr>
-      </w:r>
-      <w:r>
-        <w:rPr>
-          <w:highlight w:val="none"/>
-        </w:rPr>
-      </w:r>
-      <w:r>
-        <w:rPr>
-          <w:highlight w:val="none"/>
-        </w:rPr>
-      </w:r>
-      <w:r>
-        <w:rPr>
           <w:color w:val="000000" w:themeColor="text1"/>
           <w:sz w:val="22"/>
           <w:szCs w:val="22"/>
           <w:highlight w:val="none"/>
         </w:rPr>
       </w:r>
-    </w:p>
-    <w:p>
-      <w:pPr>
-        <w:pBdr/>
-        <w:spacing/>
-        <w:ind/>
+      <w:r>
         <w:rPr>
           <w:color w:val="000000" w:themeColor="text1"/>
           <w:sz w:val="22"/>
           <w:szCs w:val="22"/>
           <w:highlight w:val="none"/>
         </w:rPr>
-      </w:pPr>
-      <w:r>
+      </w:r>
+    </w:p>
+    <w:p>
+      <w:pPr>
+        <w:pBdr/>
+        <w:spacing/>
+        <w:ind/>
         <w:rPr>
           <w:color w:val="000000" w:themeColor="text1"/>
           <w:sz w:val="22"/>
           <w:szCs w:val="22"/>
           <w:highlight w:val="none"/>
         </w:rPr>
-      </w:r>
+      </w:pPr>
       <w:r>
         <w:rPr>
           <w:color w:val="000000" w:themeColor="text1"/>
@@ -3588,19 +3596,14 @@
           <w:highlight w:val="none"/>
         </w:rPr>
       </w:r>
-    </w:p>
-    <w:p>
-      <w:pPr>
-        <w:pBdr/>
-        <w:spacing/>
-        <w:ind/>
+      <w:r>
         <w:rPr>
           <w:color w:val="000000" w:themeColor="text1"/>
           <w:sz w:val="22"/>
           <w:szCs w:val="22"/>
           <w:highlight w:val="none"/>
         </w:rPr>
-      </w:pPr>
+      </w:r>
       <w:r>
         <w:rPr>
           <w:color w:val="000000" w:themeColor="text1"/>
@@ -3608,29 +3611,75 @@
           <w:szCs w:val="22"/>
           <w:highlight w:val="none"/>
         </w:rPr>
-        <w:t xml:space="preserve">Once the request is received, it must be parsed so that the relevant parameters can be extracted. The basic strategy I’ll use is to first search for key phrases in the text like “Mass” or “Radius” which indicate that a parameter I want is about to come up. Once a key phrase is found, this algorithm will be used to get the numerical value out:</w:t>
-      </w:r>
-      <w:r>
+      </w:r>
+    </w:p>
+    <w:p>
+      <w:pPr>
+        <w:pBdr/>
+        <w:spacing/>
+        <w:ind/>
         <w:rPr>
           <w:color w:val="000000" w:themeColor="text1"/>
           <w:sz w:val="22"/>
           <w:szCs w:val="22"/>
           <w:highlight w:val="none"/>
         </w:rPr>
-      </w:r>
-    </w:p>
-    <w:p>
-      <w:pPr>
-        <w:pBdr/>
-        <w:spacing/>
-        <w:ind/>
+      </w:pPr>
+      <w:r>
         <w:rPr>
           <w:color w:val="000000" w:themeColor="text1"/>
           <w:sz w:val="22"/>
           <w:szCs w:val="22"/>
           <w:highlight w:val="none"/>
         </w:rPr>
-      </w:pPr>
+        <w:t xml:space="preserve">Once the request is received, it must be parsed so that the relevant parameters can be e</w:t>
+      </w:r>
+      <w:r>
+        <w:rPr>
+          <w:color w:val="000000" w:themeColor="text1"/>
+          <w:sz w:val="22"/>
+          <w:szCs w:val="22"/>
+          <w:highlight w:val="none"/>
+        </w:rPr>
+        <w:t xml:space="preserve">xtracted. The basic strategy I’ll use is to first search for key phrases in the text like “Mass” or “Radius” which indicate that a parameter I want is about to come up. Once a key phrase is found, this algorithm will be used to get the numerical value out:</w:t>
+      </w:r>
+      <w:r>
+        <w:rPr>
+          <w:color w:val="000000" w:themeColor="text1"/>
+          <w:sz w:val="22"/>
+          <w:szCs w:val="22"/>
+          <w:highlight w:val="none"/>
+        </w:rPr>
+      </w:r>
+      <w:r>
+        <w:rPr>
+          <w:color w:val="000000" w:themeColor="text1"/>
+          <w:sz w:val="22"/>
+          <w:szCs w:val="22"/>
+          <w:highlight w:val="none"/>
+        </w:rPr>
+      </w:r>
+    </w:p>
+    <w:p>
+      <w:pPr>
+        <w:pBdr/>
+        <w:spacing/>
+        <w:ind/>
+        <w:rPr>
+          <w:color w:val="000000" w:themeColor="text1"/>
+          <w:sz w:val="22"/>
+          <w:szCs w:val="22"/>
+          <w:highlight w:val="none"/>
+        </w:rPr>
+      </w:pPr>
+      <w:r>
+        <w:rPr>
+          <w:color w:val="000000" w:themeColor="text1"/>
+          <w:sz w:val="22"/>
+          <w:szCs w:val="22"/>
+          <w:highlight w:val="none"/>
+        </w:rPr>
+      </w:r>
       <w:r>
         <w:rPr>
           <w:color w:val="000000" w:themeColor="text1"/>
@@ -3781,6 +3830,13 @@
           <w:szCs w:val="22"/>
         </w:rPr>
       </w:r>
+      <w:r>
+        <w:rPr>
+          <w:color w:val="000000" w:themeColor="text1"/>
+          <w:sz w:val="22"/>
+          <w:szCs w:val="22"/>
+        </w:rPr>
+      </w:r>
     </w:p>
     <w:p>
       <w:pPr>
@@ -3806,6 +3862,12 @@
           <w:highlight w:val="none"/>
         </w:rPr>
       </w:r>
+      <w:r>
+        <w:rPr>
+          <w:color w:val="4472c4" w:themeColor="accent5"/>
+          <w:highlight w:val="none"/>
+        </w:rPr>
+      </w:r>
     </w:p>
     <w:p>
       <w:pPr>
@@ -3833,7 +3895,8 @@
       </w:r>
       <w:r>
         <w:rPr>
-          <w:color w:val="5b9bd5"/>
+          <w:color w:val="4472c4" w:themeColor="accent5"/>
+          <w:highlight w:val="none"/>
         </w:rPr>
       </w:r>
     </w:p>
@@ -6530,18 +6593,514 @@
     </w:p>
     <w:p>
       <w:pPr>
-        <w:pBdr/>
-        <w:spacing/>
-        <w:ind/>
-        <w:rPr>
-          <w:highlight w:val="none"/>
-        </w:rPr>
-      </w:pPr>
-      <w:r>
-        <w:rPr>
-          <w:highlight w:val="none"/>
-        </w:rPr>
-      </w:r>
+        <w:pStyle w:val="723"/>
+        <w:pBdr/>
+        <w:spacing/>
+        <w:ind/>
+        <w:jc w:val="both"/>
+        <w:rPr>
+          <w:color w:val="4472c4" w:themeColor="accent5"/>
+          <w:highlight w:val="none"/>
+        </w:rPr>
+      </w:pPr>
+      <w:r>
+        <w:rPr>
+          <w:color w:val="4472c4" w:themeColor="accent5"/>
+          <w:highlight w:val="none"/>
+        </w:rPr>
+        <w:t xml:space="preserve">Displaying the system</w:t>
+      </w:r>
+      <w:r>
+        <w:rPr>
+          <w:highlight w:val="none"/>
+        </w:rPr>
+      </w:r>
+      <w:r>
+        <w:rPr>
+          <w:color w:val="4472c4" w:themeColor="accent5"/>
+          <w:highlight w:val="none"/>
+        </w:rPr>
+      </w:r>
+    </w:p>
+    <w:p>
+      <w:pPr>
+        <w:pBdr/>
+        <w:spacing/>
+        <w:ind/>
+        <w:rPr>
+          <w:highlight w:val="none"/>
+        </w:rPr>
+      </w:pPr>
+      <w:r>
+        <w:rPr>
+          <w:highlight w:val="none"/>
+        </w:rPr>
+        <w:t xml:space="preserve">I will use a simplistic design philosophy for this project. I want to get the relevant information across: Relative sizes of planets, orbital paths, positions of planets. But I want to do this without impacting performance or making the display hard to understand. To do this, I will use solid coloured circles for the planets, as this makes it clear where they are, and thin lines to show their trajectories. This is a mockup of what the system would look like with a few planets:</w:t>
+      </w:r>
+      <w:r>
+        <w:rPr>
+          <w:highlight w:val="none"/>
+        </w:rPr>
+      </w:r>
+      <w:r>
+        <w:rPr>
+          <w:highlight w:val="none"/>
+        </w:rPr>
+      </w:r>
+    </w:p>
+    <w:p>
+      <w:pPr>
+        <w:pBdr/>
+        <w:spacing/>
+        <w:ind/>
+        <w:rPr>
+          <w:highlight w:val="none"/>
+        </w:rPr>
+      </w:pPr>
+      <w:r>
+        <w:rPr>
+          <w:highlight w:val="none"/>
+        </w:rPr>
+      </w:r>
+      <w:r>
+        <mc:AlternateContent>
+          <mc:Choice Requires="wpg">
+            <w:drawing>
+              <wp:inline xmlns:wp="http://schemas.openxmlformats.org/drawingml/2006/wordprocessingDrawing" distT="0" distB="0" distL="0" distR="0">
+                <wp:extent cx="5940425" cy="4229324"/>
+                <wp:effectExtent l="0" t="0" r="0" b="0"/>
+                <wp:docPr id="7" name=""/>
+                <wp:cNvGraphicFramePr>
+                  <a:graphicFrameLocks xmlns:a="http://schemas.openxmlformats.org/drawingml/2006/main" noChangeAspect="1"/>
+                </wp:cNvGraphicFramePr>
+                <a:graphic xmlns:a="http://schemas.openxmlformats.org/drawingml/2006/main">
+                  <a:graphicData uri="http://schemas.openxmlformats.org/drawingml/2006/picture">
+                    <pic:pic xmlns:pic="http://schemas.openxmlformats.org/drawingml/2006/picture">
+                      <pic:nvPicPr>
+                        <pic:cNvPr id="691985598" name=""/>
+                        <pic:cNvPicPr>
+                          <a:picLocks noChangeAspect="1"/>
+                        </pic:cNvPicPr>
+                        <pic:nvPr/>
+                      </pic:nvPicPr>
+                      <pic:blipFill>
+                        <a:blip r:embed="rId22"/>
+                        <a:stretch/>
+                      </pic:blipFill>
+                      <pic:spPr bwMode="auto">
+                        <a:xfrm>
+                          <a:off x="0" y="0"/>
+                          <a:ext cx="5940424" cy="4229324"/>
+                        </a:xfrm>
+                        <a:prstGeom prst="rect">
+                          <a:avLst/>
+                        </a:prstGeom>
+                      </pic:spPr>
+                    </pic:pic>
+                  </a:graphicData>
+                </a:graphic>
+              </wp:inline>
+            </w:drawing>
+          </mc:Choice>
+          <mc:Fallback>
+            <w:pict>
+              <v:shapetype id="_x0000_t75" coordsize="21600,21600" o:spt="75" o:preferrelative="t" path="m@4@5l@4@11@9@11@9@5xe" filled="f" stroked="f">
+                <v:stroke joinstyle="miter"/>
+                <v:formulas>
+                  <v:f eqn="if lineDrawn pixelLineWidth 0"/>
+                  <v:f eqn="sum @0 1 0"/>
+                  <v:f eqn="sum 0 0 @1"/>
+                  <v:f eqn="prod @2 1 2"/>
+                  <v:f eqn="prod @3 21600 pixelWidth"/>
+                  <v:f eqn="prod @3 21600 pixelHeight"/>
+                  <v:f eqn="sum @0 0 1"/>
+                  <v:f eqn="prod @6 1 2"/>
+                  <v:f eqn="prod @7 21600 pixelWidth"/>
+                  <v:f eqn="sum @8 21600 0"/>
+                  <v:f eqn="prod @7 21600 pixelHeight"/>
+                  <v:f eqn="sum @10 21600 0"/>
+                </v:formulas>
+                <v:path o:extrusionok="f" gradientshapeok="t" o:connecttype="rect"/>
+                <o:lock v:ext="edit" aspectratio="t"/>
+              </v:shapetype>
+              <v:shape id="_x0000_i6" o:spid="_x0000_s6" type="#_x0000_t75" style="width:467.75pt;height:333.02pt;mso-wrap-distance-left:0.00pt;mso-wrap-distance-top:0.00pt;mso-wrap-distance-right:0.00pt;mso-wrap-distance-bottom:0.00pt;z-index:1;" stroked="false">
+                <v:imagedata r:id="rId22" o:title=""/>
+                <o:lock v:ext="edit" rotation="t"/>
+              </v:shape>
+            </w:pict>
+          </mc:Fallback>
+        </mc:AlternateContent>
+      </w:r>
+      <w:r>
+        <w:rPr>
+          <w:highlight w:val="none"/>
+        </w:rPr>
+      </w:r>
+      <w:r>
+        <w:rPr>
+          <w:highlight w:val="none"/>
+        </w:rPr>
+      </w:r>
+    </w:p>
+    <w:p>
+      <w:pPr>
+        <w:pBdr/>
+        <w:spacing/>
+        <w:ind/>
+        <w:rPr>
+          <w:highlight w:val="none"/>
+        </w:rPr>
+      </w:pPr>
+      <w:r>
+        <w:rPr>
+          <w:highlight w:val="none"/>
+        </w:rPr>
+        <w:t xml:space="preserve">The two smaller circles on the left with lines coming off them are planets, orbiting the central mass in the middle, which represents a star. The star does not have any lines coming off it as stars do not tend to move much relative to the centre of mass of their solar system, because they are so big. Sometimes our sun will move slightly though, and this would be represented with a line showing its path.</w:t>
+      </w:r>
+      <w:r>
+        <w:rPr>
+          <w:highlight w:val="none"/>
+        </w:rPr>
+      </w:r>
+      <w:r>
+        <w:rPr>
+          <w:highlight w:val="none"/>
+        </w:rPr>
+      </w:r>
+    </w:p>
+    <w:p>
+      <w:pPr>
+        <w:pBdr/>
+        <w:spacing/>
+        <w:ind/>
+        <w:rPr>
+          <w:highlight w:val="none"/>
+        </w:rPr>
+      </w:pPr>
+      <w:r>
+        <w:rPr>
+          <w:highlight w:val="none"/>
+        </w:rPr>
+        <w:t xml:space="preserve">This approach makes all the information I want to convey clear, and is quite simple to understand, but is also very easy to render so will not impact performance.</w:t>
+      </w:r>
+      <w:r>
+        <w:rPr>
+          <w:highlight w:val="none"/>
+        </w:rPr>
+      </w:r>
+    </w:p>
+    <w:p>
+      <w:pPr>
+        <w:pBdr/>
+        <w:spacing/>
+        <w:ind/>
+        <w:rPr>
+          <w:highlight w:val="none"/>
+        </w:rPr>
+      </w:pPr>
+      <w:r>
+        <w:rPr>
+          <w:highlight w:val="none"/>
+        </w:rPr>
+        <w:t xml:space="preserve">I want all the distances to be to scale in my program, but this is quite difficult as the distances involved in the solar system are absolutely huge. To achieve this I will use a scaling factor, so everything in the system will be scaled by the same amount. This keeps all the relative sizes accurate, e.g. the moon will still be roughly 1/4 the size of Earth, but it won’t take a 2000 kilometre wide screen to display it. To do this in code I will take the radius of a planet, multiply it by the scaling factor, and then draw a circle with that radius. If the scaling factor is chosen correctly then all the planets will be visible and it should look like an accurate model of our solar system.</w:t>
+      </w:r>
+      <w:r>
+        <w:rPr>
+          <w:highlight w:val="none"/>
+        </w:rPr>
+      </w:r>
+    </w:p>
+    <w:p>
+      <w:pPr>
+        <w:pBdr/>
+        <w:spacing/>
+        <w:ind/>
+        <w:rPr>
+          <w:highlight w:val="none"/>
+        </w:rPr>
+      </w:pPr>
+      <w:r>
+        <w:rPr>
+          <w:highlight w:val="none"/>
+        </w:rPr>
+      </w:r>
+      <w:r>
+        <w:rPr>
+          <w:highlight w:val="none"/>
+        </w:rPr>
+      </w:r>
+    </w:p>
+    <w:p>
+      <w:pPr>
+        <w:pBdr/>
+        <w:spacing/>
+        <w:ind/>
+        <w:rPr>
+          <w:highlight w:val="none"/>
+        </w:rPr>
+      </w:pPr>
+      <w:r>
+        <w:rPr>
+          <w:highlight w:val="none"/>
+        </w:rPr>
+        <w:t xml:space="preserve">This also makes size comparisons, which were requested by the client, quite easy to do. You simply draw the circles for the two desired planets side by side, rather than at their normal position. Because of the scaling factor the two planets will have the correct relative sizes, so the size comparison will be accurate.</w:t>
+      </w:r>
+      <w:r>
+        <w:rPr>
+          <w:highlight w:val="none"/>
+        </w:rPr>
+      </w:r>
+    </w:p>
+    <w:p>
+      <w:pPr>
+        <w:pBdr/>
+        <w:spacing/>
+        <w:ind/>
+        <w:rPr>
+          <w:highlight w:val="none"/>
+        </w:rPr>
+      </w:pPr>
+      <w:r>
+        <w:rPr>
+          <w:highlight w:val="none"/>
+        </w:rPr>
+        <w:t xml:space="preserve">Like mentioned when looking at NASA’s Eyes, I want the user to have the ability to move the camera. I will not give complete freedom to move the camera, as the solar system is very big and this could easily lead to them getting lost in a lot of empty space between two planets, and just seeing a blank screen. Instead, I think the camera should centre on a planet or other object and the user should be able to choose which object it focuses on. As well as being able to centre on the planets like in NASA’s Eyes, I want to also let the user centre the camera on the centre of mass of the system. While this isn’t particularly useful for our solar system usually, as the centre of mass is always inside or very close to the surface of the sun, this will be helpful when users start changing the mass of planets, as the solar system will quickly spin out of control and focusing on the centre of mass will make everything easier to see.</w:t>
+      </w:r>
+      <w:r>
+        <w:rPr>
+          <w:highlight w:val="none"/>
+        </w:rPr>
+      </w:r>
+    </w:p>
+    <w:p>
+      <w:pPr>
+        <w:pBdr/>
+        <w:spacing/>
+        <w:ind/>
+        <w:rPr>
+          <w:highlight w:val="none"/>
+        </w:rPr>
+      </w:pPr>
+      <w:r>
+        <w:rPr>
+          <w:highlight w:val="none"/>
+        </w:rPr>
+        <w:t xml:space="preserve">Focusing on planets will be done by pressing the left and right arrow keys, this will cycle through objects, which will be ordered based on their proximity to the sun, so pressing the right arrow key makes you move further away from the sun and the left arrow key makes you move closer (until you reach the furthest out object then it will bring you back to the sun and the loop starts again.)</w:t>
+      </w:r>
+      <w:r>
+        <w:rPr>
+          <w:highlight w:val="none"/>
+        </w:rPr>
+      </w:r>
+    </w:p>
+    <w:p>
+      <w:pPr>
+        <w:pBdr/>
+        <w:spacing/>
+        <w:ind/>
+        <w:rPr>
+          <w:highlight w:val="none"/>
+        </w:rPr>
+      </w:pPr>
+      <w:r>
+        <w:rPr>
+          <w:highlight w:val="none"/>
+        </w:rPr>
+        <w:t xml:space="preserve">The way the focusing will be done in code is by calculating the vector between the selected object and the centre of the coordinate system. This is our “adjustment”, which can then be added to the positions of all the planets during the display process, so that they’re all in the correct position relative to the selected planet. The full process is quite mathematical so will be explained in detail during the design.</w:t>
+      </w:r>
+      <w:r>
+        <w:rPr>
+          <w:highlight w:val="none"/>
+        </w:rPr>
+      </w:r>
+    </w:p>
+    <w:p>
+      <w:pPr>
+        <w:pBdr/>
+        <w:spacing/>
+        <w:ind/>
+        <w:rPr>
+          <w:highlight w:val="none"/>
+        </w:rPr>
+      </w:pPr>
+      <w:r>
+        <w:rPr>
+          <w:highlight w:val="none"/>
+        </w:rPr>
+      </w:r>
+      <w:r>
+        <w:rPr>
+          <w:highlight w:val="none"/>
+        </w:rPr>
+      </w:r>
+    </w:p>
+    <w:p>
+      <w:pPr>
+        <w:pStyle w:val="723"/>
+        <w:pBdr/>
+        <w:spacing/>
+        <w:ind/>
+        <w:jc w:val="both"/>
+        <w:rPr>
+          <w:color w:val="4472c4" w:themeColor="accent5"/>
+          <w:highlight w:val="none"/>
+        </w:rPr>
+      </w:pPr>
+      <w:r>
+        <w:rPr>
+          <w:color w:val="4472c4" w:themeColor="accent5"/>
+          <w:highlight w:val="none"/>
+        </w:rPr>
+        <w:t xml:space="preserve">Interface</w:t>
+      </w:r>
+      <w:r>
+        <w:rPr>
+          <w:highlight w:val="none"/>
+        </w:rPr>
+      </w:r>
+      <w:r>
+        <w:rPr>
+          <w:color w:val="4472c4" w:themeColor="accent5"/>
+          <w:highlight w:val="none"/>
+        </w:rPr>
+      </w:r>
+    </w:p>
+    <w:p>
+      <w:pPr>
+        <w:pBdr/>
+        <w:spacing/>
+        <w:ind/>
+        <w:rPr>
+          <w:highlight w:val="none"/>
+        </w:rPr>
+      </w:pPr>
+      <w:r>
+        <w:t xml:space="preserve">I will use a simple text and keyboard based menu to allow the user to interact with the program. This will be used to display the energies and momentum as needed to teach conservation of energy / momentum, as well as to let the user edit the mass of planets. I will display text at the top of the screen showing the relevant statistics like the total energy in the system, the mass of the planet, etc. An “edit mode” will be included that lets the user edit the masses of planets and the value of G by pressing keybinds. The mode should explain all the necessary keybinds so that users do not need to memorise them. Here is a mockup of what the interface will look like outside of edit mode:</w:t>
+      </w:r>
+      <w:r>
+        <w:rPr>
+          <w:highlight w:val="none"/>
+        </w:rPr>
+      </w:r>
+      <w:r>
+        <w:rPr>
+          <w:highlight w:val="none"/>
+        </w:rPr>
+      </w:r>
+    </w:p>
+    <w:p>
+      <w:pPr>
+        <w:pBdr/>
+        <w:spacing/>
+        <w:ind/>
+        <w:rPr>
+          <w:highlight w:val="none"/>
+        </w:rPr>
+      </w:pPr>
+      <w:r>
+        <w:rPr>
+          <w:highlight w:val="none"/>
+        </w:rPr>
+      </w:r>
+      <w:r>
+        <mc:AlternateContent>
+          <mc:Choice Requires="wpg">
+            <w:drawing>
+              <wp:inline xmlns:wp="http://schemas.openxmlformats.org/drawingml/2006/wordprocessingDrawing" distT="0" distB="0" distL="0" distR="0">
+                <wp:extent cx="5940425" cy="1174037"/>
+                <wp:effectExtent l="0" t="0" r="0" b="0"/>
+                <wp:docPr id="8" name=""/>
+                <wp:cNvGraphicFramePr>
+                  <a:graphicFrameLocks xmlns:a="http://schemas.openxmlformats.org/drawingml/2006/main" noChangeAspect="1"/>
+                </wp:cNvGraphicFramePr>
+                <a:graphic xmlns:a="http://schemas.openxmlformats.org/drawingml/2006/main">
+                  <a:graphicData uri="http://schemas.openxmlformats.org/drawingml/2006/picture">
+                    <pic:pic xmlns:pic="http://schemas.openxmlformats.org/drawingml/2006/picture">
+                      <pic:nvPicPr>
+                        <pic:cNvPr id="1738160212" name=""/>
+                        <pic:cNvPicPr>
+                          <a:picLocks noChangeAspect="1"/>
+                        </pic:cNvPicPr>
+                        <pic:nvPr/>
+                      </pic:nvPicPr>
+                      <pic:blipFill>
+                        <a:blip r:embed="rId23"/>
+                        <a:stretch/>
+                      </pic:blipFill>
+                      <pic:spPr bwMode="auto">
+                        <a:xfrm>
+                          <a:off x="0" y="0"/>
+                          <a:ext cx="5940424" cy="1174036"/>
+                        </a:xfrm>
+                        <a:prstGeom prst="rect">
+                          <a:avLst/>
+                        </a:prstGeom>
+                      </pic:spPr>
+                    </pic:pic>
+                  </a:graphicData>
+                </a:graphic>
+              </wp:inline>
+            </w:drawing>
+          </mc:Choice>
+          <mc:Fallback>
+            <w:pict>
+              <v:shapetype id="_x0000_t75" coordsize="21600,21600" o:spt="75" o:preferrelative="t" path="m@4@5l@4@11@9@11@9@5xe" filled="f" stroked="f">
+                <v:stroke joinstyle="miter"/>
+                <v:formulas>
+                  <v:f eqn="if lineDrawn pixelLineWidth 0"/>
+                  <v:f eqn="sum @0 1 0"/>
+                  <v:f eqn="sum 0 0 @1"/>
+                  <v:f eqn="prod @2 1 2"/>
+                  <v:f eqn="prod @3 21600 pixelWidth"/>
+                  <v:f eqn="prod @3 21600 pixelHeight"/>
+                  <v:f eqn="sum @0 0 1"/>
+                  <v:f eqn="prod @6 1 2"/>
+                  <v:f eqn="prod @7 21600 pixelWidth"/>
+                  <v:f eqn="sum @8 21600 0"/>
+                  <v:f eqn="prod @7 21600 pixelHeight"/>
+                  <v:f eqn="sum @10 21600 0"/>
+                </v:formulas>
+                <v:path o:extrusionok="f" gradientshapeok="t" o:connecttype="rect"/>
+                <o:lock v:ext="edit" aspectratio="t"/>
+              </v:shapetype>
+              <v:shape id="_x0000_i7" o:spid="_x0000_s7" type="#_x0000_t75" style="width:467.75pt;height:92.44pt;mso-wrap-distance-left:0.00pt;mso-wrap-distance-top:0.00pt;mso-wrap-distance-right:0.00pt;mso-wrap-distance-bottom:0.00pt;z-index:1;" stroked="false">
+                <v:imagedata r:id="rId23" o:title=""/>
+                <o:lock v:ext="edit" rotation="t"/>
+              </v:shape>
+            </w:pict>
+          </mc:Fallback>
+        </mc:AlternateContent>
+      </w:r>
+      <w:r>
+        <w:rPr>
+          <w:highlight w:val="none"/>
+        </w:rPr>
+      </w:r>
+      <w:r>
+        <w:rPr>
+          <w:highlight w:val="none"/>
+        </w:rPr>
+      </w:r>
+    </w:p>
+    <w:p>
+      <w:pPr>
+        <w:pBdr/>
+        <w:spacing/>
+        <w:ind/>
+        <w:rPr/>
+      </w:pPr>
+      <w:r/>
+      <w:r/>
+    </w:p>
+    <w:p>
+      <w:pPr>
+        <w:pBdr/>
+        <w:spacing/>
+        <w:ind/>
+        <w:rPr>
+          <w:highlight w:val="none"/>
+        </w:rPr>
+      </w:pPr>
       <w:r>
         <w:rPr>
           <w:highlight w:val="none"/>
@@ -6640,13 +7199,34 @@
         <w:rPr>
           <w:highlight w:val="none"/>
         </w:rPr>
-        <w:t xml:space="preserve">Display a scale model of the actual solar system using real, up to date data from NASA</w:t>
-      </w:r>
-      <w:r>
-        <w:rPr>
-          <w:highlight w:val="none"/>
-        </w:rPr>
-      </w:r>
+        <w:t xml:space="preserve">Energy and momentum should be conserved (this should naturally arise from using Newton’s laws if they’re implemented correctly)</w:t>
+      </w:r>
+      <w:r/>
+    </w:p>
+    <w:p>
+      <w:pPr>
+        <w:pStyle w:val="899"/>
+        <w:numPr>
+          <w:ilvl w:val="0"/>
+          <w:numId w:val="7"/>
+        </w:numPr>
+        <w:pBdr/>
+        <w:spacing/>
+        <w:ind/>
+        <w:rPr/>
+      </w:pPr>
+      <w:r>
+        <w:rPr>
+          <w:highlight w:val="none"/>
+        </w:rPr>
+      </w:r>
+      <w:r>
+        <w:rPr>
+          <w:highlight w:val="none"/>
+        </w:rPr>
+        <w:t xml:space="preserve">Provide useful tools to aide teaching of concepts requested by client</w:t>
+      </w:r>
+      <w:r/>
     </w:p>
     <w:p>
       <w:pPr>
@@ -6664,7 +7244,62 @@
         <w:rPr>
           <w:highlight w:val="none"/>
         </w:rPr>
-        <w:t xml:space="preserve">Energy and momentum should be conserved (this should naturally arise from using Newton’s laws if they’re implemented correctly)</w:t>
+        <w:t xml:space="preserve">Explain how Newtonian physics connects to the solar system</w:t>
+      </w:r>
+      <w:r>
+        <w:rPr>
+          <w:color w:val="000000" w:themeColor="text1"/>
+        </w:rPr>
+      </w:r>
+      <w:r/>
+    </w:p>
+    <w:p>
+      <w:pPr>
+        <w:pStyle w:val="899"/>
+        <w:numPr>
+          <w:ilvl w:val="2"/>
+          <w:numId w:val="7"/>
+        </w:numPr>
+        <w:pBdr/>
+        <w:spacing/>
+        <w:ind/>
+        <w:rPr/>
+      </w:pPr>
+      <w:r>
+        <w:rPr>
+          <w:highlight w:val="none"/>
+        </w:rPr>
+        <w:t xml:space="preserve">Include force diagrams to aid with this</w:t>
+      </w:r>
+      <w:r>
+        <w:rPr>
+          <w:highlight w:val="none"/>
+        </w:rPr>
+      </w:r>
+      <w:r/>
+    </w:p>
+    <w:p>
+      <w:pPr>
+        <w:pStyle w:val="899"/>
+        <w:numPr>
+          <w:ilvl w:val="2"/>
+          <w:numId w:val="7"/>
+        </w:numPr>
+        <w:pBdr/>
+        <w:spacing/>
+        <w:ind/>
+        <w:rPr/>
+      </w:pPr>
+      <w:r>
+        <w:rPr>
+          <w:highlight w:val="none"/>
+        </w:rPr>
+        <w:t xml:space="preserve">Have a total energy counter + momentum counter to show that they never change</w:t>
+      </w:r>
+      <w:r>
+        <w:rPr>
+          <w:highlight w:val="none"/>
+        </w:rPr>
       </w:r>
       <w:r/>
     </w:p>
@@ -6684,12 +7319,73 @@
         <w:rPr>
           <w:highlight w:val="none"/>
         </w:rPr>
-      </w:r>
-      <w:r>
-        <w:rPr>
-          <w:highlight w:val="none"/>
-        </w:rPr>
-        <w:t xml:space="preserve">Provide useful tools to aide teaching of concepts requested by client</w:t>
+        <w:t xml:space="preserve">Display the mass, radius and distance from the sun when planets are selected</w:t>
+      </w:r>
+      <w:r>
+        <w:rPr>
+          <w:highlight w:val="none"/>
+        </w:rPr>
+      </w:r>
+      <w:r/>
+      <w:r>
+        <w:rPr>
+          <w:highlight w:val="none"/>
+        </w:rPr>
+      </w:r>
+      <w:r>
+        <w:rPr>
+          <w:highlight w:val="none"/>
+        </w:rPr>
+      </w:r>
+      <w:r/>
+    </w:p>
+    <w:p>
+      <w:pPr>
+        <w:pStyle w:val="899"/>
+        <w:numPr>
+          <w:ilvl w:val="0"/>
+          <w:numId w:val="7"/>
+        </w:numPr>
+        <w:pBdr/>
+        <w:spacing/>
+        <w:ind/>
+        <w:rPr/>
+      </w:pPr>
+      <w:r>
+        <w:rPr>
+          <w:highlight w:val="none"/>
+        </w:rPr>
+        <w:t xml:space="preserve">Include the ability to compare sizes of two planets</w:t>
+      </w:r>
+      <w:r>
+        <w:rPr>
+          <w:highlight w:val="none"/>
+        </w:rPr>
+      </w:r>
+      <w:r/>
+    </w:p>
+    <w:p>
+      <w:pPr>
+        <w:pStyle w:val="899"/>
+        <w:numPr>
+          <w:ilvl w:val="0"/>
+          <w:numId w:val="7"/>
+        </w:numPr>
+        <w:pBdr/>
+        <w:spacing/>
+        <w:ind/>
+        <w:rPr/>
+      </w:pPr>
+      <w:r>
+        <w:rPr>
+          <w:highlight w:val="none"/>
+        </w:rPr>
+        <w:t xml:space="preserve">The mass of planets and the value of G should be editable</w:t>
+      </w:r>
+      <w:r>
+        <w:rPr>
+          <w:highlight w:val="none"/>
+        </w:rPr>
       </w:r>
       <w:r/>
     </w:p>
@@ -6709,11 +7405,11 @@
         <w:rPr>
           <w:highlight w:val="none"/>
         </w:rPr>
-        <w:t xml:space="preserve">Explain how Newtonian physics connects to the solar system</w:t>
-      </w:r>
-      <w:r>
-        <w:rPr>
-          <w:color w:val="000000" w:themeColor="text1"/>
+        <w:t xml:space="preserve">This should be done through a menu which shows the mass of the planet / the value of G as you change it</w:t>
+      </w:r>
+      <w:r>
+        <w:rPr>
+          <w:highlight w:val="none"/>
         </w:rPr>
       </w:r>
       <w:r/>
@@ -6722,7 +7418,7 @@
       <w:pPr>
         <w:pStyle w:val="899"/>
         <w:numPr>
-          <w:ilvl w:val="2"/>
+          <w:ilvl w:val="1"/>
           <w:numId w:val="7"/>
         </w:numPr>
         <w:pBdr/>
@@ -6734,32 +7430,17 @@
         <w:rPr>
           <w:highlight w:val="none"/>
         </w:rPr>
-        <w:t xml:space="preserve">Include force diagrams to aid with this</w:t>
-      </w:r>
-      <w:r>
-        <w:rPr>
-          <w:highlight w:val="none"/>
-        </w:rPr>
-      </w:r>
-      <w:r/>
-    </w:p>
-    <w:p>
-      <w:pPr>
-        <w:pStyle w:val="899"/>
-        <w:numPr>
-          <w:ilvl w:val="2"/>
-          <w:numId w:val="7"/>
-        </w:numPr>
-        <w:pBdr/>
-        <w:spacing/>
-        <w:ind/>
-        <w:rPr/>
-      </w:pPr>
-      <w:r>
-        <w:rPr>
-          <w:highlight w:val="none"/>
-        </w:rPr>
-        <w:t xml:space="preserve">Have a total energy counter + momentum counter to show that they never change</w:t>
+        <w:t xml:space="preserve">This should not suffer any bugs from the user accidentally setting something to be 0 or negative. This can be done by making changing the value be logarithmic, so that it gets closer and closer to 0 but never reaches 0 or goes below it.</w:t>
+      </w:r>
+      <w:r>
+        <w:rPr>
+          <w:highlight w:val="none"/>
+        </w:rPr>
+      </w:r>
+      <w:r>
+        <w:rPr>
+          <w:highlight w:val="none"/>
+        </w:rPr>
       </w:r>
       <w:r>
         <w:rPr>
@@ -6784,7 +7465,32 @@
         <w:rPr>
           <w:highlight w:val="none"/>
         </w:rPr>
-        <w:t xml:space="preserve">Display the mass, radius and distance from the sun when planets are selected</w:t>
+        <w:t xml:space="preserve">Access NASA JPL’s Horizons system to automatically import up to date data on planets</w:t>
+      </w:r>
+      <w:r>
+        <w:rPr>
+          <w:highlight w:val="none"/>
+        </w:rPr>
+      </w:r>
+      <w:r/>
+    </w:p>
+    <w:p>
+      <w:pPr>
+        <w:pStyle w:val="899"/>
+        <w:numPr>
+          <w:ilvl w:val="1"/>
+          <w:numId w:val="7"/>
+        </w:numPr>
+        <w:pBdr/>
+        <w:spacing/>
+        <w:ind/>
+        <w:rPr/>
+      </w:pPr>
+      <w:r>
+        <w:rPr>
+          <w:highlight w:val="none"/>
+        </w:rPr>
+        <w:t xml:space="preserve">Use said data to load our real solar system into the program</w:t>
       </w:r>
       <w:r>
         <w:rPr>
@@ -6809,149 +7515,13 @@
         <w:rPr>
           <w:highlight w:val="none"/>
         </w:rPr>
-        <w:t xml:space="preserve">Include the ability to compare sizes of two planets</w:t>
-      </w:r>
-      <w:r>
-        <w:rPr>
-          <w:highlight w:val="none"/>
-        </w:rPr>
-      </w:r>
-      <w:r/>
-    </w:p>
-    <w:p>
-      <w:pPr>
-        <w:pStyle w:val="899"/>
-        <w:numPr>
-          <w:ilvl w:val="0"/>
-          <w:numId w:val="7"/>
-        </w:numPr>
-        <w:pBdr/>
-        <w:spacing/>
-        <w:ind/>
-        <w:rPr/>
-      </w:pPr>
-      <w:r>
-        <w:rPr>
-          <w:highlight w:val="none"/>
-        </w:rPr>
-        <w:t xml:space="preserve">The mass of planets should be editable</w:t>
-      </w:r>
-      <w:r>
-        <w:rPr>
-          <w:highlight w:val="none"/>
-        </w:rPr>
-      </w:r>
-      <w:r/>
-    </w:p>
-    <w:p>
-      <w:pPr>
-        <w:pStyle w:val="899"/>
-        <w:numPr>
-          <w:ilvl w:val="1"/>
-          <w:numId w:val="7"/>
-        </w:numPr>
-        <w:pBdr/>
-        <w:spacing/>
-        <w:ind/>
-        <w:rPr/>
-      </w:pPr>
-      <w:r>
-        <w:rPr>
-          <w:highlight w:val="none"/>
-        </w:rPr>
-        <w:t xml:space="preserve">This should be done through a menu which shows the mass of the planet as you change it</w:t>
-      </w:r>
-      <w:r>
-        <w:rPr>
-          <w:highlight w:val="none"/>
-        </w:rPr>
-      </w:r>
-    </w:p>
-    <w:p>
-      <w:pPr>
-        <w:pStyle w:val="899"/>
-        <w:numPr>
-          <w:ilvl w:val="0"/>
-          <w:numId w:val="7"/>
-        </w:numPr>
-        <w:pBdr/>
-        <w:spacing/>
-        <w:ind/>
-        <w:rPr/>
-      </w:pPr>
-      <w:r>
-        <w:rPr>
-          <w:highlight w:val="none"/>
-        </w:rPr>
-        <w:t xml:space="preserve">Access NASA JPL’s Horizons system to automatically import data on planets</w:t>
-      </w:r>
-      <w:r>
-        <w:rPr>
-          <w:highlight w:val="none"/>
-        </w:rPr>
-      </w:r>
-      <w:r/>
-    </w:p>
-    <w:p>
-      <w:pPr>
-        <w:pStyle w:val="899"/>
-        <w:numPr>
-          <w:ilvl w:val="1"/>
-          <w:numId w:val="7"/>
-        </w:numPr>
-        <w:pBdr/>
-        <w:spacing/>
-        <w:ind/>
-        <w:rPr/>
-      </w:pPr>
-      <w:r>
-        <w:rPr>
-          <w:highlight w:val="none"/>
-        </w:rPr>
-        <w:t xml:space="preserve">Use said data to load our real solar system into the program</w:t>
-      </w:r>
-      <w:r>
-        <w:rPr>
-          <w:highlight w:val="none"/>
-        </w:rPr>
-      </w:r>
-      <w:r/>
-    </w:p>
-    <w:p>
-      <w:pPr>
-        <w:pStyle w:val="899"/>
-        <w:numPr>
-          <w:ilvl w:val="0"/>
-          <w:numId w:val="7"/>
-        </w:numPr>
-        <w:pBdr/>
-        <w:spacing/>
-        <w:ind/>
-        <w:rPr/>
-      </w:pPr>
-      <w:r>
-        <w:rPr>
-          <w:highlight w:val="none"/>
-        </w:rPr>
-        <w:t xml:space="preserve">Be sufficiently optimised and not suffer frame drops</w:t>
-      </w:r>
-      <w:r>
-        <w:rPr>
-          <w:highlight w:val="none"/>
-        </w:rPr>
-      </w:r>
-      <w:r/>
-      <w:r>
-        <w:rPr>
-          <w:highlight w:val="none"/>
-        </w:rPr>
-      </w:r>
-      <w:r>
-        <w:rPr>
-          <w:highlight w:val="none"/>
-        </w:rPr>
-      </w:r>
-      <w:r/>
+        <w:t xml:space="preserve">Be sufficiently optimised and not suffer frame drops as this would impact the user experience</w:t>
+      </w:r>
+      <w:r>
+        <w:rPr>
+          <w:highlight w:val="none"/>
+        </w:rPr>
+      </w:r>
       <w:r/>
     </w:p>
     <w:sectPr>

</xml_diff>

<commit_message>
I think analysis is pretty much done by now, so that's nice. Just sort design ASAP.
</commit_message>
<xml_diff>
--- a/Analysis.docx
+++ b/Analysis.docx
@@ -461,26 +461,6 @@
           <w:highlight w:val="none"/>
         </w:rPr>
       </w:r>
-      <w:r>
-        <w:rPr>
-          <w:highlight w:val="none"/>
-        </w:rPr>
-      </w:r>
-      <w:r>
-        <w:rPr>
-          <w:highlight w:val="none"/>
-        </w:rPr>
-      </w:r>
-      <w:r>
-        <w:rPr>
-          <w:highlight w:val="none"/>
-        </w:rPr>
-      </w:r>
-      <w:r>
-        <w:rPr>
-          <w:highlight w:val="none"/>
-        </w:rPr>
-      </w:r>
     </w:p>
     <w:p>
       <w:pPr>
@@ -1055,26 +1035,17 @@
         </w:rPr>
         <w:t xml:space="preserve">ed to create something that shows the motion of planets, as well as having size </w:t>
         <w:tab/>
-        <w:t xml:space="preserve">comparisons, like in the link above. Should be possible to edit the masses of objects to </w:t>
+        <w:t xml:space="preserve">c</w:t>
+      </w:r>
+      <w:r>
+        <w:rPr>
+          <w:highlight w:val="none"/>
+        </w:rPr>
+        <w:t xml:space="preserve">omparisons, like in the link above. Should be possible to edit the masses of objects to </w:t>
         <w:tab/>
         <w:t xml:space="preserve">show the effect it has too like in the PHeT simulator. I think allowing the user to change </w:t>
         <w:tab/>
         <w:t xml:space="preserve">the value of G would be informative as well, to show what it actually does.</w:t>
-      </w:r>
-      <w:r>
-        <w:rPr>
-          <w:highlight w:val="none"/>
-        </w:rPr>
-      </w:r>
-      <w:r>
-        <w:rPr>
-          <w:highlight w:val="none"/>
-        </w:rPr>
-      </w:r>
-      <w:r>
-        <w:rPr>
-          <w:highlight w:val="none"/>
-        </w:rPr>
       </w:r>
       <w:r>
         <w:rPr>
@@ -2289,6 +2260,11 @@
           <w:highlight w:val="none"/>
         </w:rPr>
       </w:r>
+      <w:r>
+        <w:rPr>
+          <w:highlight w:val="none"/>
+        </w:rPr>
+      </w:r>
     </w:p>
     <w:p>
       <w:pPr>
@@ -3890,7 +3866,8 @@
       </w:r>
       <w:r>
         <w:rPr>
-          <w:color w:val="5b9bd5"/>
+          <w:color w:val="4472c4" w:themeColor="accent5"/>
+          <w:highlight w:val="none"/>
         </w:rPr>
       </w:r>
       <w:r>
@@ -5886,6 +5863,77 @@
         <w:pBdr/>
         <w:spacing/>
         <w:ind/>
+        <w:rPr>
+          <w:highlight w:val="none"/>
+        </w:rPr>
+      </w:pPr>
+      <w:r>
+        <w:rPr>
+          <w:highlight w:val="none"/>
+        </w:rPr>
+        <w:t xml:space="preserve">The </w:t>
+      </w:r>
+      <m:oMath>
+        <m:r>
+          <w:rPr>
+            <w:rFonts w:hint="default" w:ascii="Cambria Math" w:hAnsi="Cambria Math" w:eastAsia="Cambria Math" w:cs="Cambria Math"/>
+          </w:rPr>
+          <m:rPr/>
+          <m:t>Δt</m:t>
+        </m:r>
+      </m:oMath>
+      <w:r>
+        <w:rPr>
+          <w:highlight w:val="none"/>
+        </w:rPr>
+        <w:t xml:space="preserve"> term lets us change the speed of the simulation. The larger it is the faster the simulation is, it might cover a year of orbits in a single second for instance, but also the larger </w:t>
+      </w:r>
+      <m:oMath>
+        <m:r>
+          <w:rPr>
+            <w:rFonts w:hint="default" w:ascii="Cambria Math" w:hAnsi="Cambria Math" w:eastAsia="Cambria Math" w:cs="Cambria Math"/>
+          </w:rPr>
+          <m:rPr/>
+          <m:t>Δt</m:t>
+        </m:r>
+      </m:oMath>
+      <w:r>
+        <w:rPr>
+          <w:highlight w:val="none"/>
+        </w:rPr>
+        <w:t xml:space="preserve"> is the less accurate the simulation is. The user will be able to change </w:t>
+      </w:r>
+      <m:oMath>
+        <m:r>
+          <w:rPr>
+            <w:rFonts w:hint="default" w:ascii="Cambria Math" w:hAnsi="Cambria Math" w:eastAsia="Cambria Math" w:cs="Cambria Math"/>
+          </w:rPr>
+          <m:rPr/>
+          <m:t>Δt</m:t>
+        </m:r>
+      </m:oMath>
+      <w:r>
+        <w:rPr>
+          <w:highlight w:val="none"/>
+        </w:rPr>
+        <w:t xml:space="preserve"> with keybinds to suit their own needs.</w:t>
+      </w:r>
+      <w:r>
+        <w:rPr>
+          <w:highlight w:val="none"/>
+        </w:rPr>
+      </w:r>
+      <w:r>
+        <w:rPr>
+          <w:highlight w:val="none"/>
+        </w:rPr>
+      </w:r>
+    </w:p>
+    <w:p>
+      <w:pPr>
+        <w:pBdr/>
+        <w:spacing/>
+        <w:ind/>
         <w:rPr/>
       </w:pPr>
       <w:r/>
@@ -6612,6 +6660,7 @@
       </w:r>
       <w:r>
         <w:rPr>
+          <w:color w:val="4472c4" w:themeColor="accent5"/>
           <w:highlight w:val="none"/>
         </w:rPr>
       </w:r>
@@ -6635,7 +6684,13 @@
         <w:rPr>
           <w:highlight w:val="none"/>
         </w:rPr>
-        <w:t xml:space="preserve">I will use a simplistic design philosophy for this project. I want to get the relevant information across: Relative sizes of planets, orbital paths, positions of planets. But I want to do this without impacting performance or making the display hard to understand. To do this, I will use solid coloured circles for the planets, as this makes it clear where they are, and thin lines to show their trajectories. This is a mockup of what the system would look like with a few planets:</w:t>
+        <w:t xml:space="preserve">I will use a simplistic design philosophy for this project. I want to get the relevant information across: Relative sizes of planets, orbital paths, positions of planets. But I want to do this without impacting performance or</w:t>
+      </w:r>
+      <w:r>
+        <w:rPr>
+          <w:highlight w:val="none"/>
+        </w:rPr>
+        <w:t xml:space="preserve"> making the display hard to understand. To do this, I will use solid coloured circles for the planets, as this makes it clear where they are, and thin lines to show their trajectories. This is a mockup of what the system would look like with a few planets:</w:t>
       </w:r>
       <w:r>
         <w:rPr>
@@ -6755,7 +6810,13 @@
         <w:rPr>
           <w:highlight w:val="none"/>
         </w:rPr>
-        <w:t xml:space="preserve">The two smaller circles on the left with lines coming off them are planets, orbiting the central mass in the middle, which represents a star. The star does not have any lines coming off it as stars do not tend to move much relative to the centre of mass of their solar system, because they are so big. Sometimes our sun will move slightly though, and this would be represented with a line showing its path.</w:t>
+        <w:t xml:space="preserve">The two smaller circles on the left with lines coming off them are planets, orbiting the central mass in the middle, which represents a star. The star</w:t>
+      </w:r>
+      <w:r>
+        <w:rPr>
+          <w:highlight w:val="none"/>
+        </w:rPr>
+        <w:t xml:space="preserve"> does not have any lines coming off it as stars do not tend to move much relative to the centre of mass of their solar system, because they are so big. Sometimes our sun will move slightly though, and this would be represented with a line showing its path.</w:t>
       </w:r>
       <w:r>
         <w:rPr>
@@ -6788,6 +6849,11 @@
           <w:highlight w:val="none"/>
         </w:rPr>
       </w:r>
+      <w:r>
+        <w:rPr>
+          <w:highlight w:val="none"/>
+        </w:rPr>
+      </w:r>
     </w:p>
     <w:p>
       <w:pPr>
@@ -6802,7 +6868,24 @@
         <w:rPr>
           <w:highlight w:val="none"/>
         </w:rPr>
-        <w:t xml:space="preserve">I want all the distances to be to scale in my program, but this is quite difficult as the distances involved in the solar system are absolutely huge. To achieve this I will use a scaling factor, so everything in the system will be scaled by the same amount. This keeps all the relative sizes accurate, e.g. the moon will still be roughly 1/4 the size of Earth, but it won’t take a 2000 kilometre wide screen to display it. To do this in code I will take the radius of a planet, multiply it by the scaling factor, and then draw a circle with that radius. If the scaling factor is chosen correctly then all the planets will be visible and it should look like an accurate model of our solar system.</w:t>
+        <w:t xml:space="preserve">I want all the distances to be to scale in my program, but this is quite difficult as the distances involved in the solar system are absolutely huge. To achieve this I will use a scal</w:t>
+      </w:r>
+      <w:r>
+        <w:rPr>
+          <w:highlight w:val="none"/>
+        </w:rPr>
+        <w:t xml:space="preserve">ing factor, so everything in the system will be scaled by the same amount. This keeps all the relative sizes accurate, e.g. the moon will still be roughly 1/4 the size of Earth, but it won’t take a 2000 kilometre wide screen to display it. To do this in co</w:t>
+      </w:r>
+      <w:r>
+        <w:rPr>
+          <w:highlight w:val="none"/>
+        </w:rPr>
+        <w:t xml:space="preserve">de I will take the radius of a planet, multiply it by the scaling factor, and then draw a circle with that radius. If the scaling factor is chosen correctly then all the planets will be visible and it should look like an accurate model of our solar system.</w:t>
+      </w:r>
+      <w:r>
+        <w:rPr>
+          <w:highlight w:val="none"/>
+        </w:rPr>
       </w:r>
       <w:r>
         <w:rPr>
@@ -6829,6 +6912,11 @@
           <w:highlight w:val="none"/>
         </w:rPr>
       </w:r>
+      <w:r>
+        <w:rPr>
+          <w:highlight w:val="none"/>
+        </w:rPr>
+      </w:r>
     </w:p>
     <w:p>
       <w:pPr>
@@ -6843,7 +6931,18 @@
         <w:rPr>
           <w:highlight w:val="none"/>
         </w:rPr>
-        <w:t xml:space="preserve">This also makes size comparisons, which were requested by the client, quite easy to do. You simply draw the circles for the two desired planets side by side, rather than at their normal position. Because of the scaling factor the two planets will have the correct relative sizes, so the size comparison will be accurate.</w:t>
+        <w:t xml:space="preserve">This also makes size comparisons, which were requested by the cl</w:t>
+      </w:r>
+      <w:r>
+        <w:rPr>
+          <w:highlight w:val="none"/>
+        </w:rPr>
+        <w:t xml:space="preserve">ient, quite easy to do. You simply draw the circles for the two desired planets side by side, rather than at their normal position. Because of the scaling factor the two planets will have the correct relative sizes, so the size comparison will be accurate.</w:t>
+      </w:r>
+      <w:r>
+        <w:rPr>
+          <w:highlight w:val="none"/>
+        </w:rPr>
       </w:r>
       <w:r>
         <w:rPr>
@@ -6864,7 +6963,30 @@
         <w:rPr>
           <w:highlight w:val="none"/>
         </w:rPr>
-        <w:t xml:space="preserve">Like mentioned when looking at NASA’s Eyes, I want the user to have the ability to move the camera. I will not give complete freedom to move the camera, as the solar system is very big and this could easily lead to them getting lost in a lot of empty space between two planets, and just seeing a blank screen. Instead, I think the camera should centre on a planet or other object and the user should be able to choose which object it focuses on. As well as being able to centre on the planets like in NASA’s Eyes, I want to also let the user centre the camera on the centre of mass of the system. While this isn’t particularly useful for our solar system usually, as the centre of mass is always inside or very close to the surface of the sun, this will be helpful when users start changing the mass of planets, as the solar system will quickly spin out of control and focusing on the centre of mass will make everything easier to see.</w:t>
+        <w:t xml:space="preserve">Like mentioned when looking at NASA’s Eyes, I want the user to have the ability to move the camera. I will not give complete freedom to move the camera, as the solar s</w:t>
+      </w:r>
+      <w:r>
+        <w:rPr>
+          <w:highlight w:val="none"/>
+        </w:rPr>
+        <w:t xml:space="preserve">ystem is very big and this could easily lead to them getting lost in a lot of empty space between two planets, and just seeing a blank screen. Instead, I think the camera should centre on a planet or other object and the user should be able to choose which</w:t>
+      </w:r>
+      <w:r>
+        <w:rPr>
+          <w:highlight w:val="none"/>
+        </w:rPr>
+        <w:t xml:space="preserve"> object it focuses on. As well as being able to centre on the planets like in NASA’s Eyes, I want to also let the user centre the camera on the centre of mass of the system. While this isn’t particularly useful for our solar system usually, as the centre o</w:t>
+      </w:r>
+      <w:r>
+        <w:rPr>
+          <w:highlight w:val="none"/>
+        </w:rPr>
+        <w:t xml:space="preserve">f mass is always inside or very close to the surface of the sun, this will be helpful when users start changing the mass of planets, as the solar system will quickly spin out of control and focusing on the centre of mass will make everything easier to see.</w:t>
+      </w:r>
+      <w:r>
+        <w:rPr>
+          <w:highlight w:val="none"/>
+        </w:rPr>
       </w:r>
       <w:r>
         <w:rPr>
@@ -6885,7 +7007,18 @@
         <w:rPr>
           <w:highlight w:val="none"/>
         </w:rPr>
-        <w:t xml:space="preserve">Focusing on planets will be done by pressing the left and right arrow keys, this will cycle through objects, which will be ordered based on their proximity to the sun, so pressing the right arrow key makes you move further away from the sun and the left arrow key makes you move closer (until you reach the furthest out object then it will bring you back to the sun and the loop starts again.)</w:t>
+        <w:t xml:space="preserve">Focusing on planets will be done by pressing the left and right arrow keys, this will cycle through objects, which will be ordered based </w:t>
+      </w:r>
+      <w:r>
+        <w:rPr>
+          <w:highlight w:val="none"/>
+        </w:rPr>
+        <w:t xml:space="preserve">on their proximity to the sun, so pressing the right arrow key makes you move further away from the sun and the left arrow key makes you move closer (until you reach the furthest out object then it will bring you back to the sun and the loop starts again.)</w:t>
+      </w:r>
+      <w:r>
+        <w:rPr>
+          <w:highlight w:val="none"/>
+        </w:rPr>
       </w:r>
       <w:r>
         <w:rPr>
@@ -6906,7 +7039,18 @@
         <w:rPr>
           <w:highlight w:val="none"/>
         </w:rPr>
-        <w:t xml:space="preserve">The way the focusing will be done in code is by calculating the vector between the selected object and the centre of the coordinate system. This is our “adjustment”, which can then be added to the positions of all the planets during the display process, so that they’re all in the correct position relative to the selected planet. The full process is quite mathematical so will be explained in detail during the design.</w:t>
+        <w:t xml:space="preserve">The way the focusing will be done in code is by calculating the vector between the selected object and the centre of the coordinate system. This is our “adjustment</w:t>
+      </w:r>
+      <w:r>
+        <w:rPr>
+          <w:highlight w:val="none"/>
+        </w:rPr>
+        <w:t xml:space="preserve">”, which can then be added to the positions of all the planets during the display process, so that they’re all in the correct position relative to the selected planet. The full process is quite mathematical so will be explained in detail during the design.</w:t>
+      </w:r>
+      <w:r>
+        <w:rPr>
+          <w:highlight w:val="none"/>
+        </w:rPr>
       </w:r>
       <w:r>
         <w:rPr>
@@ -6933,6 +7077,11 @@
           <w:highlight w:val="none"/>
         </w:rPr>
       </w:r>
+      <w:r>
+        <w:rPr>
+          <w:highlight w:val="none"/>
+        </w:rPr>
+      </w:r>
     </w:p>
     <w:p>
       <w:pPr>
@@ -6955,6 +7104,7 @@
       </w:r>
       <w:r>
         <w:rPr>
+          <w:color w:val="4472c4" w:themeColor="accent5"/>
           <w:highlight w:val="none"/>
         </w:rPr>
       </w:r>
@@ -6975,7 +7125,154 @@
         </w:rPr>
       </w:pPr>
       <w:r>
-        <w:t xml:space="preserve">I will use a simple text and keyboard based menu to allow the user to interact with the program. This will be used to display the energies and momentum as needed to teach conservation of energy / momentum, as well as to let the user edit the mass of planets. I will display text at the top of the screen showing the relevant statistics like the total energy in the system, the mass of the planet, etc. An “edit mode” will be included that lets the user edit the masses of planets and the value of G by pressing keybinds. The mode should explain all the necessary keybinds so that users do not need to memorise them. Here is a mockup of what the interface will look like outside of edit mode:</w:t>
+        <w:t xml:space="preserve">I will use a simple text and keyboard based menu to allow the user to interact with the program. This will be used to display the energies and momentum as needed to teach conserva</w:t>
+      </w:r>
+      <w:r>
+        <w:t xml:space="preserve">tion of energy / moment</w:t>
+      </w:r>
+      <w:r>
+        <w:t xml:space="preserve">um, as well as to let the user edit the mass of planets. I will display text at the top of the screen showing the relevant statistics like the total energy in the system, the mass of the planet, etc. This can be done using pygame’s font.render() method. A </w:t>
+      </w:r>
+      <w:r>
+        <w:t xml:space="preserve">start screen will be displayed at the beginning of the program that explains all the keybinds, as well as obviously letting the user start the simulation (which will be done through pressing enter). Here is a mockup of what the start screen will look like:</w:t>
+      </w:r>
+      <w:r>
+        <w:rPr>
+          <w:highlight w:val="none"/>
+        </w:rPr>
+      </w:r>
+      <w:r>
+        <w:rPr>
+          <w:highlight w:val="none"/>
+        </w:rPr>
+      </w:r>
+    </w:p>
+    <w:p>
+      <w:pPr>
+        <w:pBdr/>
+        <w:spacing/>
+        <w:ind/>
+        <w:rPr/>
+      </w:pPr>
+      <w:r>
+        <w:rPr>
+          <w:highlight w:val="none"/>
+        </w:rPr>
+        <mc:AlternateContent>
+          <mc:Choice Requires="wpg">
+            <w:drawing>
+              <wp:inline xmlns:wp="http://schemas.openxmlformats.org/drawingml/2006/wordprocessingDrawing" distT="0" distB="0" distL="0" distR="0">
+                <wp:extent cx="5940425" cy="2098188"/>
+                <wp:effectExtent l="0" t="0" r="0" b="0"/>
+                <wp:docPr id="8" name=""/>
+                <wp:cNvGraphicFramePr>
+                  <a:graphicFrameLocks xmlns:a="http://schemas.openxmlformats.org/drawingml/2006/main" noChangeAspect="1"/>
+                </wp:cNvGraphicFramePr>
+                <a:graphic xmlns:a="http://schemas.openxmlformats.org/drawingml/2006/main">
+                  <a:graphicData uri="http://schemas.openxmlformats.org/drawingml/2006/picture">
+                    <pic:pic xmlns:pic="http://schemas.openxmlformats.org/drawingml/2006/picture">
+                      <pic:nvPicPr>
+                        <pic:cNvPr id="1865081795" name=""/>
+                        <pic:cNvPicPr>
+                          <a:picLocks noChangeAspect="1"/>
+                        </pic:cNvPicPr>
+                        <pic:nvPr/>
+                      </pic:nvPicPr>
+                      <pic:blipFill>
+                        <a:blip r:embed="rId23"/>
+                        <a:stretch/>
+                      </pic:blipFill>
+                      <pic:spPr bwMode="auto">
+                        <a:xfrm>
+                          <a:off x="0" y="0"/>
+                          <a:ext cx="5940424" cy="2098188"/>
+                        </a:xfrm>
+                        <a:prstGeom prst="rect">
+                          <a:avLst/>
+                        </a:prstGeom>
+                      </pic:spPr>
+                    </pic:pic>
+                  </a:graphicData>
+                </a:graphic>
+              </wp:inline>
+            </w:drawing>
+          </mc:Choice>
+          <mc:Fallback>
+            <w:pict>
+              <v:shapetype id="_x0000_t75" coordsize="21600,21600" o:spt="75" o:preferrelative="t" path="m@4@5l@4@11@9@11@9@5xe" filled="f" stroked="f">
+                <v:stroke joinstyle="miter"/>
+                <v:formulas>
+                  <v:f eqn="if lineDrawn pixelLineWidth 0"/>
+                  <v:f eqn="sum @0 1 0"/>
+                  <v:f eqn="sum 0 0 @1"/>
+                  <v:f eqn="prod @2 1 2"/>
+                  <v:f eqn="prod @3 21600 pixelWidth"/>
+                  <v:f eqn="prod @3 21600 pixelHeight"/>
+                  <v:f eqn="sum @0 0 1"/>
+                  <v:f eqn="prod @6 1 2"/>
+                  <v:f eqn="prod @7 21600 pixelWidth"/>
+                  <v:f eqn="sum @8 21600 0"/>
+                  <v:f eqn="prod @7 21600 pixelHeight"/>
+                  <v:f eqn="sum @10 21600 0"/>
+                </v:formulas>
+                <v:path o:extrusionok="f" gradientshapeok="t" o:connecttype="rect"/>
+                <o:lock v:ext="edit" aspectratio="t"/>
+              </v:shapetype>
+              <v:shape id="_x0000_i7" o:spid="_x0000_s7" type="#_x0000_t75" style="width:467.75pt;height:165.21pt;mso-wrap-distance-left:0.00pt;mso-wrap-distance-top:0.00pt;mso-wrap-distance-right:0.00pt;mso-wrap-distance-bottom:0.00pt;z-index:1;" stroked="false">
+                <v:imagedata r:id="rId23" o:title=""/>
+                <o:lock v:ext="edit" rotation="t"/>
+              </v:shape>
+            </w:pict>
+          </mc:Fallback>
+        </mc:AlternateContent>
+      </w:r>
+      <w:r>
+        <w:rPr>
+          <w:highlight w:val="none"/>
+        </w:rPr>
+      </w:r>
+      <w:r/>
+    </w:p>
+    <w:p>
+      <w:pPr>
+        <w:pBdr/>
+        <w:spacing/>
+        <w:ind/>
+        <w:rPr>
+          <w:highlight w:val="none"/>
+        </w:rPr>
+      </w:pPr>
+      <w:r>
+        <w:rPr>
+          <w:highlight w:val="none"/>
+        </w:rPr>
+        <w:t xml:space="preserve">The last line telling the user how to start the prorgam is coloured red, differently from the other lines, to get their attention because if they don’t see it they won’t know how to start the program.</w:t>
+      </w:r>
+      <w:r>
+        <w:rPr>
+          <w:highlight w:val="none"/>
+        </w:rPr>
+      </w:r>
+      <w:r>
+        <w:rPr>
+          <w:highlight w:val="none"/>
+        </w:rPr>
+      </w:r>
+    </w:p>
+    <w:p>
+      <w:pPr>
+        <w:pBdr/>
+        <w:spacing/>
+        <w:ind/>
+        <w:rPr>
+          <w:highlight w:val="none"/>
+        </w:rPr>
+      </w:pPr>
+      <w:r>
+        <w:t xml:space="preserve">An “edit mode” will be included t</w:t>
+      </w:r>
+      <w:r>
+        <w:t xml:space="preserve">hat lets the user edit the masses of planets and the value of G by pressing keybinds. The mode should explain all the necessary keybinds so that users do not need to memorise them. Here is a mockup of what the interface will look like outside of edit mode:</w:t>
       </w:r>
       <w:r>
         <w:rPr>
@@ -7009,7 +7306,7 @@
               <wp:inline xmlns:wp="http://schemas.openxmlformats.org/drawingml/2006/wordprocessingDrawing" distT="0" distB="0" distL="0" distR="0">
                 <wp:extent cx="5940425" cy="1174037"/>
                 <wp:effectExtent l="0" t="0" r="0" b="0"/>
-                <wp:docPr id="8" name=""/>
+                <wp:docPr id="9" name=""/>
                 <wp:cNvGraphicFramePr>
                   <a:graphicFrameLocks xmlns:a="http://schemas.openxmlformats.org/drawingml/2006/main" noChangeAspect="1"/>
                 </wp:cNvGraphicFramePr>
@@ -7024,7 +7321,7 @@
                         <pic:nvPr/>
                       </pic:nvPicPr>
                       <pic:blipFill>
-                        <a:blip r:embed="rId23"/>
+                        <a:blip r:embed="rId24"/>
                         <a:stretch/>
                       </pic:blipFill>
                       <pic:spPr bwMode="auto">
@@ -7063,8 +7360,8 @@
                 <v:path o:extrusionok="f" gradientshapeok="t" o:connecttype="rect"/>
                 <o:lock v:ext="edit" aspectratio="t"/>
               </v:shapetype>
-              <v:shape id="_x0000_i7" o:spid="_x0000_s7" type="#_x0000_t75" style="width:467.75pt;height:92.44pt;mso-wrap-distance-left:0.00pt;mso-wrap-distance-top:0.00pt;mso-wrap-distance-right:0.00pt;mso-wrap-distance-bottom:0.00pt;z-index:1;" stroked="false">
-                <v:imagedata r:id="rId23" o:title=""/>
+              <v:shape id="_x0000_i8" o:spid="_x0000_s8" type="#_x0000_t75" style="width:467.75pt;height:92.44pt;mso-wrap-distance-left:0.00pt;mso-wrap-distance-top:0.00pt;mso-wrap-distance-right:0.00pt;mso-wrap-distance-bottom:0.00pt;z-index:1;" stroked="false">
+                <v:imagedata r:id="rId24" o:title=""/>
                 <o:lock v:ext="edit" rotation="t"/>
               </v:shape>
             </w:pict>
@@ -7087,9 +7384,129 @@
         <w:pBdr/>
         <w:spacing/>
         <w:ind/>
+        <w:rPr>
+          <w:highlight w:val="none"/>
+        </w:rPr>
+      </w:pPr>
+      <w:r>
+        <w:t xml:space="preserve">All of the information relevant to the physics the kids are learning is shown; the energies, the momentum, and stats about the planet.</w:t>
+      </w:r>
+      <w:r>
+        <w:rPr>
+          <w:highlight w:val="none"/>
+        </w:rPr>
+      </w:r>
+    </w:p>
+    <w:p>
+      <w:pPr>
+        <w:pBdr/>
+        <w:spacing/>
+        <w:ind/>
+        <w:rPr>
+          <w:highlight w:val="none"/>
+        </w:rPr>
+      </w:pPr>
+      <w:r>
+        <w:rPr>
+          <w:highlight w:val="none"/>
+        </w:rPr>
+        <w:t xml:space="preserve">Here is a mockup of what the interface will look like in edit mode:</w:t>
+      </w:r>
+      <w:r>
+        <w:rPr>
+          <w:highlight w:val="none"/>
+        </w:rPr>
+      </w:r>
+      <w:r>
+        <w:rPr>
+          <w:highlight w:val="none"/>
+        </w:rPr>
+      </w:r>
+    </w:p>
+    <w:p>
+      <w:pPr>
+        <w:pBdr/>
+        <w:spacing/>
+        <w:ind/>
         <w:rPr/>
       </w:pPr>
-      <w:r/>
+      <w:r>
+        <w:rPr>
+          <w:highlight w:val="none"/>
+        </w:rPr>
+        <mc:AlternateContent>
+          <mc:Choice Requires="wpg">
+            <w:drawing>
+              <wp:inline xmlns:wp="http://schemas.openxmlformats.org/drawingml/2006/wordprocessingDrawing" distT="0" distB="0" distL="0" distR="0">
+                <wp:extent cx="5940425" cy="1119378"/>
+                <wp:effectExtent l="0" t="0" r="0" b="0"/>
+                <wp:docPr id="10" name=""/>
+                <wp:cNvGraphicFramePr>
+                  <a:graphicFrameLocks xmlns:a="http://schemas.openxmlformats.org/drawingml/2006/main" noChangeAspect="1"/>
+                </wp:cNvGraphicFramePr>
+                <a:graphic xmlns:a="http://schemas.openxmlformats.org/drawingml/2006/main">
+                  <a:graphicData uri="http://schemas.openxmlformats.org/drawingml/2006/picture">
+                    <pic:pic xmlns:pic="http://schemas.openxmlformats.org/drawingml/2006/picture">
+                      <pic:nvPicPr>
+                        <pic:cNvPr id="1241364976" name=""/>
+                        <pic:cNvPicPr>
+                          <a:picLocks noChangeAspect="1"/>
+                        </pic:cNvPicPr>
+                        <pic:nvPr/>
+                      </pic:nvPicPr>
+                      <pic:blipFill>
+                        <a:blip r:embed="rId25"/>
+                        <a:stretch/>
+                      </pic:blipFill>
+                      <pic:spPr bwMode="auto">
+                        <a:xfrm>
+                          <a:off x="0" y="0"/>
+                          <a:ext cx="5940424" cy="1119378"/>
+                        </a:xfrm>
+                        <a:prstGeom prst="rect">
+                          <a:avLst/>
+                        </a:prstGeom>
+                      </pic:spPr>
+                    </pic:pic>
+                  </a:graphicData>
+                </a:graphic>
+              </wp:inline>
+            </w:drawing>
+          </mc:Choice>
+          <mc:Fallback>
+            <w:pict>
+              <v:shapetype id="_x0000_t75" coordsize="21600,21600" o:spt="75" o:preferrelative="t" path="m@4@5l@4@11@9@11@9@5xe" filled="f" stroked="f">
+                <v:stroke joinstyle="miter"/>
+                <v:formulas>
+                  <v:f eqn="if lineDrawn pixelLineWidth 0"/>
+                  <v:f eqn="sum @0 1 0"/>
+                  <v:f eqn="sum 0 0 @1"/>
+                  <v:f eqn="prod @2 1 2"/>
+                  <v:f eqn="prod @3 21600 pixelWidth"/>
+                  <v:f eqn="prod @3 21600 pixelHeight"/>
+                  <v:f eqn="sum @0 0 1"/>
+                  <v:f eqn="prod @6 1 2"/>
+                  <v:f eqn="prod @7 21600 pixelWidth"/>
+                  <v:f eqn="sum @8 21600 0"/>
+                  <v:f eqn="prod @7 21600 pixelHeight"/>
+                  <v:f eqn="sum @10 21600 0"/>
+                </v:formulas>
+                <v:path o:extrusionok="f" gradientshapeok="t" o:connecttype="rect"/>
+                <o:lock v:ext="edit" aspectratio="t"/>
+              </v:shapetype>
+              <v:shape id="_x0000_i9" o:spid="_x0000_s9" type="#_x0000_t75" style="width:467.75pt;height:88.14pt;mso-wrap-distance-left:0.00pt;mso-wrap-distance-top:0.00pt;mso-wrap-distance-right:0.00pt;mso-wrap-distance-bottom:0.00pt;z-index:1;" stroked="false">
+                <v:imagedata r:id="rId25" o:title=""/>
+                <o:lock v:ext="edit" rotation="t"/>
+              </v:shape>
+            </w:pict>
+          </mc:Fallback>
+        </mc:AlternateContent>
+      </w:r>
+      <w:r>
+        <w:rPr>
+          <w:highlight w:val="none"/>
+        </w:rPr>
+      </w:r>
       <w:r/>
     </w:p>
     <w:p>
@@ -7101,6 +7518,86 @@
           <w:highlight w:val="none"/>
         </w:rPr>
       </w:pPr>
+      <w:r>
+        <w:rPr>
+          <w:highlight w:val="none"/>
+        </w:rPr>
+      </w:r>
+      <w:r>
+        <w:rPr>
+          <w:highlight w:val="none"/>
+        </w:rPr>
+        <w:t xml:space="preserve">It show</w:t>
+      </w:r>
+      <w:r>
+        <w:rPr>
+          <w:highlight w:val="none"/>
+        </w:rPr>
+        <w:t xml:space="preserve">s the keybinds the user needs to press to interact with the program, and the value of G is still displayed so that the user can see the effects of their changes. The mass of the planet is also still shown so that the user can see their changes to that too.</w:t>
+      </w:r>
+      <w:r>
+        <w:rPr>
+          <w:highlight w:val="none"/>
+        </w:rPr>
+      </w:r>
+      <w:r>
+        <w:rPr>
+          <w:highlight w:val="none"/>
+        </w:rPr>
+      </w:r>
+    </w:p>
+    <w:p>
+      <w:pPr>
+        <w:pBdr/>
+        <w:spacing/>
+        <w:ind/>
+        <w:rPr>
+          <w:highlight w:val="none"/>
+        </w:rPr>
+      </w:pPr>
+      <w:r>
+        <w:rPr>
+          <w:highlight w:val="none"/>
+        </w:rPr>
+        <w:t xml:space="preserve">Reading the inputs will be done with pygame’s event.get() system and else if statements. The elifs will be used to check what key is pr</w:t>
+      </w:r>
+      <w:r>
+        <w:rPr>
+          <w:highlight w:val="none"/>
+        </w:rPr>
+        <w:t xml:space="preserve">essed. When ‘A’ is pressed this will toggle a boolean value, changingAttributes, and when this boolean is true the program will accept inputs of W, S, E and D and change G / the masses accordingly. When it is false the program will not accept those inputs.</w:t>
+      </w:r>
+      <w:r>
+        <w:rPr>
+          <w:highlight w:val="none"/>
+        </w:rPr>
+        <w:t xml:space="preserve"> The other inputs that are mentioned in the start screen will also all be done with elifs, when the space key is pressed it toggles a boolean that makes the program focus on the centre of mass, when the up arrow is pressed it increments the timescale, etc.</w:t>
+      </w:r>
+      <w:r>
+        <w:rPr>
+          <w:highlight w:val="none"/>
+        </w:rPr>
+      </w:r>
+      <w:r>
+        <w:rPr>
+          <w:highlight w:val="none"/>
+        </w:rPr>
+      </w:r>
+    </w:p>
+    <w:p>
+      <w:pPr>
+        <w:pBdr/>
+        <w:spacing/>
+        <w:ind/>
+        <w:rPr>
+          <w:highlight w:val="none"/>
+        </w:rPr>
+      </w:pPr>
+      <w:r>
+        <w:rPr>
+          <w:highlight w:val="none"/>
+        </w:rPr>
+      </w:r>
       <w:r>
         <w:rPr>
           <w:highlight w:val="none"/>
@@ -7307,7 +7804,7 @@
       <w:pPr>
         <w:pStyle w:val="899"/>
         <w:numPr>
-          <w:ilvl w:val="0"/>
+          <w:ilvl w:val="1"/>
           <w:numId w:val="7"/>
         </w:numPr>
         <w:pBdr/>
@@ -7319,7 +7816,7 @@
         <w:rPr>
           <w:highlight w:val="none"/>
         </w:rPr>
-        <w:t xml:space="preserve">Display the mass, radius and distance from the sun when planets are selected</w:t>
+        <w:t xml:space="preserve">Have a menu that displays stats and lets the user edit certain values</w:t>
       </w:r>
       <w:r>
         <w:rPr>
@@ -7327,17 +7824,222 @@
         </w:rPr>
       </w:r>
       <w:r/>
-      <w:r>
-        <w:rPr>
-          <w:highlight w:val="none"/>
-        </w:rPr>
-      </w:r>
-      <w:r>
-        <w:rPr>
-          <w:highlight w:val="none"/>
-        </w:rPr>
-      </w:r>
-      <w:r/>
+    </w:p>
+    <w:p>
+      <w:pPr>
+        <w:pStyle w:val="899"/>
+        <w:numPr>
+          <w:ilvl w:val="2"/>
+          <w:numId w:val="7"/>
+        </w:numPr>
+        <w:pBdr/>
+        <w:spacing/>
+        <w:ind/>
+        <w:rPr/>
+      </w:pPr>
+      <w:r>
+        <w:rPr>
+          <w:highlight w:val="none"/>
+        </w:rPr>
+        <w:t xml:space="preserve">Should display total energy and momentum</w:t>
+      </w:r>
+      <w:r>
+        <w:rPr>
+          <w:highlight w:val="none"/>
+        </w:rPr>
+      </w:r>
+    </w:p>
+    <w:p>
+      <w:pPr>
+        <w:pStyle w:val="899"/>
+        <w:numPr>
+          <w:ilvl w:val="2"/>
+          <w:numId w:val="7"/>
+        </w:numPr>
+        <w:pBdr/>
+        <w:spacing/>
+        <w:ind/>
+        <w:rPr/>
+      </w:pPr>
+      <w:r>
+        <w:rPr>
+          <w:highlight w:val="none"/>
+        </w:rPr>
+        <w:t xml:space="preserve">Should show information about the planet</w:t>
+      </w:r>
+      <w:r>
+        <w:rPr>
+          <w:highlight w:val="none"/>
+        </w:rPr>
+      </w:r>
+    </w:p>
+    <w:p>
+      <w:pPr>
+        <w:pStyle w:val="899"/>
+        <w:numPr>
+          <w:ilvl w:val="3"/>
+          <w:numId w:val="7"/>
+        </w:numPr>
+        <w:pBdr/>
+        <w:spacing/>
+        <w:ind/>
+        <w:rPr/>
+      </w:pPr>
+      <w:r>
+        <w:rPr>
+          <w:highlight w:val="none"/>
+        </w:rPr>
+        <w:t xml:space="preserve">Mass</w:t>
+      </w:r>
+      <w:r>
+        <w:rPr>
+          <w:highlight w:val="none"/>
+        </w:rPr>
+      </w:r>
+    </w:p>
+    <w:p>
+      <w:pPr>
+        <w:pStyle w:val="899"/>
+        <w:numPr>
+          <w:ilvl w:val="3"/>
+          <w:numId w:val="7"/>
+        </w:numPr>
+        <w:pBdr/>
+        <w:spacing/>
+        <w:ind/>
+        <w:rPr/>
+      </w:pPr>
+      <w:r>
+        <w:rPr>
+          <w:highlight w:val="none"/>
+        </w:rPr>
+        <w:t xml:space="preserve">Radius</w:t>
+      </w:r>
+      <w:r>
+        <w:rPr>
+          <w:highlight w:val="none"/>
+        </w:rPr>
+      </w:r>
+    </w:p>
+    <w:p>
+      <w:pPr>
+        <w:pStyle w:val="899"/>
+        <w:numPr>
+          <w:ilvl w:val="3"/>
+          <w:numId w:val="7"/>
+        </w:numPr>
+        <w:pBdr/>
+        <w:spacing/>
+        <w:ind/>
+        <w:rPr/>
+      </w:pPr>
+      <w:r>
+        <w:rPr>
+          <w:highlight w:val="none"/>
+        </w:rPr>
+        <w:t xml:space="preserve">Distance from Sun</w:t>
+      </w:r>
+      <w:r>
+        <w:rPr>
+          <w:highlight w:val="none"/>
+        </w:rPr>
+      </w:r>
+    </w:p>
+    <w:p>
+      <w:pPr>
+        <w:pStyle w:val="899"/>
+        <w:numPr>
+          <w:ilvl w:val="2"/>
+          <w:numId w:val="7"/>
+        </w:numPr>
+        <w:pBdr/>
+        <w:spacing/>
+        <w:ind/>
+        <w:rPr/>
+      </w:pPr>
+      <w:r>
+        <w:rPr>
+          <w:highlight w:val="none"/>
+        </w:rPr>
+        <w:t xml:space="preserve">Should let users edit the value of G</w:t>
+      </w:r>
+      <w:r>
+        <w:rPr>
+          <w:highlight w:val="none"/>
+        </w:rPr>
+      </w:r>
+    </w:p>
+    <w:p>
+      <w:pPr>
+        <w:pStyle w:val="899"/>
+        <w:numPr>
+          <w:ilvl w:val="3"/>
+          <w:numId w:val="7"/>
+        </w:numPr>
+        <w:pBdr/>
+        <w:spacing/>
+        <w:ind/>
+        <w:rPr/>
+      </w:pPr>
+      <w:r>
+        <w:rPr>
+          <w:highlight w:val="none"/>
+        </w:rPr>
+        <w:t xml:space="preserve">G should never become 0 or negative, this would cause a lot of severe bugs due to the way the maths of gravity works. Hence a logarithmic scale will be used so that G can get closer and closer to 0 but never reach it</w:t>
+      </w:r>
+      <w:r>
+        <w:rPr>
+          <w:highlight w:val="none"/>
+        </w:rPr>
+      </w:r>
+    </w:p>
+    <w:p>
+      <w:pPr>
+        <w:pStyle w:val="899"/>
+        <w:numPr>
+          <w:ilvl w:val="2"/>
+          <w:numId w:val="7"/>
+        </w:numPr>
+        <w:pBdr/>
+        <w:spacing/>
+        <w:ind/>
+        <w:rPr/>
+      </w:pPr>
+      <w:r>
+        <w:rPr>
+          <w:highlight w:val="none"/>
+        </w:rPr>
+        <w:t xml:space="preserve">Should let users edit the mass of planets</w:t>
+      </w:r>
+      <w:r>
+        <w:rPr>
+          <w:highlight w:val="none"/>
+        </w:rPr>
+      </w:r>
+    </w:p>
+    <w:p>
+      <w:pPr>
+        <w:pStyle w:val="899"/>
+        <w:numPr>
+          <w:ilvl w:val="3"/>
+          <w:numId w:val="7"/>
+        </w:numPr>
+        <w:pBdr/>
+        <w:spacing/>
+        <w:ind/>
+        <w:rPr/>
+      </w:pPr>
+      <w:r>
+        <w:rPr>
+          <w:highlight w:val="none"/>
+        </w:rPr>
+        <w:t xml:space="preserve">Once again this shouldn’t become negative</w:t>
+      </w:r>
+      <w:r>
+        <w:rPr>
+          <w:highlight w:val="none"/>
+        </w:rPr>
+      </w:r>
     </w:p>
     <w:p>
       <w:pPr>
@@ -7355,7 +8057,77 @@
         <w:rPr>
           <w:highlight w:val="none"/>
         </w:rPr>
-        <w:t xml:space="preserve">Include the ability to compare sizes of two planets</w:t>
+        <w:t xml:space="preserve">Accurately display the solar system with a scale model</w:t>
+      </w:r>
+      <w:r/>
+    </w:p>
+    <w:p>
+      <w:pPr>
+        <w:pStyle w:val="899"/>
+        <w:numPr>
+          <w:ilvl w:val="1"/>
+          <w:numId w:val="7"/>
+        </w:numPr>
+        <w:pBdr/>
+        <w:spacing/>
+        <w:ind/>
+        <w:rPr/>
+      </w:pPr>
+      <w:r>
+        <w:rPr>
+          <w:highlight w:val="none"/>
+        </w:rPr>
+        <w:t xml:space="preserve">This should preserve the relative sizes and distances of all the planets</w:t>
+      </w:r>
+      <w:r>
+        <w:rPr>
+          <w:highlight w:val="none"/>
+        </w:rPr>
+      </w:r>
+      <w:r/>
+    </w:p>
+    <w:p>
+      <w:pPr>
+        <w:pStyle w:val="899"/>
+        <w:numPr>
+          <w:ilvl w:val="1"/>
+          <w:numId w:val="7"/>
+        </w:numPr>
+        <w:pBdr/>
+        <w:spacing/>
+        <w:ind/>
+        <w:rPr/>
+      </w:pPr>
+      <w:r>
+        <w:rPr>
+          <w:highlight w:val="none"/>
+        </w:rPr>
+        <w:t xml:space="preserve">Orbital lines should be shown to demonstrate the path of the planets</w:t>
+      </w:r>
+      <w:r>
+        <w:rPr>
+          <w:highlight w:val="none"/>
+        </w:rPr>
+      </w:r>
+      <w:r/>
+    </w:p>
+    <w:p>
+      <w:pPr>
+        <w:pStyle w:val="899"/>
+        <w:numPr>
+          <w:ilvl w:val="1"/>
+          <w:numId w:val="7"/>
+        </w:numPr>
+        <w:pBdr/>
+        <w:spacing/>
+        <w:ind/>
+        <w:rPr/>
+      </w:pPr>
+      <w:r>
+        <w:rPr>
+          <w:highlight w:val="none"/>
+        </w:rPr>
+        <w:t xml:space="preserve">The user should be able to focus the camera on any planet of their choosing</w:t>
       </w:r>
       <w:r>
         <w:rPr>
@@ -7380,67 +8152,7 @@
         <w:rPr>
           <w:highlight w:val="none"/>
         </w:rPr>
-        <w:t xml:space="preserve">The mass of planets and the value of G should be editable</w:t>
-      </w:r>
-      <w:r>
-        <w:rPr>
-          <w:highlight w:val="none"/>
-        </w:rPr>
-      </w:r>
-      <w:r/>
-    </w:p>
-    <w:p>
-      <w:pPr>
-        <w:pStyle w:val="899"/>
-        <w:numPr>
-          <w:ilvl w:val="1"/>
-          <w:numId w:val="7"/>
-        </w:numPr>
-        <w:pBdr/>
-        <w:spacing/>
-        <w:ind/>
-        <w:rPr/>
-      </w:pPr>
-      <w:r>
-        <w:rPr>
-          <w:highlight w:val="none"/>
-        </w:rPr>
-        <w:t xml:space="preserve">This should be done through a menu which shows the mass of the planet / the value of G as you change it</w:t>
-      </w:r>
-      <w:r>
-        <w:rPr>
-          <w:highlight w:val="none"/>
-        </w:rPr>
-      </w:r>
-      <w:r/>
-    </w:p>
-    <w:p>
-      <w:pPr>
-        <w:pStyle w:val="899"/>
-        <w:numPr>
-          <w:ilvl w:val="1"/>
-          <w:numId w:val="7"/>
-        </w:numPr>
-        <w:pBdr/>
-        <w:spacing/>
-        <w:ind/>
-        <w:rPr/>
-      </w:pPr>
-      <w:r>
-        <w:rPr>
-          <w:highlight w:val="none"/>
-        </w:rPr>
-        <w:t xml:space="preserve">This should not suffer any bugs from the user accidentally setting something to be 0 or negative. This can be done by making changing the value be logarithmic, so that it gets closer and closer to 0 but never reaches 0 or goes below it.</w:t>
-      </w:r>
-      <w:r>
-        <w:rPr>
-          <w:highlight w:val="none"/>
-        </w:rPr>
-      </w:r>
-      <w:r>
-        <w:rPr>
-          <w:highlight w:val="none"/>
-        </w:rPr>
+        <w:t xml:space="preserve">Include the ability to compare sizes of two planets</w:t>
       </w:r>
       <w:r>
         <w:rPr>

</xml_diff>

<commit_message>
Some problems with analysis and design sorted
</commit_message>
<xml_diff>
--- a/Analysis.docx
+++ b/Analysis.docx
@@ -4,7 +4,7 @@
   <w:body>
     <w:p>
       <w:pPr>
-        <w:pStyle w:val="719"/>
+        <w:pStyle w:val="676"/>
         <w:pBdr/>
         <w:spacing w:line="141" w:lineRule="atLeast"/>
         <w:ind/>
@@ -37,7 +37,7 @@
     </w:p>
     <w:p>
       <w:pPr>
-        <w:pStyle w:val="723"/>
+        <w:pStyle w:val="680"/>
         <w:pBdr/>
         <w:spacing/>
         <w:ind/>
@@ -115,7 +115,7 @@
     </w:p>
     <w:p>
       <w:pPr>
-        <w:pStyle w:val="723"/>
+        <w:pStyle w:val="680"/>
         <w:pBdr/>
         <w:spacing/>
         <w:ind/>
@@ -155,7 +155,7 @@
     </w:p>
     <w:p>
       <w:pPr>
-        <w:pStyle w:val="899"/>
+        <w:pStyle w:val="856"/>
         <w:numPr>
           <w:ilvl w:val="0"/>
           <w:numId w:val="1"/>
@@ -195,7 +195,7 @@
     </w:p>
     <w:p>
       <w:pPr>
-        <w:pStyle w:val="899"/>
+        <w:pStyle w:val="856"/>
         <w:numPr>
           <w:ilvl w:val="0"/>
           <w:numId w:val="1"/>
@@ -464,7 +464,7 @@
     </w:p>
     <w:p>
       <w:pPr>
-        <w:pStyle w:val="723"/>
+        <w:pStyle w:val="680"/>
         <w:pBdr/>
         <w:spacing/>
         <w:ind/>
@@ -835,14 +835,14 @@
       <w:hyperlink r:id="rId10" w:tooltip="https://eyes.nasa.gov/apps/orrery/#/home." w:history="1">
         <w:r>
           <w:rPr>
-            <w:rStyle w:val="877"/>
+            <w:rStyle w:val="834"/>
             <w:highlight w:val="none"/>
           </w:rPr>
           <w:t xml:space="preserve">https://eyes.nasa.gov/apps/orrery/#/home</w:t>
         </w:r>
         <w:r>
           <w:rPr>
-            <w:rStyle w:val="877"/>
+            <w:rStyle w:val="834"/>
             <w:highlight w:val="none"/>
           </w:rPr>
           <w:t xml:space="preserve">.</w:t>
@@ -919,20 +919,20 @@
       <w:hyperlink r:id="rId11" w:tooltip="https://phet.colorado.edu/sims/html/my-solar-system/latest/my-solar-system_all.html" w:history="1">
         <w:r>
           <w:rPr>
-            <w:rStyle w:val="877"/>
+            <w:rStyle w:val="834"/>
             <w:highlight w:val="none"/>
           </w:rPr>
           <w:t xml:space="preserve">https://phet.colorado.edu/sims/html/my-solar-system/latest/my-solar-system_all.html</w:t>
         </w:r>
         <w:r>
           <w:rPr>
-            <w:rStyle w:val="877"/>
+            <w:rStyle w:val="834"/>
             <w:highlight w:val="none"/>
           </w:rPr>
         </w:r>
         <w:r>
           <w:rPr>
-            <w:rStyle w:val="877"/>
+            <w:rStyle w:val="834"/>
             <w:highlight w:val="none"/>
           </w:rPr>
         </w:r>
@@ -1655,7 +1655,7 @@
     </w:p>
     <w:p>
       <w:pPr>
-        <w:pStyle w:val="899"/>
+        <w:pStyle w:val="856"/>
         <w:numPr>
           <w:ilvl w:val="0"/>
           <w:numId w:val="2"/>
@@ -1686,7 +1686,7 @@
     </w:p>
     <w:p>
       <w:pPr>
-        <w:pStyle w:val="899"/>
+        <w:pStyle w:val="856"/>
         <w:numPr>
           <w:ilvl w:val="0"/>
           <w:numId w:val="2"/>
@@ -1717,7 +1717,7 @@
     </w:p>
     <w:p>
       <w:pPr>
-        <w:pStyle w:val="899"/>
+        <w:pStyle w:val="856"/>
         <w:numPr>
           <w:ilvl w:val="0"/>
           <w:numId w:val="2"/>
@@ -1748,7 +1748,7 @@
     </w:p>
     <w:p>
       <w:pPr>
-        <w:pStyle w:val="899"/>
+        <w:pStyle w:val="856"/>
         <w:numPr>
           <w:ilvl w:val="0"/>
           <w:numId w:val="2"/>
@@ -1779,7 +1779,7 @@
     </w:p>
     <w:p>
       <w:pPr>
-        <w:pStyle w:val="899"/>
+        <w:pStyle w:val="856"/>
         <w:numPr>
           <w:ilvl w:val="0"/>
           <w:numId w:val="2"/>
@@ -2000,7 +2000,7 @@
     </w:p>
     <w:p>
       <w:pPr>
-        <w:pStyle w:val="721"/>
+        <w:pStyle w:val="678"/>
         <w:pBdr/>
         <w:spacing/>
         <w:ind/>
@@ -2028,7 +2028,7 @@
     </w:p>
     <w:p>
       <w:pPr>
-        <w:pStyle w:val="723"/>
+        <w:pStyle w:val="680"/>
         <w:pBdr/>
         <w:spacing/>
         <w:ind/>
@@ -2071,29 +2071,29 @@
       <w:hyperlink r:id="rId12" w:tooltip="https://eyes.nasa.gov/apps/orrery/#/home" w:history="1">
         <w:r>
           <w:rPr>
-            <w:rStyle w:val="877"/>
+            <w:rStyle w:val="834"/>
             <w:highlight w:val="none"/>
           </w:rPr>
           <w:t xml:space="preserve">https://eyes.nasa.gov/apps/orrery/#/home</w:t>
         </w:r>
         <w:r>
           <w:rPr>
-            <w:rStyle w:val="877"/>
+            <w:rStyle w:val="834"/>
           </w:rPr>
         </w:r>
         <w:r>
           <w:rPr>
-            <w:rStyle w:val="877"/>
+            <w:rStyle w:val="834"/>
           </w:rPr>
         </w:r>
         <w:r>
           <w:rPr>
-            <w:rStyle w:val="877"/>
+            <w:rStyle w:val="834"/>
           </w:rPr>
         </w:r>
         <w:r>
           <w:rPr>
-            <w:rStyle w:val="877"/>
+            <w:rStyle w:val="834"/>
           </w:rPr>
         </w:r>
       </w:hyperlink>
@@ -2310,7 +2310,7 @@
     </w:p>
     <w:p>
       <w:pPr>
-        <w:pStyle w:val="723"/>
+        <w:pStyle w:val="680"/>
         <w:pBdr/>
         <w:spacing/>
         <w:ind/>
@@ -2349,18 +2349,18 @@
       <w:hyperlink r:id="rId14" w:tooltip="https://phet.colorado.edu/sims/html/my-solar-system/latest/my-solar-system_all.html" w:history="1">
         <w:r>
           <w:rPr>
-            <w:rStyle w:val="877"/>
+            <w:rStyle w:val="834"/>
           </w:rPr>
           <w:t xml:space="preserve">https://phet.colorado.edu/sims/html/my-solar-system/latest/my-solar-system_all.html</w:t>
         </w:r>
         <w:r>
           <w:rPr>
-            <w:rStyle w:val="877"/>
+            <w:rStyle w:val="834"/>
           </w:rPr>
         </w:r>
         <w:r>
           <w:rPr>
-            <w:rStyle w:val="877"/>
+            <w:rStyle w:val="834"/>
           </w:rPr>
         </w:r>
       </w:hyperlink>
@@ -2551,7 +2551,7 @@
     </w:p>
     <w:p>
       <w:pPr>
-        <w:pStyle w:val="721"/>
+        <w:pStyle w:val="678"/>
         <w:pBdr/>
         <w:spacing/>
         <w:ind/>
@@ -2628,7 +2628,7 @@
     </w:p>
     <w:p>
       <w:pPr>
-        <w:pStyle w:val="899"/>
+        <w:pStyle w:val="856"/>
         <w:numPr>
           <w:ilvl w:val="0"/>
           <w:numId w:val="3"/>
@@ -2645,7 +2645,7 @@
     </w:p>
     <w:p>
       <w:pPr>
-        <w:pStyle w:val="899"/>
+        <w:pStyle w:val="856"/>
         <w:numPr>
           <w:ilvl w:val="0"/>
           <w:numId w:val="3"/>
@@ -2670,7 +2670,7 @@
     </w:p>
     <w:p>
       <w:pPr>
-        <w:pStyle w:val="899"/>
+        <w:pStyle w:val="856"/>
         <w:numPr>
           <w:ilvl w:val="0"/>
           <w:numId w:val="3"/>
@@ -2695,7 +2695,7 @@
     </w:p>
     <w:p>
       <w:pPr>
-        <w:pStyle w:val="899"/>
+        <w:pStyle w:val="856"/>
         <w:numPr>
           <w:ilvl w:val="0"/>
           <w:numId w:val="3"/>
@@ -2730,7 +2730,7 @@
     </w:p>
     <w:p>
       <w:pPr>
-        <w:pStyle w:val="721"/>
+        <w:pStyle w:val="678"/>
         <w:pBdr/>
         <w:spacing/>
         <w:ind/>
@@ -2758,7 +2758,7 @@
     </w:p>
     <w:p>
       <w:pPr>
-        <w:pStyle w:val="723"/>
+        <w:pStyle w:val="680"/>
         <w:pBdr/>
         <w:spacing/>
         <w:ind/>
@@ -2798,9 +2798,9 @@
           <mc:Choice Requires="wpg">
             <w:drawing>
               <wp:inline xmlns:wp="http://schemas.openxmlformats.org/drawingml/2006/wordprocessingDrawing" distT="0" distB="0" distL="0" distR="0">
-                <wp:extent cx="5940425" cy="5689535"/>
+                <wp:extent cx="5940425" cy="4097240"/>
                 <wp:effectExtent l="0" t="0" r="0" b="0"/>
-                <wp:docPr id="4" name="" hidden="0"/>
+                <wp:docPr id="4" name=""/>
                 <wp:cNvGraphicFramePr>
                   <a:graphicFrameLocks xmlns:a="http://schemas.openxmlformats.org/drawingml/2006/main" noChangeAspect="1"/>
                 </wp:cNvGraphicFramePr>
@@ -2808,11 +2808,11 @@
                   <a:graphicData uri="http://schemas.openxmlformats.org/drawingml/2006/picture">
                     <pic:pic xmlns:pic="http://schemas.openxmlformats.org/drawingml/2006/picture">
                       <pic:nvPicPr>
-                        <pic:cNvPr id="228776122" name="" hidden="0"/>
+                        <pic:cNvPr id="1154824044" name=""/>
                         <pic:cNvPicPr>
                           <a:picLocks noChangeAspect="1"/>
                         </pic:cNvPicPr>
-                        <pic:nvPr isPhoto="0" userDrawn="0"/>
+                        <pic:nvPr/>
                       </pic:nvPicPr>
                       <pic:blipFill>
                         <a:blip r:embed="rId16"/>
@@ -2821,7 +2821,7 @@
                       <pic:spPr bwMode="auto">
                         <a:xfrm>
                           <a:off x="0" y="0"/>
-                          <a:ext cx="5940424" cy="5689535"/>
+                          <a:ext cx="5940424" cy="4097240"/>
                         </a:xfrm>
                         <a:prstGeom prst="rect">
                           <a:avLst/>
@@ -2854,7 +2854,7 @@
                 <v:path o:extrusionok="f" gradientshapeok="t" o:connecttype="rect"/>
                 <o:lock v:ext="edit" aspectratio="t"/>
               </v:shapetype>
-              <v:shape id="_x0000_i3" o:spid="_x0000_s3" type="#_x0000_t75" style="width:467.75pt;height:447.99pt;mso-wrap-distance-left:0.00pt;mso-wrap-distance-top:0.00pt;mso-wrap-distance-right:0.00pt;mso-wrap-distance-bottom:0.00pt;z-index:1;" stroked="false">
+              <v:shape id="_x0000_i3" o:spid="_x0000_s3" type="#_x0000_t75" style="width:467.75pt;height:322.62pt;mso-wrap-distance-left:0.00pt;mso-wrap-distance-top:0.00pt;mso-wrap-distance-right:0.00pt;mso-wrap-distance-bottom:0.00pt;z-index:1;" stroked="false">
                 <v:imagedata r:id="rId16" o:title=""/>
                 <o:lock v:ext="edit" rotation="t"/>
               </v:shape>
@@ -2878,26 +2878,27 @@
         <w:pBdr/>
         <w:spacing/>
         <w:ind/>
-        <w:rPr>
-          <w:highlight w:val="none"/>
-        </w:rPr>
-      </w:pPr>
-      <w:r>
-        <w:rPr>
-          <w:highlight w:val="none"/>
-        </w:rPr>
-        <w:t xml:space="preserve">An orbital system is a system of bodies orbiting each other. They are made up of these celestial bodies, and those celestial bodies are destroyed when the orbital system is destroyed, hence we use composition between them. </w:t>
-      </w:r>
-      <w:r>
-        <w:rPr>
-          <w:highlight w:val="none"/>
-        </w:rPr>
-      </w:r>
-      <w:r>
-        <w:rPr>
-          <w:highlight w:val="none"/>
-        </w:rPr>
-      </w:r>
+        <w:rPr/>
+      </w:pPr>
+      <w:r>
+        <w:rPr>
+          <w:highlight w:val="none"/>
+        </w:rPr>
+        <w:t xml:space="preserve">The main object in the solar system is a celestialBody, this is a catch all for pretty much every object in the system. Satellite and planet both inherit from celestialBody to tweak the behaviour slightly. The distinction between planet and satellite in the</w:t>
+      </w:r>
+      <w:r>
+        <w:rPr>
+          <w:highlight w:val="none"/>
+        </w:rPr>
+        <w:t xml:space="preserve"> program is based on the astronomical definition, not the colloquial definition. A satellite is a body that orbits a host that isn’t a star, while a planet is anything else. That’s the only distinction, this means that the Sun and the Voyager satellites are</w:t>
+      </w:r>
+      <w:r>
+        <w:rPr>
+          <w:highlight w:val="none"/>
+        </w:rPr>
+        <w:t xml:space="preserve"> classed as planets, because they do not have a host they orbit. Meanwhile the moon is a satellite because it orbits the Earth.</w:t>
+      </w:r>
+      <w:r/>
     </w:p>
     <w:p>
       <w:pPr>
@@ -2912,7 +2913,19 @@
         <w:rPr>
           <w:highlight w:val="none"/>
         </w:rPr>
-        <w:t xml:space="preserve">Planets and satellites are both celestial bodies, so they inherit from that class. Planets sometimes have satellites attached to them, and those satellites are destroyed when the planets are, so the relation between them is composition.</w:t>
+        <w:t xml:space="preserve">Satellites need to always orbit a host planet, and this host is one of their attributes, so they are aggregated with Planet. The Satellite’s existence is not dependent on the planet, e.g. if the Earth disappeared today the moon would continue existing, so a</w:t>
+      </w:r>
+      <w:r>
+        <w:rPr>
+          <w:highlight w:val="none"/>
+        </w:rPr>
+        <w:t xml:space="preserve">ggregation is used instead of composition.</w:t>
+      </w:r>
+      <w:r/>
+      <w:r>
+        <w:rPr>
+          <w:highlight w:val="none"/>
+        </w:rPr>
       </w:r>
       <w:r>
         <w:rPr>
@@ -2977,32 +2990,7 @@
     </w:p>
     <w:p>
       <w:pPr>
-        <w:pBdr/>
-        <w:spacing/>
-        <w:ind/>
-        <w:rPr>
-          <w:highlight w:val="none"/>
-        </w:rPr>
-      </w:pPr>
-      <w:r>
-        <w:rPr>
-          <w:highlight w:val="none"/>
-        </w:rPr>
-      </w:r>
-      <w:r>
-        <w:rPr>
-          <w:highlight w:val="none"/>
-        </w:rPr>
-      </w:r>
-      <w:r>
-        <w:rPr>
-          <w:highlight w:val="none"/>
-        </w:rPr>
-      </w:r>
-    </w:p>
-    <w:p>
-      <w:pPr>
-        <w:pStyle w:val="723"/>
+        <w:pStyle w:val="680"/>
         <w:pBdr/>
         <w:spacing/>
         <w:ind/>
@@ -3054,18 +3042,18 @@
       <w:hyperlink r:id="rId17" w:tooltip="https://ssd.jpl.nasa.gov/horizons/" w:history="1">
         <w:r>
           <w:rPr>
-            <w:rStyle w:val="877"/>
+            <w:rStyle w:val="834"/>
           </w:rPr>
           <w:t xml:space="preserve">https://ssd.jpl.nasa.gov/horizons/</w:t>
         </w:r>
         <w:r>
           <w:rPr>
-            <w:rStyle w:val="877"/>
+            <w:rStyle w:val="834"/>
           </w:rPr>
         </w:r>
         <w:r>
           <w:rPr>
-            <w:rStyle w:val="877"/>
+            <w:rStyle w:val="834"/>
           </w:rPr>
         </w:r>
       </w:hyperlink>
@@ -3187,7 +3175,7 @@
       <w:hyperlink r:id="rId18" w:tooltip="https://ssd.jpl.nasa.gov/api/horizons.api?format=text&amp;COMMAND='&quot;+target+&quot;'&amp;OBJ_DATA='YES'&amp;MAKE_EPHEM='YES'&amp;EPHEM_TYPE='VECTORS'&amp;START_TIME='&quot;+startTime+&quot;'&amp;STOP_TIME='&quot;+stopTime+&quot;'&amp;CENTER='500@0'&amp;STEP_SIZE='1 d'&amp;QUANTITIES='1,9,20,23,24,29'" w:history="1">
         <w:r>
           <w:rPr>
-            <w:rStyle w:val="877"/>
+            <w:rStyle w:val="834"/>
             <w:color w:val="000000" w:themeColor="text1"/>
             <w:sz w:val="22"/>
             <w:szCs w:val="18"/>
@@ -3197,7 +3185,7 @@
         </w:r>
         <w:r>
           <w:rPr>
-            <w:rStyle w:val="877"/>
+            <w:rStyle w:val="834"/>
             <w:color w:val="000000" w:themeColor="text1"/>
             <w:sz w:val="22"/>
             <w:szCs w:val="18"/>
@@ -3206,7 +3194,7 @@
         </w:r>
         <w:r>
           <w:rPr>
-            <w:rStyle w:val="877"/>
+            <w:rStyle w:val="834"/>
             <w:color w:val="000000" w:themeColor="text1"/>
             <w:sz w:val="22"/>
             <w:szCs w:val="18"/>
@@ -3347,7 +3335,7 @@
       <w:hyperlink r:id="rId19" w:tooltip="https://ssd-api.jpl.nasa.gov/doc/horizons.html#ephem_type" w:history="1">
         <w:r>
           <w:rPr>
-            <w:rStyle w:val="877"/>
+            <w:rStyle w:val="834"/>
             <w:color w:val="000000" w:themeColor="text1"/>
             <w:sz w:val="22"/>
             <w:szCs w:val="22"/>
@@ -3357,7 +3345,7 @@
         </w:r>
         <w:r>
           <w:rPr>
-            <w:rStyle w:val="877"/>
+            <w:rStyle w:val="834"/>
             <w:color w:val="000000" w:themeColor="text1"/>
             <w:sz w:val="22"/>
             <w:szCs w:val="22"/>
@@ -3366,7 +3354,7 @@
         </w:r>
         <w:r>
           <w:rPr>
-            <w:rStyle w:val="877"/>
+            <w:rStyle w:val="834"/>
             <w:color w:val="000000" w:themeColor="text1"/>
             <w:sz w:val="22"/>
             <w:szCs w:val="22"/>
@@ -3779,7 +3767,7 @@
     </w:p>
     <w:p>
       <w:pPr>
-        <w:pStyle w:val="723"/>
+        <w:pStyle w:val="680"/>
         <w:pBdr/>
         <w:spacing/>
         <w:ind/>
@@ -3816,7 +3804,7 @@
     </w:p>
     <w:p>
       <w:pPr>
-        <w:pStyle w:val="723"/>
+        <w:pStyle w:val="680"/>
         <w:pBdr/>
         <w:spacing/>
         <w:ind/>
@@ -3847,7 +3835,7 @@
     </w:p>
     <w:p>
       <w:pPr>
-        <w:pStyle w:val="723"/>
+        <w:pStyle w:val="680"/>
         <w:pBdr/>
         <w:spacing/>
         <w:ind/>
@@ -3879,7 +3867,7 @@
     </w:p>
     <w:p>
       <w:pPr>
-        <w:pStyle w:val="723"/>
+        <w:pStyle w:val="680"/>
         <w:pBdr/>
         <w:spacing/>
         <w:ind/>
@@ -5941,7 +5929,7 @@
     </w:p>
     <w:p>
       <w:pPr>
-        <w:pStyle w:val="723"/>
+        <w:pStyle w:val="680"/>
         <w:pBdr/>
         <w:spacing/>
         <w:ind/>
@@ -6641,7 +6629,7 @@
     </w:p>
     <w:p>
       <w:pPr>
-        <w:pStyle w:val="723"/>
+        <w:pStyle w:val="680"/>
         <w:pBdr/>
         <w:spacing/>
         <w:ind/>
@@ -7085,7 +7073,7 @@
     </w:p>
     <w:p>
       <w:pPr>
-        <w:pStyle w:val="723"/>
+        <w:pStyle w:val="680"/>
         <w:pBdr/>
         <w:spacing/>
         <w:ind/>
@@ -7396,6 +7384,11 @@
           <w:highlight w:val="none"/>
         </w:rPr>
       </w:r>
+      <w:r>
+        <w:rPr>
+          <w:highlight w:val="none"/>
+        </w:rPr>
+      </w:r>
     </w:p>
     <w:p>
       <w:pPr>
@@ -7611,7 +7604,7 @@
     </w:p>
     <w:p>
       <w:pPr>
-        <w:pStyle w:val="723"/>
+        <w:pStyle w:val="680"/>
         <w:pBdr/>
         <w:spacing/>
         <w:ind/>
@@ -7640,7 +7633,7 @@
     </w:p>
     <w:p>
       <w:pPr>
-        <w:pStyle w:val="899"/>
+        <w:pStyle w:val="856"/>
         <w:numPr>
           <w:ilvl w:val="0"/>
           <w:numId w:val="7"/>
@@ -7657,7 +7650,7 @@
     </w:p>
     <w:p>
       <w:pPr>
-        <w:pStyle w:val="899"/>
+        <w:pStyle w:val="856"/>
         <w:numPr>
           <w:ilvl w:val="1"/>
           <w:numId w:val="7"/>
@@ -7682,7 +7675,7 @@
     </w:p>
     <w:p>
       <w:pPr>
-        <w:pStyle w:val="899"/>
+        <w:pStyle w:val="856"/>
         <w:numPr>
           <w:ilvl w:val="1"/>
           <w:numId w:val="7"/>
@@ -7702,7 +7695,7 @@
     </w:p>
     <w:p>
       <w:pPr>
-        <w:pStyle w:val="899"/>
+        <w:pStyle w:val="856"/>
         <w:numPr>
           <w:ilvl w:val="0"/>
           <w:numId w:val="7"/>
@@ -7727,7 +7720,7 @@
     </w:p>
     <w:p>
       <w:pPr>
-        <w:pStyle w:val="899"/>
+        <w:pStyle w:val="856"/>
         <w:numPr>
           <w:ilvl w:val="1"/>
           <w:numId w:val="7"/>
@@ -7752,7 +7745,7 @@
     </w:p>
     <w:p>
       <w:pPr>
-        <w:pStyle w:val="899"/>
+        <w:pStyle w:val="856"/>
         <w:numPr>
           <w:ilvl w:val="2"/>
           <w:numId w:val="7"/>
@@ -7777,7 +7770,7 @@
     </w:p>
     <w:p>
       <w:pPr>
-        <w:pStyle w:val="899"/>
+        <w:pStyle w:val="856"/>
         <w:numPr>
           <w:ilvl w:val="2"/>
           <w:numId w:val="7"/>
@@ -7802,7 +7795,7 @@
     </w:p>
     <w:p>
       <w:pPr>
-        <w:pStyle w:val="899"/>
+        <w:pStyle w:val="856"/>
         <w:numPr>
           <w:ilvl w:val="1"/>
           <w:numId w:val="7"/>
@@ -7827,7 +7820,7 @@
     </w:p>
     <w:p>
       <w:pPr>
-        <w:pStyle w:val="899"/>
+        <w:pStyle w:val="856"/>
         <w:numPr>
           <w:ilvl w:val="2"/>
           <w:numId w:val="7"/>
@@ -7848,10 +7841,11 @@
           <w:highlight w:val="none"/>
         </w:rPr>
       </w:r>
+      <w:r/>
     </w:p>
     <w:p>
       <w:pPr>
-        <w:pStyle w:val="899"/>
+        <w:pStyle w:val="856"/>
         <w:numPr>
           <w:ilvl w:val="2"/>
           <w:numId w:val="7"/>
@@ -7872,10 +7866,11 @@
           <w:highlight w:val="none"/>
         </w:rPr>
       </w:r>
+      <w:r/>
     </w:p>
     <w:p>
       <w:pPr>
-        <w:pStyle w:val="899"/>
+        <w:pStyle w:val="856"/>
         <w:numPr>
           <w:ilvl w:val="3"/>
           <w:numId w:val="7"/>
@@ -7896,10 +7891,11 @@
           <w:highlight w:val="none"/>
         </w:rPr>
       </w:r>
+      <w:r/>
     </w:p>
     <w:p>
       <w:pPr>
-        <w:pStyle w:val="899"/>
+        <w:pStyle w:val="856"/>
         <w:numPr>
           <w:ilvl w:val="3"/>
           <w:numId w:val="7"/>
@@ -7920,10 +7916,11 @@
           <w:highlight w:val="none"/>
         </w:rPr>
       </w:r>
+      <w:r/>
     </w:p>
     <w:p>
       <w:pPr>
-        <w:pStyle w:val="899"/>
+        <w:pStyle w:val="856"/>
         <w:numPr>
           <w:ilvl w:val="3"/>
           <w:numId w:val="7"/>
@@ -7944,10 +7941,11 @@
           <w:highlight w:val="none"/>
         </w:rPr>
       </w:r>
+      <w:r/>
     </w:p>
     <w:p>
       <w:pPr>
-        <w:pStyle w:val="899"/>
+        <w:pStyle w:val="856"/>
         <w:numPr>
           <w:ilvl w:val="2"/>
           <w:numId w:val="7"/>
@@ -7968,10 +7966,11 @@
           <w:highlight w:val="none"/>
         </w:rPr>
       </w:r>
+      <w:r/>
     </w:p>
     <w:p>
       <w:pPr>
-        <w:pStyle w:val="899"/>
+        <w:pStyle w:val="856"/>
         <w:numPr>
           <w:ilvl w:val="3"/>
           <w:numId w:val="7"/>
@@ -7992,10 +7991,11 @@
           <w:highlight w:val="none"/>
         </w:rPr>
       </w:r>
+      <w:r/>
     </w:p>
     <w:p>
       <w:pPr>
-        <w:pStyle w:val="899"/>
+        <w:pStyle w:val="856"/>
         <w:numPr>
           <w:ilvl w:val="2"/>
           <w:numId w:val="7"/>
@@ -8016,10 +8016,11 @@
           <w:highlight w:val="none"/>
         </w:rPr>
       </w:r>
+      <w:r/>
     </w:p>
     <w:p>
       <w:pPr>
-        <w:pStyle w:val="899"/>
+        <w:pStyle w:val="856"/>
         <w:numPr>
           <w:ilvl w:val="3"/>
           <w:numId w:val="7"/>
@@ -8040,10 +8041,11 @@
           <w:highlight w:val="none"/>
         </w:rPr>
       </w:r>
+      <w:r/>
     </w:p>
     <w:p>
       <w:pPr>
-        <w:pStyle w:val="899"/>
+        <w:pStyle w:val="856"/>
         <w:numPr>
           <w:ilvl w:val="0"/>
           <w:numId w:val="7"/>
@@ -8063,7 +8065,7 @@
     </w:p>
     <w:p>
       <w:pPr>
-        <w:pStyle w:val="899"/>
+        <w:pStyle w:val="856"/>
         <w:numPr>
           <w:ilvl w:val="1"/>
           <w:numId w:val="7"/>
@@ -8088,7 +8090,7 @@
     </w:p>
     <w:p>
       <w:pPr>
-        <w:pStyle w:val="899"/>
+        <w:pStyle w:val="856"/>
         <w:numPr>
           <w:ilvl w:val="1"/>
           <w:numId w:val="7"/>
@@ -8113,7 +8115,7 @@
     </w:p>
     <w:p>
       <w:pPr>
-        <w:pStyle w:val="899"/>
+        <w:pStyle w:val="856"/>
         <w:numPr>
           <w:ilvl w:val="1"/>
           <w:numId w:val="7"/>
@@ -8138,7 +8140,7 @@
     </w:p>
     <w:p>
       <w:pPr>
-        <w:pStyle w:val="899"/>
+        <w:pStyle w:val="856"/>
         <w:numPr>
           <w:ilvl w:val="0"/>
           <w:numId w:val="7"/>
@@ -8163,7 +8165,7 @@
     </w:p>
     <w:p>
       <w:pPr>
-        <w:pStyle w:val="899"/>
+        <w:pStyle w:val="856"/>
         <w:numPr>
           <w:ilvl w:val="0"/>
           <w:numId w:val="7"/>
@@ -8188,7 +8190,7 @@
     </w:p>
     <w:p>
       <w:pPr>
-        <w:pStyle w:val="899"/>
+        <w:pStyle w:val="856"/>
         <w:numPr>
           <w:ilvl w:val="1"/>
           <w:numId w:val="7"/>
@@ -8213,7 +8215,7 @@
     </w:p>
     <w:p>
       <w:pPr>
-        <w:pStyle w:val="899"/>
+        <w:pStyle w:val="856"/>
         <w:numPr>
           <w:ilvl w:val="0"/>
           <w:numId w:val="7"/>
@@ -8240,7 +8242,7 @@
       <w:footnotePr/>
       <w:endnotePr/>
       <w:type w:val="nextPage"/>
-      <w:pgSz w:h="16838" w:orient="portrait" w:w="11906"/>
+      <w:pgSz w:h="16838" w:orient="landscape" w:w="11906"/>
       <w:pgMar w:top="1134" w:right="850" w:bottom="1134" w:left="1701" w:header="709" w:footer="709" w:gutter="0"/>
       <w:cols w:num="1" w:sep="0" w:space="708" w:equalWidth="1"/>
     </w:sectPr>
@@ -9466,9 +9468,9 @@
     <w:lsdException w:name="Bibliography" w:uiPriority="37"/>
     <w:lsdException w:name="TOC Heading" w:uiPriority="39" w:qFormat="1"/>
   </w:latentStyles>
-  <w:style w:type="character" w:styleId="711">
+  <w:style w:type="character" w:styleId="668">
     <w:name w:val="Intense Emphasis"/>
-    <w:basedOn w:val="900"/>
+    <w:basedOn w:val="857"/>
     <w:uiPriority w:val="21"/>
     <w:qFormat/>
     <w:pPr>
@@ -9482,9 +9484,9 @@
       <w:color w:val="0f4761" w:themeColor="accent1" w:themeShade="BF"/>
     </w:rPr>
   </w:style>
-  <w:style w:type="character" w:styleId="712">
+  <w:style w:type="character" w:styleId="669">
     <w:name w:val="Intense Reference"/>
-    <w:basedOn w:val="900"/>
+    <w:basedOn w:val="857"/>
     <w:uiPriority w:val="32"/>
     <w:qFormat/>
     <w:pPr>
@@ -9500,9 +9502,9 @@
       <w:spacing w:val="5"/>
     </w:rPr>
   </w:style>
-  <w:style w:type="character" w:styleId="713">
+  <w:style w:type="character" w:styleId="670">
     <w:name w:val="Subtle Emphasis"/>
-    <w:basedOn w:val="900"/>
+    <w:basedOn w:val="857"/>
     <w:uiPriority w:val="19"/>
     <w:qFormat/>
     <w:pPr>
@@ -9516,9 +9518,9 @@
       <w:color w:val="404040" w:themeColor="text1" w:themeTint="BF"/>
     </w:rPr>
   </w:style>
-  <w:style w:type="character" w:styleId="714">
+  <w:style w:type="character" w:styleId="671">
     <w:name w:val="Emphasis"/>
-    <w:basedOn w:val="900"/>
+    <w:basedOn w:val="857"/>
     <w:uiPriority w:val="20"/>
     <w:qFormat/>
     <w:pPr>
@@ -9531,9 +9533,9 @@
       <w:iCs/>
     </w:rPr>
   </w:style>
-  <w:style w:type="character" w:styleId="715">
+  <w:style w:type="character" w:styleId="672">
     <w:name w:val="Strong"/>
-    <w:basedOn w:val="900"/>
+    <w:basedOn w:val="857"/>
     <w:uiPriority w:val="22"/>
     <w:qFormat/>
     <w:pPr>
@@ -9546,9 +9548,9 @@
       <w:bCs/>
     </w:rPr>
   </w:style>
-  <w:style w:type="character" w:styleId="716">
+  <w:style w:type="character" w:styleId="673">
     <w:name w:val="Subtle Reference"/>
-    <w:basedOn w:val="900"/>
+    <w:basedOn w:val="857"/>
     <w:uiPriority w:val="31"/>
     <w:qFormat/>
     <w:pPr>
@@ -9561,9 +9563,9 @@
       <w:color w:val="5a5a5a" w:themeColor="text1" w:themeTint="A5"/>
     </w:rPr>
   </w:style>
-  <w:style w:type="character" w:styleId="717">
+  <w:style w:type="character" w:styleId="674">
     <w:name w:val="Book Title"/>
-    <w:basedOn w:val="900"/>
+    <w:basedOn w:val="857"/>
     <w:uiPriority w:val="33"/>
     <w:qFormat/>
     <w:pPr>
@@ -9579,9 +9581,9 @@
       <w:spacing w:val="5"/>
     </w:rPr>
   </w:style>
-  <w:style w:type="character" w:styleId="718">
+  <w:style w:type="character" w:styleId="675">
     <w:name w:val="FollowedHyperlink"/>
-    <w:basedOn w:val="900"/>
+    <w:basedOn w:val="857"/>
     <w:uiPriority w:val="99"/>
     <w:semiHidden/>
     <w:unhideWhenUsed/>
@@ -9595,11 +9597,11 @@
       <w:u w:val="single"/>
     </w:rPr>
   </w:style>
-  <w:style w:type="paragraph" w:styleId="719">
+  <w:style w:type="paragraph" w:styleId="676">
     <w:name w:val="Heading 1"/>
-    <w:basedOn w:val="895"/>
-    <w:next w:val="895"/>
-    <w:link w:val="720"/>
+    <w:basedOn w:val="852"/>
+    <w:next w:val="852"/>
+    <w:link w:val="677"/>
     <w:uiPriority w:val="9"/>
     <w:qFormat/>
     <w:pPr>
@@ -9616,9 +9618,9 @@
       <w:szCs w:val="40"/>
     </w:rPr>
   </w:style>
-  <w:style w:type="character" w:styleId="720">
+  <w:style w:type="character" w:styleId="677">
     <w:name w:val="Heading 1 Char"/>
-    <w:link w:val="719"/>
+    <w:link w:val="676"/>
     <w:uiPriority w:val="9"/>
     <w:pPr>
       <w:pBdr/>
@@ -9631,11 +9633,11 @@
       <w:szCs w:val="40"/>
     </w:rPr>
   </w:style>
-  <w:style w:type="paragraph" w:styleId="721">
+  <w:style w:type="paragraph" w:styleId="678">
     <w:name w:val="Heading 2"/>
-    <w:basedOn w:val="895"/>
-    <w:next w:val="895"/>
-    <w:link w:val="722"/>
+    <w:basedOn w:val="852"/>
+    <w:next w:val="852"/>
+    <w:link w:val="679"/>
     <w:uiPriority w:val="9"/>
     <w:unhideWhenUsed/>
     <w:qFormat/>
@@ -9652,9 +9654,9 @@
       <w:sz w:val="34"/>
     </w:rPr>
   </w:style>
-  <w:style w:type="character" w:styleId="722">
+  <w:style w:type="character" w:styleId="679">
     <w:name w:val="Heading 2 Char"/>
-    <w:link w:val="721"/>
+    <w:link w:val="678"/>
     <w:uiPriority w:val="9"/>
     <w:pPr>
       <w:pBdr/>
@@ -9666,11 +9668,11 @@
       <w:sz w:val="34"/>
     </w:rPr>
   </w:style>
-  <w:style w:type="paragraph" w:styleId="723">
+  <w:style w:type="paragraph" w:styleId="680">
     <w:name w:val="Heading 3"/>
-    <w:basedOn w:val="895"/>
-    <w:next w:val="895"/>
-    <w:link w:val="724"/>
+    <w:basedOn w:val="852"/>
+    <w:next w:val="852"/>
+    <w:link w:val="681"/>
     <w:uiPriority w:val="9"/>
     <w:unhideWhenUsed/>
     <w:qFormat/>
@@ -9688,9 +9690,9 @@
       <w:szCs w:val="30"/>
     </w:rPr>
   </w:style>
-  <w:style w:type="character" w:styleId="724">
+  <w:style w:type="character" w:styleId="681">
     <w:name w:val="Heading 3 Char"/>
-    <w:link w:val="723"/>
+    <w:link w:val="680"/>
     <w:uiPriority w:val="9"/>
     <w:pPr>
       <w:pBdr/>
@@ -9703,11 +9705,11 @@
       <w:szCs w:val="30"/>
     </w:rPr>
   </w:style>
-  <w:style w:type="paragraph" w:styleId="725">
+  <w:style w:type="paragraph" w:styleId="682">
     <w:name w:val="Heading 4"/>
-    <w:basedOn w:val="895"/>
-    <w:next w:val="895"/>
-    <w:link w:val="726"/>
+    <w:basedOn w:val="852"/>
+    <w:next w:val="852"/>
+    <w:link w:val="683"/>
     <w:uiPriority w:val="9"/>
     <w:unhideWhenUsed/>
     <w:qFormat/>
@@ -9727,9 +9729,9 @@
       <w:szCs w:val="26"/>
     </w:rPr>
   </w:style>
-  <w:style w:type="character" w:styleId="726">
+  <w:style w:type="character" w:styleId="683">
     <w:name w:val="Heading 4 Char"/>
-    <w:link w:val="725"/>
+    <w:link w:val="682"/>
     <w:uiPriority w:val="9"/>
     <w:pPr>
       <w:pBdr/>
@@ -9744,11 +9746,11 @@
       <w:szCs w:val="26"/>
     </w:rPr>
   </w:style>
-  <w:style w:type="paragraph" w:styleId="727">
+  <w:style w:type="paragraph" w:styleId="684">
     <w:name w:val="Heading 5"/>
-    <w:basedOn w:val="895"/>
-    <w:next w:val="895"/>
-    <w:link w:val="728"/>
+    <w:basedOn w:val="852"/>
+    <w:next w:val="852"/>
+    <w:link w:val="685"/>
     <w:uiPriority w:val="9"/>
     <w:unhideWhenUsed/>
     <w:qFormat/>
@@ -9768,9 +9770,9 @@
       <w:szCs w:val="24"/>
     </w:rPr>
   </w:style>
-  <w:style w:type="character" w:styleId="728">
+  <w:style w:type="character" w:styleId="685">
     <w:name w:val="Heading 5 Char"/>
-    <w:link w:val="727"/>
+    <w:link w:val="684"/>
     <w:uiPriority w:val="9"/>
     <w:pPr>
       <w:pBdr/>
@@ -9785,11 +9787,11 @@
       <w:szCs w:val="24"/>
     </w:rPr>
   </w:style>
-  <w:style w:type="paragraph" w:styleId="729">
+  <w:style w:type="paragraph" w:styleId="686">
     <w:name w:val="Heading 6"/>
-    <w:basedOn w:val="895"/>
-    <w:next w:val="895"/>
-    <w:link w:val="730"/>
+    <w:basedOn w:val="852"/>
+    <w:next w:val="852"/>
+    <w:link w:val="687"/>
     <w:uiPriority w:val="9"/>
     <w:unhideWhenUsed/>
     <w:qFormat/>
@@ -9809,9 +9811,9 @@
       <w:szCs w:val="22"/>
     </w:rPr>
   </w:style>
-  <w:style w:type="character" w:styleId="730">
+  <w:style w:type="character" w:styleId="687">
     <w:name w:val="Heading 6 Char"/>
-    <w:link w:val="729"/>
+    <w:link w:val="686"/>
     <w:uiPriority w:val="9"/>
     <w:pPr>
       <w:pBdr/>
@@ -9826,11 +9828,11 @@
       <w:szCs w:val="22"/>
     </w:rPr>
   </w:style>
-  <w:style w:type="paragraph" w:styleId="731">
+  <w:style w:type="paragraph" w:styleId="688">
     <w:name w:val="Heading 7"/>
-    <w:basedOn w:val="895"/>
-    <w:next w:val="895"/>
-    <w:link w:val="732"/>
+    <w:basedOn w:val="852"/>
+    <w:next w:val="852"/>
+    <w:link w:val="689"/>
     <w:uiPriority w:val="9"/>
     <w:unhideWhenUsed/>
     <w:qFormat/>
@@ -9852,9 +9854,9 @@
       <w:szCs w:val="22"/>
     </w:rPr>
   </w:style>
-  <w:style w:type="character" w:styleId="732">
+  <w:style w:type="character" w:styleId="689">
     <w:name w:val="Heading 7 Char"/>
-    <w:link w:val="731"/>
+    <w:link w:val="688"/>
     <w:uiPriority w:val="9"/>
     <w:pPr>
       <w:pBdr/>
@@ -9871,11 +9873,11 @@
       <w:szCs w:val="22"/>
     </w:rPr>
   </w:style>
-  <w:style w:type="paragraph" w:styleId="733">
+  <w:style w:type="paragraph" w:styleId="690">
     <w:name w:val="Heading 8"/>
-    <w:basedOn w:val="895"/>
-    <w:next w:val="895"/>
-    <w:link w:val="734"/>
+    <w:basedOn w:val="852"/>
+    <w:next w:val="852"/>
+    <w:link w:val="691"/>
     <w:uiPriority w:val="9"/>
     <w:unhideWhenUsed/>
     <w:qFormat/>
@@ -9895,9 +9897,9 @@
       <w:szCs w:val="22"/>
     </w:rPr>
   </w:style>
-  <w:style w:type="character" w:styleId="734">
+  <w:style w:type="character" w:styleId="691">
     <w:name w:val="Heading 8 Char"/>
-    <w:link w:val="733"/>
+    <w:link w:val="690"/>
     <w:uiPriority w:val="9"/>
     <w:pPr>
       <w:pBdr/>
@@ -9912,11 +9914,11 @@
       <w:szCs w:val="22"/>
     </w:rPr>
   </w:style>
-  <w:style w:type="paragraph" w:styleId="735">
+  <w:style w:type="paragraph" w:styleId="692">
     <w:name w:val="Heading 9"/>
-    <w:basedOn w:val="895"/>
-    <w:next w:val="895"/>
-    <w:link w:val="736"/>
+    <w:basedOn w:val="852"/>
+    <w:next w:val="852"/>
+    <w:link w:val="693"/>
     <w:uiPriority w:val="9"/>
     <w:unhideWhenUsed/>
     <w:qFormat/>
@@ -9936,9 +9938,9 @@
       <w:szCs w:val="21"/>
     </w:rPr>
   </w:style>
-  <w:style w:type="character" w:styleId="736">
+  <w:style w:type="character" w:styleId="693">
     <w:name w:val="Heading 9 Char"/>
-    <w:link w:val="735"/>
+    <w:link w:val="692"/>
     <w:uiPriority w:val="9"/>
     <w:pPr>
       <w:pBdr/>
@@ -9953,11 +9955,11 @@
       <w:szCs w:val="21"/>
     </w:rPr>
   </w:style>
-  <w:style w:type="paragraph" w:styleId="737">
+  <w:style w:type="paragraph" w:styleId="694">
     <w:name w:val="Title"/>
-    <w:basedOn w:val="895"/>
-    <w:next w:val="895"/>
-    <w:link w:val="738"/>
+    <w:basedOn w:val="852"/>
+    <w:next w:val="852"/>
+    <w:link w:val="695"/>
     <w:uiPriority w:val="10"/>
     <w:qFormat/>
     <w:pPr>
@@ -9971,9 +9973,9 @@
       <w:szCs w:val="48"/>
     </w:rPr>
   </w:style>
-  <w:style w:type="character" w:styleId="738">
+  <w:style w:type="character" w:styleId="695">
     <w:name w:val="Title Char"/>
-    <w:link w:val="737"/>
+    <w:link w:val="694"/>
     <w:uiPriority w:val="10"/>
     <w:pPr>
       <w:pBdr/>
@@ -9985,11 +9987,11 @@
       <w:szCs w:val="48"/>
     </w:rPr>
   </w:style>
-  <w:style w:type="paragraph" w:styleId="739">
+  <w:style w:type="paragraph" w:styleId="696">
     <w:name w:val="Subtitle"/>
-    <w:basedOn w:val="895"/>
-    <w:next w:val="895"/>
-    <w:link w:val="740"/>
+    <w:basedOn w:val="852"/>
+    <w:next w:val="852"/>
+    <w:link w:val="697"/>
     <w:uiPriority w:val="11"/>
     <w:qFormat/>
     <w:pPr>
@@ -10002,9 +10004,9 @@
       <w:szCs w:val="24"/>
     </w:rPr>
   </w:style>
-  <w:style w:type="character" w:styleId="740">
+  <w:style w:type="character" w:styleId="697">
     <w:name w:val="Subtitle Char"/>
-    <w:link w:val="739"/>
+    <w:link w:val="696"/>
     <w:uiPriority w:val="11"/>
     <w:pPr>
       <w:pBdr/>
@@ -10016,11 +10018,11 @@
       <w:szCs w:val="24"/>
     </w:rPr>
   </w:style>
-  <w:style w:type="paragraph" w:styleId="741">
+  <w:style w:type="paragraph" w:styleId="698">
     <w:name w:val="Quote"/>
-    <w:basedOn w:val="895"/>
-    <w:next w:val="895"/>
-    <w:link w:val="742"/>
+    <w:basedOn w:val="852"/>
+    <w:next w:val="852"/>
+    <w:link w:val="699"/>
     <w:uiPriority w:val="29"/>
     <w:qFormat/>
     <w:pPr>
@@ -10032,9 +10034,9 @@
       <w:i/>
     </w:rPr>
   </w:style>
-  <w:style w:type="character" w:styleId="742">
+  <w:style w:type="character" w:styleId="699">
     <w:name w:val="Quote Char"/>
-    <w:link w:val="741"/>
+    <w:link w:val="698"/>
     <w:uiPriority w:val="29"/>
     <w:pPr>
       <w:pBdr/>
@@ -10045,11 +10047,11 @@
       <w:i/>
     </w:rPr>
   </w:style>
-  <w:style w:type="paragraph" w:styleId="743">
+  <w:style w:type="paragraph" w:styleId="700">
     <w:name w:val="Intense Quote"/>
-    <w:basedOn w:val="895"/>
-    <w:next w:val="895"/>
-    <w:link w:val="744"/>
+    <w:basedOn w:val="852"/>
+    <w:next w:val="852"/>
+    <w:link w:val="701"/>
     <w:uiPriority w:val="30"/>
     <w:qFormat/>
     <w:pPr>
@@ -10068,9 +10070,9 @@
       <w:i/>
     </w:rPr>
   </w:style>
-  <w:style w:type="character" w:styleId="744">
+  <w:style w:type="character" w:styleId="701">
     <w:name w:val="Intense Quote Char"/>
-    <w:link w:val="743"/>
+    <w:link w:val="700"/>
     <w:uiPriority w:val="30"/>
     <w:pPr>
       <w:pBdr/>
@@ -10081,10 +10083,10 @@
       <w:i/>
     </w:rPr>
   </w:style>
-  <w:style w:type="paragraph" w:styleId="745">
+  <w:style w:type="paragraph" w:styleId="702">
     <w:name w:val="Header"/>
-    <w:basedOn w:val="895"/>
-    <w:link w:val="746"/>
+    <w:basedOn w:val="852"/>
+    <w:link w:val="703"/>
     <w:uiPriority w:val="99"/>
     <w:unhideWhenUsed/>
     <w:pPr>
@@ -10097,9 +10099,9 @@
       <w:ind/>
     </w:pPr>
   </w:style>
-  <w:style w:type="character" w:styleId="746">
+  <w:style w:type="character" w:styleId="703">
     <w:name w:val="Header Char"/>
-    <w:link w:val="745"/>
+    <w:link w:val="702"/>
     <w:uiPriority w:val="99"/>
     <w:pPr>
       <w:pBdr/>
@@ -10107,10 +10109,10 @@
       <w:ind/>
     </w:pPr>
   </w:style>
-  <w:style w:type="paragraph" w:styleId="747">
+  <w:style w:type="paragraph" w:styleId="704">
     <w:name w:val="Footer"/>
-    <w:basedOn w:val="895"/>
-    <w:link w:val="750"/>
+    <w:basedOn w:val="852"/>
+    <w:link w:val="707"/>
     <w:uiPriority w:val="99"/>
     <w:unhideWhenUsed/>
     <w:pPr>
@@ -10123,9 +10125,9 @@
       <w:ind/>
     </w:pPr>
   </w:style>
-  <w:style w:type="character" w:styleId="748">
+  <w:style w:type="character" w:styleId="705">
     <w:name w:val="Footer Char"/>
-    <w:link w:val="747"/>
+    <w:link w:val="704"/>
     <w:uiPriority w:val="99"/>
     <w:pPr>
       <w:pBdr/>
@@ -10133,10 +10135,10 @@
       <w:ind/>
     </w:pPr>
   </w:style>
-  <w:style w:type="paragraph" w:styleId="749">
+  <w:style w:type="paragraph" w:styleId="706">
     <w:name w:val="Caption"/>
-    <w:basedOn w:val="895"/>
-    <w:next w:val="895"/>
+    <w:basedOn w:val="852"/>
+    <w:next w:val="852"/>
     <w:uiPriority w:val="35"/>
     <w:semiHidden/>
     <w:unhideWhenUsed/>
@@ -10154,10 +10156,10 @@
       <w:szCs w:val="18"/>
     </w:rPr>
   </w:style>
-  <w:style w:type="character" w:styleId="750">
+  <w:style w:type="character" w:styleId="707">
     <w:name w:val="Caption Char"/>
-    <w:basedOn w:val="749"/>
-    <w:link w:val="747"/>
+    <w:basedOn w:val="706"/>
+    <w:link w:val="704"/>
     <w:uiPriority w:val="99"/>
     <w:pPr>
       <w:pBdr/>
@@ -10165,9 +10167,9 @@
       <w:ind/>
     </w:pPr>
   </w:style>
-  <w:style w:type="table" w:styleId="751">
+  <w:style w:type="table" w:styleId="708">
     <w:name w:val="Table Grid"/>
-    <w:basedOn w:val="896"/>
+    <w:basedOn w:val="853"/>
     <w:uiPriority w:val="59"/>
     <w:pPr>
       <w:pBdr/>
@@ -10364,9 +10366,9 @@
       </w:tcPr>
     </w:tblStylePr>
   </w:style>
-  <w:style w:type="table" w:styleId="752">
+  <w:style w:type="table" w:styleId="709">
     <w:name w:val="Table Grid Light"/>
-    <w:basedOn w:val="896"/>
+    <w:basedOn w:val="853"/>
     <w:uiPriority w:val="59"/>
     <w:pPr>
       <w:pBdr/>
@@ -10563,9 +10565,9 @@
       </w:tcPr>
     </w:tblStylePr>
   </w:style>
-  <w:style w:type="table" w:styleId="753">
+  <w:style w:type="table" w:styleId="710">
     <w:name w:val="Plain Table 1"/>
-    <w:basedOn w:val="896"/>
+    <w:basedOn w:val="853"/>
     <w:uiPriority w:val="59"/>
     <w:pPr>
       <w:pBdr/>
@@ -10788,9 +10790,9 @@
       </w:tcPr>
     </w:tblStylePr>
   </w:style>
-  <w:style w:type="table" w:styleId="754">
+  <w:style w:type="table" w:styleId="711">
     <w:name w:val="Plain Table 2"/>
-    <w:basedOn w:val="896"/>
+    <w:basedOn w:val="853"/>
     <w:uiPriority w:val="59"/>
     <w:pPr>
       <w:pBdr/>
@@ -11021,9 +11023,9 @@
       </w:tcPr>
     </w:tblStylePr>
   </w:style>
-  <w:style w:type="table" w:styleId="755">
+  <w:style w:type="table" w:styleId="712">
     <w:name w:val="Plain Table 3"/>
-    <w:basedOn w:val="896"/>
+    <w:basedOn w:val="853"/>
     <w:uiPriority w:val="99"/>
     <w:pPr>
       <w:pBdr/>
@@ -11251,9 +11253,9 @@
       </w:tcPr>
     </w:tblStylePr>
   </w:style>
-  <w:style w:type="table" w:styleId="756">
+  <w:style w:type="table" w:styleId="713">
     <w:name w:val="Plain Table 4"/>
-    <w:basedOn w:val="896"/>
+    <w:basedOn w:val="853"/>
     <w:uiPriority w:val="99"/>
     <w:pPr>
       <w:pBdr/>
@@ -11467,9 +11469,9 @@
       </w:tcPr>
     </w:tblStylePr>
   </w:style>
-  <w:style w:type="table" w:styleId="757">
+  <w:style w:type="table" w:styleId="714">
     <w:name w:val="Plain Table 5"/>
-    <w:basedOn w:val="896"/>
+    <w:basedOn w:val="853"/>
     <w:uiPriority w:val="99"/>
     <w:pPr>
       <w:pBdr/>
@@ -11700,9 +11702,9 @@
       </w:tcPr>
     </w:tblStylePr>
   </w:style>
-  <w:style w:type="table" w:styleId="758">
+  <w:style w:type="table" w:styleId="715">
     <w:name w:val="Grid Table 1 Light"/>
-    <w:basedOn w:val="896"/>
+    <w:basedOn w:val="853"/>
     <w:uiPriority w:val="99"/>
     <w:pPr>
       <w:pBdr/>
@@ -11923,9 +11925,9 @@
       </w:tcPr>
     </w:tblStylePr>
   </w:style>
-  <w:style w:type="table" w:styleId="759">
+  <w:style w:type="table" w:styleId="716">
     <w:name w:val="Grid Table 1 Light - Accent 1"/>
-    <w:basedOn w:val="896"/>
+    <w:basedOn w:val="853"/>
     <w:uiPriority w:val="99"/>
     <w:pPr>
       <w:pBdr/>
@@ -12146,9 +12148,9 @@
       </w:tcPr>
     </w:tblStylePr>
   </w:style>
-  <w:style w:type="table" w:styleId="760">
+  <w:style w:type="table" w:styleId="717">
     <w:name w:val="Grid Table 1 Light - Accent 2"/>
-    <w:basedOn w:val="896"/>
+    <w:basedOn w:val="853"/>
     <w:uiPriority w:val="99"/>
     <w:pPr>
       <w:pBdr/>
@@ -12369,9 +12371,9 @@
       </w:tcPr>
     </w:tblStylePr>
   </w:style>
-  <w:style w:type="table" w:styleId="761">
+  <w:style w:type="table" w:styleId="718">
     <w:name w:val="Grid Table 1 Light - Accent 3"/>
-    <w:basedOn w:val="896"/>
+    <w:basedOn w:val="853"/>
     <w:uiPriority w:val="99"/>
     <w:pPr>
       <w:pBdr/>
@@ -12592,9 +12594,9 @@
       </w:tcPr>
     </w:tblStylePr>
   </w:style>
-  <w:style w:type="table" w:styleId="762">
+  <w:style w:type="table" w:styleId="719">
     <w:name w:val="Grid Table 1 Light - Accent 4"/>
-    <w:basedOn w:val="896"/>
+    <w:basedOn w:val="853"/>
     <w:uiPriority w:val="99"/>
     <w:pPr>
       <w:pBdr/>
@@ -12815,9 +12817,9 @@
       </w:tcPr>
     </w:tblStylePr>
   </w:style>
-  <w:style w:type="table" w:styleId="763">
+  <w:style w:type="table" w:styleId="720">
     <w:name w:val="Grid Table 1 Light - Accent 5"/>
-    <w:basedOn w:val="896"/>
+    <w:basedOn w:val="853"/>
     <w:uiPriority w:val="99"/>
     <w:pPr>
       <w:pBdr/>
@@ -13038,9 +13040,9 @@
       </w:tcPr>
     </w:tblStylePr>
   </w:style>
-  <w:style w:type="table" w:styleId="764">
+  <w:style w:type="table" w:styleId="721">
     <w:name w:val="Grid Table 1 Light - Accent 6"/>
-    <w:basedOn w:val="896"/>
+    <w:basedOn w:val="853"/>
     <w:uiPriority w:val="99"/>
     <w:pPr>
       <w:pBdr/>
@@ -13261,9 +13263,9 @@
       </w:tcPr>
     </w:tblStylePr>
   </w:style>
-  <w:style w:type="table" w:styleId="765">
+  <w:style w:type="table" w:styleId="722">
     <w:name w:val="Grid Table 2"/>
-    <w:basedOn w:val="896"/>
+    <w:basedOn w:val="853"/>
     <w:uiPriority w:val="99"/>
     <w:pPr>
       <w:pBdr/>
@@ -13493,9 +13495,9 @@
       </w:tcPr>
     </w:tblStylePr>
   </w:style>
-  <w:style w:type="table" w:styleId="766">
+  <w:style w:type="table" w:styleId="723">
     <w:name w:val="Grid Table 2 - Accent 1"/>
-    <w:basedOn w:val="896"/>
+    <w:basedOn w:val="853"/>
     <w:uiPriority w:val="99"/>
     <w:pPr>
       <w:pBdr/>
@@ -13725,9 +13727,9 @@
       </w:tcPr>
     </w:tblStylePr>
   </w:style>
-  <w:style w:type="table" w:styleId="767">
+  <w:style w:type="table" w:styleId="724">
     <w:name w:val="Grid Table 2 - Accent 2"/>
-    <w:basedOn w:val="896"/>
+    <w:basedOn w:val="853"/>
     <w:uiPriority w:val="99"/>
     <w:pPr>
       <w:pBdr/>
@@ -13957,9 +13959,9 @@
       </w:tcPr>
     </w:tblStylePr>
   </w:style>
-  <w:style w:type="table" w:styleId="768">
+  <w:style w:type="table" w:styleId="725">
     <w:name w:val="Grid Table 2 - Accent 3"/>
-    <w:basedOn w:val="896"/>
+    <w:basedOn w:val="853"/>
     <w:uiPriority w:val="99"/>
     <w:pPr>
       <w:pBdr/>
@@ -14189,9 +14191,9 @@
       </w:tcPr>
     </w:tblStylePr>
   </w:style>
-  <w:style w:type="table" w:styleId="769">
+  <w:style w:type="table" w:styleId="726">
     <w:name w:val="Grid Table 2 - Accent 4"/>
-    <w:basedOn w:val="896"/>
+    <w:basedOn w:val="853"/>
     <w:uiPriority w:val="99"/>
     <w:pPr>
       <w:pBdr/>
@@ -14421,9 +14423,9 @@
       </w:tcPr>
     </w:tblStylePr>
   </w:style>
-  <w:style w:type="table" w:styleId="770">
+  <w:style w:type="table" w:styleId="727">
     <w:name w:val="Grid Table 2 - Accent 5"/>
-    <w:basedOn w:val="896"/>
+    <w:basedOn w:val="853"/>
     <w:uiPriority w:val="99"/>
     <w:pPr>
       <w:pBdr/>
@@ -14653,9 +14655,9 @@
       </w:tcPr>
     </w:tblStylePr>
   </w:style>
-  <w:style w:type="table" w:styleId="771">
+  <w:style w:type="table" w:styleId="728">
     <w:name w:val="Grid Table 2 - Accent 6"/>
-    <w:basedOn w:val="896"/>
+    <w:basedOn w:val="853"/>
     <w:uiPriority w:val="99"/>
     <w:pPr>
       <w:pBdr/>
@@ -14885,9 +14887,9 @@
       </w:tcPr>
     </w:tblStylePr>
   </w:style>
-  <w:style w:type="table" w:styleId="772">
+  <w:style w:type="table" w:styleId="729">
     <w:name w:val="Grid Table 3"/>
-    <w:basedOn w:val="896"/>
+    <w:basedOn w:val="853"/>
     <w:uiPriority w:val="99"/>
     <w:pPr>
       <w:pBdr/>
@@ -15130,9 +15132,9 @@
       </w:tcPr>
     </w:tblStylePr>
   </w:style>
-  <w:style w:type="table" w:styleId="773">
+  <w:style w:type="table" w:styleId="730">
     <w:name w:val="Grid Table 3 - Accent 1"/>
-    <w:basedOn w:val="896"/>
+    <w:basedOn w:val="853"/>
     <w:uiPriority w:val="99"/>
     <w:pPr>
       <w:pBdr/>
@@ -15375,9 +15377,9 @@
       </w:tcPr>
     </w:tblStylePr>
   </w:style>
-  <w:style w:type="table" w:styleId="774">
+  <w:style w:type="table" w:styleId="731">
     <w:name w:val="Grid Table 3 - Accent 2"/>
-    <w:basedOn w:val="896"/>
+    <w:basedOn w:val="853"/>
     <w:uiPriority w:val="99"/>
     <w:pPr>
       <w:pBdr/>
@@ -15620,9 +15622,9 @@
       </w:tcPr>
     </w:tblStylePr>
   </w:style>
-  <w:style w:type="table" w:styleId="775">
+  <w:style w:type="table" w:styleId="732">
     <w:name w:val="Grid Table 3 - Accent 3"/>
-    <w:basedOn w:val="896"/>
+    <w:basedOn w:val="853"/>
     <w:uiPriority w:val="99"/>
     <w:pPr>
       <w:pBdr/>
@@ -15865,9 +15867,9 @@
       </w:tcPr>
     </w:tblStylePr>
   </w:style>
-  <w:style w:type="table" w:styleId="776">
+  <w:style w:type="table" w:styleId="733">
     <w:name w:val="Grid Table 3 - Accent 4"/>
-    <w:basedOn w:val="896"/>
+    <w:basedOn w:val="853"/>
     <w:uiPriority w:val="99"/>
     <w:pPr>
       <w:pBdr/>
@@ -16110,9 +16112,9 @@
       </w:tcPr>
     </w:tblStylePr>
   </w:style>
-  <w:style w:type="table" w:styleId="777">
+  <w:style w:type="table" w:styleId="734">
     <w:name w:val="Grid Table 3 - Accent 5"/>
-    <w:basedOn w:val="896"/>
+    <w:basedOn w:val="853"/>
     <w:uiPriority w:val="99"/>
     <w:pPr>
       <w:pBdr/>
@@ -16355,9 +16357,9 @@
       </w:tcPr>
     </w:tblStylePr>
   </w:style>
-  <w:style w:type="table" w:styleId="778">
+  <w:style w:type="table" w:styleId="735">
     <w:name w:val="Grid Table 3 - Accent 6"/>
-    <w:basedOn w:val="896"/>
+    <w:basedOn w:val="853"/>
     <w:uiPriority w:val="99"/>
     <w:pPr>
       <w:pBdr/>
@@ -16600,9 +16602,9 @@
       </w:tcPr>
     </w:tblStylePr>
   </w:style>
-  <w:style w:type="table" w:styleId="779">
+  <w:style w:type="table" w:styleId="736">
     <w:name w:val="Grid Table 4"/>
-    <w:basedOn w:val="896"/>
+    <w:basedOn w:val="853"/>
     <w:uiPriority w:val="59"/>
     <w:pPr>
       <w:pBdr/>
@@ -16833,9 +16835,9 @@
       </w:tcPr>
     </w:tblStylePr>
   </w:style>
-  <w:style w:type="table" w:styleId="780">
+  <w:style w:type="table" w:styleId="737">
     <w:name w:val="Grid Table 4 - Accent 1"/>
-    <w:basedOn w:val="896"/>
+    <w:basedOn w:val="853"/>
     <w:uiPriority w:val="59"/>
     <w:pPr>
       <w:pBdr/>
@@ -17066,9 +17068,9 @@
       </w:tcPr>
     </w:tblStylePr>
   </w:style>
-  <w:style w:type="table" w:styleId="781">
+  <w:style w:type="table" w:styleId="738">
     <w:name w:val="Grid Table 4 - Accent 2"/>
-    <w:basedOn w:val="896"/>
+    <w:basedOn w:val="853"/>
     <w:uiPriority w:val="59"/>
     <w:pPr>
       <w:pBdr/>
@@ -17299,9 +17301,9 @@
       </w:tcPr>
     </w:tblStylePr>
   </w:style>
-  <w:style w:type="table" w:styleId="782">
+  <w:style w:type="table" w:styleId="739">
     <w:name w:val="Grid Table 4 - Accent 3"/>
-    <w:basedOn w:val="896"/>
+    <w:basedOn w:val="853"/>
     <w:uiPriority w:val="59"/>
     <w:pPr>
       <w:pBdr/>
@@ -17532,9 +17534,9 @@
       </w:tcPr>
     </w:tblStylePr>
   </w:style>
-  <w:style w:type="table" w:styleId="783">
+  <w:style w:type="table" w:styleId="740">
     <w:name w:val="Grid Table 4 - Accent 4"/>
-    <w:basedOn w:val="896"/>
+    <w:basedOn w:val="853"/>
     <w:uiPriority w:val="59"/>
     <w:pPr>
       <w:pBdr/>
@@ -17765,9 +17767,9 @@
       </w:tcPr>
     </w:tblStylePr>
   </w:style>
-  <w:style w:type="table" w:styleId="784">
+  <w:style w:type="table" w:styleId="741">
     <w:name w:val="Grid Table 4 - Accent 5"/>
-    <w:basedOn w:val="896"/>
+    <w:basedOn w:val="853"/>
     <w:uiPriority w:val="59"/>
     <w:pPr>
       <w:pBdr/>
@@ -17998,9 +18000,9 @@
       </w:tcPr>
     </w:tblStylePr>
   </w:style>
-  <w:style w:type="table" w:styleId="785">
+  <w:style w:type="table" w:styleId="742">
     <w:name w:val="Grid Table 4 - Accent 6"/>
-    <w:basedOn w:val="896"/>
+    <w:basedOn w:val="853"/>
     <w:uiPriority w:val="59"/>
     <w:pPr>
       <w:pBdr/>
@@ -18231,9 +18233,9 @@
       </w:tcPr>
     </w:tblStylePr>
   </w:style>
-  <w:style w:type="table" w:styleId="786">
+  <w:style w:type="table" w:styleId="743">
     <w:name w:val="Grid Table 5 Dark"/>
-    <w:basedOn w:val="896"/>
+    <w:basedOn w:val="853"/>
     <w:uiPriority w:val="99"/>
     <w:pPr>
       <w:pBdr/>
@@ -18459,9 +18461,9 @@
       </w:tcPr>
     </w:tblStylePr>
   </w:style>
-  <w:style w:type="table" w:styleId="787">
+  <w:style w:type="table" w:styleId="744">
     <w:name w:val="Grid Table 5 Dark- Accent 1"/>
-    <w:basedOn w:val="896"/>
+    <w:basedOn w:val="853"/>
     <w:uiPriority w:val="99"/>
     <w:pPr>
       <w:pBdr/>
@@ -18687,9 +18689,9 @@
       </w:tcPr>
     </w:tblStylePr>
   </w:style>
-  <w:style w:type="table" w:styleId="788">
+  <w:style w:type="table" w:styleId="745">
     <w:name w:val="Grid Table 5 Dark - Accent 2"/>
-    <w:basedOn w:val="896"/>
+    <w:basedOn w:val="853"/>
     <w:uiPriority w:val="99"/>
     <w:pPr>
       <w:pBdr/>
@@ -18915,9 +18917,9 @@
       </w:tcPr>
     </w:tblStylePr>
   </w:style>
-  <w:style w:type="table" w:styleId="789">
+  <w:style w:type="table" w:styleId="746">
     <w:name w:val="Grid Table 5 Dark - Accent 3"/>
-    <w:basedOn w:val="896"/>
+    <w:basedOn w:val="853"/>
     <w:uiPriority w:val="99"/>
     <w:pPr>
       <w:pBdr/>
@@ -19143,9 +19145,9 @@
       </w:tcPr>
     </w:tblStylePr>
   </w:style>
-  <w:style w:type="table" w:styleId="790">
+  <w:style w:type="table" w:styleId="747">
     <w:name w:val="Grid Table 5 Dark- Accent 4"/>
-    <w:basedOn w:val="896"/>
+    <w:basedOn w:val="853"/>
     <w:uiPriority w:val="99"/>
     <w:pPr>
       <w:pBdr/>
@@ -19371,9 +19373,9 @@
       </w:tcPr>
     </w:tblStylePr>
   </w:style>
-  <w:style w:type="table" w:styleId="791">
+  <w:style w:type="table" w:styleId="748">
     <w:name w:val="Grid Table 5 Dark - Accent 5"/>
-    <w:basedOn w:val="896"/>
+    <w:basedOn w:val="853"/>
     <w:uiPriority w:val="99"/>
     <w:pPr>
       <w:pBdr/>
@@ -19599,9 +19601,9 @@
       </w:tcPr>
     </w:tblStylePr>
   </w:style>
-  <w:style w:type="table" w:styleId="792">
+  <w:style w:type="table" w:styleId="749">
     <w:name w:val="Grid Table 5 Dark - Accent 6"/>
-    <w:basedOn w:val="896"/>
+    <w:basedOn w:val="853"/>
     <w:uiPriority w:val="99"/>
     <w:pPr>
       <w:pBdr/>
@@ -19827,9 +19829,9 @@
       </w:tcPr>
     </w:tblStylePr>
   </w:style>
-  <w:style w:type="table" w:styleId="793">
+  <w:style w:type="table" w:styleId="750">
     <w:name w:val="Grid Table 6 Colorful"/>
-    <w:basedOn w:val="896"/>
+    <w:basedOn w:val="853"/>
     <w:uiPriority w:val="99"/>
     <w:pPr>
       <w:pBdr/>
@@ -20057,9 +20059,9 @@
       </w:tcPr>
     </w:tblStylePr>
   </w:style>
-  <w:style w:type="table" w:styleId="794">
+  <w:style w:type="table" w:styleId="751">
     <w:name w:val="Grid Table 6 Colorful - Accent 1"/>
-    <w:basedOn w:val="896"/>
+    <w:basedOn w:val="853"/>
     <w:uiPriority w:val="99"/>
     <w:pPr>
       <w:pBdr/>
@@ -20287,9 +20289,9 @@
       </w:tcPr>
     </w:tblStylePr>
   </w:style>
-  <w:style w:type="table" w:styleId="795">
+  <w:style w:type="table" w:styleId="752">
     <w:name w:val="Grid Table 6 Colorful - Accent 2"/>
-    <w:basedOn w:val="896"/>
+    <w:basedOn w:val="853"/>
     <w:uiPriority w:val="99"/>
     <w:pPr>
       <w:pBdr/>
@@ -20517,9 +20519,9 @@
       </w:tcPr>
     </w:tblStylePr>
   </w:style>
-  <w:style w:type="table" w:styleId="796">
+  <w:style w:type="table" w:styleId="753">
     <w:name w:val="Grid Table 6 Colorful - Accent 3"/>
-    <w:basedOn w:val="896"/>
+    <w:basedOn w:val="853"/>
     <w:uiPriority w:val="99"/>
     <w:pPr>
       <w:pBdr/>
@@ -20747,9 +20749,9 @@
       </w:tcPr>
     </w:tblStylePr>
   </w:style>
-  <w:style w:type="table" w:styleId="797">
+  <w:style w:type="table" w:styleId="754">
     <w:name w:val="Grid Table 6 Colorful - Accent 4"/>
-    <w:basedOn w:val="896"/>
+    <w:basedOn w:val="853"/>
     <w:uiPriority w:val="99"/>
     <w:pPr>
       <w:pBdr/>
@@ -20977,9 +20979,9 @@
       </w:tcPr>
     </w:tblStylePr>
   </w:style>
-  <w:style w:type="table" w:styleId="798">
+  <w:style w:type="table" w:styleId="755">
     <w:name w:val="Grid Table 6 Colorful - Accent 5"/>
-    <w:basedOn w:val="896"/>
+    <w:basedOn w:val="853"/>
     <w:uiPriority w:val="99"/>
     <w:pPr>
       <w:pBdr/>
@@ -21207,9 +21209,9 @@
       </w:tcPr>
     </w:tblStylePr>
   </w:style>
-  <w:style w:type="table" w:styleId="799">
+  <w:style w:type="table" w:styleId="756">
     <w:name w:val="Grid Table 6 Colorful - Accent 6"/>
-    <w:basedOn w:val="896"/>
+    <w:basedOn w:val="853"/>
     <w:uiPriority w:val="99"/>
     <w:pPr>
       <w:pBdr/>
@@ -21437,9 +21439,9 @@
       </w:tcPr>
     </w:tblStylePr>
   </w:style>
-  <w:style w:type="table" w:styleId="800">
+  <w:style w:type="table" w:styleId="757">
     <w:name w:val="Grid Table 7 Colorful"/>
-    <w:basedOn w:val="896"/>
+    <w:basedOn w:val="853"/>
     <w:uiPriority w:val="99"/>
     <w:pPr>
       <w:pBdr/>
@@ -21691,9 +21693,9 @@
       </w:tcPr>
     </w:tblStylePr>
   </w:style>
-  <w:style w:type="table" w:styleId="801">
+  <w:style w:type="table" w:styleId="758">
     <w:name w:val="Grid Table 7 Colorful - Accent 1"/>
-    <w:basedOn w:val="896"/>
+    <w:basedOn w:val="853"/>
     <w:uiPriority w:val="99"/>
     <w:pPr>
       <w:pBdr/>
@@ -21945,9 +21947,9 @@
       </w:tcPr>
     </w:tblStylePr>
   </w:style>
-  <w:style w:type="table" w:styleId="802">
+  <w:style w:type="table" w:styleId="759">
     <w:name w:val="Grid Table 7 Colorful - Accent 2"/>
-    <w:basedOn w:val="896"/>
+    <w:basedOn w:val="853"/>
     <w:uiPriority w:val="99"/>
     <w:pPr>
       <w:pBdr/>
@@ -22199,9 +22201,9 @@
       </w:tcPr>
     </w:tblStylePr>
   </w:style>
-  <w:style w:type="table" w:styleId="803">
+  <w:style w:type="table" w:styleId="760">
     <w:name w:val="Grid Table 7 Colorful - Accent 3"/>
-    <w:basedOn w:val="896"/>
+    <w:basedOn w:val="853"/>
     <w:uiPriority w:val="99"/>
     <w:pPr>
       <w:pBdr/>
@@ -22453,9 +22455,9 @@
       </w:tcPr>
     </w:tblStylePr>
   </w:style>
-  <w:style w:type="table" w:styleId="804">
+  <w:style w:type="table" w:styleId="761">
     <w:name w:val="Grid Table 7 Colorful - Accent 4"/>
-    <w:basedOn w:val="896"/>
+    <w:basedOn w:val="853"/>
     <w:uiPriority w:val="99"/>
     <w:pPr>
       <w:pBdr/>
@@ -22707,9 +22709,9 @@
       </w:tcPr>
     </w:tblStylePr>
   </w:style>
-  <w:style w:type="table" w:styleId="805">
+  <w:style w:type="table" w:styleId="762">
     <w:name w:val="Grid Table 7 Colorful - Accent 5"/>
-    <w:basedOn w:val="896"/>
+    <w:basedOn w:val="853"/>
     <w:uiPriority w:val="99"/>
     <w:pPr>
       <w:pBdr/>
@@ -22961,9 +22963,9 @@
       </w:tcPr>
     </w:tblStylePr>
   </w:style>
-  <w:style w:type="table" w:styleId="806">
+  <w:style w:type="table" w:styleId="763">
     <w:name w:val="Grid Table 7 Colorful - Accent 6"/>
-    <w:basedOn w:val="896"/>
+    <w:basedOn w:val="853"/>
     <w:uiPriority w:val="99"/>
     <w:pPr>
       <w:pBdr/>
@@ -23215,9 +23217,9 @@
       </w:tcPr>
     </w:tblStylePr>
   </w:style>
-  <w:style w:type="table" w:styleId="807">
+  <w:style w:type="table" w:styleId="764">
     <w:name w:val="List Table 1 Light"/>
-    <w:basedOn w:val="896"/>
+    <w:basedOn w:val="853"/>
     <w:uiPriority w:val="99"/>
     <w:pPr>
       <w:pBdr/>
@@ -23431,9 +23433,9 @@
       </w:tcPr>
     </w:tblStylePr>
   </w:style>
-  <w:style w:type="table" w:styleId="808">
+  <w:style w:type="table" w:styleId="765">
     <w:name w:val="List Table 1 Light - Accent 1"/>
-    <w:basedOn w:val="896"/>
+    <w:basedOn w:val="853"/>
     <w:uiPriority w:val="99"/>
     <w:pPr>
       <w:pBdr/>
@@ -23647,9 +23649,9 @@
       </w:tcPr>
     </w:tblStylePr>
   </w:style>
-  <w:style w:type="table" w:styleId="809">
+  <w:style w:type="table" w:styleId="766">
     <w:name w:val="List Table 1 Light - Accent 2"/>
-    <w:basedOn w:val="896"/>
+    <w:basedOn w:val="853"/>
     <w:uiPriority w:val="99"/>
     <w:pPr>
       <w:pBdr/>
@@ -23863,9 +23865,9 @@
       </w:tcPr>
     </w:tblStylePr>
   </w:style>
-  <w:style w:type="table" w:styleId="810">
+  <w:style w:type="table" w:styleId="767">
     <w:name w:val="List Table 1 Light - Accent 3"/>
-    <w:basedOn w:val="896"/>
+    <w:basedOn w:val="853"/>
     <w:uiPriority w:val="99"/>
     <w:pPr>
       <w:pBdr/>
@@ -24079,9 +24081,9 @@
       </w:tcPr>
     </w:tblStylePr>
   </w:style>
-  <w:style w:type="table" w:styleId="811">
+  <w:style w:type="table" w:styleId="768">
     <w:name w:val="List Table 1 Light - Accent 4"/>
-    <w:basedOn w:val="896"/>
+    <w:basedOn w:val="853"/>
     <w:uiPriority w:val="99"/>
     <w:pPr>
       <w:pBdr/>
@@ -24295,9 +24297,9 @@
       </w:tcPr>
     </w:tblStylePr>
   </w:style>
-  <w:style w:type="table" w:styleId="812">
+  <w:style w:type="table" w:styleId="769">
     <w:name w:val="List Table 1 Light - Accent 5"/>
-    <w:basedOn w:val="896"/>
+    <w:basedOn w:val="853"/>
     <w:uiPriority w:val="99"/>
     <w:pPr>
       <w:pBdr/>
@@ -24511,9 +24513,9 @@
       </w:tcPr>
     </w:tblStylePr>
   </w:style>
-  <w:style w:type="table" w:styleId="813">
+  <w:style w:type="table" w:styleId="770">
     <w:name w:val="List Table 1 Light - Accent 6"/>
-    <w:basedOn w:val="896"/>
+    <w:basedOn w:val="853"/>
     <w:uiPriority w:val="99"/>
     <w:pPr>
       <w:pBdr/>
@@ -24727,9 +24729,9 @@
       </w:tcPr>
     </w:tblStylePr>
   </w:style>
-  <w:style w:type="table" w:styleId="814">
+  <w:style w:type="table" w:styleId="771">
     <w:name w:val="List Table 2"/>
-    <w:basedOn w:val="896"/>
+    <w:basedOn w:val="853"/>
     <w:uiPriority w:val="99"/>
     <w:pPr>
       <w:pBdr/>
@@ -24965,9 +24967,9 @@
       </w:tcPr>
     </w:tblStylePr>
   </w:style>
-  <w:style w:type="table" w:styleId="815">
+  <w:style w:type="table" w:styleId="772">
     <w:name w:val="List Table 2 - Accent 1"/>
-    <w:basedOn w:val="896"/>
+    <w:basedOn w:val="853"/>
     <w:uiPriority w:val="99"/>
     <w:pPr>
       <w:pBdr/>
@@ -25203,9 +25205,9 @@
       </w:tcPr>
     </w:tblStylePr>
   </w:style>
-  <w:style w:type="table" w:styleId="816">
+  <w:style w:type="table" w:styleId="773">
     <w:name w:val="List Table 2 - Accent 2"/>
-    <w:basedOn w:val="896"/>
+    <w:basedOn w:val="853"/>
     <w:uiPriority w:val="99"/>
     <w:pPr>
       <w:pBdr/>
@@ -25441,9 +25443,9 @@
       </w:tcPr>
     </w:tblStylePr>
   </w:style>
-  <w:style w:type="table" w:styleId="817">
+  <w:style w:type="table" w:styleId="774">
     <w:name w:val="List Table 2 - Accent 3"/>
-    <w:basedOn w:val="896"/>
+    <w:basedOn w:val="853"/>
     <w:uiPriority w:val="99"/>
     <w:pPr>
       <w:pBdr/>
@@ -25679,9 +25681,9 @@
       </w:tcPr>
     </w:tblStylePr>
   </w:style>
-  <w:style w:type="table" w:styleId="818">
+  <w:style w:type="table" w:styleId="775">
     <w:name w:val="List Table 2 - Accent 4"/>
-    <w:basedOn w:val="896"/>
+    <w:basedOn w:val="853"/>
     <w:uiPriority w:val="99"/>
     <w:pPr>
       <w:pBdr/>
@@ -25917,9 +25919,9 @@
       </w:tcPr>
     </w:tblStylePr>
   </w:style>
-  <w:style w:type="table" w:styleId="819">
+  <w:style w:type="table" w:styleId="776">
     <w:name w:val="List Table 2 - Accent 5"/>
-    <w:basedOn w:val="896"/>
+    <w:basedOn w:val="853"/>
     <w:uiPriority w:val="99"/>
     <w:pPr>
       <w:pBdr/>
@@ -26155,9 +26157,9 @@
       </w:tcPr>
     </w:tblStylePr>
   </w:style>
-  <w:style w:type="table" w:styleId="820">
+  <w:style w:type="table" w:styleId="777">
     <w:name w:val="List Table 2 - Accent 6"/>
-    <w:basedOn w:val="896"/>
+    <w:basedOn w:val="853"/>
     <w:uiPriority w:val="99"/>
     <w:pPr>
       <w:pBdr/>
@@ -26393,9 +26395,9 @@
       </w:tcPr>
     </w:tblStylePr>
   </w:style>
-  <w:style w:type="table" w:styleId="821">
+  <w:style w:type="table" w:styleId="778">
     <w:name w:val="List Table 3"/>
-    <w:basedOn w:val="896"/>
+    <w:basedOn w:val="853"/>
     <w:uiPriority w:val="99"/>
     <w:pPr>
       <w:pBdr/>
@@ -26621,9 +26623,9 @@
       </w:tcPr>
     </w:tblStylePr>
   </w:style>
-  <w:style w:type="table" w:styleId="822">
+  <w:style w:type="table" w:styleId="779">
     <w:name w:val="List Table 3 - Accent 1"/>
-    <w:basedOn w:val="896"/>
+    <w:basedOn w:val="853"/>
     <w:uiPriority w:val="99"/>
     <w:pPr>
       <w:pBdr/>
@@ -26849,9 +26851,9 @@
       </w:tcPr>
     </w:tblStylePr>
   </w:style>
-  <w:style w:type="table" w:styleId="823">
+  <w:style w:type="table" w:styleId="780">
     <w:name w:val="List Table 3 - Accent 2"/>
-    <w:basedOn w:val="896"/>
+    <w:basedOn w:val="853"/>
     <w:uiPriority w:val="99"/>
     <w:pPr>
       <w:pBdr/>
@@ -27077,9 +27079,9 @@
       </w:tcPr>
     </w:tblStylePr>
   </w:style>
-  <w:style w:type="table" w:styleId="824">
+  <w:style w:type="table" w:styleId="781">
     <w:name w:val="List Table 3 - Accent 3"/>
-    <w:basedOn w:val="896"/>
+    <w:basedOn w:val="853"/>
     <w:uiPriority w:val="99"/>
     <w:pPr>
       <w:pBdr/>
@@ -27305,9 +27307,9 @@
       </w:tcPr>
     </w:tblStylePr>
   </w:style>
-  <w:style w:type="table" w:styleId="825">
+  <w:style w:type="table" w:styleId="782">
     <w:name w:val="List Table 3 - Accent 4"/>
-    <w:basedOn w:val="896"/>
+    <w:basedOn w:val="853"/>
     <w:uiPriority w:val="99"/>
     <w:pPr>
       <w:pBdr/>
@@ -27533,9 +27535,9 @@
       </w:tcPr>
     </w:tblStylePr>
   </w:style>
-  <w:style w:type="table" w:styleId="826">
+  <w:style w:type="table" w:styleId="783">
     <w:name w:val="List Table 3 - Accent 5"/>
-    <w:basedOn w:val="896"/>
+    <w:basedOn w:val="853"/>
     <w:uiPriority w:val="99"/>
     <w:pPr>
       <w:pBdr/>
@@ -27761,9 +27763,9 @@
       </w:tcPr>
     </w:tblStylePr>
   </w:style>
-  <w:style w:type="table" w:styleId="827">
+  <w:style w:type="table" w:styleId="784">
     <w:name w:val="List Table 3 - Accent 6"/>
-    <w:basedOn w:val="896"/>
+    <w:basedOn w:val="853"/>
     <w:uiPriority w:val="99"/>
     <w:pPr>
       <w:pBdr/>
@@ -27989,9 +27991,9 @@
       </w:tcPr>
     </w:tblStylePr>
   </w:style>
-  <w:style w:type="table" w:styleId="828">
+  <w:style w:type="table" w:styleId="785">
     <w:name w:val="List Table 4"/>
-    <w:basedOn w:val="896"/>
+    <w:basedOn w:val="853"/>
     <w:uiPriority w:val="99"/>
     <w:pPr>
       <w:pBdr/>
@@ -28214,9 +28216,9 @@
       </w:tcPr>
     </w:tblStylePr>
   </w:style>
-  <w:style w:type="table" w:styleId="829">
+  <w:style w:type="table" w:styleId="786">
     <w:name w:val="List Table 4 - Accent 1"/>
-    <w:basedOn w:val="896"/>
+    <w:basedOn w:val="853"/>
     <w:uiPriority w:val="99"/>
     <w:pPr>
       <w:pBdr/>
@@ -28439,9 +28441,9 @@
       </w:tcPr>
     </w:tblStylePr>
   </w:style>
-  <w:style w:type="table" w:styleId="830">
+  <w:style w:type="table" w:styleId="787">
     <w:name w:val="List Table 4 - Accent 2"/>
-    <w:basedOn w:val="896"/>
+    <w:basedOn w:val="853"/>
     <w:uiPriority w:val="99"/>
     <w:pPr>
       <w:pBdr/>
@@ -28664,9 +28666,9 @@
       </w:tcPr>
     </w:tblStylePr>
   </w:style>
-  <w:style w:type="table" w:styleId="831">
+  <w:style w:type="table" w:styleId="788">
     <w:name w:val="List Table 4 - Accent 3"/>
-    <w:basedOn w:val="896"/>
+    <w:basedOn w:val="853"/>
     <w:uiPriority w:val="99"/>
     <w:pPr>
       <w:pBdr/>
@@ -28889,9 +28891,9 @@
       </w:tcPr>
     </w:tblStylePr>
   </w:style>
-  <w:style w:type="table" w:styleId="832">
+  <w:style w:type="table" w:styleId="789">
     <w:name w:val="List Table 4 - Accent 4"/>
-    <w:basedOn w:val="896"/>
+    <w:basedOn w:val="853"/>
     <w:uiPriority w:val="99"/>
     <w:pPr>
       <w:pBdr/>
@@ -29114,9 +29116,9 @@
       </w:tcPr>
     </w:tblStylePr>
   </w:style>
-  <w:style w:type="table" w:styleId="833">
+  <w:style w:type="table" w:styleId="790">
     <w:name w:val="List Table 4 - Accent 5"/>
-    <w:basedOn w:val="896"/>
+    <w:basedOn w:val="853"/>
     <w:uiPriority w:val="99"/>
     <w:pPr>
       <w:pBdr/>
@@ -29339,9 +29341,9 @@
       </w:tcPr>
     </w:tblStylePr>
   </w:style>
-  <w:style w:type="table" w:styleId="834">
+  <w:style w:type="table" w:styleId="791">
     <w:name w:val="List Table 4 - Accent 6"/>
-    <w:basedOn w:val="896"/>
+    <w:basedOn w:val="853"/>
     <w:uiPriority w:val="99"/>
     <w:pPr>
       <w:pBdr/>
@@ -29564,9 +29566,9 @@
       </w:tcPr>
     </w:tblStylePr>
   </w:style>
-  <w:style w:type="table" w:styleId="835">
+  <w:style w:type="table" w:styleId="792">
     <w:name w:val="List Table 5 Dark"/>
-    <w:basedOn w:val="896"/>
+    <w:basedOn w:val="853"/>
     <w:uiPriority w:val="99"/>
     <w:pPr>
       <w:pBdr/>
@@ -29806,9 +29808,9 @@
       </w:tcPr>
     </w:tblStylePr>
   </w:style>
-  <w:style w:type="table" w:styleId="836">
+  <w:style w:type="table" w:styleId="793">
     <w:name w:val="List Table 5 Dark - Accent 1"/>
-    <w:basedOn w:val="896"/>
+    <w:basedOn w:val="853"/>
     <w:uiPriority w:val="99"/>
     <w:pPr>
       <w:pBdr/>
@@ -30048,9 +30050,9 @@
       </w:tcPr>
     </w:tblStylePr>
   </w:style>
-  <w:style w:type="table" w:styleId="837">
+  <w:style w:type="table" w:styleId="794">
     <w:name w:val="List Table 5 Dark - Accent 2"/>
-    <w:basedOn w:val="896"/>
+    <w:basedOn w:val="853"/>
     <w:uiPriority w:val="99"/>
     <w:pPr>
       <w:pBdr/>
@@ -30290,9 +30292,9 @@
       </w:tcPr>
     </w:tblStylePr>
   </w:style>
-  <w:style w:type="table" w:styleId="838">
+  <w:style w:type="table" w:styleId="795">
     <w:name w:val="List Table 5 Dark - Accent 3"/>
-    <w:basedOn w:val="896"/>
+    <w:basedOn w:val="853"/>
     <w:uiPriority w:val="99"/>
     <w:pPr>
       <w:pBdr/>
@@ -30532,9 +30534,9 @@
       </w:tcPr>
     </w:tblStylePr>
   </w:style>
-  <w:style w:type="table" w:styleId="839">
+  <w:style w:type="table" w:styleId="796">
     <w:name w:val="List Table 5 Dark - Accent 4"/>
-    <w:basedOn w:val="896"/>
+    <w:basedOn w:val="853"/>
     <w:uiPriority w:val="99"/>
     <w:pPr>
       <w:pBdr/>
@@ -30774,9 +30776,9 @@
       </w:tcPr>
     </w:tblStylePr>
   </w:style>
-  <w:style w:type="table" w:styleId="840">
+  <w:style w:type="table" w:styleId="797">
     <w:name w:val="List Table 5 Dark - Accent 5"/>
-    <w:basedOn w:val="896"/>
+    <w:basedOn w:val="853"/>
     <w:uiPriority w:val="99"/>
     <w:pPr>
       <w:pBdr/>
@@ -31016,9 +31018,9 @@
       </w:tcPr>
     </w:tblStylePr>
   </w:style>
-  <w:style w:type="table" w:styleId="841">
+  <w:style w:type="table" w:styleId="798">
     <w:name w:val="List Table 5 Dark - Accent 6"/>
-    <w:basedOn w:val="896"/>
+    <w:basedOn w:val="853"/>
     <w:uiPriority w:val="99"/>
     <w:pPr>
       <w:pBdr/>
@@ -31258,9 +31260,9 @@
       </w:tcPr>
     </w:tblStylePr>
   </w:style>
-  <w:style w:type="table" w:styleId="842">
+  <w:style w:type="table" w:styleId="799">
     <w:name w:val="List Table 6 Colorful"/>
-    <w:basedOn w:val="896"/>
+    <w:basedOn w:val="853"/>
     <w:uiPriority w:val="99"/>
     <w:pPr>
       <w:pBdr/>
@@ -31481,9 +31483,9 @@
       </w:tcPr>
     </w:tblStylePr>
   </w:style>
-  <w:style w:type="table" w:styleId="843">
+  <w:style w:type="table" w:styleId="800">
     <w:name w:val="List Table 6 Colorful - Accent 1"/>
-    <w:basedOn w:val="896"/>
+    <w:basedOn w:val="853"/>
     <w:uiPriority w:val="99"/>
     <w:pPr>
       <w:pBdr/>
@@ -31704,9 +31706,9 @@
       </w:tcPr>
     </w:tblStylePr>
   </w:style>
-  <w:style w:type="table" w:styleId="844">
+  <w:style w:type="table" w:styleId="801">
     <w:name w:val="List Table 6 Colorful - Accent 2"/>
-    <w:basedOn w:val="896"/>
+    <w:basedOn w:val="853"/>
     <w:uiPriority w:val="99"/>
     <w:pPr>
       <w:pBdr/>
@@ -31927,9 +31929,9 @@
       </w:tcPr>
     </w:tblStylePr>
   </w:style>
-  <w:style w:type="table" w:styleId="845">
+  <w:style w:type="table" w:styleId="802">
     <w:name w:val="List Table 6 Colorful - Accent 3"/>
-    <w:basedOn w:val="896"/>
+    <w:basedOn w:val="853"/>
     <w:uiPriority w:val="99"/>
     <w:pPr>
       <w:pBdr/>
@@ -32150,9 +32152,9 @@
       </w:tcPr>
     </w:tblStylePr>
   </w:style>
-  <w:style w:type="table" w:styleId="846">
+  <w:style w:type="table" w:styleId="803">
     <w:name w:val="List Table 6 Colorful - Accent 4"/>
-    <w:basedOn w:val="896"/>
+    <w:basedOn w:val="853"/>
     <w:uiPriority w:val="99"/>
     <w:pPr>
       <w:pBdr/>
@@ -32373,9 +32375,9 @@
       </w:tcPr>
     </w:tblStylePr>
   </w:style>
-  <w:style w:type="table" w:styleId="847">
+  <w:style w:type="table" w:styleId="804">
     <w:name w:val="List Table 6 Colorful - Accent 5"/>
-    <w:basedOn w:val="896"/>
+    <w:basedOn w:val="853"/>
     <w:uiPriority w:val="99"/>
     <w:pPr>
       <w:pBdr/>
@@ -32596,9 +32598,9 @@
       </w:tcPr>
     </w:tblStylePr>
   </w:style>
-  <w:style w:type="table" w:styleId="848">
+  <w:style w:type="table" w:styleId="805">
     <w:name w:val="List Table 6 Colorful - Accent 6"/>
-    <w:basedOn w:val="896"/>
+    <w:basedOn w:val="853"/>
     <w:uiPriority w:val="99"/>
     <w:pPr>
       <w:pBdr/>
@@ -32819,9 +32821,9 @@
       </w:tcPr>
     </w:tblStylePr>
   </w:style>
-  <w:style w:type="table" w:styleId="849">
+  <w:style w:type="table" w:styleId="806">
     <w:name w:val="List Table 7 Colorful"/>
-    <w:basedOn w:val="896"/>
+    <w:basedOn w:val="853"/>
     <w:uiPriority w:val="99"/>
     <w:pPr>
       <w:pBdr/>
@@ -33075,9 +33077,9 @@
       </w:tcPr>
     </w:tblStylePr>
   </w:style>
-  <w:style w:type="table" w:styleId="850">
+  <w:style w:type="table" w:styleId="807">
     <w:name w:val="List Table 7 Colorful - Accent 1"/>
-    <w:basedOn w:val="896"/>
+    <w:basedOn w:val="853"/>
     <w:uiPriority w:val="99"/>
     <w:pPr>
       <w:pBdr/>
@@ -33331,9 +33333,9 @@
       </w:tcPr>
     </w:tblStylePr>
   </w:style>
-  <w:style w:type="table" w:styleId="851">
+  <w:style w:type="table" w:styleId="808">
     <w:name w:val="List Table 7 Colorful - Accent 2"/>
-    <w:basedOn w:val="896"/>
+    <w:basedOn w:val="853"/>
     <w:uiPriority w:val="99"/>
     <w:pPr>
       <w:pBdr/>
@@ -33587,9 +33589,9 @@
       </w:tcPr>
     </w:tblStylePr>
   </w:style>
-  <w:style w:type="table" w:styleId="852">
+  <w:style w:type="table" w:styleId="809">
     <w:name w:val="List Table 7 Colorful - Accent 3"/>
-    <w:basedOn w:val="896"/>
+    <w:basedOn w:val="853"/>
     <w:uiPriority w:val="99"/>
     <w:pPr>
       <w:pBdr/>
@@ -33843,9 +33845,9 @@
       </w:tcPr>
     </w:tblStylePr>
   </w:style>
-  <w:style w:type="table" w:styleId="853">
+  <w:style w:type="table" w:styleId="810">
     <w:name w:val="List Table 7 Colorful - Accent 4"/>
-    <w:basedOn w:val="896"/>
+    <w:basedOn w:val="853"/>
     <w:uiPriority w:val="99"/>
     <w:pPr>
       <w:pBdr/>
@@ -34099,9 +34101,9 @@
       </w:tcPr>
     </w:tblStylePr>
   </w:style>
-  <w:style w:type="table" w:styleId="854">
+  <w:style w:type="table" w:styleId="811">
     <w:name w:val="List Table 7 Colorful - Accent 5"/>
-    <w:basedOn w:val="896"/>
+    <w:basedOn w:val="853"/>
     <w:uiPriority w:val="99"/>
     <w:pPr>
       <w:pBdr/>
@@ -34355,9 +34357,9 @@
       </w:tcPr>
     </w:tblStylePr>
   </w:style>
-  <w:style w:type="table" w:styleId="855">
+  <w:style w:type="table" w:styleId="812">
     <w:name w:val="List Table 7 Colorful - Accent 6"/>
-    <w:basedOn w:val="896"/>
+    <w:basedOn w:val="853"/>
     <w:uiPriority w:val="99"/>
     <w:pPr>
       <w:pBdr/>
@@ -34611,9 +34613,9 @@
       </w:tcPr>
     </w:tblStylePr>
   </w:style>
-  <w:style w:type="table" w:styleId="856">
+  <w:style w:type="table" w:styleId="813">
     <w:name w:val="Lined - Accent"/>
-    <w:basedOn w:val="896"/>
+    <w:basedOn w:val="853"/>
     <w:uiPriority w:val="99"/>
     <w:pPr>
       <w:pBdr/>
@@ -34848,9 +34850,9 @@
       </w:tcPr>
     </w:tblStylePr>
   </w:style>
-  <w:style w:type="table" w:styleId="857">
+  <w:style w:type="table" w:styleId="814">
     <w:name w:val="Lined - Accent 1"/>
-    <w:basedOn w:val="896"/>
+    <w:basedOn w:val="853"/>
     <w:uiPriority w:val="99"/>
     <w:pPr>
       <w:pBdr/>
@@ -35085,9 +35087,9 @@
       </w:tcPr>
     </w:tblStylePr>
   </w:style>
-  <w:style w:type="table" w:styleId="858">
+  <w:style w:type="table" w:styleId="815">
     <w:name w:val="Lined - Accent 2"/>
-    <w:basedOn w:val="896"/>
+    <w:basedOn w:val="853"/>
     <w:uiPriority w:val="99"/>
     <w:pPr>
       <w:pBdr/>
@@ -35322,9 +35324,9 @@
       </w:tcPr>
     </w:tblStylePr>
   </w:style>
-  <w:style w:type="table" w:styleId="859">
+  <w:style w:type="table" w:styleId="816">
     <w:name w:val="Lined - Accent 3"/>
-    <w:basedOn w:val="896"/>
+    <w:basedOn w:val="853"/>
     <w:uiPriority w:val="99"/>
     <w:pPr>
       <w:pBdr/>
@@ -35559,9 +35561,9 @@
       </w:tcPr>
     </w:tblStylePr>
   </w:style>
-  <w:style w:type="table" w:styleId="860">
+  <w:style w:type="table" w:styleId="817">
     <w:name w:val="Lined - Accent 4"/>
-    <w:basedOn w:val="896"/>
+    <w:basedOn w:val="853"/>
     <w:uiPriority w:val="99"/>
     <w:pPr>
       <w:pBdr/>
@@ -35796,9 +35798,9 @@
       </w:tcPr>
     </w:tblStylePr>
   </w:style>
-  <w:style w:type="table" w:styleId="861">
+  <w:style w:type="table" w:styleId="818">
     <w:name w:val="Lined - Accent 5"/>
-    <w:basedOn w:val="896"/>
+    <w:basedOn w:val="853"/>
     <w:uiPriority w:val="99"/>
     <w:pPr>
       <w:pBdr/>
@@ -36033,9 +36035,9 @@
       </w:tcPr>
     </w:tblStylePr>
   </w:style>
-  <w:style w:type="table" w:styleId="862">
+  <w:style w:type="table" w:styleId="819">
     <w:name w:val="Lined - Accent 6"/>
-    <w:basedOn w:val="896"/>
+    <w:basedOn w:val="853"/>
     <w:uiPriority w:val="99"/>
     <w:pPr>
       <w:pBdr/>
@@ -36270,9 +36272,9 @@
       </w:tcPr>
     </w:tblStylePr>
   </w:style>
-  <w:style w:type="table" w:styleId="863">
+  <w:style w:type="table" w:styleId="820">
     <w:name w:val="Bordered &amp; Lined - Accent"/>
-    <w:basedOn w:val="896"/>
+    <w:basedOn w:val="853"/>
     <w:uiPriority w:val="99"/>
     <w:pPr>
       <w:pBdr/>
@@ -36514,9 +36516,9 @@
       </w:tcPr>
     </w:tblStylePr>
   </w:style>
-  <w:style w:type="table" w:styleId="864">
+  <w:style w:type="table" w:styleId="821">
     <w:name w:val="Bordered &amp; Lined - Accent 1"/>
-    <w:basedOn w:val="896"/>
+    <w:basedOn w:val="853"/>
     <w:uiPriority w:val="99"/>
     <w:pPr>
       <w:pBdr/>
@@ -36758,9 +36760,9 @@
       </w:tcPr>
     </w:tblStylePr>
   </w:style>
-  <w:style w:type="table" w:styleId="865">
+  <w:style w:type="table" w:styleId="822">
     <w:name w:val="Bordered &amp; Lined - Accent 2"/>
-    <w:basedOn w:val="896"/>
+    <w:basedOn w:val="853"/>
     <w:uiPriority w:val="99"/>
     <w:pPr>
       <w:pBdr/>
@@ -37002,9 +37004,9 @@
       </w:tcPr>
     </w:tblStylePr>
   </w:style>
-  <w:style w:type="table" w:styleId="866">
+  <w:style w:type="table" w:styleId="823">
     <w:name w:val="Bordered &amp; Lined - Accent 3"/>
-    <w:basedOn w:val="896"/>
+    <w:basedOn w:val="853"/>
     <w:uiPriority w:val="99"/>
     <w:pPr>
       <w:pBdr/>
@@ -37246,9 +37248,9 @@
       </w:tcPr>
     </w:tblStylePr>
   </w:style>
-  <w:style w:type="table" w:styleId="867">
+  <w:style w:type="table" w:styleId="824">
     <w:name w:val="Bordered &amp; Lined - Accent 4"/>
-    <w:basedOn w:val="896"/>
+    <w:basedOn w:val="853"/>
     <w:uiPriority w:val="99"/>
     <w:pPr>
       <w:pBdr/>
@@ -37490,9 +37492,9 @@
       </w:tcPr>
     </w:tblStylePr>
   </w:style>
-  <w:style w:type="table" w:styleId="868">
+  <w:style w:type="table" w:styleId="825">
     <w:name w:val="Bordered &amp; Lined - Accent 5"/>
-    <w:basedOn w:val="896"/>
+    <w:basedOn w:val="853"/>
     <w:uiPriority w:val="99"/>
     <w:pPr>
       <w:pBdr/>
@@ -37734,9 +37736,9 @@
       </w:tcPr>
     </w:tblStylePr>
   </w:style>
-  <w:style w:type="table" w:styleId="869">
+  <w:style w:type="table" w:styleId="826">
     <w:name w:val="Bordered &amp; Lined - Accent 6"/>
-    <w:basedOn w:val="896"/>
+    <w:basedOn w:val="853"/>
     <w:uiPriority w:val="99"/>
     <w:pPr>
       <w:pBdr/>
@@ -37978,9 +37980,9 @@
       </w:tcPr>
     </w:tblStylePr>
   </w:style>
-  <w:style w:type="table" w:styleId="870">
+  <w:style w:type="table" w:styleId="827">
     <w:name w:val="Bordered"/>
-    <w:basedOn w:val="896"/>
+    <w:basedOn w:val="853"/>
     <w:uiPriority w:val="99"/>
     <w:pPr>
       <w:pBdr/>
@@ -38209,9 +38211,9 @@
       </w:tcPr>
     </w:tblStylePr>
   </w:style>
-  <w:style w:type="table" w:styleId="871">
+  <w:style w:type="table" w:styleId="828">
     <w:name w:val="Bordered - Accent 1"/>
-    <w:basedOn w:val="896"/>
+    <w:basedOn w:val="853"/>
     <w:uiPriority w:val="99"/>
     <w:pPr>
       <w:pBdr/>
@@ -38440,9 +38442,9 @@
       </w:tcPr>
     </w:tblStylePr>
   </w:style>
-  <w:style w:type="table" w:styleId="872">
+  <w:style w:type="table" w:styleId="829">
     <w:name w:val="Bordered - Accent 2"/>
-    <w:basedOn w:val="896"/>
+    <w:basedOn w:val="853"/>
     <w:uiPriority w:val="99"/>
     <w:pPr>
       <w:pBdr/>
@@ -38671,9 +38673,9 @@
       </w:tcPr>
     </w:tblStylePr>
   </w:style>
-  <w:style w:type="table" w:styleId="873">
+  <w:style w:type="table" w:styleId="830">
     <w:name w:val="Bordered - Accent 3"/>
-    <w:basedOn w:val="896"/>
+    <w:basedOn w:val="853"/>
     <w:uiPriority w:val="99"/>
     <w:pPr>
       <w:pBdr/>
@@ -38902,9 +38904,9 @@
       </w:tcPr>
     </w:tblStylePr>
   </w:style>
-  <w:style w:type="table" w:styleId="874">
+  <w:style w:type="table" w:styleId="831">
     <w:name w:val="Bordered - Accent 4"/>
-    <w:basedOn w:val="896"/>
+    <w:basedOn w:val="853"/>
     <w:uiPriority w:val="99"/>
     <w:pPr>
       <w:pBdr/>
@@ -39133,9 +39135,9 @@
       </w:tcPr>
     </w:tblStylePr>
   </w:style>
-  <w:style w:type="table" w:styleId="875">
+  <w:style w:type="table" w:styleId="832">
     <w:name w:val="Bordered - Accent 5"/>
-    <w:basedOn w:val="896"/>
+    <w:basedOn w:val="853"/>
     <w:uiPriority w:val="99"/>
     <w:pPr>
       <w:pBdr/>
@@ -39364,9 +39366,9 @@
       </w:tcPr>
     </w:tblStylePr>
   </w:style>
-  <w:style w:type="table" w:styleId="876">
+  <w:style w:type="table" w:styleId="833">
     <w:name w:val="Bordered - Accent 6"/>
-    <w:basedOn w:val="896"/>
+    <w:basedOn w:val="853"/>
     <w:uiPriority w:val="99"/>
     <w:pPr>
       <w:pBdr/>
@@ -39595,7 +39597,7 @@
       </w:tcPr>
     </w:tblStylePr>
   </w:style>
-  <w:style w:type="character" w:styleId="877">
+  <w:style w:type="character" w:styleId="834">
     <w:name w:val="Hyperlink"/>
     <w:uiPriority w:val="99"/>
     <w:unhideWhenUsed/>
@@ -39609,10 +39611,10 @@
       <w:u w:val="single"/>
     </w:rPr>
   </w:style>
-  <w:style w:type="paragraph" w:styleId="878">
+  <w:style w:type="paragraph" w:styleId="835">
     <w:name w:val="footnote text"/>
-    <w:basedOn w:val="895"/>
-    <w:link w:val="879"/>
+    <w:basedOn w:val="852"/>
+    <w:link w:val="836"/>
     <w:uiPriority w:val="99"/>
     <w:semiHidden/>
     <w:unhideWhenUsed/>
@@ -39625,9 +39627,9 @@
       <w:sz w:val="18"/>
     </w:rPr>
   </w:style>
-  <w:style w:type="character" w:styleId="879">
+  <w:style w:type="character" w:styleId="836">
     <w:name w:val="Footnote Text Char"/>
-    <w:link w:val="878"/>
+    <w:link w:val="835"/>
     <w:uiPriority w:val="99"/>
     <w:pPr>
       <w:pBdr/>
@@ -39638,7 +39640,7 @@
       <w:sz w:val="18"/>
     </w:rPr>
   </w:style>
-  <w:style w:type="character" w:styleId="880">
+  <w:style w:type="character" w:styleId="837">
     <w:name w:val="footnote reference"/>
     <w:uiPriority w:val="99"/>
     <w:unhideWhenUsed/>
@@ -39651,10 +39653,10 @@
       <w:vertAlign w:val="superscript"/>
     </w:rPr>
   </w:style>
-  <w:style w:type="paragraph" w:styleId="881">
+  <w:style w:type="paragraph" w:styleId="838">
     <w:name w:val="endnote text"/>
-    <w:basedOn w:val="895"/>
-    <w:link w:val="882"/>
+    <w:basedOn w:val="852"/>
+    <w:link w:val="839"/>
     <w:uiPriority w:val="99"/>
     <w:semiHidden/>
     <w:unhideWhenUsed/>
@@ -39667,9 +39669,9 @@
       <w:sz w:val="20"/>
     </w:rPr>
   </w:style>
-  <w:style w:type="character" w:styleId="882">
+  <w:style w:type="character" w:styleId="839">
     <w:name w:val="Endnote Text Char"/>
-    <w:link w:val="881"/>
+    <w:link w:val="838"/>
     <w:uiPriority w:val="99"/>
     <w:pPr>
       <w:pBdr/>
@@ -39680,7 +39682,7 @@
       <w:sz w:val="20"/>
     </w:rPr>
   </w:style>
-  <w:style w:type="character" w:styleId="883">
+  <w:style w:type="character" w:styleId="840">
     <w:name w:val="endnote reference"/>
     <w:uiPriority w:val="99"/>
     <w:semiHidden/>
@@ -39694,10 +39696,10 @@
       <w:vertAlign w:val="superscript"/>
     </w:rPr>
   </w:style>
-  <w:style w:type="paragraph" w:styleId="884">
+  <w:style w:type="paragraph" w:styleId="841">
     <w:name w:val="toc 1"/>
-    <w:basedOn w:val="895"/>
-    <w:next w:val="895"/>
+    <w:basedOn w:val="852"/>
+    <w:next w:val="852"/>
     <w:uiPriority w:val="39"/>
     <w:unhideWhenUsed/>
     <w:pPr>
@@ -39706,10 +39708,10 @@
       <w:ind w:right="0" w:firstLine="0" w:left="0"/>
     </w:pPr>
   </w:style>
-  <w:style w:type="paragraph" w:styleId="885">
+  <w:style w:type="paragraph" w:styleId="842">
     <w:name w:val="toc 2"/>
-    <w:basedOn w:val="895"/>
-    <w:next w:val="895"/>
+    <w:basedOn w:val="852"/>
+    <w:next w:val="852"/>
     <w:uiPriority w:val="39"/>
     <w:unhideWhenUsed/>
     <w:pPr>
@@ -39718,10 +39720,10 @@
       <w:ind w:right="0" w:firstLine="0" w:left="283"/>
     </w:pPr>
   </w:style>
-  <w:style w:type="paragraph" w:styleId="886">
+  <w:style w:type="paragraph" w:styleId="843">
     <w:name w:val="toc 3"/>
-    <w:basedOn w:val="895"/>
-    <w:next w:val="895"/>
+    <w:basedOn w:val="852"/>
+    <w:next w:val="852"/>
     <w:uiPriority w:val="39"/>
     <w:unhideWhenUsed/>
     <w:pPr>
@@ -39730,10 +39732,10 @@
       <w:ind w:right="0" w:firstLine="0" w:left="567"/>
     </w:pPr>
   </w:style>
-  <w:style w:type="paragraph" w:styleId="887">
+  <w:style w:type="paragraph" w:styleId="844">
     <w:name w:val="toc 4"/>
-    <w:basedOn w:val="895"/>
-    <w:next w:val="895"/>
+    <w:basedOn w:val="852"/>
+    <w:next w:val="852"/>
     <w:uiPriority w:val="39"/>
     <w:unhideWhenUsed/>
     <w:pPr>
@@ -39742,10 +39744,10 @@
       <w:ind w:right="0" w:firstLine="0" w:left="850"/>
     </w:pPr>
   </w:style>
-  <w:style w:type="paragraph" w:styleId="888">
+  <w:style w:type="paragraph" w:styleId="845">
     <w:name w:val="toc 5"/>
-    <w:basedOn w:val="895"/>
-    <w:next w:val="895"/>
+    <w:basedOn w:val="852"/>
+    <w:next w:val="852"/>
     <w:uiPriority w:val="39"/>
     <w:unhideWhenUsed/>
     <w:pPr>
@@ -39754,10 +39756,10 @@
       <w:ind w:right="0" w:firstLine="0" w:left="1134"/>
     </w:pPr>
   </w:style>
-  <w:style w:type="paragraph" w:styleId="889">
+  <w:style w:type="paragraph" w:styleId="846">
     <w:name w:val="toc 6"/>
-    <w:basedOn w:val="895"/>
-    <w:next w:val="895"/>
+    <w:basedOn w:val="852"/>
+    <w:next w:val="852"/>
     <w:uiPriority w:val="39"/>
     <w:unhideWhenUsed/>
     <w:pPr>
@@ -39766,10 +39768,10 @@
       <w:ind w:right="0" w:firstLine="0" w:left="1417"/>
     </w:pPr>
   </w:style>
-  <w:style w:type="paragraph" w:styleId="890">
+  <w:style w:type="paragraph" w:styleId="847">
     <w:name w:val="toc 7"/>
-    <w:basedOn w:val="895"/>
-    <w:next w:val="895"/>
+    <w:basedOn w:val="852"/>
+    <w:next w:val="852"/>
     <w:uiPriority w:val="39"/>
     <w:unhideWhenUsed/>
     <w:pPr>
@@ -39778,10 +39780,10 @@
       <w:ind w:right="0" w:firstLine="0" w:left="1701"/>
     </w:pPr>
   </w:style>
-  <w:style w:type="paragraph" w:styleId="891">
+  <w:style w:type="paragraph" w:styleId="848">
     <w:name w:val="toc 8"/>
-    <w:basedOn w:val="895"/>
-    <w:next w:val="895"/>
+    <w:basedOn w:val="852"/>
+    <w:next w:val="852"/>
     <w:uiPriority w:val="39"/>
     <w:unhideWhenUsed/>
     <w:pPr>
@@ -39790,10 +39792,10 @@
       <w:ind w:right="0" w:firstLine="0" w:left="1984"/>
     </w:pPr>
   </w:style>
-  <w:style w:type="paragraph" w:styleId="892">
+  <w:style w:type="paragraph" w:styleId="849">
     <w:name w:val="toc 9"/>
-    <w:basedOn w:val="895"/>
-    <w:next w:val="895"/>
+    <w:basedOn w:val="852"/>
+    <w:next w:val="852"/>
     <w:uiPriority w:val="39"/>
     <w:unhideWhenUsed/>
     <w:pPr>
@@ -39802,7 +39804,7 @@
       <w:ind w:right="0" w:firstLine="0" w:left="2268"/>
     </w:pPr>
   </w:style>
-  <w:style w:type="paragraph" w:styleId="893">
+  <w:style w:type="paragraph" w:styleId="850">
     <w:name w:val="TOC Heading"/>
     <w:uiPriority w:val="39"/>
     <w:unhideWhenUsed/>
@@ -39812,10 +39814,10 @@
       <w:ind/>
     </w:pPr>
   </w:style>
-  <w:style w:type="paragraph" w:styleId="894">
+  <w:style w:type="paragraph" w:styleId="851">
     <w:name w:val="table of figures"/>
-    <w:basedOn w:val="895"/>
-    <w:next w:val="895"/>
+    <w:basedOn w:val="852"/>
+    <w:next w:val="852"/>
     <w:uiPriority w:val="99"/>
     <w:unhideWhenUsed/>
     <w:pPr>
@@ -39824,7 +39826,7 @@
       <w:ind/>
     </w:pPr>
   </w:style>
-  <w:style w:type="paragraph" w:styleId="895" w:default="1">
+  <w:style w:type="paragraph" w:styleId="852" w:default="1">
     <w:name w:val="Normal"/>
     <w:qFormat/>
     <w:pPr>
@@ -39833,7 +39835,7 @@
       <w:ind/>
     </w:pPr>
   </w:style>
-  <w:style w:type="table" w:styleId="896" w:default="1">
+  <w:style w:type="table" w:styleId="853" w:default="1">
     <w:name w:val="Normal Table"/>
     <w:uiPriority w:val="99"/>
     <w:semiHidden/>
@@ -40026,7 +40028,7 @@
       </w:tcPr>
     </w:tblStylePr>
   </w:style>
-  <w:style w:type="numbering" w:styleId="897" w:default="1">
+  <w:style w:type="numbering" w:styleId="854" w:default="1">
     <w:name w:val="No List"/>
     <w:uiPriority w:val="99"/>
     <w:semiHidden/>
@@ -40037,9 +40039,9 @@
       <w:ind/>
     </w:pPr>
   </w:style>
-  <w:style w:type="paragraph" w:styleId="898">
+  <w:style w:type="paragraph" w:styleId="855">
     <w:name w:val="No Spacing"/>
-    <w:basedOn w:val="895"/>
+    <w:basedOn w:val="852"/>
     <w:uiPriority w:val="1"/>
     <w:qFormat/>
     <w:pPr>
@@ -40048,9 +40050,9 @@
       <w:ind/>
     </w:pPr>
   </w:style>
-  <w:style w:type="paragraph" w:styleId="899">
+  <w:style w:type="paragraph" w:styleId="856">
     <w:name w:val="List Paragraph"/>
-    <w:basedOn w:val="895"/>
+    <w:basedOn w:val="852"/>
     <w:uiPriority w:val="34"/>
     <w:qFormat/>
     <w:pPr>
@@ -40060,7 +40062,7 @@
       <w:contextualSpacing w:val="true"/>
     </w:pPr>
   </w:style>
-  <w:style w:type="character" w:styleId="900" w:default="1">
+  <w:style w:type="character" w:styleId="857" w:default="1">
     <w:name w:val="Default Paragraph Font"/>
     <w:uiPriority w:val="1"/>
     <w:semiHidden/>

</xml_diff>

<commit_message>
Writing a bit more on design ig.
</commit_message>
<xml_diff>
--- a/Analysis.docx
+++ b/Analysis.docx
@@ -7078,6 +7078,11 @@
           <w:highlight w:val="none"/>
         </w:rPr>
       </w:r>
+      <w:r>
+        <w:rPr>
+          <w:highlight w:val="none"/>
+        </w:rPr>
+      </w:r>
     </w:p>
     <w:p>
       <w:pPr>
@@ -7152,7 +7157,10 @@
         <w:t xml:space="preserve">tion of energy / moment</w:t>
       </w:r>
       <w:r>
-        <w:t xml:space="preserve">um, as well as to let the user edit the mass of planets. I want the user to be able to switch the planet that the program is focused on, and to be able to speed up or slow down the simulation to their liking. I will display text at the top of the screen showing the relevant statistics like the total energy in the system, the mass of the planet, etc. This can be done using pygame’s font.render() method. A </w:t>
+        <w:t xml:space="preserve">um, as well as to let the user edit the mass of planets. I want the user to be able to switch the planet that the program is focused on, and to be able </w:t>
+      </w:r>
+      <w:r>
+        <w:t xml:space="preserve">to speed up or slow down the simulation to their liking. I will display text at the top of the screen showing the relevant statistics like the total energy in the system, the mass of the planet, etc. This can be done using pygame’s font.render() method. A </w:t>
       </w:r>
       <w:r>
         <w:t xml:space="preserve">start screen will be displayed at the beginning of the program that explains all the keybinds, as well as obviously letting the user start the simulation (which will be done through pressing enter). Here is a mockup of what the start screen will look like:</w:t>
@@ -7623,6 +7631,27 @@
         <w:rPr>
           <w:highlight w:val="none"/>
         </w:rPr>
+        <w:t xml:space="preserve">We don’t want G, the mass or the timescale to be negative, as this would be weird and could lead to many bugs. timeScale is simply changed in increments of a tenth of a year, which works fine, so an if statement will just be used to check if it goes below zero and change it back to 0. For G and the mass, these need to be able to take on values across a huge range of orders of magnitudes. The Sun weighs one hundred million times more than our moon. If we were to choose any fixed increment to change mass by, either the moon’s mass would increase by a factor of a few million on a single button press, or the sun’s mass would barely change at all. To deal with this a logarithmic scale is used, upon pressing a button to increase or decrease a planet’s mass or G, the value will change by 0.5*floor(log(value)) where the log is base 10 and floor returns the largest integer less than log(value). This means the amount that a planet’s mass changes by is relative to the current mass of the planet. This also has the side effect of stopping the values from becoming negative, as the increment gets smaller and smaller as you decrease the mass.</w:t>
+      </w:r>
+      <w:r>
+        <w:rPr>
+          <w:highlight w:val="none"/>
+        </w:rPr>
+      </w:r>
+    </w:p>
+    <w:p>
+      <w:pPr>
+        <w:pBdr/>
+        <w:spacing/>
+        <w:ind/>
+        <w:rPr>
+          <w:highlight w:val="none"/>
+        </w:rPr>
+      </w:pPr>
+      <w:r>
+        <w:rPr>
+          <w:highlight w:val="none"/>
+        </w:rPr>
       </w:r>
       <w:r>
         <w:rPr>
@@ -8099,11 +8128,6 @@
           <w:highlight w:val="none"/>
         </w:rPr>
       </w:r>
-      <w:r>
-        <w:rPr>
-          <w:highlight w:val="none"/>
-        </w:rPr>
-      </w:r>
       <w:r/>
     </w:p>
     <w:p>
@@ -8175,17 +8199,6 @@
         </w:rPr>
       </w:r>
       <w:r/>
-      <w:r>
-        <w:rPr>
-          <w:highlight w:val="none"/>
-        </w:rPr>
-      </w:r>
-      <w:r>
-        <w:rPr>
-          <w:highlight w:val="none"/>
-        </w:rPr>
-      </w:r>
-      <w:r/>
     </w:p>
     <w:p>
       <w:pPr>
@@ -8235,6 +8248,7 @@
           <w:highlight w:val="none"/>
         </w:rPr>
       </w:r>
+      <w:r/>
     </w:p>
     <w:p>
       <w:pPr>

</xml_diff>

<commit_message>
Display is finished, finally.
</commit_message>
<xml_diff>
--- a/Analysis.docx
+++ b/Analysis.docx
@@ -6937,12 +6937,99 @@
         <w:rPr>
           <w:highlight w:val="none"/>
         </w:rPr>
-        <w:t xml:space="preserve">ient, quite easy to do. You simply draw the circles for the two desired planets side by side, rather than at their normal position. Because of the scaling factor the two planets will have the correct relative sizes, so the size comparison will be accurate.</w:t>
-      </w:r>
-      <w:r>
-        <w:rPr>
-          <w:highlight w:val="none"/>
-        </w:rPr>
+        <w:t xml:space="preserve">ient, quite easy to do. You simply draw the circles for the two desired planets side by side, rather than at their normal position. Because of the scaling factor the two planets will have the correct relative sizes, so the size comparison will be accurate. This is a mockup of what a size comparison might look like:</w:t>
+      </w:r>
+      <w:r>
+        <w:rPr>
+          <w:highlight w:val="none"/>
+        </w:rPr>
+      </w:r>
+      <w:r>
+        <w:rPr>
+          <w:highlight w:val="none"/>
+        </w:rPr>
+      </w:r>
+    </w:p>
+    <w:p>
+      <w:pPr>
+        <w:pBdr/>
+        <w:spacing/>
+        <w:ind/>
+        <w:rPr>
+          <w:highlight w:val="none"/>
+        </w:rPr>
+      </w:pPr>
+      <w:r>
+        <w:rPr>
+          <w:highlight w:val="none"/>
+        </w:rPr>
+        <mc:AlternateContent>
+          <mc:Choice Requires="wpg">
+            <w:drawing>
+              <wp:inline xmlns:wp="http://schemas.openxmlformats.org/drawingml/2006/wordprocessingDrawing" distT="0" distB="0" distL="0" distR="0">
+                <wp:extent cx="5940425" cy="4078858"/>
+                <wp:effectExtent l="0" t="0" r="0" b="0"/>
+                <wp:docPr id="8" name=""/>
+                <wp:cNvGraphicFramePr>
+                  <a:graphicFrameLocks xmlns:a="http://schemas.openxmlformats.org/drawingml/2006/main" noChangeAspect="1"/>
+                </wp:cNvGraphicFramePr>
+                <a:graphic xmlns:a="http://schemas.openxmlformats.org/drawingml/2006/main">
+                  <a:graphicData uri="http://schemas.openxmlformats.org/drawingml/2006/picture">
+                    <pic:pic xmlns:pic="http://schemas.openxmlformats.org/drawingml/2006/picture">
+                      <pic:nvPicPr>
+                        <pic:cNvPr id="111607245" name=""/>
+                        <pic:cNvPicPr>
+                          <a:picLocks noChangeAspect="1"/>
+                        </pic:cNvPicPr>
+                        <pic:nvPr/>
+                      </pic:nvPicPr>
+                      <pic:blipFill>
+                        <a:blip r:embed="rId23"/>
+                        <a:stretch/>
+                      </pic:blipFill>
+                      <pic:spPr bwMode="auto">
+                        <a:xfrm>
+                          <a:off x="0" y="0"/>
+                          <a:ext cx="5940424" cy="4078858"/>
+                        </a:xfrm>
+                        <a:prstGeom prst="rect">
+                          <a:avLst/>
+                        </a:prstGeom>
+                      </pic:spPr>
+                    </pic:pic>
+                  </a:graphicData>
+                </a:graphic>
+              </wp:inline>
+            </w:drawing>
+          </mc:Choice>
+          <mc:Fallback>
+            <w:pict>
+              <v:shapetype id="_x0000_t75" coordsize="21600,21600" o:spt="75" o:preferrelative="t" path="m@4@5l@4@11@9@11@9@5xe" filled="f" stroked="f">
+                <v:stroke joinstyle="miter"/>
+                <v:formulas>
+                  <v:f eqn="if lineDrawn pixelLineWidth 0"/>
+                  <v:f eqn="sum @0 1 0"/>
+                  <v:f eqn="sum 0 0 @1"/>
+                  <v:f eqn="prod @2 1 2"/>
+                  <v:f eqn="prod @3 21600 pixelWidth"/>
+                  <v:f eqn="prod @3 21600 pixelHeight"/>
+                  <v:f eqn="sum @0 0 1"/>
+                  <v:f eqn="prod @6 1 2"/>
+                  <v:f eqn="prod @7 21600 pixelWidth"/>
+                  <v:f eqn="sum @8 21600 0"/>
+                  <v:f eqn="prod @7 21600 pixelHeight"/>
+                  <v:f eqn="sum @10 21600 0"/>
+                </v:formulas>
+                <v:path o:extrusionok="f" gradientshapeok="t" o:connecttype="rect"/>
+                <o:lock v:ext="edit" aspectratio="t"/>
+              </v:shapetype>
+              <v:shape id="_x0000_i7" o:spid="_x0000_s7" type="#_x0000_t75" style="width:467.75pt;height:321.17pt;mso-wrap-distance-left:0.00pt;mso-wrap-distance-top:0.00pt;mso-wrap-distance-right:0.00pt;mso-wrap-distance-bottom:0.00pt;z-index:1;" stroked="false">
+                <v:imagedata r:id="rId23" o:title=""/>
+                <o:lock v:ext="edit" rotation="t"/>
+              </v:shape>
+            </w:pict>
+          </mc:Fallback>
+        </mc:AlternateContent>
       </w:r>
       <w:r>
         <w:rPr>
@@ -7193,7 +7280,7 @@
               <wp:inline xmlns:wp="http://schemas.openxmlformats.org/drawingml/2006/wordprocessingDrawing" distT="0" distB="0" distL="0" distR="0">
                 <wp:extent cx="5940425" cy="2098188"/>
                 <wp:effectExtent l="0" t="0" r="0" b="0"/>
-                <wp:docPr id="8" name=""/>
+                <wp:docPr id="9" name=""/>
                 <wp:cNvGraphicFramePr>
                   <a:graphicFrameLocks xmlns:a="http://schemas.openxmlformats.org/drawingml/2006/main" noChangeAspect="1"/>
                 </wp:cNvGraphicFramePr>
@@ -7208,7 +7295,7 @@
                         <pic:nvPr/>
                       </pic:nvPicPr>
                       <pic:blipFill>
-                        <a:blip r:embed="rId23"/>
+                        <a:blip r:embed="rId24"/>
                         <a:stretch/>
                       </pic:blipFill>
                       <pic:spPr bwMode="auto">
@@ -7247,8 +7334,8 @@
                 <v:path o:extrusionok="f" gradientshapeok="t" o:connecttype="rect"/>
                 <o:lock v:ext="edit" aspectratio="t"/>
               </v:shapetype>
-              <v:shape id="_x0000_i7" o:spid="_x0000_s7" type="#_x0000_t75" style="width:467.75pt;height:165.21pt;mso-wrap-distance-left:0.00pt;mso-wrap-distance-top:0.00pt;mso-wrap-distance-right:0.00pt;mso-wrap-distance-bottom:0.00pt;z-index:1;" stroked="false">
-                <v:imagedata r:id="rId23" o:title=""/>
+              <v:shape id="_x0000_i8" o:spid="_x0000_s8" type="#_x0000_t75" style="width:467.75pt;height:165.21pt;mso-wrap-distance-left:0.00pt;mso-wrap-distance-top:0.00pt;mso-wrap-distance-right:0.00pt;mso-wrap-distance-bottom:0.00pt;z-index:1;" stroked="false">
+                <v:imagedata r:id="rId24" o:title=""/>
                 <o:lock v:ext="edit" rotation="t"/>
               </v:shape>
             </w:pict>
@@ -7335,7 +7422,7 @@
               <wp:inline xmlns:wp="http://schemas.openxmlformats.org/drawingml/2006/wordprocessingDrawing" distT="0" distB="0" distL="0" distR="0">
                 <wp:extent cx="5940425" cy="1174037"/>
                 <wp:effectExtent l="0" t="0" r="0" b="0"/>
-                <wp:docPr id="9" name=""/>
+                <wp:docPr id="10" name=""/>
                 <wp:cNvGraphicFramePr>
                   <a:graphicFrameLocks xmlns:a="http://schemas.openxmlformats.org/drawingml/2006/main" noChangeAspect="1"/>
                 </wp:cNvGraphicFramePr>
@@ -7350,7 +7437,7 @@
                         <pic:nvPr/>
                       </pic:nvPicPr>
                       <pic:blipFill>
-                        <a:blip r:embed="rId24"/>
+                        <a:blip r:embed="rId25"/>
                         <a:stretch/>
                       </pic:blipFill>
                       <pic:spPr bwMode="auto">
@@ -7389,8 +7476,8 @@
                 <v:path o:extrusionok="f" gradientshapeok="t" o:connecttype="rect"/>
                 <o:lock v:ext="edit" aspectratio="t"/>
               </v:shapetype>
-              <v:shape id="_x0000_i8" o:spid="_x0000_s8" type="#_x0000_t75" style="width:467.75pt;height:92.44pt;mso-wrap-distance-left:0.00pt;mso-wrap-distance-top:0.00pt;mso-wrap-distance-right:0.00pt;mso-wrap-distance-bottom:0.00pt;z-index:1;" stroked="false">
-                <v:imagedata r:id="rId24" o:title=""/>
+              <v:shape id="_x0000_i9" o:spid="_x0000_s9" type="#_x0000_t75" style="width:467.75pt;height:92.44pt;mso-wrap-distance-left:0.00pt;mso-wrap-distance-top:0.00pt;mso-wrap-distance-right:0.00pt;mso-wrap-distance-bottom:0.00pt;z-index:1;" stroked="false">
+                <v:imagedata r:id="rId25" o:title=""/>
                 <o:lock v:ext="edit" rotation="t"/>
               </v:shape>
             </w:pict>
@@ -7474,7 +7561,7 @@
               <wp:inline xmlns:wp="http://schemas.openxmlformats.org/drawingml/2006/wordprocessingDrawing" distT="0" distB="0" distL="0" distR="0">
                 <wp:extent cx="5940425" cy="1119378"/>
                 <wp:effectExtent l="0" t="0" r="0" b="0"/>
-                <wp:docPr id="10" name=""/>
+                <wp:docPr id="11" name=""/>
                 <wp:cNvGraphicFramePr>
                   <a:graphicFrameLocks xmlns:a="http://schemas.openxmlformats.org/drawingml/2006/main" noChangeAspect="1"/>
                 </wp:cNvGraphicFramePr>
@@ -7489,7 +7576,7 @@
                         <pic:nvPr/>
                       </pic:nvPicPr>
                       <pic:blipFill>
-                        <a:blip r:embed="rId25"/>
+                        <a:blip r:embed="rId26"/>
                         <a:stretch/>
                       </pic:blipFill>
                       <pic:spPr bwMode="auto">
@@ -7528,8 +7615,8 @@
                 <v:path o:extrusionok="f" gradientshapeok="t" o:connecttype="rect"/>
                 <o:lock v:ext="edit" aspectratio="t"/>
               </v:shapetype>
-              <v:shape id="_x0000_i9" o:spid="_x0000_s9" type="#_x0000_t75" style="width:467.75pt;height:88.14pt;mso-wrap-distance-left:0.00pt;mso-wrap-distance-top:0.00pt;mso-wrap-distance-right:0.00pt;mso-wrap-distance-bottom:0.00pt;z-index:1;" stroked="false">
-                <v:imagedata r:id="rId25" o:title=""/>
+              <v:shape id="_x0000_i10" o:spid="_x0000_s10" type="#_x0000_t75" style="width:467.75pt;height:88.14pt;mso-wrap-distance-left:0.00pt;mso-wrap-distance-top:0.00pt;mso-wrap-distance-right:0.00pt;mso-wrap-distance-bottom:0.00pt;z-index:1;" stroked="false">
+                <v:imagedata r:id="rId26" o:title=""/>
                 <o:lock v:ext="edit" rotation="t"/>
               </v:shape>
             </w:pict>
@@ -7631,7 +7718,36 @@
         <w:rPr>
           <w:highlight w:val="none"/>
         </w:rPr>
-        <w:t xml:space="preserve">We don’t want G, the mass or the timescale to be negative, as this would be weird and could lead to many bugs. timeScale is simply changed in increments of a tenth of a year, which works fine, so an if statement will just be used to check if it goes below zero and change it back to 0. For G and the mass, these need to be able to take on values across a huge range of orders of magnitudes. The Sun weighs one hundred million times more than our moon. If we were to choose any fixed increment to change mass by, either the moon’s mass would increase by a factor of a few million on a single button press, or the sun’s mass would barely change at all. To deal with this a logarithmic scale is used, upon pressing a button to increase or decrease a planet’s mass or G, the value will change by 0.5*floor(log(value)) where the log is base 10 and floor returns the largest integer less than log(value). This means the amount that a planet’s mass changes by is relative to the current mass of the planet. This also has the side effect of stopping the values from becoming negative, as the increment gets smaller and smaller as you decrease the mass.</w:t>
+        <w:t xml:space="preserve">We don’t want G, the mass or the timescale to be negative, as this would be weird and could lead to many bugs. timeScale</w:t>
+      </w:r>
+      <w:r>
+        <w:rPr>
+          <w:highlight w:val="none"/>
+        </w:rPr>
+        <w:t xml:space="preserve"> is simply changed in increments of a tenth of a year, which works fine, so an if statement will just be used to check if it goes below zero and change it back to 0. For G and the mass, these need to be able to take on values across a huge range of orders </w:t>
+      </w:r>
+      <w:r>
+        <w:rPr>
+          <w:highlight w:val="none"/>
+        </w:rPr>
+        <w:t xml:space="preserve">of magnitudes. The Sun weighs one hundred million times more than our moon. If we were to choose any fixed increment to change mass by, either the moon’s mass would increase by a factor of a few million on a single button press, or the sun’s mass would bar</w:t>
+      </w:r>
+      <w:r>
+        <w:rPr>
+          <w:highlight w:val="none"/>
+        </w:rPr>
+        <w:t xml:space="preserve">ely change at all. To deal with this a logarithmic scale is used, upon pressing a button to increase or decrease a planet’s mass or G, the value will change by 0.5*floor(log(value)) where the log is base 10 and floor returns the largest integer less than l</w:t>
+      </w:r>
+      <w:r>
+        <w:rPr>
+          <w:highlight w:val="none"/>
+        </w:rPr>
+        <w:t xml:space="preserve">og(value). This means the amount that a planet’s mass changes by is relative to the current mass of the planet. This also has the side effect of stopping the values from becoming negative, as the increment gets smaller and smaller as you decrease the mass.</w:t>
+      </w:r>
+      <w:r>
+        <w:rPr>
+          <w:highlight w:val="none"/>
+        </w:rPr>
       </w:r>
       <w:r>
         <w:rPr>

</xml_diff>

<commit_message>
Everything except structure chart and pseudocode for main loop is done for design now.
</commit_message>
<xml_diff>
--- a/Analysis.docx
+++ b/Analysis.docx
@@ -4,7 +4,7 @@
   <w:body>
     <w:p>
       <w:pPr>
-        <w:pStyle w:val="719"/>
+        <w:pStyle w:val="676"/>
         <w:pBdr/>
         <w:spacing w:line="141" w:lineRule="atLeast"/>
         <w:ind/>
@@ -37,7 +37,7 @@
     </w:p>
     <w:p>
       <w:pPr>
-        <w:pStyle w:val="723"/>
+        <w:pStyle w:val="680"/>
         <w:pBdr/>
         <w:spacing/>
         <w:ind/>
@@ -90,7 +90,7 @@
         <w:t xml:space="preserve">However, there is a lack of interactive tools available for teaching the solar system that also incorporate </w:t>
       </w:r>
       <w:r>
-        <w:t xml:space="preserve">other physics topics such as energy. It would be useful to teachers, and students, to have a prorgam that can use an interesting topic like space that also teaches important concepts from other topics such as conservation of momentum or Newton’s laws.</w:t>
+        <w:t xml:space="preserve">other physics topics such as energy. It would be useful to teachers, and students, to have a progam that can use an interesting topic like space that also teaches important concepts from other topics such as conservation of momentum or Newton’s laws.</w:t>
       </w:r>
       <w:r>
         <w:rPr>
@@ -115,7 +115,7 @@
     </w:p>
     <w:p>
       <w:pPr>
-        <w:pStyle w:val="723"/>
+        <w:pStyle w:val="680"/>
         <w:pBdr/>
         <w:spacing/>
         <w:ind/>
@@ -155,7 +155,7 @@
     </w:p>
     <w:p>
       <w:pPr>
-        <w:pStyle w:val="899"/>
+        <w:pStyle w:val="856"/>
         <w:numPr>
           <w:ilvl w:val="0"/>
           <w:numId w:val="1"/>
@@ -195,7 +195,7 @@
     </w:p>
     <w:p>
       <w:pPr>
-        <w:pStyle w:val="899"/>
+        <w:pStyle w:val="856"/>
         <w:numPr>
           <w:ilvl w:val="0"/>
           <w:numId w:val="1"/>
@@ -464,7 +464,7 @@
     </w:p>
     <w:p>
       <w:pPr>
-        <w:pStyle w:val="723"/>
+        <w:pStyle w:val="680"/>
         <w:pBdr/>
         <w:spacing/>
         <w:ind/>
@@ -835,14 +835,14 @@
       <w:hyperlink r:id="rId10" w:tooltip="https://eyes.nasa.gov/apps/orrery/#/home." w:history="1">
         <w:r>
           <w:rPr>
-            <w:rStyle w:val="877"/>
+            <w:rStyle w:val="834"/>
             <w:highlight w:val="none"/>
           </w:rPr>
           <w:t xml:space="preserve">https://eyes.nasa.gov/apps/orrery/#/home</w:t>
         </w:r>
         <w:r>
           <w:rPr>
-            <w:rStyle w:val="877"/>
+            <w:rStyle w:val="834"/>
             <w:highlight w:val="none"/>
           </w:rPr>
           <w:t xml:space="preserve">.</w:t>
@@ -919,20 +919,20 @@
       <w:hyperlink r:id="rId11" w:tooltip="https://phet.colorado.edu/sims/html/my-solar-system/latest/my-solar-system_all.html" w:history="1">
         <w:r>
           <w:rPr>
-            <w:rStyle w:val="877"/>
+            <w:rStyle w:val="834"/>
             <w:highlight w:val="none"/>
           </w:rPr>
           <w:t xml:space="preserve">https://phet.colorado.edu/sims/html/my-solar-system/latest/my-solar-system_all.html</w:t>
         </w:r>
         <w:r>
           <w:rPr>
-            <w:rStyle w:val="877"/>
+            <w:rStyle w:val="834"/>
             <w:highlight w:val="none"/>
           </w:rPr>
         </w:r>
         <w:r>
           <w:rPr>
-            <w:rStyle w:val="877"/>
+            <w:rStyle w:val="834"/>
             <w:highlight w:val="none"/>
           </w:rPr>
         </w:r>
@@ -1655,7 +1655,7 @@
     </w:p>
     <w:p>
       <w:pPr>
-        <w:pStyle w:val="899"/>
+        <w:pStyle w:val="856"/>
         <w:numPr>
           <w:ilvl w:val="0"/>
           <w:numId w:val="2"/>
@@ -1686,7 +1686,7 @@
     </w:p>
     <w:p>
       <w:pPr>
-        <w:pStyle w:val="899"/>
+        <w:pStyle w:val="856"/>
         <w:numPr>
           <w:ilvl w:val="0"/>
           <w:numId w:val="2"/>
@@ -1717,7 +1717,7 @@
     </w:p>
     <w:p>
       <w:pPr>
-        <w:pStyle w:val="899"/>
+        <w:pStyle w:val="856"/>
         <w:numPr>
           <w:ilvl w:val="0"/>
           <w:numId w:val="2"/>
@@ -1748,7 +1748,7 @@
     </w:p>
     <w:p>
       <w:pPr>
-        <w:pStyle w:val="899"/>
+        <w:pStyle w:val="856"/>
         <w:numPr>
           <w:ilvl w:val="0"/>
           <w:numId w:val="2"/>
@@ -1779,7 +1779,7 @@
     </w:p>
     <w:p>
       <w:pPr>
-        <w:pStyle w:val="899"/>
+        <w:pStyle w:val="856"/>
         <w:numPr>
           <w:ilvl w:val="0"/>
           <w:numId w:val="2"/>
@@ -2000,7 +2000,7 @@
     </w:p>
     <w:p>
       <w:pPr>
-        <w:pStyle w:val="721"/>
+        <w:pStyle w:val="678"/>
         <w:pBdr/>
         <w:spacing/>
         <w:ind/>
@@ -2028,7 +2028,7 @@
     </w:p>
     <w:p>
       <w:pPr>
-        <w:pStyle w:val="723"/>
+        <w:pStyle w:val="680"/>
         <w:pBdr/>
         <w:spacing/>
         <w:ind/>
@@ -2071,29 +2071,29 @@
       <w:hyperlink r:id="rId12" w:tooltip="https://eyes.nasa.gov/apps/orrery/#/home" w:history="1">
         <w:r>
           <w:rPr>
-            <w:rStyle w:val="877"/>
+            <w:rStyle w:val="834"/>
             <w:highlight w:val="none"/>
           </w:rPr>
           <w:t xml:space="preserve">https://eyes.nasa.gov/apps/orrery/#/home</w:t>
         </w:r>
         <w:r>
           <w:rPr>
-            <w:rStyle w:val="877"/>
+            <w:rStyle w:val="834"/>
           </w:rPr>
         </w:r>
         <w:r>
           <w:rPr>
-            <w:rStyle w:val="877"/>
+            <w:rStyle w:val="834"/>
           </w:rPr>
         </w:r>
         <w:r>
           <w:rPr>
-            <w:rStyle w:val="877"/>
+            <w:rStyle w:val="834"/>
           </w:rPr>
         </w:r>
         <w:r>
           <w:rPr>
-            <w:rStyle w:val="877"/>
+            <w:rStyle w:val="834"/>
           </w:rPr>
         </w:r>
       </w:hyperlink>
@@ -2310,7 +2310,7 @@
     </w:p>
     <w:p>
       <w:pPr>
-        <w:pStyle w:val="723"/>
+        <w:pStyle w:val="680"/>
         <w:pBdr/>
         <w:spacing/>
         <w:ind/>
@@ -2349,18 +2349,18 @@
       <w:hyperlink r:id="rId14" w:tooltip="https://phet.colorado.edu/sims/html/my-solar-system/latest/my-solar-system_all.html" w:history="1">
         <w:r>
           <w:rPr>
-            <w:rStyle w:val="877"/>
+            <w:rStyle w:val="834"/>
           </w:rPr>
           <w:t xml:space="preserve">https://phet.colorado.edu/sims/html/my-solar-system/latest/my-solar-system_all.html</w:t>
         </w:r>
         <w:r>
           <w:rPr>
-            <w:rStyle w:val="877"/>
+            <w:rStyle w:val="834"/>
           </w:rPr>
         </w:r>
         <w:r>
           <w:rPr>
-            <w:rStyle w:val="877"/>
+            <w:rStyle w:val="834"/>
           </w:rPr>
         </w:r>
       </w:hyperlink>
@@ -2551,7 +2551,7 @@
     </w:p>
     <w:p>
       <w:pPr>
-        <w:pStyle w:val="721"/>
+        <w:pStyle w:val="678"/>
         <w:pBdr/>
         <w:spacing/>
         <w:ind/>
@@ -2628,7 +2628,7 @@
     </w:p>
     <w:p>
       <w:pPr>
-        <w:pStyle w:val="899"/>
+        <w:pStyle w:val="856"/>
         <w:numPr>
           <w:ilvl w:val="0"/>
           <w:numId w:val="3"/>
@@ -2639,13 +2639,13 @@
         <w:rPr/>
       </w:pPr>
       <w:r>
-        <w:t xml:space="preserve">A downloadable executable is the most accessible format for teachers</w:t>
+        <w:t xml:space="preserve">A downloadable program is the most accessible format for teachers</w:t>
       </w:r>
       <w:r/>
     </w:p>
     <w:p>
       <w:pPr>
-        <w:pStyle w:val="899"/>
+        <w:pStyle w:val="856"/>
         <w:numPr>
           <w:ilvl w:val="0"/>
           <w:numId w:val="3"/>
@@ -2670,7 +2670,7 @@
     </w:p>
     <w:p>
       <w:pPr>
-        <w:pStyle w:val="899"/>
+        <w:pStyle w:val="856"/>
         <w:numPr>
           <w:ilvl w:val="0"/>
           <w:numId w:val="3"/>
@@ -2695,7 +2695,7 @@
     </w:p>
     <w:p>
       <w:pPr>
-        <w:pStyle w:val="899"/>
+        <w:pStyle w:val="856"/>
         <w:numPr>
           <w:ilvl w:val="0"/>
           <w:numId w:val="3"/>
@@ -2730,7 +2730,7 @@
     </w:p>
     <w:p>
       <w:pPr>
-        <w:pStyle w:val="721"/>
+        <w:pStyle w:val="678"/>
         <w:pBdr/>
         <w:spacing/>
         <w:ind/>
@@ -2758,7 +2758,7 @@
     </w:p>
     <w:p>
       <w:pPr>
-        <w:pStyle w:val="723"/>
+        <w:pStyle w:val="680"/>
         <w:pBdr/>
         <w:spacing/>
         <w:ind/>
@@ -3002,7 +3002,7 @@
     </w:p>
     <w:p>
       <w:pPr>
-        <w:pStyle w:val="723"/>
+        <w:pStyle w:val="680"/>
         <w:pBdr/>
         <w:spacing/>
         <w:ind/>
@@ -3054,18 +3054,18 @@
       <w:hyperlink r:id="rId17" w:tooltip="https://ssd.jpl.nasa.gov/horizons/" w:history="1">
         <w:r>
           <w:rPr>
-            <w:rStyle w:val="877"/>
+            <w:rStyle w:val="834"/>
           </w:rPr>
           <w:t xml:space="preserve">https://ssd.jpl.nasa.gov/horizons/</w:t>
         </w:r>
         <w:r>
           <w:rPr>
-            <w:rStyle w:val="877"/>
+            <w:rStyle w:val="834"/>
           </w:rPr>
         </w:r>
         <w:r>
           <w:rPr>
-            <w:rStyle w:val="877"/>
+            <w:rStyle w:val="834"/>
           </w:rPr>
         </w:r>
       </w:hyperlink>
@@ -3187,7 +3187,7 @@
       <w:hyperlink r:id="rId18" w:tooltip="https://ssd.jpl.nasa.gov/api/horizons.api?format=text&amp;COMMAND='&quot;+target+&quot;'&amp;OBJ_DATA='YES'&amp;MAKE_EPHEM='YES'&amp;EPHEM_TYPE='VECTORS'&amp;START_TIME='&quot;+startTime+&quot;'&amp;STOP_TIME='&quot;+stopTime+&quot;'&amp;CENTER='500@0'&amp;STEP_SIZE='1 d'&amp;QUANTITIES='1,9,20,23,24,29'" w:history="1">
         <w:r>
           <w:rPr>
-            <w:rStyle w:val="877"/>
+            <w:rStyle w:val="834"/>
             <w:color w:val="000000" w:themeColor="text1"/>
             <w:sz w:val="22"/>
             <w:szCs w:val="18"/>
@@ -3197,7 +3197,7 @@
         </w:r>
         <w:r>
           <w:rPr>
-            <w:rStyle w:val="877"/>
+            <w:rStyle w:val="834"/>
             <w:color w:val="000000" w:themeColor="text1"/>
             <w:sz w:val="22"/>
             <w:szCs w:val="18"/>
@@ -3206,7 +3206,7 @@
         </w:r>
         <w:r>
           <w:rPr>
-            <w:rStyle w:val="877"/>
+            <w:rStyle w:val="834"/>
             <w:color w:val="000000" w:themeColor="text1"/>
             <w:sz w:val="22"/>
             <w:szCs w:val="18"/>
@@ -3347,7 +3347,7 @@
       <w:hyperlink r:id="rId19" w:tooltip="https://ssd-api.jpl.nasa.gov/doc/horizons.html#ephem_type" w:history="1">
         <w:r>
           <w:rPr>
-            <w:rStyle w:val="877"/>
+            <w:rStyle w:val="834"/>
             <w:color w:val="000000" w:themeColor="text1"/>
             <w:sz w:val="22"/>
             <w:szCs w:val="22"/>
@@ -3357,7 +3357,7 @@
         </w:r>
         <w:r>
           <w:rPr>
-            <w:rStyle w:val="877"/>
+            <w:rStyle w:val="834"/>
             <w:color w:val="000000" w:themeColor="text1"/>
             <w:sz w:val="22"/>
             <w:szCs w:val="22"/>
@@ -3366,7 +3366,7 @@
         </w:r>
         <w:r>
           <w:rPr>
-            <w:rStyle w:val="877"/>
+            <w:rStyle w:val="834"/>
             <w:color w:val="000000" w:themeColor="text1"/>
             <w:sz w:val="22"/>
             <w:szCs w:val="22"/>
@@ -3779,7 +3779,7 @@
     </w:p>
     <w:p>
       <w:pPr>
-        <w:pStyle w:val="723"/>
+        <w:pStyle w:val="680"/>
         <w:pBdr/>
         <w:spacing/>
         <w:ind/>
@@ -3816,7 +3816,7 @@
     </w:p>
     <w:p>
       <w:pPr>
-        <w:pStyle w:val="723"/>
+        <w:pStyle w:val="680"/>
         <w:pBdr/>
         <w:spacing/>
         <w:ind/>
@@ -3847,7 +3847,7 @@
     </w:p>
     <w:p>
       <w:pPr>
-        <w:pStyle w:val="723"/>
+        <w:pStyle w:val="680"/>
         <w:pBdr/>
         <w:spacing/>
         <w:ind/>
@@ -3879,7 +3879,7 @@
     </w:p>
     <w:p>
       <w:pPr>
-        <w:pStyle w:val="723"/>
+        <w:pStyle w:val="680"/>
         <w:pBdr/>
         <w:spacing/>
         <w:ind/>
@@ -5941,7 +5941,7 @@
     </w:p>
     <w:p>
       <w:pPr>
-        <w:pStyle w:val="723"/>
+        <w:pStyle w:val="680"/>
         <w:pBdr/>
         <w:spacing/>
         <w:ind/>
@@ -6641,7 +6641,7 @@
     </w:p>
     <w:p>
       <w:pPr>
-        <w:pStyle w:val="723"/>
+        <w:pStyle w:val="680"/>
         <w:pBdr/>
         <w:spacing/>
         <w:ind/>
@@ -6937,7 +6937,13 @@
         <w:rPr>
           <w:highlight w:val="none"/>
         </w:rPr>
-        <w:t xml:space="preserve">ient, quite easy to do. You simply draw the circles for the two desired planets side by side, rather than at their normal position. Because of the scaling factor the two planets will have the correct relative sizes, so the size comparison will be accurate. This is a mockup of what a size comparison might look like:</w:t>
+        <w:t xml:space="preserve">ient, quite easy to do. You simply draw the circles for the </w:t>
+      </w:r>
+      <w:r>
+        <w:rPr>
+          <w:highlight w:val="none"/>
+        </w:rPr>
+        <w:t xml:space="preserve">two desired planets side by side, rather than at their normal position. Because of the scaling factor the two planets will have the correct relative sizes, so the size comparison will be accurate. This is a mockup of what a size comparison might look like:</w:t>
       </w:r>
       <w:r>
         <w:rPr>
@@ -7036,6 +7042,11 @@
           <w:highlight w:val="none"/>
         </w:rPr>
       </w:r>
+      <w:r>
+        <w:rPr>
+          <w:highlight w:val="none"/>
+        </w:rPr>
+      </w:r>
     </w:p>
     <w:p>
       <w:pPr>
@@ -7068,7 +7079,7 @@
         <w:rPr>
           <w:highlight w:val="none"/>
         </w:rPr>
-        <w:t xml:space="preserve">f mass is always inside or very close to the surface of the sun, this will be helpful when users start changing the mass of planets, as the solar system will quickly spin out of control and focusing on the centre of mass will make everything easier to see.</w:t>
+        <w:t xml:space="preserve">f mass is always inside or very close to the surface of the sun, this will be helpful when users start changing the mass of planets, as the solar system will quickly spin out of control and focusing on the centre of mass will make everything easier to see. It will also place you inbetween the sun and whatever planet you’ve increased the mass of by an absurd amount, so you get a good position to view the system.</w:t>
       </w:r>
       <w:r>
         <w:rPr>
@@ -7198,7 +7209,7 @@
     </w:p>
     <w:p>
       <w:pPr>
-        <w:pStyle w:val="723"/>
+        <w:pStyle w:val="680"/>
         <w:pBdr/>
         <w:spacing/>
         <w:ind/>
@@ -7505,7 +7516,7 @@
         </w:rPr>
       </w:pPr>
       <w:r>
-        <w:t xml:space="preserve">All of the information relevant to the physics the kids are learning is shown; the energies, the momentum, and stats about the planet.</w:t>
+        <w:t xml:space="preserve">All of the information relevant to the physics the kids are learning is shown; the energies, the momentum, and stats about the planet. Kids are expected to know the acronyms GPE and KE for GCSE, so it is okay to use them.</w:t>
       </w:r>
       <w:r>
         <w:rPr>
@@ -7782,7 +7793,7 @@
     </w:p>
     <w:p>
       <w:pPr>
-        <w:pStyle w:val="723"/>
+        <w:pStyle w:val="680"/>
         <w:pBdr/>
         <w:spacing/>
         <w:ind/>
@@ -7811,7 +7822,7 @@
     </w:p>
     <w:p>
       <w:pPr>
-        <w:pStyle w:val="899"/>
+        <w:pStyle w:val="856"/>
         <w:numPr>
           <w:ilvl w:val="0"/>
           <w:numId w:val="7"/>
@@ -7828,7 +7839,7 @@
     </w:p>
     <w:p>
       <w:pPr>
-        <w:pStyle w:val="899"/>
+        <w:pStyle w:val="856"/>
         <w:numPr>
           <w:ilvl w:val="1"/>
           <w:numId w:val="7"/>
@@ -7853,7 +7864,7 @@
     </w:p>
     <w:p>
       <w:pPr>
-        <w:pStyle w:val="899"/>
+        <w:pStyle w:val="856"/>
         <w:numPr>
           <w:ilvl w:val="1"/>
           <w:numId w:val="7"/>
@@ -7873,7 +7884,7 @@
     </w:p>
     <w:p>
       <w:pPr>
-        <w:pStyle w:val="899"/>
+        <w:pStyle w:val="856"/>
         <w:numPr>
           <w:ilvl w:val="0"/>
           <w:numId w:val="7"/>
@@ -7898,7 +7909,7 @@
     </w:p>
     <w:p>
       <w:pPr>
-        <w:pStyle w:val="899"/>
+        <w:pStyle w:val="856"/>
         <w:numPr>
           <w:ilvl w:val="1"/>
           <w:numId w:val="7"/>
@@ -7923,7 +7934,7 @@
     </w:p>
     <w:p>
       <w:pPr>
-        <w:pStyle w:val="899"/>
+        <w:pStyle w:val="856"/>
         <w:numPr>
           <w:ilvl w:val="2"/>
           <w:numId w:val="7"/>
@@ -7948,7 +7959,7 @@
     </w:p>
     <w:p>
       <w:pPr>
-        <w:pStyle w:val="899"/>
+        <w:pStyle w:val="856"/>
         <w:numPr>
           <w:ilvl w:val="2"/>
           <w:numId w:val="7"/>
@@ -7973,7 +7984,7 @@
     </w:p>
     <w:p>
       <w:pPr>
-        <w:pStyle w:val="899"/>
+        <w:pStyle w:val="856"/>
         <w:numPr>
           <w:ilvl w:val="1"/>
           <w:numId w:val="7"/>
@@ -7998,7 +8009,7 @@
     </w:p>
     <w:p>
       <w:pPr>
-        <w:pStyle w:val="899"/>
+        <w:pStyle w:val="856"/>
         <w:numPr>
           <w:ilvl w:val="2"/>
           <w:numId w:val="7"/>
@@ -8023,7 +8034,7 @@
     </w:p>
     <w:p>
       <w:pPr>
-        <w:pStyle w:val="899"/>
+        <w:pStyle w:val="856"/>
         <w:numPr>
           <w:ilvl w:val="2"/>
           <w:numId w:val="7"/>
@@ -8048,7 +8059,7 @@
     </w:p>
     <w:p>
       <w:pPr>
-        <w:pStyle w:val="899"/>
+        <w:pStyle w:val="856"/>
         <w:numPr>
           <w:ilvl w:val="3"/>
           <w:numId w:val="7"/>
@@ -8073,7 +8084,7 @@
     </w:p>
     <w:p>
       <w:pPr>
-        <w:pStyle w:val="899"/>
+        <w:pStyle w:val="856"/>
         <w:numPr>
           <w:ilvl w:val="3"/>
           <w:numId w:val="7"/>
@@ -8098,7 +8109,7 @@
     </w:p>
     <w:p>
       <w:pPr>
-        <w:pStyle w:val="899"/>
+        <w:pStyle w:val="856"/>
         <w:numPr>
           <w:ilvl w:val="3"/>
           <w:numId w:val="7"/>
@@ -8123,7 +8134,7 @@
     </w:p>
     <w:p>
       <w:pPr>
-        <w:pStyle w:val="899"/>
+        <w:pStyle w:val="856"/>
         <w:numPr>
           <w:ilvl w:val="2"/>
           <w:numId w:val="7"/>
@@ -8148,7 +8159,7 @@
     </w:p>
     <w:p>
       <w:pPr>
-        <w:pStyle w:val="899"/>
+        <w:pStyle w:val="856"/>
         <w:numPr>
           <w:ilvl w:val="3"/>
           <w:numId w:val="7"/>
@@ -8173,7 +8184,7 @@
     </w:p>
     <w:p>
       <w:pPr>
-        <w:pStyle w:val="899"/>
+        <w:pStyle w:val="856"/>
         <w:numPr>
           <w:ilvl w:val="2"/>
           <w:numId w:val="7"/>
@@ -8198,7 +8209,7 @@
     </w:p>
     <w:p>
       <w:pPr>
-        <w:pStyle w:val="899"/>
+        <w:pStyle w:val="856"/>
         <w:numPr>
           <w:ilvl w:val="3"/>
           <w:numId w:val="7"/>
@@ -8223,7 +8234,7 @@
     </w:p>
     <w:p>
       <w:pPr>
-        <w:pStyle w:val="899"/>
+        <w:pStyle w:val="856"/>
         <w:numPr>
           <w:ilvl w:val="1"/>
           <w:numId w:val="7"/>
@@ -8248,7 +8259,7 @@
     </w:p>
     <w:p>
       <w:pPr>
-        <w:pStyle w:val="899"/>
+        <w:pStyle w:val="856"/>
         <w:numPr>
           <w:ilvl w:val="0"/>
           <w:numId w:val="7"/>
@@ -8268,7 +8279,7 @@
     </w:p>
     <w:p>
       <w:pPr>
-        <w:pStyle w:val="899"/>
+        <w:pStyle w:val="856"/>
         <w:numPr>
           <w:ilvl w:val="1"/>
           <w:numId w:val="7"/>
@@ -8293,7 +8304,7 @@
     </w:p>
     <w:p>
       <w:pPr>
-        <w:pStyle w:val="899"/>
+        <w:pStyle w:val="856"/>
         <w:numPr>
           <w:ilvl w:val="1"/>
           <w:numId w:val="7"/>
@@ -8318,7 +8329,7 @@
     </w:p>
     <w:p>
       <w:pPr>
-        <w:pStyle w:val="899"/>
+        <w:pStyle w:val="856"/>
         <w:numPr>
           <w:ilvl w:val="1"/>
           <w:numId w:val="7"/>
@@ -8343,7 +8354,7 @@
     </w:p>
     <w:p>
       <w:pPr>
-        <w:pStyle w:val="899"/>
+        <w:pStyle w:val="856"/>
         <w:numPr>
           <w:ilvl w:val="1"/>
           <w:numId w:val="7"/>
@@ -8368,7 +8379,7 @@
     </w:p>
     <w:p>
       <w:pPr>
-        <w:pStyle w:val="899"/>
+        <w:pStyle w:val="856"/>
         <w:numPr>
           <w:ilvl w:val="0"/>
           <w:numId w:val="7"/>
@@ -8393,7 +8404,7 @@
     </w:p>
     <w:p>
       <w:pPr>
-        <w:pStyle w:val="899"/>
+        <w:pStyle w:val="856"/>
         <w:numPr>
           <w:ilvl w:val="0"/>
           <w:numId w:val="7"/>
@@ -8418,7 +8429,7 @@
     </w:p>
     <w:p>
       <w:pPr>
-        <w:pStyle w:val="899"/>
+        <w:pStyle w:val="856"/>
         <w:numPr>
           <w:ilvl w:val="1"/>
           <w:numId w:val="7"/>
@@ -8443,7 +8454,7 @@
     </w:p>
     <w:p>
       <w:pPr>
-        <w:pStyle w:val="899"/>
+        <w:pStyle w:val="856"/>
         <w:numPr>
           <w:ilvl w:val="0"/>
           <w:numId w:val="7"/>
@@ -8470,7 +8481,7 @@
       <w:footnotePr/>
       <w:endnotePr/>
       <w:type w:val="nextPage"/>
-      <w:pgSz w:h="16838" w:orient="portrait" w:w="11906"/>
+      <w:pgSz w:h="16838" w:orient="landscape" w:w="11906"/>
       <w:pgMar w:top="1134" w:right="850" w:bottom="1134" w:left="1701" w:header="709" w:footer="709" w:gutter="0"/>
       <w:cols w:num="1" w:sep="0" w:space="708" w:equalWidth="1"/>
     </w:sectPr>
@@ -9696,9 +9707,9 @@
     <w:lsdException w:name="Bibliography" w:uiPriority="37"/>
     <w:lsdException w:name="TOC Heading" w:uiPriority="39" w:qFormat="1"/>
   </w:latentStyles>
-  <w:style w:type="character" w:styleId="711">
+  <w:style w:type="character" w:styleId="668">
     <w:name w:val="Intense Emphasis"/>
-    <w:basedOn w:val="900"/>
+    <w:basedOn w:val="857"/>
     <w:uiPriority w:val="21"/>
     <w:qFormat/>
     <w:pPr>
@@ -9712,9 +9723,9 @@
       <w:color w:val="0f4761" w:themeColor="accent1" w:themeShade="BF"/>
     </w:rPr>
   </w:style>
-  <w:style w:type="character" w:styleId="712">
+  <w:style w:type="character" w:styleId="669">
     <w:name w:val="Intense Reference"/>
-    <w:basedOn w:val="900"/>
+    <w:basedOn w:val="857"/>
     <w:uiPriority w:val="32"/>
     <w:qFormat/>
     <w:pPr>
@@ -9730,9 +9741,9 @@
       <w:spacing w:val="5"/>
     </w:rPr>
   </w:style>
-  <w:style w:type="character" w:styleId="713">
+  <w:style w:type="character" w:styleId="670">
     <w:name w:val="Subtle Emphasis"/>
-    <w:basedOn w:val="900"/>
+    <w:basedOn w:val="857"/>
     <w:uiPriority w:val="19"/>
     <w:qFormat/>
     <w:pPr>
@@ -9746,9 +9757,9 @@
       <w:color w:val="404040" w:themeColor="text1" w:themeTint="BF"/>
     </w:rPr>
   </w:style>
-  <w:style w:type="character" w:styleId="714">
+  <w:style w:type="character" w:styleId="671">
     <w:name w:val="Emphasis"/>
-    <w:basedOn w:val="900"/>
+    <w:basedOn w:val="857"/>
     <w:uiPriority w:val="20"/>
     <w:qFormat/>
     <w:pPr>
@@ -9761,9 +9772,9 @@
       <w:iCs/>
     </w:rPr>
   </w:style>
-  <w:style w:type="character" w:styleId="715">
+  <w:style w:type="character" w:styleId="672">
     <w:name w:val="Strong"/>
-    <w:basedOn w:val="900"/>
+    <w:basedOn w:val="857"/>
     <w:uiPriority w:val="22"/>
     <w:qFormat/>
     <w:pPr>
@@ -9776,9 +9787,9 @@
       <w:bCs/>
     </w:rPr>
   </w:style>
-  <w:style w:type="character" w:styleId="716">
+  <w:style w:type="character" w:styleId="673">
     <w:name w:val="Subtle Reference"/>
-    <w:basedOn w:val="900"/>
+    <w:basedOn w:val="857"/>
     <w:uiPriority w:val="31"/>
     <w:qFormat/>
     <w:pPr>
@@ -9791,9 +9802,9 @@
       <w:color w:val="5a5a5a" w:themeColor="text1" w:themeTint="A5"/>
     </w:rPr>
   </w:style>
-  <w:style w:type="character" w:styleId="717">
+  <w:style w:type="character" w:styleId="674">
     <w:name w:val="Book Title"/>
-    <w:basedOn w:val="900"/>
+    <w:basedOn w:val="857"/>
     <w:uiPriority w:val="33"/>
     <w:qFormat/>
     <w:pPr>
@@ -9809,9 +9820,9 @@
       <w:spacing w:val="5"/>
     </w:rPr>
   </w:style>
-  <w:style w:type="character" w:styleId="718">
+  <w:style w:type="character" w:styleId="675">
     <w:name w:val="FollowedHyperlink"/>
-    <w:basedOn w:val="900"/>
+    <w:basedOn w:val="857"/>
     <w:uiPriority w:val="99"/>
     <w:semiHidden/>
     <w:unhideWhenUsed/>
@@ -9825,11 +9836,11 @@
       <w:u w:val="single"/>
     </w:rPr>
   </w:style>
-  <w:style w:type="paragraph" w:styleId="719">
+  <w:style w:type="paragraph" w:styleId="676">
     <w:name w:val="Heading 1"/>
-    <w:basedOn w:val="895"/>
-    <w:next w:val="895"/>
-    <w:link w:val="720"/>
+    <w:basedOn w:val="852"/>
+    <w:next w:val="852"/>
+    <w:link w:val="677"/>
     <w:uiPriority w:val="9"/>
     <w:qFormat/>
     <w:pPr>
@@ -9846,9 +9857,9 @@
       <w:szCs w:val="40"/>
     </w:rPr>
   </w:style>
-  <w:style w:type="character" w:styleId="720">
+  <w:style w:type="character" w:styleId="677">
     <w:name w:val="Heading 1 Char"/>
-    <w:link w:val="719"/>
+    <w:link w:val="676"/>
     <w:uiPriority w:val="9"/>
     <w:pPr>
       <w:pBdr/>
@@ -9861,11 +9872,11 @@
       <w:szCs w:val="40"/>
     </w:rPr>
   </w:style>
-  <w:style w:type="paragraph" w:styleId="721">
+  <w:style w:type="paragraph" w:styleId="678">
     <w:name w:val="Heading 2"/>
-    <w:basedOn w:val="895"/>
-    <w:next w:val="895"/>
-    <w:link w:val="722"/>
+    <w:basedOn w:val="852"/>
+    <w:next w:val="852"/>
+    <w:link w:val="679"/>
     <w:uiPriority w:val="9"/>
     <w:unhideWhenUsed/>
     <w:qFormat/>
@@ -9882,9 +9893,9 @@
       <w:sz w:val="34"/>
     </w:rPr>
   </w:style>
-  <w:style w:type="character" w:styleId="722">
+  <w:style w:type="character" w:styleId="679">
     <w:name w:val="Heading 2 Char"/>
-    <w:link w:val="721"/>
+    <w:link w:val="678"/>
     <w:uiPriority w:val="9"/>
     <w:pPr>
       <w:pBdr/>
@@ -9896,11 +9907,11 @@
       <w:sz w:val="34"/>
     </w:rPr>
   </w:style>
-  <w:style w:type="paragraph" w:styleId="723">
+  <w:style w:type="paragraph" w:styleId="680">
     <w:name w:val="Heading 3"/>
-    <w:basedOn w:val="895"/>
-    <w:next w:val="895"/>
-    <w:link w:val="724"/>
+    <w:basedOn w:val="852"/>
+    <w:next w:val="852"/>
+    <w:link w:val="681"/>
     <w:uiPriority w:val="9"/>
     <w:unhideWhenUsed/>
     <w:qFormat/>
@@ -9918,9 +9929,9 @@
       <w:szCs w:val="30"/>
     </w:rPr>
   </w:style>
-  <w:style w:type="character" w:styleId="724">
+  <w:style w:type="character" w:styleId="681">
     <w:name w:val="Heading 3 Char"/>
-    <w:link w:val="723"/>
+    <w:link w:val="680"/>
     <w:uiPriority w:val="9"/>
     <w:pPr>
       <w:pBdr/>
@@ -9933,11 +9944,11 @@
       <w:szCs w:val="30"/>
     </w:rPr>
   </w:style>
-  <w:style w:type="paragraph" w:styleId="725">
+  <w:style w:type="paragraph" w:styleId="682">
     <w:name w:val="Heading 4"/>
-    <w:basedOn w:val="895"/>
-    <w:next w:val="895"/>
-    <w:link w:val="726"/>
+    <w:basedOn w:val="852"/>
+    <w:next w:val="852"/>
+    <w:link w:val="683"/>
     <w:uiPriority w:val="9"/>
     <w:unhideWhenUsed/>
     <w:qFormat/>
@@ -9957,9 +9968,9 @@
       <w:szCs w:val="26"/>
     </w:rPr>
   </w:style>
-  <w:style w:type="character" w:styleId="726">
+  <w:style w:type="character" w:styleId="683">
     <w:name w:val="Heading 4 Char"/>
-    <w:link w:val="725"/>
+    <w:link w:val="682"/>
     <w:uiPriority w:val="9"/>
     <w:pPr>
       <w:pBdr/>
@@ -9974,11 +9985,11 @@
       <w:szCs w:val="26"/>
     </w:rPr>
   </w:style>
-  <w:style w:type="paragraph" w:styleId="727">
+  <w:style w:type="paragraph" w:styleId="684">
     <w:name w:val="Heading 5"/>
-    <w:basedOn w:val="895"/>
-    <w:next w:val="895"/>
-    <w:link w:val="728"/>
+    <w:basedOn w:val="852"/>
+    <w:next w:val="852"/>
+    <w:link w:val="685"/>
     <w:uiPriority w:val="9"/>
     <w:unhideWhenUsed/>
     <w:qFormat/>
@@ -9998,9 +10009,9 @@
       <w:szCs w:val="24"/>
     </w:rPr>
   </w:style>
-  <w:style w:type="character" w:styleId="728">
+  <w:style w:type="character" w:styleId="685">
     <w:name w:val="Heading 5 Char"/>
-    <w:link w:val="727"/>
+    <w:link w:val="684"/>
     <w:uiPriority w:val="9"/>
     <w:pPr>
       <w:pBdr/>
@@ -10015,11 +10026,11 @@
       <w:szCs w:val="24"/>
     </w:rPr>
   </w:style>
-  <w:style w:type="paragraph" w:styleId="729">
+  <w:style w:type="paragraph" w:styleId="686">
     <w:name w:val="Heading 6"/>
-    <w:basedOn w:val="895"/>
-    <w:next w:val="895"/>
-    <w:link w:val="730"/>
+    <w:basedOn w:val="852"/>
+    <w:next w:val="852"/>
+    <w:link w:val="687"/>
     <w:uiPriority w:val="9"/>
     <w:unhideWhenUsed/>
     <w:qFormat/>
@@ -10039,9 +10050,9 @@
       <w:szCs w:val="22"/>
     </w:rPr>
   </w:style>
-  <w:style w:type="character" w:styleId="730">
+  <w:style w:type="character" w:styleId="687">
     <w:name w:val="Heading 6 Char"/>
-    <w:link w:val="729"/>
+    <w:link w:val="686"/>
     <w:uiPriority w:val="9"/>
     <w:pPr>
       <w:pBdr/>
@@ -10056,11 +10067,11 @@
       <w:szCs w:val="22"/>
     </w:rPr>
   </w:style>
-  <w:style w:type="paragraph" w:styleId="731">
+  <w:style w:type="paragraph" w:styleId="688">
     <w:name w:val="Heading 7"/>
-    <w:basedOn w:val="895"/>
-    <w:next w:val="895"/>
-    <w:link w:val="732"/>
+    <w:basedOn w:val="852"/>
+    <w:next w:val="852"/>
+    <w:link w:val="689"/>
     <w:uiPriority w:val="9"/>
     <w:unhideWhenUsed/>
     <w:qFormat/>
@@ -10082,9 +10093,9 @@
       <w:szCs w:val="22"/>
     </w:rPr>
   </w:style>
-  <w:style w:type="character" w:styleId="732">
+  <w:style w:type="character" w:styleId="689">
     <w:name w:val="Heading 7 Char"/>
-    <w:link w:val="731"/>
+    <w:link w:val="688"/>
     <w:uiPriority w:val="9"/>
     <w:pPr>
       <w:pBdr/>
@@ -10101,11 +10112,11 @@
       <w:szCs w:val="22"/>
     </w:rPr>
   </w:style>
-  <w:style w:type="paragraph" w:styleId="733">
+  <w:style w:type="paragraph" w:styleId="690">
     <w:name w:val="Heading 8"/>
-    <w:basedOn w:val="895"/>
-    <w:next w:val="895"/>
-    <w:link w:val="734"/>
+    <w:basedOn w:val="852"/>
+    <w:next w:val="852"/>
+    <w:link w:val="691"/>
     <w:uiPriority w:val="9"/>
     <w:unhideWhenUsed/>
     <w:qFormat/>
@@ -10125,9 +10136,9 @@
       <w:szCs w:val="22"/>
     </w:rPr>
   </w:style>
-  <w:style w:type="character" w:styleId="734">
+  <w:style w:type="character" w:styleId="691">
     <w:name w:val="Heading 8 Char"/>
-    <w:link w:val="733"/>
+    <w:link w:val="690"/>
     <w:uiPriority w:val="9"/>
     <w:pPr>
       <w:pBdr/>
@@ -10142,11 +10153,11 @@
       <w:szCs w:val="22"/>
     </w:rPr>
   </w:style>
-  <w:style w:type="paragraph" w:styleId="735">
+  <w:style w:type="paragraph" w:styleId="692">
     <w:name w:val="Heading 9"/>
-    <w:basedOn w:val="895"/>
-    <w:next w:val="895"/>
-    <w:link w:val="736"/>
+    <w:basedOn w:val="852"/>
+    <w:next w:val="852"/>
+    <w:link w:val="693"/>
     <w:uiPriority w:val="9"/>
     <w:unhideWhenUsed/>
     <w:qFormat/>
@@ -10166,9 +10177,9 @@
       <w:szCs w:val="21"/>
     </w:rPr>
   </w:style>
-  <w:style w:type="character" w:styleId="736">
+  <w:style w:type="character" w:styleId="693">
     <w:name w:val="Heading 9 Char"/>
-    <w:link w:val="735"/>
+    <w:link w:val="692"/>
     <w:uiPriority w:val="9"/>
     <w:pPr>
       <w:pBdr/>
@@ -10183,11 +10194,11 @@
       <w:szCs w:val="21"/>
     </w:rPr>
   </w:style>
-  <w:style w:type="paragraph" w:styleId="737">
+  <w:style w:type="paragraph" w:styleId="694">
     <w:name w:val="Title"/>
-    <w:basedOn w:val="895"/>
-    <w:next w:val="895"/>
-    <w:link w:val="738"/>
+    <w:basedOn w:val="852"/>
+    <w:next w:val="852"/>
+    <w:link w:val="695"/>
     <w:uiPriority w:val="10"/>
     <w:qFormat/>
     <w:pPr>
@@ -10201,9 +10212,9 @@
       <w:szCs w:val="48"/>
     </w:rPr>
   </w:style>
-  <w:style w:type="character" w:styleId="738">
+  <w:style w:type="character" w:styleId="695">
     <w:name w:val="Title Char"/>
-    <w:link w:val="737"/>
+    <w:link w:val="694"/>
     <w:uiPriority w:val="10"/>
     <w:pPr>
       <w:pBdr/>
@@ -10215,11 +10226,11 @@
       <w:szCs w:val="48"/>
     </w:rPr>
   </w:style>
-  <w:style w:type="paragraph" w:styleId="739">
+  <w:style w:type="paragraph" w:styleId="696">
     <w:name w:val="Subtitle"/>
-    <w:basedOn w:val="895"/>
-    <w:next w:val="895"/>
-    <w:link w:val="740"/>
+    <w:basedOn w:val="852"/>
+    <w:next w:val="852"/>
+    <w:link w:val="697"/>
     <w:uiPriority w:val="11"/>
     <w:qFormat/>
     <w:pPr>
@@ -10232,9 +10243,9 @@
       <w:szCs w:val="24"/>
     </w:rPr>
   </w:style>
-  <w:style w:type="character" w:styleId="740">
+  <w:style w:type="character" w:styleId="697">
     <w:name w:val="Subtitle Char"/>
-    <w:link w:val="739"/>
+    <w:link w:val="696"/>
     <w:uiPriority w:val="11"/>
     <w:pPr>
       <w:pBdr/>
@@ -10246,11 +10257,11 @@
       <w:szCs w:val="24"/>
     </w:rPr>
   </w:style>
-  <w:style w:type="paragraph" w:styleId="741">
+  <w:style w:type="paragraph" w:styleId="698">
     <w:name w:val="Quote"/>
-    <w:basedOn w:val="895"/>
-    <w:next w:val="895"/>
-    <w:link w:val="742"/>
+    <w:basedOn w:val="852"/>
+    <w:next w:val="852"/>
+    <w:link w:val="699"/>
     <w:uiPriority w:val="29"/>
     <w:qFormat/>
     <w:pPr>
@@ -10262,9 +10273,9 @@
       <w:i/>
     </w:rPr>
   </w:style>
-  <w:style w:type="character" w:styleId="742">
+  <w:style w:type="character" w:styleId="699">
     <w:name w:val="Quote Char"/>
-    <w:link w:val="741"/>
+    <w:link w:val="698"/>
     <w:uiPriority w:val="29"/>
     <w:pPr>
       <w:pBdr/>
@@ -10275,11 +10286,11 @@
       <w:i/>
     </w:rPr>
   </w:style>
-  <w:style w:type="paragraph" w:styleId="743">
+  <w:style w:type="paragraph" w:styleId="700">
     <w:name w:val="Intense Quote"/>
-    <w:basedOn w:val="895"/>
-    <w:next w:val="895"/>
-    <w:link w:val="744"/>
+    <w:basedOn w:val="852"/>
+    <w:next w:val="852"/>
+    <w:link w:val="701"/>
     <w:uiPriority w:val="30"/>
     <w:qFormat/>
     <w:pPr>
@@ -10298,9 +10309,9 @@
       <w:i/>
     </w:rPr>
   </w:style>
-  <w:style w:type="character" w:styleId="744">
+  <w:style w:type="character" w:styleId="701">
     <w:name w:val="Intense Quote Char"/>
-    <w:link w:val="743"/>
+    <w:link w:val="700"/>
     <w:uiPriority w:val="30"/>
     <w:pPr>
       <w:pBdr/>
@@ -10311,10 +10322,10 @@
       <w:i/>
     </w:rPr>
   </w:style>
-  <w:style w:type="paragraph" w:styleId="745">
+  <w:style w:type="paragraph" w:styleId="702">
     <w:name w:val="Header"/>
-    <w:basedOn w:val="895"/>
-    <w:link w:val="746"/>
+    <w:basedOn w:val="852"/>
+    <w:link w:val="703"/>
     <w:uiPriority w:val="99"/>
     <w:unhideWhenUsed/>
     <w:pPr>
@@ -10327,9 +10338,9 @@
       <w:ind/>
     </w:pPr>
   </w:style>
-  <w:style w:type="character" w:styleId="746">
+  <w:style w:type="character" w:styleId="703">
     <w:name w:val="Header Char"/>
-    <w:link w:val="745"/>
+    <w:link w:val="702"/>
     <w:uiPriority w:val="99"/>
     <w:pPr>
       <w:pBdr/>
@@ -10337,10 +10348,10 @@
       <w:ind/>
     </w:pPr>
   </w:style>
-  <w:style w:type="paragraph" w:styleId="747">
+  <w:style w:type="paragraph" w:styleId="704">
     <w:name w:val="Footer"/>
-    <w:basedOn w:val="895"/>
-    <w:link w:val="750"/>
+    <w:basedOn w:val="852"/>
+    <w:link w:val="707"/>
     <w:uiPriority w:val="99"/>
     <w:unhideWhenUsed/>
     <w:pPr>
@@ -10353,9 +10364,9 @@
       <w:ind/>
     </w:pPr>
   </w:style>
-  <w:style w:type="character" w:styleId="748">
+  <w:style w:type="character" w:styleId="705">
     <w:name w:val="Footer Char"/>
-    <w:link w:val="747"/>
+    <w:link w:val="704"/>
     <w:uiPriority w:val="99"/>
     <w:pPr>
       <w:pBdr/>
@@ -10363,10 +10374,10 @@
       <w:ind/>
     </w:pPr>
   </w:style>
-  <w:style w:type="paragraph" w:styleId="749">
+  <w:style w:type="paragraph" w:styleId="706">
     <w:name w:val="Caption"/>
-    <w:basedOn w:val="895"/>
-    <w:next w:val="895"/>
+    <w:basedOn w:val="852"/>
+    <w:next w:val="852"/>
     <w:uiPriority w:val="35"/>
     <w:semiHidden/>
     <w:unhideWhenUsed/>
@@ -10384,10 +10395,10 @@
       <w:szCs w:val="18"/>
     </w:rPr>
   </w:style>
-  <w:style w:type="character" w:styleId="750">
+  <w:style w:type="character" w:styleId="707">
     <w:name w:val="Caption Char"/>
-    <w:basedOn w:val="749"/>
-    <w:link w:val="747"/>
+    <w:basedOn w:val="706"/>
+    <w:link w:val="704"/>
     <w:uiPriority w:val="99"/>
     <w:pPr>
       <w:pBdr/>
@@ -10395,9 +10406,9 @@
       <w:ind/>
     </w:pPr>
   </w:style>
-  <w:style w:type="table" w:styleId="751">
+  <w:style w:type="table" w:styleId="708">
     <w:name w:val="Table Grid"/>
-    <w:basedOn w:val="896"/>
+    <w:basedOn w:val="853"/>
     <w:uiPriority w:val="59"/>
     <w:pPr>
       <w:pBdr/>
@@ -10594,9 +10605,9 @@
       </w:tcPr>
     </w:tblStylePr>
   </w:style>
-  <w:style w:type="table" w:styleId="752">
+  <w:style w:type="table" w:styleId="709">
     <w:name w:val="Table Grid Light"/>
-    <w:basedOn w:val="896"/>
+    <w:basedOn w:val="853"/>
     <w:uiPriority w:val="59"/>
     <w:pPr>
       <w:pBdr/>
@@ -10793,9 +10804,9 @@
       </w:tcPr>
     </w:tblStylePr>
   </w:style>
-  <w:style w:type="table" w:styleId="753">
+  <w:style w:type="table" w:styleId="710">
     <w:name w:val="Plain Table 1"/>
-    <w:basedOn w:val="896"/>
+    <w:basedOn w:val="853"/>
     <w:uiPriority w:val="59"/>
     <w:pPr>
       <w:pBdr/>
@@ -11018,9 +11029,9 @@
       </w:tcPr>
     </w:tblStylePr>
   </w:style>
-  <w:style w:type="table" w:styleId="754">
+  <w:style w:type="table" w:styleId="711">
     <w:name w:val="Plain Table 2"/>
-    <w:basedOn w:val="896"/>
+    <w:basedOn w:val="853"/>
     <w:uiPriority w:val="59"/>
     <w:pPr>
       <w:pBdr/>
@@ -11251,9 +11262,9 @@
       </w:tcPr>
     </w:tblStylePr>
   </w:style>
-  <w:style w:type="table" w:styleId="755">
+  <w:style w:type="table" w:styleId="712">
     <w:name w:val="Plain Table 3"/>
-    <w:basedOn w:val="896"/>
+    <w:basedOn w:val="853"/>
     <w:uiPriority w:val="99"/>
     <w:pPr>
       <w:pBdr/>
@@ -11481,9 +11492,9 @@
       </w:tcPr>
     </w:tblStylePr>
   </w:style>
-  <w:style w:type="table" w:styleId="756">
+  <w:style w:type="table" w:styleId="713">
     <w:name w:val="Plain Table 4"/>
-    <w:basedOn w:val="896"/>
+    <w:basedOn w:val="853"/>
     <w:uiPriority w:val="99"/>
     <w:pPr>
       <w:pBdr/>
@@ -11697,9 +11708,9 @@
       </w:tcPr>
     </w:tblStylePr>
   </w:style>
-  <w:style w:type="table" w:styleId="757">
+  <w:style w:type="table" w:styleId="714">
     <w:name w:val="Plain Table 5"/>
-    <w:basedOn w:val="896"/>
+    <w:basedOn w:val="853"/>
     <w:uiPriority w:val="99"/>
     <w:pPr>
       <w:pBdr/>
@@ -11930,9 +11941,9 @@
       </w:tcPr>
     </w:tblStylePr>
   </w:style>
-  <w:style w:type="table" w:styleId="758">
+  <w:style w:type="table" w:styleId="715">
     <w:name w:val="Grid Table 1 Light"/>
-    <w:basedOn w:val="896"/>
+    <w:basedOn w:val="853"/>
     <w:uiPriority w:val="99"/>
     <w:pPr>
       <w:pBdr/>
@@ -12153,9 +12164,9 @@
       </w:tcPr>
     </w:tblStylePr>
   </w:style>
-  <w:style w:type="table" w:styleId="759">
+  <w:style w:type="table" w:styleId="716">
     <w:name w:val="Grid Table 1 Light - Accent 1"/>
-    <w:basedOn w:val="896"/>
+    <w:basedOn w:val="853"/>
     <w:uiPriority w:val="99"/>
     <w:pPr>
       <w:pBdr/>
@@ -12376,9 +12387,9 @@
       </w:tcPr>
     </w:tblStylePr>
   </w:style>
-  <w:style w:type="table" w:styleId="760">
+  <w:style w:type="table" w:styleId="717">
     <w:name w:val="Grid Table 1 Light - Accent 2"/>
-    <w:basedOn w:val="896"/>
+    <w:basedOn w:val="853"/>
     <w:uiPriority w:val="99"/>
     <w:pPr>
       <w:pBdr/>
@@ -12599,9 +12610,9 @@
       </w:tcPr>
     </w:tblStylePr>
   </w:style>
-  <w:style w:type="table" w:styleId="761">
+  <w:style w:type="table" w:styleId="718">
     <w:name w:val="Grid Table 1 Light - Accent 3"/>
-    <w:basedOn w:val="896"/>
+    <w:basedOn w:val="853"/>
     <w:uiPriority w:val="99"/>
     <w:pPr>
       <w:pBdr/>
@@ -12822,9 +12833,9 @@
       </w:tcPr>
     </w:tblStylePr>
   </w:style>
-  <w:style w:type="table" w:styleId="762">
+  <w:style w:type="table" w:styleId="719">
     <w:name w:val="Grid Table 1 Light - Accent 4"/>
-    <w:basedOn w:val="896"/>
+    <w:basedOn w:val="853"/>
     <w:uiPriority w:val="99"/>
     <w:pPr>
       <w:pBdr/>
@@ -13045,9 +13056,9 @@
       </w:tcPr>
     </w:tblStylePr>
   </w:style>
-  <w:style w:type="table" w:styleId="763">
+  <w:style w:type="table" w:styleId="720">
     <w:name w:val="Grid Table 1 Light - Accent 5"/>
-    <w:basedOn w:val="896"/>
+    <w:basedOn w:val="853"/>
     <w:uiPriority w:val="99"/>
     <w:pPr>
       <w:pBdr/>
@@ -13268,9 +13279,9 @@
       </w:tcPr>
     </w:tblStylePr>
   </w:style>
-  <w:style w:type="table" w:styleId="764">
+  <w:style w:type="table" w:styleId="721">
     <w:name w:val="Grid Table 1 Light - Accent 6"/>
-    <w:basedOn w:val="896"/>
+    <w:basedOn w:val="853"/>
     <w:uiPriority w:val="99"/>
     <w:pPr>
       <w:pBdr/>
@@ -13491,9 +13502,9 @@
       </w:tcPr>
     </w:tblStylePr>
   </w:style>
-  <w:style w:type="table" w:styleId="765">
+  <w:style w:type="table" w:styleId="722">
     <w:name w:val="Grid Table 2"/>
-    <w:basedOn w:val="896"/>
+    <w:basedOn w:val="853"/>
     <w:uiPriority w:val="99"/>
     <w:pPr>
       <w:pBdr/>
@@ -13723,9 +13734,9 @@
       </w:tcPr>
     </w:tblStylePr>
   </w:style>
-  <w:style w:type="table" w:styleId="766">
+  <w:style w:type="table" w:styleId="723">
     <w:name w:val="Grid Table 2 - Accent 1"/>
-    <w:basedOn w:val="896"/>
+    <w:basedOn w:val="853"/>
     <w:uiPriority w:val="99"/>
     <w:pPr>
       <w:pBdr/>
@@ -13955,9 +13966,9 @@
       </w:tcPr>
     </w:tblStylePr>
   </w:style>
-  <w:style w:type="table" w:styleId="767">
+  <w:style w:type="table" w:styleId="724">
     <w:name w:val="Grid Table 2 - Accent 2"/>
-    <w:basedOn w:val="896"/>
+    <w:basedOn w:val="853"/>
     <w:uiPriority w:val="99"/>
     <w:pPr>
       <w:pBdr/>
@@ -14187,9 +14198,9 @@
       </w:tcPr>
     </w:tblStylePr>
   </w:style>
-  <w:style w:type="table" w:styleId="768">
+  <w:style w:type="table" w:styleId="725">
     <w:name w:val="Grid Table 2 - Accent 3"/>
-    <w:basedOn w:val="896"/>
+    <w:basedOn w:val="853"/>
     <w:uiPriority w:val="99"/>
     <w:pPr>
       <w:pBdr/>
@@ -14419,9 +14430,9 @@
       </w:tcPr>
     </w:tblStylePr>
   </w:style>
-  <w:style w:type="table" w:styleId="769">
+  <w:style w:type="table" w:styleId="726">
     <w:name w:val="Grid Table 2 - Accent 4"/>
-    <w:basedOn w:val="896"/>
+    <w:basedOn w:val="853"/>
     <w:uiPriority w:val="99"/>
     <w:pPr>
       <w:pBdr/>
@@ -14651,9 +14662,9 @@
       </w:tcPr>
     </w:tblStylePr>
   </w:style>
-  <w:style w:type="table" w:styleId="770">
+  <w:style w:type="table" w:styleId="727">
     <w:name w:val="Grid Table 2 - Accent 5"/>
-    <w:basedOn w:val="896"/>
+    <w:basedOn w:val="853"/>
     <w:uiPriority w:val="99"/>
     <w:pPr>
       <w:pBdr/>
@@ -14883,9 +14894,9 @@
       </w:tcPr>
     </w:tblStylePr>
   </w:style>
-  <w:style w:type="table" w:styleId="771">
+  <w:style w:type="table" w:styleId="728">
     <w:name w:val="Grid Table 2 - Accent 6"/>
-    <w:basedOn w:val="896"/>
+    <w:basedOn w:val="853"/>
     <w:uiPriority w:val="99"/>
     <w:pPr>
       <w:pBdr/>
@@ -15115,9 +15126,9 @@
       </w:tcPr>
     </w:tblStylePr>
   </w:style>
-  <w:style w:type="table" w:styleId="772">
+  <w:style w:type="table" w:styleId="729">
     <w:name w:val="Grid Table 3"/>
-    <w:basedOn w:val="896"/>
+    <w:basedOn w:val="853"/>
     <w:uiPriority w:val="99"/>
     <w:pPr>
       <w:pBdr/>
@@ -15360,9 +15371,9 @@
       </w:tcPr>
     </w:tblStylePr>
   </w:style>
-  <w:style w:type="table" w:styleId="773">
+  <w:style w:type="table" w:styleId="730">
     <w:name w:val="Grid Table 3 - Accent 1"/>
-    <w:basedOn w:val="896"/>
+    <w:basedOn w:val="853"/>
     <w:uiPriority w:val="99"/>
     <w:pPr>
       <w:pBdr/>
@@ -15605,9 +15616,9 @@
       </w:tcPr>
     </w:tblStylePr>
   </w:style>
-  <w:style w:type="table" w:styleId="774">
+  <w:style w:type="table" w:styleId="731">
     <w:name w:val="Grid Table 3 - Accent 2"/>
-    <w:basedOn w:val="896"/>
+    <w:basedOn w:val="853"/>
     <w:uiPriority w:val="99"/>
     <w:pPr>
       <w:pBdr/>
@@ -15850,9 +15861,9 @@
       </w:tcPr>
     </w:tblStylePr>
   </w:style>
-  <w:style w:type="table" w:styleId="775">
+  <w:style w:type="table" w:styleId="732">
     <w:name w:val="Grid Table 3 - Accent 3"/>
-    <w:basedOn w:val="896"/>
+    <w:basedOn w:val="853"/>
     <w:uiPriority w:val="99"/>
     <w:pPr>
       <w:pBdr/>
@@ -16095,9 +16106,9 @@
       </w:tcPr>
     </w:tblStylePr>
   </w:style>
-  <w:style w:type="table" w:styleId="776">
+  <w:style w:type="table" w:styleId="733">
     <w:name w:val="Grid Table 3 - Accent 4"/>
-    <w:basedOn w:val="896"/>
+    <w:basedOn w:val="853"/>
     <w:uiPriority w:val="99"/>
     <w:pPr>
       <w:pBdr/>
@@ -16340,9 +16351,9 @@
       </w:tcPr>
     </w:tblStylePr>
   </w:style>
-  <w:style w:type="table" w:styleId="777">
+  <w:style w:type="table" w:styleId="734">
     <w:name w:val="Grid Table 3 - Accent 5"/>
-    <w:basedOn w:val="896"/>
+    <w:basedOn w:val="853"/>
     <w:uiPriority w:val="99"/>
     <w:pPr>
       <w:pBdr/>
@@ -16585,9 +16596,9 @@
       </w:tcPr>
     </w:tblStylePr>
   </w:style>
-  <w:style w:type="table" w:styleId="778">
+  <w:style w:type="table" w:styleId="735">
     <w:name w:val="Grid Table 3 - Accent 6"/>
-    <w:basedOn w:val="896"/>
+    <w:basedOn w:val="853"/>
     <w:uiPriority w:val="99"/>
     <w:pPr>
       <w:pBdr/>
@@ -16830,9 +16841,9 @@
       </w:tcPr>
     </w:tblStylePr>
   </w:style>
-  <w:style w:type="table" w:styleId="779">
+  <w:style w:type="table" w:styleId="736">
     <w:name w:val="Grid Table 4"/>
-    <w:basedOn w:val="896"/>
+    <w:basedOn w:val="853"/>
     <w:uiPriority w:val="59"/>
     <w:pPr>
       <w:pBdr/>
@@ -17063,9 +17074,9 @@
       </w:tcPr>
     </w:tblStylePr>
   </w:style>
-  <w:style w:type="table" w:styleId="780">
+  <w:style w:type="table" w:styleId="737">
     <w:name w:val="Grid Table 4 - Accent 1"/>
-    <w:basedOn w:val="896"/>
+    <w:basedOn w:val="853"/>
     <w:uiPriority w:val="59"/>
     <w:pPr>
       <w:pBdr/>
@@ -17296,9 +17307,9 @@
       </w:tcPr>
     </w:tblStylePr>
   </w:style>
-  <w:style w:type="table" w:styleId="781">
+  <w:style w:type="table" w:styleId="738">
     <w:name w:val="Grid Table 4 - Accent 2"/>
-    <w:basedOn w:val="896"/>
+    <w:basedOn w:val="853"/>
     <w:uiPriority w:val="59"/>
     <w:pPr>
       <w:pBdr/>
@@ -17529,9 +17540,9 @@
       </w:tcPr>
     </w:tblStylePr>
   </w:style>
-  <w:style w:type="table" w:styleId="782">
+  <w:style w:type="table" w:styleId="739">
     <w:name w:val="Grid Table 4 - Accent 3"/>
-    <w:basedOn w:val="896"/>
+    <w:basedOn w:val="853"/>
     <w:uiPriority w:val="59"/>
     <w:pPr>
       <w:pBdr/>
@@ -17762,9 +17773,9 @@
       </w:tcPr>
     </w:tblStylePr>
   </w:style>
-  <w:style w:type="table" w:styleId="783">
+  <w:style w:type="table" w:styleId="740">
     <w:name w:val="Grid Table 4 - Accent 4"/>
-    <w:basedOn w:val="896"/>
+    <w:basedOn w:val="853"/>
     <w:uiPriority w:val="59"/>
     <w:pPr>
       <w:pBdr/>
@@ -17995,9 +18006,9 @@
       </w:tcPr>
     </w:tblStylePr>
   </w:style>
-  <w:style w:type="table" w:styleId="784">
+  <w:style w:type="table" w:styleId="741">
     <w:name w:val="Grid Table 4 - Accent 5"/>
-    <w:basedOn w:val="896"/>
+    <w:basedOn w:val="853"/>
     <w:uiPriority w:val="59"/>
     <w:pPr>
       <w:pBdr/>
@@ -18228,9 +18239,9 @@
       </w:tcPr>
     </w:tblStylePr>
   </w:style>
-  <w:style w:type="table" w:styleId="785">
+  <w:style w:type="table" w:styleId="742">
     <w:name w:val="Grid Table 4 - Accent 6"/>
-    <w:basedOn w:val="896"/>
+    <w:basedOn w:val="853"/>
     <w:uiPriority w:val="59"/>
     <w:pPr>
       <w:pBdr/>
@@ -18461,9 +18472,9 @@
       </w:tcPr>
     </w:tblStylePr>
   </w:style>
-  <w:style w:type="table" w:styleId="786">
+  <w:style w:type="table" w:styleId="743">
     <w:name w:val="Grid Table 5 Dark"/>
-    <w:basedOn w:val="896"/>
+    <w:basedOn w:val="853"/>
     <w:uiPriority w:val="99"/>
     <w:pPr>
       <w:pBdr/>
@@ -18689,9 +18700,9 @@
       </w:tcPr>
     </w:tblStylePr>
   </w:style>
-  <w:style w:type="table" w:styleId="787">
+  <w:style w:type="table" w:styleId="744">
     <w:name w:val="Grid Table 5 Dark- Accent 1"/>
-    <w:basedOn w:val="896"/>
+    <w:basedOn w:val="853"/>
     <w:uiPriority w:val="99"/>
     <w:pPr>
       <w:pBdr/>
@@ -18917,9 +18928,9 @@
       </w:tcPr>
     </w:tblStylePr>
   </w:style>
-  <w:style w:type="table" w:styleId="788">
+  <w:style w:type="table" w:styleId="745">
     <w:name w:val="Grid Table 5 Dark - Accent 2"/>
-    <w:basedOn w:val="896"/>
+    <w:basedOn w:val="853"/>
     <w:uiPriority w:val="99"/>
     <w:pPr>
       <w:pBdr/>
@@ -19145,9 +19156,9 @@
       </w:tcPr>
     </w:tblStylePr>
   </w:style>
-  <w:style w:type="table" w:styleId="789">
+  <w:style w:type="table" w:styleId="746">
     <w:name w:val="Grid Table 5 Dark - Accent 3"/>
-    <w:basedOn w:val="896"/>
+    <w:basedOn w:val="853"/>
     <w:uiPriority w:val="99"/>
     <w:pPr>
       <w:pBdr/>
@@ -19373,9 +19384,9 @@
       </w:tcPr>
     </w:tblStylePr>
   </w:style>
-  <w:style w:type="table" w:styleId="790">
+  <w:style w:type="table" w:styleId="747">
     <w:name w:val="Grid Table 5 Dark- Accent 4"/>
-    <w:basedOn w:val="896"/>
+    <w:basedOn w:val="853"/>
     <w:uiPriority w:val="99"/>
     <w:pPr>
       <w:pBdr/>
@@ -19601,9 +19612,9 @@
       </w:tcPr>
     </w:tblStylePr>
   </w:style>
-  <w:style w:type="table" w:styleId="791">
+  <w:style w:type="table" w:styleId="748">
     <w:name w:val="Grid Table 5 Dark - Accent 5"/>
-    <w:basedOn w:val="896"/>
+    <w:basedOn w:val="853"/>
     <w:uiPriority w:val="99"/>
     <w:pPr>
       <w:pBdr/>
@@ -19829,9 +19840,9 @@
       </w:tcPr>
     </w:tblStylePr>
   </w:style>
-  <w:style w:type="table" w:styleId="792">
+  <w:style w:type="table" w:styleId="749">
     <w:name w:val="Grid Table 5 Dark - Accent 6"/>
-    <w:basedOn w:val="896"/>
+    <w:basedOn w:val="853"/>
     <w:uiPriority w:val="99"/>
     <w:pPr>
       <w:pBdr/>
@@ -20057,9 +20068,9 @@
       </w:tcPr>
     </w:tblStylePr>
   </w:style>
-  <w:style w:type="table" w:styleId="793">
+  <w:style w:type="table" w:styleId="750">
     <w:name w:val="Grid Table 6 Colorful"/>
-    <w:basedOn w:val="896"/>
+    <w:basedOn w:val="853"/>
     <w:uiPriority w:val="99"/>
     <w:pPr>
       <w:pBdr/>
@@ -20287,9 +20298,9 @@
       </w:tcPr>
     </w:tblStylePr>
   </w:style>
-  <w:style w:type="table" w:styleId="794">
+  <w:style w:type="table" w:styleId="751">
     <w:name w:val="Grid Table 6 Colorful - Accent 1"/>
-    <w:basedOn w:val="896"/>
+    <w:basedOn w:val="853"/>
     <w:uiPriority w:val="99"/>
     <w:pPr>
       <w:pBdr/>
@@ -20517,9 +20528,9 @@
       </w:tcPr>
     </w:tblStylePr>
   </w:style>
-  <w:style w:type="table" w:styleId="795">
+  <w:style w:type="table" w:styleId="752">
     <w:name w:val="Grid Table 6 Colorful - Accent 2"/>
-    <w:basedOn w:val="896"/>
+    <w:basedOn w:val="853"/>
     <w:uiPriority w:val="99"/>
     <w:pPr>
       <w:pBdr/>
@@ -20747,9 +20758,9 @@
       </w:tcPr>
     </w:tblStylePr>
   </w:style>
-  <w:style w:type="table" w:styleId="796">
+  <w:style w:type="table" w:styleId="753">
     <w:name w:val="Grid Table 6 Colorful - Accent 3"/>
-    <w:basedOn w:val="896"/>
+    <w:basedOn w:val="853"/>
     <w:uiPriority w:val="99"/>
     <w:pPr>
       <w:pBdr/>
@@ -20977,9 +20988,9 @@
       </w:tcPr>
     </w:tblStylePr>
   </w:style>
-  <w:style w:type="table" w:styleId="797">
+  <w:style w:type="table" w:styleId="754">
     <w:name w:val="Grid Table 6 Colorful - Accent 4"/>
-    <w:basedOn w:val="896"/>
+    <w:basedOn w:val="853"/>
     <w:uiPriority w:val="99"/>
     <w:pPr>
       <w:pBdr/>
@@ -21207,9 +21218,9 @@
       </w:tcPr>
     </w:tblStylePr>
   </w:style>
-  <w:style w:type="table" w:styleId="798">
+  <w:style w:type="table" w:styleId="755">
     <w:name w:val="Grid Table 6 Colorful - Accent 5"/>
-    <w:basedOn w:val="896"/>
+    <w:basedOn w:val="853"/>
     <w:uiPriority w:val="99"/>
     <w:pPr>
       <w:pBdr/>
@@ -21437,9 +21448,9 @@
       </w:tcPr>
     </w:tblStylePr>
   </w:style>
-  <w:style w:type="table" w:styleId="799">
+  <w:style w:type="table" w:styleId="756">
     <w:name w:val="Grid Table 6 Colorful - Accent 6"/>
-    <w:basedOn w:val="896"/>
+    <w:basedOn w:val="853"/>
     <w:uiPriority w:val="99"/>
     <w:pPr>
       <w:pBdr/>
@@ -21667,9 +21678,9 @@
       </w:tcPr>
     </w:tblStylePr>
   </w:style>
-  <w:style w:type="table" w:styleId="800">
+  <w:style w:type="table" w:styleId="757">
     <w:name w:val="Grid Table 7 Colorful"/>
-    <w:basedOn w:val="896"/>
+    <w:basedOn w:val="853"/>
     <w:uiPriority w:val="99"/>
     <w:pPr>
       <w:pBdr/>
@@ -21921,9 +21932,9 @@
       </w:tcPr>
     </w:tblStylePr>
   </w:style>
-  <w:style w:type="table" w:styleId="801">
+  <w:style w:type="table" w:styleId="758">
     <w:name w:val="Grid Table 7 Colorful - Accent 1"/>
-    <w:basedOn w:val="896"/>
+    <w:basedOn w:val="853"/>
     <w:uiPriority w:val="99"/>
     <w:pPr>
       <w:pBdr/>
@@ -22175,9 +22186,9 @@
       </w:tcPr>
     </w:tblStylePr>
   </w:style>
-  <w:style w:type="table" w:styleId="802">
+  <w:style w:type="table" w:styleId="759">
     <w:name w:val="Grid Table 7 Colorful - Accent 2"/>
-    <w:basedOn w:val="896"/>
+    <w:basedOn w:val="853"/>
     <w:uiPriority w:val="99"/>
     <w:pPr>
       <w:pBdr/>
@@ -22429,9 +22440,9 @@
       </w:tcPr>
     </w:tblStylePr>
   </w:style>
-  <w:style w:type="table" w:styleId="803">
+  <w:style w:type="table" w:styleId="760">
     <w:name w:val="Grid Table 7 Colorful - Accent 3"/>
-    <w:basedOn w:val="896"/>
+    <w:basedOn w:val="853"/>
     <w:uiPriority w:val="99"/>
     <w:pPr>
       <w:pBdr/>
@@ -22683,9 +22694,9 @@
       </w:tcPr>
     </w:tblStylePr>
   </w:style>
-  <w:style w:type="table" w:styleId="804">
+  <w:style w:type="table" w:styleId="761">
     <w:name w:val="Grid Table 7 Colorful - Accent 4"/>
-    <w:basedOn w:val="896"/>
+    <w:basedOn w:val="853"/>
     <w:uiPriority w:val="99"/>
     <w:pPr>
       <w:pBdr/>
@@ -22937,9 +22948,9 @@
       </w:tcPr>
     </w:tblStylePr>
   </w:style>
-  <w:style w:type="table" w:styleId="805">
+  <w:style w:type="table" w:styleId="762">
     <w:name w:val="Grid Table 7 Colorful - Accent 5"/>
-    <w:basedOn w:val="896"/>
+    <w:basedOn w:val="853"/>
     <w:uiPriority w:val="99"/>
     <w:pPr>
       <w:pBdr/>
@@ -23191,9 +23202,9 @@
       </w:tcPr>
     </w:tblStylePr>
   </w:style>
-  <w:style w:type="table" w:styleId="806">
+  <w:style w:type="table" w:styleId="763">
     <w:name w:val="Grid Table 7 Colorful - Accent 6"/>
-    <w:basedOn w:val="896"/>
+    <w:basedOn w:val="853"/>
     <w:uiPriority w:val="99"/>
     <w:pPr>
       <w:pBdr/>
@@ -23445,9 +23456,9 @@
       </w:tcPr>
     </w:tblStylePr>
   </w:style>
-  <w:style w:type="table" w:styleId="807">
+  <w:style w:type="table" w:styleId="764">
     <w:name w:val="List Table 1 Light"/>
-    <w:basedOn w:val="896"/>
+    <w:basedOn w:val="853"/>
     <w:uiPriority w:val="99"/>
     <w:pPr>
       <w:pBdr/>
@@ -23661,9 +23672,9 @@
       </w:tcPr>
     </w:tblStylePr>
   </w:style>
-  <w:style w:type="table" w:styleId="808">
+  <w:style w:type="table" w:styleId="765">
     <w:name w:val="List Table 1 Light - Accent 1"/>
-    <w:basedOn w:val="896"/>
+    <w:basedOn w:val="853"/>
     <w:uiPriority w:val="99"/>
     <w:pPr>
       <w:pBdr/>
@@ -23877,9 +23888,9 @@
       </w:tcPr>
     </w:tblStylePr>
   </w:style>
-  <w:style w:type="table" w:styleId="809">
+  <w:style w:type="table" w:styleId="766">
     <w:name w:val="List Table 1 Light - Accent 2"/>
-    <w:basedOn w:val="896"/>
+    <w:basedOn w:val="853"/>
     <w:uiPriority w:val="99"/>
     <w:pPr>
       <w:pBdr/>
@@ -24093,9 +24104,9 @@
       </w:tcPr>
     </w:tblStylePr>
   </w:style>
-  <w:style w:type="table" w:styleId="810">
+  <w:style w:type="table" w:styleId="767">
     <w:name w:val="List Table 1 Light - Accent 3"/>
-    <w:basedOn w:val="896"/>
+    <w:basedOn w:val="853"/>
     <w:uiPriority w:val="99"/>
     <w:pPr>
       <w:pBdr/>
@@ -24309,9 +24320,9 @@
       </w:tcPr>
     </w:tblStylePr>
   </w:style>
-  <w:style w:type="table" w:styleId="811">
+  <w:style w:type="table" w:styleId="768">
     <w:name w:val="List Table 1 Light - Accent 4"/>
-    <w:basedOn w:val="896"/>
+    <w:basedOn w:val="853"/>
     <w:uiPriority w:val="99"/>
     <w:pPr>
       <w:pBdr/>
@@ -24525,9 +24536,9 @@
       </w:tcPr>
     </w:tblStylePr>
   </w:style>
-  <w:style w:type="table" w:styleId="812">
+  <w:style w:type="table" w:styleId="769">
     <w:name w:val="List Table 1 Light - Accent 5"/>
-    <w:basedOn w:val="896"/>
+    <w:basedOn w:val="853"/>
     <w:uiPriority w:val="99"/>
     <w:pPr>
       <w:pBdr/>
@@ -24741,9 +24752,9 @@
       </w:tcPr>
     </w:tblStylePr>
   </w:style>
-  <w:style w:type="table" w:styleId="813">
+  <w:style w:type="table" w:styleId="770">
     <w:name w:val="List Table 1 Light - Accent 6"/>
-    <w:basedOn w:val="896"/>
+    <w:basedOn w:val="853"/>
     <w:uiPriority w:val="99"/>
     <w:pPr>
       <w:pBdr/>
@@ -24957,9 +24968,9 @@
       </w:tcPr>
     </w:tblStylePr>
   </w:style>
-  <w:style w:type="table" w:styleId="814">
+  <w:style w:type="table" w:styleId="771">
     <w:name w:val="List Table 2"/>
-    <w:basedOn w:val="896"/>
+    <w:basedOn w:val="853"/>
     <w:uiPriority w:val="99"/>
     <w:pPr>
       <w:pBdr/>
@@ -25195,9 +25206,9 @@
       </w:tcPr>
     </w:tblStylePr>
   </w:style>
-  <w:style w:type="table" w:styleId="815">
+  <w:style w:type="table" w:styleId="772">
     <w:name w:val="List Table 2 - Accent 1"/>
-    <w:basedOn w:val="896"/>
+    <w:basedOn w:val="853"/>
     <w:uiPriority w:val="99"/>
     <w:pPr>
       <w:pBdr/>
@@ -25433,9 +25444,9 @@
       </w:tcPr>
     </w:tblStylePr>
   </w:style>
-  <w:style w:type="table" w:styleId="816">
+  <w:style w:type="table" w:styleId="773">
     <w:name w:val="List Table 2 - Accent 2"/>
-    <w:basedOn w:val="896"/>
+    <w:basedOn w:val="853"/>
     <w:uiPriority w:val="99"/>
     <w:pPr>
       <w:pBdr/>
@@ -25671,9 +25682,9 @@
       </w:tcPr>
     </w:tblStylePr>
   </w:style>
-  <w:style w:type="table" w:styleId="817">
+  <w:style w:type="table" w:styleId="774">
     <w:name w:val="List Table 2 - Accent 3"/>
-    <w:basedOn w:val="896"/>
+    <w:basedOn w:val="853"/>
     <w:uiPriority w:val="99"/>
     <w:pPr>
       <w:pBdr/>
@@ -25909,9 +25920,9 @@
       </w:tcPr>
     </w:tblStylePr>
   </w:style>
-  <w:style w:type="table" w:styleId="818">
+  <w:style w:type="table" w:styleId="775">
     <w:name w:val="List Table 2 - Accent 4"/>
-    <w:basedOn w:val="896"/>
+    <w:basedOn w:val="853"/>
     <w:uiPriority w:val="99"/>
     <w:pPr>
       <w:pBdr/>
@@ -26147,9 +26158,9 @@
       </w:tcPr>
     </w:tblStylePr>
   </w:style>
-  <w:style w:type="table" w:styleId="819">
+  <w:style w:type="table" w:styleId="776">
     <w:name w:val="List Table 2 - Accent 5"/>
-    <w:basedOn w:val="896"/>
+    <w:basedOn w:val="853"/>
     <w:uiPriority w:val="99"/>
     <w:pPr>
       <w:pBdr/>
@@ -26385,9 +26396,9 @@
       </w:tcPr>
     </w:tblStylePr>
   </w:style>
-  <w:style w:type="table" w:styleId="820">
+  <w:style w:type="table" w:styleId="777">
     <w:name w:val="List Table 2 - Accent 6"/>
-    <w:basedOn w:val="896"/>
+    <w:basedOn w:val="853"/>
     <w:uiPriority w:val="99"/>
     <w:pPr>
       <w:pBdr/>
@@ -26623,9 +26634,9 @@
       </w:tcPr>
     </w:tblStylePr>
   </w:style>
-  <w:style w:type="table" w:styleId="821">
+  <w:style w:type="table" w:styleId="778">
     <w:name w:val="List Table 3"/>
-    <w:basedOn w:val="896"/>
+    <w:basedOn w:val="853"/>
     <w:uiPriority w:val="99"/>
     <w:pPr>
       <w:pBdr/>
@@ -26851,9 +26862,9 @@
       </w:tcPr>
     </w:tblStylePr>
   </w:style>
-  <w:style w:type="table" w:styleId="822">
+  <w:style w:type="table" w:styleId="779">
     <w:name w:val="List Table 3 - Accent 1"/>
-    <w:basedOn w:val="896"/>
+    <w:basedOn w:val="853"/>
     <w:uiPriority w:val="99"/>
     <w:pPr>
       <w:pBdr/>
@@ -27079,9 +27090,9 @@
       </w:tcPr>
     </w:tblStylePr>
   </w:style>
-  <w:style w:type="table" w:styleId="823">
+  <w:style w:type="table" w:styleId="780">
     <w:name w:val="List Table 3 - Accent 2"/>
-    <w:basedOn w:val="896"/>
+    <w:basedOn w:val="853"/>
     <w:uiPriority w:val="99"/>
     <w:pPr>
       <w:pBdr/>
@@ -27307,9 +27318,9 @@
       </w:tcPr>
     </w:tblStylePr>
   </w:style>
-  <w:style w:type="table" w:styleId="824">
+  <w:style w:type="table" w:styleId="781">
     <w:name w:val="List Table 3 - Accent 3"/>
-    <w:basedOn w:val="896"/>
+    <w:basedOn w:val="853"/>
     <w:uiPriority w:val="99"/>
     <w:pPr>
       <w:pBdr/>
@@ -27535,9 +27546,9 @@
       </w:tcPr>
     </w:tblStylePr>
   </w:style>
-  <w:style w:type="table" w:styleId="825">
+  <w:style w:type="table" w:styleId="782">
     <w:name w:val="List Table 3 - Accent 4"/>
-    <w:basedOn w:val="896"/>
+    <w:basedOn w:val="853"/>
     <w:uiPriority w:val="99"/>
     <w:pPr>
       <w:pBdr/>
@@ -27763,9 +27774,9 @@
       </w:tcPr>
     </w:tblStylePr>
   </w:style>
-  <w:style w:type="table" w:styleId="826">
+  <w:style w:type="table" w:styleId="783">
     <w:name w:val="List Table 3 - Accent 5"/>
-    <w:basedOn w:val="896"/>
+    <w:basedOn w:val="853"/>
     <w:uiPriority w:val="99"/>
     <w:pPr>
       <w:pBdr/>
@@ -27991,9 +28002,9 @@
       </w:tcPr>
     </w:tblStylePr>
   </w:style>
-  <w:style w:type="table" w:styleId="827">
+  <w:style w:type="table" w:styleId="784">
     <w:name w:val="List Table 3 - Accent 6"/>
-    <w:basedOn w:val="896"/>
+    <w:basedOn w:val="853"/>
     <w:uiPriority w:val="99"/>
     <w:pPr>
       <w:pBdr/>
@@ -28219,9 +28230,9 @@
       </w:tcPr>
     </w:tblStylePr>
   </w:style>
-  <w:style w:type="table" w:styleId="828">
+  <w:style w:type="table" w:styleId="785">
     <w:name w:val="List Table 4"/>
-    <w:basedOn w:val="896"/>
+    <w:basedOn w:val="853"/>
     <w:uiPriority w:val="99"/>
     <w:pPr>
       <w:pBdr/>
@@ -28444,9 +28455,9 @@
       </w:tcPr>
     </w:tblStylePr>
   </w:style>
-  <w:style w:type="table" w:styleId="829">
+  <w:style w:type="table" w:styleId="786">
     <w:name w:val="List Table 4 - Accent 1"/>
-    <w:basedOn w:val="896"/>
+    <w:basedOn w:val="853"/>
     <w:uiPriority w:val="99"/>
     <w:pPr>
       <w:pBdr/>
@@ -28669,9 +28680,9 @@
       </w:tcPr>
     </w:tblStylePr>
   </w:style>
-  <w:style w:type="table" w:styleId="830">
+  <w:style w:type="table" w:styleId="787">
     <w:name w:val="List Table 4 - Accent 2"/>
-    <w:basedOn w:val="896"/>
+    <w:basedOn w:val="853"/>
     <w:uiPriority w:val="99"/>
     <w:pPr>
       <w:pBdr/>
@@ -28894,9 +28905,9 @@
       </w:tcPr>
     </w:tblStylePr>
   </w:style>
-  <w:style w:type="table" w:styleId="831">
+  <w:style w:type="table" w:styleId="788">
     <w:name w:val="List Table 4 - Accent 3"/>
-    <w:basedOn w:val="896"/>
+    <w:basedOn w:val="853"/>
     <w:uiPriority w:val="99"/>
     <w:pPr>
       <w:pBdr/>
@@ -29119,9 +29130,9 @@
       </w:tcPr>
     </w:tblStylePr>
   </w:style>
-  <w:style w:type="table" w:styleId="832">
+  <w:style w:type="table" w:styleId="789">
     <w:name w:val="List Table 4 - Accent 4"/>
-    <w:basedOn w:val="896"/>
+    <w:basedOn w:val="853"/>
     <w:uiPriority w:val="99"/>
     <w:pPr>
       <w:pBdr/>
@@ -29344,9 +29355,9 @@
       </w:tcPr>
     </w:tblStylePr>
   </w:style>
-  <w:style w:type="table" w:styleId="833">
+  <w:style w:type="table" w:styleId="790">
     <w:name w:val="List Table 4 - Accent 5"/>
-    <w:basedOn w:val="896"/>
+    <w:basedOn w:val="853"/>
     <w:uiPriority w:val="99"/>
     <w:pPr>
       <w:pBdr/>
@@ -29569,9 +29580,9 @@
       </w:tcPr>
     </w:tblStylePr>
   </w:style>
-  <w:style w:type="table" w:styleId="834">
+  <w:style w:type="table" w:styleId="791">
     <w:name w:val="List Table 4 - Accent 6"/>
-    <w:basedOn w:val="896"/>
+    <w:basedOn w:val="853"/>
     <w:uiPriority w:val="99"/>
     <w:pPr>
       <w:pBdr/>
@@ -29794,9 +29805,9 @@
       </w:tcPr>
     </w:tblStylePr>
   </w:style>
-  <w:style w:type="table" w:styleId="835">
+  <w:style w:type="table" w:styleId="792">
     <w:name w:val="List Table 5 Dark"/>
-    <w:basedOn w:val="896"/>
+    <w:basedOn w:val="853"/>
     <w:uiPriority w:val="99"/>
     <w:pPr>
       <w:pBdr/>
@@ -30036,9 +30047,9 @@
       </w:tcPr>
     </w:tblStylePr>
   </w:style>
-  <w:style w:type="table" w:styleId="836">
+  <w:style w:type="table" w:styleId="793">
     <w:name w:val="List Table 5 Dark - Accent 1"/>
-    <w:basedOn w:val="896"/>
+    <w:basedOn w:val="853"/>
     <w:uiPriority w:val="99"/>
     <w:pPr>
       <w:pBdr/>
@@ -30278,9 +30289,9 @@
       </w:tcPr>
     </w:tblStylePr>
   </w:style>
-  <w:style w:type="table" w:styleId="837">
+  <w:style w:type="table" w:styleId="794">
     <w:name w:val="List Table 5 Dark - Accent 2"/>
-    <w:basedOn w:val="896"/>
+    <w:basedOn w:val="853"/>
     <w:uiPriority w:val="99"/>
     <w:pPr>
       <w:pBdr/>
@@ -30520,9 +30531,9 @@
       </w:tcPr>
     </w:tblStylePr>
   </w:style>
-  <w:style w:type="table" w:styleId="838">
+  <w:style w:type="table" w:styleId="795">
     <w:name w:val="List Table 5 Dark - Accent 3"/>
-    <w:basedOn w:val="896"/>
+    <w:basedOn w:val="853"/>
     <w:uiPriority w:val="99"/>
     <w:pPr>
       <w:pBdr/>
@@ -30762,9 +30773,9 @@
       </w:tcPr>
     </w:tblStylePr>
   </w:style>
-  <w:style w:type="table" w:styleId="839">
+  <w:style w:type="table" w:styleId="796">
     <w:name w:val="List Table 5 Dark - Accent 4"/>
-    <w:basedOn w:val="896"/>
+    <w:basedOn w:val="853"/>
     <w:uiPriority w:val="99"/>
     <w:pPr>
       <w:pBdr/>
@@ -31004,9 +31015,9 @@
       </w:tcPr>
     </w:tblStylePr>
   </w:style>
-  <w:style w:type="table" w:styleId="840">
+  <w:style w:type="table" w:styleId="797">
     <w:name w:val="List Table 5 Dark - Accent 5"/>
-    <w:basedOn w:val="896"/>
+    <w:basedOn w:val="853"/>
     <w:uiPriority w:val="99"/>
     <w:pPr>
       <w:pBdr/>
@@ -31246,9 +31257,9 @@
       </w:tcPr>
     </w:tblStylePr>
   </w:style>
-  <w:style w:type="table" w:styleId="841">
+  <w:style w:type="table" w:styleId="798">
     <w:name w:val="List Table 5 Dark - Accent 6"/>
-    <w:basedOn w:val="896"/>
+    <w:basedOn w:val="853"/>
     <w:uiPriority w:val="99"/>
     <w:pPr>
       <w:pBdr/>
@@ -31488,9 +31499,9 @@
       </w:tcPr>
     </w:tblStylePr>
   </w:style>
-  <w:style w:type="table" w:styleId="842">
+  <w:style w:type="table" w:styleId="799">
     <w:name w:val="List Table 6 Colorful"/>
-    <w:basedOn w:val="896"/>
+    <w:basedOn w:val="853"/>
     <w:uiPriority w:val="99"/>
     <w:pPr>
       <w:pBdr/>
@@ -31711,9 +31722,9 @@
       </w:tcPr>
     </w:tblStylePr>
   </w:style>
-  <w:style w:type="table" w:styleId="843">
+  <w:style w:type="table" w:styleId="800">
     <w:name w:val="List Table 6 Colorful - Accent 1"/>
-    <w:basedOn w:val="896"/>
+    <w:basedOn w:val="853"/>
     <w:uiPriority w:val="99"/>
     <w:pPr>
       <w:pBdr/>
@@ -31934,9 +31945,9 @@
       </w:tcPr>
     </w:tblStylePr>
   </w:style>
-  <w:style w:type="table" w:styleId="844">
+  <w:style w:type="table" w:styleId="801">
     <w:name w:val="List Table 6 Colorful - Accent 2"/>
-    <w:basedOn w:val="896"/>
+    <w:basedOn w:val="853"/>
     <w:uiPriority w:val="99"/>
     <w:pPr>
       <w:pBdr/>
@@ -32157,9 +32168,9 @@
       </w:tcPr>
     </w:tblStylePr>
   </w:style>
-  <w:style w:type="table" w:styleId="845">
+  <w:style w:type="table" w:styleId="802">
     <w:name w:val="List Table 6 Colorful - Accent 3"/>
-    <w:basedOn w:val="896"/>
+    <w:basedOn w:val="853"/>
     <w:uiPriority w:val="99"/>
     <w:pPr>
       <w:pBdr/>
@@ -32380,9 +32391,9 @@
       </w:tcPr>
     </w:tblStylePr>
   </w:style>
-  <w:style w:type="table" w:styleId="846">
+  <w:style w:type="table" w:styleId="803">
     <w:name w:val="List Table 6 Colorful - Accent 4"/>
-    <w:basedOn w:val="896"/>
+    <w:basedOn w:val="853"/>
     <w:uiPriority w:val="99"/>
     <w:pPr>
       <w:pBdr/>
@@ -32603,9 +32614,9 @@
       </w:tcPr>
     </w:tblStylePr>
   </w:style>
-  <w:style w:type="table" w:styleId="847">
+  <w:style w:type="table" w:styleId="804">
     <w:name w:val="List Table 6 Colorful - Accent 5"/>
-    <w:basedOn w:val="896"/>
+    <w:basedOn w:val="853"/>
     <w:uiPriority w:val="99"/>
     <w:pPr>
       <w:pBdr/>
@@ -32826,9 +32837,9 @@
       </w:tcPr>
     </w:tblStylePr>
   </w:style>
-  <w:style w:type="table" w:styleId="848">
+  <w:style w:type="table" w:styleId="805">
     <w:name w:val="List Table 6 Colorful - Accent 6"/>
-    <w:basedOn w:val="896"/>
+    <w:basedOn w:val="853"/>
     <w:uiPriority w:val="99"/>
     <w:pPr>
       <w:pBdr/>
@@ -33049,9 +33060,9 @@
       </w:tcPr>
     </w:tblStylePr>
   </w:style>
-  <w:style w:type="table" w:styleId="849">
+  <w:style w:type="table" w:styleId="806">
     <w:name w:val="List Table 7 Colorful"/>
-    <w:basedOn w:val="896"/>
+    <w:basedOn w:val="853"/>
     <w:uiPriority w:val="99"/>
     <w:pPr>
       <w:pBdr/>
@@ -33305,9 +33316,9 @@
       </w:tcPr>
     </w:tblStylePr>
   </w:style>
-  <w:style w:type="table" w:styleId="850">
+  <w:style w:type="table" w:styleId="807">
     <w:name w:val="List Table 7 Colorful - Accent 1"/>
-    <w:basedOn w:val="896"/>
+    <w:basedOn w:val="853"/>
     <w:uiPriority w:val="99"/>
     <w:pPr>
       <w:pBdr/>
@@ -33561,9 +33572,9 @@
       </w:tcPr>
     </w:tblStylePr>
   </w:style>
-  <w:style w:type="table" w:styleId="851">
+  <w:style w:type="table" w:styleId="808">
     <w:name w:val="List Table 7 Colorful - Accent 2"/>
-    <w:basedOn w:val="896"/>
+    <w:basedOn w:val="853"/>
     <w:uiPriority w:val="99"/>
     <w:pPr>
       <w:pBdr/>
@@ -33817,9 +33828,9 @@
       </w:tcPr>
     </w:tblStylePr>
   </w:style>
-  <w:style w:type="table" w:styleId="852">
+  <w:style w:type="table" w:styleId="809">
     <w:name w:val="List Table 7 Colorful - Accent 3"/>
-    <w:basedOn w:val="896"/>
+    <w:basedOn w:val="853"/>
     <w:uiPriority w:val="99"/>
     <w:pPr>
       <w:pBdr/>
@@ -34073,9 +34084,9 @@
       </w:tcPr>
     </w:tblStylePr>
   </w:style>
-  <w:style w:type="table" w:styleId="853">
+  <w:style w:type="table" w:styleId="810">
     <w:name w:val="List Table 7 Colorful - Accent 4"/>
-    <w:basedOn w:val="896"/>
+    <w:basedOn w:val="853"/>
     <w:uiPriority w:val="99"/>
     <w:pPr>
       <w:pBdr/>
@@ -34329,9 +34340,9 @@
       </w:tcPr>
     </w:tblStylePr>
   </w:style>
-  <w:style w:type="table" w:styleId="854">
+  <w:style w:type="table" w:styleId="811">
     <w:name w:val="List Table 7 Colorful - Accent 5"/>
-    <w:basedOn w:val="896"/>
+    <w:basedOn w:val="853"/>
     <w:uiPriority w:val="99"/>
     <w:pPr>
       <w:pBdr/>
@@ -34585,9 +34596,9 @@
       </w:tcPr>
     </w:tblStylePr>
   </w:style>
-  <w:style w:type="table" w:styleId="855">
+  <w:style w:type="table" w:styleId="812">
     <w:name w:val="List Table 7 Colorful - Accent 6"/>
-    <w:basedOn w:val="896"/>
+    <w:basedOn w:val="853"/>
     <w:uiPriority w:val="99"/>
     <w:pPr>
       <w:pBdr/>
@@ -34841,9 +34852,9 @@
       </w:tcPr>
     </w:tblStylePr>
   </w:style>
-  <w:style w:type="table" w:styleId="856">
+  <w:style w:type="table" w:styleId="813">
     <w:name w:val="Lined - Accent"/>
-    <w:basedOn w:val="896"/>
+    <w:basedOn w:val="853"/>
     <w:uiPriority w:val="99"/>
     <w:pPr>
       <w:pBdr/>
@@ -35078,9 +35089,9 @@
       </w:tcPr>
     </w:tblStylePr>
   </w:style>
-  <w:style w:type="table" w:styleId="857">
+  <w:style w:type="table" w:styleId="814">
     <w:name w:val="Lined - Accent 1"/>
-    <w:basedOn w:val="896"/>
+    <w:basedOn w:val="853"/>
     <w:uiPriority w:val="99"/>
     <w:pPr>
       <w:pBdr/>
@@ -35315,9 +35326,9 @@
       </w:tcPr>
     </w:tblStylePr>
   </w:style>
-  <w:style w:type="table" w:styleId="858">
+  <w:style w:type="table" w:styleId="815">
     <w:name w:val="Lined - Accent 2"/>
-    <w:basedOn w:val="896"/>
+    <w:basedOn w:val="853"/>
     <w:uiPriority w:val="99"/>
     <w:pPr>
       <w:pBdr/>
@@ -35552,9 +35563,9 @@
       </w:tcPr>
     </w:tblStylePr>
   </w:style>
-  <w:style w:type="table" w:styleId="859">
+  <w:style w:type="table" w:styleId="816">
     <w:name w:val="Lined - Accent 3"/>
-    <w:basedOn w:val="896"/>
+    <w:basedOn w:val="853"/>
     <w:uiPriority w:val="99"/>
     <w:pPr>
       <w:pBdr/>
@@ -35789,9 +35800,9 @@
       </w:tcPr>
     </w:tblStylePr>
   </w:style>
-  <w:style w:type="table" w:styleId="860">
+  <w:style w:type="table" w:styleId="817">
     <w:name w:val="Lined - Accent 4"/>
-    <w:basedOn w:val="896"/>
+    <w:basedOn w:val="853"/>
     <w:uiPriority w:val="99"/>
     <w:pPr>
       <w:pBdr/>
@@ -36026,9 +36037,9 @@
       </w:tcPr>
     </w:tblStylePr>
   </w:style>
-  <w:style w:type="table" w:styleId="861">
+  <w:style w:type="table" w:styleId="818">
     <w:name w:val="Lined - Accent 5"/>
-    <w:basedOn w:val="896"/>
+    <w:basedOn w:val="853"/>
     <w:uiPriority w:val="99"/>
     <w:pPr>
       <w:pBdr/>
@@ -36263,9 +36274,9 @@
       </w:tcPr>
     </w:tblStylePr>
   </w:style>
-  <w:style w:type="table" w:styleId="862">
+  <w:style w:type="table" w:styleId="819">
     <w:name w:val="Lined - Accent 6"/>
-    <w:basedOn w:val="896"/>
+    <w:basedOn w:val="853"/>
     <w:uiPriority w:val="99"/>
     <w:pPr>
       <w:pBdr/>
@@ -36500,9 +36511,9 @@
       </w:tcPr>
     </w:tblStylePr>
   </w:style>
-  <w:style w:type="table" w:styleId="863">
+  <w:style w:type="table" w:styleId="820">
     <w:name w:val="Bordered &amp; Lined - Accent"/>
-    <w:basedOn w:val="896"/>
+    <w:basedOn w:val="853"/>
     <w:uiPriority w:val="99"/>
     <w:pPr>
       <w:pBdr/>
@@ -36744,9 +36755,9 @@
       </w:tcPr>
     </w:tblStylePr>
   </w:style>
-  <w:style w:type="table" w:styleId="864">
+  <w:style w:type="table" w:styleId="821">
     <w:name w:val="Bordered &amp; Lined - Accent 1"/>
-    <w:basedOn w:val="896"/>
+    <w:basedOn w:val="853"/>
     <w:uiPriority w:val="99"/>
     <w:pPr>
       <w:pBdr/>
@@ -36988,9 +36999,9 @@
       </w:tcPr>
     </w:tblStylePr>
   </w:style>
-  <w:style w:type="table" w:styleId="865">
+  <w:style w:type="table" w:styleId="822">
     <w:name w:val="Bordered &amp; Lined - Accent 2"/>
-    <w:basedOn w:val="896"/>
+    <w:basedOn w:val="853"/>
     <w:uiPriority w:val="99"/>
     <w:pPr>
       <w:pBdr/>
@@ -37232,9 +37243,9 @@
       </w:tcPr>
     </w:tblStylePr>
   </w:style>
-  <w:style w:type="table" w:styleId="866">
+  <w:style w:type="table" w:styleId="823">
     <w:name w:val="Bordered &amp; Lined - Accent 3"/>
-    <w:basedOn w:val="896"/>
+    <w:basedOn w:val="853"/>
     <w:uiPriority w:val="99"/>
     <w:pPr>
       <w:pBdr/>
@@ -37476,9 +37487,9 @@
       </w:tcPr>
     </w:tblStylePr>
   </w:style>
-  <w:style w:type="table" w:styleId="867">
+  <w:style w:type="table" w:styleId="824">
     <w:name w:val="Bordered &amp; Lined - Accent 4"/>
-    <w:basedOn w:val="896"/>
+    <w:basedOn w:val="853"/>
     <w:uiPriority w:val="99"/>
     <w:pPr>
       <w:pBdr/>
@@ -37720,9 +37731,9 @@
       </w:tcPr>
     </w:tblStylePr>
   </w:style>
-  <w:style w:type="table" w:styleId="868">
+  <w:style w:type="table" w:styleId="825">
     <w:name w:val="Bordered &amp; Lined - Accent 5"/>
-    <w:basedOn w:val="896"/>
+    <w:basedOn w:val="853"/>
     <w:uiPriority w:val="99"/>
     <w:pPr>
       <w:pBdr/>
@@ -37964,9 +37975,9 @@
       </w:tcPr>
     </w:tblStylePr>
   </w:style>
-  <w:style w:type="table" w:styleId="869">
+  <w:style w:type="table" w:styleId="826">
     <w:name w:val="Bordered &amp; Lined - Accent 6"/>
-    <w:basedOn w:val="896"/>
+    <w:basedOn w:val="853"/>
     <w:uiPriority w:val="99"/>
     <w:pPr>
       <w:pBdr/>
@@ -38208,9 +38219,9 @@
       </w:tcPr>
     </w:tblStylePr>
   </w:style>
-  <w:style w:type="table" w:styleId="870">
+  <w:style w:type="table" w:styleId="827">
     <w:name w:val="Bordered"/>
-    <w:basedOn w:val="896"/>
+    <w:basedOn w:val="853"/>
     <w:uiPriority w:val="99"/>
     <w:pPr>
       <w:pBdr/>
@@ -38439,9 +38450,9 @@
       </w:tcPr>
     </w:tblStylePr>
   </w:style>
-  <w:style w:type="table" w:styleId="871">
+  <w:style w:type="table" w:styleId="828">
     <w:name w:val="Bordered - Accent 1"/>
-    <w:basedOn w:val="896"/>
+    <w:basedOn w:val="853"/>
     <w:uiPriority w:val="99"/>
     <w:pPr>
       <w:pBdr/>
@@ -38670,9 +38681,9 @@
       </w:tcPr>
     </w:tblStylePr>
   </w:style>
-  <w:style w:type="table" w:styleId="872">
+  <w:style w:type="table" w:styleId="829">
     <w:name w:val="Bordered - Accent 2"/>
-    <w:basedOn w:val="896"/>
+    <w:basedOn w:val="853"/>
     <w:uiPriority w:val="99"/>
     <w:pPr>
       <w:pBdr/>
@@ -38901,9 +38912,9 @@
       </w:tcPr>
     </w:tblStylePr>
   </w:style>
-  <w:style w:type="table" w:styleId="873">
+  <w:style w:type="table" w:styleId="830">
     <w:name w:val="Bordered - Accent 3"/>
-    <w:basedOn w:val="896"/>
+    <w:basedOn w:val="853"/>
     <w:uiPriority w:val="99"/>
     <w:pPr>
       <w:pBdr/>
@@ -39132,9 +39143,9 @@
       </w:tcPr>
     </w:tblStylePr>
   </w:style>
-  <w:style w:type="table" w:styleId="874">
+  <w:style w:type="table" w:styleId="831">
     <w:name w:val="Bordered - Accent 4"/>
-    <w:basedOn w:val="896"/>
+    <w:basedOn w:val="853"/>
     <w:uiPriority w:val="99"/>
     <w:pPr>
       <w:pBdr/>
@@ -39363,9 +39374,9 @@
       </w:tcPr>
     </w:tblStylePr>
   </w:style>
-  <w:style w:type="table" w:styleId="875">
+  <w:style w:type="table" w:styleId="832">
     <w:name w:val="Bordered - Accent 5"/>
-    <w:basedOn w:val="896"/>
+    <w:basedOn w:val="853"/>
     <w:uiPriority w:val="99"/>
     <w:pPr>
       <w:pBdr/>
@@ -39594,9 +39605,9 @@
       </w:tcPr>
     </w:tblStylePr>
   </w:style>
-  <w:style w:type="table" w:styleId="876">
+  <w:style w:type="table" w:styleId="833">
     <w:name w:val="Bordered - Accent 6"/>
-    <w:basedOn w:val="896"/>
+    <w:basedOn w:val="853"/>
     <w:uiPriority w:val="99"/>
     <w:pPr>
       <w:pBdr/>
@@ -39825,7 +39836,7 @@
       </w:tcPr>
     </w:tblStylePr>
   </w:style>
-  <w:style w:type="character" w:styleId="877">
+  <w:style w:type="character" w:styleId="834">
     <w:name w:val="Hyperlink"/>
     <w:uiPriority w:val="99"/>
     <w:unhideWhenUsed/>
@@ -39839,10 +39850,10 @@
       <w:u w:val="single"/>
     </w:rPr>
   </w:style>
-  <w:style w:type="paragraph" w:styleId="878">
+  <w:style w:type="paragraph" w:styleId="835">
     <w:name w:val="footnote text"/>
-    <w:basedOn w:val="895"/>
-    <w:link w:val="879"/>
+    <w:basedOn w:val="852"/>
+    <w:link w:val="836"/>
     <w:uiPriority w:val="99"/>
     <w:semiHidden/>
     <w:unhideWhenUsed/>
@@ -39855,9 +39866,9 @@
       <w:sz w:val="18"/>
     </w:rPr>
   </w:style>
-  <w:style w:type="character" w:styleId="879">
+  <w:style w:type="character" w:styleId="836">
     <w:name w:val="Footnote Text Char"/>
-    <w:link w:val="878"/>
+    <w:link w:val="835"/>
     <w:uiPriority w:val="99"/>
     <w:pPr>
       <w:pBdr/>
@@ -39868,7 +39879,7 @@
       <w:sz w:val="18"/>
     </w:rPr>
   </w:style>
-  <w:style w:type="character" w:styleId="880">
+  <w:style w:type="character" w:styleId="837">
     <w:name w:val="footnote reference"/>
     <w:uiPriority w:val="99"/>
     <w:unhideWhenUsed/>
@@ -39881,10 +39892,10 @@
       <w:vertAlign w:val="superscript"/>
     </w:rPr>
   </w:style>
-  <w:style w:type="paragraph" w:styleId="881">
+  <w:style w:type="paragraph" w:styleId="838">
     <w:name w:val="endnote text"/>
-    <w:basedOn w:val="895"/>
-    <w:link w:val="882"/>
+    <w:basedOn w:val="852"/>
+    <w:link w:val="839"/>
     <w:uiPriority w:val="99"/>
     <w:semiHidden/>
     <w:unhideWhenUsed/>
@@ -39897,9 +39908,9 @@
       <w:sz w:val="20"/>
     </w:rPr>
   </w:style>
-  <w:style w:type="character" w:styleId="882">
+  <w:style w:type="character" w:styleId="839">
     <w:name w:val="Endnote Text Char"/>
-    <w:link w:val="881"/>
+    <w:link w:val="838"/>
     <w:uiPriority w:val="99"/>
     <w:pPr>
       <w:pBdr/>
@@ -39910,7 +39921,7 @@
       <w:sz w:val="20"/>
     </w:rPr>
   </w:style>
-  <w:style w:type="character" w:styleId="883">
+  <w:style w:type="character" w:styleId="840">
     <w:name w:val="endnote reference"/>
     <w:uiPriority w:val="99"/>
     <w:semiHidden/>
@@ -39924,10 +39935,10 @@
       <w:vertAlign w:val="superscript"/>
     </w:rPr>
   </w:style>
-  <w:style w:type="paragraph" w:styleId="884">
+  <w:style w:type="paragraph" w:styleId="841">
     <w:name w:val="toc 1"/>
-    <w:basedOn w:val="895"/>
-    <w:next w:val="895"/>
+    <w:basedOn w:val="852"/>
+    <w:next w:val="852"/>
     <w:uiPriority w:val="39"/>
     <w:unhideWhenUsed/>
     <w:pPr>
@@ -39936,10 +39947,10 @@
       <w:ind w:right="0" w:firstLine="0" w:left="0"/>
     </w:pPr>
   </w:style>
-  <w:style w:type="paragraph" w:styleId="885">
+  <w:style w:type="paragraph" w:styleId="842">
     <w:name w:val="toc 2"/>
-    <w:basedOn w:val="895"/>
-    <w:next w:val="895"/>
+    <w:basedOn w:val="852"/>
+    <w:next w:val="852"/>
     <w:uiPriority w:val="39"/>
     <w:unhideWhenUsed/>
     <w:pPr>
@@ -39948,10 +39959,10 @@
       <w:ind w:right="0" w:firstLine="0" w:left="283"/>
     </w:pPr>
   </w:style>
-  <w:style w:type="paragraph" w:styleId="886">
+  <w:style w:type="paragraph" w:styleId="843">
     <w:name w:val="toc 3"/>
-    <w:basedOn w:val="895"/>
-    <w:next w:val="895"/>
+    <w:basedOn w:val="852"/>
+    <w:next w:val="852"/>
     <w:uiPriority w:val="39"/>
     <w:unhideWhenUsed/>
     <w:pPr>
@@ -39960,10 +39971,10 @@
       <w:ind w:right="0" w:firstLine="0" w:left="567"/>
     </w:pPr>
   </w:style>
-  <w:style w:type="paragraph" w:styleId="887">
+  <w:style w:type="paragraph" w:styleId="844">
     <w:name w:val="toc 4"/>
-    <w:basedOn w:val="895"/>
-    <w:next w:val="895"/>
+    <w:basedOn w:val="852"/>
+    <w:next w:val="852"/>
     <w:uiPriority w:val="39"/>
     <w:unhideWhenUsed/>
     <w:pPr>
@@ -39972,10 +39983,10 @@
       <w:ind w:right="0" w:firstLine="0" w:left="850"/>
     </w:pPr>
   </w:style>
-  <w:style w:type="paragraph" w:styleId="888">
+  <w:style w:type="paragraph" w:styleId="845">
     <w:name w:val="toc 5"/>
-    <w:basedOn w:val="895"/>
-    <w:next w:val="895"/>
+    <w:basedOn w:val="852"/>
+    <w:next w:val="852"/>
     <w:uiPriority w:val="39"/>
     <w:unhideWhenUsed/>
     <w:pPr>
@@ -39984,10 +39995,10 @@
       <w:ind w:right="0" w:firstLine="0" w:left="1134"/>
     </w:pPr>
   </w:style>
-  <w:style w:type="paragraph" w:styleId="889">
+  <w:style w:type="paragraph" w:styleId="846">
     <w:name w:val="toc 6"/>
-    <w:basedOn w:val="895"/>
-    <w:next w:val="895"/>
+    <w:basedOn w:val="852"/>
+    <w:next w:val="852"/>
     <w:uiPriority w:val="39"/>
     <w:unhideWhenUsed/>
     <w:pPr>
@@ -39996,10 +40007,10 @@
       <w:ind w:right="0" w:firstLine="0" w:left="1417"/>
     </w:pPr>
   </w:style>
-  <w:style w:type="paragraph" w:styleId="890">
+  <w:style w:type="paragraph" w:styleId="847">
     <w:name w:val="toc 7"/>
-    <w:basedOn w:val="895"/>
-    <w:next w:val="895"/>
+    <w:basedOn w:val="852"/>
+    <w:next w:val="852"/>
     <w:uiPriority w:val="39"/>
     <w:unhideWhenUsed/>
     <w:pPr>
@@ -40008,10 +40019,10 @@
       <w:ind w:right="0" w:firstLine="0" w:left="1701"/>
     </w:pPr>
   </w:style>
-  <w:style w:type="paragraph" w:styleId="891">
+  <w:style w:type="paragraph" w:styleId="848">
     <w:name w:val="toc 8"/>
-    <w:basedOn w:val="895"/>
-    <w:next w:val="895"/>
+    <w:basedOn w:val="852"/>
+    <w:next w:val="852"/>
     <w:uiPriority w:val="39"/>
     <w:unhideWhenUsed/>
     <w:pPr>
@@ -40020,10 +40031,10 @@
       <w:ind w:right="0" w:firstLine="0" w:left="1984"/>
     </w:pPr>
   </w:style>
-  <w:style w:type="paragraph" w:styleId="892">
+  <w:style w:type="paragraph" w:styleId="849">
     <w:name w:val="toc 9"/>
-    <w:basedOn w:val="895"/>
-    <w:next w:val="895"/>
+    <w:basedOn w:val="852"/>
+    <w:next w:val="852"/>
     <w:uiPriority w:val="39"/>
     <w:unhideWhenUsed/>
     <w:pPr>
@@ -40032,7 +40043,7 @@
       <w:ind w:right="0" w:firstLine="0" w:left="2268"/>
     </w:pPr>
   </w:style>
-  <w:style w:type="paragraph" w:styleId="893">
+  <w:style w:type="paragraph" w:styleId="850">
     <w:name w:val="TOC Heading"/>
     <w:uiPriority w:val="39"/>
     <w:unhideWhenUsed/>
@@ -40042,10 +40053,10 @@
       <w:ind/>
     </w:pPr>
   </w:style>
-  <w:style w:type="paragraph" w:styleId="894">
+  <w:style w:type="paragraph" w:styleId="851">
     <w:name w:val="table of figures"/>
-    <w:basedOn w:val="895"/>
-    <w:next w:val="895"/>
+    <w:basedOn w:val="852"/>
+    <w:next w:val="852"/>
     <w:uiPriority w:val="99"/>
     <w:unhideWhenUsed/>
     <w:pPr>
@@ -40054,7 +40065,7 @@
       <w:ind/>
     </w:pPr>
   </w:style>
-  <w:style w:type="paragraph" w:styleId="895" w:default="1">
+  <w:style w:type="paragraph" w:styleId="852" w:default="1">
     <w:name w:val="Normal"/>
     <w:qFormat/>
     <w:pPr>
@@ -40063,7 +40074,7 @@
       <w:ind/>
     </w:pPr>
   </w:style>
-  <w:style w:type="table" w:styleId="896" w:default="1">
+  <w:style w:type="table" w:styleId="853" w:default="1">
     <w:name w:val="Normal Table"/>
     <w:uiPriority w:val="99"/>
     <w:semiHidden/>
@@ -40256,7 +40267,7 @@
       </w:tcPr>
     </w:tblStylePr>
   </w:style>
-  <w:style w:type="numbering" w:styleId="897" w:default="1">
+  <w:style w:type="numbering" w:styleId="854" w:default="1">
     <w:name w:val="No List"/>
     <w:uiPriority w:val="99"/>
     <w:semiHidden/>
@@ -40267,9 +40278,9 @@
       <w:ind/>
     </w:pPr>
   </w:style>
-  <w:style w:type="paragraph" w:styleId="898">
+  <w:style w:type="paragraph" w:styleId="855">
     <w:name w:val="No Spacing"/>
-    <w:basedOn w:val="895"/>
+    <w:basedOn w:val="852"/>
     <w:uiPriority w:val="1"/>
     <w:qFormat/>
     <w:pPr>
@@ -40278,9 +40289,9 @@
       <w:ind/>
     </w:pPr>
   </w:style>
-  <w:style w:type="paragraph" w:styleId="899">
+  <w:style w:type="paragraph" w:styleId="856">
     <w:name w:val="List Paragraph"/>
-    <w:basedOn w:val="895"/>
+    <w:basedOn w:val="852"/>
     <w:uiPriority w:val="34"/>
     <w:qFormat/>
     <w:pPr>
@@ -40290,7 +40301,7 @@
       <w:contextualSpacing w:val="true"/>
     </w:pPr>
   </w:style>
-  <w:style w:type="character" w:styleId="900" w:default="1">
+  <w:style w:type="character" w:styleId="857" w:default="1">
     <w:name w:val="Default Paragraph Font"/>
     <w:uiPriority w:val="1"/>
     <w:semiHidden/>

</xml_diff>

<commit_message>
Added images to menu explanations.
</commit_message>
<xml_diff>
--- a/Analysis.docx
+++ b/Analysis.docx
@@ -7285,11 +7285,13 @@
         <w:rPr>
           <w:highlight w:val="none"/>
         </w:rPr>
+      </w:r>
+      <w:r>
         <mc:AlternateContent>
           <mc:Choice Requires="wpg">
             <w:drawing>
               <wp:inline xmlns:wp="http://schemas.openxmlformats.org/drawingml/2006/wordprocessingDrawing" distT="0" distB="0" distL="0" distR="0">
-                <wp:extent cx="5940425" cy="2098188"/>
+                <wp:extent cx="5940425" cy="2330956"/>
                 <wp:effectExtent l="0" t="0" r="0" b="0"/>
                 <wp:docPr id="9" name=""/>
                 <wp:cNvGraphicFramePr>
@@ -7299,7 +7301,7 @@
                   <a:graphicData uri="http://schemas.openxmlformats.org/drawingml/2006/picture">
                     <pic:pic xmlns:pic="http://schemas.openxmlformats.org/drawingml/2006/picture">
                       <pic:nvPicPr>
-                        <pic:cNvPr id="1865081795" name=""/>
+                        <pic:cNvPr id="1576144279" name=""/>
                         <pic:cNvPicPr>
                           <a:picLocks noChangeAspect="1"/>
                         </pic:cNvPicPr>
@@ -7312,7 +7314,7 @@
                       <pic:spPr bwMode="auto">
                         <a:xfrm>
                           <a:off x="0" y="0"/>
-                          <a:ext cx="5940424" cy="2098188"/>
+                          <a:ext cx="5940424" cy="2330955"/>
                         </a:xfrm>
                         <a:prstGeom prst="rect">
                           <a:avLst/>
@@ -7345,13 +7347,24 @@
                 <v:path o:extrusionok="f" gradientshapeok="t" o:connecttype="rect"/>
                 <o:lock v:ext="edit" aspectratio="t"/>
               </v:shapetype>
-              <v:shape id="_x0000_i8" o:spid="_x0000_s8" type="#_x0000_t75" style="width:467.75pt;height:165.21pt;mso-wrap-distance-left:0.00pt;mso-wrap-distance-top:0.00pt;mso-wrap-distance-right:0.00pt;mso-wrap-distance-bottom:0.00pt;z-index:1;" stroked="false">
+              <v:shape id="_x0000_i8" o:spid="_x0000_s8" type="#_x0000_t75" style="width:467.75pt;height:183.54pt;mso-wrap-distance-left:0.00pt;mso-wrap-distance-top:0.00pt;mso-wrap-distance-right:0.00pt;mso-wrap-distance-bottom:0.00pt;z-index:1;" stroked="false">
                 <v:imagedata r:id="rId24" o:title=""/>
                 <o:lock v:ext="edit" rotation="t"/>
               </v:shape>
             </w:pict>
           </mc:Fallback>
         </mc:AlternateContent>
+      </w:r>
+      <w:r>
+        <w:rPr>
+          <w:highlight w:val="none"/>
+        </w:rPr>
+      </w:r>
+      <w:r/>
+      <w:r>
+        <w:rPr>
+          <w:highlight w:val="none"/>
+        </w:rPr>
       </w:r>
       <w:r>
         <w:rPr>

</xml_diff>

<commit_message>
Tried to make objectives more specific
</commit_message>
<xml_diff>
--- a/Analysis.docx
+++ b/Analysis.docx
@@ -4,7 +4,7 @@
   <w:body>
     <w:p>
       <w:pPr>
-        <w:pStyle w:val="676"/>
+        <w:pStyle w:val="719"/>
         <w:pBdr/>
         <w:spacing w:line="141" w:lineRule="atLeast"/>
         <w:ind/>
@@ -37,7 +37,7 @@
     </w:p>
     <w:p>
       <w:pPr>
-        <w:pStyle w:val="680"/>
+        <w:pStyle w:val="723"/>
         <w:pBdr/>
         <w:spacing/>
         <w:ind/>
@@ -115,7 +115,7 @@
     </w:p>
     <w:p>
       <w:pPr>
-        <w:pStyle w:val="680"/>
+        <w:pStyle w:val="723"/>
         <w:pBdr/>
         <w:spacing/>
         <w:ind/>
@@ -155,7 +155,7 @@
     </w:p>
     <w:p>
       <w:pPr>
-        <w:pStyle w:val="856"/>
+        <w:pStyle w:val="899"/>
         <w:numPr>
           <w:ilvl w:val="0"/>
           <w:numId w:val="1"/>
@@ -195,7 +195,7 @@
     </w:p>
     <w:p>
       <w:pPr>
-        <w:pStyle w:val="856"/>
+        <w:pStyle w:val="899"/>
         <w:numPr>
           <w:ilvl w:val="0"/>
           <w:numId w:val="1"/>
@@ -464,7 +464,7 @@
     </w:p>
     <w:p>
       <w:pPr>
-        <w:pStyle w:val="680"/>
+        <w:pStyle w:val="723"/>
         <w:pBdr/>
         <w:spacing/>
         <w:ind/>
@@ -835,14 +835,14 @@
       <w:hyperlink r:id="rId10" w:tooltip="https://eyes.nasa.gov/apps/orrery/#/home." w:history="1">
         <w:r>
           <w:rPr>
-            <w:rStyle w:val="834"/>
+            <w:rStyle w:val="877"/>
             <w:highlight w:val="none"/>
           </w:rPr>
           <w:t xml:space="preserve">https://eyes.nasa.gov/apps/orrery/#/home</w:t>
         </w:r>
         <w:r>
           <w:rPr>
-            <w:rStyle w:val="834"/>
+            <w:rStyle w:val="877"/>
             <w:highlight w:val="none"/>
           </w:rPr>
           <w:t xml:space="preserve">.</w:t>
@@ -919,20 +919,20 @@
       <w:hyperlink r:id="rId11" w:tooltip="https://phet.colorado.edu/sims/html/my-solar-system/latest/my-solar-system_all.html" w:history="1">
         <w:r>
           <w:rPr>
-            <w:rStyle w:val="834"/>
+            <w:rStyle w:val="877"/>
             <w:highlight w:val="none"/>
           </w:rPr>
           <w:t xml:space="preserve">https://phet.colorado.edu/sims/html/my-solar-system/latest/my-solar-system_all.html</w:t>
         </w:r>
         <w:r>
           <w:rPr>
-            <w:rStyle w:val="834"/>
+            <w:rStyle w:val="877"/>
             <w:highlight w:val="none"/>
           </w:rPr>
         </w:r>
         <w:r>
           <w:rPr>
-            <w:rStyle w:val="834"/>
+            <w:rStyle w:val="877"/>
             <w:highlight w:val="none"/>
           </w:rPr>
         </w:r>
@@ -1655,7 +1655,7 @@
     </w:p>
     <w:p>
       <w:pPr>
-        <w:pStyle w:val="856"/>
+        <w:pStyle w:val="899"/>
         <w:numPr>
           <w:ilvl w:val="0"/>
           <w:numId w:val="2"/>
@@ -1686,7 +1686,7 @@
     </w:p>
     <w:p>
       <w:pPr>
-        <w:pStyle w:val="856"/>
+        <w:pStyle w:val="899"/>
         <w:numPr>
           <w:ilvl w:val="0"/>
           <w:numId w:val="2"/>
@@ -1717,7 +1717,7 @@
     </w:p>
     <w:p>
       <w:pPr>
-        <w:pStyle w:val="856"/>
+        <w:pStyle w:val="899"/>
         <w:numPr>
           <w:ilvl w:val="0"/>
           <w:numId w:val="2"/>
@@ -1748,7 +1748,7 @@
     </w:p>
     <w:p>
       <w:pPr>
-        <w:pStyle w:val="856"/>
+        <w:pStyle w:val="899"/>
         <w:numPr>
           <w:ilvl w:val="0"/>
           <w:numId w:val="2"/>
@@ -1779,7 +1779,7 @@
     </w:p>
     <w:p>
       <w:pPr>
-        <w:pStyle w:val="856"/>
+        <w:pStyle w:val="899"/>
         <w:numPr>
           <w:ilvl w:val="0"/>
           <w:numId w:val="2"/>
@@ -2000,7 +2000,7 @@
     </w:p>
     <w:p>
       <w:pPr>
-        <w:pStyle w:val="678"/>
+        <w:pStyle w:val="721"/>
         <w:pBdr/>
         <w:spacing/>
         <w:ind/>
@@ -2028,7 +2028,7 @@
     </w:p>
     <w:p>
       <w:pPr>
-        <w:pStyle w:val="680"/>
+        <w:pStyle w:val="723"/>
         <w:pBdr/>
         <w:spacing/>
         <w:ind/>
@@ -2071,29 +2071,29 @@
       <w:hyperlink r:id="rId12" w:tooltip="https://eyes.nasa.gov/apps/orrery/#/home" w:history="1">
         <w:r>
           <w:rPr>
-            <w:rStyle w:val="834"/>
+            <w:rStyle w:val="877"/>
             <w:highlight w:val="none"/>
           </w:rPr>
           <w:t xml:space="preserve">https://eyes.nasa.gov/apps/orrery/#/home</w:t>
         </w:r>
         <w:r>
           <w:rPr>
-            <w:rStyle w:val="834"/>
+            <w:rStyle w:val="877"/>
           </w:rPr>
         </w:r>
         <w:r>
           <w:rPr>
-            <w:rStyle w:val="834"/>
+            <w:rStyle w:val="877"/>
           </w:rPr>
         </w:r>
         <w:r>
           <w:rPr>
-            <w:rStyle w:val="834"/>
+            <w:rStyle w:val="877"/>
           </w:rPr>
         </w:r>
         <w:r>
           <w:rPr>
-            <w:rStyle w:val="834"/>
+            <w:rStyle w:val="877"/>
           </w:rPr>
         </w:r>
       </w:hyperlink>
@@ -2310,7 +2310,7 @@
     </w:p>
     <w:p>
       <w:pPr>
-        <w:pStyle w:val="680"/>
+        <w:pStyle w:val="723"/>
         <w:pBdr/>
         <w:spacing/>
         <w:ind/>
@@ -2349,18 +2349,18 @@
       <w:hyperlink r:id="rId14" w:tooltip="https://phet.colorado.edu/sims/html/my-solar-system/latest/my-solar-system_all.html" w:history="1">
         <w:r>
           <w:rPr>
-            <w:rStyle w:val="834"/>
+            <w:rStyle w:val="877"/>
           </w:rPr>
           <w:t xml:space="preserve">https://phet.colorado.edu/sims/html/my-solar-system/latest/my-solar-system_all.html</w:t>
         </w:r>
         <w:r>
           <w:rPr>
-            <w:rStyle w:val="834"/>
+            <w:rStyle w:val="877"/>
           </w:rPr>
         </w:r>
         <w:r>
           <w:rPr>
-            <w:rStyle w:val="834"/>
+            <w:rStyle w:val="877"/>
           </w:rPr>
         </w:r>
       </w:hyperlink>
@@ -2551,7 +2551,7 @@
     </w:p>
     <w:p>
       <w:pPr>
-        <w:pStyle w:val="678"/>
+        <w:pStyle w:val="721"/>
         <w:pBdr/>
         <w:spacing/>
         <w:ind/>
@@ -2628,7 +2628,7 @@
     </w:p>
     <w:p>
       <w:pPr>
-        <w:pStyle w:val="856"/>
+        <w:pStyle w:val="899"/>
         <w:numPr>
           <w:ilvl w:val="0"/>
           <w:numId w:val="3"/>
@@ -2645,7 +2645,7 @@
     </w:p>
     <w:p>
       <w:pPr>
-        <w:pStyle w:val="856"/>
+        <w:pStyle w:val="899"/>
         <w:numPr>
           <w:ilvl w:val="0"/>
           <w:numId w:val="3"/>
@@ -2670,7 +2670,7 @@
     </w:p>
     <w:p>
       <w:pPr>
-        <w:pStyle w:val="856"/>
+        <w:pStyle w:val="899"/>
         <w:numPr>
           <w:ilvl w:val="0"/>
           <w:numId w:val="3"/>
@@ -2695,7 +2695,7 @@
     </w:p>
     <w:p>
       <w:pPr>
-        <w:pStyle w:val="856"/>
+        <w:pStyle w:val="899"/>
         <w:numPr>
           <w:ilvl w:val="0"/>
           <w:numId w:val="3"/>
@@ -2730,7 +2730,7 @@
     </w:p>
     <w:p>
       <w:pPr>
-        <w:pStyle w:val="678"/>
+        <w:pStyle w:val="721"/>
         <w:pBdr/>
         <w:spacing/>
         <w:ind/>
@@ -2758,7 +2758,7 @@
     </w:p>
     <w:p>
       <w:pPr>
-        <w:pStyle w:val="680"/>
+        <w:pStyle w:val="723"/>
         <w:pBdr/>
         <w:spacing/>
         <w:ind/>
@@ -3002,7 +3002,7 @@
     </w:p>
     <w:p>
       <w:pPr>
-        <w:pStyle w:val="680"/>
+        <w:pStyle w:val="723"/>
         <w:pBdr/>
         <w:spacing/>
         <w:ind/>
@@ -3054,18 +3054,18 @@
       <w:hyperlink r:id="rId17" w:tooltip="https://ssd.jpl.nasa.gov/horizons/" w:history="1">
         <w:r>
           <w:rPr>
-            <w:rStyle w:val="834"/>
+            <w:rStyle w:val="877"/>
           </w:rPr>
           <w:t xml:space="preserve">https://ssd.jpl.nasa.gov/horizons/</w:t>
         </w:r>
         <w:r>
           <w:rPr>
-            <w:rStyle w:val="834"/>
+            <w:rStyle w:val="877"/>
           </w:rPr>
         </w:r>
         <w:r>
           <w:rPr>
-            <w:rStyle w:val="834"/>
+            <w:rStyle w:val="877"/>
           </w:rPr>
         </w:r>
       </w:hyperlink>
@@ -3187,7 +3187,7 @@
       <w:hyperlink r:id="rId18" w:tooltip="https://ssd.jpl.nasa.gov/api/horizons.api?format=text&amp;COMMAND='&quot;+target+&quot;'&amp;OBJ_DATA='YES'&amp;MAKE_EPHEM='YES'&amp;EPHEM_TYPE='VECTORS'&amp;START_TIME='&quot;+startTime+&quot;'&amp;STOP_TIME='&quot;+stopTime+&quot;'&amp;CENTER='500@0'&amp;STEP_SIZE='1 d'&amp;QUANTITIES='1,9,20,23,24,29'" w:history="1">
         <w:r>
           <w:rPr>
-            <w:rStyle w:val="834"/>
+            <w:rStyle w:val="877"/>
             <w:color w:val="000000" w:themeColor="text1"/>
             <w:sz w:val="22"/>
             <w:szCs w:val="18"/>
@@ -3197,7 +3197,7 @@
         </w:r>
         <w:r>
           <w:rPr>
-            <w:rStyle w:val="834"/>
+            <w:rStyle w:val="877"/>
             <w:color w:val="000000" w:themeColor="text1"/>
             <w:sz w:val="22"/>
             <w:szCs w:val="18"/>
@@ -3206,7 +3206,7 @@
         </w:r>
         <w:r>
           <w:rPr>
-            <w:rStyle w:val="834"/>
+            <w:rStyle w:val="877"/>
             <w:color w:val="000000" w:themeColor="text1"/>
             <w:sz w:val="22"/>
             <w:szCs w:val="18"/>
@@ -3347,7 +3347,7 @@
       <w:hyperlink r:id="rId19" w:tooltip="https://ssd-api.jpl.nasa.gov/doc/horizons.html#ephem_type" w:history="1">
         <w:r>
           <w:rPr>
-            <w:rStyle w:val="834"/>
+            <w:rStyle w:val="877"/>
             <w:color w:val="000000" w:themeColor="text1"/>
             <w:sz w:val="22"/>
             <w:szCs w:val="22"/>
@@ -3357,7 +3357,7 @@
         </w:r>
         <w:r>
           <w:rPr>
-            <w:rStyle w:val="834"/>
+            <w:rStyle w:val="877"/>
             <w:color w:val="000000" w:themeColor="text1"/>
             <w:sz w:val="22"/>
             <w:szCs w:val="22"/>
@@ -3366,7 +3366,7 @@
         </w:r>
         <w:r>
           <w:rPr>
-            <w:rStyle w:val="834"/>
+            <w:rStyle w:val="877"/>
             <w:color w:val="000000" w:themeColor="text1"/>
             <w:sz w:val="22"/>
             <w:szCs w:val="22"/>
@@ -3779,7 +3779,7 @@
     </w:p>
     <w:p>
       <w:pPr>
-        <w:pStyle w:val="680"/>
+        <w:pStyle w:val="723"/>
         <w:pBdr/>
         <w:spacing/>
         <w:ind/>
@@ -3816,7 +3816,7 @@
     </w:p>
     <w:p>
       <w:pPr>
-        <w:pStyle w:val="680"/>
+        <w:pStyle w:val="723"/>
         <w:pBdr/>
         <w:spacing/>
         <w:ind/>
@@ -3847,7 +3847,7 @@
     </w:p>
     <w:p>
       <w:pPr>
-        <w:pStyle w:val="680"/>
+        <w:pStyle w:val="723"/>
         <w:pBdr/>
         <w:spacing/>
         <w:ind/>
@@ -3879,7 +3879,7 @@
     </w:p>
     <w:p>
       <w:pPr>
-        <w:pStyle w:val="680"/>
+        <w:pStyle w:val="723"/>
         <w:pBdr/>
         <w:spacing/>
         <w:ind/>
@@ -5941,7 +5941,7 @@
     </w:p>
     <w:p>
       <w:pPr>
-        <w:pStyle w:val="680"/>
+        <w:pStyle w:val="723"/>
         <w:pBdr/>
         <w:spacing/>
         <w:ind/>
@@ -6641,7 +6641,7 @@
     </w:p>
     <w:p>
       <w:pPr>
-        <w:pStyle w:val="680"/>
+        <w:pStyle w:val="723"/>
         <w:pBdr/>
         <w:spacing/>
         <w:ind/>
@@ -7079,7 +7079,13 @@
         <w:rPr>
           <w:highlight w:val="none"/>
         </w:rPr>
-        <w:t xml:space="preserve">f mass is always inside or very close to the surface of the sun, this will be helpful when users start changing the mass of planets, as the solar system will quickly spin out of control and focusing on the centre of mass will make everything easier to see. It will also place you inbetween the sun and whatever planet you’ve increased the mass of by an absurd amount, so you get a good position to view the system.</w:t>
+        <w:t xml:space="preserve">f mass is always inside or very close to the surface of the sun, this will be helpful when users start changing the mass of planets, as the solar system will </w:t>
+      </w:r>
+      <w:r>
+        <w:rPr>
+          <w:highlight w:val="none"/>
+        </w:rPr>
+        <w:t xml:space="preserve">quickly spin out of control and focusing on the centre of mass will make everything easier to see. It will also place you inbetween the sun and whatever planet you’ve increased the mass of by an absurd amount, so you get a good position to view the system.</w:t>
       </w:r>
       <w:r>
         <w:rPr>
@@ -7209,7 +7215,7 @@
     </w:p>
     <w:p>
       <w:pPr>
-        <w:pStyle w:val="680"/>
+        <w:pStyle w:val="723"/>
         <w:pBdr/>
         <w:spacing/>
         <w:ind/>
@@ -7361,17 +7367,6 @@
         </w:rPr>
       </w:r>
       <w:r/>
-      <w:r>
-        <w:rPr>
-          <w:highlight w:val="none"/>
-        </w:rPr>
-      </w:r>
-      <w:r>
-        <w:rPr>
-          <w:highlight w:val="none"/>
-        </w:rPr>
-      </w:r>
-      <w:r/>
     </w:p>
     <w:p>
       <w:pPr>
@@ -7806,7 +7801,7 @@
     </w:p>
     <w:p>
       <w:pPr>
-        <w:pStyle w:val="680"/>
+        <w:pStyle w:val="723"/>
         <w:pBdr/>
         <w:spacing/>
         <w:ind/>
@@ -7835,7 +7830,7 @@
     </w:p>
     <w:p>
       <w:pPr>
-        <w:pStyle w:val="856"/>
+        <w:pStyle w:val="899"/>
         <w:numPr>
           <w:ilvl w:val="0"/>
           <w:numId w:val="7"/>
@@ -7852,7 +7847,7 @@
     </w:p>
     <w:p>
       <w:pPr>
-        <w:pStyle w:val="856"/>
+        <w:pStyle w:val="899"/>
         <w:numPr>
           <w:ilvl w:val="1"/>
           <w:numId w:val="7"/>
@@ -7877,7 +7872,31 @@
     </w:p>
     <w:p>
       <w:pPr>
-        <w:pStyle w:val="856"/>
+        <w:pStyle w:val="899"/>
+        <w:numPr>
+          <w:ilvl w:val="2"/>
+          <w:numId w:val="7"/>
+        </w:numPr>
+        <w:pBdr/>
+        <w:spacing/>
+        <w:ind/>
+        <w:rPr/>
+      </w:pPr>
+      <w:r>
+        <w:rPr>
+          <w:highlight w:val="none"/>
+        </w:rPr>
+        <w:t xml:space="preserve">These laws should be implemented as methods for a class used to represent planets and other celestial bodies</w:t>
+      </w:r>
+      <w:r>
+        <w:rPr>
+          <w:highlight w:val="none"/>
+        </w:rPr>
+      </w:r>
+    </w:p>
+    <w:p>
+      <w:pPr>
+        <w:pStyle w:val="899"/>
         <w:numPr>
           <w:ilvl w:val="1"/>
           <w:numId w:val="7"/>
@@ -7891,13 +7910,61 @@
         <w:rPr>
           <w:highlight w:val="none"/>
         </w:rPr>
+        <w:t xml:space="preserve">Calculate the motion of objects using verlet integration</w:t>
+      </w:r>
+      <w:r>
+        <w:rPr>
+          <w:highlight w:val="none"/>
+        </w:rPr>
+      </w:r>
+    </w:p>
+    <w:p>
+      <w:pPr>
+        <w:pStyle w:val="899"/>
+        <w:numPr>
+          <w:ilvl w:val="2"/>
+          <w:numId w:val="7"/>
+        </w:numPr>
+        <w:pBdr/>
+        <w:spacing/>
+        <w:ind/>
+        <w:rPr/>
+      </w:pPr>
+      <w:r>
+        <w:rPr>
+          <w:highlight w:val="none"/>
+        </w:rPr>
+        <w:t xml:space="preserve">This should also be implemented as methods for the celestialBody class.</w:t>
+      </w:r>
+      <w:r>
+        <w:rPr>
+          <w:highlight w:val="none"/>
+        </w:rPr>
+      </w:r>
+    </w:p>
+    <w:p>
+      <w:pPr>
+        <w:pStyle w:val="899"/>
+        <w:numPr>
+          <w:ilvl w:val="1"/>
+          <w:numId w:val="7"/>
+        </w:numPr>
+        <w:pBdr/>
+        <w:spacing/>
+        <w:ind/>
+        <w:rPr/>
+      </w:pPr>
+      <w:r>
+        <w:rPr>
+          <w:highlight w:val="none"/>
+        </w:rPr>
         <w:t xml:space="preserve">Energy and momentum should be conserved (this should naturally arise from using Newton’s laws if they’re implemented correctly)</w:t>
       </w:r>
       <w:r/>
     </w:p>
     <w:p>
       <w:pPr>
-        <w:pStyle w:val="856"/>
+        <w:pStyle w:val="899"/>
         <w:numPr>
           <w:ilvl w:val="0"/>
           <w:numId w:val="7"/>
@@ -7922,7 +7989,7 @@
     </w:p>
     <w:p>
       <w:pPr>
-        <w:pStyle w:val="856"/>
+        <w:pStyle w:val="899"/>
         <w:numPr>
           <w:ilvl w:val="1"/>
           <w:numId w:val="7"/>
@@ -7947,7 +8014,7 @@
     </w:p>
     <w:p>
       <w:pPr>
-        <w:pStyle w:val="856"/>
+        <w:pStyle w:val="899"/>
         <w:numPr>
           <w:ilvl w:val="2"/>
           <w:numId w:val="7"/>
@@ -7972,7 +8039,7 @@
     </w:p>
     <w:p>
       <w:pPr>
-        <w:pStyle w:val="856"/>
+        <w:pStyle w:val="899"/>
         <w:numPr>
           <w:ilvl w:val="2"/>
           <w:numId w:val="7"/>
@@ -7997,7 +8064,7 @@
     </w:p>
     <w:p>
       <w:pPr>
-        <w:pStyle w:val="856"/>
+        <w:pStyle w:val="899"/>
         <w:numPr>
           <w:ilvl w:val="1"/>
           <w:numId w:val="7"/>
@@ -8011,7 +8078,7 @@
         <w:rPr>
           <w:highlight w:val="none"/>
         </w:rPr>
-        <w:t xml:space="preserve">Have a menu that displays stats and lets the user edit certain values</w:t>
+        <w:t xml:space="preserve">Have a menu that displays stats and lets the user edit certain values as requested by client</w:t>
       </w:r>
       <w:r>
         <w:rPr>
@@ -8022,7 +8089,7 @@
     </w:p>
     <w:p>
       <w:pPr>
-        <w:pStyle w:val="856"/>
+        <w:pStyle w:val="899"/>
         <w:numPr>
           <w:ilvl w:val="2"/>
           <w:numId w:val="7"/>
@@ -8047,7 +8114,7 @@
     </w:p>
     <w:p>
       <w:pPr>
-        <w:pStyle w:val="856"/>
+        <w:pStyle w:val="899"/>
         <w:numPr>
           <w:ilvl w:val="2"/>
           <w:numId w:val="7"/>
@@ -8061,7 +8128,7 @@
         <w:rPr>
           <w:highlight w:val="none"/>
         </w:rPr>
-        <w:t xml:space="preserve">Should show information about the planet</w:t>
+        <w:t xml:space="preserve">Should show information about the planet from a reliable source (NASA, see objective 5)</w:t>
       </w:r>
       <w:r>
         <w:rPr>
@@ -8072,7 +8139,7 @@
     </w:p>
     <w:p>
       <w:pPr>
-        <w:pStyle w:val="856"/>
+        <w:pStyle w:val="899"/>
         <w:numPr>
           <w:ilvl w:val="3"/>
           <w:numId w:val="7"/>
@@ -8097,7 +8164,7 @@
     </w:p>
     <w:p>
       <w:pPr>
-        <w:pStyle w:val="856"/>
+        <w:pStyle w:val="899"/>
         <w:numPr>
           <w:ilvl w:val="3"/>
           <w:numId w:val="7"/>
@@ -8122,7 +8189,7 @@
     </w:p>
     <w:p>
       <w:pPr>
-        <w:pStyle w:val="856"/>
+        <w:pStyle w:val="899"/>
         <w:numPr>
           <w:ilvl w:val="3"/>
           <w:numId w:val="7"/>
@@ -8147,7 +8214,7 @@
     </w:p>
     <w:p>
       <w:pPr>
-        <w:pStyle w:val="856"/>
+        <w:pStyle w:val="899"/>
         <w:numPr>
           <w:ilvl w:val="2"/>
           <w:numId w:val="7"/>
@@ -8161,6 +8228,30 @@
         <w:rPr>
           <w:highlight w:val="none"/>
         </w:rPr>
+        <w:t xml:space="preserve">The information should be stored as attributes of the celestialBody class (or in the case of distance from sun can be calculated from celestialBody class).</w:t>
+      </w:r>
+      <w:r>
+        <w:rPr>
+          <w:highlight w:val="none"/>
+        </w:rPr>
+      </w:r>
+    </w:p>
+    <w:p>
+      <w:pPr>
+        <w:pStyle w:val="899"/>
+        <w:numPr>
+          <w:ilvl w:val="2"/>
+          <w:numId w:val="7"/>
+        </w:numPr>
+        <w:pBdr/>
+        <w:spacing/>
+        <w:ind/>
+        <w:rPr/>
+      </w:pPr>
+      <w:r>
+        <w:rPr>
+          <w:highlight w:val="none"/>
+        </w:rPr>
         <w:t xml:space="preserve">Should let users edit the value of G</w:t>
       </w:r>
       <w:r>
@@ -8172,7 +8263,7 @@
     </w:p>
     <w:p>
       <w:pPr>
-        <w:pStyle w:val="856"/>
+        <w:pStyle w:val="899"/>
         <w:numPr>
           <w:ilvl w:val="3"/>
           <w:numId w:val="7"/>
@@ -8197,7 +8288,7 @@
     </w:p>
     <w:p>
       <w:pPr>
-        <w:pStyle w:val="856"/>
+        <w:pStyle w:val="899"/>
         <w:numPr>
           <w:ilvl w:val="2"/>
           <w:numId w:val="7"/>
@@ -8222,7 +8313,7 @@
     </w:p>
     <w:p>
       <w:pPr>
-        <w:pStyle w:val="856"/>
+        <w:pStyle w:val="899"/>
         <w:numPr>
           <w:ilvl w:val="3"/>
           <w:numId w:val="7"/>
@@ -8244,10 +8335,21 @@
         </w:rPr>
       </w:r>
       <w:r/>
+      <w:r>
+        <w:rPr>
+          <w:highlight w:val="none"/>
+        </w:rPr>
+      </w:r>
+      <w:r>
+        <w:rPr>
+          <w:highlight w:val="none"/>
+        </w:rPr>
+      </w:r>
+      <w:r/>
     </w:p>
     <w:p>
       <w:pPr>
-        <w:pStyle w:val="856"/>
+        <w:pStyle w:val="899"/>
         <w:numPr>
           <w:ilvl w:val="1"/>
           <w:numId w:val="7"/>
@@ -8272,7 +8374,7 @@
     </w:p>
     <w:p>
       <w:pPr>
-        <w:pStyle w:val="856"/>
+        <w:pStyle w:val="899"/>
         <w:numPr>
           <w:ilvl w:val="0"/>
           <w:numId w:val="7"/>
@@ -8292,7 +8394,7 @@
     </w:p>
     <w:p>
       <w:pPr>
-        <w:pStyle w:val="856"/>
+        <w:pStyle w:val="899"/>
         <w:numPr>
           <w:ilvl w:val="1"/>
           <w:numId w:val="7"/>
@@ -8317,7 +8419,7 @@
     </w:p>
     <w:p>
       <w:pPr>
-        <w:pStyle w:val="856"/>
+        <w:pStyle w:val="899"/>
         <w:numPr>
           <w:ilvl w:val="1"/>
           <w:numId w:val="7"/>
@@ -8342,7 +8444,7 @@
     </w:p>
     <w:p>
       <w:pPr>
-        <w:pStyle w:val="856"/>
+        <w:pStyle w:val="899"/>
         <w:numPr>
           <w:ilvl w:val="1"/>
           <w:numId w:val="7"/>
@@ -8367,7 +8469,7 @@
     </w:p>
     <w:p>
       <w:pPr>
-        <w:pStyle w:val="856"/>
+        <w:pStyle w:val="899"/>
         <w:numPr>
           <w:ilvl w:val="1"/>
           <w:numId w:val="7"/>
@@ -8392,7 +8494,7 @@
     </w:p>
     <w:p>
       <w:pPr>
-        <w:pStyle w:val="856"/>
+        <w:pStyle w:val="899"/>
         <w:numPr>
           <w:ilvl w:val="0"/>
           <w:numId w:val="7"/>
@@ -8406,7 +8508,7 @@
         <w:rPr>
           <w:highlight w:val="none"/>
         </w:rPr>
-        <w:t xml:space="preserve">Include the ability to compare sizes of two planets</w:t>
+        <w:t xml:space="preserve">Include the ability to compare sizes of two planets as requested by client.</w:t>
       </w:r>
       <w:r>
         <w:rPr>
@@ -8417,7 +8519,7 @@
     </w:p>
     <w:p>
       <w:pPr>
-        <w:pStyle w:val="856"/>
+        <w:pStyle w:val="899"/>
         <w:numPr>
           <w:ilvl w:val="0"/>
           <w:numId w:val="7"/>
@@ -8431,7 +8533,7 @@
         <w:rPr>
           <w:highlight w:val="none"/>
         </w:rPr>
-        <w:t xml:space="preserve">Access NASA JPL’s Horizons system to automatically import up to date data on planets</w:t>
+        <w:t xml:space="preserve">Access NASA JPL’s Horizons system to automatically import up to date data on planets via API requests</w:t>
       </w:r>
       <w:r>
         <w:rPr>
@@ -8442,7 +8544,7 @@
     </w:p>
     <w:p>
       <w:pPr>
-        <w:pStyle w:val="856"/>
+        <w:pStyle w:val="899"/>
         <w:numPr>
           <w:ilvl w:val="1"/>
           <w:numId w:val="7"/>
@@ -8456,7 +8558,7 @@
         <w:rPr>
           <w:highlight w:val="none"/>
         </w:rPr>
-        <w:t xml:space="preserve">Use said data to load our real solar system into the program</w:t>
+        <w:t xml:space="preserve">Use said data to load our real solar system into the program via dynamic object creation</w:t>
       </w:r>
       <w:r>
         <w:rPr>
@@ -8467,7 +8569,31 @@
     </w:p>
     <w:p>
       <w:pPr>
-        <w:pStyle w:val="856"/>
+        <w:pStyle w:val="899"/>
+        <w:numPr>
+          <w:ilvl w:val="1"/>
+          <w:numId w:val="7"/>
+        </w:numPr>
+        <w:pBdr/>
+        <w:spacing/>
+        <w:ind/>
+        <w:rPr/>
+      </w:pPr>
+      <w:r>
+        <w:rPr>
+          <w:highlight w:val="none"/>
+        </w:rPr>
+        <w:t xml:space="preserve">The solar system should be stored as a list of celestial bodies, “planets”.</w:t>
+      </w:r>
+      <w:r>
+        <w:rPr>
+          <w:highlight w:val="none"/>
+        </w:rPr>
+      </w:r>
+    </w:p>
+    <w:p>
+      <w:pPr>
+        <w:pStyle w:val="899"/>
         <w:numPr>
           <w:ilvl w:val="0"/>
           <w:numId w:val="7"/>
@@ -8494,7 +8620,7 @@
       <w:footnotePr/>
       <w:endnotePr/>
       <w:type w:val="nextPage"/>
-      <w:pgSz w:h="16838" w:orient="landscape" w:w="11906"/>
+      <w:pgSz w:h="16838" w:orient="portrait" w:w="11906"/>
       <w:pgMar w:top="1134" w:right="850" w:bottom="1134" w:left="1701" w:header="709" w:footer="709" w:gutter="0"/>
       <w:cols w:num="1" w:sep="0" w:space="708" w:equalWidth="1"/>
     </w:sectPr>
@@ -9720,9 +9846,9 @@
     <w:lsdException w:name="Bibliography" w:uiPriority="37"/>
     <w:lsdException w:name="TOC Heading" w:uiPriority="39" w:qFormat="1"/>
   </w:latentStyles>
-  <w:style w:type="character" w:styleId="668">
+  <w:style w:type="character" w:styleId="711">
     <w:name w:val="Intense Emphasis"/>
-    <w:basedOn w:val="857"/>
+    <w:basedOn w:val="900"/>
     <w:uiPriority w:val="21"/>
     <w:qFormat/>
     <w:pPr>
@@ -9736,9 +9862,9 @@
       <w:color w:val="0f4761" w:themeColor="accent1" w:themeShade="BF"/>
     </w:rPr>
   </w:style>
-  <w:style w:type="character" w:styleId="669">
+  <w:style w:type="character" w:styleId="712">
     <w:name w:val="Intense Reference"/>
-    <w:basedOn w:val="857"/>
+    <w:basedOn w:val="900"/>
     <w:uiPriority w:val="32"/>
     <w:qFormat/>
     <w:pPr>
@@ -9754,9 +9880,9 @@
       <w:spacing w:val="5"/>
     </w:rPr>
   </w:style>
-  <w:style w:type="character" w:styleId="670">
+  <w:style w:type="character" w:styleId="713">
     <w:name w:val="Subtle Emphasis"/>
-    <w:basedOn w:val="857"/>
+    <w:basedOn w:val="900"/>
     <w:uiPriority w:val="19"/>
     <w:qFormat/>
     <w:pPr>
@@ -9770,9 +9896,9 @@
       <w:color w:val="404040" w:themeColor="text1" w:themeTint="BF"/>
     </w:rPr>
   </w:style>
-  <w:style w:type="character" w:styleId="671">
+  <w:style w:type="character" w:styleId="714">
     <w:name w:val="Emphasis"/>
-    <w:basedOn w:val="857"/>
+    <w:basedOn w:val="900"/>
     <w:uiPriority w:val="20"/>
     <w:qFormat/>
     <w:pPr>
@@ -9785,9 +9911,9 @@
       <w:iCs/>
     </w:rPr>
   </w:style>
-  <w:style w:type="character" w:styleId="672">
+  <w:style w:type="character" w:styleId="715">
     <w:name w:val="Strong"/>
-    <w:basedOn w:val="857"/>
+    <w:basedOn w:val="900"/>
     <w:uiPriority w:val="22"/>
     <w:qFormat/>
     <w:pPr>
@@ -9800,9 +9926,9 @@
       <w:bCs/>
     </w:rPr>
   </w:style>
-  <w:style w:type="character" w:styleId="673">
+  <w:style w:type="character" w:styleId="716">
     <w:name w:val="Subtle Reference"/>
-    <w:basedOn w:val="857"/>
+    <w:basedOn w:val="900"/>
     <w:uiPriority w:val="31"/>
     <w:qFormat/>
     <w:pPr>
@@ -9815,9 +9941,9 @@
       <w:color w:val="5a5a5a" w:themeColor="text1" w:themeTint="A5"/>
     </w:rPr>
   </w:style>
-  <w:style w:type="character" w:styleId="674">
+  <w:style w:type="character" w:styleId="717">
     <w:name w:val="Book Title"/>
-    <w:basedOn w:val="857"/>
+    <w:basedOn w:val="900"/>
     <w:uiPriority w:val="33"/>
     <w:qFormat/>
     <w:pPr>
@@ -9833,9 +9959,9 @@
       <w:spacing w:val="5"/>
     </w:rPr>
   </w:style>
-  <w:style w:type="character" w:styleId="675">
+  <w:style w:type="character" w:styleId="718">
     <w:name w:val="FollowedHyperlink"/>
-    <w:basedOn w:val="857"/>
+    <w:basedOn w:val="900"/>
     <w:uiPriority w:val="99"/>
     <w:semiHidden/>
     <w:unhideWhenUsed/>
@@ -9849,11 +9975,11 @@
       <w:u w:val="single"/>
     </w:rPr>
   </w:style>
-  <w:style w:type="paragraph" w:styleId="676">
+  <w:style w:type="paragraph" w:styleId="719">
     <w:name w:val="Heading 1"/>
-    <w:basedOn w:val="852"/>
-    <w:next w:val="852"/>
-    <w:link w:val="677"/>
+    <w:basedOn w:val="895"/>
+    <w:next w:val="895"/>
+    <w:link w:val="720"/>
     <w:uiPriority w:val="9"/>
     <w:qFormat/>
     <w:pPr>
@@ -9870,9 +9996,9 @@
       <w:szCs w:val="40"/>
     </w:rPr>
   </w:style>
-  <w:style w:type="character" w:styleId="677">
+  <w:style w:type="character" w:styleId="720">
     <w:name w:val="Heading 1 Char"/>
-    <w:link w:val="676"/>
+    <w:link w:val="719"/>
     <w:uiPriority w:val="9"/>
     <w:pPr>
       <w:pBdr/>
@@ -9885,11 +10011,11 @@
       <w:szCs w:val="40"/>
     </w:rPr>
   </w:style>
-  <w:style w:type="paragraph" w:styleId="678">
+  <w:style w:type="paragraph" w:styleId="721">
     <w:name w:val="Heading 2"/>
-    <w:basedOn w:val="852"/>
-    <w:next w:val="852"/>
-    <w:link w:val="679"/>
+    <w:basedOn w:val="895"/>
+    <w:next w:val="895"/>
+    <w:link w:val="722"/>
     <w:uiPriority w:val="9"/>
     <w:unhideWhenUsed/>
     <w:qFormat/>
@@ -9906,9 +10032,9 @@
       <w:sz w:val="34"/>
     </w:rPr>
   </w:style>
-  <w:style w:type="character" w:styleId="679">
+  <w:style w:type="character" w:styleId="722">
     <w:name w:val="Heading 2 Char"/>
-    <w:link w:val="678"/>
+    <w:link w:val="721"/>
     <w:uiPriority w:val="9"/>
     <w:pPr>
       <w:pBdr/>
@@ -9920,11 +10046,11 @@
       <w:sz w:val="34"/>
     </w:rPr>
   </w:style>
-  <w:style w:type="paragraph" w:styleId="680">
+  <w:style w:type="paragraph" w:styleId="723">
     <w:name w:val="Heading 3"/>
-    <w:basedOn w:val="852"/>
-    <w:next w:val="852"/>
-    <w:link w:val="681"/>
+    <w:basedOn w:val="895"/>
+    <w:next w:val="895"/>
+    <w:link w:val="724"/>
     <w:uiPriority w:val="9"/>
     <w:unhideWhenUsed/>
     <w:qFormat/>
@@ -9942,9 +10068,9 @@
       <w:szCs w:val="30"/>
     </w:rPr>
   </w:style>
-  <w:style w:type="character" w:styleId="681">
+  <w:style w:type="character" w:styleId="724">
     <w:name w:val="Heading 3 Char"/>
-    <w:link w:val="680"/>
+    <w:link w:val="723"/>
     <w:uiPriority w:val="9"/>
     <w:pPr>
       <w:pBdr/>
@@ -9957,11 +10083,11 @@
       <w:szCs w:val="30"/>
     </w:rPr>
   </w:style>
-  <w:style w:type="paragraph" w:styleId="682">
+  <w:style w:type="paragraph" w:styleId="725">
     <w:name w:val="Heading 4"/>
-    <w:basedOn w:val="852"/>
-    <w:next w:val="852"/>
-    <w:link w:val="683"/>
+    <w:basedOn w:val="895"/>
+    <w:next w:val="895"/>
+    <w:link w:val="726"/>
     <w:uiPriority w:val="9"/>
     <w:unhideWhenUsed/>
     <w:qFormat/>
@@ -9981,9 +10107,9 @@
       <w:szCs w:val="26"/>
     </w:rPr>
   </w:style>
-  <w:style w:type="character" w:styleId="683">
+  <w:style w:type="character" w:styleId="726">
     <w:name w:val="Heading 4 Char"/>
-    <w:link w:val="682"/>
+    <w:link w:val="725"/>
     <w:uiPriority w:val="9"/>
     <w:pPr>
       <w:pBdr/>
@@ -9998,11 +10124,11 @@
       <w:szCs w:val="26"/>
     </w:rPr>
   </w:style>
-  <w:style w:type="paragraph" w:styleId="684">
+  <w:style w:type="paragraph" w:styleId="727">
     <w:name w:val="Heading 5"/>
-    <w:basedOn w:val="852"/>
-    <w:next w:val="852"/>
-    <w:link w:val="685"/>
+    <w:basedOn w:val="895"/>
+    <w:next w:val="895"/>
+    <w:link w:val="728"/>
     <w:uiPriority w:val="9"/>
     <w:unhideWhenUsed/>
     <w:qFormat/>
@@ -10022,9 +10148,9 @@
       <w:szCs w:val="24"/>
     </w:rPr>
   </w:style>
-  <w:style w:type="character" w:styleId="685">
+  <w:style w:type="character" w:styleId="728">
     <w:name w:val="Heading 5 Char"/>
-    <w:link w:val="684"/>
+    <w:link w:val="727"/>
     <w:uiPriority w:val="9"/>
     <w:pPr>
       <w:pBdr/>
@@ -10039,11 +10165,11 @@
       <w:szCs w:val="24"/>
     </w:rPr>
   </w:style>
-  <w:style w:type="paragraph" w:styleId="686">
+  <w:style w:type="paragraph" w:styleId="729">
     <w:name w:val="Heading 6"/>
-    <w:basedOn w:val="852"/>
-    <w:next w:val="852"/>
-    <w:link w:val="687"/>
+    <w:basedOn w:val="895"/>
+    <w:next w:val="895"/>
+    <w:link w:val="730"/>
     <w:uiPriority w:val="9"/>
     <w:unhideWhenUsed/>
     <w:qFormat/>
@@ -10063,9 +10189,9 @@
       <w:szCs w:val="22"/>
     </w:rPr>
   </w:style>
-  <w:style w:type="character" w:styleId="687">
+  <w:style w:type="character" w:styleId="730">
     <w:name w:val="Heading 6 Char"/>
-    <w:link w:val="686"/>
+    <w:link w:val="729"/>
     <w:uiPriority w:val="9"/>
     <w:pPr>
       <w:pBdr/>
@@ -10080,11 +10206,11 @@
       <w:szCs w:val="22"/>
     </w:rPr>
   </w:style>
-  <w:style w:type="paragraph" w:styleId="688">
+  <w:style w:type="paragraph" w:styleId="731">
     <w:name w:val="Heading 7"/>
-    <w:basedOn w:val="852"/>
-    <w:next w:val="852"/>
-    <w:link w:val="689"/>
+    <w:basedOn w:val="895"/>
+    <w:next w:val="895"/>
+    <w:link w:val="732"/>
     <w:uiPriority w:val="9"/>
     <w:unhideWhenUsed/>
     <w:qFormat/>
@@ -10106,9 +10232,9 @@
       <w:szCs w:val="22"/>
     </w:rPr>
   </w:style>
-  <w:style w:type="character" w:styleId="689">
+  <w:style w:type="character" w:styleId="732">
     <w:name w:val="Heading 7 Char"/>
-    <w:link w:val="688"/>
+    <w:link w:val="731"/>
     <w:uiPriority w:val="9"/>
     <w:pPr>
       <w:pBdr/>
@@ -10125,11 +10251,11 @@
       <w:szCs w:val="22"/>
     </w:rPr>
   </w:style>
-  <w:style w:type="paragraph" w:styleId="690">
+  <w:style w:type="paragraph" w:styleId="733">
     <w:name w:val="Heading 8"/>
-    <w:basedOn w:val="852"/>
-    <w:next w:val="852"/>
-    <w:link w:val="691"/>
+    <w:basedOn w:val="895"/>
+    <w:next w:val="895"/>
+    <w:link w:val="734"/>
     <w:uiPriority w:val="9"/>
     <w:unhideWhenUsed/>
     <w:qFormat/>
@@ -10149,9 +10275,9 @@
       <w:szCs w:val="22"/>
     </w:rPr>
   </w:style>
-  <w:style w:type="character" w:styleId="691">
+  <w:style w:type="character" w:styleId="734">
     <w:name w:val="Heading 8 Char"/>
-    <w:link w:val="690"/>
+    <w:link w:val="733"/>
     <w:uiPriority w:val="9"/>
     <w:pPr>
       <w:pBdr/>
@@ -10166,11 +10292,11 @@
       <w:szCs w:val="22"/>
     </w:rPr>
   </w:style>
-  <w:style w:type="paragraph" w:styleId="692">
+  <w:style w:type="paragraph" w:styleId="735">
     <w:name w:val="Heading 9"/>
-    <w:basedOn w:val="852"/>
-    <w:next w:val="852"/>
-    <w:link w:val="693"/>
+    <w:basedOn w:val="895"/>
+    <w:next w:val="895"/>
+    <w:link w:val="736"/>
     <w:uiPriority w:val="9"/>
     <w:unhideWhenUsed/>
     <w:qFormat/>
@@ -10190,9 +10316,9 @@
       <w:szCs w:val="21"/>
     </w:rPr>
   </w:style>
-  <w:style w:type="character" w:styleId="693">
+  <w:style w:type="character" w:styleId="736">
     <w:name w:val="Heading 9 Char"/>
-    <w:link w:val="692"/>
+    <w:link w:val="735"/>
     <w:uiPriority w:val="9"/>
     <w:pPr>
       <w:pBdr/>
@@ -10207,11 +10333,11 @@
       <w:szCs w:val="21"/>
     </w:rPr>
   </w:style>
-  <w:style w:type="paragraph" w:styleId="694">
+  <w:style w:type="paragraph" w:styleId="737">
     <w:name w:val="Title"/>
-    <w:basedOn w:val="852"/>
-    <w:next w:val="852"/>
-    <w:link w:val="695"/>
+    <w:basedOn w:val="895"/>
+    <w:next w:val="895"/>
+    <w:link w:val="738"/>
     <w:uiPriority w:val="10"/>
     <w:qFormat/>
     <w:pPr>
@@ -10225,9 +10351,9 @@
       <w:szCs w:val="48"/>
     </w:rPr>
   </w:style>
-  <w:style w:type="character" w:styleId="695">
+  <w:style w:type="character" w:styleId="738">
     <w:name w:val="Title Char"/>
-    <w:link w:val="694"/>
+    <w:link w:val="737"/>
     <w:uiPriority w:val="10"/>
     <w:pPr>
       <w:pBdr/>
@@ -10239,11 +10365,11 @@
       <w:szCs w:val="48"/>
     </w:rPr>
   </w:style>
-  <w:style w:type="paragraph" w:styleId="696">
+  <w:style w:type="paragraph" w:styleId="739">
     <w:name w:val="Subtitle"/>
-    <w:basedOn w:val="852"/>
-    <w:next w:val="852"/>
-    <w:link w:val="697"/>
+    <w:basedOn w:val="895"/>
+    <w:next w:val="895"/>
+    <w:link w:val="740"/>
     <w:uiPriority w:val="11"/>
     <w:qFormat/>
     <w:pPr>
@@ -10256,9 +10382,9 @@
       <w:szCs w:val="24"/>
     </w:rPr>
   </w:style>
-  <w:style w:type="character" w:styleId="697">
+  <w:style w:type="character" w:styleId="740">
     <w:name w:val="Subtitle Char"/>
-    <w:link w:val="696"/>
+    <w:link w:val="739"/>
     <w:uiPriority w:val="11"/>
     <w:pPr>
       <w:pBdr/>
@@ -10270,11 +10396,11 @@
       <w:szCs w:val="24"/>
     </w:rPr>
   </w:style>
-  <w:style w:type="paragraph" w:styleId="698">
+  <w:style w:type="paragraph" w:styleId="741">
     <w:name w:val="Quote"/>
-    <w:basedOn w:val="852"/>
-    <w:next w:val="852"/>
-    <w:link w:val="699"/>
+    <w:basedOn w:val="895"/>
+    <w:next w:val="895"/>
+    <w:link w:val="742"/>
     <w:uiPriority w:val="29"/>
     <w:qFormat/>
     <w:pPr>
@@ -10286,9 +10412,9 @@
       <w:i/>
     </w:rPr>
   </w:style>
-  <w:style w:type="character" w:styleId="699">
+  <w:style w:type="character" w:styleId="742">
     <w:name w:val="Quote Char"/>
-    <w:link w:val="698"/>
+    <w:link w:val="741"/>
     <w:uiPriority w:val="29"/>
     <w:pPr>
       <w:pBdr/>
@@ -10299,11 +10425,11 @@
       <w:i/>
     </w:rPr>
   </w:style>
-  <w:style w:type="paragraph" w:styleId="700">
+  <w:style w:type="paragraph" w:styleId="743">
     <w:name w:val="Intense Quote"/>
-    <w:basedOn w:val="852"/>
-    <w:next w:val="852"/>
-    <w:link w:val="701"/>
+    <w:basedOn w:val="895"/>
+    <w:next w:val="895"/>
+    <w:link w:val="744"/>
     <w:uiPriority w:val="30"/>
     <w:qFormat/>
     <w:pPr>
@@ -10322,9 +10448,9 @@
       <w:i/>
     </w:rPr>
   </w:style>
-  <w:style w:type="character" w:styleId="701">
+  <w:style w:type="character" w:styleId="744">
     <w:name w:val="Intense Quote Char"/>
-    <w:link w:val="700"/>
+    <w:link w:val="743"/>
     <w:uiPriority w:val="30"/>
     <w:pPr>
       <w:pBdr/>
@@ -10335,10 +10461,10 @@
       <w:i/>
     </w:rPr>
   </w:style>
-  <w:style w:type="paragraph" w:styleId="702">
+  <w:style w:type="paragraph" w:styleId="745">
     <w:name w:val="Header"/>
-    <w:basedOn w:val="852"/>
-    <w:link w:val="703"/>
+    <w:basedOn w:val="895"/>
+    <w:link w:val="746"/>
     <w:uiPriority w:val="99"/>
     <w:unhideWhenUsed/>
     <w:pPr>
@@ -10351,9 +10477,9 @@
       <w:ind/>
     </w:pPr>
   </w:style>
-  <w:style w:type="character" w:styleId="703">
+  <w:style w:type="character" w:styleId="746">
     <w:name w:val="Header Char"/>
-    <w:link w:val="702"/>
+    <w:link w:val="745"/>
     <w:uiPriority w:val="99"/>
     <w:pPr>
       <w:pBdr/>
@@ -10361,10 +10487,10 @@
       <w:ind/>
     </w:pPr>
   </w:style>
-  <w:style w:type="paragraph" w:styleId="704">
+  <w:style w:type="paragraph" w:styleId="747">
     <w:name w:val="Footer"/>
-    <w:basedOn w:val="852"/>
-    <w:link w:val="707"/>
+    <w:basedOn w:val="895"/>
+    <w:link w:val="750"/>
     <w:uiPriority w:val="99"/>
     <w:unhideWhenUsed/>
     <w:pPr>
@@ -10377,9 +10503,9 @@
       <w:ind/>
     </w:pPr>
   </w:style>
-  <w:style w:type="character" w:styleId="705">
+  <w:style w:type="character" w:styleId="748">
     <w:name w:val="Footer Char"/>
-    <w:link w:val="704"/>
+    <w:link w:val="747"/>
     <w:uiPriority w:val="99"/>
     <w:pPr>
       <w:pBdr/>
@@ -10387,10 +10513,10 @@
       <w:ind/>
     </w:pPr>
   </w:style>
-  <w:style w:type="paragraph" w:styleId="706">
+  <w:style w:type="paragraph" w:styleId="749">
     <w:name w:val="Caption"/>
-    <w:basedOn w:val="852"/>
-    <w:next w:val="852"/>
+    <w:basedOn w:val="895"/>
+    <w:next w:val="895"/>
     <w:uiPriority w:val="35"/>
     <w:semiHidden/>
     <w:unhideWhenUsed/>
@@ -10408,10 +10534,10 @@
       <w:szCs w:val="18"/>
     </w:rPr>
   </w:style>
-  <w:style w:type="character" w:styleId="707">
+  <w:style w:type="character" w:styleId="750">
     <w:name w:val="Caption Char"/>
-    <w:basedOn w:val="706"/>
-    <w:link w:val="704"/>
+    <w:basedOn w:val="749"/>
+    <w:link w:val="747"/>
     <w:uiPriority w:val="99"/>
     <w:pPr>
       <w:pBdr/>
@@ -10419,9 +10545,9 @@
       <w:ind/>
     </w:pPr>
   </w:style>
-  <w:style w:type="table" w:styleId="708">
+  <w:style w:type="table" w:styleId="751">
     <w:name w:val="Table Grid"/>
-    <w:basedOn w:val="853"/>
+    <w:basedOn w:val="896"/>
     <w:uiPriority w:val="59"/>
     <w:pPr>
       <w:pBdr/>
@@ -10618,9 +10744,9 @@
       </w:tcPr>
     </w:tblStylePr>
   </w:style>
-  <w:style w:type="table" w:styleId="709">
+  <w:style w:type="table" w:styleId="752">
     <w:name w:val="Table Grid Light"/>
-    <w:basedOn w:val="853"/>
+    <w:basedOn w:val="896"/>
     <w:uiPriority w:val="59"/>
     <w:pPr>
       <w:pBdr/>
@@ -10817,9 +10943,9 @@
       </w:tcPr>
     </w:tblStylePr>
   </w:style>
-  <w:style w:type="table" w:styleId="710">
+  <w:style w:type="table" w:styleId="753">
     <w:name w:val="Plain Table 1"/>
-    <w:basedOn w:val="853"/>
+    <w:basedOn w:val="896"/>
     <w:uiPriority w:val="59"/>
     <w:pPr>
       <w:pBdr/>
@@ -11042,9 +11168,9 @@
       </w:tcPr>
     </w:tblStylePr>
   </w:style>
-  <w:style w:type="table" w:styleId="711">
+  <w:style w:type="table" w:styleId="754">
     <w:name w:val="Plain Table 2"/>
-    <w:basedOn w:val="853"/>
+    <w:basedOn w:val="896"/>
     <w:uiPriority w:val="59"/>
     <w:pPr>
       <w:pBdr/>
@@ -11275,9 +11401,9 @@
       </w:tcPr>
     </w:tblStylePr>
   </w:style>
-  <w:style w:type="table" w:styleId="712">
+  <w:style w:type="table" w:styleId="755">
     <w:name w:val="Plain Table 3"/>
-    <w:basedOn w:val="853"/>
+    <w:basedOn w:val="896"/>
     <w:uiPriority w:val="99"/>
     <w:pPr>
       <w:pBdr/>
@@ -11505,9 +11631,9 @@
       </w:tcPr>
     </w:tblStylePr>
   </w:style>
-  <w:style w:type="table" w:styleId="713">
+  <w:style w:type="table" w:styleId="756">
     <w:name w:val="Plain Table 4"/>
-    <w:basedOn w:val="853"/>
+    <w:basedOn w:val="896"/>
     <w:uiPriority w:val="99"/>
     <w:pPr>
       <w:pBdr/>
@@ -11721,9 +11847,9 @@
       </w:tcPr>
     </w:tblStylePr>
   </w:style>
-  <w:style w:type="table" w:styleId="714">
+  <w:style w:type="table" w:styleId="757">
     <w:name w:val="Plain Table 5"/>
-    <w:basedOn w:val="853"/>
+    <w:basedOn w:val="896"/>
     <w:uiPriority w:val="99"/>
     <w:pPr>
       <w:pBdr/>
@@ -11954,9 +12080,9 @@
       </w:tcPr>
     </w:tblStylePr>
   </w:style>
-  <w:style w:type="table" w:styleId="715">
+  <w:style w:type="table" w:styleId="758">
     <w:name w:val="Grid Table 1 Light"/>
-    <w:basedOn w:val="853"/>
+    <w:basedOn w:val="896"/>
     <w:uiPriority w:val="99"/>
     <w:pPr>
       <w:pBdr/>
@@ -12177,9 +12303,9 @@
       </w:tcPr>
     </w:tblStylePr>
   </w:style>
-  <w:style w:type="table" w:styleId="716">
+  <w:style w:type="table" w:styleId="759">
     <w:name w:val="Grid Table 1 Light - Accent 1"/>
-    <w:basedOn w:val="853"/>
+    <w:basedOn w:val="896"/>
     <w:uiPriority w:val="99"/>
     <w:pPr>
       <w:pBdr/>
@@ -12400,9 +12526,9 @@
       </w:tcPr>
     </w:tblStylePr>
   </w:style>
-  <w:style w:type="table" w:styleId="717">
+  <w:style w:type="table" w:styleId="760">
     <w:name w:val="Grid Table 1 Light - Accent 2"/>
-    <w:basedOn w:val="853"/>
+    <w:basedOn w:val="896"/>
     <w:uiPriority w:val="99"/>
     <w:pPr>
       <w:pBdr/>
@@ -12623,9 +12749,9 @@
       </w:tcPr>
     </w:tblStylePr>
   </w:style>
-  <w:style w:type="table" w:styleId="718">
+  <w:style w:type="table" w:styleId="761">
     <w:name w:val="Grid Table 1 Light - Accent 3"/>
-    <w:basedOn w:val="853"/>
+    <w:basedOn w:val="896"/>
     <w:uiPriority w:val="99"/>
     <w:pPr>
       <w:pBdr/>
@@ -12846,9 +12972,9 @@
       </w:tcPr>
     </w:tblStylePr>
   </w:style>
-  <w:style w:type="table" w:styleId="719">
+  <w:style w:type="table" w:styleId="762">
     <w:name w:val="Grid Table 1 Light - Accent 4"/>
-    <w:basedOn w:val="853"/>
+    <w:basedOn w:val="896"/>
     <w:uiPriority w:val="99"/>
     <w:pPr>
       <w:pBdr/>
@@ -13069,9 +13195,9 @@
       </w:tcPr>
     </w:tblStylePr>
   </w:style>
-  <w:style w:type="table" w:styleId="720">
+  <w:style w:type="table" w:styleId="763">
     <w:name w:val="Grid Table 1 Light - Accent 5"/>
-    <w:basedOn w:val="853"/>
+    <w:basedOn w:val="896"/>
     <w:uiPriority w:val="99"/>
     <w:pPr>
       <w:pBdr/>
@@ -13292,9 +13418,9 @@
       </w:tcPr>
     </w:tblStylePr>
   </w:style>
-  <w:style w:type="table" w:styleId="721">
+  <w:style w:type="table" w:styleId="764">
     <w:name w:val="Grid Table 1 Light - Accent 6"/>
-    <w:basedOn w:val="853"/>
+    <w:basedOn w:val="896"/>
     <w:uiPriority w:val="99"/>
     <w:pPr>
       <w:pBdr/>
@@ -13515,9 +13641,9 @@
       </w:tcPr>
     </w:tblStylePr>
   </w:style>
-  <w:style w:type="table" w:styleId="722">
+  <w:style w:type="table" w:styleId="765">
     <w:name w:val="Grid Table 2"/>
-    <w:basedOn w:val="853"/>
+    <w:basedOn w:val="896"/>
     <w:uiPriority w:val="99"/>
     <w:pPr>
       <w:pBdr/>
@@ -13747,9 +13873,9 @@
       </w:tcPr>
     </w:tblStylePr>
   </w:style>
-  <w:style w:type="table" w:styleId="723">
+  <w:style w:type="table" w:styleId="766">
     <w:name w:val="Grid Table 2 - Accent 1"/>
-    <w:basedOn w:val="853"/>
+    <w:basedOn w:val="896"/>
     <w:uiPriority w:val="99"/>
     <w:pPr>
       <w:pBdr/>
@@ -13979,9 +14105,9 @@
       </w:tcPr>
     </w:tblStylePr>
   </w:style>
-  <w:style w:type="table" w:styleId="724">
+  <w:style w:type="table" w:styleId="767">
     <w:name w:val="Grid Table 2 - Accent 2"/>
-    <w:basedOn w:val="853"/>
+    <w:basedOn w:val="896"/>
     <w:uiPriority w:val="99"/>
     <w:pPr>
       <w:pBdr/>
@@ -14211,9 +14337,9 @@
       </w:tcPr>
     </w:tblStylePr>
   </w:style>
-  <w:style w:type="table" w:styleId="725">
+  <w:style w:type="table" w:styleId="768">
     <w:name w:val="Grid Table 2 - Accent 3"/>
-    <w:basedOn w:val="853"/>
+    <w:basedOn w:val="896"/>
     <w:uiPriority w:val="99"/>
     <w:pPr>
       <w:pBdr/>
@@ -14443,9 +14569,9 @@
       </w:tcPr>
     </w:tblStylePr>
   </w:style>
-  <w:style w:type="table" w:styleId="726">
+  <w:style w:type="table" w:styleId="769">
     <w:name w:val="Grid Table 2 - Accent 4"/>
-    <w:basedOn w:val="853"/>
+    <w:basedOn w:val="896"/>
     <w:uiPriority w:val="99"/>
     <w:pPr>
       <w:pBdr/>
@@ -14675,9 +14801,9 @@
       </w:tcPr>
     </w:tblStylePr>
   </w:style>
-  <w:style w:type="table" w:styleId="727">
+  <w:style w:type="table" w:styleId="770">
     <w:name w:val="Grid Table 2 - Accent 5"/>
-    <w:basedOn w:val="853"/>
+    <w:basedOn w:val="896"/>
     <w:uiPriority w:val="99"/>
     <w:pPr>
       <w:pBdr/>
@@ -14907,9 +15033,9 @@
       </w:tcPr>
     </w:tblStylePr>
   </w:style>
-  <w:style w:type="table" w:styleId="728">
+  <w:style w:type="table" w:styleId="771">
     <w:name w:val="Grid Table 2 - Accent 6"/>
-    <w:basedOn w:val="853"/>
+    <w:basedOn w:val="896"/>
     <w:uiPriority w:val="99"/>
     <w:pPr>
       <w:pBdr/>
@@ -15139,9 +15265,9 @@
       </w:tcPr>
     </w:tblStylePr>
   </w:style>
-  <w:style w:type="table" w:styleId="729">
+  <w:style w:type="table" w:styleId="772">
     <w:name w:val="Grid Table 3"/>
-    <w:basedOn w:val="853"/>
+    <w:basedOn w:val="896"/>
     <w:uiPriority w:val="99"/>
     <w:pPr>
       <w:pBdr/>
@@ -15384,9 +15510,9 @@
       </w:tcPr>
     </w:tblStylePr>
   </w:style>
-  <w:style w:type="table" w:styleId="730">
+  <w:style w:type="table" w:styleId="773">
     <w:name w:val="Grid Table 3 - Accent 1"/>
-    <w:basedOn w:val="853"/>
+    <w:basedOn w:val="896"/>
     <w:uiPriority w:val="99"/>
     <w:pPr>
       <w:pBdr/>
@@ -15629,9 +15755,9 @@
       </w:tcPr>
     </w:tblStylePr>
   </w:style>
-  <w:style w:type="table" w:styleId="731">
+  <w:style w:type="table" w:styleId="774">
     <w:name w:val="Grid Table 3 - Accent 2"/>
-    <w:basedOn w:val="853"/>
+    <w:basedOn w:val="896"/>
     <w:uiPriority w:val="99"/>
     <w:pPr>
       <w:pBdr/>
@@ -15874,9 +16000,9 @@
       </w:tcPr>
     </w:tblStylePr>
   </w:style>
-  <w:style w:type="table" w:styleId="732">
+  <w:style w:type="table" w:styleId="775">
     <w:name w:val="Grid Table 3 - Accent 3"/>
-    <w:basedOn w:val="853"/>
+    <w:basedOn w:val="896"/>
     <w:uiPriority w:val="99"/>
     <w:pPr>
       <w:pBdr/>
@@ -16119,9 +16245,9 @@
       </w:tcPr>
     </w:tblStylePr>
   </w:style>
-  <w:style w:type="table" w:styleId="733">
+  <w:style w:type="table" w:styleId="776">
     <w:name w:val="Grid Table 3 - Accent 4"/>
-    <w:basedOn w:val="853"/>
+    <w:basedOn w:val="896"/>
     <w:uiPriority w:val="99"/>
     <w:pPr>
       <w:pBdr/>
@@ -16364,9 +16490,9 @@
       </w:tcPr>
     </w:tblStylePr>
   </w:style>
-  <w:style w:type="table" w:styleId="734">
+  <w:style w:type="table" w:styleId="777">
     <w:name w:val="Grid Table 3 - Accent 5"/>
-    <w:basedOn w:val="853"/>
+    <w:basedOn w:val="896"/>
     <w:uiPriority w:val="99"/>
     <w:pPr>
       <w:pBdr/>
@@ -16609,9 +16735,9 @@
       </w:tcPr>
     </w:tblStylePr>
   </w:style>
-  <w:style w:type="table" w:styleId="735">
+  <w:style w:type="table" w:styleId="778">
     <w:name w:val="Grid Table 3 - Accent 6"/>
-    <w:basedOn w:val="853"/>
+    <w:basedOn w:val="896"/>
     <w:uiPriority w:val="99"/>
     <w:pPr>
       <w:pBdr/>
@@ -16854,9 +16980,9 @@
       </w:tcPr>
     </w:tblStylePr>
   </w:style>
-  <w:style w:type="table" w:styleId="736">
+  <w:style w:type="table" w:styleId="779">
     <w:name w:val="Grid Table 4"/>
-    <w:basedOn w:val="853"/>
+    <w:basedOn w:val="896"/>
     <w:uiPriority w:val="59"/>
     <w:pPr>
       <w:pBdr/>
@@ -17087,9 +17213,9 @@
       </w:tcPr>
     </w:tblStylePr>
   </w:style>
-  <w:style w:type="table" w:styleId="737">
+  <w:style w:type="table" w:styleId="780">
     <w:name w:val="Grid Table 4 - Accent 1"/>
-    <w:basedOn w:val="853"/>
+    <w:basedOn w:val="896"/>
     <w:uiPriority w:val="59"/>
     <w:pPr>
       <w:pBdr/>
@@ -17320,9 +17446,9 @@
       </w:tcPr>
     </w:tblStylePr>
   </w:style>
-  <w:style w:type="table" w:styleId="738">
+  <w:style w:type="table" w:styleId="781">
     <w:name w:val="Grid Table 4 - Accent 2"/>
-    <w:basedOn w:val="853"/>
+    <w:basedOn w:val="896"/>
     <w:uiPriority w:val="59"/>
     <w:pPr>
       <w:pBdr/>
@@ -17553,9 +17679,9 @@
       </w:tcPr>
     </w:tblStylePr>
   </w:style>
-  <w:style w:type="table" w:styleId="739">
+  <w:style w:type="table" w:styleId="782">
     <w:name w:val="Grid Table 4 - Accent 3"/>
-    <w:basedOn w:val="853"/>
+    <w:basedOn w:val="896"/>
     <w:uiPriority w:val="59"/>
     <w:pPr>
       <w:pBdr/>
@@ -17786,9 +17912,9 @@
       </w:tcPr>
     </w:tblStylePr>
   </w:style>
-  <w:style w:type="table" w:styleId="740">
+  <w:style w:type="table" w:styleId="783">
     <w:name w:val="Grid Table 4 - Accent 4"/>
-    <w:basedOn w:val="853"/>
+    <w:basedOn w:val="896"/>
     <w:uiPriority w:val="59"/>
     <w:pPr>
       <w:pBdr/>
@@ -18019,9 +18145,9 @@
       </w:tcPr>
     </w:tblStylePr>
   </w:style>
-  <w:style w:type="table" w:styleId="741">
+  <w:style w:type="table" w:styleId="784">
     <w:name w:val="Grid Table 4 - Accent 5"/>
-    <w:basedOn w:val="853"/>
+    <w:basedOn w:val="896"/>
     <w:uiPriority w:val="59"/>
     <w:pPr>
       <w:pBdr/>
@@ -18252,9 +18378,9 @@
       </w:tcPr>
     </w:tblStylePr>
   </w:style>
-  <w:style w:type="table" w:styleId="742">
+  <w:style w:type="table" w:styleId="785">
     <w:name w:val="Grid Table 4 - Accent 6"/>
-    <w:basedOn w:val="853"/>
+    <w:basedOn w:val="896"/>
     <w:uiPriority w:val="59"/>
     <w:pPr>
       <w:pBdr/>
@@ -18485,9 +18611,9 @@
       </w:tcPr>
     </w:tblStylePr>
   </w:style>
-  <w:style w:type="table" w:styleId="743">
+  <w:style w:type="table" w:styleId="786">
     <w:name w:val="Grid Table 5 Dark"/>
-    <w:basedOn w:val="853"/>
+    <w:basedOn w:val="896"/>
     <w:uiPriority w:val="99"/>
     <w:pPr>
       <w:pBdr/>
@@ -18713,9 +18839,9 @@
       </w:tcPr>
     </w:tblStylePr>
   </w:style>
-  <w:style w:type="table" w:styleId="744">
+  <w:style w:type="table" w:styleId="787">
     <w:name w:val="Grid Table 5 Dark- Accent 1"/>
-    <w:basedOn w:val="853"/>
+    <w:basedOn w:val="896"/>
     <w:uiPriority w:val="99"/>
     <w:pPr>
       <w:pBdr/>
@@ -18941,9 +19067,9 @@
       </w:tcPr>
     </w:tblStylePr>
   </w:style>
-  <w:style w:type="table" w:styleId="745">
+  <w:style w:type="table" w:styleId="788">
     <w:name w:val="Grid Table 5 Dark - Accent 2"/>
-    <w:basedOn w:val="853"/>
+    <w:basedOn w:val="896"/>
     <w:uiPriority w:val="99"/>
     <w:pPr>
       <w:pBdr/>
@@ -19169,9 +19295,9 @@
       </w:tcPr>
     </w:tblStylePr>
   </w:style>
-  <w:style w:type="table" w:styleId="746">
+  <w:style w:type="table" w:styleId="789">
     <w:name w:val="Grid Table 5 Dark - Accent 3"/>
-    <w:basedOn w:val="853"/>
+    <w:basedOn w:val="896"/>
     <w:uiPriority w:val="99"/>
     <w:pPr>
       <w:pBdr/>
@@ -19397,9 +19523,9 @@
       </w:tcPr>
     </w:tblStylePr>
   </w:style>
-  <w:style w:type="table" w:styleId="747">
+  <w:style w:type="table" w:styleId="790">
     <w:name w:val="Grid Table 5 Dark- Accent 4"/>
-    <w:basedOn w:val="853"/>
+    <w:basedOn w:val="896"/>
     <w:uiPriority w:val="99"/>
     <w:pPr>
       <w:pBdr/>
@@ -19625,9 +19751,9 @@
       </w:tcPr>
     </w:tblStylePr>
   </w:style>
-  <w:style w:type="table" w:styleId="748">
+  <w:style w:type="table" w:styleId="791">
     <w:name w:val="Grid Table 5 Dark - Accent 5"/>
-    <w:basedOn w:val="853"/>
+    <w:basedOn w:val="896"/>
     <w:uiPriority w:val="99"/>
     <w:pPr>
       <w:pBdr/>
@@ -19853,9 +19979,9 @@
       </w:tcPr>
     </w:tblStylePr>
   </w:style>
-  <w:style w:type="table" w:styleId="749">
+  <w:style w:type="table" w:styleId="792">
     <w:name w:val="Grid Table 5 Dark - Accent 6"/>
-    <w:basedOn w:val="853"/>
+    <w:basedOn w:val="896"/>
     <w:uiPriority w:val="99"/>
     <w:pPr>
       <w:pBdr/>
@@ -20081,9 +20207,9 @@
       </w:tcPr>
     </w:tblStylePr>
   </w:style>
-  <w:style w:type="table" w:styleId="750">
+  <w:style w:type="table" w:styleId="793">
     <w:name w:val="Grid Table 6 Colorful"/>
-    <w:basedOn w:val="853"/>
+    <w:basedOn w:val="896"/>
     <w:uiPriority w:val="99"/>
     <w:pPr>
       <w:pBdr/>
@@ -20311,9 +20437,9 @@
       </w:tcPr>
     </w:tblStylePr>
   </w:style>
-  <w:style w:type="table" w:styleId="751">
+  <w:style w:type="table" w:styleId="794">
     <w:name w:val="Grid Table 6 Colorful - Accent 1"/>
-    <w:basedOn w:val="853"/>
+    <w:basedOn w:val="896"/>
     <w:uiPriority w:val="99"/>
     <w:pPr>
       <w:pBdr/>
@@ -20541,9 +20667,9 @@
       </w:tcPr>
     </w:tblStylePr>
   </w:style>
-  <w:style w:type="table" w:styleId="752">
+  <w:style w:type="table" w:styleId="795">
     <w:name w:val="Grid Table 6 Colorful - Accent 2"/>
-    <w:basedOn w:val="853"/>
+    <w:basedOn w:val="896"/>
     <w:uiPriority w:val="99"/>
     <w:pPr>
       <w:pBdr/>
@@ -20771,9 +20897,9 @@
       </w:tcPr>
     </w:tblStylePr>
   </w:style>
-  <w:style w:type="table" w:styleId="753">
+  <w:style w:type="table" w:styleId="796">
     <w:name w:val="Grid Table 6 Colorful - Accent 3"/>
-    <w:basedOn w:val="853"/>
+    <w:basedOn w:val="896"/>
     <w:uiPriority w:val="99"/>
     <w:pPr>
       <w:pBdr/>
@@ -21001,9 +21127,9 @@
       </w:tcPr>
     </w:tblStylePr>
   </w:style>
-  <w:style w:type="table" w:styleId="754">
+  <w:style w:type="table" w:styleId="797">
     <w:name w:val="Grid Table 6 Colorful - Accent 4"/>
-    <w:basedOn w:val="853"/>
+    <w:basedOn w:val="896"/>
     <w:uiPriority w:val="99"/>
     <w:pPr>
       <w:pBdr/>
@@ -21231,9 +21357,9 @@
       </w:tcPr>
     </w:tblStylePr>
   </w:style>
-  <w:style w:type="table" w:styleId="755">
+  <w:style w:type="table" w:styleId="798">
     <w:name w:val="Grid Table 6 Colorful - Accent 5"/>
-    <w:basedOn w:val="853"/>
+    <w:basedOn w:val="896"/>
     <w:uiPriority w:val="99"/>
     <w:pPr>
       <w:pBdr/>
@@ -21461,9 +21587,9 @@
       </w:tcPr>
     </w:tblStylePr>
   </w:style>
-  <w:style w:type="table" w:styleId="756">
+  <w:style w:type="table" w:styleId="799">
     <w:name w:val="Grid Table 6 Colorful - Accent 6"/>
-    <w:basedOn w:val="853"/>
+    <w:basedOn w:val="896"/>
     <w:uiPriority w:val="99"/>
     <w:pPr>
       <w:pBdr/>
@@ -21691,9 +21817,9 @@
       </w:tcPr>
     </w:tblStylePr>
   </w:style>
-  <w:style w:type="table" w:styleId="757">
+  <w:style w:type="table" w:styleId="800">
     <w:name w:val="Grid Table 7 Colorful"/>
-    <w:basedOn w:val="853"/>
+    <w:basedOn w:val="896"/>
     <w:uiPriority w:val="99"/>
     <w:pPr>
       <w:pBdr/>
@@ -21945,9 +22071,9 @@
       </w:tcPr>
     </w:tblStylePr>
   </w:style>
-  <w:style w:type="table" w:styleId="758">
+  <w:style w:type="table" w:styleId="801">
     <w:name w:val="Grid Table 7 Colorful - Accent 1"/>
-    <w:basedOn w:val="853"/>
+    <w:basedOn w:val="896"/>
     <w:uiPriority w:val="99"/>
     <w:pPr>
       <w:pBdr/>
@@ -22199,9 +22325,9 @@
       </w:tcPr>
     </w:tblStylePr>
   </w:style>
-  <w:style w:type="table" w:styleId="759">
+  <w:style w:type="table" w:styleId="802">
     <w:name w:val="Grid Table 7 Colorful - Accent 2"/>
-    <w:basedOn w:val="853"/>
+    <w:basedOn w:val="896"/>
     <w:uiPriority w:val="99"/>
     <w:pPr>
       <w:pBdr/>
@@ -22453,9 +22579,9 @@
       </w:tcPr>
     </w:tblStylePr>
   </w:style>
-  <w:style w:type="table" w:styleId="760">
+  <w:style w:type="table" w:styleId="803">
     <w:name w:val="Grid Table 7 Colorful - Accent 3"/>
-    <w:basedOn w:val="853"/>
+    <w:basedOn w:val="896"/>
     <w:uiPriority w:val="99"/>
     <w:pPr>
       <w:pBdr/>
@@ -22707,9 +22833,9 @@
       </w:tcPr>
     </w:tblStylePr>
   </w:style>
-  <w:style w:type="table" w:styleId="761">
+  <w:style w:type="table" w:styleId="804">
     <w:name w:val="Grid Table 7 Colorful - Accent 4"/>
-    <w:basedOn w:val="853"/>
+    <w:basedOn w:val="896"/>
     <w:uiPriority w:val="99"/>
     <w:pPr>
       <w:pBdr/>
@@ -22961,9 +23087,9 @@
       </w:tcPr>
     </w:tblStylePr>
   </w:style>
-  <w:style w:type="table" w:styleId="762">
+  <w:style w:type="table" w:styleId="805">
     <w:name w:val="Grid Table 7 Colorful - Accent 5"/>
-    <w:basedOn w:val="853"/>
+    <w:basedOn w:val="896"/>
     <w:uiPriority w:val="99"/>
     <w:pPr>
       <w:pBdr/>
@@ -23215,9 +23341,9 @@
       </w:tcPr>
     </w:tblStylePr>
   </w:style>
-  <w:style w:type="table" w:styleId="763">
+  <w:style w:type="table" w:styleId="806">
     <w:name w:val="Grid Table 7 Colorful - Accent 6"/>
-    <w:basedOn w:val="853"/>
+    <w:basedOn w:val="896"/>
     <w:uiPriority w:val="99"/>
     <w:pPr>
       <w:pBdr/>
@@ -23469,9 +23595,9 @@
       </w:tcPr>
     </w:tblStylePr>
   </w:style>
-  <w:style w:type="table" w:styleId="764">
+  <w:style w:type="table" w:styleId="807">
     <w:name w:val="List Table 1 Light"/>
-    <w:basedOn w:val="853"/>
+    <w:basedOn w:val="896"/>
     <w:uiPriority w:val="99"/>
     <w:pPr>
       <w:pBdr/>
@@ -23685,9 +23811,9 @@
       </w:tcPr>
     </w:tblStylePr>
   </w:style>
-  <w:style w:type="table" w:styleId="765">
+  <w:style w:type="table" w:styleId="808">
     <w:name w:val="List Table 1 Light - Accent 1"/>
-    <w:basedOn w:val="853"/>
+    <w:basedOn w:val="896"/>
     <w:uiPriority w:val="99"/>
     <w:pPr>
       <w:pBdr/>
@@ -23901,9 +24027,9 @@
       </w:tcPr>
     </w:tblStylePr>
   </w:style>
-  <w:style w:type="table" w:styleId="766">
+  <w:style w:type="table" w:styleId="809">
     <w:name w:val="List Table 1 Light - Accent 2"/>
-    <w:basedOn w:val="853"/>
+    <w:basedOn w:val="896"/>
     <w:uiPriority w:val="99"/>
     <w:pPr>
       <w:pBdr/>
@@ -24117,9 +24243,9 @@
       </w:tcPr>
     </w:tblStylePr>
   </w:style>
-  <w:style w:type="table" w:styleId="767">
+  <w:style w:type="table" w:styleId="810">
     <w:name w:val="List Table 1 Light - Accent 3"/>
-    <w:basedOn w:val="853"/>
+    <w:basedOn w:val="896"/>
     <w:uiPriority w:val="99"/>
     <w:pPr>
       <w:pBdr/>
@@ -24333,9 +24459,9 @@
       </w:tcPr>
     </w:tblStylePr>
   </w:style>
-  <w:style w:type="table" w:styleId="768">
+  <w:style w:type="table" w:styleId="811">
     <w:name w:val="List Table 1 Light - Accent 4"/>
-    <w:basedOn w:val="853"/>
+    <w:basedOn w:val="896"/>
     <w:uiPriority w:val="99"/>
     <w:pPr>
       <w:pBdr/>
@@ -24549,9 +24675,9 @@
       </w:tcPr>
     </w:tblStylePr>
   </w:style>
-  <w:style w:type="table" w:styleId="769">
+  <w:style w:type="table" w:styleId="812">
     <w:name w:val="List Table 1 Light - Accent 5"/>
-    <w:basedOn w:val="853"/>
+    <w:basedOn w:val="896"/>
     <w:uiPriority w:val="99"/>
     <w:pPr>
       <w:pBdr/>
@@ -24765,9 +24891,9 @@
       </w:tcPr>
     </w:tblStylePr>
   </w:style>
-  <w:style w:type="table" w:styleId="770">
+  <w:style w:type="table" w:styleId="813">
     <w:name w:val="List Table 1 Light - Accent 6"/>
-    <w:basedOn w:val="853"/>
+    <w:basedOn w:val="896"/>
     <w:uiPriority w:val="99"/>
     <w:pPr>
       <w:pBdr/>
@@ -24981,9 +25107,9 @@
       </w:tcPr>
     </w:tblStylePr>
   </w:style>
-  <w:style w:type="table" w:styleId="771">
+  <w:style w:type="table" w:styleId="814">
     <w:name w:val="List Table 2"/>
-    <w:basedOn w:val="853"/>
+    <w:basedOn w:val="896"/>
     <w:uiPriority w:val="99"/>
     <w:pPr>
       <w:pBdr/>
@@ -25219,9 +25345,9 @@
       </w:tcPr>
     </w:tblStylePr>
   </w:style>
-  <w:style w:type="table" w:styleId="772">
+  <w:style w:type="table" w:styleId="815">
     <w:name w:val="List Table 2 - Accent 1"/>
-    <w:basedOn w:val="853"/>
+    <w:basedOn w:val="896"/>
     <w:uiPriority w:val="99"/>
     <w:pPr>
       <w:pBdr/>
@@ -25457,9 +25583,9 @@
       </w:tcPr>
     </w:tblStylePr>
   </w:style>
-  <w:style w:type="table" w:styleId="773">
+  <w:style w:type="table" w:styleId="816">
     <w:name w:val="List Table 2 - Accent 2"/>
-    <w:basedOn w:val="853"/>
+    <w:basedOn w:val="896"/>
     <w:uiPriority w:val="99"/>
     <w:pPr>
       <w:pBdr/>
@@ -25695,9 +25821,9 @@
       </w:tcPr>
     </w:tblStylePr>
   </w:style>
-  <w:style w:type="table" w:styleId="774">
+  <w:style w:type="table" w:styleId="817">
     <w:name w:val="List Table 2 - Accent 3"/>
-    <w:basedOn w:val="853"/>
+    <w:basedOn w:val="896"/>
     <w:uiPriority w:val="99"/>
     <w:pPr>
       <w:pBdr/>
@@ -25933,9 +26059,9 @@
       </w:tcPr>
     </w:tblStylePr>
   </w:style>
-  <w:style w:type="table" w:styleId="775">
+  <w:style w:type="table" w:styleId="818">
     <w:name w:val="List Table 2 - Accent 4"/>
-    <w:basedOn w:val="853"/>
+    <w:basedOn w:val="896"/>
     <w:uiPriority w:val="99"/>
     <w:pPr>
       <w:pBdr/>
@@ -26171,9 +26297,9 @@
       </w:tcPr>
     </w:tblStylePr>
   </w:style>
-  <w:style w:type="table" w:styleId="776">
+  <w:style w:type="table" w:styleId="819">
     <w:name w:val="List Table 2 - Accent 5"/>
-    <w:basedOn w:val="853"/>
+    <w:basedOn w:val="896"/>
     <w:uiPriority w:val="99"/>
     <w:pPr>
       <w:pBdr/>
@@ -26409,9 +26535,9 @@
       </w:tcPr>
     </w:tblStylePr>
   </w:style>
-  <w:style w:type="table" w:styleId="777">
+  <w:style w:type="table" w:styleId="820">
     <w:name w:val="List Table 2 - Accent 6"/>
-    <w:basedOn w:val="853"/>
+    <w:basedOn w:val="896"/>
     <w:uiPriority w:val="99"/>
     <w:pPr>
       <w:pBdr/>
@@ -26647,9 +26773,9 @@
       </w:tcPr>
     </w:tblStylePr>
   </w:style>
-  <w:style w:type="table" w:styleId="778">
+  <w:style w:type="table" w:styleId="821">
     <w:name w:val="List Table 3"/>
-    <w:basedOn w:val="853"/>
+    <w:basedOn w:val="896"/>
     <w:uiPriority w:val="99"/>
     <w:pPr>
       <w:pBdr/>
@@ -26875,9 +27001,9 @@
       </w:tcPr>
     </w:tblStylePr>
   </w:style>
-  <w:style w:type="table" w:styleId="779">
+  <w:style w:type="table" w:styleId="822">
     <w:name w:val="List Table 3 - Accent 1"/>
-    <w:basedOn w:val="853"/>
+    <w:basedOn w:val="896"/>
     <w:uiPriority w:val="99"/>
     <w:pPr>
       <w:pBdr/>
@@ -27103,9 +27229,9 @@
       </w:tcPr>
     </w:tblStylePr>
   </w:style>
-  <w:style w:type="table" w:styleId="780">
+  <w:style w:type="table" w:styleId="823">
     <w:name w:val="List Table 3 - Accent 2"/>
-    <w:basedOn w:val="853"/>
+    <w:basedOn w:val="896"/>
     <w:uiPriority w:val="99"/>
     <w:pPr>
       <w:pBdr/>
@@ -27331,9 +27457,9 @@
       </w:tcPr>
     </w:tblStylePr>
   </w:style>
-  <w:style w:type="table" w:styleId="781">
+  <w:style w:type="table" w:styleId="824">
     <w:name w:val="List Table 3 - Accent 3"/>
-    <w:basedOn w:val="853"/>
+    <w:basedOn w:val="896"/>
     <w:uiPriority w:val="99"/>
     <w:pPr>
       <w:pBdr/>
@@ -27559,9 +27685,9 @@
       </w:tcPr>
     </w:tblStylePr>
   </w:style>
-  <w:style w:type="table" w:styleId="782">
+  <w:style w:type="table" w:styleId="825">
     <w:name w:val="List Table 3 - Accent 4"/>
-    <w:basedOn w:val="853"/>
+    <w:basedOn w:val="896"/>
     <w:uiPriority w:val="99"/>
     <w:pPr>
       <w:pBdr/>
@@ -27787,9 +27913,9 @@
       </w:tcPr>
     </w:tblStylePr>
   </w:style>
-  <w:style w:type="table" w:styleId="783">
+  <w:style w:type="table" w:styleId="826">
     <w:name w:val="List Table 3 - Accent 5"/>
-    <w:basedOn w:val="853"/>
+    <w:basedOn w:val="896"/>
     <w:uiPriority w:val="99"/>
     <w:pPr>
       <w:pBdr/>
@@ -28015,9 +28141,9 @@
       </w:tcPr>
     </w:tblStylePr>
   </w:style>
-  <w:style w:type="table" w:styleId="784">
+  <w:style w:type="table" w:styleId="827">
     <w:name w:val="List Table 3 - Accent 6"/>
-    <w:basedOn w:val="853"/>
+    <w:basedOn w:val="896"/>
     <w:uiPriority w:val="99"/>
     <w:pPr>
       <w:pBdr/>
@@ -28243,9 +28369,9 @@
       </w:tcPr>
     </w:tblStylePr>
   </w:style>
-  <w:style w:type="table" w:styleId="785">
+  <w:style w:type="table" w:styleId="828">
     <w:name w:val="List Table 4"/>
-    <w:basedOn w:val="853"/>
+    <w:basedOn w:val="896"/>
     <w:uiPriority w:val="99"/>
     <w:pPr>
       <w:pBdr/>
@@ -28468,9 +28594,9 @@
       </w:tcPr>
     </w:tblStylePr>
   </w:style>
-  <w:style w:type="table" w:styleId="786">
+  <w:style w:type="table" w:styleId="829">
     <w:name w:val="List Table 4 - Accent 1"/>
-    <w:basedOn w:val="853"/>
+    <w:basedOn w:val="896"/>
     <w:uiPriority w:val="99"/>
     <w:pPr>
       <w:pBdr/>
@@ -28693,9 +28819,9 @@
       </w:tcPr>
     </w:tblStylePr>
   </w:style>
-  <w:style w:type="table" w:styleId="787">
+  <w:style w:type="table" w:styleId="830">
     <w:name w:val="List Table 4 - Accent 2"/>
-    <w:basedOn w:val="853"/>
+    <w:basedOn w:val="896"/>
     <w:uiPriority w:val="99"/>
     <w:pPr>
       <w:pBdr/>
@@ -28918,9 +29044,9 @@
       </w:tcPr>
     </w:tblStylePr>
   </w:style>
-  <w:style w:type="table" w:styleId="788">
+  <w:style w:type="table" w:styleId="831">
     <w:name w:val="List Table 4 - Accent 3"/>
-    <w:basedOn w:val="853"/>
+    <w:basedOn w:val="896"/>
     <w:uiPriority w:val="99"/>
     <w:pPr>
       <w:pBdr/>
@@ -29143,9 +29269,9 @@
       </w:tcPr>
     </w:tblStylePr>
   </w:style>
-  <w:style w:type="table" w:styleId="789">
+  <w:style w:type="table" w:styleId="832">
     <w:name w:val="List Table 4 - Accent 4"/>
-    <w:basedOn w:val="853"/>
+    <w:basedOn w:val="896"/>
     <w:uiPriority w:val="99"/>
     <w:pPr>
       <w:pBdr/>
@@ -29368,9 +29494,9 @@
       </w:tcPr>
     </w:tblStylePr>
   </w:style>
-  <w:style w:type="table" w:styleId="790">
+  <w:style w:type="table" w:styleId="833">
     <w:name w:val="List Table 4 - Accent 5"/>
-    <w:basedOn w:val="853"/>
+    <w:basedOn w:val="896"/>
     <w:uiPriority w:val="99"/>
     <w:pPr>
       <w:pBdr/>
@@ -29593,9 +29719,9 @@
       </w:tcPr>
     </w:tblStylePr>
   </w:style>
-  <w:style w:type="table" w:styleId="791">
+  <w:style w:type="table" w:styleId="834">
     <w:name w:val="List Table 4 - Accent 6"/>
-    <w:basedOn w:val="853"/>
+    <w:basedOn w:val="896"/>
     <w:uiPriority w:val="99"/>
     <w:pPr>
       <w:pBdr/>
@@ -29818,9 +29944,9 @@
       </w:tcPr>
     </w:tblStylePr>
   </w:style>
-  <w:style w:type="table" w:styleId="792">
+  <w:style w:type="table" w:styleId="835">
     <w:name w:val="List Table 5 Dark"/>
-    <w:basedOn w:val="853"/>
+    <w:basedOn w:val="896"/>
     <w:uiPriority w:val="99"/>
     <w:pPr>
       <w:pBdr/>
@@ -30060,9 +30186,9 @@
       </w:tcPr>
     </w:tblStylePr>
   </w:style>
-  <w:style w:type="table" w:styleId="793">
+  <w:style w:type="table" w:styleId="836">
     <w:name w:val="List Table 5 Dark - Accent 1"/>
-    <w:basedOn w:val="853"/>
+    <w:basedOn w:val="896"/>
     <w:uiPriority w:val="99"/>
     <w:pPr>
       <w:pBdr/>
@@ -30302,9 +30428,9 @@
       </w:tcPr>
     </w:tblStylePr>
   </w:style>
-  <w:style w:type="table" w:styleId="794">
+  <w:style w:type="table" w:styleId="837">
     <w:name w:val="List Table 5 Dark - Accent 2"/>
-    <w:basedOn w:val="853"/>
+    <w:basedOn w:val="896"/>
     <w:uiPriority w:val="99"/>
     <w:pPr>
       <w:pBdr/>
@@ -30544,9 +30670,9 @@
       </w:tcPr>
     </w:tblStylePr>
   </w:style>
-  <w:style w:type="table" w:styleId="795">
+  <w:style w:type="table" w:styleId="838">
     <w:name w:val="List Table 5 Dark - Accent 3"/>
-    <w:basedOn w:val="853"/>
+    <w:basedOn w:val="896"/>
     <w:uiPriority w:val="99"/>
     <w:pPr>
       <w:pBdr/>
@@ -30786,9 +30912,9 @@
       </w:tcPr>
     </w:tblStylePr>
   </w:style>
-  <w:style w:type="table" w:styleId="796">
+  <w:style w:type="table" w:styleId="839">
     <w:name w:val="List Table 5 Dark - Accent 4"/>
-    <w:basedOn w:val="853"/>
+    <w:basedOn w:val="896"/>
     <w:uiPriority w:val="99"/>
     <w:pPr>
       <w:pBdr/>
@@ -31028,9 +31154,9 @@
       </w:tcPr>
     </w:tblStylePr>
   </w:style>
-  <w:style w:type="table" w:styleId="797">
+  <w:style w:type="table" w:styleId="840">
     <w:name w:val="List Table 5 Dark - Accent 5"/>
-    <w:basedOn w:val="853"/>
+    <w:basedOn w:val="896"/>
     <w:uiPriority w:val="99"/>
     <w:pPr>
       <w:pBdr/>
@@ -31270,9 +31396,9 @@
       </w:tcPr>
     </w:tblStylePr>
   </w:style>
-  <w:style w:type="table" w:styleId="798">
+  <w:style w:type="table" w:styleId="841">
     <w:name w:val="List Table 5 Dark - Accent 6"/>
-    <w:basedOn w:val="853"/>
+    <w:basedOn w:val="896"/>
     <w:uiPriority w:val="99"/>
     <w:pPr>
       <w:pBdr/>
@@ -31512,9 +31638,9 @@
       </w:tcPr>
     </w:tblStylePr>
   </w:style>
-  <w:style w:type="table" w:styleId="799">
+  <w:style w:type="table" w:styleId="842">
     <w:name w:val="List Table 6 Colorful"/>
-    <w:basedOn w:val="853"/>
+    <w:basedOn w:val="896"/>
     <w:uiPriority w:val="99"/>
     <w:pPr>
       <w:pBdr/>
@@ -31735,9 +31861,9 @@
       </w:tcPr>
     </w:tblStylePr>
   </w:style>
-  <w:style w:type="table" w:styleId="800">
+  <w:style w:type="table" w:styleId="843">
     <w:name w:val="List Table 6 Colorful - Accent 1"/>
-    <w:basedOn w:val="853"/>
+    <w:basedOn w:val="896"/>
     <w:uiPriority w:val="99"/>
     <w:pPr>
       <w:pBdr/>
@@ -31958,9 +32084,9 @@
       </w:tcPr>
     </w:tblStylePr>
   </w:style>
-  <w:style w:type="table" w:styleId="801">
+  <w:style w:type="table" w:styleId="844">
     <w:name w:val="List Table 6 Colorful - Accent 2"/>
-    <w:basedOn w:val="853"/>
+    <w:basedOn w:val="896"/>
     <w:uiPriority w:val="99"/>
     <w:pPr>
       <w:pBdr/>
@@ -32181,9 +32307,9 @@
       </w:tcPr>
     </w:tblStylePr>
   </w:style>
-  <w:style w:type="table" w:styleId="802">
+  <w:style w:type="table" w:styleId="845">
     <w:name w:val="List Table 6 Colorful - Accent 3"/>
-    <w:basedOn w:val="853"/>
+    <w:basedOn w:val="896"/>
     <w:uiPriority w:val="99"/>
     <w:pPr>
       <w:pBdr/>
@@ -32404,9 +32530,9 @@
       </w:tcPr>
     </w:tblStylePr>
   </w:style>
-  <w:style w:type="table" w:styleId="803">
+  <w:style w:type="table" w:styleId="846">
     <w:name w:val="List Table 6 Colorful - Accent 4"/>
-    <w:basedOn w:val="853"/>
+    <w:basedOn w:val="896"/>
     <w:uiPriority w:val="99"/>
     <w:pPr>
       <w:pBdr/>
@@ -32627,9 +32753,9 @@
       </w:tcPr>
     </w:tblStylePr>
   </w:style>
-  <w:style w:type="table" w:styleId="804">
+  <w:style w:type="table" w:styleId="847">
     <w:name w:val="List Table 6 Colorful - Accent 5"/>
-    <w:basedOn w:val="853"/>
+    <w:basedOn w:val="896"/>
     <w:uiPriority w:val="99"/>
     <w:pPr>
       <w:pBdr/>
@@ -32850,9 +32976,9 @@
       </w:tcPr>
     </w:tblStylePr>
   </w:style>
-  <w:style w:type="table" w:styleId="805">
+  <w:style w:type="table" w:styleId="848">
     <w:name w:val="List Table 6 Colorful - Accent 6"/>
-    <w:basedOn w:val="853"/>
+    <w:basedOn w:val="896"/>
     <w:uiPriority w:val="99"/>
     <w:pPr>
       <w:pBdr/>
@@ -33073,9 +33199,9 @@
       </w:tcPr>
     </w:tblStylePr>
   </w:style>
-  <w:style w:type="table" w:styleId="806">
+  <w:style w:type="table" w:styleId="849">
     <w:name w:val="List Table 7 Colorful"/>
-    <w:basedOn w:val="853"/>
+    <w:basedOn w:val="896"/>
     <w:uiPriority w:val="99"/>
     <w:pPr>
       <w:pBdr/>
@@ -33329,9 +33455,9 @@
       </w:tcPr>
     </w:tblStylePr>
   </w:style>
-  <w:style w:type="table" w:styleId="807">
+  <w:style w:type="table" w:styleId="850">
     <w:name w:val="List Table 7 Colorful - Accent 1"/>
-    <w:basedOn w:val="853"/>
+    <w:basedOn w:val="896"/>
     <w:uiPriority w:val="99"/>
     <w:pPr>
       <w:pBdr/>
@@ -33585,9 +33711,9 @@
       </w:tcPr>
     </w:tblStylePr>
   </w:style>
-  <w:style w:type="table" w:styleId="808">
+  <w:style w:type="table" w:styleId="851">
     <w:name w:val="List Table 7 Colorful - Accent 2"/>
-    <w:basedOn w:val="853"/>
+    <w:basedOn w:val="896"/>
     <w:uiPriority w:val="99"/>
     <w:pPr>
       <w:pBdr/>
@@ -33841,9 +33967,9 @@
       </w:tcPr>
     </w:tblStylePr>
   </w:style>
-  <w:style w:type="table" w:styleId="809">
+  <w:style w:type="table" w:styleId="852">
     <w:name w:val="List Table 7 Colorful - Accent 3"/>
-    <w:basedOn w:val="853"/>
+    <w:basedOn w:val="896"/>
     <w:uiPriority w:val="99"/>
     <w:pPr>
       <w:pBdr/>
@@ -34097,9 +34223,9 @@
       </w:tcPr>
     </w:tblStylePr>
   </w:style>
-  <w:style w:type="table" w:styleId="810">
+  <w:style w:type="table" w:styleId="853">
     <w:name w:val="List Table 7 Colorful - Accent 4"/>
-    <w:basedOn w:val="853"/>
+    <w:basedOn w:val="896"/>
     <w:uiPriority w:val="99"/>
     <w:pPr>
       <w:pBdr/>
@@ -34353,9 +34479,9 @@
       </w:tcPr>
     </w:tblStylePr>
   </w:style>
-  <w:style w:type="table" w:styleId="811">
+  <w:style w:type="table" w:styleId="854">
     <w:name w:val="List Table 7 Colorful - Accent 5"/>
-    <w:basedOn w:val="853"/>
+    <w:basedOn w:val="896"/>
     <w:uiPriority w:val="99"/>
     <w:pPr>
       <w:pBdr/>
@@ -34609,9 +34735,9 @@
       </w:tcPr>
     </w:tblStylePr>
   </w:style>
-  <w:style w:type="table" w:styleId="812">
+  <w:style w:type="table" w:styleId="855">
     <w:name w:val="List Table 7 Colorful - Accent 6"/>
-    <w:basedOn w:val="853"/>
+    <w:basedOn w:val="896"/>
     <w:uiPriority w:val="99"/>
     <w:pPr>
       <w:pBdr/>
@@ -34865,9 +34991,9 @@
       </w:tcPr>
     </w:tblStylePr>
   </w:style>
-  <w:style w:type="table" w:styleId="813">
+  <w:style w:type="table" w:styleId="856">
     <w:name w:val="Lined - Accent"/>
-    <w:basedOn w:val="853"/>
+    <w:basedOn w:val="896"/>
     <w:uiPriority w:val="99"/>
     <w:pPr>
       <w:pBdr/>
@@ -35102,9 +35228,9 @@
       </w:tcPr>
     </w:tblStylePr>
   </w:style>
-  <w:style w:type="table" w:styleId="814">
+  <w:style w:type="table" w:styleId="857">
     <w:name w:val="Lined - Accent 1"/>
-    <w:basedOn w:val="853"/>
+    <w:basedOn w:val="896"/>
     <w:uiPriority w:val="99"/>
     <w:pPr>
       <w:pBdr/>
@@ -35339,9 +35465,9 @@
       </w:tcPr>
     </w:tblStylePr>
   </w:style>
-  <w:style w:type="table" w:styleId="815">
+  <w:style w:type="table" w:styleId="858">
     <w:name w:val="Lined - Accent 2"/>
-    <w:basedOn w:val="853"/>
+    <w:basedOn w:val="896"/>
     <w:uiPriority w:val="99"/>
     <w:pPr>
       <w:pBdr/>
@@ -35576,9 +35702,9 @@
       </w:tcPr>
     </w:tblStylePr>
   </w:style>
-  <w:style w:type="table" w:styleId="816">
+  <w:style w:type="table" w:styleId="859">
     <w:name w:val="Lined - Accent 3"/>
-    <w:basedOn w:val="853"/>
+    <w:basedOn w:val="896"/>
     <w:uiPriority w:val="99"/>
     <w:pPr>
       <w:pBdr/>
@@ -35813,9 +35939,9 @@
       </w:tcPr>
     </w:tblStylePr>
   </w:style>
-  <w:style w:type="table" w:styleId="817">
+  <w:style w:type="table" w:styleId="860">
     <w:name w:val="Lined - Accent 4"/>
-    <w:basedOn w:val="853"/>
+    <w:basedOn w:val="896"/>
     <w:uiPriority w:val="99"/>
     <w:pPr>
       <w:pBdr/>
@@ -36050,9 +36176,9 @@
       </w:tcPr>
     </w:tblStylePr>
   </w:style>
-  <w:style w:type="table" w:styleId="818">
+  <w:style w:type="table" w:styleId="861">
     <w:name w:val="Lined - Accent 5"/>
-    <w:basedOn w:val="853"/>
+    <w:basedOn w:val="896"/>
     <w:uiPriority w:val="99"/>
     <w:pPr>
       <w:pBdr/>
@@ -36287,9 +36413,9 @@
       </w:tcPr>
     </w:tblStylePr>
   </w:style>
-  <w:style w:type="table" w:styleId="819">
+  <w:style w:type="table" w:styleId="862">
     <w:name w:val="Lined - Accent 6"/>
-    <w:basedOn w:val="853"/>
+    <w:basedOn w:val="896"/>
     <w:uiPriority w:val="99"/>
     <w:pPr>
       <w:pBdr/>
@@ -36524,9 +36650,9 @@
       </w:tcPr>
     </w:tblStylePr>
   </w:style>
-  <w:style w:type="table" w:styleId="820">
+  <w:style w:type="table" w:styleId="863">
     <w:name w:val="Bordered &amp; Lined - Accent"/>
-    <w:basedOn w:val="853"/>
+    <w:basedOn w:val="896"/>
     <w:uiPriority w:val="99"/>
     <w:pPr>
       <w:pBdr/>
@@ -36768,9 +36894,9 @@
       </w:tcPr>
     </w:tblStylePr>
   </w:style>
-  <w:style w:type="table" w:styleId="821">
+  <w:style w:type="table" w:styleId="864">
     <w:name w:val="Bordered &amp; Lined - Accent 1"/>
-    <w:basedOn w:val="853"/>
+    <w:basedOn w:val="896"/>
     <w:uiPriority w:val="99"/>
     <w:pPr>
       <w:pBdr/>
@@ -37012,9 +37138,9 @@
       </w:tcPr>
     </w:tblStylePr>
   </w:style>
-  <w:style w:type="table" w:styleId="822">
+  <w:style w:type="table" w:styleId="865">
     <w:name w:val="Bordered &amp; Lined - Accent 2"/>
-    <w:basedOn w:val="853"/>
+    <w:basedOn w:val="896"/>
     <w:uiPriority w:val="99"/>
     <w:pPr>
       <w:pBdr/>
@@ -37256,9 +37382,9 @@
       </w:tcPr>
     </w:tblStylePr>
   </w:style>
-  <w:style w:type="table" w:styleId="823">
+  <w:style w:type="table" w:styleId="866">
     <w:name w:val="Bordered &amp; Lined - Accent 3"/>
-    <w:basedOn w:val="853"/>
+    <w:basedOn w:val="896"/>
     <w:uiPriority w:val="99"/>
     <w:pPr>
       <w:pBdr/>
@@ -37500,9 +37626,9 @@
       </w:tcPr>
     </w:tblStylePr>
   </w:style>
-  <w:style w:type="table" w:styleId="824">
+  <w:style w:type="table" w:styleId="867">
     <w:name w:val="Bordered &amp; Lined - Accent 4"/>
-    <w:basedOn w:val="853"/>
+    <w:basedOn w:val="896"/>
     <w:uiPriority w:val="99"/>
     <w:pPr>
       <w:pBdr/>
@@ -37744,9 +37870,9 @@
       </w:tcPr>
     </w:tblStylePr>
   </w:style>
-  <w:style w:type="table" w:styleId="825">
+  <w:style w:type="table" w:styleId="868">
     <w:name w:val="Bordered &amp; Lined - Accent 5"/>
-    <w:basedOn w:val="853"/>
+    <w:basedOn w:val="896"/>
     <w:uiPriority w:val="99"/>
     <w:pPr>
       <w:pBdr/>
@@ -37988,9 +38114,9 @@
       </w:tcPr>
     </w:tblStylePr>
   </w:style>
-  <w:style w:type="table" w:styleId="826">
+  <w:style w:type="table" w:styleId="869">
     <w:name w:val="Bordered &amp; Lined - Accent 6"/>
-    <w:basedOn w:val="853"/>
+    <w:basedOn w:val="896"/>
     <w:uiPriority w:val="99"/>
     <w:pPr>
       <w:pBdr/>
@@ -38232,9 +38358,9 @@
       </w:tcPr>
     </w:tblStylePr>
   </w:style>
-  <w:style w:type="table" w:styleId="827">
+  <w:style w:type="table" w:styleId="870">
     <w:name w:val="Bordered"/>
-    <w:basedOn w:val="853"/>
+    <w:basedOn w:val="896"/>
     <w:uiPriority w:val="99"/>
     <w:pPr>
       <w:pBdr/>
@@ -38463,9 +38589,9 @@
       </w:tcPr>
     </w:tblStylePr>
   </w:style>
-  <w:style w:type="table" w:styleId="828">
+  <w:style w:type="table" w:styleId="871">
     <w:name w:val="Bordered - Accent 1"/>
-    <w:basedOn w:val="853"/>
+    <w:basedOn w:val="896"/>
     <w:uiPriority w:val="99"/>
     <w:pPr>
       <w:pBdr/>
@@ -38694,9 +38820,9 @@
       </w:tcPr>
     </w:tblStylePr>
   </w:style>
-  <w:style w:type="table" w:styleId="829">
+  <w:style w:type="table" w:styleId="872">
     <w:name w:val="Bordered - Accent 2"/>
-    <w:basedOn w:val="853"/>
+    <w:basedOn w:val="896"/>
     <w:uiPriority w:val="99"/>
     <w:pPr>
       <w:pBdr/>
@@ -38925,9 +39051,9 @@
       </w:tcPr>
     </w:tblStylePr>
   </w:style>
-  <w:style w:type="table" w:styleId="830">
+  <w:style w:type="table" w:styleId="873">
     <w:name w:val="Bordered - Accent 3"/>
-    <w:basedOn w:val="853"/>
+    <w:basedOn w:val="896"/>
     <w:uiPriority w:val="99"/>
     <w:pPr>
       <w:pBdr/>
@@ -39156,9 +39282,9 @@
       </w:tcPr>
     </w:tblStylePr>
   </w:style>
-  <w:style w:type="table" w:styleId="831">
+  <w:style w:type="table" w:styleId="874">
     <w:name w:val="Bordered - Accent 4"/>
-    <w:basedOn w:val="853"/>
+    <w:basedOn w:val="896"/>
     <w:uiPriority w:val="99"/>
     <w:pPr>
       <w:pBdr/>
@@ -39387,9 +39513,9 @@
       </w:tcPr>
     </w:tblStylePr>
   </w:style>
-  <w:style w:type="table" w:styleId="832">
+  <w:style w:type="table" w:styleId="875">
     <w:name w:val="Bordered - Accent 5"/>
-    <w:basedOn w:val="853"/>
+    <w:basedOn w:val="896"/>
     <w:uiPriority w:val="99"/>
     <w:pPr>
       <w:pBdr/>
@@ -39618,9 +39744,9 @@
       </w:tcPr>
     </w:tblStylePr>
   </w:style>
-  <w:style w:type="table" w:styleId="833">
+  <w:style w:type="table" w:styleId="876">
     <w:name w:val="Bordered - Accent 6"/>
-    <w:basedOn w:val="853"/>
+    <w:basedOn w:val="896"/>
     <w:uiPriority w:val="99"/>
     <w:pPr>
       <w:pBdr/>
@@ -39849,7 +39975,7 @@
       </w:tcPr>
     </w:tblStylePr>
   </w:style>
-  <w:style w:type="character" w:styleId="834">
+  <w:style w:type="character" w:styleId="877">
     <w:name w:val="Hyperlink"/>
     <w:uiPriority w:val="99"/>
     <w:unhideWhenUsed/>
@@ -39863,10 +39989,10 @@
       <w:u w:val="single"/>
     </w:rPr>
   </w:style>
-  <w:style w:type="paragraph" w:styleId="835">
+  <w:style w:type="paragraph" w:styleId="878">
     <w:name w:val="footnote text"/>
-    <w:basedOn w:val="852"/>
-    <w:link w:val="836"/>
+    <w:basedOn w:val="895"/>
+    <w:link w:val="879"/>
     <w:uiPriority w:val="99"/>
     <w:semiHidden/>
     <w:unhideWhenUsed/>
@@ -39879,9 +40005,9 @@
       <w:sz w:val="18"/>
     </w:rPr>
   </w:style>
-  <w:style w:type="character" w:styleId="836">
+  <w:style w:type="character" w:styleId="879">
     <w:name w:val="Footnote Text Char"/>
-    <w:link w:val="835"/>
+    <w:link w:val="878"/>
     <w:uiPriority w:val="99"/>
     <w:pPr>
       <w:pBdr/>
@@ -39892,7 +40018,7 @@
       <w:sz w:val="18"/>
     </w:rPr>
   </w:style>
-  <w:style w:type="character" w:styleId="837">
+  <w:style w:type="character" w:styleId="880">
     <w:name w:val="footnote reference"/>
     <w:uiPriority w:val="99"/>
     <w:unhideWhenUsed/>
@@ -39905,10 +40031,10 @@
       <w:vertAlign w:val="superscript"/>
     </w:rPr>
   </w:style>
-  <w:style w:type="paragraph" w:styleId="838">
+  <w:style w:type="paragraph" w:styleId="881">
     <w:name w:val="endnote text"/>
-    <w:basedOn w:val="852"/>
-    <w:link w:val="839"/>
+    <w:basedOn w:val="895"/>
+    <w:link w:val="882"/>
     <w:uiPriority w:val="99"/>
     <w:semiHidden/>
     <w:unhideWhenUsed/>
@@ -39921,9 +40047,9 @@
       <w:sz w:val="20"/>
     </w:rPr>
   </w:style>
-  <w:style w:type="character" w:styleId="839">
+  <w:style w:type="character" w:styleId="882">
     <w:name w:val="Endnote Text Char"/>
-    <w:link w:val="838"/>
+    <w:link w:val="881"/>
     <w:uiPriority w:val="99"/>
     <w:pPr>
       <w:pBdr/>
@@ -39934,7 +40060,7 @@
       <w:sz w:val="20"/>
     </w:rPr>
   </w:style>
-  <w:style w:type="character" w:styleId="840">
+  <w:style w:type="character" w:styleId="883">
     <w:name w:val="endnote reference"/>
     <w:uiPriority w:val="99"/>
     <w:semiHidden/>
@@ -39948,10 +40074,10 @@
       <w:vertAlign w:val="superscript"/>
     </w:rPr>
   </w:style>
-  <w:style w:type="paragraph" w:styleId="841">
+  <w:style w:type="paragraph" w:styleId="884">
     <w:name w:val="toc 1"/>
-    <w:basedOn w:val="852"/>
-    <w:next w:val="852"/>
+    <w:basedOn w:val="895"/>
+    <w:next w:val="895"/>
     <w:uiPriority w:val="39"/>
     <w:unhideWhenUsed/>
     <w:pPr>
@@ -39960,10 +40086,10 @@
       <w:ind w:right="0" w:firstLine="0" w:left="0"/>
     </w:pPr>
   </w:style>
-  <w:style w:type="paragraph" w:styleId="842">
+  <w:style w:type="paragraph" w:styleId="885">
     <w:name w:val="toc 2"/>
-    <w:basedOn w:val="852"/>
-    <w:next w:val="852"/>
+    <w:basedOn w:val="895"/>
+    <w:next w:val="895"/>
     <w:uiPriority w:val="39"/>
     <w:unhideWhenUsed/>
     <w:pPr>
@@ -39972,10 +40098,10 @@
       <w:ind w:right="0" w:firstLine="0" w:left="283"/>
     </w:pPr>
   </w:style>
-  <w:style w:type="paragraph" w:styleId="843">
+  <w:style w:type="paragraph" w:styleId="886">
     <w:name w:val="toc 3"/>
-    <w:basedOn w:val="852"/>
-    <w:next w:val="852"/>
+    <w:basedOn w:val="895"/>
+    <w:next w:val="895"/>
     <w:uiPriority w:val="39"/>
     <w:unhideWhenUsed/>
     <w:pPr>
@@ -39984,10 +40110,10 @@
       <w:ind w:right="0" w:firstLine="0" w:left="567"/>
     </w:pPr>
   </w:style>
-  <w:style w:type="paragraph" w:styleId="844">
+  <w:style w:type="paragraph" w:styleId="887">
     <w:name w:val="toc 4"/>
-    <w:basedOn w:val="852"/>
-    <w:next w:val="852"/>
+    <w:basedOn w:val="895"/>
+    <w:next w:val="895"/>
     <w:uiPriority w:val="39"/>
     <w:unhideWhenUsed/>
     <w:pPr>
@@ -39996,10 +40122,10 @@
       <w:ind w:right="0" w:firstLine="0" w:left="850"/>
     </w:pPr>
   </w:style>
-  <w:style w:type="paragraph" w:styleId="845">
+  <w:style w:type="paragraph" w:styleId="888">
     <w:name w:val="toc 5"/>
-    <w:basedOn w:val="852"/>
-    <w:next w:val="852"/>
+    <w:basedOn w:val="895"/>
+    <w:next w:val="895"/>
     <w:uiPriority w:val="39"/>
     <w:unhideWhenUsed/>
     <w:pPr>
@@ -40008,10 +40134,10 @@
       <w:ind w:right="0" w:firstLine="0" w:left="1134"/>
     </w:pPr>
   </w:style>
-  <w:style w:type="paragraph" w:styleId="846">
+  <w:style w:type="paragraph" w:styleId="889">
     <w:name w:val="toc 6"/>
-    <w:basedOn w:val="852"/>
-    <w:next w:val="852"/>
+    <w:basedOn w:val="895"/>
+    <w:next w:val="895"/>
     <w:uiPriority w:val="39"/>
     <w:unhideWhenUsed/>
     <w:pPr>
@@ -40020,10 +40146,10 @@
       <w:ind w:right="0" w:firstLine="0" w:left="1417"/>
     </w:pPr>
   </w:style>
-  <w:style w:type="paragraph" w:styleId="847">
+  <w:style w:type="paragraph" w:styleId="890">
     <w:name w:val="toc 7"/>
-    <w:basedOn w:val="852"/>
-    <w:next w:val="852"/>
+    <w:basedOn w:val="895"/>
+    <w:next w:val="895"/>
     <w:uiPriority w:val="39"/>
     <w:unhideWhenUsed/>
     <w:pPr>
@@ -40032,10 +40158,10 @@
       <w:ind w:right="0" w:firstLine="0" w:left="1701"/>
     </w:pPr>
   </w:style>
-  <w:style w:type="paragraph" w:styleId="848">
+  <w:style w:type="paragraph" w:styleId="891">
     <w:name w:val="toc 8"/>
-    <w:basedOn w:val="852"/>
-    <w:next w:val="852"/>
+    <w:basedOn w:val="895"/>
+    <w:next w:val="895"/>
     <w:uiPriority w:val="39"/>
     <w:unhideWhenUsed/>
     <w:pPr>
@@ -40044,10 +40170,10 @@
       <w:ind w:right="0" w:firstLine="0" w:left="1984"/>
     </w:pPr>
   </w:style>
-  <w:style w:type="paragraph" w:styleId="849">
+  <w:style w:type="paragraph" w:styleId="892">
     <w:name w:val="toc 9"/>
-    <w:basedOn w:val="852"/>
-    <w:next w:val="852"/>
+    <w:basedOn w:val="895"/>
+    <w:next w:val="895"/>
     <w:uiPriority w:val="39"/>
     <w:unhideWhenUsed/>
     <w:pPr>
@@ -40056,7 +40182,7 @@
       <w:ind w:right="0" w:firstLine="0" w:left="2268"/>
     </w:pPr>
   </w:style>
-  <w:style w:type="paragraph" w:styleId="850">
+  <w:style w:type="paragraph" w:styleId="893">
     <w:name w:val="TOC Heading"/>
     <w:uiPriority w:val="39"/>
     <w:unhideWhenUsed/>
@@ -40066,10 +40192,10 @@
       <w:ind/>
     </w:pPr>
   </w:style>
-  <w:style w:type="paragraph" w:styleId="851">
+  <w:style w:type="paragraph" w:styleId="894">
     <w:name w:val="table of figures"/>
-    <w:basedOn w:val="852"/>
-    <w:next w:val="852"/>
+    <w:basedOn w:val="895"/>
+    <w:next w:val="895"/>
     <w:uiPriority w:val="99"/>
     <w:unhideWhenUsed/>
     <w:pPr>
@@ -40078,7 +40204,7 @@
       <w:ind/>
     </w:pPr>
   </w:style>
-  <w:style w:type="paragraph" w:styleId="852" w:default="1">
+  <w:style w:type="paragraph" w:styleId="895" w:default="1">
     <w:name w:val="Normal"/>
     <w:qFormat/>
     <w:pPr>
@@ -40087,7 +40213,7 @@
       <w:ind/>
     </w:pPr>
   </w:style>
-  <w:style w:type="table" w:styleId="853" w:default="1">
+  <w:style w:type="table" w:styleId="896" w:default="1">
     <w:name w:val="Normal Table"/>
     <w:uiPriority w:val="99"/>
     <w:semiHidden/>
@@ -40280,7 +40406,7 @@
       </w:tcPr>
     </w:tblStylePr>
   </w:style>
-  <w:style w:type="numbering" w:styleId="854" w:default="1">
+  <w:style w:type="numbering" w:styleId="897" w:default="1">
     <w:name w:val="No List"/>
     <w:uiPriority w:val="99"/>
     <w:semiHidden/>
@@ -40291,9 +40417,9 @@
       <w:ind/>
     </w:pPr>
   </w:style>
-  <w:style w:type="paragraph" w:styleId="855">
+  <w:style w:type="paragraph" w:styleId="898">
     <w:name w:val="No Spacing"/>
-    <w:basedOn w:val="852"/>
+    <w:basedOn w:val="895"/>
     <w:uiPriority w:val="1"/>
     <w:qFormat/>
     <w:pPr>
@@ -40302,9 +40428,9 @@
       <w:ind/>
     </w:pPr>
   </w:style>
-  <w:style w:type="paragraph" w:styleId="856">
+  <w:style w:type="paragraph" w:styleId="899">
     <w:name w:val="List Paragraph"/>
-    <w:basedOn w:val="852"/>
+    <w:basedOn w:val="895"/>
     <w:uiPriority w:val="34"/>
     <w:qFormat/>
     <w:pPr>
@@ -40314,7 +40440,7 @@
       <w:contextualSpacing w:val="true"/>
     </w:pPr>
   </w:style>
-  <w:style w:type="character" w:styleId="857" w:default="1">
+  <w:style w:type="character" w:styleId="900" w:default="1">
     <w:name w:val="Default Paragraph Font"/>
     <w:uiPriority w:val="1"/>
     <w:semiHidden/>

</xml_diff>

<commit_message>
Started testing, have like 2 tests lmao.
</commit_message>
<xml_diff>
--- a/Analysis.docx
+++ b/Analysis.docx
@@ -2977,31 +2977,6 @@
     </w:p>
     <w:p>
       <w:pPr>
-        <w:pBdr/>
-        <w:spacing/>
-        <w:ind/>
-        <w:rPr>
-          <w:highlight w:val="none"/>
-        </w:rPr>
-      </w:pPr>
-      <w:r>
-        <w:rPr>
-          <w:highlight w:val="none"/>
-        </w:rPr>
-      </w:r>
-      <w:r>
-        <w:rPr>
-          <w:highlight w:val="none"/>
-        </w:rPr>
-      </w:r>
-      <w:r>
-        <w:rPr>
-          <w:highlight w:val="none"/>
-        </w:rPr>
-      </w:r>
-    </w:p>
-    <w:p>
-      <w:pPr>
         <w:pStyle w:val="723"/>
         <w:pBdr/>
         <w:spacing/>
@@ -3813,6 +3788,18 @@
           <w:szCs w:val="22"/>
         </w:rPr>
       </w:r>
+    </w:p>
+    <w:p>
+      <w:pPr>
+        <w:pBdr/>
+        <w:spacing/>
+        <w:ind/>
+        <w:rPr/>
+      </w:pPr>
+      <w:r>
+        <w:t xml:space="preserve">The functions to request and extract data from NASA will be in a separate file, horizonsParser, so that it can be imported as a module.</w:t>
+      </w:r>
+      <w:r/>
     </w:p>
     <w:p>
       <w:pPr>
@@ -6097,6 +6084,27 @@
               </m:r>
             </m:den>
           </m:f>
+          <m:acc>
+            <m:accPr>
+              <m:ctrlPr>
+                <w:rPr>
+                  <w:rFonts w:hint="default" w:ascii="Cambria Math" w:hAnsi="Cambria Math" w:eastAsia="Cambria Math" w:cs="Cambria Math"/>
+                  <w:i/>
+                </w:rPr>
+              </m:ctrlPr>
+            </m:accPr>
+            <m:e>
+              <m:r>
+                <w:rPr>
+                  <w:rFonts w:hint="default" w:ascii="Cambria Math" w:hAnsi="Cambria Math" w:eastAsia="Cambria Math" w:cs="Cambria Math"/>
+                </w:rPr>
+                <m:rPr>
+                  <m:sty m:val="i"/>
+                </m:rPr>
+                <m:t>r</m:t>
+              </m:r>
+            </m:e>
+          </m:acc>
         </m:oMath>
       </m:oMathPara>
       <w:r>
@@ -6206,6 +6214,27 @@
             </m:r>
           </m:den>
         </m:f>
+        <m:acc>
+          <m:accPr>
+            <m:ctrlPr>
+              <w:rPr>
+                <w:rFonts w:hint="default" w:ascii="Cambria Math" w:hAnsi="Cambria Math" w:eastAsia="Cambria Math" w:cs="Cambria Math"/>
+                <w:i/>
+              </w:rPr>
+            </m:ctrlPr>
+          </m:accPr>
+          <m:e>
+            <m:r>
+              <w:rPr>
+                <w:rFonts w:hint="default" w:ascii="Cambria Math" w:hAnsi="Cambria Math" w:eastAsia="Cambria Math" w:cs="Cambria Math"/>
+              </w:rPr>
+              <m:rPr>
+                <m:sty m:val="i"/>
+              </m:rPr>
+              <m:t>r</m:t>
+            </m:r>
+          </m:e>
+        </m:acc>
       </m:oMath>
       <w:r>
         <w:rPr>
@@ -6390,12 +6419,64 @@
             </m:r>
           </m:den>
         </m:f>
+        <m:acc>
+          <m:accPr>
+            <m:ctrlPr>
+              <w:rPr>
+                <w:rFonts w:hint="default" w:ascii="Cambria Math" w:hAnsi="Cambria Math" w:eastAsia="Cambria Math" w:cs="Cambria Math"/>
+                <w:i/>
+              </w:rPr>
+            </m:ctrlPr>
+          </m:accPr>
+          <m:e>
+            <m:r>
+              <w:rPr>
+                <w:rFonts w:hint="default" w:ascii="Cambria Math" w:hAnsi="Cambria Math" w:eastAsia="Cambria Math" w:cs="Cambria Math"/>
+              </w:rPr>
+              <m:rPr>
+                <m:sty m:val="i"/>
+              </m:rPr>
+              <m:t>r</m:t>
+            </m:r>
+          </m:e>
+        </m:acc>
       </m:oMath>
       <w:r>
         <w:rPr>
           <w:highlight w:val="none"/>
         </w:rPr>
-        <w:t xml:space="preserve">. Here, M and m are the masses of the two objects in question (M is conventionally the mass of the larger planet), r is the distance between them and G is a physical constant. It’</w:t>
+        <w:t xml:space="preserve">. Here, M and m are the masses of the two objects in question (M is conventionally the mass of the larger planet), r is the distance between them, </w:t>
+      </w:r>
+      <m:oMath>
+        <m:acc>
+          <m:accPr>
+            <m:ctrlPr>
+              <w:rPr>
+                <w:rFonts w:hint="default" w:ascii="Cambria Math" w:hAnsi="Cambria Math" w:eastAsia="Cambria Math" w:cs="Cambria Math"/>
+                <w:i/>
+                <w:highlight w:val="none"/>
+              </w:rPr>
+            </m:ctrlPr>
+          </m:accPr>
+          <m:e>
+            <m:r>
+              <w:rPr>
+                <w:rFonts w:hint="default" w:ascii="Cambria Math" w:hAnsi="Cambria Math" w:eastAsia="Cambria Math" w:cs="Cambria Math"/>
+                <w:highlight w:val="none"/>
+              </w:rPr>
+              <m:rPr>
+                <m:sty m:val="i"/>
+              </m:rPr>
+              <m:t>r</m:t>
+            </m:r>
+          </m:e>
+        </m:acc>
+      </m:oMath>
+      <w:r>
+        <w:rPr>
+          <w:highlight w:val="none"/>
+        </w:rPr>
+        <w:t xml:space="preserve"> is a unit vector pointing from one planet to another, and G is a physical constant. It’</w:t>
       </w:r>
       <w:r>
         <w:rPr>
@@ -6464,9 +6545,30 @@
             </m:r>
           </m:den>
         </m:f>
+        <m:acc>
+          <m:accPr>
+            <m:ctrlPr>
+              <w:rPr>
+                <w:rFonts w:hint="default" w:ascii="Cambria Math" w:hAnsi="Cambria Math" w:eastAsia="Cambria Math" w:cs="Cambria Math"/>
+                <w:i/>
+              </w:rPr>
+            </m:ctrlPr>
+          </m:accPr>
+          <m:e>
+            <m:r>
+              <w:rPr>
+                <w:rFonts w:hint="default" w:ascii="Cambria Math" w:hAnsi="Cambria Math" w:eastAsia="Cambria Math" w:cs="Cambria Math"/>
+              </w:rPr>
+              <m:rPr>
+                <m:sty m:val="i"/>
+              </m:rPr>
+              <m:t>r</m:t>
+            </m:r>
+          </m:e>
+        </m:acc>
       </m:oMath>
       <w:r>
-        <w:t xml:space="preserve"> for that planet and all the other bodies in the system. We then add those forces up (some may be negative and cancel each other out) to get the resultant force. This is then given to F = ma, and the acceleration from that is given to Verlet integration.</w:t>
+        <w:t xml:space="preserve"> for that planet and all the other bodies in the system. We then add those forces up (some may be negative and cancel each other out) to get the resultant force. This is then given to F = ma, and the acceleration from that is given to Verlet integration. Note that we must </w:t>
       </w:r>
       <w:r>
         <w:rPr>
@@ -6647,6 +6749,258 @@
         <w:ind/>
         <w:jc w:val="both"/>
         <w:rPr>
+          <w:color w:val="5b9bd5"/>
+        </w:rPr>
+      </w:pPr>
+      <w:r>
+        <w:rPr>
+          <w:color w:val="4472c4" w:themeColor="accent5"/>
+          <w:highlight w:val="none"/>
+        </w:rPr>
+        <w:t xml:space="preserve">Vectors</w:t>
+      </w:r>
+      <w:r>
+        <w:rPr>
+          <w:color w:val="5b9bd5"/>
+        </w:rPr>
+      </w:r>
+      <w:r>
+        <w:rPr>
+          <w:color w:val="5b9bd5"/>
+        </w:rPr>
+      </w:r>
+    </w:p>
+    <w:p>
+      <w:pPr>
+        <w:pBdr/>
+        <w:spacing/>
+        <w:ind/>
+        <w:rPr>
+          <w:highlight w:val="none"/>
+        </w:rPr>
+      </w:pPr>
+      <w:r>
+        <w:t xml:space="preserve">To use verlet integration and Newton’s law of gravity we will need to have access to a few basic vector operations. These are:</w:t>
+      </w:r>
+      <w:r>
+        <w:rPr>
+          <w:color w:val="4472c4" w:themeColor="accent5"/>
+          <w:highlight w:val="none"/>
+        </w:rPr>
+      </w:r>
+      <w:r/>
+    </w:p>
+    <w:p>
+      <w:pPr>
+        <w:pStyle w:val="899"/>
+        <w:numPr>
+          <w:ilvl w:val="0"/>
+          <w:numId w:val="8"/>
+        </w:numPr>
+        <w:pBdr/>
+        <w:spacing/>
+        <w:ind/>
+        <w:rPr/>
+      </w:pPr>
+      <w:r>
+        <w:rPr>
+          <w:highlight w:val="none"/>
+        </w:rPr>
+        <w:t xml:space="preserve">Finding the magnitude of a vector</w:t>
+      </w:r>
+      <w:r>
+        <w:rPr>
+          <w:highlight w:val="none"/>
+        </w:rPr>
+      </w:r>
+    </w:p>
+    <w:p>
+      <w:pPr>
+        <w:pStyle w:val="899"/>
+        <w:numPr>
+          <w:ilvl w:val="0"/>
+          <w:numId w:val="8"/>
+        </w:numPr>
+        <w:pBdr/>
+        <w:spacing/>
+        <w:ind/>
+        <w:rPr/>
+      </w:pPr>
+      <w:r>
+        <w:rPr>
+          <w:highlight w:val="none"/>
+        </w:rPr>
+        <w:t xml:space="preserve">Finding the unit of a vector</w:t>
+      </w:r>
+      <w:r>
+        <w:rPr>
+          <w:highlight w:val="none"/>
+        </w:rPr>
+      </w:r>
+    </w:p>
+    <w:p>
+      <w:pPr>
+        <w:pStyle w:val="899"/>
+        <w:numPr>
+          <w:ilvl w:val="0"/>
+          <w:numId w:val="8"/>
+        </w:numPr>
+        <w:pBdr/>
+        <w:spacing/>
+        <w:ind/>
+        <w:rPr/>
+      </w:pPr>
+      <w:r>
+        <w:rPr>
+          <w:highlight w:val="none"/>
+        </w:rPr>
+        <w:t xml:space="preserve">Finding the perpendicular to a 2d vector</w:t>
+      </w:r>
+      <w:r>
+        <w:rPr>
+          <w:highlight w:val="none"/>
+        </w:rPr>
+      </w:r>
+    </w:p>
+    <w:p>
+      <w:pPr>
+        <w:pBdr/>
+        <w:spacing/>
+        <w:ind/>
+        <w:rPr>
+          <w:highlight w:val="none"/>
+        </w:rPr>
+      </w:pPr>
+      <w:r>
+        <w:rPr>
+          <w:highlight w:val="none"/>
+        </w:rPr>
+        <w:t xml:space="preserve">To find the magnitude of a vector you simply square each element, add them up, and then take the square root. E.g. if we have the vector (1, 2, 2) then the magnitude is sqrt(1²+2²+2²)=sqrt(1+4+4)=sqrt(9)=3. This is needed to find “r” in the gravity equation, as the distance between two planets is the magnitude of the vector between them.</w:t>
+      </w:r>
+      <w:r>
+        <w:rPr>
+          <w:highlight w:val="none"/>
+        </w:rPr>
+      </w:r>
+    </w:p>
+    <w:p>
+      <w:pPr>
+        <w:pBdr/>
+        <w:spacing/>
+        <w:ind/>
+        <w:rPr>
+          <w:highlight w:val="none"/>
+        </w:rPr>
+      </w:pPr>
+      <w:r>
+        <w:rPr>
+          <w:highlight w:val="none"/>
+        </w:rPr>
+        <w:t xml:space="preserve">To find the unit of a vector is very simple, you find its magnitude and then divide every element by it. So the unit of (1, 2, 2) would be (1/3, 2/3, 2/3). This is needed to find </w:t>
+      </w:r>
+      <w:r>
+        <w:rPr>
+          <w:highlight w:val="none"/>
+        </w:rPr>
+      </w:r>
+      <m:oMath>
+        <m:acc>
+          <m:accPr>
+            <m:ctrlPr>
+              <w:rPr>
+                <w:rFonts w:hint="default" w:ascii="Cambria Math" w:hAnsi="Cambria Math" w:eastAsia="Cambria Math" w:cs="Cambria Math"/>
+                <w:i/>
+                <w:highlight w:val="none"/>
+              </w:rPr>
+            </m:ctrlPr>
+          </m:accPr>
+          <m:e>
+            <m:r>
+              <w:rPr>
+                <w:rFonts w:hint="default" w:ascii="Cambria Math" w:hAnsi="Cambria Math" w:eastAsia="Cambria Math" w:cs="Cambria Math"/>
+                <w:highlight w:val="none"/>
+              </w:rPr>
+              <m:rPr>
+                <m:sty m:val="i"/>
+              </m:rPr>
+              <m:t>r</m:t>
+            </m:r>
+          </m:e>
+        </m:acc>
+      </m:oMath>
+      <w:r>
+        <w:rPr>
+          <w:highlight w:val="none"/>
+        </w:rPr>
+        <w:t xml:space="preserve"> in the gravity equation.</w:t>
+      </w:r>
+      <w:r>
+        <w:rPr>
+          <w:highlight w:val="none"/>
+        </w:rPr>
+      </w:r>
+    </w:p>
+    <w:p>
+      <w:pPr>
+        <w:pBdr/>
+        <w:spacing/>
+        <w:ind/>
+        <w:rPr>
+          <w:highlight w:val="none"/>
+        </w:rPr>
+      </w:pPr>
+      <w:r>
+        <w:rPr>
+          <w:highlight w:val="none"/>
+        </w:rPr>
+        <w:t xml:space="preserve">To find a perpendicular to a 2d vector you swap the elements around and negate one of them. So e.g. the two perpendiculars to (1,2) would be (-2,1) and (2,-1). It is arbitrary which you negate so I will just negate the first element. This is needed to draw arrows, the two lines at the end of the arrow need to lie on a perpendicular to the main line of the arrow. This will be explained more in the design, drawing arrows is surprisingly technical.</w:t>
+      </w:r>
+      <w:r>
+        <w:rPr>
+          <w:highlight w:val="none"/>
+        </w:rPr>
+      </w:r>
+      <w:r>
+        <w:rPr>
+          <w:color w:val="4472c4" w:themeColor="accent5"/>
+          <w:highlight w:val="none"/>
+        </w:rPr>
+      </w:r>
+      <w:r>
+        <w:rPr>
+          <w:color w:val="4472c4" w:themeColor="accent5"/>
+          <w:highlight w:val="none"/>
+        </w:rPr>
+      </w:r>
+      <w:r/>
+    </w:p>
+    <w:p>
+      <w:pPr>
+        <w:pBdr/>
+        <w:spacing/>
+        <w:ind/>
+        <w:rPr/>
+      </w:pPr>
+      <w:r>
+        <w:rPr>
+          <w:highlight w:val="none"/>
+        </w:rPr>
+        <w:t xml:space="preserve">These operations will be put in a separate file so they can be imported as a module.</w:t>
+      </w:r>
+      <w:r>
+        <w:rPr>
+          <w:highlight w:val="none"/>
+        </w:rPr>
+      </w:r>
+    </w:p>
+    <w:p>
+      <w:pPr>
+        <w:pStyle w:val="723"/>
+        <w:pBdr/>
+        <w:spacing/>
+        <w:ind/>
+        <w:jc w:val="both"/>
+        <w:rPr>
           <w:color w:val="4472c4" w:themeColor="accent5"/>
           <w:highlight w:val="none"/>
         </w:rPr>
@@ -7893,6 +8247,31 @@
           <w:highlight w:val="none"/>
         </w:rPr>
       </w:r>
+      <w:r/>
+    </w:p>
+    <w:p>
+      <w:pPr>
+        <w:pStyle w:val="899"/>
+        <w:numPr>
+          <w:ilvl w:val="2"/>
+          <w:numId w:val="7"/>
+        </w:numPr>
+        <w:pBdr/>
+        <w:spacing/>
+        <w:ind/>
+        <w:rPr/>
+      </w:pPr>
+      <w:r>
+        <w:rPr>
+          <w:highlight w:val="none"/>
+        </w:rPr>
+        <w:t xml:space="preserve">These laws will require the use of vector operations, the vector operations should be implemented in a separate file, vectors, so they can be called from a module.</w:t>
+      </w:r>
+      <w:r>
+        <w:rPr>
+          <w:highlight w:val="none"/>
+        </w:rPr>
+      </w:r>
     </w:p>
     <w:p>
       <w:pPr>
@@ -7917,6 +8296,7 @@
           <w:highlight w:val="none"/>
         </w:rPr>
       </w:r>
+      <w:r/>
     </w:p>
     <w:p>
       <w:pPr>
@@ -7941,6 +8321,7 @@
           <w:highlight w:val="none"/>
         </w:rPr>
       </w:r>
+      <w:r/>
     </w:p>
     <w:p>
       <w:pPr>
@@ -8003,6 +8384,30 @@
         <w:rPr>
           <w:highlight w:val="none"/>
         </w:rPr>
+        <w:t xml:space="preserve">Have a start screen that explains the keybinds to improve user experience</w:t>
+      </w:r>
+      <w:r>
+        <w:rPr>
+          <w:highlight w:val="none"/>
+        </w:rPr>
+      </w:r>
+    </w:p>
+    <w:p>
+      <w:pPr>
+        <w:pStyle w:val="899"/>
+        <w:numPr>
+          <w:ilvl w:val="1"/>
+          <w:numId w:val="7"/>
+        </w:numPr>
+        <w:pBdr/>
+        <w:spacing/>
+        <w:ind/>
+        <w:rPr/>
+      </w:pPr>
+      <w:r>
+        <w:rPr>
+          <w:highlight w:val="none"/>
+        </w:rPr>
         <w:t xml:space="preserve">Explain how Newtonian physics connects to the solar system</w:t>
       </w:r>
       <w:r>
@@ -8235,6 +8640,7 @@
           <w:highlight w:val="none"/>
         </w:rPr>
       </w:r>
+      <w:r/>
     </w:p>
     <w:p>
       <w:pPr>
@@ -8335,17 +8741,6 @@
         </w:rPr>
       </w:r>
       <w:r/>
-      <w:r>
-        <w:rPr>
-          <w:highlight w:val="none"/>
-        </w:rPr>
-      </w:r>
-      <w:r>
-        <w:rPr>
-          <w:highlight w:val="none"/>
-        </w:rPr>
-      </w:r>
-      <w:r/>
     </w:p>
     <w:p>
       <w:pPr>
@@ -8590,6 +8985,7 @@
           <w:highlight w:val="none"/>
         </w:rPr>
       </w:r>
+      <w:r/>
     </w:p>
     <w:p>
       <w:pPr>
@@ -9537,6 +9933,134 @@
     </w:lvl>
   </w:abstractNum>
   <w:abstractNum w:abstractNumId="6">
+    <w:lvl w:ilvl="0">
+      <w:isLgl w:val="false"/>
+      <w:lvlJc w:val="left"/>
+      <w:lvlText w:val="%1."/>
+      <w:numFmt w:val="decimal"/>
+      <w:pPr>
+        <w:pBdr/>
+        <w:spacing/>
+        <w:ind w:hanging="360" w:left="709"/>
+      </w:pPr>
+      <w:rPr/>
+      <w:start w:val="1"/>
+      <w:suff w:val="tab"/>
+    </w:lvl>
+    <w:lvl w:ilvl="1">
+      <w:isLgl w:val="false"/>
+      <w:lvlJc w:val="left"/>
+      <w:lvlText w:val="%2."/>
+      <w:numFmt w:val="lowerLetter"/>
+      <w:pPr>
+        <w:pBdr/>
+        <w:spacing/>
+        <w:ind w:hanging="360" w:left="1429"/>
+      </w:pPr>
+      <w:rPr/>
+      <w:start w:val="1"/>
+      <w:suff w:val="tab"/>
+    </w:lvl>
+    <w:lvl w:ilvl="2">
+      <w:isLgl w:val="false"/>
+      <w:lvlJc w:val="right"/>
+      <w:lvlText w:val="%3."/>
+      <w:numFmt w:val="lowerRoman"/>
+      <w:pPr>
+        <w:pBdr/>
+        <w:spacing/>
+        <w:ind w:hanging="180" w:left="2149"/>
+      </w:pPr>
+      <w:rPr/>
+      <w:start w:val="1"/>
+      <w:suff w:val="tab"/>
+    </w:lvl>
+    <w:lvl w:ilvl="3">
+      <w:isLgl w:val="false"/>
+      <w:lvlJc w:val="left"/>
+      <w:lvlText w:val="%4."/>
+      <w:numFmt w:val="decimal"/>
+      <w:pPr>
+        <w:pBdr/>
+        <w:spacing/>
+        <w:ind w:hanging="360" w:left="2869"/>
+      </w:pPr>
+      <w:rPr/>
+      <w:start w:val="1"/>
+      <w:suff w:val="tab"/>
+    </w:lvl>
+    <w:lvl w:ilvl="4">
+      <w:isLgl w:val="false"/>
+      <w:lvlJc w:val="left"/>
+      <w:lvlText w:val="%5."/>
+      <w:numFmt w:val="lowerLetter"/>
+      <w:pPr>
+        <w:pBdr/>
+        <w:spacing/>
+        <w:ind w:hanging="360" w:left="3589"/>
+      </w:pPr>
+      <w:rPr/>
+      <w:start w:val="1"/>
+      <w:suff w:val="tab"/>
+    </w:lvl>
+    <w:lvl w:ilvl="5">
+      <w:isLgl w:val="false"/>
+      <w:lvlJc w:val="right"/>
+      <w:lvlText w:val="%6."/>
+      <w:numFmt w:val="lowerRoman"/>
+      <w:pPr>
+        <w:pBdr/>
+        <w:spacing/>
+        <w:ind w:hanging="180" w:left="4309"/>
+      </w:pPr>
+      <w:rPr/>
+      <w:start w:val="1"/>
+      <w:suff w:val="tab"/>
+    </w:lvl>
+    <w:lvl w:ilvl="6">
+      <w:isLgl w:val="false"/>
+      <w:lvlJc w:val="left"/>
+      <w:lvlText w:val="%7."/>
+      <w:numFmt w:val="decimal"/>
+      <w:pPr>
+        <w:pBdr/>
+        <w:spacing/>
+        <w:ind w:hanging="360" w:left="5029"/>
+      </w:pPr>
+      <w:rPr/>
+      <w:start w:val="1"/>
+      <w:suff w:val="tab"/>
+    </w:lvl>
+    <w:lvl w:ilvl="7">
+      <w:isLgl w:val="false"/>
+      <w:lvlJc w:val="left"/>
+      <w:lvlText w:val="%8."/>
+      <w:numFmt w:val="lowerLetter"/>
+      <w:pPr>
+        <w:pBdr/>
+        <w:spacing/>
+        <w:ind w:hanging="360" w:left="5749"/>
+      </w:pPr>
+      <w:rPr/>
+      <w:start w:val="1"/>
+      <w:suff w:val="tab"/>
+    </w:lvl>
+    <w:lvl w:ilvl="8">
+      <w:isLgl w:val="false"/>
+      <w:lvlJc w:val="right"/>
+      <w:lvlText w:val="%9."/>
+      <w:numFmt w:val="lowerRoman"/>
+      <w:pPr>
+        <w:pBdr/>
+        <w:spacing/>
+        <w:ind w:hanging="180" w:left="6469"/>
+      </w:pPr>
+      <w:rPr/>
+      <w:start w:val="1"/>
+      <w:suff w:val="tab"/>
+    </w:lvl>
+  </w:abstractNum>
+  <w:abstractNum w:abstractNumId="7">
     <w:lvl w:ilvl="0">
       <w:isLgl w:val="false"/>
       <w:lvlJc w:val="left"/>
@@ -9684,6 +10208,9 @@
   </w:num>
   <w:num w:numId="7">
     <w:abstractNumId w:val="6"/>
+  </w:num>
+  <w:num w:numId="8">
+    <w:abstractNumId w:val="7"/>
   </w:num>
 </w:numbering>
 </file>

</xml_diff>

<commit_message>
Added some more tests
</commit_message>
<xml_diff>
--- a/Analysis.docx
+++ b/Analysis.docx
@@ -4,7 +4,7 @@
   <w:body>
     <w:p>
       <w:pPr>
-        <w:pStyle w:val="719"/>
+        <w:pStyle w:val="721"/>
         <w:pBdr/>
         <w:spacing w:line="141" w:lineRule="atLeast"/>
         <w:ind/>
@@ -37,7 +37,7 @@
     </w:p>
     <w:p>
       <w:pPr>
-        <w:pStyle w:val="723"/>
+        <w:pStyle w:val="725"/>
         <w:pBdr/>
         <w:spacing/>
         <w:ind/>
@@ -115,7 +115,7 @@
     </w:p>
     <w:p>
       <w:pPr>
-        <w:pStyle w:val="723"/>
+        <w:pStyle w:val="725"/>
         <w:pBdr/>
         <w:spacing/>
         <w:ind/>
@@ -155,7 +155,7 @@
     </w:p>
     <w:p>
       <w:pPr>
-        <w:pStyle w:val="899"/>
+        <w:pStyle w:val="901"/>
         <w:numPr>
           <w:ilvl w:val="0"/>
           <w:numId w:val="1"/>
@@ -195,7 +195,7 @@
     </w:p>
     <w:p>
       <w:pPr>
-        <w:pStyle w:val="899"/>
+        <w:pStyle w:val="901"/>
         <w:numPr>
           <w:ilvl w:val="0"/>
           <w:numId w:val="1"/>
@@ -464,7 +464,7 @@
     </w:p>
     <w:p>
       <w:pPr>
-        <w:pStyle w:val="723"/>
+        <w:pStyle w:val="725"/>
         <w:pBdr/>
         <w:spacing/>
         <w:ind/>
@@ -835,14 +835,14 @@
       <w:hyperlink r:id="rId10" w:tooltip="https://eyes.nasa.gov/apps/orrery/#/home." w:history="1">
         <w:r>
           <w:rPr>
-            <w:rStyle w:val="877"/>
+            <w:rStyle w:val="879"/>
             <w:highlight w:val="none"/>
           </w:rPr>
           <w:t xml:space="preserve">https://eyes.nasa.gov/apps/orrery/#/home</w:t>
         </w:r>
         <w:r>
           <w:rPr>
-            <w:rStyle w:val="877"/>
+            <w:rStyle w:val="879"/>
             <w:highlight w:val="none"/>
           </w:rPr>
           <w:t xml:space="preserve">.</w:t>
@@ -919,20 +919,20 @@
       <w:hyperlink r:id="rId11" w:tooltip="https://phet.colorado.edu/sims/html/my-solar-system/latest/my-solar-system_all.html" w:history="1">
         <w:r>
           <w:rPr>
-            <w:rStyle w:val="877"/>
+            <w:rStyle w:val="879"/>
             <w:highlight w:val="none"/>
           </w:rPr>
           <w:t xml:space="preserve">https://phet.colorado.edu/sims/html/my-solar-system/latest/my-solar-system_all.html</w:t>
         </w:r>
         <w:r>
           <w:rPr>
-            <w:rStyle w:val="877"/>
+            <w:rStyle w:val="879"/>
             <w:highlight w:val="none"/>
           </w:rPr>
         </w:r>
         <w:r>
           <w:rPr>
-            <w:rStyle w:val="877"/>
+            <w:rStyle w:val="879"/>
             <w:highlight w:val="none"/>
           </w:rPr>
         </w:r>
@@ -1655,7 +1655,7 @@
     </w:p>
     <w:p>
       <w:pPr>
-        <w:pStyle w:val="899"/>
+        <w:pStyle w:val="901"/>
         <w:numPr>
           <w:ilvl w:val="0"/>
           <w:numId w:val="2"/>
@@ -1686,7 +1686,7 @@
     </w:p>
     <w:p>
       <w:pPr>
-        <w:pStyle w:val="899"/>
+        <w:pStyle w:val="901"/>
         <w:numPr>
           <w:ilvl w:val="0"/>
           <w:numId w:val="2"/>
@@ -1717,7 +1717,7 @@
     </w:p>
     <w:p>
       <w:pPr>
-        <w:pStyle w:val="899"/>
+        <w:pStyle w:val="901"/>
         <w:numPr>
           <w:ilvl w:val="0"/>
           <w:numId w:val="2"/>
@@ -1748,7 +1748,7 @@
     </w:p>
     <w:p>
       <w:pPr>
-        <w:pStyle w:val="899"/>
+        <w:pStyle w:val="901"/>
         <w:numPr>
           <w:ilvl w:val="0"/>
           <w:numId w:val="2"/>
@@ -1779,7 +1779,7 @@
     </w:p>
     <w:p>
       <w:pPr>
-        <w:pStyle w:val="899"/>
+        <w:pStyle w:val="901"/>
         <w:numPr>
           <w:ilvl w:val="0"/>
           <w:numId w:val="2"/>
@@ -2000,7 +2000,7 @@
     </w:p>
     <w:p>
       <w:pPr>
-        <w:pStyle w:val="721"/>
+        <w:pStyle w:val="723"/>
         <w:pBdr/>
         <w:spacing/>
         <w:ind/>
@@ -2028,7 +2028,7 @@
     </w:p>
     <w:p>
       <w:pPr>
-        <w:pStyle w:val="723"/>
+        <w:pStyle w:val="725"/>
         <w:pBdr/>
         <w:spacing/>
         <w:ind/>
@@ -2071,29 +2071,29 @@
       <w:hyperlink r:id="rId12" w:tooltip="https://eyes.nasa.gov/apps/orrery/#/home" w:history="1">
         <w:r>
           <w:rPr>
-            <w:rStyle w:val="877"/>
+            <w:rStyle w:val="879"/>
             <w:highlight w:val="none"/>
           </w:rPr>
           <w:t xml:space="preserve">https://eyes.nasa.gov/apps/orrery/#/home</w:t>
         </w:r>
         <w:r>
           <w:rPr>
-            <w:rStyle w:val="877"/>
+            <w:rStyle w:val="879"/>
           </w:rPr>
         </w:r>
         <w:r>
           <w:rPr>
-            <w:rStyle w:val="877"/>
+            <w:rStyle w:val="879"/>
           </w:rPr>
         </w:r>
         <w:r>
           <w:rPr>
-            <w:rStyle w:val="877"/>
+            <w:rStyle w:val="879"/>
           </w:rPr>
         </w:r>
         <w:r>
           <w:rPr>
-            <w:rStyle w:val="877"/>
+            <w:rStyle w:val="879"/>
           </w:rPr>
         </w:r>
       </w:hyperlink>
@@ -2310,7 +2310,7 @@
     </w:p>
     <w:p>
       <w:pPr>
-        <w:pStyle w:val="723"/>
+        <w:pStyle w:val="725"/>
         <w:pBdr/>
         <w:spacing/>
         <w:ind/>
@@ -2349,18 +2349,18 @@
       <w:hyperlink r:id="rId14" w:tooltip="https://phet.colorado.edu/sims/html/my-solar-system/latest/my-solar-system_all.html" w:history="1">
         <w:r>
           <w:rPr>
-            <w:rStyle w:val="877"/>
+            <w:rStyle w:val="879"/>
           </w:rPr>
           <w:t xml:space="preserve">https://phet.colorado.edu/sims/html/my-solar-system/latest/my-solar-system_all.html</w:t>
         </w:r>
         <w:r>
           <w:rPr>
-            <w:rStyle w:val="877"/>
+            <w:rStyle w:val="879"/>
           </w:rPr>
         </w:r>
         <w:r>
           <w:rPr>
-            <w:rStyle w:val="877"/>
+            <w:rStyle w:val="879"/>
           </w:rPr>
         </w:r>
       </w:hyperlink>
@@ -2551,7 +2551,7 @@
     </w:p>
     <w:p>
       <w:pPr>
-        <w:pStyle w:val="721"/>
+        <w:pStyle w:val="723"/>
         <w:pBdr/>
         <w:spacing/>
         <w:ind/>
@@ -2628,7 +2628,7 @@
     </w:p>
     <w:p>
       <w:pPr>
-        <w:pStyle w:val="899"/>
+        <w:pStyle w:val="901"/>
         <w:numPr>
           <w:ilvl w:val="0"/>
           <w:numId w:val="3"/>
@@ -2645,7 +2645,7 @@
     </w:p>
     <w:p>
       <w:pPr>
-        <w:pStyle w:val="899"/>
+        <w:pStyle w:val="901"/>
         <w:numPr>
           <w:ilvl w:val="0"/>
           <w:numId w:val="3"/>
@@ -2670,7 +2670,7 @@
     </w:p>
     <w:p>
       <w:pPr>
-        <w:pStyle w:val="899"/>
+        <w:pStyle w:val="901"/>
         <w:numPr>
           <w:ilvl w:val="0"/>
           <w:numId w:val="3"/>
@@ -2695,7 +2695,7 @@
     </w:p>
     <w:p>
       <w:pPr>
-        <w:pStyle w:val="899"/>
+        <w:pStyle w:val="901"/>
         <w:numPr>
           <w:ilvl w:val="0"/>
           <w:numId w:val="3"/>
@@ -2730,7 +2730,7 @@
     </w:p>
     <w:p>
       <w:pPr>
-        <w:pStyle w:val="721"/>
+        <w:pStyle w:val="723"/>
         <w:pBdr/>
         <w:spacing/>
         <w:ind/>
@@ -2758,7 +2758,7 @@
     </w:p>
     <w:p>
       <w:pPr>
-        <w:pStyle w:val="723"/>
+        <w:pStyle w:val="725"/>
         <w:pBdr/>
         <w:spacing/>
         <w:ind/>
@@ -2977,7 +2977,7 @@
     </w:p>
     <w:p>
       <w:pPr>
-        <w:pStyle w:val="723"/>
+        <w:pStyle w:val="725"/>
         <w:pBdr/>
         <w:spacing/>
         <w:ind/>
@@ -3029,18 +3029,18 @@
       <w:hyperlink r:id="rId17" w:tooltip="https://ssd.jpl.nasa.gov/horizons/" w:history="1">
         <w:r>
           <w:rPr>
-            <w:rStyle w:val="877"/>
+            <w:rStyle w:val="879"/>
           </w:rPr>
           <w:t xml:space="preserve">https://ssd.jpl.nasa.gov/horizons/</w:t>
         </w:r>
         <w:r>
           <w:rPr>
-            <w:rStyle w:val="877"/>
+            <w:rStyle w:val="879"/>
           </w:rPr>
         </w:r>
         <w:r>
           <w:rPr>
-            <w:rStyle w:val="877"/>
+            <w:rStyle w:val="879"/>
           </w:rPr>
         </w:r>
       </w:hyperlink>
@@ -3162,7 +3162,7 @@
       <w:hyperlink r:id="rId18" w:tooltip="https://ssd.jpl.nasa.gov/api/horizons.api?format=text&amp;COMMAND='&quot;+target+&quot;'&amp;OBJ_DATA='YES'&amp;MAKE_EPHEM='YES'&amp;EPHEM_TYPE='VECTORS'&amp;START_TIME='&quot;+startTime+&quot;'&amp;STOP_TIME='&quot;+stopTime+&quot;'&amp;CENTER='500@0'&amp;STEP_SIZE='1 d'&amp;QUANTITIES='1,9,20,23,24,29'" w:history="1">
         <w:r>
           <w:rPr>
-            <w:rStyle w:val="877"/>
+            <w:rStyle w:val="879"/>
             <w:color w:val="000000" w:themeColor="text1"/>
             <w:sz w:val="22"/>
             <w:szCs w:val="18"/>
@@ -3172,7 +3172,7 @@
         </w:r>
         <w:r>
           <w:rPr>
-            <w:rStyle w:val="877"/>
+            <w:rStyle w:val="879"/>
             <w:color w:val="000000" w:themeColor="text1"/>
             <w:sz w:val="22"/>
             <w:szCs w:val="18"/>
@@ -3181,7 +3181,7 @@
         </w:r>
         <w:r>
           <w:rPr>
-            <w:rStyle w:val="877"/>
+            <w:rStyle w:val="879"/>
             <w:color w:val="000000" w:themeColor="text1"/>
             <w:sz w:val="22"/>
             <w:szCs w:val="18"/>
@@ -3322,7 +3322,7 @@
       <w:hyperlink r:id="rId19" w:tooltip="https://ssd-api.jpl.nasa.gov/doc/horizons.html#ephem_type" w:history="1">
         <w:r>
           <w:rPr>
-            <w:rStyle w:val="877"/>
+            <w:rStyle w:val="879"/>
             <w:color w:val="000000" w:themeColor="text1"/>
             <w:sz w:val="22"/>
             <w:szCs w:val="22"/>
@@ -3332,7 +3332,7 @@
         </w:r>
         <w:r>
           <w:rPr>
-            <w:rStyle w:val="877"/>
+            <w:rStyle w:val="879"/>
             <w:color w:val="000000" w:themeColor="text1"/>
             <w:sz w:val="22"/>
             <w:szCs w:val="22"/>
@@ -3341,7 +3341,7 @@
         </w:r>
         <w:r>
           <w:rPr>
-            <w:rStyle w:val="877"/>
+            <w:rStyle w:val="879"/>
             <w:color w:val="000000" w:themeColor="text1"/>
             <w:sz w:val="22"/>
             <w:szCs w:val="22"/>
@@ -3754,7 +3754,7 @@
     </w:p>
     <w:p>
       <w:pPr>
-        <w:pStyle w:val="723"/>
+        <w:pStyle w:val="725"/>
         <w:pBdr/>
         <w:spacing/>
         <w:ind/>
@@ -3803,7 +3803,7 @@
     </w:p>
     <w:p>
       <w:pPr>
-        <w:pStyle w:val="723"/>
+        <w:pStyle w:val="725"/>
         <w:pBdr/>
         <w:spacing/>
         <w:ind/>
@@ -3834,7 +3834,7 @@
     </w:p>
     <w:p>
       <w:pPr>
-        <w:pStyle w:val="723"/>
+        <w:pStyle w:val="725"/>
         <w:pBdr/>
         <w:spacing/>
         <w:ind/>
@@ -3866,7 +3866,7 @@
     </w:p>
     <w:p>
       <w:pPr>
-        <w:pStyle w:val="723"/>
+        <w:pStyle w:val="725"/>
         <w:pBdr/>
         <w:spacing/>
         <w:ind/>
@@ -5928,7 +5928,7 @@
     </w:p>
     <w:p>
       <w:pPr>
-        <w:pStyle w:val="723"/>
+        <w:pStyle w:val="725"/>
         <w:pBdr/>
         <w:spacing/>
         <w:ind/>
@@ -6088,7 +6088,7 @@
             <m:accPr>
               <m:ctrlPr>
                 <w:rPr>
-                  <w:rFonts w:hint="default" w:ascii="Cambria Math" w:hAnsi="Cambria Math" w:eastAsia="Cambria Math" w:cs="Cambria Math"/>
+                  <w:rFonts w:ascii="Cambria Math" w:hAnsi="Cambria Math" w:eastAsia="Cambria Math" w:cs="Cambria Math"/>
                   <w:i/>
                 </w:rPr>
               </m:ctrlPr>
@@ -6218,7 +6218,7 @@
           <m:accPr>
             <m:ctrlPr>
               <w:rPr>
-                <w:rFonts w:hint="default" w:ascii="Cambria Math" w:hAnsi="Cambria Math" w:eastAsia="Cambria Math" w:cs="Cambria Math"/>
+                <w:rFonts w:ascii="Cambria Math" w:hAnsi="Cambria Math" w:eastAsia="Cambria Math" w:cs="Cambria Math"/>
                 <w:i/>
               </w:rPr>
             </m:ctrlPr>
@@ -6423,7 +6423,7 @@
           <m:accPr>
             <m:ctrlPr>
               <w:rPr>
-                <w:rFonts w:hint="default" w:ascii="Cambria Math" w:hAnsi="Cambria Math" w:eastAsia="Cambria Math" w:cs="Cambria Math"/>
+                <w:rFonts w:ascii="Cambria Math" w:hAnsi="Cambria Math" w:eastAsia="Cambria Math" w:cs="Cambria Math"/>
                 <w:i/>
               </w:rPr>
             </m:ctrlPr>
@@ -6452,7 +6452,7 @@
           <m:accPr>
             <m:ctrlPr>
               <w:rPr>
-                <w:rFonts w:hint="default" w:ascii="Cambria Math" w:hAnsi="Cambria Math" w:eastAsia="Cambria Math" w:cs="Cambria Math"/>
+                <w:rFonts w:ascii="Cambria Math" w:hAnsi="Cambria Math" w:eastAsia="Cambria Math" w:cs="Cambria Math"/>
                 <w:i/>
                 <w:highlight w:val="none"/>
               </w:rPr>
@@ -6549,7 +6549,7 @@
           <m:accPr>
             <m:ctrlPr>
               <w:rPr>
-                <w:rFonts w:hint="default" w:ascii="Cambria Math" w:hAnsi="Cambria Math" w:eastAsia="Cambria Math" w:cs="Cambria Math"/>
+                <w:rFonts w:ascii="Cambria Math" w:hAnsi="Cambria Math" w:eastAsia="Cambria Math" w:cs="Cambria Math"/>
                 <w:i/>
               </w:rPr>
             </m:ctrlPr>
@@ -6568,7 +6568,10 @@
         </m:acc>
       </m:oMath>
       <w:r>
-        <w:t xml:space="preserve"> for that planet and all the other bodies in the system. We then add those forces up (some may be negative and cancel each other out) to get the resultant force. This is then given to F = ma, and the acceleration from that is given to Verlet integration. Note that we must </w:t>
+        <w:t xml:space="preserve"> for that planet </w:t>
+      </w:r>
+      <w:r>
+        <w:t xml:space="preserve">and all the other bodies in the system. We then add those forces up (some may be negative and cancel each other out) to get the resultant force. This is then given to F = ma, and the acceleration from that is given to Verlet integration. Note that we must </w:t>
       </w:r>
       <w:r>
         <w:rPr>
@@ -6743,7 +6746,7 @@
     </w:p>
     <w:p>
       <w:pPr>
-        <w:pStyle w:val="723"/>
+        <w:pStyle w:val="725"/>
         <w:pBdr/>
         <w:spacing/>
         <w:ind/>
@@ -6788,11 +6791,15 @@
           <w:highlight w:val="none"/>
         </w:rPr>
       </w:r>
-      <w:r/>
+      <w:r>
+        <w:rPr>
+          <w:highlight w:val="none"/>
+        </w:rPr>
+      </w:r>
     </w:p>
     <w:p>
       <w:pPr>
-        <w:pStyle w:val="899"/>
+        <w:pStyle w:val="901"/>
         <w:numPr>
           <w:ilvl w:val="0"/>
           <w:numId w:val="8"/>
@@ -6813,10 +6820,11 @@
           <w:highlight w:val="none"/>
         </w:rPr>
       </w:r>
+      <w:r/>
     </w:p>
     <w:p>
       <w:pPr>
-        <w:pStyle w:val="899"/>
+        <w:pStyle w:val="901"/>
         <w:numPr>
           <w:ilvl w:val="0"/>
           <w:numId w:val="8"/>
@@ -6837,10 +6845,11 @@
           <w:highlight w:val="none"/>
         </w:rPr>
       </w:r>
+      <w:r/>
     </w:p>
     <w:p>
       <w:pPr>
-        <w:pStyle w:val="899"/>
+        <w:pStyle w:val="901"/>
         <w:numPr>
           <w:ilvl w:val="0"/>
           <w:numId w:val="8"/>
@@ -6861,6 +6870,7 @@
           <w:highlight w:val="none"/>
         </w:rPr>
       </w:r>
+      <w:r/>
     </w:p>
     <w:p>
       <w:pPr>
@@ -6875,7 +6885,18 @@
         <w:rPr>
           <w:highlight w:val="none"/>
         </w:rPr>
-        <w:t xml:space="preserve">To find the magnitude of a vector you simply square each element, add them up, and then take the square root. E.g. if we have the vector (1, 2, 2) then the magnitude is sqrt(1²+2²+2²)=sqrt(1+4+4)=sqrt(9)=3. This is needed to find “r” in the gravity equation, as the distance between two planets is the magnitude of the vector between them.</w:t>
+        <w:t xml:space="preserve">To find the magnitude of a vector you simply square each element, add them up, and </w:t>
+      </w:r>
+      <w:r>
+        <w:rPr>
+          <w:highlight w:val="none"/>
+        </w:rPr>
+        <w:t xml:space="preserve">then take the square root. E.g. if we have the vector (1, 2, 2) then the magnitude is sqrt(1²+2²+2²)=sqrt(1+4+4)=sqrt(9)=3. This is needed to find “r” in the gravity equation, as the distance between two planets is the magnitude of the vector between them.</w:t>
+      </w:r>
+      <w:r>
+        <w:rPr>
+          <w:highlight w:val="none"/>
+        </w:rPr>
       </w:r>
       <w:r>
         <w:rPr>
@@ -6908,7 +6929,7 @@
           <m:accPr>
             <m:ctrlPr>
               <w:rPr>
-                <w:rFonts w:hint="default" w:ascii="Cambria Math" w:hAnsi="Cambria Math" w:eastAsia="Cambria Math" w:cs="Cambria Math"/>
+                <w:rFonts w:ascii="Cambria Math" w:hAnsi="Cambria Math" w:eastAsia="Cambria Math" w:cs="Cambria Math"/>
                 <w:i/>
                 <w:highlight w:val="none"/>
               </w:rPr>
@@ -6939,6 +6960,11 @@
           <w:highlight w:val="none"/>
         </w:rPr>
       </w:r>
+      <w:r>
+        <w:rPr>
+          <w:highlight w:val="none"/>
+        </w:rPr>
+      </w:r>
     </w:p>
     <w:p>
       <w:pPr>
@@ -6953,12 +6979,13 @@
         <w:rPr>
           <w:highlight w:val="none"/>
         </w:rPr>
-        <w:t xml:space="preserve">To find a perpendicular to a 2d vector you swap the elements around and negate one of them. So e.g. the two perpendiculars to (1,2) would be (-2,1) and (2,-1). It is arbitrary which you negate so I will just negate the first element. This is needed to draw arrows, the two lines at the end of the arrow need to lie on a perpendicular to the main line of the arrow. This will be explained more in the design, drawing arrows is surprisingly technical.</w:t>
-      </w:r>
-      <w:r>
-        <w:rPr>
-          <w:highlight w:val="none"/>
-        </w:rPr>
+        <w:t xml:space="preserve">To find a perpendicular to a 2d vector you swap the elements around and negate one of them. So e.g. the two perpendiculars to (1,2) would be (-2,1) and (2,-1). It is arbitrary which you negate </w:t>
+      </w:r>
+      <w:r>
+        <w:rPr>
+          <w:highlight w:val="none"/>
+        </w:rPr>
+        <w:t xml:space="preserve">so I will just negate the first element. This is needed to draw arrows, the two lines at the end of the arrow need to lie on a perpendicular to the main line of the arrow. This will be explained more in the design, drawing arrows is surprisingly technical.</w:t>
       </w:r>
       <w:r>
         <w:rPr>
@@ -6968,7 +6995,25 @@
       </w:r>
       <w:r>
         <w:rPr>
-          <w:color w:val="4472c4" w:themeColor="accent5"/>
+          <w:highlight w:val="none"/>
+        </w:rPr>
+      </w:r>
+    </w:p>
+    <w:p>
+      <w:pPr>
+        <w:pBdr/>
+        <w:spacing/>
+        <w:ind/>
+        <w:rPr/>
+      </w:pPr>
+      <w:r>
+        <w:rPr>
+          <w:highlight w:val="none"/>
+        </w:rPr>
+        <w:t xml:space="preserve">These operations will be put in a separate file so they can be imported as a module.</w:t>
+      </w:r>
+      <w:r>
+        <w:rPr>
           <w:highlight w:val="none"/>
         </w:rPr>
       </w:r>
@@ -6976,26 +7021,7 @@
     </w:p>
     <w:p>
       <w:pPr>
-        <w:pBdr/>
-        <w:spacing/>
-        <w:ind/>
-        <w:rPr/>
-      </w:pPr>
-      <w:r>
-        <w:rPr>
-          <w:highlight w:val="none"/>
-        </w:rPr>
-        <w:t xml:space="preserve">These operations will be put in a separate file so they can be imported as a module.</w:t>
-      </w:r>
-      <w:r>
-        <w:rPr>
-          <w:highlight w:val="none"/>
-        </w:rPr>
-      </w:r>
-    </w:p>
-    <w:p>
-      <w:pPr>
-        <w:pStyle w:val="723"/>
+        <w:pStyle w:val="725"/>
         <w:pBdr/>
         <w:spacing/>
         <w:ind/>
@@ -7569,7 +7595,7 @@
     </w:p>
     <w:p>
       <w:pPr>
-        <w:pStyle w:val="723"/>
+        <w:pStyle w:val="725"/>
         <w:pBdr/>
         <w:spacing/>
         <w:ind/>
@@ -8155,7 +8181,7 @@
     </w:p>
     <w:p>
       <w:pPr>
-        <w:pStyle w:val="723"/>
+        <w:pStyle w:val="725"/>
         <w:pBdr/>
         <w:spacing/>
         <w:ind/>
@@ -8184,7 +8210,7 @@
     </w:p>
     <w:p>
       <w:pPr>
-        <w:pStyle w:val="899"/>
+        <w:pStyle w:val="901"/>
         <w:numPr>
           <w:ilvl w:val="0"/>
           <w:numId w:val="7"/>
@@ -8201,7 +8227,7 @@
     </w:p>
     <w:p>
       <w:pPr>
-        <w:pStyle w:val="899"/>
+        <w:pStyle w:val="901"/>
         <w:numPr>
           <w:ilvl w:val="1"/>
           <w:numId w:val="7"/>
@@ -8226,7 +8252,7 @@
     </w:p>
     <w:p>
       <w:pPr>
-        <w:pStyle w:val="899"/>
+        <w:pStyle w:val="901"/>
         <w:numPr>
           <w:ilvl w:val="2"/>
           <w:numId w:val="7"/>
@@ -8251,7 +8277,7 @@
     </w:p>
     <w:p>
       <w:pPr>
-        <w:pStyle w:val="899"/>
+        <w:pStyle w:val="901"/>
         <w:numPr>
           <w:ilvl w:val="2"/>
           <w:numId w:val="7"/>
@@ -8272,10 +8298,11 @@
           <w:highlight w:val="none"/>
         </w:rPr>
       </w:r>
+      <w:r/>
     </w:p>
     <w:p>
       <w:pPr>
-        <w:pStyle w:val="899"/>
+        <w:pStyle w:val="901"/>
         <w:numPr>
           <w:ilvl w:val="1"/>
           <w:numId w:val="7"/>
@@ -8300,7 +8327,7 @@
     </w:p>
     <w:p>
       <w:pPr>
-        <w:pStyle w:val="899"/>
+        <w:pStyle w:val="901"/>
         <w:numPr>
           <w:ilvl w:val="2"/>
           <w:numId w:val="7"/>
@@ -8325,7 +8352,7 @@
     </w:p>
     <w:p>
       <w:pPr>
-        <w:pStyle w:val="899"/>
+        <w:pStyle w:val="901"/>
         <w:numPr>
           <w:ilvl w:val="1"/>
           <w:numId w:val="7"/>
@@ -8345,7 +8372,7 @@
     </w:p>
     <w:p>
       <w:pPr>
-        <w:pStyle w:val="899"/>
+        <w:pStyle w:val="901"/>
         <w:numPr>
           <w:ilvl w:val="0"/>
           <w:numId w:val="7"/>
@@ -8370,7 +8397,7 @@
     </w:p>
     <w:p>
       <w:pPr>
-        <w:pStyle w:val="899"/>
+        <w:pStyle w:val="901"/>
         <w:numPr>
           <w:ilvl w:val="1"/>
           <w:numId w:val="7"/>
@@ -8391,10 +8418,11 @@
           <w:highlight w:val="none"/>
         </w:rPr>
       </w:r>
+      <w:r/>
     </w:p>
     <w:p>
       <w:pPr>
-        <w:pStyle w:val="899"/>
+        <w:pStyle w:val="901"/>
         <w:numPr>
           <w:ilvl w:val="1"/>
           <w:numId w:val="7"/>
@@ -8419,7 +8447,7 @@
     </w:p>
     <w:p>
       <w:pPr>
-        <w:pStyle w:val="899"/>
+        <w:pStyle w:val="901"/>
         <w:numPr>
           <w:ilvl w:val="2"/>
           <w:numId w:val="7"/>
@@ -8444,7 +8472,7 @@
     </w:p>
     <w:p>
       <w:pPr>
-        <w:pStyle w:val="899"/>
+        <w:pStyle w:val="901"/>
         <w:numPr>
           <w:ilvl w:val="2"/>
           <w:numId w:val="7"/>
@@ -8469,7 +8497,7 @@
     </w:p>
     <w:p>
       <w:pPr>
-        <w:pStyle w:val="899"/>
+        <w:pStyle w:val="901"/>
         <w:numPr>
           <w:ilvl w:val="1"/>
           <w:numId w:val="7"/>
@@ -8494,7 +8522,7 @@
     </w:p>
     <w:p>
       <w:pPr>
-        <w:pStyle w:val="899"/>
+        <w:pStyle w:val="901"/>
         <w:numPr>
           <w:ilvl w:val="2"/>
           <w:numId w:val="7"/>
@@ -8508,7 +8536,7 @@
         <w:rPr>
           <w:highlight w:val="none"/>
         </w:rPr>
-        <w:t xml:space="preserve">Should display total energy and momentum</w:t>
+        <w:t xml:space="preserve">Should display kinetic, potential and total energy, and momentum</w:t>
       </w:r>
       <w:r>
         <w:rPr>
@@ -8519,7 +8547,7 @@
     </w:p>
     <w:p>
       <w:pPr>
-        <w:pStyle w:val="899"/>
+        <w:pStyle w:val="901"/>
         <w:numPr>
           <w:ilvl w:val="2"/>
           <w:numId w:val="7"/>
@@ -8544,7 +8572,7 @@
     </w:p>
     <w:p>
       <w:pPr>
-        <w:pStyle w:val="899"/>
+        <w:pStyle w:val="901"/>
         <w:numPr>
           <w:ilvl w:val="3"/>
           <w:numId w:val="7"/>
@@ -8569,7 +8597,7 @@
     </w:p>
     <w:p>
       <w:pPr>
-        <w:pStyle w:val="899"/>
+        <w:pStyle w:val="901"/>
         <w:numPr>
           <w:ilvl w:val="3"/>
           <w:numId w:val="7"/>
@@ -8594,7 +8622,7 @@
     </w:p>
     <w:p>
       <w:pPr>
-        <w:pStyle w:val="899"/>
+        <w:pStyle w:val="901"/>
         <w:numPr>
           <w:ilvl w:val="3"/>
           <w:numId w:val="7"/>
@@ -8619,7 +8647,7 @@
     </w:p>
     <w:p>
       <w:pPr>
-        <w:pStyle w:val="899"/>
+        <w:pStyle w:val="901"/>
         <w:numPr>
           <w:ilvl w:val="2"/>
           <w:numId w:val="7"/>
@@ -8644,7 +8672,7 @@
     </w:p>
     <w:p>
       <w:pPr>
-        <w:pStyle w:val="899"/>
+        <w:pStyle w:val="901"/>
         <w:numPr>
           <w:ilvl w:val="2"/>
           <w:numId w:val="7"/>
@@ -8658,18 +8686,17 @@
         <w:rPr>
           <w:highlight w:val="none"/>
         </w:rPr>
-        <w:t xml:space="preserve">Should let users edit the value of G</w:t>
-      </w:r>
-      <w:r>
-        <w:rPr>
-          <w:highlight w:val="none"/>
-        </w:rPr>
-      </w:r>
-      <w:r/>
+        <w:t xml:space="preserve">Users should be able to press “A” to enter a mode where they can edit attributes</w:t>
+      </w:r>
+      <w:r>
+        <w:rPr>
+          <w:highlight w:val="none"/>
+        </w:rPr>
+      </w:r>
     </w:p>
     <w:p>
       <w:pPr>
-        <w:pStyle w:val="899"/>
+        <w:pStyle w:val="901"/>
         <w:numPr>
           <w:ilvl w:val="3"/>
           <w:numId w:val="7"/>
@@ -8683,7 +8710,7 @@
         <w:rPr>
           <w:highlight w:val="none"/>
         </w:rPr>
-        <w:t xml:space="preserve">G should never become 0 or negative, this would cause a lot of severe bugs due to the way the maths of gravity works. Hence a logarithmic scale will be used so that G can get closer and closer to 0 but never reach it</w:t>
+        <w:t xml:space="preserve">Should let users edit the value of G</w:t>
       </w:r>
       <w:r>
         <w:rPr>
@@ -8694,9 +8721,9 @@
     </w:p>
     <w:p>
       <w:pPr>
-        <w:pStyle w:val="899"/>
+        <w:pStyle w:val="901"/>
         <w:numPr>
-          <w:ilvl w:val="2"/>
+          <w:ilvl w:val="4"/>
           <w:numId w:val="7"/>
         </w:numPr>
         <w:pBdr/>
@@ -8708,7 +8735,7 @@
         <w:rPr>
           <w:highlight w:val="none"/>
         </w:rPr>
-        <w:t xml:space="preserve">Should let users edit the mass of planets</w:t>
+        <w:t xml:space="preserve">G should never become 0 or negative, this would cause a lot of severe bugs due to the way the maths of gravity works. Hence a logarithmic scale will be used so that G can get closer and closer to 0 but never reach it</w:t>
       </w:r>
       <w:r>
         <w:rPr>
@@ -8719,7 +8746,7 @@
     </w:p>
     <w:p>
       <w:pPr>
-        <w:pStyle w:val="899"/>
+        <w:pStyle w:val="901"/>
         <w:numPr>
           <w:ilvl w:val="3"/>
           <w:numId w:val="7"/>
@@ -8733,7 +8760,7 @@
         <w:rPr>
           <w:highlight w:val="none"/>
         </w:rPr>
-        <w:t xml:space="preserve">Once again this shouldn’t become negative</w:t>
+        <w:t xml:space="preserve">Should let users edit the mass of planets</w:t>
       </w:r>
       <w:r>
         <w:rPr>
@@ -8744,7 +8771,32 @@
     </w:p>
     <w:p>
       <w:pPr>
-        <w:pStyle w:val="899"/>
+        <w:pStyle w:val="901"/>
+        <w:numPr>
+          <w:ilvl w:val="4"/>
+          <w:numId w:val="7"/>
+        </w:numPr>
+        <w:pBdr/>
+        <w:spacing/>
+        <w:ind/>
+        <w:rPr/>
+      </w:pPr>
+      <w:r>
+        <w:rPr>
+          <w:highlight w:val="none"/>
+        </w:rPr>
+        <w:t xml:space="preserve">Once again this shouldn’t become negative</w:t>
+      </w:r>
+      <w:r>
+        <w:rPr>
+          <w:highlight w:val="none"/>
+        </w:rPr>
+      </w:r>
+      <w:r/>
+    </w:p>
+    <w:p>
+      <w:pPr>
+        <w:pStyle w:val="901"/>
         <w:numPr>
           <w:ilvl w:val="1"/>
           <w:numId w:val="7"/>
@@ -8769,7 +8821,7 @@
     </w:p>
     <w:p>
       <w:pPr>
-        <w:pStyle w:val="899"/>
+        <w:pStyle w:val="901"/>
         <w:numPr>
           <w:ilvl w:val="0"/>
           <w:numId w:val="7"/>
@@ -8789,7 +8841,7 @@
     </w:p>
     <w:p>
       <w:pPr>
-        <w:pStyle w:val="899"/>
+        <w:pStyle w:val="901"/>
         <w:numPr>
           <w:ilvl w:val="1"/>
           <w:numId w:val="7"/>
@@ -8814,7 +8866,7 @@
     </w:p>
     <w:p>
       <w:pPr>
-        <w:pStyle w:val="899"/>
+        <w:pStyle w:val="901"/>
         <w:numPr>
           <w:ilvl w:val="1"/>
           <w:numId w:val="7"/>
@@ -8839,7 +8891,7 @@
     </w:p>
     <w:p>
       <w:pPr>
-        <w:pStyle w:val="899"/>
+        <w:pStyle w:val="901"/>
         <w:numPr>
           <w:ilvl w:val="1"/>
           <w:numId w:val="7"/>
@@ -8864,7 +8916,7 @@
     </w:p>
     <w:p>
       <w:pPr>
-        <w:pStyle w:val="899"/>
+        <w:pStyle w:val="901"/>
         <w:numPr>
           <w:ilvl w:val="1"/>
           <w:numId w:val="7"/>
@@ -8889,7 +8941,7 @@
     </w:p>
     <w:p>
       <w:pPr>
-        <w:pStyle w:val="899"/>
+        <w:pStyle w:val="901"/>
         <w:numPr>
           <w:ilvl w:val="0"/>
           <w:numId w:val="7"/>
@@ -8914,7 +8966,31 @@
     </w:p>
     <w:p>
       <w:pPr>
-        <w:pStyle w:val="899"/>
+        <w:pStyle w:val="901"/>
+        <w:numPr>
+          <w:ilvl w:val="1"/>
+          <w:numId w:val="7"/>
+        </w:numPr>
+        <w:pBdr/>
+        <w:spacing/>
+        <w:ind/>
+        <w:rPr/>
+      </w:pPr>
+      <w:r>
+        <w:rPr>
+          <w:highlight w:val="none"/>
+        </w:rPr>
+        <w:t xml:space="preserve">The menu should work slightly differently here and display info on both planets being compared, instead of displaying info on one planet and then displaying info about energies and momentum.</w:t>
+      </w:r>
+      <w:r>
+        <w:rPr>
+          <w:highlight w:val="none"/>
+        </w:rPr>
+      </w:r>
+    </w:p>
+    <w:p>
+      <w:pPr>
+        <w:pStyle w:val="901"/>
         <w:numPr>
           <w:ilvl w:val="0"/>
           <w:numId w:val="7"/>
@@ -8939,7 +9015,7 @@
     </w:p>
     <w:p>
       <w:pPr>
-        <w:pStyle w:val="899"/>
+        <w:pStyle w:val="901"/>
         <w:numPr>
           <w:ilvl w:val="1"/>
           <w:numId w:val="7"/>
@@ -8964,7 +9040,7 @@
     </w:p>
     <w:p>
       <w:pPr>
-        <w:pStyle w:val="899"/>
+        <w:pStyle w:val="901"/>
         <w:numPr>
           <w:ilvl w:val="1"/>
           <w:numId w:val="7"/>
@@ -8989,7 +9065,7 @@
     </w:p>
     <w:p>
       <w:pPr>
-        <w:pStyle w:val="899"/>
+        <w:pStyle w:val="901"/>
         <w:numPr>
           <w:ilvl w:val="0"/>
           <w:numId w:val="7"/>
@@ -10373,9 +10449,9 @@
     <w:lsdException w:name="Bibliography" w:uiPriority="37"/>
     <w:lsdException w:name="TOC Heading" w:uiPriority="39" w:qFormat="1"/>
   </w:latentStyles>
-  <w:style w:type="character" w:styleId="711">
+  <w:style w:type="character" w:styleId="713">
     <w:name w:val="Intense Emphasis"/>
-    <w:basedOn w:val="900"/>
+    <w:basedOn w:val="902"/>
     <w:uiPriority w:val="21"/>
     <w:qFormat/>
     <w:pPr>
@@ -10389,9 +10465,9 @@
       <w:color w:val="0f4761" w:themeColor="accent1" w:themeShade="BF"/>
     </w:rPr>
   </w:style>
-  <w:style w:type="character" w:styleId="712">
+  <w:style w:type="character" w:styleId="714">
     <w:name w:val="Intense Reference"/>
-    <w:basedOn w:val="900"/>
+    <w:basedOn w:val="902"/>
     <w:uiPriority w:val="32"/>
     <w:qFormat/>
     <w:pPr>
@@ -10407,9 +10483,9 @@
       <w:spacing w:val="5"/>
     </w:rPr>
   </w:style>
-  <w:style w:type="character" w:styleId="713">
+  <w:style w:type="character" w:styleId="715">
     <w:name w:val="Subtle Emphasis"/>
-    <w:basedOn w:val="900"/>
+    <w:basedOn w:val="902"/>
     <w:uiPriority w:val="19"/>
     <w:qFormat/>
     <w:pPr>
@@ -10423,9 +10499,9 @@
       <w:color w:val="404040" w:themeColor="text1" w:themeTint="BF"/>
     </w:rPr>
   </w:style>
-  <w:style w:type="character" w:styleId="714">
+  <w:style w:type="character" w:styleId="716">
     <w:name w:val="Emphasis"/>
-    <w:basedOn w:val="900"/>
+    <w:basedOn w:val="902"/>
     <w:uiPriority w:val="20"/>
     <w:qFormat/>
     <w:pPr>
@@ -10438,9 +10514,9 @@
       <w:iCs/>
     </w:rPr>
   </w:style>
-  <w:style w:type="character" w:styleId="715">
+  <w:style w:type="character" w:styleId="717">
     <w:name w:val="Strong"/>
-    <w:basedOn w:val="900"/>
+    <w:basedOn w:val="902"/>
     <w:uiPriority w:val="22"/>
     <w:qFormat/>
     <w:pPr>
@@ -10453,9 +10529,9 @@
       <w:bCs/>
     </w:rPr>
   </w:style>
-  <w:style w:type="character" w:styleId="716">
+  <w:style w:type="character" w:styleId="718">
     <w:name w:val="Subtle Reference"/>
-    <w:basedOn w:val="900"/>
+    <w:basedOn w:val="902"/>
     <w:uiPriority w:val="31"/>
     <w:qFormat/>
     <w:pPr>
@@ -10468,9 +10544,9 @@
       <w:color w:val="5a5a5a" w:themeColor="text1" w:themeTint="A5"/>
     </w:rPr>
   </w:style>
-  <w:style w:type="character" w:styleId="717">
+  <w:style w:type="character" w:styleId="719">
     <w:name w:val="Book Title"/>
-    <w:basedOn w:val="900"/>
+    <w:basedOn w:val="902"/>
     <w:uiPriority w:val="33"/>
     <w:qFormat/>
     <w:pPr>
@@ -10486,9 +10562,9 @@
       <w:spacing w:val="5"/>
     </w:rPr>
   </w:style>
-  <w:style w:type="character" w:styleId="718">
+  <w:style w:type="character" w:styleId="720">
     <w:name w:val="FollowedHyperlink"/>
-    <w:basedOn w:val="900"/>
+    <w:basedOn w:val="902"/>
     <w:uiPriority w:val="99"/>
     <w:semiHidden/>
     <w:unhideWhenUsed/>
@@ -10502,11 +10578,11 @@
       <w:u w:val="single"/>
     </w:rPr>
   </w:style>
-  <w:style w:type="paragraph" w:styleId="719">
+  <w:style w:type="paragraph" w:styleId="721">
     <w:name w:val="Heading 1"/>
-    <w:basedOn w:val="895"/>
-    <w:next w:val="895"/>
-    <w:link w:val="720"/>
+    <w:basedOn w:val="897"/>
+    <w:next w:val="897"/>
+    <w:link w:val="722"/>
     <w:uiPriority w:val="9"/>
     <w:qFormat/>
     <w:pPr>
@@ -10523,9 +10599,9 @@
       <w:szCs w:val="40"/>
     </w:rPr>
   </w:style>
-  <w:style w:type="character" w:styleId="720">
+  <w:style w:type="character" w:styleId="722">
     <w:name w:val="Heading 1 Char"/>
-    <w:link w:val="719"/>
+    <w:link w:val="721"/>
     <w:uiPriority w:val="9"/>
     <w:pPr>
       <w:pBdr/>
@@ -10538,11 +10614,11 @@
       <w:szCs w:val="40"/>
     </w:rPr>
   </w:style>
-  <w:style w:type="paragraph" w:styleId="721">
+  <w:style w:type="paragraph" w:styleId="723">
     <w:name w:val="Heading 2"/>
-    <w:basedOn w:val="895"/>
-    <w:next w:val="895"/>
-    <w:link w:val="722"/>
+    <w:basedOn w:val="897"/>
+    <w:next w:val="897"/>
+    <w:link w:val="724"/>
     <w:uiPriority w:val="9"/>
     <w:unhideWhenUsed/>
     <w:qFormat/>
@@ -10559,9 +10635,9 @@
       <w:sz w:val="34"/>
     </w:rPr>
   </w:style>
-  <w:style w:type="character" w:styleId="722">
+  <w:style w:type="character" w:styleId="724">
     <w:name w:val="Heading 2 Char"/>
-    <w:link w:val="721"/>
+    <w:link w:val="723"/>
     <w:uiPriority w:val="9"/>
     <w:pPr>
       <w:pBdr/>
@@ -10573,11 +10649,11 @@
       <w:sz w:val="34"/>
     </w:rPr>
   </w:style>
-  <w:style w:type="paragraph" w:styleId="723">
+  <w:style w:type="paragraph" w:styleId="725">
     <w:name w:val="Heading 3"/>
-    <w:basedOn w:val="895"/>
-    <w:next w:val="895"/>
-    <w:link w:val="724"/>
+    <w:basedOn w:val="897"/>
+    <w:next w:val="897"/>
+    <w:link w:val="726"/>
     <w:uiPriority w:val="9"/>
     <w:unhideWhenUsed/>
     <w:qFormat/>
@@ -10595,9 +10671,9 @@
       <w:szCs w:val="30"/>
     </w:rPr>
   </w:style>
-  <w:style w:type="character" w:styleId="724">
+  <w:style w:type="character" w:styleId="726">
     <w:name w:val="Heading 3 Char"/>
-    <w:link w:val="723"/>
+    <w:link w:val="725"/>
     <w:uiPriority w:val="9"/>
     <w:pPr>
       <w:pBdr/>
@@ -10610,11 +10686,11 @@
       <w:szCs w:val="30"/>
     </w:rPr>
   </w:style>
-  <w:style w:type="paragraph" w:styleId="725">
+  <w:style w:type="paragraph" w:styleId="727">
     <w:name w:val="Heading 4"/>
-    <w:basedOn w:val="895"/>
-    <w:next w:val="895"/>
-    <w:link w:val="726"/>
+    <w:basedOn w:val="897"/>
+    <w:next w:val="897"/>
+    <w:link w:val="728"/>
     <w:uiPriority w:val="9"/>
     <w:unhideWhenUsed/>
     <w:qFormat/>
@@ -10634,9 +10710,9 @@
       <w:szCs w:val="26"/>
     </w:rPr>
   </w:style>
-  <w:style w:type="character" w:styleId="726">
+  <w:style w:type="character" w:styleId="728">
     <w:name w:val="Heading 4 Char"/>
-    <w:link w:val="725"/>
+    <w:link w:val="727"/>
     <w:uiPriority w:val="9"/>
     <w:pPr>
       <w:pBdr/>
@@ -10651,11 +10727,11 @@
       <w:szCs w:val="26"/>
     </w:rPr>
   </w:style>
-  <w:style w:type="paragraph" w:styleId="727">
+  <w:style w:type="paragraph" w:styleId="729">
     <w:name w:val="Heading 5"/>
-    <w:basedOn w:val="895"/>
-    <w:next w:val="895"/>
-    <w:link w:val="728"/>
+    <w:basedOn w:val="897"/>
+    <w:next w:val="897"/>
+    <w:link w:val="730"/>
     <w:uiPriority w:val="9"/>
     <w:unhideWhenUsed/>
     <w:qFormat/>
@@ -10675,9 +10751,9 @@
       <w:szCs w:val="24"/>
     </w:rPr>
   </w:style>
-  <w:style w:type="character" w:styleId="728">
+  <w:style w:type="character" w:styleId="730">
     <w:name w:val="Heading 5 Char"/>
-    <w:link w:val="727"/>
+    <w:link w:val="729"/>
     <w:uiPriority w:val="9"/>
     <w:pPr>
       <w:pBdr/>
@@ -10692,11 +10768,11 @@
       <w:szCs w:val="24"/>
     </w:rPr>
   </w:style>
-  <w:style w:type="paragraph" w:styleId="729">
+  <w:style w:type="paragraph" w:styleId="731">
     <w:name w:val="Heading 6"/>
-    <w:basedOn w:val="895"/>
-    <w:next w:val="895"/>
-    <w:link w:val="730"/>
+    <w:basedOn w:val="897"/>
+    <w:next w:val="897"/>
+    <w:link w:val="732"/>
     <w:uiPriority w:val="9"/>
     <w:unhideWhenUsed/>
     <w:qFormat/>
@@ -10716,9 +10792,9 @@
       <w:szCs w:val="22"/>
     </w:rPr>
   </w:style>
-  <w:style w:type="character" w:styleId="730">
+  <w:style w:type="character" w:styleId="732">
     <w:name w:val="Heading 6 Char"/>
-    <w:link w:val="729"/>
+    <w:link w:val="731"/>
     <w:uiPriority w:val="9"/>
     <w:pPr>
       <w:pBdr/>
@@ -10733,11 +10809,11 @@
       <w:szCs w:val="22"/>
     </w:rPr>
   </w:style>
-  <w:style w:type="paragraph" w:styleId="731">
+  <w:style w:type="paragraph" w:styleId="733">
     <w:name w:val="Heading 7"/>
-    <w:basedOn w:val="895"/>
-    <w:next w:val="895"/>
-    <w:link w:val="732"/>
+    <w:basedOn w:val="897"/>
+    <w:next w:val="897"/>
+    <w:link w:val="734"/>
     <w:uiPriority w:val="9"/>
     <w:unhideWhenUsed/>
     <w:qFormat/>
@@ -10759,9 +10835,9 @@
       <w:szCs w:val="22"/>
     </w:rPr>
   </w:style>
-  <w:style w:type="character" w:styleId="732">
+  <w:style w:type="character" w:styleId="734">
     <w:name w:val="Heading 7 Char"/>
-    <w:link w:val="731"/>
+    <w:link w:val="733"/>
     <w:uiPriority w:val="9"/>
     <w:pPr>
       <w:pBdr/>
@@ -10778,11 +10854,11 @@
       <w:szCs w:val="22"/>
     </w:rPr>
   </w:style>
-  <w:style w:type="paragraph" w:styleId="733">
+  <w:style w:type="paragraph" w:styleId="735">
     <w:name w:val="Heading 8"/>
-    <w:basedOn w:val="895"/>
-    <w:next w:val="895"/>
-    <w:link w:val="734"/>
+    <w:basedOn w:val="897"/>
+    <w:next w:val="897"/>
+    <w:link w:val="736"/>
     <w:uiPriority w:val="9"/>
     <w:unhideWhenUsed/>
     <w:qFormat/>
@@ -10802,9 +10878,9 @@
       <w:szCs w:val="22"/>
     </w:rPr>
   </w:style>
-  <w:style w:type="character" w:styleId="734">
+  <w:style w:type="character" w:styleId="736">
     <w:name w:val="Heading 8 Char"/>
-    <w:link w:val="733"/>
+    <w:link w:val="735"/>
     <w:uiPriority w:val="9"/>
     <w:pPr>
       <w:pBdr/>
@@ -10819,11 +10895,11 @@
       <w:szCs w:val="22"/>
     </w:rPr>
   </w:style>
-  <w:style w:type="paragraph" w:styleId="735">
+  <w:style w:type="paragraph" w:styleId="737">
     <w:name w:val="Heading 9"/>
-    <w:basedOn w:val="895"/>
-    <w:next w:val="895"/>
-    <w:link w:val="736"/>
+    <w:basedOn w:val="897"/>
+    <w:next w:val="897"/>
+    <w:link w:val="738"/>
     <w:uiPriority w:val="9"/>
     <w:unhideWhenUsed/>
     <w:qFormat/>
@@ -10843,9 +10919,9 @@
       <w:szCs w:val="21"/>
     </w:rPr>
   </w:style>
-  <w:style w:type="character" w:styleId="736">
+  <w:style w:type="character" w:styleId="738">
     <w:name w:val="Heading 9 Char"/>
-    <w:link w:val="735"/>
+    <w:link w:val="737"/>
     <w:uiPriority w:val="9"/>
     <w:pPr>
       <w:pBdr/>
@@ -10860,11 +10936,11 @@
       <w:szCs w:val="21"/>
     </w:rPr>
   </w:style>
-  <w:style w:type="paragraph" w:styleId="737">
+  <w:style w:type="paragraph" w:styleId="739">
     <w:name w:val="Title"/>
-    <w:basedOn w:val="895"/>
-    <w:next w:val="895"/>
-    <w:link w:val="738"/>
+    <w:basedOn w:val="897"/>
+    <w:next w:val="897"/>
+    <w:link w:val="740"/>
     <w:uiPriority w:val="10"/>
     <w:qFormat/>
     <w:pPr>
@@ -10878,9 +10954,9 @@
       <w:szCs w:val="48"/>
     </w:rPr>
   </w:style>
-  <w:style w:type="character" w:styleId="738">
+  <w:style w:type="character" w:styleId="740">
     <w:name w:val="Title Char"/>
-    <w:link w:val="737"/>
+    <w:link w:val="739"/>
     <w:uiPriority w:val="10"/>
     <w:pPr>
       <w:pBdr/>
@@ -10892,11 +10968,11 @@
       <w:szCs w:val="48"/>
     </w:rPr>
   </w:style>
-  <w:style w:type="paragraph" w:styleId="739">
+  <w:style w:type="paragraph" w:styleId="741">
     <w:name w:val="Subtitle"/>
-    <w:basedOn w:val="895"/>
-    <w:next w:val="895"/>
-    <w:link w:val="740"/>
+    <w:basedOn w:val="897"/>
+    <w:next w:val="897"/>
+    <w:link w:val="742"/>
     <w:uiPriority w:val="11"/>
     <w:qFormat/>
     <w:pPr>
@@ -10909,9 +10985,9 @@
       <w:szCs w:val="24"/>
     </w:rPr>
   </w:style>
-  <w:style w:type="character" w:styleId="740">
+  <w:style w:type="character" w:styleId="742">
     <w:name w:val="Subtitle Char"/>
-    <w:link w:val="739"/>
+    <w:link w:val="741"/>
     <w:uiPriority w:val="11"/>
     <w:pPr>
       <w:pBdr/>
@@ -10923,11 +10999,11 @@
       <w:szCs w:val="24"/>
     </w:rPr>
   </w:style>
-  <w:style w:type="paragraph" w:styleId="741">
+  <w:style w:type="paragraph" w:styleId="743">
     <w:name w:val="Quote"/>
-    <w:basedOn w:val="895"/>
-    <w:next w:val="895"/>
-    <w:link w:val="742"/>
+    <w:basedOn w:val="897"/>
+    <w:next w:val="897"/>
+    <w:link w:val="744"/>
     <w:uiPriority w:val="29"/>
     <w:qFormat/>
     <w:pPr>
@@ -10939,9 +11015,9 @@
       <w:i/>
     </w:rPr>
   </w:style>
-  <w:style w:type="character" w:styleId="742">
+  <w:style w:type="character" w:styleId="744">
     <w:name w:val="Quote Char"/>
-    <w:link w:val="741"/>
+    <w:link w:val="743"/>
     <w:uiPriority w:val="29"/>
     <w:pPr>
       <w:pBdr/>
@@ -10952,11 +11028,11 @@
       <w:i/>
     </w:rPr>
   </w:style>
-  <w:style w:type="paragraph" w:styleId="743">
+  <w:style w:type="paragraph" w:styleId="745">
     <w:name w:val="Intense Quote"/>
-    <w:basedOn w:val="895"/>
-    <w:next w:val="895"/>
-    <w:link w:val="744"/>
+    <w:basedOn w:val="897"/>
+    <w:next w:val="897"/>
+    <w:link w:val="746"/>
     <w:uiPriority w:val="30"/>
     <w:qFormat/>
     <w:pPr>
@@ -10975,9 +11051,9 @@
       <w:i/>
     </w:rPr>
   </w:style>
-  <w:style w:type="character" w:styleId="744">
+  <w:style w:type="character" w:styleId="746">
     <w:name w:val="Intense Quote Char"/>
-    <w:link w:val="743"/>
+    <w:link w:val="745"/>
     <w:uiPriority w:val="30"/>
     <w:pPr>
       <w:pBdr/>
@@ -10988,36 +11064,10 @@
       <w:i/>
     </w:rPr>
   </w:style>
-  <w:style w:type="paragraph" w:styleId="745">
+  <w:style w:type="paragraph" w:styleId="747">
     <w:name w:val="Header"/>
-    <w:basedOn w:val="895"/>
-    <w:link w:val="746"/>
-    <w:uiPriority w:val="99"/>
-    <w:unhideWhenUsed/>
-    <w:pPr>
-      <w:pBdr/>
-      <w:tabs>
-        <w:tab w:val="center" w:leader="none" w:pos="7143"/>
-        <w:tab w:val="right" w:leader="none" w:pos="14287"/>
-      </w:tabs>
-      <w:spacing w:after="0" w:line="240" w:lineRule="auto"/>
-      <w:ind/>
-    </w:pPr>
-  </w:style>
-  <w:style w:type="character" w:styleId="746">
-    <w:name w:val="Header Char"/>
-    <w:link w:val="745"/>
-    <w:uiPriority w:val="99"/>
-    <w:pPr>
-      <w:pBdr/>
-      <w:spacing/>
-      <w:ind/>
-    </w:pPr>
-  </w:style>
-  <w:style w:type="paragraph" w:styleId="747">
-    <w:name w:val="Footer"/>
-    <w:basedOn w:val="895"/>
-    <w:link w:val="750"/>
+    <w:basedOn w:val="897"/>
+    <w:link w:val="748"/>
     <w:uiPriority w:val="99"/>
     <w:unhideWhenUsed/>
     <w:pPr>
@@ -11031,7 +11081,7 @@
     </w:pPr>
   </w:style>
   <w:style w:type="character" w:styleId="748">
-    <w:name w:val="Footer Char"/>
+    <w:name w:val="Header Char"/>
     <w:link w:val="747"/>
     <w:uiPriority w:val="99"/>
     <w:pPr>
@@ -11041,9 +11091,35 @@
     </w:pPr>
   </w:style>
   <w:style w:type="paragraph" w:styleId="749">
+    <w:name w:val="Footer"/>
+    <w:basedOn w:val="897"/>
+    <w:link w:val="752"/>
+    <w:uiPriority w:val="99"/>
+    <w:unhideWhenUsed/>
+    <w:pPr>
+      <w:pBdr/>
+      <w:tabs>
+        <w:tab w:val="center" w:leader="none" w:pos="7143"/>
+        <w:tab w:val="right" w:leader="none" w:pos="14287"/>
+      </w:tabs>
+      <w:spacing w:after="0" w:line="240" w:lineRule="auto"/>
+      <w:ind/>
+    </w:pPr>
+  </w:style>
+  <w:style w:type="character" w:styleId="750">
+    <w:name w:val="Footer Char"/>
+    <w:link w:val="749"/>
+    <w:uiPriority w:val="99"/>
+    <w:pPr>
+      <w:pBdr/>
+      <w:spacing/>
+      <w:ind/>
+    </w:pPr>
+  </w:style>
+  <w:style w:type="paragraph" w:styleId="751">
     <w:name w:val="Caption"/>
-    <w:basedOn w:val="895"/>
-    <w:next w:val="895"/>
+    <w:basedOn w:val="897"/>
+    <w:next w:val="897"/>
     <w:uiPriority w:val="35"/>
     <w:semiHidden/>
     <w:unhideWhenUsed/>
@@ -11061,10 +11137,10 @@
       <w:szCs w:val="18"/>
     </w:rPr>
   </w:style>
-  <w:style w:type="character" w:styleId="750">
+  <w:style w:type="character" w:styleId="752">
     <w:name w:val="Caption Char"/>
-    <w:basedOn w:val="749"/>
-    <w:link w:val="747"/>
+    <w:basedOn w:val="751"/>
+    <w:link w:val="749"/>
     <w:uiPriority w:val="99"/>
     <w:pPr>
       <w:pBdr/>
@@ -11072,9 +11148,9 @@
       <w:ind/>
     </w:pPr>
   </w:style>
-  <w:style w:type="table" w:styleId="751">
+  <w:style w:type="table" w:styleId="753">
     <w:name w:val="Table Grid"/>
-    <w:basedOn w:val="896"/>
+    <w:basedOn w:val="898"/>
     <w:uiPriority w:val="59"/>
     <w:pPr>
       <w:pBdr/>
@@ -11271,9 +11347,9 @@
       </w:tcPr>
     </w:tblStylePr>
   </w:style>
-  <w:style w:type="table" w:styleId="752">
+  <w:style w:type="table" w:styleId="754">
     <w:name w:val="Table Grid Light"/>
-    <w:basedOn w:val="896"/>
+    <w:basedOn w:val="898"/>
     <w:uiPriority w:val="59"/>
     <w:pPr>
       <w:pBdr/>
@@ -11470,9 +11546,9 @@
       </w:tcPr>
     </w:tblStylePr>
   </w:style>
-  <w:style w:type="table" w:styleId="753">
+  <w:style w:type="table" w:styleId="755">
     <w:name w:val="Plain Table 1"/>
-    <w:basedOn w:val="896"/>
+    <w:basedOn w:val="898"/>
     <w:uiPriority w:val="59"/>
     <w:pPr>
       <w:pBdr/>
@@ -11695,9 +11771,9 @@
       </w:tcPr>
     </w:tblStylePr>
   </w:style>
-  <w:style w:type="table" w:styleId="754">
+  <w:style w:type="table" w:styleId="756">
     <w:name w:val="Plain Table 2"/>
-    <w:basedOn w:val="896"/>
+    <w:basedOn w:val="898"/>
     <w:uiPriority w:val="59"/>
     <w:pPr>
       <w:pBdr/>
@@ -11928,9 +12004,9 @@
       </w:tcPr>
     </w:tblStylePr>
   </w:style>
-  <w:style w:type="table" w:styleId="755">
+  <w:style w:type="table" w:styleId="757">
     <w:name w:val="Plain Table 3"/>
-    <w:basedOn w:val="896"/>
+    <w:basedOn w:val="898"/>
     <w:uiPriority w:val="99"/>
     <w:pPr>
       <w:pBdr/>
@@ -12158,9 +12234,9 @@
       </w:tcPr>
     </w:tblStylePr>
   </w:style>
-  <w:style w:type="table" w:styleId="756">
+  <w:style w:type="table" w:styleId="758">
     <w:name w:val="Plain Table 4"/>
-    <w:basedOn w:val="896"/>
+    <w:basedOn w:val="898"/>
     <w:uiPriority w:val="99"/>
     <w:pPr>
       <w:pBdr/>
@@ -12374,9 +12450,9 @@
       </w:tcPr>
     </w:tblStylePr>
   </w:style>
-  <w:style w:type="table" w:styleId="757">
+  <w:style w:type="table" w:styleId="759">
     <w:name w:val="Plain Table 5"/>
-    <w:basedOn w:val="896"/>
+    <w:basedOn w:val="898"/>
     <w:uiPriority w:val="99"/>
     <w:pPr>
       <w:pBdr/>
@@ -12607,9 +12683,9 @@
       </w:tcPr>
     </w:tblStylePr>
   </w:style>
-  <w:style w:type="table" w:styleId="758">
+  <w:style w:type="table" w:styleId="760">
     <w:name w:val="Grid Table 1 Light"/>
-    <w:basedOn w:val="896"/>
+    <w:basedOn w:val="898"/>
     <w:uiPriority w:val="99"/>
     <w:pPr>
       <w:pBdr/>
@@ -12830,9 +12906,9 @@
       </w:tcPr>
     </w:tblStylePr>
   </w:style>
-  <w:style w:type="table" w:styleId="759">
+  <w:style w:type="table" w:styleId="761">
     <w:name w:val="Grid Table 1 Light - Accent 1"/>
-    <w:basedOn w:val="896"/>
+    <w:basedOn w:val="898"/>
     <w:uiPriority w:val="99"/>
     <w:pPr>
       <w:pBdr/>
@@ -13053,9 +13129,9 @@
       </w:tcPr>
     </w:tblStylePr>
   </w:style>
-  <w:style w:type="table" w:styleId="760">
+  <w:style w:type="table" w:styleId="762">
     <w:name w:val="Grid Table 1 Light - Accent 2"/>
-    <w:basedOn w:val="896"/>
+    <w:basedOn w:val="898"/>
     <w:uiPriority w:val="99"/>
     <w:pPr>
       <w:pBdr/>
@@ -13276,9 +13352,9 @@
       </w:tcPr>
     </w:tblStylePr>
   </w:style>
-  <w:style w:type="table" w:styleId="761">
+  <w:style w:type="table" w:styleId="763">
     <w:name w:val="Grid Table 1 Light - Accent 3"/>
-    <w:basedOn w:val="896"/>
+    <w:basedOn w:val="898"/>
     <w:uiPriority w:val="99"/>
     <w:pPr>
       <w:pBdr/>
@@ -13499,9 +13575,9 @@
       </w:tcPr>
     </w:tblStylePr>
   </w:style>
-  <w:style w:type="table" w:styleId="762">
+  <w:style w:type="table" w:styleId="764">
     <w:name w:val="Grid Table 1 Light - Accent 4"/>
-    <w:basedOn w:val="896"/>
+    <w:basedOn w:val="898"/>
     <w:uiPriority w:val="99"/>
     <w:pPr>
       <w:pBdr/>
@@ -13722,9 +13798,9 @@
       </w:tcPr>
     </w:tblStylePr>
   </w:style>
-  <w:style w:type="table" w:styleId="763">
+  <w:style w:type="table" w:styleId="765">
     <w:name w:val="Grid Table 1 Light - Accent 5"/>
-    <w:basedOn w:val="896"/>
+    <w:basedOn w:val="898"/>
     <w:uiPriority w:val="99"/>
     <w:pPr>
       <w:pBdr/>
@@ -13945,9 +14021,9 @@
       </w:tcPr>
     </w:tblStylePr>
   </w:style>
-  <w:style w:type="table" w:styleId="764">
+  <w:style w:type="table" w:styleId="766">
     <w:name w:val="Grid Table 1 Light - Accent 6"/>
-    <w:basedOn w:val="896"/>
+    <w:basedOn w:val="898"/>
     <w:uiPriority w:val="99"/>
     <w:pPr>
       <w:pBdr/>
@@ -14168,9 +14244,9 @@
       </w:tcPr>
     </w:tblStylePr>
   </w:style>
-  <w:style w:type="table" w:styleId="765">
+  <w:style w:type="table" w:styleId="767">
     <w:name w:val="Grid Table 2"/>
-    <w:basedOn w:val="896"/>
+    <w:basedOn w:val="898"/>
     <w:uiPriority w:val="99"/>
     <w:pPr>
       <w:pBdr/>
@@ -14400,9 +14476,9 @@
       </w:tcPr>
     </w:tblStylePr>
   </w:style>
-  <w:style w:type="table" w:styleId="766">
+  <w:style w:type="table" w:styleId="768">
     <w:name w:val="Grid Table 2 - Accent 1"/>
-    <w:basedOn w:val="896"/>
+    <w:basedOn w:val="898"/>
     <w:uiPriority w:val="99"/>
     <w:pPr>
       <w:pBdr/>
@@ -14632,9 +14708,9 @@
       </w:tcPr>
     </w:tblStylePr>
   </w:style>
-  <w:style w:type="table" w:styleId="767">
+  <w:style w:type="table" w:styleId="769">
     <w:name w:val="Grid Table 2 - Accent 2"/>
-    <w:basedOn w:val="896"/>
+    <w:basedOn w:val="898"/>
     <w:uiPriority w:val="99"/>
     <w:pPr>
       <w:pBdr/>
@@ -14864,9 +14940,9 @@
       </w:tcPr>
     </w:tblStylePr>
   </w:style>
-  <w:style w:type="table" w:styleId="768">
+  <w:style w:type="table" w:styleId="770">
     <w:name w:val="Grid Table 2 - Accent 3"/>
-    <w:basedOn w:val="896"/>
+    <w:basedOn w:val="898"/>
     <w:uiPriority w:val="99"/>
     <w:pPr>
       <w:pBdr/>
@@ -15096,9 +15172,9 @@
       </w:tcPr>
     </w:tblStylePr>
   </w:style>
-  <w:style w:type="table" w:styleId="769">
+  <w:style w:type="table" w:styleId="771">
     <w:name w:val="Grid Table 2 - Accent 4"/>
-    <w:basedOn w:val="896"/>
+    <w:basedOn w:val="898"/>
     <w:uiPriority w:val="99"/>
     <w:pPr>
       <w:pBdr/>
@@ -15328,9 +15404,9 @@
       </w:tcPr>
     </w:tblStylePr>
   </w:style>
-  <w:style w:type="table" w:styleId="770">
+  <w:style w:type="table" w:styleId="772">
     <w:name w:val="Grid Table 2 - Accent 5"/>
-    <w:basedOn w:val="896"/>
+    <w:basedOn w:val="898"/>
     <w:uiPriority w:val="99"/>
     <w:pPr>
       <w:pBdr/>
@@ -15560,9 +15636,9 @@
       </w:tcPr>
     </w:tblStylePr>
   </w:style>
-  <w:style w:type="table" w:styleId="771">
+  <w:style w:type="table" w:styleId="773">
     <w:name w:val="Grid Table 2 - Accent 6"/>
-    <w:basedOn w:val="896"/>
+    <w:basedOn w:val="898"/>
     <w:uiPriority w:val="99"/>
     <w:pPr>
       <w:pBdr/>
@@ -15792,9 +15868,9 @@
       </w:tcPr>
     </w:tblStylePr>
   </w:style>
-  <w:style w:type="table" w:styleId="772">
+  <w:style w:type="table" w:styleId="774">
     <w:name w:val="Grid Table 3"/>
-    <w:basedOn w:val="896"/>
+    <w:basedOn w:val="898"/>
     <w:uiPriority w:val="99"/>
     <w:pPr>
       <w:pBdr/>
@@ -16037,9 +16113,9 @@
       </w:tcPr>
     </w:tblStylePr>
   </w:style>
-  <w:style w:type="table" w:styleId="773">
+  <w:style w:type="table" w:styleId="775">
     <w:name w:val="Grid Table 3 - Accent 1"/>
-    <w:basedOn w:val="896"/>
+    <w:basedOn w:val="898"/>
     <w:uiPriority w:val="99"/>
     <w:pPr>
       <w:pBdr/>
@@ -16282,9 +16358,9 @@
       </w:tcPr>
     </w:tblStylePr>
   </w:style>
-  <w:style w:type="table" w:styleId="774">
+  <w:style w:type="table" w:styleId="776">
     <w:name w:val="Grid Table 3 - Accent 2"/>
-    <w:basedOn w:val="896"/>
+    <w:basedOn w:val="898"/>
     <w:uiPriority w:val="99"/>
     <w:pPr>
       <w:pBdr/>
@@ -16527,9 +16603,9 @@
       </w:tcPr>
     </w:tblStylePr>
   </w:style>
-  <w:style w:type="table" w:styleId="775">
+  <w:style w:type="table" w:styleId="777">
     <w:name w:val="Grid Table 3 - Accent 3"/>
-    <w:basedOn w:val="896"/>
+    <w:basedOn w:val="898"/>
     <w:uiPriority w:val="99"/>
     <w:pPr>
       <w:pBdr/>
@@ -16772,9 +16848,9 @@
       </w:tcPr>
     </w:tblStylePr>
   </w:style>
-  <w:style w:type="table" w:styleId="776">
+  <w:style w:type="table" w:styleId="778">
     <w:name w:val="Grid Table 3 - Accent 4"/>
-    <w:basedOn w:val="896"/>
+    <w:basedOn w:val="898"/>
     <w:uiPriority w:val="99"/>
     <w:pPr>
       <w:pBdr/>
@@ -17017,9 +17093,9 @@
       </w:tcPr>
     </w:tblStylePr>
   </w:style>
-  <w:style w:type="table" w:styleId="777">
+  <w:style w:type="table" w:styleId="779">
     <w:name w:val="Grid Table 3 - Accent 5"/>
-    <w:basedOn w:val="896"/>
+    <w:basedOn w:val="898"/>
     <w:uiPriority w:val="99"/>
     <w:pPr>
       <w:pBdr/>
@@ -17262,9 +17338,9 @@
       </w:tcPr>
     </w:tblStylePr>
   </w:style>
-  <w:style w:type="table" w:styleId="778">
+  <w:style w:type="table" w:styleId="780">
     <w:name w:val="Grid Table 3 - Accent 6"/>
-    <w:basedOn w:val="896"/>
+    <w:basedOn w:val="898"/>
     <w:uiPriority w:val="99"/>
     <w:pPr>
       <w:pBdr/>
@@ -17507,9 +17583,9 @@
       </w:tcPr>
     </w:tblStylePr>
   </w:style>
-  <w:style w:type="table" w:styleId="779">
+  <w:style w:type="table" w:styleId="781">
     <w:name w:val="Grid Table 4"/>
-    <w:basedOn w:val="896"/>
+    <w:basedOn w:val="898"/>
     <w:uiPriority w:val="59"/>
     <w:pPr>
       <w:pBdr/>
@@ -17740,9 +17816,9 @@
       </w:tcPr>
     </w:tblStylePr>
   </w:style>
-  <w:style w:type="table" w:styleId="780">
+  <w:style w:type="table" w:styleId="782">
     <w:name w:val="Grid Table 4 - Accent 1"/>
-    <w:basedOn w:val="896"/>
+    <w:basedOn w:val="898"/>
     <w:uiPriority w:val="59"/>
     <w:pPr>
       <w:pBdr/>
@@ -17973,9 +18049,9 @@
       </w:tcPr>
     </w:tblStylePr>
   </w:style>
-  <w:style w:type="table" w:styleId="781">
+  <w:style w:type="table" w:styleId="783">
     <w:name w:val="Grid Table 4 - Accent 2"/>
-    <w:basedOn w:val="896"/>
+    <w:basedOn w:val="898"/>
     <w:uiPriority w:val="59"/>
     <w:pPr>
       <w:pBdr/>
@@ -18206,9 +18282,9 @@
       </w:tcPr>
     </w:tblStylePr>
   </w:style>
-  <w:style w:type="table" w:styleId="782">
+  <w:style w:type="table" w:styleId="784">
     <w:name w:val="Grid Table 4 - Accent 3"/>
-    <w:basedOn w:val="896"/>
+    <w:basedOn w:val="898"/>
     <w:uiPriority w:val="59"/>
     <w:pPr>
       <w:pBdr/>
@@ -18439,9 +18515,9 @@
       </w:tcPr>
     </w:tblStylePr>
   </w:style>
-  <w:style w:type="table" w:styleId="783">
+  <w:style w:type="table" w:styleId="785">
     <w:name w:val="Grid Table 4 - Accent 4"/>
-    <w:basedOn w:val="896"/>
+    <w:basedOn w:val="898"/>
     <w:uiPriority w:val="59"/>
     <w:pPr>
       <w:pBdr/>
@@ -18672,9 +18748,9 @@
       </w:tcPr>
     </w:tblStylePr>
   </w:style>
-  <w:style w:type="table" w:styleId="784">
+  <w:style w:type="table" w:styleId="786">
     <w:name w:val="Grid Table 4 - Accent 5"/>
-    <w:basedOn w:val="896"/>
+    <w:basedOn w:val="898"/>
     <w:uiPriority w:val="59"/>
     <w:pPr>
       <w:pBdr/>
@@ -18905,9 +18981,9 @@
       </w:tcPr>
     </w:tblStylePr>
   </w:style>
-  <w:style w:type="table" w:styleId="785">
+  <w:style w:type="table" w:styleId="787">
     <w:name w:val="Grid Table 4 - Accent 6"/>
-    <w:basedOn w:val="896"/>
+    <w:basedOn w:val="898"/>
     <w:uiPriority w:val="59"/>
     <w:pPr>
       <w:pBdr/>
@@ -19138,9 +19214,9 @@
       </w:tcPr>
     </w:tblStylePr>
   </w:style>
-  <w:style w:type="table" w:styleId="786">
+  <w:style w:type="table" w:styleId="788">
     <w:name w:val="Grid Table 5 Dark"/>
-    <w:basedOn w:val="896"/>
+    <w:basedOn w:val="898"/>
     <w:uiPriority w:val="99"/>
     <w:pPr>
       <w:pBdr/>
@@ -19366,9 +19442,9 @@
       </w:tcPr>
     </w:tblStylePr>
   </w:style>
-  <w:style w:type="table" w:styleId="787">
+  <w:style w:type="table" w:styleId="789">
     <w:name w:val="Grid Table 5 Dark- Accent 1"/>
-    <w:basedOn w:val="896"/>
+    <w:basedOn w:val="898"/>
     <w:uiPriority w:val="99"/>
     <w:pPr>
       <w:pBdr/>
@@ -19594,9 +19670,9 @@
       </w:tcPr>
     </w:tblStylePr>
   </w:style>
-  <w:style w:type="table" w:styleId="788">
+  <w:style w:type="table" w:styleId="790">
     <w:name w:val="Grid Table 5 Dark - Accent 2"/>
-    <w:basedOn w:val="896"/>
+    <w:basedOn w:val="898"/>
     <w:uiPriority w:val="99"/>
     <w:pPr>
       <w:pBdr/>
@@ -19822,9 +19898,9 @@
       </w:tcPr>
     </w:tblStylePr>
   </w:style>
-  <w:style w:type="table" w:styleId="789">
+  <w:style w:type="table" w:styleId="791">
     <w:name w:val="Grid Table 5 Dark - Accent 3"/>
-    <w:basedOn w:val="896"/>
+    <w:basedOn w:val="898"/>
     <w:uiPriority w:val="99"/>
     <w:pPr>
       <w:pBdr/>
@@ -20050,9 +20126,9 @@
       </w:tcPr>
     </w:tblStylePr>
   </w:style>
-  <w:style w:type="table" w:styleId="790">
+  <w:style w:type="table" w:styleId="792">
     <w:name w:val="Grid Table 5 Dark- Accent 4"/>
-    <w:basedOn w:val="896"/>
+    <w:basedOn w:val="898"/>
     <w:uiPriority w:val="99"/>
     <w:pPr>
       <w:pBdr/>
@@ -20278,9 +20354,9 @@
       </w:tcPr>
     </w:tblStylePr>
   </w:style>
-  <w:style w:type="table" w:styleId="791">
+  <w:style w:type="table" w:styleId="793">
     <w:name w:val="Grid Table 5 Dark - Accent 5"/>
-    <w:basedOn w:val="896"/>
+    <w:basedOn w:val="898"/>
     <w:uiPriority w:val="99"/>
     <w:pPr>
       <w:pBdr/>
@@ -20506,9 +20582,9 @@
       </w:tcPr>
     </w:tblStylePr>
   </w:style>
-  <w:style w:type="table" w:styleId="792">
+  <w:style w:type="table" w:styleId="794">
     <w:name w:val="Grid Table 5 Dark - Accent 6"/>
-    <w:basedOn w:val="896"/>
+    <w:basedOn w:val="898"/>
     <w:uiPriority w:val="99"/>
     <w:pPr>
       <w:pBdr/>
@@ -20734,9 +20810,9 @@
       </w:tcPr>
     </w:tblStylePr>
   </w:style>
-  <w:style w:type="table" w:styleId="793">
+  <w:style w:type="table" w:styleId="795">
     <w:name w:val="Grid Table 6 Colorful"/>
-    <w:basedOn w:val="896"/>
+    <w:basedOn w:val="898"/>
     <w:uiPriority w:val="99"/>
     <w:pPr>
       <w:pBdr/>
@@ -20964,9 +21040,9 @@
       </w:tcPr>
     </w:tblStylePr>
   </w:style>
-  <w:style w:type="table" w:styleId="794">
+  <w:style w:type="table" w:styleId="796">
     <w:name w:val="Grid Table 6 Colorful - Accent 1"/>
-    <w:basedOn w:val="896"/>
+    <w:basedOn w:val="898"/>
     <w:uiPriority w:val="99"/>
     <w:pPr>
       <w:pBdr/>
@@ -21194,9 +21270,9 @@
       </w:tcPr>
     </w:tblStylePr>
   </w:style>
-  <w:style w:type="table" w:styleId="795">
+  <w:style w:type="table" w:styleId="797">
     <w:name w:val="Grid Table 6 Colorful - Accent 2"/>
-    <w:basedOn w:val="896"/>
+    <w:basedOn w:val="898"/>
     <w:uiPriority w:val="99"/>
     <w:pPr>
       <w:pBdr/>
@@ -21424,9 +21500,9 @@
       </w:tcPr>
     </w:tblStylePr>
   </w:style>
-  <w:style w:type="table" w:styleId="796">
+  <w:style w:type="table" w:styleId="798">
     <w:name w:val="Grid Table 6 Colorful - Accent 3"/>
-    <w:basedOn w:val="896"/>
+    <w:basedOn w:val="898"/>
     <w:uiPriority w:val="99"/>
     <w:pPr>
       <w:pBdr/>
@@ -21654,9 +21730,9 @@
       </w:tcPr>
     </w:tblStylePr>
   </w:style>
-  <w:style w:type="table" w:styleId="797">
+  <w:style w:type="table" w:styleId="799">
     <w:name w:val="Grid Table 6 Colorful - Accent 4"/>
-    <w:basedOn w:val="896"/>
+    <w:basedOn w:val="898"/>
     <w:uiPriority w:val="99"/>
     <w:pPr>
       <w:pBdr/>
@@ -21884,9 +21960,9 @@
       </w:tcPr>
     </w:tblStylePr>
   </w:style>
-  <w:style w:type="table" w:styleId="798">
+  <w:style w:type="table" w:styleId="800">
     <w:name w:val="Grid Table 6 Colorful - Accent 5"/>
-    <w:basedOn w:val="896"/>
+    <w:basedOn w:val="898"/>
     <w:uiPriority w:val="99"/>
     <w:pPr>
       <w:pBdr/>
@@ -22114,9 +22190,9 @@
       </w:tcPr>
     </w:tblStylePr>
   </w:style>
-  <w:style w:type="table" w:styleId="799">
+  <w:style w:type="table" w:styleId="801">
     <w:name w:val="Grid Table 6 Colorful - Accent 6"/>
-    <w:basedOn w:val="896"/>
+    <w:basedOn w:val="898"/>
     <w:uiPriority w:val="99"/>
     <w:pPr>
       <w:pBdr/>
@@ -22344,9 +22420,9 @@
       </w:tcPr>
     </w:tblStylePr>
   </w:style>
-  <w:style w:type="table" w:styleId="800">
+  <w:style w:type="table" w:styleId="802">
     <w:name w:val="Grid Table 7 Colorful"/>
-    <w:basedOn w:val="896"/>
+    <w:basedOn w:val="898"/>
     <w:uiPriority w:val="99"/>
     <w:pPr>
       <w:pBdr/>
@@ -22598,9 +22674,9 @@
       </w:tcPr>
     </w:tblStylePr>
   </w:style>
-  <w:style w:type="table" w:styleId="801">
+  <w:style w:type="table" w:styleId="803">
     <w:name w:val="Grid Table 7 Colorful - Accent 1"/>
-    <w:basedOn w:val="896"/>
+    <w:basedOn w:val="898"/>
     <w:uiPriority w:val="99"/>
     <w:pPr>
       <w:pBdr/>
@@ -22852,9 +22928,9 @@
       </w:tcPr>
     </w:tblStylePr>
   </w:style>
-  <w:style w:type="table" w:styleId="802">
+  <w:style w:type="table" w:styleId="804">
     <w:name w:val="Grid Table 7 Colorful - Accent 2"/>
-    <w:basedOn w:val="896"/>
+    <w:basedOn w:val="898"/>
     <w:uiPriority w:val="99"/>
     <w:pPr>
       <w:pBdr/>
@@ -23106,9 +23182,9 @@
       </w:tcPr>
     </w:tblStylePr>
   </w:style>
-  <w:style w:type="table" w:styleId="803">
+  <w:style w:type="table" w:styleId="805">
     <w:name w:val="Grid Table 7 Colorful - Accent 3"/>
-    <w:basedOn w:val="896"/>
+    <w:basedOn w:val="898"/>
     <w:uiPriority w:val="99"/>
     <w:pPr>
       <w:pBdr/>
@@ -23360,9 +23436,9 @@
       </w:tcPr>
     </w:tblStylePr>
   </w:style>
-  <w:style w:type="table" w:styleId="804">
+  <w:style w:type="table" w:styleId="806">
     <w:name w:val="Grid Table 7 Colorful - Accent 4"/>
-    <w:basedOn w:val="896"/>
+    <w:basedOn w:val="898"/>
     <w:uiPriority w:val="99"/>
     <w:pPr>
       <w:pBdr/>
@@ -23614,9 +23690,9 @@
       </w:tcPr>
     </w:tblStylePr>
   </w:style>
-  <w:style w:type="table" w:styleId="805">
+  <w:style w:type="table" w:styleId="807">
     <w:name w:val="Grid Table 7 Colorful - Accent 5"/>
-    <w:basedOn w:val="896"/>
+    <w:basedOn w:val="898"/>
     <w:uiPriority w:val="99"/>
     <w:pPr>
       <w:pBdr/>
@@ -23868,9 +23944,9 @@
       </w:tcPr>
     </w:tblStylePr>
   </w:style>
-  <w:style w:type="table" w:styleId="806">
+  <w:style w:type="table" w:styleId="808">
     <w:name w:val="Grid Table 7 Colorful - Accent 6"/>
-    <w:basedOn w:val="896"/>
+    <w:basedOn w:val="898"/>
     <w:uiPriority w:val="99"/>
     <w:pPr>
       <w:pBdr/>
@@ -24122,9 +24198,9 @@
       </w:tcPr>
     </w:tblStylePr>
   </w:style>
-  <w:style w:type="table" w:styleId="807">
+  <w:style w:type="table" w:styleId="809">
     <w:name w:val="List Table 1 Light"/>
-    <w:basedOn w:val="896"/>
+    <w:basedOn w:val="898"/>
     <w:uiPriority w:val="99"/>
     <w:pPr>
       <w:pBdr/>
@@ -24338,9 +24414,9 @@
       </w:tcPr>
     </w:tblStylePr>
   </w:style>
-  <w:style w:type="table" w:styleId="808">
+  <w:style w:type="table" w:styleId="810">
     <w:name w:val="List Table 1 Light - Accent 1"/>
-    <w:basedOn w:val="896"/>
+    <w:basedOn w:val="898"/>
     <w:uiPriority w:val="99"/>
     <w:pPr>
       <w:pBdr/>
@@ -24554,9 +24630,9 @@
       </w:tcPr>
     </w:tblStylePr>
   </w:style>
-  <w:style w:type="table" w:styleId="809">
+  <w:style w:type="table" w:styleId="811">
     <w:name w:val="List Table 1 Light - Accent 2"/>
-    <w:basedOn w:val="896"/>
+    <w:basedOn w:val="898"/>
     <w:uiPriority w:val="99"/>
     <w:pPr>
       <w:pBdr/>
@@ -24770,9 +24846,9 @@
       </w:tcPr>
     </w:tblStylePr>
   </w:style>
-  <w:style w:type="table" w:styleId="810">
+  <w:style w:type="table" w:styleId="812">
     <w:name w:val="List Table 1 Light - Accent 3"/>
-    <w:basedOn w:val="896"/>
+    <w:basedOn w:val="898"/>
     <w:uiPriority w:val="99"/>
     <w:pPr>
       <w:pBdr/>
@@ -24986,9 +25062,9 @@
       </w:tcPr>
     </w:tblStylePr>
   </w:style>
-  <w:style w:type="table" w:styleId="811">
+  <w:style w:type="table" w:styleId="813">
     <w:name w:val="List Table 1 Light - Accent 4"/>
-    <w:basedOn w:val="896"/>
+    <w:basedOn w:val="898"/>
     <w:uiPriority w:val="99"/>
     <w:pPr>
       <w:pBdr/>
@@ -25202,9 +25278,9 @@
       </w:tcPr>
     </w:tblStylePr>
   </w:style>
-  <w:style w:type="table" w:styleId="812">
+  <w:style w:type="table" w:styleId="814">
     <w:name w:val="List Table 1 Light - Accent 5"/>
-    <w:basedOn w:val="896"/>
+    <w:basedOn w:val="898"/>
     <w:uiPriority w:val="99"/>
     <w:pPr>
       <w:pBdr/>
@@ -25418,9 +25494,9 @@
       </w:tcPr>
     </w:tblStylePr>
   </w:style>
-  <w:style w:type="table" w:styleId="813">
+  <w:style w:type="table" w:styleId="815">
     <w:name w:val="List Table 1 Light - Accent 6"/>
-    <w:basedOn w:val="896"/>
+    <w:basedOn w:val="898"/>
     <w:uiPriority w:val="99"/>
     <w:pPr>
       <w:pBdr/>
@@ -25634,9 +25710,9 @@
       </w:tcPr>
     </w:tblStylePr>
   </w:style>
-  <w:style w:type="table" w:styleId="814">
+  <w:style w:type="table" w:styleId="816">
     <w:name w:val="List Table 2"/>
-    <w:basedOn w:val="896"/>
+    <w:basedOn w:val="898"/>
     <w:uiPriority w:val="99"/>
     <w:pPr>
       <w:pBdr/>
@@ -25872,9 +25948,9 @@
       </w:tcPr>
     </w:tblStylePr>
   </w:style>
-  <w:style w:type="table" w:styleId="815">
+  <w:style w:type="table" w:styleId="817">
     <w:name w:val="List Table 2 - Accent 1"/>
-    <w:basedOn w:val="896"/>
+    <w:basedOn w:val="898"/>
     <w:uiPriority w:val="99"/>
     <w:pPr>
       <w:pBdr/>
@@ -26110,9 +26186,9 @@
       </w:tcPr>
     </w:tblStylePr>
   </w:style>
-  <w:style w:type="table" w:styleId="816">
+  <w:style w:type="table" w:styleId="818">
     <w:name w:val="List Table 2 - Accent 2"/>
-    <w:basedOn w:val="896"/>
+    <w:basedOn w:val="898"/>
     <w:uiPriority w:val="99"/>
     <w:pPr>
       <w:pBdr/>
@@ -26348,9 +26424,9 @@
       </w:tcPr>
     </w:tblStylePr>
   </w:style>
-  <w:style w:type="table" w:styleId="817">
+  <w:style w:type="table" w:styleId="819">
     <w:name w:val="List Table 2 - Accent 3"/>
-    <w:basedOn w:val="896"/>
+    <w:basedOn w:val="898"/>
     <w:uiPriority w:val="99"/>
     <w:pPr>
       <w:pBdr/>
@@ -26586,9 +26662,9 @@
       </w:tcPr>
     </w:tblStylePr>
   </w:style>
-  <w:style w:type="table" w:styleId="818">
+  <w:style w:type="table" w:styleId="820">
     <w:name w:val="List Table 2 - Accent 4"/>
-    <w:basedOn w:val="896"/>
+    <w:basedOn w:val="898"/>
     <w:uiPriority w:val="99"/>
     <w:pPr>
       <w:pBdr/>
@@ -26824,9 +26900,9 @@
       </w:tcPr>
     </w:tblStylePr>
   </w:style>
-  <w:style w:type="table" w:styleId="819">
+  <w:style w:type="table" w:styleId="821">
     <w:name w:val="List Table 2 - Accent 5"/>
-    <w:basedOn w:val="896"/>
+    <w:basedOn w:val="898"/>
     <w:uiPriority w:val="99"/>
     <w:pPr>
       <w:pBdr/>
@@ -27062,9 +27138,9 @@
       </w:tcPr>
     </w:tblStylePr>
   </w:style>
-  <w:style w:type="table" w:styleId="820">
+  <w:style w:type="table" w:styleId="822">
     <w:name w:val="List Table 2 - Accent 6"/>
-    <w:basedOn w:val="896"/>
+    <w:basedOn w:val="898"/>
     <w:uiPriority w:val="99"/>
     <w:pPr>
       <w:pBdr/>
@@ -27300,9 +27376,9 @@
       </w:tcPr>
     </w:tblStylePr>
   </w:style>
-  <w:style w:type="table" w:styleId="821">
+  <w:style w:type="table" w:styleId="823">
     <w:name w:val="List Table 3"/>
-    <w:basedOn w:val="896"/>
+    <w:basedOn w:val="898"/>
     <w:uiPriority w:val="99"/>
     <w:pPr>
       <w:pBdr/>
@@ -27528,9 +27604,9 @@
       </w:tcPr>
     </w:tblStylePr>
   </w:style>
-  <w:style w:type="table" w:styleId="822">
+  <w:style w:type="table" w:styleId="824">
     <w:name w:val="List Table 3 - Accent 1"/>
-    <w:basedOn w:val="896"/>
+    <w:basedOn w:val="898"/>
     <w:uiPriority w:val="99"/>
     <w:pPr>
       <w:pBdr/>
@@ -27756,9 +27832,9 @@
       </w:tcPr>
     </w:tblStylePr>
   </w:style>
-  <w:style w:type="table" w:styleId="823">
+  <w:style w:type="table" w:styleId="825">
     <w:name w:val="List Table 3 - Accent 2"/>
-    <w:basedOn w:val="896"/>
+    <w:basedOn w:val="898"/>
     <w:uiPriority w:val="99"/>
     <w:pPr>
       <w:pBdr/>
@@ -27984,9 +28060,9 @@
       </w:tcPr>
     </w:tblStylePr>
   </w:style>
-  <w:style w:type="table" w:styleId="824">
+  <w:style w:type="table" w:styleId="826">
     <w:name w:val="List Table 3 - Accent 3"/>
-    <w:basedOn w:val="896"/>
+    <w:basedOn w:val="898"/>
     <w:uiPriority w:val="99"/>
     <w:pPr>
       <w:pBdr/>
@@ -28212,9 +28288,9 @@
       </w:tcPr>
     </w:tblStylePr>
   </w:style>
-  <w:style w:type="table" w:styleId="825">
+  <w:style w:type="table" w:styleId="827">
     <w:name w:val="List Table 3 - Accent 4"/>
-    <w:basedOn w:val="896"/>
+    <w:basedOn w:val="898"/>
     <w:uiPriority w:val="99"/>
     <w:pPr>
       <w:pBdr/>
@@ -28440,9 +28516,9 @@
       </w:tcPr>
     </w:tblStylePr>
   </w:style>
-  <w:style w:type="table" w:styleId="826">
+  <w:style w:type="table" w:styleId="828">
     <w:name w:val="List Table 3 - Accent 5"/>
-    <w:basedOn w:val="896"/>
+    <w:basedOn w:val="898"/>
     <w:uiPriority w:val="99"/>
     <w:pPr>
       <w:pBdr/>
@@ -28668,9 +28744,9 @@
       </w:tcPr>
     </w:tblStylePr>
   </w:style>
-  <w:style w:type="table" w:styleId="827">
+  <w:style w:type="table" w:styleId="829">
     <w:name w:val="List Table 3 - Accent 6"/>
-    <w:basedOn w:val="896"/>
+    <w:basedOn w:val="898"/>
     <w:uiPriority w:val="99"/>
     <w:pPr>
       <w:pBdr/>
@@ -28896,9 +28972,9 @@
       </w:tcPr>
     </w:tblStylePr>
   </w:style>
-  <w:style w:type="table" w:styleId="828">
+  <w:style w:type="table" w:styleId="830">
     <w:name w:val="List Table 4"/>
-    <w:basedOn w:val="896"/>
+    <w:basedOn w:val="898"/>
     <w:uiPriority w:val="99"/>
     <w:pPr>
       <w:pBdr/>
@@ -29121,9 +29197,9 @@
       </w:tcPr>
     </w:tblStylePr>
   </w:style>
-  <w:style w:type="table" w:styleId="829">
+  <w:style w:type="table" w:styleId="831">
     <w:name w:val="List Table 4 - Accent 1"/>
-    <w:basedOn w:val="896"/>
+    <w:basedOn w:val="898"/>
     <w:uiPriority w:val="99"/>
     <w:pPr>
       <w:pBdr/>
@@ -29346,9 +29422,9 @@
       </w:tcPr>
     </w:tblStylePr>
   </w:style>
-  <w:style w:type="table" w:styleId="830">
+  <w:style w:type="table" w:styleId="832">
     <w:name w:val="List Table 4 - Accent 2"/>
-    <w:basedOn w:val="896"/>
+    <w:basedOn w:val="898"/>
     <w:uiPriority w:val="99"/>
     <w:pPr>
       <w:pBdr/>
@@ -29571,9 +29647,9 @@
       </w:tcPr>
     </w:tblStylePr>
   </w:style>
-  <w:style w:type="table" w:styleId="831">
+  <w:style w:type="table" w:styleId="833">
     <w:name w:val="List Table 4 - Accent 3"/>
-    <w:basedOn w:val="896"/>
+    <w:basedOn w:val="898"/>
     <w:uiPriority w:val="99"/>
     <w:pPr>
       <w:pBdr/>
@@ -29796,9 +29872,9 @@
       </w:tcPr>
     </w:tblStylePr>
   </w:style>
-  <w:style w:type="table" w:styleId="832">
+  <w:style w:type="table" w:styleId="834">
     <w:name w:val="List Table 4 - Accent 4"/>
-    <w:basedOn w:val="896"/>
+    <w:basedOn w:val="898"/>
     <w:uiPriority w:val="99"/>
     <w:pPr>
       <w:pBdr/>
@@ -30021,9 +30097,9 @@
       </w:tcPr>
     </w:tblStylePr>
   </w:style>
-  <w:style w:type="table" w:styleId="833">
+  <w:style w:type="table" w:styleId="835">
     <w:name w:val="List Table 4 - Accent 5"/>
-    <w:basedOn w:val="896"/>
+    <w:basedOn w:val="898"/>
     <w:uiPriority w:val="99"/>
     <w:pPr>
       <w:pBdr/>
@@ -30246,9 +30322,9 @@
       </w:tcPr>
     </w:tblStylePr>
   </w:style>
-  <w:style w:type="table" w:styleId="834">
+  <w:style w:type="table" w:styleId="836">
     <w:name w:val="List Table 4 - Accent 6"/>
-    <w:basedOn w:val="896"/>
+    <w:basedOn w:val="898"/>
     <w:uiPriority w:val="99"/>
     <w:pPr>
       <w:pBdr/>
@@ -30471,9 +30547,9 @@
       </w:tcPr>
     </w:tblStylePr>
   </w:style>
-  <w:style w:type="table" w:styleId="835">
+  <w:style w:type="table" w:styleId="837">
     <w:name w:val="List Table 5 Dark"/>
-    <w:basedOn w:val="896"/>
+    <w:basedOn w:val="898"/>
     <w:uiPriority w:val="99"/>
     <w:pPr>
       <w:pBdr/>
@@ -30713,9 +30789,9 @@
       </w:tcPr>
     </w:tblStylePr>
   </w:style>
-  <w:style w:type="table" w:styleId="836">
+  <w:style w:type="table" w:styleId="838">
     <w:name w:val="List Table 5 Dark - Accent 1"/>
-    <w:basedOn w:val="896"/>
+    <w:basedOn w:val="898"/>
     <w:uiPriority w:val="99"/>
     <w:pPr>
       <w:pBdr/>
@@ -30955,9 +31031,9 @@
       </w:tcPr>
     </w:tblStylePr>
   </w:style>
-  <w:style w:type="table" w:styleId="837">
+  <w:style w:type="table" w:styleId="839">
     <w:name w:val="List Table 5 Dark - Accent 2"/>
-    <w:basedOn w:val="896"/>
+    <w:basedOn w:val="898"/>
     <w:uiPriority w:val="99"/>
     <w:pPr>
       <w:pBdr/>
@@ -31197,9 +31273,9 @@
       </w:tcPr>
     </w:tblStylePr>
   </w:style>
-  <w:style w:type="table" w:styleId="838">
+  <w:style w:type="table" w:styleId="840">
     <w:name w:val="List Table 5 Dark - Accent 3"/>
-    <w:basedOn w:val="896"/>
+    <w:basedOn w:val="898"/>
     <w:uiPriority w:val="99"/>
     <w:pPr>
       <w:pBdr/>
@@ -31439,9 +31515,9 @@
       </w:tcPr>
     </w:tblStylePr>
   </w:style>
-  <w:style w:type="table" w:styleId="839">
+  <w:style w:type="table" w:styleId="841">
     <w:name w:val="List Table 5 Dark - Accent 4"/>
-    <w:basedOn w:val="896"/>
+    <w:basedOn w:val="898"/>
     <w:uiPriority w:val="99"/>
     <w:pPr>
       <w:pBdr/>
@@ -31681,9 +31757,9 @@
       </w:tcPr>
     </w:tblStylePr>
   </w:style>
-  <w:style w:type="table" w:styleId="840">
+  <w:style w:type="table" w:styleId="842">
     <w:name w:val="List Table 5 Dark - Accent 5"/>
-    <w:basedOn w:val="896"/>
+    <w:basedOn w:val="898"/>
     <w:uiPriority w:val="99"/>
     <w:pPr>
       <w:pBdr/>
@@ -31923,9 +31999,9 @@
       </w:tcPr>
     </w:tblStylePr>
   </w:style>
-  <w:style w:type="table" w:styleId="841">
+  <w:style w:type="table" w:styleId="843">
     <w:name w:val="List Table 5 Dark - Accent 6"/>
-    <w:basedOn w:val="896"/>
+    <w:basedOn w:val="898"/>
     <w:uiPriority w:val="99"/>
     <w:pPr>
       <w:pBdr/>
@@ -32165,9 +32241,9 @@
       </w:tcPr>
     </w:tblStylePr>
   </w:style>
-  <w:style w:type="table" w:styleId="842">
+  <w:style w:type="table" w:styleId="844">
     <w:name w:val="List Table 6 Colorful"/>
-    <w:basedOn w:val="896"/>
+    <w:basedOn w:val="898"/>
     <w:uiPriority w:val="99"/>
     <w:pPr>
       <w:pBdr/>
@@ -32388,9 +32464,9 @@
       </w:tcPr>
     </w:tblStylePr>
   </w:style>
-  <w:style w:type="table" w:styleId="843">
+  <w:style w:type="table" w:styleId="845">
     <w:name w:val="List Table 6 Colorful - Accent 1"/>
-    <w:basedOn w:val="896"/>
+    <w:basedOn w:val="898"/>
     <w:uiPriority w:val="99"/>
     <w:pPr>
       <w:pBdr/>
@@ -32611,9 +32687,9 @@
       </w:tcPr>
     </w:tblStylePr>
   </w:style>
-  <w:style w:type="table" w:styleId="844">
+  <w:style w:type="table" w:styleId="846">
     <w:name w:val="List Table 6 Colorful - Accent 2"/>
-    <w:basedOn w:val="896"/>
+    <w:basedOn w:val="898"/>
     <w:uiPriority w:val="99"/>
     <w:pPr>
       <w:pBdr/>
@@ -32834,9 +32910,9 @@
       </w:tcPr>
     </w:tblStylePr>
   </w:style>
-  <w:style w:type="table" w:styleId="845">
+  <w:style w:type="table" w:styleId="847">
     <w:name w:val="List Table 6 Colorful - Accent 3"/>
-    <w:basedOn w:val="896"/>
+    <w:basedOn w:val="898"/>
     <w:uiPriority w:val="99"/>
     <w:pPr>
       <w:pBdr/>
@@ -33057,9 +33133,9 @@
       </w:tcPr>
     </w:tblStylePr>
   </w:style>
-  <w:style w:type="table" w:styleId="846">
+  <w:style w:type="table" w:styleId="848">
     <w:name w:val="List Table 6 Colorful - Accent 4"/>
-    <w:basedOn w:val="896"/>
+    <w:basedOn w:val="898"/>
     <w:uiPriority w:val="99"/>
     <w:pPr>
       <w:pBdr/>
@@ -33280,9 +33356,9 @@
       </w:tcPr>
     </w:tblStylePr>
   </w:style>
-  <w:style w:type="table" w:styleId="847">
+  <w:style w:type="table" w:styleId="849">
     <w:name w:val="List Table 6 Colorful - Accent 5"/>
-    <w:basedOn w:val="896"/>
+    <w:basedOn w:val="898"/>
     <w:uiPriority w:val="99"/>
     <w:pPr>
       <w:pBdr/>
@@ -33503,9 +33579,9 @@
       </w:tcPr>
     </w:tblStylePr>
   </w:style>
-  <w:style w:type="table" w:styleId="848">
+  <w:style w:type="table" w:styleId="850">
     <w:name w:val="List Table 6 Colorful - Accent 6"/>
-    <w:basedOn w:val="896"/>
+    <w:basedOn w:val="898"/>
     <w:uiPriority w:val="99"/>
     <w:pPr>
       <w:pBdr/>
@@ -33726,9 +33802,9 @@
       </w:tcPr>
     </w:tblStylePr>
   </w:style>
-  <w:style w:type="table" w:styleId="849">
+  <w:style w:type="table" w:styleId="851">
     <w:name w:val="List Table 7 Colorful"/>
-    <w:basedOn w:val="896"/>
+    <w:basedOn w:val="898"/>
     <w:uiPriority w:val="99"/>
     <w:pPr>
       <w:pBdr/>
@@ -33982,9 +34058,9 @@
       </w:tcPr>
     </w:tblStylePr>
   </w:style>
-  <w:style w:type="table" w:styleId="850">
+  <w:style w:type="table" w:styleId="852">
     <w:name w:val="List Table 7 Colorful - Accent 1"/>
-    <w:basedOn w:val="896"/>
+    <w:basedOn w:val="898"/>
     <w:uiPriority w:val="99"/>
     <w:pPr>
       <w:pBdr/>
@@ -34238,9 +34314,9 @@
       </w:tcPr>
     </w:tblStylePr>
   </w:style>
-  <w:style w:type="table" w:styleId="851">
+  <w:style w:type="table" w:styleId="853">
     <w:name w:val="List Table 7 Colorful - Accent 2"/>
-    <w:basedOn w:val="896"/>
+    <w:basedOn w:val="898"/>
     <w:uiPriority w:val="99"/>
     <w:pPr>
       <w:pBdr/>
@@ -34494,9 +34570,9 @@
       </w:tcPr>
     </w:tblStylePr>
   </w:style>
-  <w:style w:type="table" w:styleId="852">
+  <w:style w:type="table" w:styleId="854">
     <w:name w:val="List Table 7 Colorful - Accent 3"/>
-    <w:basedOn w:val="896"/>
+    <w:basedOn w:val="898"/>
     <w:uiPriority w:val="99"/>
     <w:pPr>
       <w:pBdr/>
@@ -34750,9 +34826,9 @@
       </w:tcPr>
     </w:tblStylePr>
   </w:style>
-  <w:style w:type="table" w:styleId="853">
+  <w:style w:type="table" w:styleId="855">
     <w:name w:val="List Table 7 Colorful - Accent 4"/>
-    <w:basedOn w:val="896"/>
+    <w:basedOn w:val="898"/>
     <w:uiPriority w:val="99"/>
     <w:pPr>
       <w:pBdr/>
@@ -35006,9 +35082,9 @@
       </w:tcPr>
     </w:tblStylePr>
   </w:style>
-  <w:style w:type="table" w:styleId="854">
+  <w:style w:type="table" w:styleId="856">
     <w:name w:val="List Table 7 Colorful - Accent 5"/>
-    <w:basedOn w:val="896"/>
+    <w:basedOn w:val="898"/>
     <w:uiPriority w:val="99"/>
     <w:pPr>
       <w:pBdr/>
@@ -35262,9 +35338,9 @@
       </w:tcPr>
     </w:tblStylePr>
   </w:style>
-  <w:style w:type="table" w:styleId="855">
+  <w:style w:type="table" w:styleId="857">
     <w:name w:val="List Table 7 Colorful - Accent 6"/>
-    <w:basedOn w:val="896"/>
+    <w:basedOn w:val="898"/>
     <w:uiPriority w:val="99"/>
     <w:pPr>
       <w:pBdr/>
@@ -35518,9 +35594,9 @@
       </w:tcPr>
     </w:tblStylePr>
   </w:style>
-  <w:style w:type="table" w:styleId="856">
+  <w:style w:type="table" w:styleId="858">
     <w:name w:val="Lined - Accent"/>
-    <w:basedOn w:val="896"/>
+    <w:basedOn w:val="898"/>
     <w:uiPriority w:val="99"/>
     <w:pPr>
       <w:pBdr/>
@@ -35755,9 +35831,9 @@
       </w:tcPr>
     </w:tblStylePr>
   </w:style>
-  <w:style w:type="table" w:styleId="857">
+  <w:style w:type="table" w:styleId="859">
     <w:name w:val="Lined - Accent 1"/>
-    <w:basedOn w:val="896"/>
+    <w:basedOn w:val="898"/>
     <w:uiPriority w:val="99"/>
     <w:pPr>
       <w:pBdr/>
@@ -35992,9 +36068,9 @@
       </w:tcPr>
     </w:tblStylePr>
   </w:style>
-  <w:style w:type="table" w:styleId="858">
+  <w:style w:type="table" w:styleId="860">
     <w:name w:val="Lined - Accent 2"/>
-    <w:basedOn w:val="896"/>
+    <w:basedOn w:val="898"/>
     <w:uiPriority w:val="99"/>
     <w:pPr>
       <w:pBdr/>
@@ -36229,9 +36305,9 @@
       </w:tcPr>
     </w:tblStylePr>
   </w:style>
-  <w:style w:type="table" w:styleId="859">
+  <w:style w:type="table" w:styleId="861">
     <w:name w:val="Lined - Accent 3"/>
-    <w:basedOn w:val="896"/>
+    <w:basedOn w:val="898"/>
     <w:uiPriority w:val="99"/>
     <w:pPr>
       <w:pBdr/>
@@ -36466,9 +36542,9 @@
       </w:tcPr>
     </w:tblStylePr>
   </w:style>
-  <w:style w:type="table" w:styleId="860">
+  <w:style w:type="table" w:styleId="862">
     <w:name w:val="Lined - Accent 4"/>
-    <w:basedOn w:val="896"/>
+    <w:basedOn w:val="898"/>
     <w:uiPriority w:val="99"/>
     <w:pPr>
       <w:pBdr/>
@@ -36703,9 +36779,9 @@
       </w:tcPr>
     </w:tblStylePr>
   </w:style>
-  <w:style w:type="table" w:styleId="861">
+  <w:style w:type="table" w:styleId="863">
     <w:name w:val="Lined - Accent 5"/>
-    <w:basedOn w:val="896"/>
+    <w:basedOn w:val="898"/>
     <w:uiPriority w:val="99"/>
     <w:pPr>
       <w:pBdr/>
@@ -36940,9 +37016,9 @@
       </w:tcPr>
     </w:tblStylePr>
   </w:style>
-  <w:style w:type="table" w:styleId="862">
+  <w:style w:type="table" w:styleId="864">
     <w:name w:val="Lined - Accent 6"/>
-    <w:basedOn w:val="896"/>
+    <w:basedOn w:val="898"/>
     <w:uiPriority w:val="99"/>
     <w:pPr>
       <w:pBdr/>
@@ -37177,9 +37253,9 @@
       </w:tcPr>
     </w:tblStylePr>
   </w:style>
-  <w:style w:type="table" w:styleId="863">
+  <w:style w:type="table" w:styleId="865">
     <w:name w:val="Bordered &amp; Lined - Accent"/>
-    <w:basedOn w:val="896"/>
+    <w:basedOn w:val="898"/>
     <w:uiPriority w:val="99"/>
     <w:pPr>
       <w:pBdr/>
@@ -37421,9 +37497,9 @@
       </w:tcPr>
     </w:tblStylePr>
   </w:style>
-  <w:style w:type="table" w:styleId="864">
+  <w:style w:type="table" w:styleId="866">
     <w:name w:val="Bordered &amp; Lined - Accent 1"/>
-    <w:basedOn w:val="896"/>
+    <w:basedOn w:val="898"/>
     <w:uiPriority w:val="99"/>
     <w:pPr>
       <w:pBdr/>
@@ -37665,9 +37741,9 @@
       </w:tcPr>
     </w:tblStylePr>
   </w:style>
-  <w:style w:type="table" w:styleId="865">
+  <w:style w:type="table" w:styleId="867">
     <w:name w:val="Bordered &amp; Lined - Accent 2"/>
-    <w:basedOn w:val="896"/>
+    <w:basedOn w:val="898"/>
     <w:uiPriority w:val="99"/>
     <w:pPr>
       <w:pBdr/>
@@ -37909,9 +37985,9 @@
       </w:tcPr>
     </w:tblStylePr>
   </w:style>
-  <w:style w:type="table" w:styleId="866">
+  <w:style w:type="table" w:styleId="868">
     <w:name w:val="Bordered &amp; Lined - Accent 3"/>
-    <w:basedOn w:val="896"/>
+    <w:basedOn w:val="898"/>
     <w:uiPriority w:val="99"/>
     <w:pPr>
       <w:pBdr/>
@@ -38153,9 +38229,9 @@
       </w:tcPr>
     </w:tblStylePr>
   </w:style>
-  <w:style w:type="table" w:styleId="867">
+  <w:style w:type="table" w:styleId="869">
     <w:name w:val="Bordered &amp; Lined - Accent 4"/>
-    <w:basedOn w:val="896"/>
+    <w:basedOn w:val="898"/>
     <w:uiPriority w:val="99"/>
     <w:pPr>
       <w:pBdr/>
@@ -38397,9 +38473,9 @@
       </w:tcPr>
     </w:tblStylePr>
   </w:style>
-  <w:style w:type="table" w:styleId="868">
+  <w:style w:type="table" w:styleId="870">
     <w:name w:val="Bordered &amp; Lined - Accent 5"/>
-    <w:basedOn w:val="896"/>
+    <w:basedOn w:val="898"/>
     <w:uiPriority w:val="99"/>
     <w:pPr>
       <w:pBdr/>
@@ -38641,9 +38717,9 @@
       </w:tcPr>
     </w:tblStylePr>
   </w:style>
-  <w:style w:type="table" w:styleId="869">
+  <w:style w:type="table" w:styleId="871">
     <w:name w:val="Bordered &amp; Lined - Accent 6"/>
-    <w:basedOn w:val="896"/>
+    <w:basedOn w:val="898"/>
     <w:uiPriority w:val="99"/>
     <w:pPr>
       <w:pBdr/>
@@ -38885,9 +38961,9 @@
       </w:tcPr>
     </w:tblStylePr>
   </w:style>
-  <w:style w:type="table" w:styleId="870">
+  <w:style w:type="table" w:styleId="872">
     <w:name w:val="Bordered"/>
-    <w:basedOn w:val="896"/>
+    <w:basedOn w:val="898"/>
     <w:uiPriority w:val="99"/>
     <w:pPr>
       <w:pBdr/>
@@ -39116,9 +39192,9 @@
       </w:tcPr>
     </w:tblStylePr>
   </w:style>
-  <w:style w:type="table" w:styleId="871">
+  <w:style w:type="table" w:styleId="873">
     <w:name w:val="Bordered - Accent 1"/>
-    <w:basedOn w:val="896"/>
+    <w:basedOn w:val="898"/>
     <w:uiPriority w:val="99"/>
     <w:pPr>
       <w:pBdr/>
@@ -39347,9 +39423,9 @@
       </w:tcPr>
     </w:tblStylePr>
   </w:style>
-  <w:style w:type="table" w:styleId="872">
+  <w:style w:type="table" w:styleId="874">
     <w:name w:val="Bordered - Accent 2"/>
-    <w:basedOn w:val="896"/>
+    <w:basedOn w:val="898"/>
     <w:uiPriority w:val="99"/>
     <w:pPr>
       <w:pBdr/>
@@ -39578,9 +39654,9 @@
       </w:tcPr>
     </w:tblStylePr>
   </w:style>
-  <w:style w:type="table" w:styleId="873">
+  <w:style w:type="table" w:styleId="875">
     <w:name w:val="Bordered - Accent 3"/>
-    <w:basedOn w:val="896"/>
+    <w:basedOn w:val="898"/>
     <w:uiPriority w:val="99"/>
     <w:pPr>
       <w:pBdr/>
@@ -39809,9 +39885,9 @@
       </w:tcPr>
     </w:tblStylePr>
   </w:style>
-  <w:style w:type="table" w:styleId="874">
+  <w:style w:type="table" w:styleId="876">
     <w:name w:val="Bordered - Accent 4"/>
-    <w:basedOn w:val="896"/>
+    <w:basedOn w:val="898"/>
     <w:uiPriority w:val="99"/>
     <w:pPr>
       <w:pBdr/>
@@ -40040,9 +40116,9 @@
       </w:tcPr>
     </w:tblStylePr>
   </w:style>
-  <w:style w:type="table" w:styleId="875">
+  <w:style w:type="table" w:styleId="877">
     <w:name w:val="Bordered - Accent 5"/>
-    <w:basedOn w:val="896"/>
+    <w:basedOn w:val="898"/>
     <w:uiPriority w:val="99"/>
     <w:pPr>
       <w:pBdr/>
@@ -40271,9 +40347,9 @@
       </w:tcPr>
     </w:tblStylePr>
   </w:style>
-  <w:style w:type="table" w:styleId="876">
+  <w:style w:type="table" w:styleId="878">
     <w:name w:val="Bordered - Accent 6"/>
-    <w:basedOn w:val="896"/>
+    <w:basedOn w:val="898"/>
     <w:uiPriority w:val="99"/>
     <w:pPr>
       <w:pBdr/>
@@ -40502,7 +40578,7 @@
       </w:tcPr>
     </w:tblStylePr>
   </w:style>
-  <w:style w:type="character" w:styleId="877">
+  <w:style w:type="character" w:styleId="879">
     <w:name w:val="Hyperlink"/>
     <w:uiPriority w:val="99"/>
     <w:unhideWhenUsed/>
@@ -40516,10 +40592,10 @@
       <w:u w:val="single"/>
     </w:rPr>
   </w:style>
-  <w:style w:type="paragraph" w:styleId="878">
+  <w:style w:type="paragraph" w:styleId="880">
     <w:name w:val="footnote text"/>
-    <w:basedOn w:val="895"/>
-    <w:link w:val="879"/>
+    <w:basedOn w:val="897"/>
+    <w:link w:val="881"/>
     <w:uiPriority w:val="99"/>
     <w:semiHidden/>
     <w:unhideWhenUsed/>
@@ -40532,9 +40608,9 @@
       <w:sz w:val="18"/>
     </w:rPr>
   </w:style>
-  <w:style w:type="character" w:styleId="879">
+  <w:style w:type="character" w:styleId="881">
     <w:name w:val="Footnote Text Char"/>
-    <w:link w:val="878"/>
+    <w:link w:val="880"/>
     <w:uiPriority w:val="99"/>
     <w:pPr>
       <w:pBdr/>
@@ -40545,7 +40621,7 @@
       <w:sz w:val="18"/>
     </w:rPr>
   </w:style>
-  <w:style w:type="character" w:styleId="880">
+  <w:style w:type="character" w:styleId="882">
     <w:name w:val="footnote reference"/>
     <w:uiPriority w:val="99"/>
     <w:unhideWhenUsed/>
@@ -40558,10 +40634,10 @@
       <w:vertAlign w:val="superscript"/>
     </w:rPr>
   </w:style>
-  <w:style w:type="paragraph" w:styleId="881">
+  <w:style w:type="paragraph" w:styleId="883">
     <w:name w:val="endnote text"/>
-    <w:basedOn w:val="895"/>
-    <w:link w:val="882"/>
+    <w:basedOn w:val="897"/>
+    <w:link w:val="884"/>
     <w:uiPriority w:val="99"/>
     <w:semiHidden/>
     <w:unhideWhenUsed/>
@@ -40574,9 +40650,9 @@
       <w:sz w:val="20"/>
     </w:rPr>
   </w:style>
-  <w:style w:type="character" w:styleId="882">
+  <w:style w:type="character" w:styleId="884">
     <w:name w:val="Endnote Text Char"/>
-    <w:link w:val="881"/>
+    <w:link w:val="883"/>
     <w:uiPriority w:val="99"/>
     <w:pPr>
       <w:pBdr/>
@@ -40587,7 +40663,7 @@
       <w:sz w:val="20"/>
     </w:rPr>
   </w:style>
-  <w:style w:type="character" w:styleId="883">
+  <w:style w:type="character" w:styleId="885">
     <w:name w:val="endnote reference"/>
     <w:uiPriority w:val="99"/>
     <w:semiHidden/>
@@ -40601,10 +40677,10 @@
       <w:vertAlign w:val="superscript"/>
     </w:rPr>
   </w:style>
-  <w:style w:type="paragraph" w:styleId="884">
+  <w:style w:type="paragraph" w:styleId="886">
     <w:name w:val="toc 1"/>
-    <w:basedOn w:val="895"/>
-    <w:next w:val="895"/>
+    <w:basedOn w:val="897"/>
+    <w:next w:val="897"/>
     <w:uiPriority w:val="39"/>
     <w:unhideWhenUsed/>
     <w:pPr>
@@ -40613,10 +40689,10 @@
       <w:ind w:right="0" w:firstLine="0" w:left="0"/>
     </w:pPr>
   </w:style>
-  <w:style w:type="paragraph" w:styleId="885">
+  <w:style w:type="paragraph" w:styleId="887">
     <w:name w:val="toc 2"/>
-    <w:basedOn w:val="895"/>
-    <w:next w:val="895"/>
+    <w:basedOn w:val="897"/>
+    <w:next w:val="897"/>
     <w:uiPriority w:val="39"/>
     <w:unhideWhenUsed/>
     <w:pPr>
@@ -40625,10 +40701,10 @@
       <w:ind w:right="0" w:firstLine="0" w:left="283"/>
     </w:pPr>
   </w:style>
-  <w:style w:type="paragraph" w:styleId="886">
+  <w:style w:type="paragraph" w:styleId="888">
     <w:name w:val="toc 3"/>
-    <w:basedOn w:val="895"/>
-    <w:next w:val="895"/>
+    <w:basedOn w:val="897"/>
+    <w:next w:val="897"/>
     <w:uiPriority w:val="39"/>
     <w:unhideWhenUsed/>
     <w:pPr>
@@ -40637,10 +40713,10 @@
       <w:ind w:right="0" w:firstLine="0" w:left="567"/>
     </w:pPr>
   </w:style>
-  <w:style w:type="paragraph" w:styleId="887">
+  <w:style w:type="paragraph" w:styleId="889">
     <w:name w:val="toc 4"/>
-    <w:basedOn w:val="895"/>
-    <w:next w:val="895"/>
+    <w:basedOn w:val="897"/>
+    <w:next w:val="897"/>
     <w:uiPriority w:val="39"/>
     <w:unhideWhenUsed/>
     <w:pPr>
@@ -40649,10 +40725,10 @@
       <w:ind w:right="0" w:firstLine="0" w:left="850"/>
     </w:pPr>
   </w:style>
-  <w:style w:type="paragraph" w:styleId="888">
+  <w:style w:type="paragraph" w:styleId="890">
     <w:name w:val="toc 5"/>
-    <w:basedOn w:val="895"/>
-    <w:next w:val="895"/>
+    <w:basedOn w:val="897"/>
+    <w:next w:val="897"/>
     <w:uiPriority w:val="39"/>
     <w:unhideWhenUsed/>
     <w:pPr>
@@ -40661,10 +40737,10 @@
       <w:ind w:right="0" w:firstLine="0" w:left="1134"/>
     </w:pPr>
   </w:style>
-  <w:style w:type="paragraph" w:styleId="889">
+  <w:style w:type="paragraph" w:styleId="891">
     <w:name w:val="toc 6"/>
-    <w:basedOn w:val="895"/>
-    <w:next w:val="895"/>
+    <w:basedOn w:val="897"/>
+    <w:next w:val="897"/>
     <w:uiPriority w:val="39"/>
     <w:unhideWhenUsed/>
     <w:pPr>
@@ -40673,10 +40749,10 @@
       <w:ind w:right="0" w:firstLine="0" w:left="1417"/>
     </w:pPr>
   </w:style>
-  <w:style w:type="paragraph" w:styleId="890">
+  <w:style w:type="paragraph" w:styleId="892">
     <w:name w:val="toc 7"/>
-    <w:basedOn w:val="895"/>
-    <w:next w:val="895"/>
+    <w:basedOn w:val="897"/>
+    <w:next w:val="897"/>
     <w:uiPriority w:val="39"/>
     <w:unhideWhenUsed/>
     <w:pPr>
@@ -40685,10 +40761,10 @@
       <w:ind w:right="0" w:firstLine="0" w:left="1701"/>
     </w:pPr>
   </w:style>
-  <w:style w:type="paragraph" w:styleId="891">
+  <w:style w:type="paragraph" w:styleId="893">
     <w:name w:val="toc 8"/>
-    <w:basedOn w:val="895"/>
-    <w:next w:val="895"/>
+    <w:basedOn w:val="897"/>
+    <w:next w:val="897"/>
     <w:uiPriority w:val="39"/>
     <w:unhideWhenUsed/>
     <w:pPr>
@@ -40697,10 +40773,10 @@
       <w:ind w:right="0" w:firstLine="0" w:left="1984"/>
     </w:pPr>
   </w:style>
-  <w:style w:type="paragraph" w:styleId="892">
+  <w:style w:type="paragraph" w:styleId="894">
     <w:name w:val="toc 9"/>
-    <w:basedOn w:val="895"/>
-    <w:next w:val="895"/>
+    <w:basedOn w:val="897"/>
+    <w:next w:val="897"/>
     <w:uiPriority w:val="39"/>
     <w:unhideWhenUsed/>
     <w:pPr>
@@ -40709,7 +40785,7 @@
       <w:ind w:right="0" w:firstLine="0" w:left="2268"/>
     </w:pPr>
   </w:style>
-  <w:style w:type="paragraph" w:styleId="893">
+  <w:style w:type="paragraph" w:styleId="895">
     <w:name w:val="TOC Heading"/>
     <w:uiPriority w:val="39"/>
     <w:unhideWhenUsed/>
@@ -40719,10 +40795,10 @@
       <w:ind/>
     </w:pPr>
   </w:style>
-  <w:style w:type="paragraph" w:styleId="894">
+  <w:style w:type="paragraph" w:styleId="896">
     <w:name w:val="table of figures"/>
-    <w:basedOn w:val="895"/>
-    <w:next w:val="895"/>
+    <w:basedOn w:val="897"/>
+    <w:next w:val="897"/>
     <w:uiPriority w:val="99"/>
     <w:unhideWhenUsed/>
     <w:pPr>
@@ -40731,7 +40807,7 @@
       <w:ind/>
     </w:pPr>
   </w:style>
-  <w:style w:type="paragraph" w:styleId="895" w:default="1">
+  <w:style w:type="paragraph" w:styleId="897" w:default="1">
     <w:name w:val="Normal"/>
     <w:qFormat/>
     <w:pPr>
@@ -40740,7 +40816,7 @@
       <w:ind/>
     </w:pPr>
   </w:style>
-  <w:style w:type="table" w:styleId="896" w:default="1">
+  <w:style w:type="table" w:styleId="898" w:default="1">
     <w:name w:val="Normal Table"/>
     <w:uiPriority w:val="99"/>
     <w:semiHidden/>
@@ -40933,7 +41009,7 @@
       </w:tcPr>
     </w:tblStylePr>
   </w:style>
-  <w:style w:type="numbering" w:styleId="897" w:default="1">
+  <w:style w:type="numbering" w:styleId="899" w:default="1">
     <w:name w:val="No List"/>
     <w:uiPriority w:val="99"/>
     <w:semiHidden/>
@@ -40944,9 +41020,9 @@
       <w:ind/>
     </w:pPr>
   </w:style>
-  <w:style w:type="paragraph" w:styleId="898">
+  <w:style w:type="paragraph" w:styleId="900">
     <w:name w:val="No Spacing"/>
-    <w:basedOn w:val="895"/>
+    <w:basedOn w:val="897"/>
     <w:uiPriority w:val="1"/>
     <w:qFormat/>
     <w:pPr>
@@ -40955,9 +41031,9 @@
       <w:ind/>
     </w:pPr>
   </w:style>
-  <w:style w:type="paragraph" w:styleId="899">
+  <w:style w:type="paragraph" w:styleId="901">
     <w:name w:val="List Paragraph"/>
-    <w:basedOn w:val="895"/>
+    <w:basedOn w:val="897"/>
     <w:uiPriority w:val="34"/>
     <w:qFormat/>
     <w:pPr>
@@ -40967,7 +41043,7 @@
       <w:contextualSpacing w:val="true"/>
     </w:pPr>
   </w:style>
-  <w:style w:type="character" w:styleId="900" w:default="1">
+  <w:style w:type="character" w:styleId="902" w:default="1">
     <w:name w:val="Default Paragraph Font"/>
     <w:uiPriority w:val="1"/>
     <w:semiHidden/>

</xml_diff>

<commit_message>
15 tests, going strong.
</commit_message>
<xml_diff>
--- a/Analysis.docx
+++ b/Analysis.docx
@@ -8436,7 +8436,7 @@
         <w:rPr>
           <w:highlight w:val="none"/>
         </w:rPr>
-        <w:t xml:space="preserve">Explain how Newtonian physics connects to the solar system</w:t>
+        <w:t xml:space="preserve">Explain how Newtonian physics connects to the solar system through force diagrams and showing key concepts like energy conservation</w:t>
       </w:r>
       <w:r>
         <w:rPr>
@@ -8461,7 +8461,32 @@
         <w:rPr>
           <w:highlight w:val="none"/>
         </w:rPr>
-        <w:t xml:space="preserve">Include force diagrams to aid with this</w:t>
+        <w:t xml:space="preserve">Include force diagrams to aid with this by showing how the forces cause the motion of the planets</w:t>
+      </w:r>
+      <w:r>
+        <w:rPr>
+          <w:highlight w:val="none"/>
+        </w:rPr>
+      </w:r>
+      <w:r/>
+    </w:p>
+    <w:p>
+      <w:pPr>
+        <w:pStyle w:val="901"/>
+        <w:numPr>
+          <w:ilvl w:val="1"/>
+          <w:numId w:val="7"/>
+        </w:numPr>
+        <w:pBdr/>
+        <w:spacing/>
+        <w:ind/>
+        <w:rPr/>
+      </w:pPr>
+      <w:r>
+        <w:rPr>
+          <w:highlight w:val="none"/>
+        </w:rPr>
+        <w:t xml:space="preserve">Have a menu that displays stats and lets the user edit certain values as requested by client</w:t>
       </w:r>
       <w:r>
         <w:rPr>
@@ -8486,57 +8511,7 @@
         <w:rPr>
           <w:highlight w:val="none"/>
         </w:rPr>
-        <w:t xml:space="preserve">Have a total energy counter + momentum counter to show that they never change</w:t>
-      </w:r>
-      <w:r>
-        <w:rPr>
-          <w:highlight w:val="none"/>
-        </w:rPr>
-      </w:r>
-      <w:r/>
-    </w:p>
-    <w:p>
-      <w:pPr>
-        <w:pStyle w:val="901"/>
-        <w:numPr>
-          <w:ilvl w:val="1"/>
-          <w:numId w:val="7"/>
-        </w:numPr>
-        <w:pBdr/>
-        <w:spacing/>
-        <w:ind/>
-        <w:rPr/>
-      </w:pPr>
-      <w:r>
-        <w:rPr>
-          <w:highlight w:val="none"/>
-        </w:rPr>
-        <w:t xml:space="preserve">Have a menu that displays stats and lets the user edit certain values as requested by client</w:t>
-      </w:r>
-      <w:r>
-        <w:rPr>
-          <w:highlight w:val="none"/>
-        </w:rPr>
-      </w:r>
-      <w:r/>
-    </w:p>
-    <w:p>
-      <w:pPr>
-        <w:pStyle w:val="901"/>
-        <w:numPr>
-          <w:ilvl w:val="2"/>
-          <w:numId w:val="7"/>
-        </w:numPr>
-        <w:pBdr/>
-        <w:spacing/>
-        <w:ind/>
-        <w:rPr/>
-      </w:pPr>
-      <w:r>
-        <w:rPr>
-          <w:highlight w:val="none"/>
-        </w:rPr>
-        <w:t xml:space="preserve">Should display kinetic, potential and total energy, and momentum</w:t>
+        <w:t xml:space="preserve">Should display kinetic, potential and total energy, and momentum (This aids objective 2b, explaining how Newtonian physics connects to the solar system.)</w:t>
       </w:r>
       <w:r>
         <w:rPr>

</xml_diff>

<commit_message>
Just a tiny bit more analysis.
</commit_message>
<xml_diff>
--- a/Analysis.docx
+++ b/Analysis.docx
@@ -4,7 +4,7 @@
   <w:body>
     <w:p>
       <w:pPr>
-        <w:pStyle w:val="721"/>
+        <w:pStyle w:val="678"/>
         <w:pBdr/>
         <w:spacing w:line="141" w:lineRule="atLeast"/>
         <w:ind/>
@@ -37,7 +37,7 @@
     </w:p>
     <w:p>
       <w:pPr>
-        <w:pStyle w:val="725"/>
+        <w:pStyle w:val="682"/>
         <w:pBdr/>
         <w:spacing/>
         <w:ind/>
@@ -115,7 +115,7 @@
     </w:p>
     <w:p>
       <w:pPr>
-        <w:pStyle w:val="725"/>
+        <w:pStyle w:val="682"/>
         <w:pBdr/>
         <w:spacing/>
         <w:ind/>
@@ -155,7 +155,7 @@
     </w:p>
     <w:p>
       <w:pPr>
-        <w:pStyle w:val="901"/>
+        <w:pStyle w:val="858"/>
         <w:numPr>
           <w:ilvl w:val="0"/>
           <w:numId w:val="1"/>
@@ -195,7 +195,7 @@
     </w:p>
     <w:p>
       <w:pPr>
-        <w:pStyle w:val="901"/>
+        <w:pStyle w:val="858"/>
         <w:numPr>
           <w:ilvl w:val="0"/>
           <w:numId w:val="1"/>
@@ -464,7 +464,7 @@
     </w:p>
     <w:p>
       <w:pPr>
-        <w:pStyle w:val="725"/>
+        <w:pStyle w:val="682"/>
         <w:pBdr/>
         <w:spacing/>
         <w:ind/>
@@ -835,14 +835,14 @@
       <w:hyperlink r:id="rId10" w:tooltip="https://eyes.nasa.gov/apps/orrery/#/home." w:history="1">
         <w:r>
           <w:rPr>
-            <w:rStyle w:val="879"/>
+            <w:rStyle w:val="836"/>
             <w:highlight w:val="none"/>
           </w:rPr>
           <w:t xml:space="preserve">https://eyes.nasa.gov/apps/orrery/#/home</w:t>
         </w:r>
         <w:r>
           <w:rPr>
-            <w:rStyle w:val="879"/>
+            <w:rStyle w:val="836"/>
             <w:highlight w:val="none"/>
           </w:rPr>
           <w:t xml:space="preserve">.</w:t>
@@ -919,20 +919,20 @@
       <w:hyperlink r:id="rId11" w:tooltip="https://phet.colorado.edu/sims/html/my-solar-system/latest/my-solar-system_all.html" w:history="1">
         <w:r>
           <w:rPr>
-            <w:rStyle w:val="879"/>
+            <w:rStyle w:val="836"/>
             <w:highlight w:val="none"/>
           </w:rPr>
           <w:t xml:space="preserve">https://phet.colorado.edu/sims/html/my-solar-system/latest/my-solar-system_all.html</w:t>
         </w:r>
         <w:r>
           <w:rPr>
-            <w:rStyle w:val="879"/>
+            <w:rStyle w:val="836"/>
             <w:highlight w:val="none"/>
           </w:rPr>
         </w:r>
         <w:r>
           <w:rPr>
-            <w:rStyle w:val="879"/>
+            <w:rStyle w:val="836"/>
             <w:highlight w:val="none"/>
           </w:rPr>
         </w:r>
@@ -1655,7 +1655,7 @@
     </w:p>
     <w:p>
       <w:pPr>
-        <w:pStyle w:val="901"/>
+        <w:pStyle w:val="858"/>
         <w:numPr>
           <w:ilvl w:val="0"/>
           <w:numId w:val="2"/>
@@ -1686,7 +1686,7 @@
     </w:p>
     <w:p>
       <w:pPr>
-        <w:pStyle w:val="901"/>
+        <w:pStyle w:val="858"/>
         <w:numPr>
           <w:ilvl w:val="0"/>
           <w:numId w:val="2"/>
@@ -1717,7 +1717,7 @@
     </w:p>
     <w:p>
       <w:pPr>
-        <w:pStyle w:val="901"/>
+        <w:pStyle w:val="858"/>
         <w:numPr>
           <w:ilvl w:val="0"/>
           <w:numId w:val="2"/>
@@ -1748,7 +1748,7 @@
     </w:p>
     <w:p>
       <w:pPr>
-        <w:pStyle w:val="901"/>
+        <w:pStyle w:val="858"/>
         <w:numPr>
           <w:ilvl w:val="0"/>
           <w:numId w:val="2"/>
@@ -1779,7 +1779,7 @@
     </w:p>
     <w:p>
       <w:pPr>
-        <w:pStyle w:val="901"/>
+        <w:pStyle w:val="858"/>
         <w:numPr>
           <w:ilvl w:val="0"/>
           <w:numId w:val="2"/>
@@ -2000,7 +2000,7 @@
     </w:p>
     <w:p>
       <w:pPr>
-        <w:pStyle w:val="723"/>
+        <w:pStyle w:val="680"/>
         <w:pBdr/>
         <w:spacing/>
         <w:ind/>
@@ -2028,7 +2028,7 @@
     </w:p>
     <w:p>
       <w:pPr>
-        <w:pStyle w:val="725"/>
+        <w:pStyle w:val="682"/>
         <w:pBdr/>
         <w:spacing/>
         <w:ind/>
@@ -2071,29 +2071,29 @@
       <w:hyperlink r:id="rId12" w:tooltip="https://eyes.nasa.gov/apps/orrery/#/home" w:history="1">
         <w:r>
           <w:rPr>
-            <w:rStyle w:val="879"/>
+            <w:rStyle w:val="836"/>
             <w:highlight w:val="none"/>
           </w:rPr>
           <w:t xml:space="preserve">https://eyes.nasa.gov/apps/orrery/#/home</w:t>
         </w:r>
         <w:r>
           <w:rPr>
-            <w:rStyle w:val="879"/>
+            <w:rStyle w:val="836"/>
           </w:rPr>
         </w:r>
         <w:r>
           <w:rPr>
-            <w:rStyle w:val="879"/>
+            <w:rStyle w:val="836"/>
           </w:rPr>
         </w:r>
         <w:r>
           <w:rPr>
-            <w:rStyle w:val="879"/>
+            <w:rStyle w:val="836"/>
           </w:rPr>
         </w:r>
         <w:r>
           <w:rPr>
-            <w:rStyle w:val="879"/>
+            <w:rStyle w:val="836"/>
           </w:rPr>
         </w:r>
       </w:hyperlink>
@@ -2310,7 +2310,7 @@
     </w:p>
     <w:p>
       <w:pPr>
-        <w:pStyle w:val="725"/>
+        <w:pStyle w:val="682"/>
         <w:pBdr/>
         <w:spacing/>
         <w:ind/>
@@ -2349,18 +2349,18 @@
       <w:hyperlink r:id="rId14" w:tooltip="https://phet.colorado.edu/sims/html/my-solar-system/latest/my-solar-system_all.html" w:history="1">
         <w:r>
           <w:rPr>
-            <w:rStyle w:val="879"/>
+            <w:rStyle w:val="836"/>
           </w:rPr>
           <w:t xml:space="preserve">https://phet.colorado.edu/sims/html/my-solar-system/latest/my-solar-system_all.html</w:t>
         </w:r>
         <w:r>
           <w:rPr>
-            <w:rStyle w:val="879"/>
+            <w:rStyle w:val="836"/>
           </w:rPr>
         </w:r>
         <w:r>
           <w:rPr>
-            <w:rStyle w:val="879"/>
+            <w:rStyle w:val="836"/>
           </w:rPr>
         </w:r>
       </w:hyperlink>
@@ -2551,7 +2551,7 @@
     </w:p>
     <w:p>
       <w:pPr>
-        <w:pStyle w:val="723"/>
+        <w:pStyle w:val="680"/>
         <w:pBdr/>
         <w:spacing/>
         <w:ind/>
@@ -2628,7 +2628,7 @@
     </w:p>
     <w:p>
       <w:pPr>
-        <w:pStyle w:val="901"/>
+        <w:pStyle w:val="858"/>
         <w:numPr>
           <w:ilvl w:val="0"/>
           <w:numId w:val="3"/>
@@ -2645,7 +2645,7 @@
     </w:p>
     <w:p>
       <w:pPr>
-        <w:pStyle w:val="901"/>
+        <w:pStyle w:val="858"/>
         <w:numPr>
           <w:ilvl w:val="0"/>
           <w:numId w:val="3"/>
@@ -2670,7 +2670,7 @@
     </w:p>
     <w:p>
       <w:pPr>
-        <w:pStyle w:val="901"/>
+        <w:pStyle w:val="858"/>
         <w:numPr>
           <w:ilvl w:val="0"/>
           <w:numId w:val="3"/>
@@ -2695,7 +2695,7 @@
     </w:p>
     <w:p>
       <w:pPr>
-        <w:pStyle w:val="901"/>
+        <w:pStyle w:val="858"/>
         <w:numPr>
           <w:ilvl w:val="0"/>
           <w:numId w:val="3"/>
@@ -2730,7 +2730,7 @@
     </w:p>
     <w:p>
       <w:pPr>
-        <w:pStyle w:val="723"/>
+        <w:pStyle w:val="680"/>
         <w:pBdr/>
         <w:spacing/>
         <w:ind/>
@@ -2758,7 +2758,7 @@
     </w:p>
     <w:p>
       <w:pPr>
-        <w:pStyle w:val="725"/>
+        <w:pStyle w:val="682"/>
         <w:pBdr/>
         <w:spacing/>
         <w:ind/>
@@ -2977,7 +2977,7 @@
     </w:p>
     <w:p>
       <w:pPr>
-        <w:pStyle w:val="725"/>
+        <w:pStyle w:val="682"/>
         <w:pBdr/>
         <w:spacing/>
         <w:ind/>
@@ -3029,18 +3029,18 @@
       <w:hyperlink r:id="rId17" w:tooltip="https://ssd.jpl.nasa.gov/horizons/" w:history="1">
         <w:r>
           <w:rPr>
-            <w:rStyle w:val="879"/>
+            <w:rStyle w:val="836"/>
           </w:rPr>
           <w:t xml:space="preserve">https://ssd.jpl.nasa.gov/horizons/</w:t>
         </w:r>
         <w:r>
           <w:rPr>
-            <w:rStyle w:val="879"/>
+            <w:rStyle w:val="836"/>
           </w:rPr>
         </w:r>
         <w:r>
           <w:rPr>
-            <w:rStyle w:val="879"/>
+            <w:rStyle w:val="836"/>
           </w:rPr>
         </w:r>
       </w:hyperlink>
@@ -3162,7 +3162,7 @@
       <w:hyperlink r:id="rId18" w:tooltip="https://ssd.jpl.nasa.gov/api/horizons.api?format=text&amp;COMMAND='&quot;+target+&quot;'&amp;OBJ_DATA='YES'&amp;MAKE_EPHEM='YES'&amp;EPHEM_TYPE='VECTORS'&amp;START_TIME='&quot;+startTime+&quot;'&amp;STOP_TIME='&quot;+stopTime+&quot;'&amp;CENTER='500@0'&amp;STEP_SIZE='1 d'&amp;QUANTITIES='1,9,20,23,24,29'" w:history="1">
         <w:r>
           <w:rPr>
-            <w:rStyle w:val="879"/>
+            <w:rStyle w:val="836"/>
             <w:color w:val="000000" w:themeColor="text1"/>
             <w:sz w:val="22"/>
             <w:szCs w:val="18"/>
@@ -3172,7 +3172,7 @@
         </w:r>
         <w:r>
           <w:rPr>
-            <w:rStyle w:val="879"/>
+            <w:rStyle w:val="836"/>
             <w:color w:val="000000" w:themeColor="text1"/>
             <w:sz w:val="22"/>
             <w:szCs w:val="18"/>
@@ -3181,7 +3181,7 @@
         </w:r>
         <w:r>
           <w:rPr>
-            <w:rStyle w:val="879"/>
+            <w:rStyle w:val="836"/>
             <w:color w:val="000000" w:themeColor="text1"/>
             <w:sz w:val="22"/>
             <w:szCs w:val="18"/>
@@ -3322,7 +3322,7 @@
       <w:hyperlink r:id="rId19" w:tooltip="https://ssd-api.jpl.nasa.gov/doc/horizons.html#ephem_type" w:history="1">
         <w:r>
           <w:rPr>
-            <w:rStyle w:val="879"/>
+            <w:rStyle w:val="836"/>
             <w:color w:val="000000" w:themeColor="text1"/>
             <w:sz w:val="22"/>
             <w:szCs w:val="22"/>
@@ -3332,7 +3332,7 @@
         </w:r>
         <w:r>
           <w:rPr>
-            <w:rStyle w:val="879"/>
+            <w:rStyle w:val="836"/>
             <w:color w:val="000000" w:themeColor="text1"/>
             <w:sz w:val="22"/>
             <w:szCs w:val="22"/>
@@ -3341,7 +3341,7 @@
         </w:r>
         <w:r>
           <w:rPr>
-            <w:rStyle w:val="879"/>
+            <w:rStyle w:val="836"/>
             <w:color w:val="000000" w:themeColor="text1"/>
             <w:sz w:val="22"/>
             <w:szCs w:val="22"/>
@@ -3754,7 +3754,7 @@
     </w:p>
     <w:p>
       <w:pPr>
-        <w:pStyle w:val="725"/>
+        <w:pStyle w:val="682"/>
         <w:pBdr/>
         <w:spacing/>
         <w:ind/>
@@ -3803,7 +3803,7 @@
     </w:p>
     <w:p>
       <w:pPr>
-        <w:pStyle w:val="725"/>
+        <w:pStyle w:val="682"/>
         <w:pBdr/>
         <w:spacing/>
         <w:ind/>
@@ -3834,7 +3834,7 @@
     </w:p>
     <w:p>
       <w:pPr>
-        <w:pStyle w:val="725"/>
+        <w:pStyle w:val="682"/>
         <w:pBdr/>
         <w:spacing/>
         <w:ind/>
@@ -3866,7 +3866,7 @@
     </w:p>
     <w:p>
       <w:pPr>
-        <w:pStyle w:val="725"/>
+        <w:pStyle w:val="682"/>
         <w:pBdr/>
         <w:spacing/>
         <w:ind/>
@@ -5928,7 +5928,7 @@
     </w:p>
     <w:p>
       <w:pPr>
-        <w:pStyle w:val="725"/>
+        <w:pStyle w:val="682"/>
         <w:pBdr/>
         <w:spacing/>
         <w:ind/>
@@ -6746,7 +6746,7 @@
     </w:p>
     <w:p>
       <w:pPr>
-        <w:pStyle w:val="725"/>
+        <w:pStyle w:val="682"/>
         <w:pBdr/>
         <w:spacing/>
         <w:ind/>
@@ -6787,7 +6787,6 @@
       </w:r>
       <w:r>
         <w:rPr>
-          <w:color w:val="4472c4" w:themeColor="accent5"/>
           <w:highlight w:val="none"/>
         </w:rPr>
       </w:r>
@@ -6799,7 +6798,7 @@
     </w:p>
     <w:p>
       <w:pPr>
-        <w:pStyle w:val="901"/>
+        <w:pStyle w:val="858"/>
         <w:numPr>
           <w:ilvl w:val="0"/>
           <w:numId w:val="8"/>
@@ -6824,7 +6823,7 @@
     </w:p>
     <w:p>
       <w:pPr>
-        <w:pStyle w:val="901"/>
+        <w:pStyle w:val="858"/>
         <w:numPr>
           <w:ilvl w:val="0"/>
           <w:numId w:val="8"/>
@@ -6849,7 +6848,7 @@
     </w:p>
     <w:p>
       <w:pPr>
-        <w:pStyle w:val="901"/>
+        <w:pStyle w:val="858"/>
         <w:numPr>
           <w:ilvl w:val="0"/>
           <w:numId w:val="8"/>
@@ -6989,7 +6988,6 @@
       </w:r>
       <w:r>
         <w:rPr>
-          <w:color w:val="4472c4" w:themeColor="accent5"/>
           <w:highlight w:val="none"/>
         </w:rPr>
       </w:r>
@@ -7021,7 +7019,7 @@
     </w:p>
     <w:p>
       <w:pPr>
-        <w:pStyle w:val="725"/>
+        <w:pStyle w:val="682"/>
         <w:pBdr/>
         <w:spacing/>
         <w:ind/>
@@ -7595,7 +7593,7 @@
     </w:p>
     <w:p>
       <w:pPr>
-        <w:pStyle w:val="725"/>
+        <w:pStyle w:val="682"/>
         <w:pBdr/>
         <w:spacing/>
         <w:ind/>
@@ -8181,7 +8179,7 @@
     </w:p>
     <w:p>
       <w:pPr>
-        <w:pStyle w:val="725"/>
+        <w:pStyle w:val="682"/>
         <w:pBdr/>
         <w:spacing/>
         <w:ind/>
@@ -8210,7 +8208,7 @@
     </w:p>
     <w:p>
       <w:pPr>
-        <w:pStyle w:val="901"/>
+        <w:pStyle w:val="858"/>
         <w:numPr>
           <w:ilvl w:val="0"/>
           <w:numId w:val="7"/>
@@ -8227,7 +8225,7 @@
     </w:p>
     <w:p>
       <w:pPr>
-        <w:pStyle w:val="901"/>
+        <w:pStyle w:val="858"/>
         <w:numPr>
           <w:ilvl w:val="1"/>
           <w:numId w:val="7"/>
@@ -8252,7 +8250,7 @@
     </w:p>
     <w:p>
       <w:pPr>
-        <w:pStyle w:val="901"/>
+        <w:pStyle w:val="858"/>
         <w:numPr>
           <w:ilvl w:val="2"/>
           <w:numId w:val="7"/>
@@ -8277,7 +8275,7 @@
     </w:p>
     <w:p>
       <w:pPr>
-        <w:pStyle w:val="901"/>
+        <w:pStyle w:val="858"/>
         <w:numPr>
           <w:ilvl w:val="2"/>
           <w:numId w:val="7"/>
@@ -8302,7 +8300,7 @@
     </w:p>
     <w:p>
       <w:pPr>
-        <w:pStyle w:val="901"/>
+        <w:pStyle w:val="858"/>
         <w:numPr>
           <w:ilvl w:val="1"/>
           <w:numId w:val="7"/>
@@ -8327,7 +8325,7 @@
     </w:p>
     <w:p>
       <w:pPr>
-        <w:pStyle w:val="901"/>
+        <w:pStyle w:val="858"/>
         <w:numPr>
           <w:ilvl w:val="2"/>
           <w:numId w:val="7"/>
@@ -8352,7 +8350,7 @@
     </w:p>
     <w:p>
       <w:pPr>
-        <w:pStyle w:val="901"/>
+        <w:pStyle w:val="858"/>
         <w:numPr>
           <w:ilvl w:val="1"/>
           <w:numId w:val="7"/>
@@ -8372,7 +8370,7 @@
     </w:p>
     <w:p>
       <w:pPr>
-        <w:pStyle w:val="901"/>
+        <w:pStyle w:val="858"/>
         <w:numPr>
           <w:ilvl w:val="0"/>
           <w:numId w:val="7"/>
@@ -8397,7 +8395,7 @@
     </w:p>
     <w:p>
       <w:pPr>
-        <w:pStyle w:val="901"/>
+        <w:pStyle w:val="858"/>
         <w:numPr>
           <w:ilvl w:val="1"/>
           <w:numId w:val="7"/>
@@ -8422,7 +8420,7 @@
     </w:p>
     <w:p>
       <w:pPr>
-        <w:pStyle w:val="901"/>
+        <w:pStyle w:val="858"/>
         <w:numPr>
           <w:ilvl w:val="1"/>
           <w:numId w:val="7"/>
@@ -8447,7 +8445,7 @@
     </w:p>
     <w:p>
       <w:pPr>
-        <w:pStyle w:val="901"/>
+        <w:pStyle w:val="858"/>
         <w:numPr>
           <w:ilvl w:val="2"/>
           <w:numId w:val="7"/>
@@ -8472,7 +8470,7 @@
     </w:p>
     <w:p>
       <w:pPr>
-        <w:pStyle w:val="901"/>
+        <w:pStyle w:val="858"/>
         <w:numPr>
           <w:ilvl w:val="1"/>
           <w:numId w:val="7"/>
@@ -8497,7 +8495,7 @@
     </w:p>
     <w:p>
       <w:pPr>
-        <w:pStyle w:val="901"/>
+        <w:pStyle w:val="858"/>
         <w:numPr>
           <w:ilvl w:val="2"/>
           <w:numId w:val="7"/>
@@ -8522,7 +8520,7 @@
     </w:p>
     <w:p>
       <w:pPr>
-        <w:pStyle w:val="901"/>
+        <w:pStyle w:val="858"/>
         <w:numPr>
           <w:ilvl w:val="2"/>
           <w:numId w:val="7"/>
@@ -8547,7 +8545,7 @@
     </w:p>
     <w:p>
       <w:pPr>
-        <w:pStyle w:val="901"/>
+        <w:pStyle w:val="858"/>
         <w:numPr>
           <w:ilvl w:val="3"/>
           <w:numId w:val="7"/>
@@ -8572,7 +8570,7 @@
     </w:p>
     <w:p>
       <w:pPr>
-        <w:pStyle w:val="901"/>
+        <w:pStyle w:val="858"/>
         <w:numPr>
           <w:ilvl w:val="3"/>
           <w:numId w:val="7"/>
@@ -8597,7 +8595,7 @@
     </w:p>
     <w:p>
       <w:pPr>
-        <w:pStyle w:val="901"/>
+        <w:pStyle w:val="858"/>
         <w:numPr>
           <w:ilvl w:val="3"/>
           <w:numId w:val="7"/>
@@ -8622,7 +8620,7 @@
     </w:p>
     <w:p>
       <w:pPr>
-        <w:pStyle w:val="901"/>
+        <w:pStyle w:val="858"/>
         <w:numPr>
           <w:ilvl w:val="2"/>
           <w:numId w:val="7"/>
@@ -8647,7 +8645,7 @@
     </w:p>
     <w:p>
       <w:pPr>
-        <w:pStyle w:val="901"/>
+        <w:pStyle w:val="858"/>
         <w:numPr>
           <w:ilvl w:val="2"/>
           <w:numId w:val="7"/>
@@ -8668,10 +8666,11 @@
           <w:highlight w:val="none"/>
         </w:rPr>
       </w:r>
+      <w:r/>
     </w:p>
     <w:p>
       <w:pPr>
-        <w:pStyle w:val="901"/>
+        <w:pStyle w:val="858"/>
         <w:numPr>
           <w:ilvl w:val="3"/>
           <w:numId w:val="7"/>
@@ -8696,7 +8695,7 @@
     </w:p>
     <w:p>
       <w:pPr>
-        <w:pStyle w:val="901"/>
+        <w:pStyle w:val="858"/>
         <w:numPr>
           <w:ilvl w:val="4"/>
           <w:numId w:val="7"/>
@@ -8721,7 +8720,7 @@
     </w:p>
     <w:p>
       <w:pPr>
-        <w:pStyle w:val="901"/>
+        <w:pStyle w:val="858"/>
         <w:numPr>
           <w:ilvl w:val="3"/>
           <w:numId w:val="7"/>
@@ -8746,7 +8745,7 @@
     </w:p>
     <w:p>
       <w:pPr>
-        <w:pStyle w:val="901"/>
+        <w:pStyle w:val="858"/>
         <w:numPr>
           <w:ilvl w:val="4"/>
           <w:numId w:val="7"/>
@@ -8771,7 +8770,7 @@
     </w:p>
     <w:p>
       <w:pPr>
-        <w:pStyle w:val="901"/>
+        <w:pStyle w:val="858"/>
         <w:numPr>
           <w:ilvl w:val="1"/>
           <w:numId w:val="7"/>
@@ -8796,7 +8795,7 @@
     </w:p>
     <w:p>
       <w:pPr>
-        <w:pStyle w:val="901"/>
+        <w:pStyle w:val="858"/>
         <w:numPr>
           <w:ilvl w:val="0"/>
           <w:numId w:val="7"/>
@@ -8816,7 +8815,7 @@
     </w:p>
     <w:p>
       <w:pPr>
-        <w:pStyle w:val="901"/>
+        <w:pStyle w:val="858"/>
         <w:numPr>
           <w:ilvl w:val="1"/>
           <w:numId w:val="7"/>
@@ -8841,7 +8840,7 @@
     </w:p>
     <w:p>
       <w:pPr>
-        <w:pStyle w:val="901"/>
+        <w:pStyle w:val="858"/>
         <w:numPr>
           <w:ilvl w:val="1"/>
           <w:numId w:val="7"/>
@@ -8866,7 +8865,7 @@
     </w:p>
     <w:p>
       <w:pPr>
-        <w:pStyle w:val="901"/>
+        <w:pStyle w:val="858"/>
         <w:numPr>
           <w:ilvl w:val="1"/>
           <w:numId w:val="7"/>
@@ -8880,7 +8879,7 @@
         <w:rPr>
           <w:highlight w:val="none"/>
         </w:rPr>
-        <w:t xml:space="preserve">The user should be able to focus the camera on any planet of their choosing</w:t>
+        <w:t xml:space="preserve">The user should be able to focus the camera on any planet of their choosing, or on the center of mass</w:t>
       </w:r>
       <w:r>
         <w:rPr>
@@ -8891,7 +8890,7 @@
     </w:p>
     <w:p>
       <w:pPr>
-        <w:pStyle w:val="901"/>
+        <w:pStyle w:val="858"/>
         <w:numPr>
           <w:ilvl w:val="1"/>
           <w:numId w:val="7"/>
@@ -8916,7 +8915,7 @@
     </w:p>
     <w:p>
       <w:pPr>
-        <w:pStyle w:val="901"/>
+        <w:pStyle w:val="858"/>
         <w:numPr>
           <w:ilvl w:val="0"/>
           <w:numId w:val="7"/>
@@ -8941,7 +8940,7 @@
     </w:p>
     <w:p>
       <w:pPr>
-        <w:pStyle w:val="901"/>
+        <w:pStyle w:val="858"/>
         <w:numPr>
           <w:ilvl w:val="1"/>
           <w:numId w:val="7"/>
@@ -8962,10 +8961,11 @@
           <w:highlight w:val="none"/>
         </w:rPr>
       </w:r>
+      <w:r/>
     </w:p>
     <w:p>
       <w:pPr>
-        <w:pStyle w:val="901"/>
+        <w:pStyle w:val="858"/>
         <w:numPr>
           <w:ilvl w:val="0"/>
           <w:numId w:val="7"/>
@@ -8990,7 +8990,7 @@
     </w:p>
     <w:p>
       <w:pPr>
-        <w:pStyle w:val="901"/>
+        <w:pStyle w:val="858"/>
         <w:numPr>
           <w:ilvl w:val="1"/>
           <w:numId w:val="7"/>
@@ -9015,7 +9015,7 @@
     </w:p>
     <w:p>
       <w:pPr>
-        <w:pStyle w:val="901"/>
+        <w:pStyle w:val="858"/>
         <w:numPr>
           <w:ilvl w:val="1"/>
           <w:numId w:val="7"/>
@@ -9040,7 +9040,7 @@
     </w:p>
     <w:p>
       <w:pPr>
-        <w:pStyle w:val="901"/>
+        <w:pStyle w:val="858"/>
         <w:numPr>
           <w:ilvl w:val="0"/>
           <w:numId w:val="7"/>
@@ -9067,7 +9067,7 @@
       <w:footnotePr/>
       <w:endnotePr/>
       <w:type w:val="nextPage"/>
-      <w:pgSz w:h="16838" w:orient="portrait" w:w="11906"/>
+      <w:pgSz w:h="16838" w:orient="landscape" w:w="11906"/>
       <w:pgMar w:top="1134" w:right="850" w:bottom="1134" w:left="1701" w:header="709" w:footer="709" w:gutter="0"/>
       <w:cols w:num="1" w:sep="0" w:space="708" w:equalWidth="1"/>
     </w:sectPr>
@@ -10424,9 +10424,9 @@
     <w:lsdException w:name="Bibliography" w:uiPriority="37"/>
     <w:lsdException w:name="TOC Heading" w:uiPriority="39" w:qFormat="1"/>
   </w:latentStyles>
-  <w:style w:type="character" w:styleId="713">
+  <w:style w:type="character" w:styleId="670">
     <w:name w:val="Intense Emphasis"/>
-    <w:basedOn w:val="902"/>
+    <w:basedOn w:val="859"/>
     <w:uiPriority w:val="21"/>
     <w:qFormat/>
     <w:pPr>
@@ -10440,9 +10440,9 @@
       <w:color w:val="0f4761" w:themeColor="accent1" w:themeShade="BF"/>
     </w:rPr>
   </w:style>
-  <w:style w:type="character" w:styleId="714">
+  <w:style w:type="character" w:styleId="671">
     <w:name w:val="Intense Reference"/>
-    <w:basedOn w:val="902"/>
+    <w:basedOn w:val="859"/>
     <w:uiPriority w:val="32"/>
     <w:qFormat/>
     <w:pPr>
@@ -10458,9 +10458,9 @@
       <w:spacing w:val="5"/>
     </w:rPr>
   </w:style>
-  <w:style w:type="character" w:styleId="715">
+  <w:style w:type="character" w:styleId="672">
     <w:name w:val="Subtle Emphasis"/>
-    <w:basedOn w:val="902"/>
+    <w:basedOn w:val="859"/>
     <w:uiPriority w:val="19"/>
     <w:qFormat/>
     <w:pPr>
@@ -10474,9 +10474,9 @@
       <w:color w:val="404040" w:themeColor="text1" w:themeTint="BF"/>
     </w:rPr>
   </w:style>
-  <w:style w:type="character" w:styleId="716">
+  <w:style w:type="character" w:styleId="673">
     <w:name w:val="Emphasis"/>
-    <w:basedOn w:val="902"/>
+    <w:basedOn w:val="859"/>
     <w:uiPriority w:val="20"/>
     <w:qFormat/>
     <w:pPr>
@@ -10489,9 +10489,9 @@
       <w:iCs/>
     </w:rPr>
   </w:style>
-  <w:style w:type="character" w:styleId="717">
+  <w:style w:type="character" w:styleId="674">
     <w:name w:val="Strong"/>
-    <w:basedOn w:val="902"/>
+    <w:basedOn w:val="859"/>
     <w:uiPriority w:val="22"/>
     <w:qFormat/>
     <w:pPr>
@@ -10504,9 +10504,9 @@
       <w:bCs/>
     </w:rPr>
   </w:style>
-  <w:style w:type="character" w:styleId="718">
+  <w:style w:type="character" w:styleId="675">
     <w:name w:val="Subtle Reference"/>
-    <w:basedOn w:val="902"/>
+    <w:basedOn w:val="859"/>
     <w:uiPriority w:val="31"/>
     <w:qFormat/>
     <w:pPr>
@@ -10519,9 +10519,9 @@
       <w:color w:val="5a5a5a" w:themeColor="text1" w:themeTint="A5"/>
     </w:rPr>
   </w:style>
-  <w:style w:type="character" w:styleId="719">
+  <w:style w:type="character" w:styleId="676">
     <w:name w:val="Book Title"/>
-    <w:basedOn w:val="902"/>
+    <w:basedOn w:val="859"/>
     <w:uiPriority w:val="33"/>
     <w:qFormat/>
     <w:pPr>
@@ -10537,9 +10537,9 @@
       <w:spacing w:val="5"/>
     </w:rPr>
   </w:style>
-  <w:style w:type="character" w:styleId="720">
+  <w:style w:type="character" w:styleId="677">
     <w:name w:val="FollowedHyperlink"/>
-    <w:basedOn w:val="902"/>
+    <w:basedOn w:val="859"/>
     <w:uiPriority w:val="99"/>
     <w:semiHidden/>
     <w:unhideWhenUsed/>
@@ -10553,11 +10553,11 @@
       <w:u w:val="single"/>
     </w:rPr>
   </w:style>
-  <w:style w:type="paragraph" w:styleId="721">
+  <w:style w:type="paragraph" w:styleId="678">
     <w:name w:val="Heading 1"/>
-    <w:basedOn w:val="897"/>
-    <w:next w:val="897"/>
-    <w:link w:val="722"/>
+    <w:basedOn w:val="854"/>
+    <w:next w:val="854"/>
+    <w:link w:val="679"/>
     <w:uiPriority w:val="9"/>
     <w:qFormat/>
     <w:pPr>
@@ -10574,9 +10574,9 @@
       <w:szCs w:val="40"/>
     </w:rPr>
   </w:style>
-  <w:style w:type="character" w:styleId="722">
+  <w:style w:type="character" w:styleId="679">
     <w:name w:val="Heading 1 Char"/>
-    <w:link w:val="721"/>
+    <w:link w:val="678"/>
     <w:uiPriority w:val="9"/>
     <w:pPr>
       <w:pBdr/>
@@ -10589,11 +10589,11 @@
       <w:szCs w:val="40"/>
     </w:rPr>
   </w:style>
-  <w:style w:type="paragraph" w:styleId="723">
+  <w:style w:type="paragraph" w:styleId="680">
     <w:name w:val="Heading 2"/>
-    <w:basedOn w:val="897"/>
-    <w:next w:val="897"/>
-    <w:link w:val="724"/>
+    <w:basedOn w:val="854"/>
+    <w:next w:val="854"/>
+    <w:link w:val="681"/>
     <w:uiPriority w:val="9"/>
     <w:unhideWhenUsed/>
     <w:qFormat/>
@@ -10610,9 +10610,9 @@
       <w:sz w:val="34"/>
     </w:rPr>
   </w:style>
-  <w:style w:type="character" w:styleId="724">
+  <w:style w:type="character" w:styleId="681">
     <w:name w:val="Heading 2 Char"/>
-    <w:link w:val="723"/>
+    <w:link w:val="680"/>
     <w:uiPriority w:val="9"/>
     <w:pPr>
       <w:pBdr/>
@@ -10624,11 +10624,11 @@
       <w:sz w:val="34"/>
     </w:rPr>
   </w:style>
-  <w:style w:type="paragraph" w:styleId="725">
+  <w:style w:type="paragraph" w:styleId="682">
     <w:name w:val="Heading 3"/>
-    <w:basedOn w:val="897"/>
-    <w:next w:val="897"/>
-    <w:link w:val="726"/>
+    <w:basedOn w:val="854"/>
+    <w:next w:val="854"/>
+    <w:link w:val="683"/>
     <w:uiPriority w:val="9"/>
     <w:unhideWhenUsed/>
     <w:qFormat/>
@@ -10646,9 +10646,9 @@
       <w:szCs w:val="30"/>
     </w:rPr>
   </w:style>
-  <w:style w:type="character" w:styleId="726">
+  <w:style w:type="character" w:styleId="683">
     <w:name w:val="Heading 3 Char"/>
-    <w:link w:val="725"/>
+    <w:link w:val="682"/>
     <w:uiPriority w:val="9"/>
     <w:pPr>
       <w:pBdr/>
@@ -10661,11 +10661,11 @@
       <w:szCs w:val="30"/>
     </w:rPr>
   </w:style>
-  <w:style w:type="paragraph" w:styleId="727">
+  <w:style w:type="paragraph" w:styleId="684">
     <w:name w:val="Heading 4"/>
-    <w:basedOn w:val="897"/>
-    <w:next w:val="897"/>
-    <w:link w:val="728"/>
+    <w:basedOn w:val="854"/>
+    <w:next w:val="854"/>
+    <w:link w:val="685"/>
     <w:uiPriority w:val="9"/>
     <w:unhideWhenUsed/>
     <w:qFormat/>
@@ -10685,9 +10685,9 @@
       <w:szCs w:val="26"/>
     </w:rPr>
   </w:style>
-  <w:style w:type="character" w:styleId="728">
+  <w:style w:type="character" w:styleId="685">
     <w:name w:val="Heading 4 Char"/>
-    <w:link w:val="727"/>
+    <w:link w:val="684"/>
     <w:uiPriority w:val="9"/>
     <w:pPr>
       <w:pBdr/>
@@ -10702,11 +10702,11 @@
       <w:szCs w:val="26"/>
     </w:rPr>
   </w:style>
-  <w:style w:type="paragraph" w:styleId="729">
+  <w:style w:type="paragraph" w:styleId="686">
     <w:name w:val="Heading 5"/>
-    <w:basedOn w:val="897"/>
-    <w:next w:val="897"/>
-    <w:link w:val="730"/>
+    <w:basedOn w:val="854"/>
+    <w:next w:val="854"/>
+    <w:link w:val="687"/>
     <w:uiPriority w:val="9"/>
     <w:unhideWhenUsed/>
     <w:qFormat/>
@@ -10726,9 +10726,9 @@
       <w:szCs w:val="24"/>
     </w:rPr>
   </w:style>
-  <w:style w:type="character" w:styleId="730">
+  <w:style w:type="character" w:styleId="687">
     <w:name w:val="Heading 5 Char"/>
-    <w:link w:val="729"/>
+    <w:link w:val="686"/>
     <w:uiPriority w:val="9"/>
     <w:pPr>
       <w:pBdr/>
@@ -10743,11 +10743,11 @@
       <w:szCs w:val="24"/>
     </w:rPr>
   </w:style>
-  <w:style w:type="paragraph" w:styleId="731">
+  <w:style w:type="paragraph" w:styleId="688">
     <w:name w:val="Heading 6"/>
-    <w:basedOn w:val="897"/>
-    <w:next w:val="897"/>
-    <w:link w:val="732"/>
+    <w:basedOn w:val="854"/>
+    <w:next w:val="854"/>
+    <w:link w:val="689"/>
     <w:uiPriority w:val="9"/>
     <w:unhideWhenUsed/>
     <w:qFormat/>
@@ -10767,9 +10767,9 @@
       <w:szCs w:val="22"/>
     </w:rPr>
   </w:style>
-  <w:style w:type="character" w:styleId="732">
+  <w:style w:type="character" w:styleId="689">
     <w:name w:val="Heading 6 Char"/>
-    <w:link w:val="731"/>
+    <w:link w:val="688"/>
     <w:uiPriority w:val="9"/>
     <w:pPr>
       <w:pBdr/>
@@ -10784,11 +10784,11 @@
       <w:szCs w:val="22"/>
     </w:rPr>
   </w:style>
-  <w:style w:type="paragraph" w:styleId="733">
+  <w:style w:type="paragraph" w:styleId="690">
     <w:name w:val="Heading 7"/>
-    <w:basedOn w:val="897"/>
-    <w:next w:val="897"/>
-    <w:link w:val="734"/>
+    <w:basedOn w:val="854"/>
+    <w:next w:val="854"/>
+    <w:link w:val="691"/>
     <w:uiPriority w:val="9"/>
     <w:unhideWhenUsed/>
     <w:qFormat/>
@@ -10810,9 +10810,9 @@
       <w:szCs w:val="22"/>
     </w:rPr>
   </w:style>
-  <w:style w:type="character" w:styleId="734">
+  <w:style w:type="character" w:styleId="691">
     <w:name w:val="Heading 7 Char"/>
-    <w:link w:val="733"/>
+    <w:link w:val="690"/>
     <w:uiPriority w:val="9"/>
     <w:pPr>
       <w:pBdr/>
@@ -10829,11 +10829,11 @@
       <w:szCs w:val="22"/>
     </w:rPr>
   </w:style>
-  <w:style w:type="paragraph" w:styleId="735">
+  <w:style w:type="paragraph" w:styleId="692">
     <w:name w:val="Heading 8"/>
-    <w:basedOn w:val="897"/>
-    <w:next w:val="897"/>
-    <w:link w:val="736"/>
+    <w:basedOn w:val="854"/>
+    <w:next w:val="854"/>
+    <w:link w:val="693"/>
     <w:uiPriority w:val="9"/>
     <w:unhideWhenUsed/>
     <w:qFormat/>
@@ -10853,9 +10853,9 @@
       <w:szCs w:val="22"/>
     </w:rPr>
   </w:style>
-  <w:style w:type="character" w:styleId="736">
+  <w:style w:type="character" w:styleId="693">
     <w:name w:val="Heading 8 Char"/>
-    <w:link w:val="735"/>
+    <w:link w:val="692"/>
     <w:uiPriority w:val="9"/>
     <w:pPr>
       <w:pBdr/>
@@ -10870,11 +10870,11 @@
       <w:szCs w:val="22"/>
     </w:rPr>
   </w:style>
-  <w:style w:type="paragraph" w:styleId="737">
+  <w:style w:type="paragraph" w:styleId="694">
     <w:name w:val="Heading 9"/>
-    <w:basedOn w:val="897"/>
-    <w:next w:val="897"/>
-    <w:link w:val="738"/>
+    <w:basedOn w:val="854"/>
+    <w:next w:val="854"/>
+    <w:link w:val="695"/>
     <w:uiPriority w:val="9"/>
     <w:unhideWhenUsed/>
     <w:qFormat/>
@@ -10894,9 +10894,9 @@
       <w:szCs w:val="21"/>
     </w:rPr>
   </w:style>
-  <w:style w:type="character" w:styleId="738">
+  <w:style w:type="character" w:styleId="695">
     <w:name w:val="Heading 9 Char"/>
-    <w:link w:val="737"/>
+    <w:link w:val="694"/>
     <w:uiPriority w:val="9"/>
     <w:pPr>
       <w:pBdr/>
@@ -10911,11 +10911,11 @@
       <w:szCs w:val="21"/>
     </w:rPr>
   </w:style>
-  <w:style w:type="paragraph" w:styleId="739">
+  <w:style w:type="paragraph" w:styleId="696">
     <w:name w:val="Title"/>
-    <w:basedOn w:val="897"/>
-    <w:next w:val="897"/>
-    <w:link w:val="740"/>
+    <w:basedOn w:val="854"/>
+    <w:next w:val="854"/>
+    <w:link w:val="697"/>
     <w:uiPriority w:val="10"/>
     <w:qFormat/>
     <w:pPr>
@@ -10929,9 +10929,9 @@
       <w:szCs w:val="48"/>
     </w:rPr>
   </w:style>
-  <w:style w:type="character" w:styleId="740">
+  <w:style w:type="character" w:styleId="697">
     <w:name w:val="Title Char"/>
-    <w:link w:val="739"/>
+    <w:link w:val="696"/>
     <w:uiPriority w:val="10"/>
     <w:pPr>
       <w:pBdr/>
@@ -10943,11 +10943,11 @@
       <w:szCs w:val="48"/>
     </w:rPr>
   </w:style>
-  <w:style w:type="paragraph" w:styleId="741">
+  <w:style w:type="paragraph" w:styleId="698">
     <w:name w:val="Subtitle"/>
-    <w:basedOn w:val="897"/>
-    <w:next w:val="897"/>
-    <w:link w:val="742"/>
+    <w:basedOn w:val="854"/>
+    <w:next w:val="854"/>
+    <w:link w:val="699"/>
     <w:uiPriority w:val="11"/>
     <w:qFormat/>
     <w:pPr>
@@ -10960,9 +10960,9 @@
       <w:szCs w:val="24"/>
     </w:rPr>
   </w:style>
-  <w:style w:type="character" w:styleId="742">
+  <w:style w:type="character" w:styleId="699">
     <w:name w:val="Subtitle Char"/>
-    <w:link w:val="741"/>
+    <w:link w:val="698"/>
     <w:uiPriority w:val="11"/>
     <w:pPr>
       <w:pBdr/>
@@ -10974,11 +10974,11 @@
       <w:szCs w:val="24"/>
     </w:rPr>
   </w:style>
-  <w:style w:type="paragraph" w:styleId="743">
+  <w:style w:type="paragraph" w:styleId="700">
     <w:name w:val="Quote"/>
-    <w:basedOn w:val="897"/>
-    <w:next w:val="897"/>
-    <w:link w:val="744"/>
+    <w:basedOn w:val="854"/>
+    <w:next w:val="854"/>
+    <w:link w:val="701"/>
     <w:uiPriority w:val="29"/>
     <w:qFormat/>
     <w:pPr>
@@ -10990,9 +10990,9 @@
       <w:i/>
     </w:rPr>
   </w:style>
-  <w:style w:type="character" w:styleId="744">
+  <w:style w:type="character" w:styleId="701">
     <w:name w:val="Quote Char"/>
-    <w:link w:val="743"/>
+    <w:link w:val="700"/>
     <w:uiPriority w:val="29"/>
     <w:pPr>
       <w:pBdr/>
@@ -11003,11 +11003,11 @@
       <w:i/>
     </w:rPr>
   </w:style>
-  <w:style w:type="paragraph" w:styleId="745">
+  <w:style w:type="paragraph" w:styleId="702">
     <w:name w:val="Intense Quote"/>
-    <w:basedOn w:val="897"/>
-    <w:next w:val="897"/>
-    <w:link w:val="746"/>
+    <w:basedOn w:val="854"/>
+    <w:next w:val="854"/>
+    <w:link w:val="703"/>
     <w:uiPriority w:val="30"/>
     <w:qFormat/>
     <w:pPr>
@@ -11026,9 +11026,9 @@
       <w:i/>
     </w:rPr>
   </w:style>
-  <w:style w:type="character" w:styleId="746">
+  <w:style w:type="character" w:styleId="703">
     <w:name w:val="Intense Quote Char"/>
-    <w:link w:val="745"/>
+    <w:link w:val="702"/>
     <w:uiPriority w:val="30"/>
     <w:pPr>
       <w:pBdr/>
@@ -11039,10 +11039,10 @@
       <w:i/>
     </w:rPr>
   </w:style>
-  <w:style w:type="paragraph" w:styleId="747">
+  <w:style w:type="paragraph" w:styleId="704">
     <w:name w:val="Header"/>
-    <w:basedOn w:val="897"/>
-    <w:link w:val="748"/>
+    <w:basedOn w:val="854"/>
+    <w:link w:val="705"/>
     <w:uiPriority w:val="99"/>
     <w:unhideWhenUsed/>
     <w:pPr>
@@ -11055,9 +11055,9 @@
       <w:ind/>
     </w:pPr>
   </w:style>
-  <w:style w:type="character" w:styleId="748">
+  <w:style w:type="character" w:styleId="705">
     <w:name w:val="Header Char"/>
-    <w:link w:val="747"/>
+    <w:link w:val="704"/>
     <w:uiPriority w:val="99"/>
     <w:pPr>
       <w:pBdr/>
@@ -11065,10 +11065,10 @@
       <w:ind/>
     </w:pPr>
   </w:style>
-  <w:style w:type="paragraph" w:styleId="749">
+  <w:style w:type="paragraph" w:styleId="706">
     <w:name w:val="Footer"/>
-    <w:basedOn w:val="897"/>
-    <w:link w:val="752"/>
+    <w:basedOn w:val="854"/>
+    <w:link w:val="709"/>
     <w:uiPriority w:val="99"/>
     <w:unhideWhenUsed/>
     <w:pPr>
@@ -11081,9 +11081,9 @@
       <w:ind/>
     </w:pPr>
   </w:style>
-  <w:style w:type="character" w:styleId="750">
+  <w:style w:type="character" w:styleId="707">
     <w:name w:val="Footer Char"/>
-    <w:link w:val="749"/>
+    <w:link w:val="706"/>
     <w:uiPriority w:val="99"/>
     <w:pPr>
       <w:pBdr/>
@@ -11091,10 +11091,10 @@
       <w:ind/>
     </w:pPr>
   </w:style>
-  <w:style w:type="paragraph" w:styleId="751">
+  <w:style w:type="paragraph" w:styleId="708">
     <w:name w:val="Caption"/>
-    <w:basedOn w:val="897"/>
-    <w:next w:val="897"/>
+    <w:basedOn w:val="854"/>
+    <w:next w:val="854"/>
     <w:uiPriority w:val="35"/>
     <w:semiHidden/>
     <w:unhideWhenUsed/>
@@ -11112,10 +11112,10 @@
       <w:szCs w:val="18"/>
     </w:rPr>
   </w:style>
-  <w:style w:type="character" w:styleId="752">
+  <w:style w:type="character" w:styleId="709">
     <w:name w:val="Caption Char"/>
-    <w:basedOn w:val="751"/>
-    <w:link w:val="749"/>
+    <w:basedOn w:val="708"/>
+    <w:link w:val="706"/>
     <w:uiPriority w:val="99"/>
     <w:pPr>
       <w:pBdr/>
@@ -11123,9 +11123,9 @@
       <w:ind/>
     </w:pPr>
   </w:style>
-  <w:style w:type="table" w:styleId="753">
+  <w:style w:type="table" w:styleId="710">
     <w:name w:val="Table Grid"/>
-    <w:basedOn w:val="898"/>
+    <w:basedOn w:val="855"/>
     <w:uiPriority w:val="59"/>
     <w:pPr>
       <w:pBdr/>
@@ -11322,9 +11322,9 @@
       </w:tcPr>
     </w:tblStylePr>
   </w:style>
-  <w:style w:type="table" w:styleId="754">
+  <w:style w:type="table" w:styleId="711">
     <w:name w:val="Table Grid Light"/>
-    <w:basedOn w:val="898"/>
+    <w:basedOn w:val="855"/>
     <w:uiPriority w:val="59"/>
     <w:pPr>
       <w:pBdr/>
@@ -11521,9 +11521,9 @@
       </w:tcPr>
     </w:tblStylePr>
   </w:style>
-  <w:style w:type="table" w:styleId="755">
+  <w:style w:type="table" w:styleId="712">
     <w:name w:val="Plain Table 1"/>
-    <w:basedOn w:val="898"/>
+    <w:basedOn w:val="855"/>
     <w:uiPriority w:val="59"/>
     <w:pPr>
       <w:pBdr/>
@@ -11746,9 +11746,9 @@
       </w:tcPr>
     </w:tblStylePr>
   </w:style>
-  <w:style w:type="table" w:styleId="756">
+  <w:style w:type="table" w:styleId="713">
     <w:name w:val="Plain Table 2"/>
-    <w:basedOn w:val="898"/>
+    <w:basedOn w:val="855"/>
     <w:uiPriority w:val="59"/>
     <w:pPr>
       <w:pBdr/>
@@ -11979,9 +11979,9 @@
       </w:tcPr>
     </w:tblStylePr>
   </w:style>
-  <w:style w:type="table" w:styleId="757">
+  <w:style w:type="table" w:styleId="714">
     <w:name w:val="Plain Table 3"/>
-    <w:basedOn w:val="898"/>
+    <w:basedOn w:val="855"/>
     <w:uiPriority w:val="99"/>
     <w:pPr>
       <w:pBdr/>
@@ -12209,9 +12209,9 @@
       </w:tcPr>
     </w:tblStylePr>
   </w:style>
-  <w:style w:type="table" w:styleId="758">
+  <w:style w:type="table" w:styleId="715">
     <w:name w:val="Plain Table 4"/>
-    <w:basedOn w:val="898"/>
+    <w:basedOn w:val="855"/>
     <w:uiPriority w:val="99"/>
     <w:pPr>
       <w:pBdr/>
@@ -12425,9 +12425,9 @@
       </w:tcPr>
     </w:tblStylePr>
   </w:style>
-  <w:style w:type="table" w:styleId="759">
+  <w:style w:type="table" w:styleId="716">
     <w:name w:val="Plain Table 5"/>
-    <w:basedOn w:val="898"/>
+    <w:basedOn w:val="855"/>
     <w:uiPriority w:val="99"/>
     <w:pPr>
       <w:pBdr/>
@@ -12658,9 +12658,9 @@
       </w:tcPr>
     </w:tblStylePr>
   </w:style>
-  <w:style w:type="table" w:styleId="760">
+  <w:style w:type="table" w:styleId="717">
     <w:name w:val="Grid Table 1 Light"/>
-    <w:basedOn w:val="898"/>
+    <w:basedOn w:val="855"/>
     <w:uiPriority w:val="99"/>
     <w:pPr>
       <w:pBdr/>
@@ -12881,9 +12881,9 @@
       </w:tcPr>
     </w:tblStylePr>
   </w:style>
-  <w:style w:type="table" w:styleId="761">
+  <w:style w:type="table" w:styleId="718">
     <w:name w:val="Grid Table 1 Light - Accent 1"/>
-    <w:basedOn w:val="898"/>
+    <w:basedOn w:val="855"/>
     <w:uiPriority w:val="99"/>
     <w:pPr>
       <w:pBdr/>
@@ -13104,9 +13104,9 @@
       </w:tcPr>
     </w:tblStylePr>
   </w:style>
-  <w:style w:type="table" w:styleId="762">
+  <w:style w:type="table" w:styleId="719">
     <w:name w:val="Grid Table 1 Light - Accent 2"/>
-    <w:basedOn w:val="898"/>
+    <w:basedOn w:val="855"/>
     <w:uiPriority w:val="99"/>
     <w:pPr>
       <w:pBdr/>
@@ -13327,9 +13327,9 @@
       </w:tcPr>
     </w:tblStylePr>
   </w:style>
-  <w:style w:type="table" w:styleId="763">
+  <w:style w:type="table" w:styleId="720">
     <w:name w:val="Grid Table 1 Light - Accent 3"/>
-    <w:basedOn w:val="898"/>
+    <w:basedOn w:val="855"/>
     <w:uiPriority w:val="99"/>
     <w:pPr>
       <w:pBdr/>
@@ -13550,9 +13550,9 @@
       </w:tcPr>
     </w:tblStylePr>
   </w:style>
-  <w:style w:type="table" w:styleId="764">
+  <w:style w:type="table" w:styleId="721">
     <w:name w:val="Grid Table 1 Light - Accent 4"/>
-    <w:basedOn w:val="898"/>
+    <w:basedOn w:val="855"/>
     <w:uiPriority w:val="99"/>
     <w:pPr>
       <w:pBdr/>
@@ -13773,9 +13773,9 @@
       </w:tcPr>
     </w:tblStylePr>
   </w:style>
-  <w:style w:type="table" w:styleId="765">
+  <w:style w:type="table" w:styleId="722">
     <w:name w:val="Grid Table 1 Light - Accent 5"/>
-    <w:basedOn w:val="898"/>
+    <w:basedOn w:val="855"/>
     <w:uiPriority w:val="99"/>
     <w:pPr>
       <w:pBdr/>
@@ -13996,9 +13996,9 @@
       </w:tcPr>
     </w:tblStylePr>
   </w:style>
-  <w:style w:type="table" w:styleId="766">
+  <w:style w:type="table" w:styleId="723">
     <w:name w:val="Grid Table 1 Light - Accent 6"/>
-    <w:basedOn w:val="898"/>
+    <w:basedOn w:val="855"/>
     <w:uiPriority w:val="99"/>
     <w:pPr>
       <w:pBdr/>
@@ -14219,9 +14219,9 @@
       </w:tcPr>
     </w:tblStylePr>
   </w:style>
-  <w:style w:type="table" w:styleId="767">
+  <w:style w:type="table" w:styleId="724">
     <w:name w:val="Grid Table 2"/>
-    <w:basedOn w:val="898"/>
+    <w:basedOn w:val="855"/>
     <w:uiPriority w:val="99"/>
     <w:pPr>
       <w:pBdr/>
@@ -14451,9 +14451,9 @@
       </w:tcPr>
     </w:tblStylePr>
   </w:style>
-  <w:style w:type="table" w:styleId="768">
+  <w:style w:type="table" w:styleId="725">
     <w:name w:val="Grid Table 2 - Accent 1"/>
-    <w:basedOn w:val="898"/>
+    <w:basedOn w:val="855"/>
     <w:uiPriority w:val="99"/>
     <w:pPr>
       <w:pBdr/>
@@ -14683,9 +14683,9 @@
       </w:tcPr>
     </w:tblStylePr>
   </w:style>
-  <w:style w:type="table" w:styleId="769">
+  <w:style w:type="table" w:styleId="726">
     <w:name w:val="Grid Table 2 - Accent 2"/>
-    <w:basedOn w:val="898"/>
+    <w:basedOn w:val="855"/>
     <w:uiPriority w:val="99"/>
     <w:pPr>
       <w:pBdr/>
@@ -14915,9 +14915,9 @@
       </w:tcPr>
     </w:tblStylePr>
   </w:style>
-  <w:style w:type="table" w:styleId="770">
+  <w:style w:type="table" w:styleId="727">
     <w:name w:val="Grid Table 2 - Accent 3"/>
-    <w:basedOn w:val="898"/>
+    <w:basedOn w:val="855"/>
     <w:uiPriority w:val="99"/>
     <w:pPr>
       <w:pBdr/>
@@ -15147,9 +15147,9 @@
       </w:tcPr>
     </w:tblStylePr>
   </w:style>
-  <w:style w:type="table" w:styleId="771">
+  <w:style w:type="table" w:styleId="728">
     <w:name w:val="Grid Table 2 - Accent 4"/>
-    <w:basedOn w:val="898"/>
+    <w:basedOn w:val="855"/>
     <w:uiPriority w:val="99"/>
     <w:pPr>
       <w:pBdr/>
@@ -15379,9 +15379,9 @@
       </w:tcPr>
     </w:tblStylePr>
   </w:style>
-  <w:style w:type="table" w:styleId="772">
+  <w:style w:type="table" w:styleId="729">
     <w:name w:val="Grid Table 2 - Accent 5"/>
-    <w:basedOn w:val="898"/>
+    <w:basedOn w:val="855"/>
     <w:uiPriority w:val="99"/>
     <w:pPr>
       <w:pBdr/>
@@ -15611,9 +15611,9 @@
       </w:tcPr>
     </w:tblStylePr>
   </w:style>
-  <w:style w:type="table" w:styleId="773">
+  <w:style w:type="table" w:styleId="730">
     <w:name w:val="Grid Table 2 - Accent 6"/>
-    <w:basedOn w:val="898"/>
+    <w:basedOn w:val="855"/>
     <w:uiPriority w:val="99"/>
     <w:pPr>
       <w:pBdr/>
@@ -15843,9 +15843,9 @@
       </w:tcPr>
     </w:tblStylePr>
   </w:style>
-  <w:style w:type="table" w:styleId="774">
+  <w:style w:type="table" w:styleId="731">
     <w:name w:val="Grid Table 3"/>
-    <w:basedOn w:val="898"/>
+    <w:basedOn w:val="855"/>
     <w:uiPriority w:val="99"/>
     <w:pPr>
       <w:pBdr/>
@@ -16088,9 +16088,9 @@
       </w:tcPr>
     </w:tblStylePr>
   </w:style>
-  <w:style w:type="table" w:styleId="775">
+  <w:style w:type="table" w:styleId="732">
     <w:name w:val="Grid Table 3 - Accent 1"/>
-    <w:basedOn w:val="898"/>
+    <w:basedOn w:val="855"/>
     <w:uiPriority w:val="99"/>
     <w:pPr>
       <w:pBdr/>
@@ -16333,9 +16333,9 @@
       </w:tcPr>
     </w:tblStylePr>
   </w:style>
-  <w:style w:type="table" w:styleId="776">
+  <w:style w:type="table" w:styleId="733">
     <w:name w:val="Grid Table 3 - Accent 2"/>
-    <w:basedOn w:val="898"/>
+    <w:basedOn w:val="855"/>
     <w:uiPriority w:val="99"/>
     <w:pPr>
       <w:pBdr/>
@@ -16578,9 +16578,9 @@
       </w:tcPr>
     </w:tblStylePr>
   </w:style>
-  <w:style w:type="table" w:styleId="777">
+  <w:style w:type="table" w:styleId="734">
     <w:name w:val="Grid Table 3 - Accent 3"/>
-    <w:basedOn w:val="898"/>
+    <w:basedOn w:val="855"/>
     <w:uiPriority w:val="99"/>
     <w:pPr>
       <w:pBdr/>
@@ -16823,9 +16823,9 @@
       </w:tcPr>
     </w:tblStylePr>
   </w:style>
-  <w:style w:type="table" w:styleId="778">
+  <w:style w:type="table" w:styleId="735">
     <w:name w:val="Grid Table 3 - Accent 4"/>
-    <w:basedOn w:val="898"/>
+    <w:basedOn w:val="855"/>
     <w:uiPriority w:val="99"/>
     <w:pPr>
       <w:pBdr/>
@@ -17068,9 +17068,9 @@
       </w:tcPr>
     </w:tblStylePr>
   </w:style>
-  <w:style w:type="table" w:styleId="779">
+  <w:style w:type="table" w:styleId="736">
     <w:name w:val="Grid Table 3 - Accent 5"/>
-    <w:basedOn w:val="898"/>
+    <w:basedOn w:val="855"/>
     <w:uiPriority w:val="99"/>
     <w:pPr>
       <w:pBdr/>
@@ -17313,9 +17313,9 @@
       </w:tcPr>
     </w:tblStylePr>
   </w:style>
-  <w:style w:type="table" w:styleId="780">
+  <w:style w:type="table" w:styleId="737">
     <w:name w:val="Grid Table 3 - Accent 6"/>
-    <w:basedOn w:val="898"/>
+    <w:basedOn w:val="855"/>
     <w:uiPriority w:val="99"/>
     <w:pPr>
       <w:pBdr/>
@@ -17558,9 +17558,9 @@
       </w:tcPr>
     </w:tblStylePr>
   </w:style>
-  <w:style w:type="table" w:styleId="781">
+  <w:style w:type="table" w:styleId="738">
     <w:name w:val="Grid Table 4"/>
-    <w:basedOn w:val="898"/>
+    <w:basedOn w:val="855"/>
     <w:uiPriority w:val="59"/>
     <w:pPr>
       <w:pBdr/>
@@ -17791,9 +17791,9 @@
       </w:tcPr>
     </w:tblStylePr>
   </w:style>
-  <w:style w:type="table" w:styleId="782">
+  <w:style w:type="table" w:styleId="739">
     <w:name w:val="Grid Table 4 - Accent 1"/>
-    <w:basedOn w:val="898"/>
+    <w:basedOn w:val="855"/>
     <w:uiPriority w:val="59"/>
     <w:pPr>
       <w:pBdr/>
@@ -18024,9 +18024,9 @@
       </w:tcPr>
     </w:tblStylePr>
   </w:style>
-  <w:style w:type="table" w:styleId="783">
+  <w:style w:type="table" w:styleId="740">
     <w:name w:val="Grid Table 4 - Accent 2"/>
-    <w:basedOn w:val="898"/>
+    <w:basedOn w:val="855"/>
     <w:uiPriority w:val="59"/>
     <w:pPr>
       <w:pBdr/>
@@ -18257,9 +18257,9 @@
       </w:tcPr>
     </w:tblStylePr>
   </w:style>
-  <w:style w:type="table" w:styleId="784">
+  <w:style w:type="table" w:styleId="741">
     <w:name w:val="Grid Table 4 - Accent 3"/>
-    <w:basedOn w:val="898"/>
+    <w:basedOn w:val="855"/>
     <w:uiPriority w:val="59"/>
     <w:pPr>
       <w:pBdr/>
@@ -18490,9 +18490,9 @@
       </w:tcPr>
     </w:tblStylePr>
   </w:style>
-  <w:style w:type="table" w:styleId="785">
+  <w:style w:type="table" w:styleId="742">
     <w:name w:val="Grid Table 4 - Accent 4"/>
-    <w:basedOn w:val="898"/>
+    <w:basedOn w:val="855"/>
     <w:uiPriority w:val="59"/>
     <w:pPr>
       <w:pBdr/>
@@ -18723,9 +18723,9 @@
       </w:tcPr>
     </w:tblStylePr>
   </w:style>
-  <w:style w:type="table" w:styleId="786">
+  <w:style w:type="table" w:styleId="743">
     <w:name w:val="Grid Table 4 - Accent 5"/>
-    <w:basedOn w:val="898"/>
+    <w:basedOn w:val="855"/>
     <w:uiPriority w:val="59"/>
     <w:pPr>
       <w:pBdr/>
@@ -18956,9 +18956,9 @@
       </w:tcPr>
     </w:tblStylePr>
   </w:style>
-  <w:style w:type="table" w:styleId="787">
+  <w:style w:type="table" w:styleId="744">
     <w:name w:val="Grid Table 4 - Accent 6"/>
-    <w:basedOn w:val="898"/>
+    <w:basedOn w:val="855"/>
     <w:uiPriority w:val="59"/>
     <w:pPr>
       <w:pBdr/>
@@ -19189,9 +19189,9 @@
       </w:tcPr>
     </w:tblStylePr>
   </w:style>
-  <w:style w:type="table" w:styleId="788">
+  <w:style w:type="table" w:styleId="745">
     <w:name w:val="Grid Table 5 Dark"/>
-    <w:basedOn w:val="898"/>
+    <w:basedOn w:val="855"/>
     <w:uiPriority w:val="99"/>
     <w:pPr>
       <w:pBdr/>
@@ -19417,9 +19417,9 @@
       </w:tcPr>
     </w:tblStylePr>
   </w:style>
-  <w:style w:type="table" w:styleId="789">
+  <w:style w:type="table" w:styleId="746">
     <w:name w:val="Grid Table 5 Dark- Accent 1"/>
-    <w:basedOn w:val="898"/>
+    <w:basedOn w:val="855"/>
     <w:uiPriority w:val="99"/>
     <w:pPr>
       <w:pBdr/>
@@ -19645,9 +19645,9 @@
       </w:tcPr>
     </w:tblStylePr>
   </w:style>
-  <w:style w:type="table" w:styleId="790">
+  <w:style w:type="table" w:styleId="747">
     <w:name w:val="Grid Table 5 Dark - Accent 2"/>
-    <w:basedOn w:val="898"/>
+    <w:basedOn w:val="855"/>
     <w:uiPriority w:val="99"/>
     <w:pPr>
       <w:pBdr/>
@@ -19873,9 +19873,9 @@
       </w:tcPr>
     </w:tblStylePr>
   </w:style>
-  <w:style w:type="table" w:styleId="791">
+  <w:style w:type="table" w:styleId="748">
     <w:name w:val="Grid Table 5 Dark - Accent 3"/>
-    <w:basedOn w:val="898"/>
+    <w:basedOn w:val="855"/>
     <w:uiPriority w:val="99"/>
     <w:pPr>
       <w:pBdr/>
@@ -20101,9 +20101,9 @@
       </w:tcPr>
     </w:tblStylePr>
   </w:style>
-  <w:style w:type="table" w:styleId="792">
+  <w:style w:type="table" w:styleId="749">
     <w:name w:val="Grid Table 5 Dark- Accent 4"/>
-    <w:basedOn w:val="898"/>
+    <w:basedOn w:val="855"/>
     <w:uiPriority w:val="99"/>
     <w:pPr>
       <w:pBdr/>
@@ -20329,9 +20329,9 @@
       </w:tcPr>
     </w:tblStylePr>
   </w:style>
-  <w:style w:type="table" w:styleId="793">
+  <w:style w:type="table" w:styleId="750">
     <w:name w:val="Grid Table 5 Dark - Accent 5"/>
-    <w:basedOn w:val="898"/>
+    <w:basedOn w:val="855"/>
     <w:uiPriority w:val="99"/>
     <w:pPr>
       <w:pBdr/>
@@ -20557,9 +20557,9 @@
       </w:tcPr>
     </w:tblStylePr>
   </w:style>
-  <w:style w:type="table" w:styleId="794">
+  <w:style w:type="table" w:styleId="751">
     <w:name w:val="Grid Table 5 Dark - Accent 6"/>
-    <w:basedOn w:val="898"/>
+    <w:basedOn w:val="855"/>
     <w:uiPriority w:val="99"/>
     <w:pPr>
       <w:pBdr/>
@@ -20785,9 +20785,9 @@
       </w:tcPr>
     </w:tblStylePr>
   </w:style>
-  <w:style w:type="table" w:styleId="795">
+  <w:style w:type="table" w:styleId="752">
     <w:name w:val="Grid Table 6 Colorful"/>
-    <w:basedOn w:val="898"/>
+    <w:basedOn w:val="855"/>
     <w:uiPriority w:val="99"/>
     <w:pPr>
       <w:pBdr/>
@@ -21015,9 +21015,9 @@
       </w:tcPr>
     </w:tblStylePr>
   </w:style>
-  <w:style w:type="table" w:styleId="796">
+  <w:style w:type="table" w:styleId="753">
     <w:name w:val="Grid Table 6 Colorful - Accent 1"/>
-    <w:basedOn w:val="898"/>
+    <w:basedOn w:val="855"/>
     <w:uiPriority w:val="99"/>
     <w:pPr>
       <w:pBdr/>
@@ -21245,9 +21245,9 @@
       </w:tcPr>
     </w:tblStylePr>
   </w:style>
-  <w:style w:type="table" w:styleId="797">
+  <w:style w:type="table" w:styleId="754">
     <w:name w:val="Grid Table 6 Colorful - Accent 2"/>
-    <w:basedOn w:val="898"/>
+    <w:basedOn w:val="855"/>
     <w:uiPriority w:val="99"/>
     <w:pPr>
       <w:pBdr/>
@@ -21475,9 +21475,9 @@
       </w:tcPr>
     </w:tblStylePr>
   </w:style>
-  <w:style w:type="table" w:styleId="798">
+  <w:style w:type="table" w:styleId="755">
     <w:name w:val="Grid Table 6 Colorful - Accent 3"/>
-    <w:basedOn w:val="898"/>
+    <w:basedOn w:val="855"/>
     <w:uiPriority w:val="99"/>
     <w:pPr>
       <w:pBdr/>
@@ -21705,9 +21705,9 @@
       </w:tcPr>
     </w:tblStylePr>
   </w:style>
-  <w:style w:type="table" w:styleId="799">
+  <w:style w:type="table" w:styleId="756">
     <w:name w:val="Grid Table 6 Colorful - Accent 4"/>
-    <w:basedOn w:val="898"/>
+    <w:basedOn w:val="855"/>
     <w:uiPriority w:val="99"/>
     <w:pPr>
       <w:pBdr/>
@@ -21935,9 +21935,9 @@
       </w:tcPr>
     </w:tblStylePr>
   </w:style>
-  <w:style w:type="table" w:styleId="800">
+  <w:style w:type="table" w:styleId="757">
     <w:name w:val="Grid Table 6 Colorful - Accent 5"/>
-    <w:basedOn w:val="898"/>
+    <w:basedOn w:val="855"/>
     <w:uiPriority w:val="99"/>
     <w:pPr>
       <w:pBdr/>
@@ -22165,9 +22165,9 @@
       </w:tcPr>
     </w:tblStylePr>
   </w:style>
-  <w:style w:type="table" w:styleId="801">
+  <w:style w:type="table" w:styleId="758">
     <w:name w:val="Grid Table 6 Colorful - Accent 6"/>
-    <w:basedOn w:val="898"/>
+    <w:basedOn w:val="855"/>
     <w:uiPriority w:val="99"/>
     <w:pPr>
       <w:pBdr/>
@@ -22395,9 +22395,9 @@
       </w:tcPr>
     </w:tblStylePr>
   </w:style>
-  <w:style w:type="table" w:styleId="802">
+  <w:style w:type="table" w:styleId="759">
     <w:name w:val="Grid Table 7 Colorful"/>
-    <w:basedOn w:val="898"/>
+    <w:basedOn w:val="855"/>
     <w:uiPriority w:val="99"/>
     <w:pPr>
       <w:pBdr/>
@@ -22649,9 +22649,9 @@
       </w:tcPr>
     </w:tblStylePr>
   </w:style>
-  <w:style w:type="table" w:styleId="803">
+  <w:style w:type="table" w:styleId="760">
     <w:name w:val="Grid Table 7 Colorful - Accent 1"/>
-    <w:basedOn w:val="898"/>
+    <w:basedOn w:val="855"/>
     <w:uiPriority w:val="99"/>
     <w:pPr>
       <w:pBdr/>
@@ -22903,9 +22903,9 @@
       </w:tcPr>
     </w:tblStylePr>
   </w:style>
-  <w:style w:type="table" w:styleId="804">
+  <w:style w:type="table" w:styleId="761">
     <w:name w:val="Grid Table 7 Colorful - Accent 2"/>
-    <w:basedOn w:val="898"/>
+    <w:basedOn w:val="855"/>
     <w:uiPriority w:val="99"/>
     <w:pPr>
       <w:pBdr/>
@@ -23157,9 +23157,9 @@
       </w:tcPr>
     </w:tblStylePr>
   </w:style>
-  <w:style w:type="table" w:styleId="805">
+  <w:style w:type="table" w:styleId="762">
     <w:name w:val="Grid Table 7 Colorful - Accent 3"/>
-    <w:basedOn w:val="898"/>
+    <w:basedOn w:val="855"/>
     <w:uiPriority w:val="99"/>
     <w:pPr>
       <w:pBdr/>
@@ -23411,9 +23411,9 @@
       </w:tcPr>
     </w:tblStylePr>
   </w:style>
-  <w:style w:type="table" w:styleId="806">
+  <w:style w:type="table" w:styleId="763">
     <w:name w:val="Grid Table 7 Colorful - Accent 4"/>
-    <w:basedOn w:val="898"/>
+    <w:basedOn w:val="855"/>
     <w:uiPriority w:val="99"/>
     <w:pPr>
       <w:pBdr/>
@@ -23665,9 +23665,9 @@
       </w:tcPr>
     </w:tblStylePr>
   </w:style>
-  <w:style w:type="table" w:styleId="807">
+  <w:style w:type="table" w:styleId="764">
     <w:name w:val="Grid Table 7 Colorful - Accent 5"/>
-    <w:basedOn w:val="898"/>
+    <w:basedOn w:val="855"/>
     <w:uiPriority w:val="99"/>
     <w:pPr>
       <w:pBdr/>
@@ -23919,9 +23919,9 @@
       </w:tcPr>
     </w:tblStylePr>
   </w:style>
-  <w:style w:type="table" w:styleId="808">
+  <w:style w:type="table" w:styleId="765">
     <w:name w:val="Grid Table 7 Colorful - Accent 6"/>
-    <w:basedOn w:val="898"/>
+    <w:basedOn w:val="855"/>
     <w:uiPriority w:val="99"/>
     <w:pPr>
       <w:pBdr/>
@@ -24173,9 +24173,9 @@
       </w:tcPr>
     </w:tblStylePr>
   </w:style>
-  <w:style w:type="table" w:styleId="809">
+  <w:style w:type="table" w:styleId="766">
     <w:name w:val="List Table 1 Light"/>
-    <w:basedOn w:val="898"/>
+    <w:basedOn w:val="855"/>
     <w:uiPriority w:val="99"/>
     <w:pPr>
       <w:pBdr/>
@@ -24389,9 +24389,9 @@
       </w:tcPr>
     </w:tblStylePr>
   </w:style>
-  <w:style w:type="table" w:styleId="810">
+  <w:style w:type="table" w:styleId="767">
     <w:name w:val="List Table 1 Light - Accent 1"/>
-    <w:basedOn w:val="898"/>
+    <w:basedOn w:val="855"/>
     <w:uiPriority w:val="99"/>
     <w:pPr>
       <w:pBdr/>
@@ -24605,9 +24605,9 @@
       </w:tcPr>
     </w:tblStylePr>
   </w:style>
-  <w:style w:type="table" w:styleId="811">
+  <w:style w:type="table" w:styleId="768">
     <w:name w:val="List Table 1 Light - Accent 2"/>
-    <w:basedOn w:val="898"/>
+    <w:basedOn w:val="855"/>
     <w:uiPriority w:val="99"/>
     <w:pPr>
       <w:pBdr/>
@@ -24821,9 +24821,9 @@
       </w:tcPr>
     </w:tblStylePr>
   </w:style>
-  <w:style w:type="table" w:styleId="812">
+  <w:style w:type="table" w:styleId="769">
     <w:name w:val="List Table 1 Light - Accent 3"/>
-    <w:basedOn w:val="898"/>
+    <w:basedOn w:val="855"/>
     <w:uiPriority w:val="99"/>
     <w:pPr>
       <w:pBdr/>
@@ -25037,9 +25037,9 @@
       </w:tcPr>
     </w:tblStylePr>
   </w:style>
-  <w:style w:type="table" w:styleId="813">
+  <w:style w:type="table" w:styleId="770">
     <w:name w:val="List Table 1 Light - Accent 4"/>
-    <w:basedOn w:val="898"/>
+    <w:basedOn w:val="855"/>
     <w:uiPriority w:val="99"/>
     <w:pPr>
       <w:pBdr/>
@@ -25253,9 +25253,9 @@
       </w:tcPr>
     </w:tblStylePr>
   </w:style>
-  <w:style w:type="table" w:styleId="814">
+  <w:style w:type="table" w:styleId="771">
     <w:name w:val="List Table 1 Light - Accent 5"/>
-    <w:basedOn w:val="898"/>
+    <w:basedOn w:val="855"/>
     <w:uiPriority w:val="99"/>
     <w:pPr>
       <w:pBdr/>
@@ -25469,9 +25469,9 @@
       </w:tcPr>
     </w:tblStylePr>
   </w:style>
-  <w:style w:type="table" w:styleId="815">
+  <w:style w:type="table" w:styleId="772">
     <w:name w:val="List Table 1 Light - Accent 6"/>
-    <w:basedOn w:val="898"/>
+    <w:basedOn w:val="855"/>
     <w:uiPriority w:val="99"/>
     <w:pPr>
       <w:pBdr/>
@@ -25685,9 +25685,9 @@
       </w:tcPr>
     </w:tblStylePr>
   </w:style>
-  <w:style w:type="table" w:styleId="816">
+  <w:style w:type="table" w:styleId="773">
     <w:name w:val="List Table 2"/>
-    <w:basedOn w:val="898"/>
+    <w:basedOn w:val="855"/>
     <w:uiPriority w:val="99"/>
     <w:pPr>
       <w:pBdr/>
@@ -25923,9 +25923,9 @@
       </w:tcPr>
     </w:tblStylePr>
   </w:style>
-  <w:style w:type="table" w:styleId="817">
+  <w:style w:type="table" w:styleId="774">
     <w:name w:val="List Table 2 - Accent 1"/>
-    <w:basedOn w:val="898"/>
+    <w:basedOn w:val="855"/>
     <w:uiPriority w:val="99"/>
     <w:pPr>
       <w:pBdr/>
@@ -26161,9 +26161,9 @@
       </w:tcPr>
     </w:tblStylePr>
   </w:style>
-  <w:style w:type="table" w:styleId="818">
+  <w:style w:type="table" w:styleId="775">
     <w:name w:val="List Table 2 - Accent 2"/>
-    <w:basedOn w:val="898"/>
+    <w:basedOn w:val="855"/>
     <w:uiPriority w:val="99"/>
     <w:pPr>
       <w:pBdr/>
@@ -26399,9 +26399,9 @@
       </w:tcPr>
     </w:tblStylePr>
   </w:style>
-  <w:style w:type="table" w:styleId="819">
+  <w:style w:type="table" w:styleId="776">
     <w:name w:val="List Table 2 - Accent 3"/>
-    <w:basedOn w:val="898"/>
+    <w:basedOn w:val="855"/>
     <w:uiPriority w:val="99"/>
     <w:pPr>
       <w:pBdr/>
@@ -26637,9 +26637,9 @@
       </w:tcPr>
     </w:tblStylePr>
   </w:style>
-  <w:style w:type="table" w:styleId="820">
+  <w:style w:type="table" w:styleId="777">
     <w:name w:val="List Table 2 - Accent 4"/>
-    <w:basedOn w:val="898"/>
+    <w:basedOn w:val="855"/>
     <w:uiPriority w:val="99"/>
     <w:pPr>
       <w:pBdr/>
@@ -26875,9 +26875,9 @@
       </w:tcPr>
     </w:tblStylePr>
   </w:style>
-  <w:style w:type="table" w:styleId="821">
+  <w:style w:type="table" w:styleId="778">
     <w:name w:val="List Table 2 - Accent 5"/>
-    <w:basedOn w:val="898"/>
+    <w:basedOn w:val="855"/>
     <w:uiPriority w:val="99"/>
     <w:pPr>
       <w:pBdr/>
@@ -27113,9 +27113,9 @@
       </w:tcPr>
     </w:tblStylePr>
   </w:style>
-  <w:style w:type="table" w:styleId="822">
+  <w:style w:type="table" w:styleId="779">
     <w:name w:val="List Table 2 - Accent 6"/>
-    <w:basedOn w:val="898"/>
+    <w:basedOn w:val="855"/>
     <w:uiPriority w:val="99"/>
     <w:pPr>
       <w:pBdr/>
@@ -27351,9 +27351,9 @@
       </w:tcPr>
     </w:tblStylePr>
   </w:style>
-  <w:style w:type="table" w:styleId="823">
+  <w:style w:type="table" w:styleId="780">
     <w:name w:val="List Table 3"/>
-    <w:basedOn w:val="898"/>
+    <w:basedOn w:val="855"/>
     <w:uiPriority w:val="99"/>
     <w:pPr>
       <w:pBdr/>
@@ -27579,9 +27579,9 @@
       </w:tcPr>
     </w:tblStylePr>
   </w:style>
-  <w:style w:type="table" w:styleId="824">
+  <w:style w:type="table" w:styleId="781">
     <w:name w:val="List Table 3 - Accent 1"/>
-    <w:basedOn w:val="898"/>
+    <w:basedOn w:val="855"/>
     <w:uiPriority w:val="99"/>
     <w:pPr>
       <w:pBdr/>
@@ -27807,9 +27807,9 @@
       </w:tcPr>
     </w:tblStylePr>
   </w:style>
-  <w:style w:type="table" w:styleId="825">
+  <w:style w:type="table" w:styleId="782">
     <w:name w:val="List Table 3 - Accent 2"/>
-    <w:basedOn w:val="898"/>
+    <w:basedOn w:val="855"/>
     <w:uiPriority w:val="99"/>
     <w:pPr>
       <w:pBdr/>
@@ -28035,9 +28035,9 @@
       </w:tcPr>
     </w:tblStylePr>
   </w:style>
-  <w:style w:type="table" w:styleId="826">
+  <w:style w:type="table" w:styleId="783">
     <w:name w:val="List Table 3 - Accent 3"/>
-    <w:basedOn w:val="898"/>
+    <w:basedOn w:val="855"/>
     <w:uiPriority w:val="99"/>
     <w:pPr>
       <w:pBdr/>
@@ -28263,9 +28263,9 @@
       </w:tcPr>
     </w:tblStylePr>
   </w:style>
-  <w:style w:type="table" w:styleId="827">
+  <w:style w:type="table" w:styleId="784">
     <w:name w:val="List Table 3 - Accent 4"/>
-    <w:basedOn w:val="898"/>
+    <w:basedOn w:val="855"/>
     <w:uiPriority w:val="99"/>
     <w:pPr>
       <w:pBdr/>
@@ -28491,9 +28491,9 @@
       </w:tcPr>
     </w:tblStylePr>
   </w:style>
-  <w:style w:type="table" w:styleId="828">
+  <w:style w:type="table" w:styleId="785">
     <w:name w:val="List Table 3 - Accent 5"/>
-    <w:basedOn w:val="898"/>
+    <w:basedOn w:val="855"/>
     <w:uiPriority w:val="99"/>
     <w:pPr>
       <w:pBdr/>
@@ -28719,9 +28719,9 @@
       </w:tcPr>
     </w:tblStylePr>
   </w:style>
-  <w:style w:type="table" w:styleId="829">
+  <w:style w:type="table" w:styleId="786">
     <w:name w:val="List Table 3 - Accent 6"/>
-    <w:basedOn w:val="898"/>
+    <w:basedOn w:val="855"/>
     <w:uiPriority w:val="99"/>
     <w:pPr>
       <w:pBdr/>
@@ -28947,9 +28947,9 @@
       </w:tcPr>
     </w:tblStylePr>
   </w:style>
-  <w:style w:type="table" w:styleId="830">
+  <w:style w:type="table" w:styleId="787">
     <w:name w:val="List Table 4"/>
-    <w:basedOn w:val="898"/>
+    <w:basedOn w:val="855"/>
     <w:uiPriority w:val="99"/>
     <w:pPr>
       <w:pBdr/>
@@ -29172,9 +29172,9 @@
       </w:tcPr>
     </w:tblStylePr>
   </w:style>
-  <w:style w:type="table" w:styleId="831">
+  <w:style w:type="table" w:styleId="788">
     <w:name w:val="List Table 4 - Accent 1"/>
-    <w:basedOn w:val="898"/>
+    <w:basedOn w:val="855"/>
     <w:uiPriority w:val="99"/>
     <w:pPr>
       <w:pBdr/>
@@ -29397,9 +29397,9 @@
       </w:tcPr>
     </w:tblStylePr>
   </w:style>
-  <w:style w:type="table" w:styleId="832">
+  <w:style w:type="table" w:styleId="789">
     <w:name w:val="List Table 4 - Accent 2"/>
-    <w:basedOn w:val="898"/>
+    <w:basedOn w:val="855"/>
     <w:uiPriority w:val="99"/>
     <w:pPr>
       <w:pBdr/>
@@ -29622,9 +29622,9 @@
       </w:tcPr>
     </w:tblStylePr>
   </w:style>
-  <w:style w:type="table" w:styleId="833">
+  <w:style w:type="table" w:styleId="790">
     <w:name w:val="List Table 4 - Accent 3"/>
-    <w:basedOn w:val="898"/>
+    <w:basedOn w:val="855"/>
     <w:uiPriority w:val="99"/>
     <w:pPr>
       <w:pBdr/>
@@ -29847,9 +29847,9 @@
       </w:tcPr>
     </w:tblStylePr>
   </w:style>
-  <w:style w:type="table" w:styleId="834">
+  <w:style w:type="table" w:styleId="791">
     <w:name w:val="List Table 4 - Accent 4"/>
-    <w:basedOn w:val="898"/>
+    <w:basedOn w:val="855"/>
     <w:uiPriority w:val="99"/>
     <w:pPr>
       <w:pBdr/>
@@ -30072,9 +30072,9 @@
       </w:tcPr>
     </w:tblStylePr>
   </w:style>
-  <w:style w:type="table" w:styleId="835">
+  <w:style w:type="table" w:styleId="792">
     <w:name w:val="List Table 4 - Accent 5"/>
-    <w:basedOn w:val="898"/>
+    <w:basedOn w:val="855"/>
     <w:uiPriority w:val="99"/>
     <w:pPr>
       <w:pBdr/>
@@ -30297,9 +30297,9 @@
       </w:tcPr>
     </w:tblStylePr>
   </w:style>
-  <w:style w:type="table" w:styleId="836">
+  <w:style w:type="table" w:styleId="793">
     <w:name w:val="List Table 4 - Accent 6"/>
-    <w:basedOn w:val="898"/>
+    <w:basedOn w:val="855"/>
     <w:uiPriority w:val="99"/>
     <w:pPr>
       <w:pBdr/>
@@ -30522,9 +30522,9 @@
       </w:tcPr>
     </w:tblStylePr>
   </w:style>
-  <w:style w:type="table" w:styleId="837">
+  <w:style w:type="table" w:styleId="794">
     <w:name w:val="List Table 5 Dark"/>
-    <w:basedOn w:val="898"/>
+    <w:basedOn w:val="855"/>
     <w:uiPriority w:val="99"/>
     <w:pPr>
       <w:pBdr/>
@@ -30764,9 +30764,9 @@
       </w:tcPr>
     </w:tblStylePr>
   </w:style>
-  <w:style w:type="table" w:styleId="838">
+  <w:style w:type="table" w:styleId="795">
     <w:name w:val="List Table 5 Dark - Accent 1"/>
-    <w:basedOn w:val="898"/>
+    <w:basedOn w:val="855"/>
     <w:uiPriority w:val="99"/>
     <w:pPr>
       <w:pBdr/>
@@ -31006,9 +31006,9 @@
       </w:tcPr>
     </w:tblStylePr>
   </w:style>
-  <w:style w:type="table" w:styleId="839">
+  <w:style w:type="table" w:styleId="796">
     <w:name w:val="List Table 5 Dark - Accent 2"/>
-    <w:basedOn w:val="898"/>
+    <w:basedOn w:val="855"/>
     <w:uiPriority w:val="99"/>
     <w:pPr>
       <w:pBdr/>
@@ -31248,9 +31248,9 @@
       </w:tcPr>
     </w:tblStylePr>
   </w:style>
-  <w:style w:type="table" w:styleId="840">
+  <w:style w:type="table" w:styleId="797">
     <w:name w:val="List Table 5 Dark - Accent 3"/>
-    <w:basedOn w:val="898"/>
+    <w:basedOn w:val="855"/>
     <w:uiPriority w:val="99"/>
     <w:pPr>
       <w:pBdr/>
@@ -31490,9 +31490,9 @@
       </w:tcPr>
     </w:tblStylePr>
   </w:style>
-  <w:style w:type="table" w:styleId="841">
+  <w:style w:type="table" w:styleId="798">
     <w:name w:val="List Table 5 Dark - Accent 4"/>
-    <w:basedOn w:val="898"/>
+    <w:basedOn w:val="855"/>
     <w:uiPriority w:val="99"/>
     <w:pPr>
       <w:pBdr/>
@@ -31732,9 +31732,9 @@
       </w:tcPr>
     </w:tblStylePr>
   </w:style>
-  <w:style w:type="table" w:styleId="842">
+  <w:style w:type="table" w:styleId="799">
     <w:name w:val="List Table 5 Dark - Accent 5"/>
-    <w:basedOn w:val="898"/>
+    <w:basedOn w:val="855"/>
     <w:uiPriority w:val="99"/>
     <w:pPr>
       <w:pBdr/>
@@ -31974,9 +31974,9 @@
       </w:tcPr>
     </w:tblStylePr>
   </w:style>
-  <w:style w:type="table" w:styleId="843">
+  <w:style w:type="table" w:styleId="800">
     <w:name w:val="List Table 5 Dark - Accent 6"/>
-    <w:basedOn w:val="898"/>
+    <w:basedOn w:val="855"/>
     <w:uiPriority w:val="99"/>
     <w:pPr>
       <w:pBdr/>
@@ -32216,9 +32216,9 @@
       </w:tcPr>
     </w:tblStylePr>
   </w:style>
-  <w:style w:type="table" w:styleId="844">
+  <w:style w:type="table" w:styleId="801">
     <w:name w:val="List Table 6 Colorful"/>
-    <w:basedOn w:val="898"/>
+    <w:basedOn w:val="855"/>
     <w:uiPriority w:val="99"/>
     <w:pPr>
       <w:pBdr/>
@@ -32439,9 +32439,9 @@
       </w:tcPr>
     </w:tblStylePr>
   </w:style>
-  <w:style w:type="table" w:styleId="845">
+  <w:style w:type="table" w:styleId="802">
     <w:name w:val="List Table 6 Colorful - Accent 1"/>
-    <w:basedOn w:val="898"/>
+    <w:basedOn w:val="855"/>
     <w:uiPriority w:val="99"/>
     <w:pPr>
       <w:pBdr/>
@@ -32662,9 +32662,9 @@
       </w:tcPr>
     </w:tblStylePr>
   </w:style>
-  <w:style w:type="table" w:styleId="846">
+  <w:style w:type="table" w:styleId="803">
     <w:name w:val="List Table 6 Colorful - Accent 2"/>
-    <w:basedOn w:val="898"/>
+    <w:basedOn w:val="855"/>
     <w:uiPriority w:val="99"/>
     <w:pPr>
       <w:pBdr/>
@@ -32885,9 +32885,9 @@
       </w:tcPr>
     </w:tblStylePr>
   </w:style>
-  <w:style w:type="table" w:styleId="847">
+  <w:style w:type="table" w:styleId="804">
     <w:name w:val="List Table 6 Colorful - Accent 3"/>
-    <w:basedOn w:val="898"/>
+    <w:basedOn w:val="855"/>
     <w:uiPriority w:val="99"/>
     <w:pPr>
       <w:pBdr/>
@@ -33108,9 +33108,9 @@
       </w:tcPr>
     </w:tblStylePr>
   </w:style>
-  <w:style w:type="table" w:styleId="848">
+  <w:style w:type="table" w:styleId="805">
     <w:name w:val="List Table 6 Colorful - Accent 4"/>
-    <w:basedOn w:val="898"/>
+    <w:basedOn w:val="855"/>
     <w:uiPriority w:val="99"/>
     <w:pPr>
       <w:pBdr/>
@@ -33331,9 +33331,9 @@
       </w:tcPr>
     </w:tblStylePr>
   </w:style>
-  <w:style w:type="table" w:styleId="849">
+  <w:style w:type="table" w:styleId="806">
     <w:name w:val="List Table 6 Colorful - Accent 5"/>
-    <w:basedOn w:val="898"/>
+    <w:basedOn w:val="855"/>
     <w:uiPriority w:val="99"/>
     <w:pPr>
       <w:pBdr/>
@@ -33554,9 +33554,9 @@
       </w:tcPr>
     </w:tblStylePr>
   </w:style>
-  <w:style w:type="table" w:styleId="850">
+  <w:style w:type="table" w:styleId="807">
     <w:name w:val="List Table 6 Colorful - Accent 6"/>
-    <w:basedOn w:val="898"/>
+    <w:basedOn w:val="855"/>
     <w:uiPriority w:val="99"/>
     <w:pPr>
       <w:pBdr/>
@@ -33777,9 +33777,9 @@
       </w:tcPr>
     </w:tblStylePr>
   </w:style>
-  <w:style w:type="table" w:styleId="851">
+  <w:style w:type="table" w:styleId="808">
     <w:name w:val="List Table 7 Colorful"/>
-    <w:basedOn w:val="898"/>
+    <w:basedOn w:val="855"/>
     <w:uiPriority w:val="99"/>
     <w:pPr>
       <w:pBdr/>
@@ -34033,9 +34033,9 @@
       </w:tcPr>
     </w:tblStylePr>
   </w:style>
-  <w:style w:type="table" w:styleId="852">
+  <w:style w:type="table" w:styleId="809">
     <w:name w:val="List Table 7 Colorful - Accent 1"/>
-    <w:basedOn w:val="898"/>
+    <w:basedOn w:val="855"/>
     <w:uiPriority w:val="99"/>
     <w:pPr>
       <w:pBdr/>
@@ -34289,9 +34289,9 @@
       </w:tcPr>
     </w:tblStylePr>
   </w:style>
-  <w:style w:type="table" w:styleId="853">
+  <w:style w:type="table" w:styleId="810">
     <w:name w:val="List Table 7 Colorful - Accent 2"/>
-    <w:basedOn w:val="898"/>
+    <w:basedOn w:val="855"/>
     <w:uiPriority w:val="99"/>
     <w:pPr>
       <w:pBdr/>
@@ -34545,9 +34545,9 @@
       </w:tcPr>
     </w:tblStylePr>
   </w:style>
-  <w:style w:type="table" w:styleId="854">
+  <w:style w:type="table" w:styleId="811">
     <w:name w:val="List Table 7 Colorful - Accent 3"/>
-    <w:basedOn w:val="898"/>
+    <w:basedOn w:val="855"/>
     <w:uiPriority w:val="99"/>
     <w:pPr>
       <w:pBdr/>
@@ -34801,9 +34801,9 @@
       </w:tcPr>
     </w:tblStylePr>
   </w:style>
-  <w:style w:type="table" w:styleId="855">
+  <w:style w:type="table" w:styleId="812">
     <w:name w:val="List Table 7 Colorful - Accent 4"/>
-    <w:basedOn w:val="898"/>
+    <w:basedOn w:val="855"/>
     <w:uiPriority w:val="99"/>
     <w:pPr>
       <w:pBdr/>
@@ -35057,9 +35057,9 @@
       </w:tcPr>
     </w:tblStylePr>
   </w:style>
-  <w:style w:type="table" w:styleId="856">
+  <w:style w:type="table" w:styleId="813">
     <w:name w:val="List Table 7 Colorful - Accent 5"/>
-    <w:basedOn w:val="898"/>
+    <w:basedOn w:val="855"/>
     <w:uiPriority w:val="99"/>
     <w:pPr>
       <w:pBdr/>
@@ -35313,9 +35313,9 @@
       </w:tcPr>
     </w:tblStylePr>
   </w:style>
-  <w:style w:type="table" w:styleId="857">
+  <w:style w:type="table" w:styleId="814">
     <w:name w:val="List Table 7 Colorful - Accent 6"/>
-    <w:basedOn w:val="898"/>
+    <w:basedOn w:val="855"/>
     <w:uiPriority w:val="99"/>
     <w:pPr>
       <w:pBdr/>
@@ -35569,9 +35569,9 @@
       </w:tcPr>
     </w:tblStylePr>
   </w:style>
-  <w:style w:type="table" w:styleId="858">
+  <w:style w:type="table" w:styleId="815">
     <w:name w:val="Lined - Accent"/>
-    <w:basedOn w:val="898"/>
+    <w:basedOn w:val="855"/>
     <w:uiPriority w:val="99"/>
     <w:pPr>
       <w:pBdr/>
@@ -35806,9 +35806,9 @@
       </w:tcPr>
     </w:tblStylePr>
   </w:style>
-  <w:style w:type="table" w:styleId="859">
+  <w:style w:type="table" w:styleId="816">
     <w:name w:val="Lined - Accent 1"/>
-    <w:basedOn w:val="898"/>
+    <w:basedOn w:val="855"/>
     <w:uiPriority w:val="99"/>
     <w:pPr>
       <w:pBdr/>
@@ -36043,9 +36043,9 @@
       </w:tcPr>
     </w:tblStylePr>
   </w:style>
-  <w:style w:type="table" w:styleId="860">
+  <w:style w:type="table" w:styleId="817">
     <w:name w:val="Lined - Accent 2"/>
-    <w:basedOn w:val="898"/>
+    <w:basedOn w:val="855"/>
     <w:uiPriority w:val="99"/>
     <w:pPr>
       <w:pBdr/>
@@ -36280,9 +36280,9 @@
       </w:tcPr>
     </w:tblStylePr>
   </w:style>
-  <w:style w:type="table" w:styleId="861">
+  <w:style w:type="table" w:styleId="818">
     <w:name w:val="Lined - Accent 3"/>
-    <w:basedOn w:val="898"/>
+    <w:basedOn w:val="855"/>
     <w:uiPriority w:val="99"/>
     <w:pPr>
       <w:pBdr/>
@@ -36517,9 +36517,9 @@
       </w:tcPr>
     </w:tblStylePr>
   </w:style>
-  <w:style w:type="table" w:styleId="862">
+  <w:style w:type="table" w:styleId="819">
     <w:name w:val="Lined - Accent 4"/>
-    <w:basedOn w:val="898"/>
+    <w:basedOn w:val="855"/>
     <w:uiPriority w:val="99"/>
     <w:pPr>
       <w:pBdr/>
@@ -36754,9 +36754,9 @@
       </w:tcPr>
     </w:tblStylePr>
   </w:style>
-  <w:style w:type="table" w:styleId="863">
+  <w:style w:type="table" w:styleId="820">
     <w:name w:val="Lined - Accent 5"/>
-    <w:basedOn w:val="898"/>
+    <w:basedOn w:val="855"/>
     <w:uiPriority w:val="99"/>
     <w:pPr>
       <w:pBdr/>
@@ -36991,9 +36991,9 @@
       </w:tcPr>
     </w:tblStylePr>
   </w:style>
-  <w:style w:type="table" w:styleId="864">
+  <w:style w:type="table" w:styleId="821">
     <w:name w:val="Lined - Accent 6"/>
-    <w:basedOn w:val="898"/>
+    <w:basedOn w:val="855"/>
     <w:uiPriority w:val="99"/>
     <w:pPr>
       <w:pBdr/>
@@ -37228,9 +37228,9 @@
       </w:tcPr>
     </w:tblStylePr>
   </w:style>
-  <w:style w:type="table" w:styleId="865">
+  <w:style w:type="table" w:styleId="822">
     <w:name w:val="Bordered &amp; Lined - Accent"/>
-    <w:basedOn w:val="898"/>
+    <w:basedOn w:val="855"/>
     <w:uiPriority w:val="99"/>
     <w:pPr>
       <w:pBdr/>
@@ -37472,9 +37472,9 @@
       </w:tcPr>
     </w:tblStylePr>
   </w:style>
-  <w:style w:type="table" w:styleId="866">
+  <w:style w:type="table" w:styleId="823">
     <w:name w:val="Bordered &amp; Lined - Accent 1"/>
-    <w:basedOn w:val="898"/>
+    <w:basedOn w:val="855"/>
     <w:uiPriority w:val="99"/>
     <w:pPr>
       <w:pBdr/>
@@ -37716,9 +37716,9 @@
       </w:tcPr>
     </w:tblStylePr>
   </w:style>
-  <w:style w:type="table" w:styleId="867">
+  <w:style w:type="table" w:styleId="824">
     <w:name w:val="Bordered &amp; Lined - Accent 2"/>
-    <w:basedOn w:val="898"/>
+    <w:basedOn w:val="855"/>
     <w:uiPriority w:val="99"/>
     <w:pPr>
       <w:pBdr/>
@@ -37960,9 +37960,9 @@
       </w:tcPr>
     </w:tblStylePr>
   </w:style>
-  <w:style w:type="table" w:styleId="868">
+  <w:style w:type="table" w:styleId="825">
     <w:name w:val="Bordered &amp; Lined - Accent 3"/>
-    <w:basedOn w:val="898"/>
+    <w:basedOn w:val="855"/>
     <w:uiPriority w:val="99"/>
     <w:pPr>
       <w:pBdr/>
@@ -38204,9 +38204,9 @@
       </w:tcPr>
     </w:tblStylePr>
   </w:style>
-  <w:style w:type="table" w:styleId="869">
+  <w:style w:type="table" w:styleId="826">
     <w:name w:val="Bordered &amp; Lined - Accent 4"/>
-    <w:basedOn w:val="898"/>
+    <w:basedOn w:val="855"/>
     <w:uiPriority w:val="99"/>
     <w:pPr>
       <w:pBdr/>
@@ -38448,9 +38448,9 @@
       </w:tcPr>
     </w:tblStylePr>
   </w:style>
-  <w:style w:type="table" w:styleId="870">
+  <w:style w:type="table" w:styleId="827">
     <w:name w:val="Bordered &amp; Lined - Accent 5"/>
-    <w:basedOn w:val="898"/>
+    <w:basedOn w:val="855"/>
     <w:uiPriority w:val="99"/>
     <w:pPr>
       <w:pBdr/>
@@ -38692,9 +38692,9 @@
       </w:tcPr>
     </w:tblStylePr>
   </w:style>
-  <w:style w:type="table" w:styleId="871">
+  <w:style w:type="table" w:styleId="828">
     <w:name w:val="Bordered &amp; Lined - Accent 6"/>
-    <w:basedOn w:val="898"/>
+    <w:basedOn w:val="855"/>
     <w:uiPriority w:val="99"/>
     <w:pPr>
       <w:pBdr/>
@@ -38936,9 +38936,9 @@
       </w:tcPr>
     </w:tblStylePr>
   </w:style>
-  <w:style w:type="table" w:styleId="872">
+  <w:style w:type="table" w:styleId="829">
     <w:name w:val="Bordered"/>
-    <w:basedOn w:val="898"/>
+    <w:basedOn w:val="855"/>
     <w:uiPriority w:val="99"/>
     <w:pPr>
       <w:pBdr/>
@@ -39167,9 +39167,9 @@
       </w:tcPr>
     </w:tblStylePr>
   </w:style>
-  <w:style w:type="table" w:styleId="873">
+  <w:style w:type="table" w:styleId="830">
     <w:name w:val="Bordered - Accent 1"/>
-    <w:basedOn w:val="898"/>
+    <w:basedOn w:val="855"/>
     <w:uiPriority w:val="99"/>
     <w:pPr>
       <w:pBdr/>
@@ -39398,9 +39398,9 @@
       </w:tcPr>
     </w:tblStylePr>
   </w:style>
-  <w:style w:type="table" w:styleId="874">
+  <w:style w:type="table" w:styleId="831">
     <w:name w:val="Bordered - Accent 2"/>
-    <w:basedOn w:val="898"/>
+    <w:basedOn w:val="855"/>
     <w:uiPriority w:val="99"/>
     <w:pPr>
       <w:pBdr/>
@@ -39629,9 +39629,9 @@
       </w:tcPr>
     </w:tblStylePr>
   </w:style>
-  <w:style w:type="table" w:styleId="875">
+  <w:style w:type="table" w:styleId="832">
     <w:name w:val="Bordered - Accent 3"/>
-    <w:basedOn w:val="898"/>
+    <w:basedOn w:val="855"/>
     <w:uiPriority w:val="99"/>
     <w:pPr>
       <w:pBdr/>
@@ -39860,9 +39860,9 @@
       </w:tcPr>
     </w:tblStylePr>
   </w:style>
-  <w:style w:type="table" w:styleId="876">
+  <w:style w:type="table" w:styleId="833">
     <w:name w:val="Bordered - Accent 4"/>
-    <w:basedOn w:val="898"/>
+    <w:basedOn w:val="855"/>
     <w:uiPriority w:val="99"/>
     <w:pPr>
       <w:pBdr/>
@@ -40091,9 +40091,9 @@
       </w:tcPr>
     </w:tblStylePr>
   </w:style>
-  <w:style w:type="table" w:styleId="877">
+  <w:style w:type="table" w:styleId="834">
     <w:name w:val="Bordered - Accent 5"/>
-    <w:basedOn w:val="898"/>
+    <w:basedOn w:val="855"/>
     <w:uiPriority w:val="99"/>
     <w:pPr>
       <w:pBdr/>
@@ -40322,9 +40322,9 @@
       </w:tcPr>
     </w:tblStylePr>
   </w:style>
-  <w:style w:type="table" w:styleId="878">
+  <w:style w:type="table" w:styleId="835">
     <w:name w:val="Bordered - Accent 6"/>
-    <w:basedOn w:val="898"/>
+    <w:basedOn w:val="855"/>
     <w:uiPriority w:val="99"/>
     <w:pPr>
       <w:pBdr/>
@@ -40553,7 +40553,7 @@
       </w:tcPr>
     </w:tblStylePr>
   </w:style>
-  <w:style w:type="character" w:styleId="879">
+  <w:style w:type="character" w:styleId="836">
     <w:name w:val="Hyperlink"/>
     <w:uiPriority w:val="99"/>
     <w:unhideWhenUsed/>
@@ -40567,10 +40567,10 @@
       <w:u w:val="single"/>
     </w:rPr>
   </w:style>
-  <w:style w:type="paragraph" w:styleId="880">
+  <w:style w:type="paragraph" w:styleId="837">
     <w:name w:val="footnote text"/>
-    <w:basedOn w:val="897"/>
-    <w:link w:val="881"/>
+    <w:basedOn w:val="854"/>
+    <w:link w:val="838"/>
     <w:uiPriority w:val="99"/>
     <w:semiHidden/>
     <w:unhideWhenUsed/>
@@ -40583,9 +40583,9 @@
       <w:sz w:val="18"/>
     </w:rPr>
   </w:style>
-  <w:style w:type="character" w:styleId="881">
+  <w:style w:type="character" w:styleId="838">
     <w:name w:val="Footnote Text Char"/>
-    <w:link w:val="880"/>
+    <w:link w:val="837"/>
     <w:uiPriority w:val="99"/>
     <w:pPr>
       <w:pBdr/>
@@ -40596,7 +40596,7 @@
       <w:sz w:val="18"/>
     </w:rPr>
   </w:style>
-  <w:style w:type="character" w:styleId="882">
+  <w:style w:type="character" w:styleId="839">
     <w:name w:val="footnote reference"/>
     <w:uiPriority w:val="99"/>
     <w:unhideWhenUsed/>
@@ -40609,10 +40609,10 @@
       <w:vertAlign w:val="superscript"/>
     </w:rPr>
   </w:style>
-  <w:style w:type="paragraph" w:styleId="883">
+  <w:style w:type="paragraph" w:styleId="840">
     <w:name w:val="endnote text"/>
-    <w:basedOn w:val="897"/>
-    <w:link w:val="884"/>
+    <w:basedOn w:val="854"/>
+    <w:link w:val="841"/>
     <w:uiPriority w:val="99"/>
     <w:semiHidden/>
     <w:unhideWhenUsed/>
@@ -40625,9 +40625,9 @@
       <w:sz w:val="20"/>
     </w:rPr>
   </w:style>
-  <w:style w:type="character" w:styleId="884">
+  <w:style w:type="character" w:styleId="841">
     <w:name w:val="Endnote Text Char"/>
-    <w:link w:val="883"/>
+    <w:link w:val="840"/>
     <w:uiPriority w:val="99"/>
     <w:pPr>
       <w:pBdr/>
@@ -40638,7 +40638,7 @@
       <w:sz w:val="20"/>
     </w:rPr>
   </w:style>
-  <w:style w:type="character" w:styleId="885">
+  <w:style w:type="character" w:styleId="842">
     <w:name w:val="endnote reference"/>
     <w:uiPriority w:val="99"/>
     <w:semiHidden/>
@@ -40652,10 +40652,10 @@
       <w:vertAlign w:val="superscript"/>
     </w:rPr>
   </w:style>
-  <w:style w:type="paragraph" w:styleId="886">
+  <w:style w:type="paragraph" w:styleId="843">
     <w:name w:val="toc 1"/>
-    <w:basedOn w:val="897"/>
-    <w:next w:val="897"/>
+    <w:basedOn w:val="854"/>
+    <w:next w:val="854"/>
     <w:uiPriority w:val="39"/>
     <w:unhideWhenUsed/>
     <w:pPr>
@@ -40664,10 +40664,10 @@
       <w:ind w:right="0" w:firstLine="0" w:left="0"/>
     </w:pPr>
   </w:style>
-  <w:style w:type="paragraph" w:styleId="887">
+  <w:style w:type="paragraph" w:styleId="844">
     <w:name w:val="toc 2"/>
-    <w:basedOn w:val="897"/>
-    <w:next w:val="897"/>
+    <w:basedOn w:val="854"/>
+    <w:next w:val="854"/>
     <w:uiPriority w:val="39"/>
     <w:unhideWhenUsed/>
     <w:pPr>
@@ -40676,10 +40676,10 @@
       <w:ind w:right="0" w:firstLine="0" w:left="283"/>
     </w:pPr>
   </w:style>
-  <w:style w:type="paragraph" w:styleId="888">
+  <w:style w:type="paragraph" w:styleId="845">
     <w:name w:val="toc 3"/>
-    <w:basedOn w:val="897"/>
-    <w:next w:val="897"/>
+    <w:basedOn w:val="854"/>
+    <w:next w:val="854"/>
     <w:uiPriority w:val="39"/>
     <w:unhideWhenUsed/>
     <w:pPr>
@@ -40688,10 +40688,10 @@
       <w:ind w:right="0" w:firstLine="0" w:left="567"/>
     </w:pPr>
   </w:style>
-  <w:style w:type="paragraph" w:styleId="889">
+  <w:style w:type="paragraph" w:styleId="846">
     <w:name w:val="toc 4"/>
-    <w:basedOn w:val="897"/>
-    <w:next w:val="897"/>
+    <w:basedOn w:val="854"/>
+    <w:next w:val="854"/>
     <w:uiPriority w:val="39"/>
     <w:unhideWhenUsed/>
     <w:pPr>
@@ -40700,10 +40700,10 @@
       <w:ind w:right="0" w:firstLine="0" w:left="850"/>
     </w:pPr>
   </w:style>
-  <w:style w:type="paragraph" w:styleId="890">
+  <w:style w:type="paragraph" w:styleId="847">
     <w:name w:val="toc 5"/>
-    <w:basedOn w:val="897"/>
-    <w:next w:val="897"/>
+    <w:basedOn w:val="854"/>
+    <w:next w:val="854"/>
     <w:uiPriority w:val="39"/>
     <w:unhideWhenUsed/>
     <w:pPr>
@@ -40712,10 +40712,10 @@
       <w:ind w:right="0" w:firstLine="0" w:left="1134"/>
     </w:pPr>
   </w:style>
-  <w:style w:type="paragraph" w:styleId="891">
+  <w:style w:type="paragraph" w:styleId="848">
     <w:name w:val="toc 6"/>
-    <w:basedOn w:val="897"/>
-    <w:next w:val="897"/>
+    <w:basedOn w:val="854"/>
+    <w:next w:val="854"/>
     <w:uiPriority w:val="39"/>
     <w:unhideWhenUsed/>
     <w:pPr>
@@ -40724,10 +40724,10 @@
       <w:ind w:right="0" w:firstLine="0" w:left="1417"/>
     </w:pPr>
   </w:style>
-  <w:style w:type="paragraph" w:styleId="892">
+  <w:style w:type="paragraph" w:styleId="849">
     <w:name w:val="toc 7"/>
-    <w:basedOn w:val="897"/>
-    <w:next w:val="897"/>
+    <w:basedOn w:val="854"/>
+    <w:next w:val="854"/>
     <w:uiPriority w:val="39"/>
     <w:unhideWhenUsed/>
     <w:pPr>
@@ -40736,10 +40736,10 @@
       <w:ind w:right="0" w:firstLine="0" w:left="1701"/>
     </w:pPr>
   </w:style>
-  <w:style w:type="paragraph" w:styleId="893">
+  <w:style w:type="paragraph" w:styleId="850">
     <w:name w:val="toc 8"/>
-    <w:basedOn w:val="897"/>
-    <w:next w:val="897"/>
+    <w:basedOn w:val="854"/>
+    <w:next w:val="854"/>
     <w:uiPriority w:val="39"/>
     <w:unhideWhenUsed/>
     <w:pPr>
@@ -40748,10 +40748,10 @@
       <w:ind w:right="0" w:firstLine="0" w:left="1984"/>
     </w:pPr>
   </w:style>
-  <w:style w:type="paragraph" w:styleId="894">
+  <w:style w:type="paragraph" w:styleId="851">
     <w:name w:val="toc 9"/>
-    <w:basedOn w:val="897"/>
-    <w:next w:val="897"/>
+    <w:basedOn w:val="854"/>
+    <w:next w:val="854"/>
     <w:uiPriority w:val="39"/>
     <w:unhideWhenUsed/>
     <w:pPr>
@@ -40760,7 +40760,7 @@
       <w:ind w:right="0" w:firstLine="0" w:left="2268"/>
     </w:pPr>
   </w:style>
-  <w:style w:type="paragraph" w:styleId="895">
+  <w:style w:type="paragraph" w:styleId="852">
     <w:name w:val="TOC Heading"/>
     <w:uiPriority w:val="39"/>
     <w:unhideWhenUsed/>
@@ -40770,10 +40770,10 @@
       <w:ind/>
     </w:pPr>
   </w:style>
-  <w:style w:type="paragraph" w:styleId="896">
+  <w:style w:type="paragraph" w:styleId="853">
     <w:name w:val="table of figures"/>
-    <w:basedOn w:val="897"/>
-    <w:next w:val="897"/>
+    <w:basedOn w:val="854"/>
+    <w:next w:val="854"/>
     <w:uiPriority w:val="99"/>
     <w:unhideWhenUsed/>
     <w:pPr>
@@ -40782,7 +40782,7 @@
       <w:ind/>
     </w:pPr>
   </w:style>
-  <w:style w:type="paragraph" w:styleId="897" w:default="1">
+  <w:style w:type="paragraph" w:styleId="854" w:default="1">
     <w:name w:val="Normal"/>
     <w:qFormat/>
     <w:pPr>
@@ -40791,7 +40791,7 @@
       <w:ind/>
     </w:pPr>
   </w:style>
-  <w:style w:type="table" w:styleId="898" w:default="1">
+  <w:style w:type="table" w:styleId="855" w:default="1">
     <w:name w:val="Normal Table"/>
     <w:uiPriority w:val="99"/>
     <w:semiHidden/>
@@ -40984,7 +40984,7 @@
       </w:tcPr>
     </w:tblStylePr>
   </w:style>
-  <w:style w:type="numbering" w:styleId="899" w:default="1">
+  <w:style w:type="numbering" w:styleId="856" w:default="1">
     <w:name w:val="No List"/>
     <w:uiPriority w:val="99"/>
     <w:semiHidden/>
@@ -40995,9 +40995,9 @@
       <w:ind/>
     </w:pPr>
   </w:style>
-  <w:style w:type="paragraph" w:styleId="900">
+  <w:style w:type="paragraph" w:styleId="857">
     <w:name w:val="No Spacing"/>
-    <w:basedOn w:val="897"/>
+    <w:basedOn w:val="854"/>
     <w:uiPriority w:val="1"/>
     <w:qFormat/>
     <w:pPr>
@@ -41006,9 +41006,9 @@
       <w:ind/>
     </w:pPr>
   </w:style>
-  <w:style w:type="paragraph" w:styleId="901">
+  <w:style w:type="paragraph" w:styleId="858">
     <w:name w:val="List Paragraph"/>
-    <w:basedOn w:val="897"/>
+    <w:basedOn w:val="854"/>
     <w:uiPriority w:val="34"/>
     <w:qFormat/>
     <w:pPr>
@@ -41018,7 +41018,7 @@
       <w:contextualSpacing w:val="true"/>
     </w:pPr>
   </w:style>
-  <w:style w:type="character" w:styleId="902" w:default="1">
+  <w:style w:type="character" w:styleId="859" w:default="1">
     <w:name w:val="Default Paragraph Font"/>
     <w:uiPriority w:val="1"/>
     <w:semiHidden/>

</xml_diff>

<commit_message>
Testing table is done.
</commit_message>
<xml_diff>
--- a/Analysis.docx
+++ b/Analysis.docx
@@ -9004,14 +9004,13 @@
         <w:rPr>
           <w:highlight w:val="none"/>
         </w:rPr>
-        <w:t xml:space="preserve">Use said data to load our real solar system into the program via dynamic object creation</w:t>
-      </w:r>
-      <w:r>
-        <w:rPr>
-          <w:highlight w:val="none"/>
-        </w:rPr>
-      </w:r>
-      <w:r/>
+        <w:t xml:space="preserve">Should be able to parse the data to extract relevant values (mass, size, position, velocity).</w:t>
+      </w:r>
+      <w:r>
+        <w:rPr>
+          <w:highlight w:val="none"/>
+        </w:rPr>
+      </w:r>
     </w:p>
     <w:p>
       <w:pPr>
@@ -9029,7 +9028,7 @@
         <w:rPr>
           <w:highlight w:val="none"/>
         </w:rPr>
-        <w:t xml:space="preserve">The solar system should be stored as a list of celestial bodies, “planets”.</w:t>
+        <w:t xml:space="preserve">Use said data to load our real solar system into a list of planets (celestialBodies) via dynamic object creation</w:t>
       </w:r>
       <w:r>
         <w:rPr>

</xml_diff>